<commit_message>
Added in irit's introduction
</commit_message>
<xml_diff>
--- a/manuscript/Obesity-Stress/Manuscript.docx
+++ b/manuscript/Obesity-Stress/Manuscript.docx
@@ -4,18 +4,429 @@
   <w:body>
     <w:p>
       <w:pPr>
-        <w:pStyle w:val="Heading1"/>
+        <w:pStyle w:val="Title"/>
       </w:pPr>
       <w:r>
-        <w:t>Introduction</w:t>
-      </w:r>
-    </w:p>
-    <w:p/>
+        <w:t>Stress and Its Impact on the Development of Diabetes in Obese Individuals: A Comprehensive Analysis</w:t>
+      </w:r>
+    </w:p>
+    <w:p/>
+    <w:p/>
+    <w:p>
+      <w:proofErr w:type="spellStart"/>
+      <w:r>
+        <w:t>Irit</w:t>
+      </w:r>
+      <w:proofErr w:type="spellEnd"/>
+      <w:r>
+        <w:t xml:space="preserve"> Hochberg, Katherine W. Bauer, and Dave Bridges</w:t>
+      </w:r>
+    </w:p>
+    <w:p>
+      <w:pPr>
+        <w:rPr>
+          <w:rFonts w:asciiTheme="majorHAnsi" w:eastAsiaTheme="majorEastAsia" w:hAnsiTheme="majorHAnsi" w:cstheme="majorBidi"/>
+          <w:color w:val="2F5496" w:themeColor="accent1" w:themeShade="BF"/>
+          <w:sz w:val="32"/>
+          <w:szCs w:val="32"/>
+        </w:rPr>
+      </w:pPr>
+      <w:r>
+        <w:br w:type="page"/>
+      </w:r>
+    </w:p>
     <w:p>
       <w:pPr>
         <w:pStyle w:val="Heading1"/>
       </w:pPr>
       <w:r>
+        <w:lastRenderedPageBreak/>
+        <w:t>Abstract</w:t>
+      </w:r>
+    </w:p>
+    <w:p/>
+    <w:p/>
+    <w:p>
+      <w:pPr>
+        <w:rPr>
+          <w:rFonts w:asciiTheme="majorHAnsi" w:eastAsiaTheme="majorEastAsia" w:hAnsiTheme="majorHAnsi" w:cstheme="majorBidi"/>
+          <w:color w:val="2F5496" w:themeColor="accent1" w:themeShade="BF"/>
+          <w:sz w:val="32"/>
+          <w:szCs w:val="32"/>
+        </w:rPr>
+      </w:pPr>
+      <w:r>
+        <w:br w:type="page"/>
+      </w:r>
+    </w:p>
+    <w:p>
+      <w:pPr>
+        <w:pStyle w:val="Heading1"/>
+      </w:pPr>
+      <w:r>
+        <w:lastRenderedPageBreak/>
+        <w:t>Introduction</w:t>
+      </w:r>
+    </w:p>
+    <w:p/>
+    <w:p>
+      <w:r>
+        <w:t>Obesity and diabetes mellitus are two of the most pressing health concerns globally, and they are strongly associated, with obesity being the strongest risk factor for diabetes</w:t>
+      </w:r>
+      <w:r>
+        <w:fldChar w:fldCharType="begin"/>
+      </w:r>
+      <w:r>
+        <w:instrText xml:space="preserve"> ADDIN ZOTERO_ITEM CSL_CITATION {"citationID":"7xF47Y29","properties":{"formattedCitation":"(Klein et al., 2022)","plainCitation":"(Klein et al., 2022)","noteIndex":0},"citationItems":[{"id":1821,"uris":["http://zotero.org/users/2695081/items/YEZFY7CW"],"itemData":{"id":1821,"type":"article-journal","container-title":"Cell Metabolism","DOI":"10.1016/j.cmet.2021.12.012","ISSN":"15504131","issue":"1","journalAbbreviation":"Cell Metabolism","language":"en","page":"11-20","source":"DOI.org (Crossref)","title":"Why does obesity cause diabetes?","volume":"34","author":[{"family":"Klein","given":"Samuel"},{"family":"Gastaldelli","given":"Amalia"},{"family":"Yki-Järvinen","given":"Hannele"},{"family":"Scherer","given":"Philipp E."}],"issued":{"date-parts":[["2022",1]]}}}],"schema":"https://github.com/citation-style-language/schema/raw/master/csl-citation.json"} </w:instrText>
+      </w:r>
+      <w:r>
+        <w:fldChar w:fldCharType="separate"/>
+      </w:r>
+      <w:r>
+        <w:rPr>
+          <w:lang w:val="en-GB"/>
+        </w:rPr>
+        <w:t>(Klein et al., 2022)</w:t>
+      </w:r>
+      <w:r>
+        <w:fldChar w:fldCharType="end"/>
+      </w:r>
+      <w:r>
+        <w:t xml:space="preserve">. Stress, both psychological and physiological, is a </w:t>
+      </w:r>
+      <w:proofErr w:type="spellStart"/>
+      <w:r>
+        <w:t>well established</w:t>
+      </w:r>
+      <w:proofErr w:type="spellEnd"/>
+      <w:r>
+        <w:t xml:space="preserve"> risk factor for both diabetes </w:t>
+      </w:r>
+      <w:r>
+        <w:fldChar w:fldCharType="begin"/>
+      </w:r>
+      <w:r>
+        <w:instrText xml:space="preserve"> ADDIN ZOTERO_ITEM CSL_CITATION {"citationID":"M57XEHIn","properties":{"formattedCitation":"(Ingrosso et al., 2023)","plainCitation":"(Ingrosso et al., 2023)","noteIndex":0},"citationItems":[{"id":1813,"uris":["http://zotero.org/users/2695081/items/NFIEYI62"],"itemData":{"id":1813,"type":"article-journal","abstract":"Evidence suggests that psychological and physical stress are relevant triggering factors for the onset of type 1 diabetes (T1D) and type 2 diabetes (T2D). The underlying mechanisms involve a complex neuroendocrine structure, involving the central nervous system and the periphery. Psychological stress leads to an increase of serum glucocorticoid concentrations and catecholamines release increasing the insulin need and the insulin resistance. According to the β-cell stress hypothesis, also causes of increased insulin demand, such as rapid growth, overweight, puberty, low physical activity, trauma, infections, and glucose overload, are potentially relevant factors in development of T1D. It has also been demonstrated that chronic stress and obesity form a vicious circle which leads to a definitive metabolic failure, increasing the risk of developing T2D. In this review, we will provide the most recent data concerning the role of stress in the outcomes of T1D and T2D, with a focus on the role of physical and psychological stress on the onset of T1D.","container-title":"Hormone Research in Paediatrics","DOI":"10.1159/000522431","ISSN":"1663-2826","issue":"1","journalAbbreviation":"Horm Res Paediatr","language":"eng","note":"PMID: 35124671","page":"34-43","source":"PubMed","title":"Stress and Diabetes Mellitus: Pathogenetic Mechanisms and Clinical Outcome","title-short":"Stress and Diabetes Mellitus","volume":"96","author":[{"family":"Ingrosso","given":"Diletta Maria Francesca"},{"family":"Primavera","given":"Marina"},{"family":"Samvelyan","given":"Sona"},{"family":"Tagi","given":"Veronica Maria"},{"family":"Chiarelli","given":"Francesco"}],"issued":{"date-parts":[["2023"]]}}}],"schema":"https://github.com/citation-style-language/schema/raw/master/csl-citation.json"} </w:instrText>
+      </w:r>
+      <w:r>
+        <w:fldChar w:fldCharType="separate"/>
+      </w:r>
+      <w:r>
+        <w:rPr>
+          <w:lang w:val="en-GB"/>
+        </w:rPr>
+        <w:t>(</w:t>
+      </w:r>
+      <w:proofErr w:type="spellStart"/>
+      <w:r>
+        <w:rPr>
+          <w:lang w:val="en-GB"/>
+        </w:rPr>
+        <w:t>Ingrosso</w:t>
+      </w:r>
+      <w:proofErr w:type="spellEnd"/>
+      <w:r>
+        <w:rPr>
+          <w:lang w:val="en-GB"/>
+        </w:rPr>
+        <w:t xml:space="preserve"> et al., 2023)</w:t>
+      </w:r>
+      <w:r>
+        <w:fldChar w:fldCharType="end"/>
+      </w:r>
+      <w:r>
+        <w:t xml:space="preserve"> and obesity (</w:t>
+      </w:r>
+      <w:r>
+        <w:fldChar w:fldCharType="begin"/>
+      </w:r>
+      <w:r>
+        <w:instrText xml:space="preserve"> ADDIN ZOTERO_ITEM CSL_CITATION {"citationID":"uXca1Ecw","properties":{"formattedCitation":"(Tomiyama, 2019)","plainCitation":"(Tomiyama, 2019)","noteIndex":0},"citationItems":[{"id":1825,"uris":["http://zotero.org/users/2695081/items/9FN2SLJA"],"itemData":{"id":1825,"type":"article-journal","abstract":"Many pathways connect stress and obesity, two highly prevalent problems facing society today. First, stress interferes with cognitive processes such as executive function and self-regulation. Second, stress can affect behavior by inducing overeating and consumption of foods that are high in calories, fat, or sugar; by decreasing physical activity; and by shortening sleep. Third, stress triggers physiological changes in the hypothalamic-pituitary-adrenal axis, reward processing in the brain, and possibly the gut microbiome. Finally, stress can stimulate production of biochemical hormones and peptides such as leptin, ghrelin, and neuropeptide Y. Obesity itself can be a stressful state due to the high prevalence of weight stigma. This article therefore traces the contribution of weight stigma to stress and obesogenic processes, ultimately describing a vicious cycle of stress to obesity to stigma to stress. Current obesity prevention efforts focus solely on eating and exercise; the evidence reviewed in this article points to stress as an important but currently overlooked public policy target.","container-title":"Annual Review of Psychology","DOI":"10.1146/annurev-psych-010418-102936","ISSN":"0066-4308, 1545-2085","issue":"1","journalAbbreviation":"Annu. Rev. Psychol.","language":"en","page":"703-718","source":"DOI.org (Crossref)","title":"Stress and Obesity","volume":"70","author":[{"family":"Tomiyama","given":"A. Janet"}],"issued":{"date-parts":[["2019",1,4]]}}}],"schema":"https://github.com/citation-style-language/schema/raw/master/csl-citation.json"} </w:instrText>
+      </w:r>
+      <w:r>
+        <w:fldChar w:fldCharType="separate"/>
+      </w:r>
+      <w:proofErr w:type="spellStart"/>
+      <w:r>
+        <w:rPr>
+          <w:lang w:val="en-GB"/>
+        </w:rPr>
+        <w:t>Tomiyama</w:t>
+      </w:r>
+      <w:proofErr w:type="spellEnd"/>
+      <w:r>
+        <w:rPr>
+          <w:lang w:val="en-GB"/>
+        </w:rPr>
+        <w:t>, 2019)</w:t>
+      </w:r>
+      <w:r>
+        <w:fldChar w:fldCharType="end"/>
+      </w:r>
+      <w:r>
+        <w:t>. Physiological pathways induced by chronic stress, including dysfunctional hypothalamic-</w:t>
+      </w:r>
+      <w:proofErr w:type="spellStart"/>
+      <w:r>
+        <w:t>pitutary</w:t>
+      </w:r>
+      <w:proofErr w:type="spellEnd"/>
+      <w:r>
+        <w:t xml:space="preserve">-adrenal axis </w:t>
+      </w:r>
+      <w:proofErr w:type="spellStart"/>
+      <w:r>
+        <w:t>activaty</w:t>
+      </w:r>
+      <w:proofErr w:type="spellEnd"/>
+      <w:r>
+        <w:t xml:space="preserve"> and hyperactivation of the sympathetic nervous system, can disrupt glucose homeostasis, leading to insulin resistance – a key precursor to type 2 diabetes </w:t>
+      </w:r>
+      <w:r>
+        <w:fldChar w:fldCharType="begin"/>
+      </w:r>
+      <w:r>
+        <w:instrText xml:space="preserve"> ADDIN ZOTERO_ITEM CSL_CITATION {"citationID":"g6EUyo8B","properties":{"formattedCitation":"(Ingrosso et al., 2023)","plainCitation":"(Ingrosso et al., 2023)","noteIndex":0},"citationItems":[{"id":1813,"uris":["http://zotero.org/users/2695081/items/NFIEYI62"],"itemData":{"id":1813,"type":"article-journal","abstract":"Evidence suggests that psychological and physical stress are relevant triggering factors for the onset of type 1 diabetes (T1D) and type 2 diabetes (T2D). The underlying mechanisms involve a complex neuroendocrine structure, involving the central nervous system and the periphery. Psychological stress leads to an increase of serum glucocorticoid concentrations and catecholamines release increasing the insulin need and the insulin resistance. According to the β-cell stress hypothesis, also causes of increased insulin demand, such as rapid growth, overweight, puberty, low physical activity, trauma, infections, and glucose overload, are potentially relevant factors in development of T1D. It has also been demonstrated that chronic stress and obesity form a vicious circle which leads to a definitive metabolic failure, increasing the risk of developing T2D. In this review, we will provide the most recent data concerning the role of stress in the outcomes of T1D and T2D, with a focus on the role of physical and psychological stress on the onset of T1D.","container-title":"Hormone Research in Paediatrics","DOI":"10.1159/000522431","ISSN":"1663-2826","issue":"1","journalAbbreviation":"Horm Res Paediatr","language":"eng","note":"PMID: 35124671","page":"34-43","source":"PubMed","title":"Stress and Diabetes Mellitus: Pathogenetic Mechanisms and Clinical Outcome","title-short":"Stress and Diabetes Mellitus","volume":"96","author":[{"family":"Ingrosso","given":"Diletta Maria Francesca"},{"family":"Primavera","given":"Marina"},{"family":"Samvelyan","given":"Sona"},{"family":"Tagi","given":"Veronica Maria"},{"family":"Chiarelli","given":"Francesco"}],"issued":{"date-parts":[["2023"]]}}}],"schema":"https://github.com/citation-style-language/schema/raw/master/csl-citation.json"} </w:instrText>
+      </w:r>
+      <w:r>
+        <w:fldChar w:fldCharType="separate"/>
+      </w:r>
+      <w:r>
+        <w:rPr>
+          <w:lang w:val="en-GB"/>
+        </w:rPr>
+        <w:t>(</w:t>
+      </w:r>
+      <w:proofErr w:type="spellStart"/>
+      <w:r>
+        <w:rPr>
+          <w:lang w:val="en-GB"/>
+        </w:rPr>
+        <w:t>Ingrosso</w:t>
+      </w:r>
+      <w:proofErr w:type="spellEnd"/>
+      <w:r>
+        <w:rPr>
+          <w:lang w:val="en-GB"/>
+        </w:rPr>
+        <w:t xml:space="preserve"> et al., 2023)</w:t>
+      </w:r>
+      <w:r>
+        <w:fldChar w:fldCharType="end"/>
+      </w:r>
+      <w:r>
+        <w:t>. Furthermore, stress often correlates with unhealthy lifestyle choices, such as poor diet and physical inactivity, which are significant risk factors for obesity and diabetes</w:t>
+      </w:r>
+      <w:r>
+        <w:fldChar w:fldCharType="begin"/>
+      </w:r>
+      <w:r>
+        <w:instrText xml:space="preserve"> ADDIN ZOTERO_ITEM CSL_CITATION {"citationID":"FfVoWjjp","properties":{"formattedCitation":"(Tomiyama, 2019)","plainCitation":"(Tomiyama, 2019)","noteIndex":0},"citationItems":[{"id":1825,"uris":["http://zotero.org/users/2695081/items/9FN2SLJA"],"itemData":{"id":1825,"type":"article-journal","abstract":"Many pathways connect stress and obesity, two highly prevalent problems facing society today. First, stress interferes with cognitive processes such as executive function and self-regulation. Second, stress can affect behavior by inducing overeating and consumption of foods that are high in calories, fat, or sugar; by decreasing physical activity; and by shortening sleep. Third, stress triggers physiological changes in the hypothalamic-pituitary-adrenal axis, reward processing in the brain, and possibly the gut microbiome. Finally, stress can stimulate production of biochemical hormones and peptides such as leptin, ghrelin, and neuropeptide Y. Obesity itself can be a stressful state due to the high prevalence of weight stigma. This article therefore traces the contribution of weight stigma to stress and obesogenic processes, ultimately describing a vicious cycle of stress to obesity to stigma to stress. Current obesity prevention efforts focus solely on eating and exercise; the evidence reviewed in this article points to stress as an important but currently overlooked public policy target.","container-title":"Annual Review of Psychology","DOI":"10.1146/annurev-psych-010418-102936","ISSN":"0066-4308, 1545-2085","issue":"1","journalAbbreviation":"Annu. Rev. Psychol.","language":"en","page":"703-718","source":"DOI.org (Crossref)","title":"Stress and Obesity","volume":"70","author":[{"family":"Tomiyama","given":"A. Janet"}],"issued":{"date-parts":[["2019",1,4]]}}}],"schema":"https://github.com/citation-style-language/schema/raw/master/csl-citation.json"} </w:instrText>
+      </w:r>
+      <w:r>
+        <w:fldChar w:fldCharType="separate"/>
+      </w:r>
+      <w:r>
+        <w:rPr>
+          <w:lang w:val="en-GB"/>
+        </w:rPr>
+        <w:t>(</w:t>
+      </w:r>
+      <w:proofErr w:type="spellStart"/>
+      <w:r>
+        <w:rPr>
+          <w:lang w:val="en-GB"/>
+        </w:rPr>
+        <w:t>Tomiyama</w:t>
+      </w:r>
+      <w:proofErr w:type="spellEnd"/>
+      <w:r>
+        <w:rPr>
+          <w:lang w:val="en-GB"/>
+        </w:rPr>
+        <w:t>, 2019)</w:t>
+      </w:r>
+      <w:r>
+        <w:fldChar w:fldCharType="end"/>
+      </w:r>
+      <w:r>
+        <w:rPr>
+          <w:rtl/>
+          <w:lang w:bidi="he-IL"/>
+        </w:rPr>
+        <w:t>.</w:t>
+      </w:r>
+      <w:r>
+        <w:t xml:space="preserve"> We have shown in mice that chronically elevated external glucocorticoids act </w:t>
+      </w:r>
+      <w:proofErr w:type="spellStart"/>
+      <w:r>
+        <w:t>synergistecly</w:t>
+      </w:r>
+      <w:proofErr w:type="spellEnd"/>
+      <w:r>
+        <w:t xml:space="preserve"> with diet-induced obesity, leading to exacerbations in metabolic dysfunction</w:t>
+      </w:r>
+      <w:r>
+        <w:fldChar w:fldCharType="begin"/>
+      </w:r>
+      <w:r>
+        <w:instrText xml:space="preserve"> ADDIN ZOTERO_ITEM CSL_CITATION {"citationID":"GJwkqvDF","properties":{"formattedCitation":"(Harvey et al., 2018)","plainCitation":"(Harvey et al., 2018)","noteIndex":0},"citationItems":[{"id":1829,"uris":["http://zotero.org/users/2695081/items/ABIIT6F6"],"itemData":{"id":1829,"type":"article-journal","container-title":"Endocrinology","DOI":"10.1210/en.2018-00147","ISSN":"1945-7170","issue":"6","language":"en","page":"2275-2287","source":"DOI.org (Crossref)","title":"Glucocorticoid-Induced Metabolic Disturbances Are Exacerbated in Obese Male Mice","volume":"159","author":[{"family":"Harvey","given":"Innocence"},{"family":"Stephenson","given":"Erin J"},{"family":"Redd","given":"JeAnna R"},{"family":"Tran","given":"Quynh T"},{"family":"Hochberg","given":"Irit"},{"family":"Qi","given":"Nathan"},{"family":"Bridges","given":"Dave"}],"issued":{"date-parts":[["2018",6,1]]}}}],"schema":"https://github.com/citation-style-language/schema/raw/master/csl-citation.json"} </w:instrText>
+      </w:r>
+      <w:r>
+        <w:fldChar w:fldCharType="separate"/>
+      </w:r>
+      <w:r>
+        <w:rPr>
+          <w:lang w:val="en-GB"/>
+        </w:rPr>
+        <w:t>(Harvey et al., 2018)</w:t>
+      </w:r>
+      <w:r>
+        <w:fldChar w:fldCharType="end"/>
+      </w:r>
+      <w:r>
+        <w:t xml:space="preserve"> </w:t>
+      </w:r>
+      <w:r>
+        <w:fldChar w:fldCharType="begin"/>
+      </w:r>
+      <w:r>
+        <w:instrText xml:space="preserve"> ADDIN ZOTERO_ITEM CSL_CITATION {"citationID":"NgNNSsKf","properties":{"formattedCitation":"(Gunder et al., 2020)","plainCitation":"(Gunder et al., 2020)","noteIndex":0},"citationItems":[{"id":1831,"uris":["http://zotero.org/users/2695081/items/455VREYL"],"itemData":{"id":1831,"type":"article-journal","abstract":"Glucocorticoids promote muscle atrophy by inducing a class of proteins called atrogenes, resulting in reductions in muscle size and strength. In this work, we evaluated whether a mouse model with pre-existing diet-induced obesity had altered glucocorticoid responsiveness. We observed that all animals treated with the synthetic glucocorticoid dexamethasone had reduced strength, but that obesity exacerbated this effect. These changes were concordant with more pronounced reductions in muscle size, particularly in Type II muscle fibers, and potentiated induction of atrogene expression in the obese mice relative to lean mice. Furthermore, we show that the reductions in lean mass do not fully account for the dexamethasone-induced insulin resistance observed in these mice. Together, these data suggest that obesity potentiates glucocorticoid-induced muscle atrophy.","container-title":"Biomedicines","DOI":"10.3390/biomedicines8100420","ISSN":"2227-9059","issue":"10","journalAbbreviation":"Biomedicines","language":"en","page":"420","source":"DOI.org (Crossref)","title":"Obesity Augments Glucocorticoid-Dependent Muscle Atrophy in Male C57BL/6J Mice","volume":"8","author":[{"family":"Gunder","given":"Laura C."},{"family":"Harvey","given":"Innocence"},{"family":"Redd","given":"JeAnna R."},{"family":"Davis","given":"Carol S."},{"family":"AL-Tamimi","given":"Ayat"},{"family":"Brooks","given":"Susan V."},{"family":"Bridges","given":"Dave"}],"issued":{"date-parts":[["2020",10,15]]}}}],"schema":"https://github.com/citation-style-language/schema/raw/master/csl-citation.json"} </w:instrText>
+      </w:r>
+      <w:r>
+        <w:fldChar w:fldCharType="separate"/>
+      </w:r>
+      <w:r>
+        <w:rPr>
+          <w:lang w:val="en-GB"/>
+        </w:rPr>
+        <w:t>(</w:t>
+      </w:r>
+      <w:proofErr w:type="spellStart"/>
+      <w:r>
+        <w:rPr>
+          <w:lang w:val="en-GB"/>
+        </w:rPr>
+        <w:t>Gunder</w:t>
+      </w:r>
+      <w:proofErr w:type="spellEnd"/>
+      <w:r>
+        <w:rPr>
+          <w:lang w:val="en-GB"/>
+        </w:rPr>
+        <w:t xml:space="preserve"> et al., 2020)</w:t>
+      </w:r>
+      <w:r>
+        <w:fldChar w:fldCharType="end"/>
+      </w:r>
+      <w:r>
+        <w:t xml:space="preserve">. </w:t>
+      </w:r>
+    </w:p>
+    <w:p/>
+    <w:p>
+      <w:r>
+        <w:t xml:space="preserve">In humans, although several key studies have identified a robust association between stress and the development of diabetes, most of these studies did not determine whether the metabolic effect of stress is different between obese and lean individuals. The only major study that addressed the combined effect of stress and obesity on diabetes is the Whitehall II study, that found that work stress strongly increased the risk of diabetes in obese women, with no apparent modulating effect in obese men and lean women, and a protective effect in lean men </w:t>
+      </w:r>
+      <w:r>
+        <w:fldChar w:fldCharType="begin"/>
+      </w:r>
+      <w:r>
+        <w:instrText xml:space="preserve"> ADDIN ZOTERO_ITEM CSL_CITATION {"citationID":"K8XBA9DN","properties":{"formattedCitation":"(Heraclides et al., 2012)","plainCitation":"(Heraclides et al., 2012)","noteIndex":0},"citationItems":[{"id":1804,"uris":["http://zotero.org/users/2695081/items/3FLNIKRN"],"itemData":{"id":1804,"type":"article-journal","abstract":"Psychosocial work stress has been linked to higher risk of type 2 diabetes (T2DM), with the effect being consistently higher among women than men. Also, work stress has been linked to prospective weight gain among obese men but weight loss among lean men. Here, we aimed to examine the interaction between work stress and obesity in relation to T2DM risk in a gender-specific manner. We studied 5,568 white middle-aged men and women in the Whitehall II study, who were free from diabetes at analysis baseline (1993). After 1993, diabetes was ascertained at six consecutive phases by an oral glucose tolerance test supplemented by self-reports. Cox regression analysis was used to assess the association between job strain (high job demands/low job control) and 18-year incident T2DM stratifying by BMI (BMI &lt;30 kg/m(2) vs. BMI ≥30 kg/m(2)). Overall, work stress was associated with incident T2DM among women (hazard ratio (HR) 1.41: 95% confidence intervals: 1.02; 1.95) but not among men (HR 0.87: 95% confidence interval 0.69; 1.11) (P(INTERACTION) = 0.017). Among men, work stress was associated with a lower risk of T2DM in nonobese (HR 0.70: 0.53; 0.93) but not in obese individuals (P(INTERACTION) = 0.17). Among women, work stress was associated with higher risk of T2DM in the obese (HR 2.01: 1.06; 3.92) but not in the nonobese (P(INTERACTION) = 0.005). Gender and body weight status play a critical role in determining the direction of the association between psychosocial stress and T2DM. The potential effect-modifying role of gender and obesity should not be ignored by future studies looking at stress-disease associations.","container-title":"Obesity (Silver Spring, Md.)","DOI":"10.1038/oby.2011.95","ISSN":"1930-739X","issue":"2","journalAbbreviation":"Obesity (Silver Spring)","language":"eng","note":"PMID: 21593804","page":"428-433","source":"PubMed","title":"Work stress, obesity and the risk of type 2 diabetes: gender-specific bidirectional effect in the Whitehall II study","title-short":"Work stress, obesity and the risk of type 2 diabetes","volume":"20","author":[{"family":"Heraclides","given":"Alexandros M."},{"family":"Chandola","given":"Tarani"},{"family":"Witte","given":"Daniel R."},{"family":"Brunner","given":"Eric J."}],"issued":{"date-parts":[["2012",2]]}}}],"schema":"https://github.com/citation-style-language/schema/raw/master/csl-citation.json"} </w:instrText>
+      </w:r>
+      <w:r>
+        <w:fldChar w:fldCharType="separate"/>
+      </w:r>
+      <w:r>
+        <w:rPr>
+          <w:lang w:val="en-GB"/>
+        </w:rPr>
+        <w:t>(</w:t>
+      </w:r>
+      <w:proofErr w:type="spellStart"/>
+      <w:r>
+        <w:rPr>
+          <w:lang w:val="en-GB"/>
+        </w:rPr>
+        <w:t>Heraclides</w:t>
+      </w:r>
+      <w:proofErr w:type="spellEnd"/>
+      <w:r>
+        <w:rPr>
+          <w:lang w:val="en-GB"/>
+        </w:rPr>
+        <w:t xml:space="preserve"> et al., 2012)</w:t>
+      </w:r>
+      <w:r>
+        <w:fldChar w:fldCharType="end"/>
+      </w:r>
+      <w:r>
+        <w:t xml:space="preserve">.  A selective effect of chronic stress on development of diabetes in woman but not in men was also demonstrated in the Australian Diabetes, Obesity and Lifestyle study </w:t>
+      </w:r>
+      <w:r>
+        <w:fldChar w:fldCharType="begin"/>
+      </w:r>
+      <w:r>
+        <w:instrText xml:space="preserve"> ADDIN ZOTERO_ITEM CSL_CITATION {"citationID":"AFe5E0pt","properties":{"formattedCitation":"(Williams et al., 2013)","plainCitation":"(Williams et al., 2013)","noteIndex":0},"citationItems":[{"id":1807,"uris":["http://zotero.org/users/2695081/items/VA42I7LX"],"itemData":{"id":1807,"type":"article-journal","abstract":"BACKGROUND: The evidence supporting a relationship between stress and diabetes has been inconsistent.\nPURPOSE: This study examined the effects of stress on abnormal glucose metabolism, using a population-based sample of 3,759, with normoglycemia at baseline, from the Australian Diabetes, Obesity and Lifestyle study.\nMETHODS: Perceived stress and stressful life events were measured at baseline, with health behavior and anthropometric information also collected. Oral glucose tolerance tests were undertaken at baseline and 5-year follow-up. The primary outcome was the development of abnormal glucose metabolism (impaired fasting glucose, impaired glucose tolerance, and type 2 diabetes), according to WHO 1999 criteria.\nRESULTS: Perceived stress predicted incident abnormal glucose metabolism in women but not men, after multivariate adjustment. Life events showed an inconsistent relationship with abnormal glucose metabolism.\nCONCLUSIONS: Perceived stress predicted abnormal glucose metabolism in women. Healthcare professionals should consider psychosocial adversity when assessing risk factor profiles for the development of diabetes.","container-title":"Annals of Behavioral Medicine: A Publication of the Society of Behavioral Medicine","DOI":"10.1007/s12160-013-9473-y","ISSN":"1532-4796","issue":"1","journalAbbreviation":"Ann Behav Med","language":"eng","note":"PMID: 23389687","page":"62-72","source":"PubMed","title":"Psychosocial stress predicts abnormal glucose metabolism: the Australian Diabetes, Obesity and Lifestyle (AusDiab) study","title-short":"Psychosocial stress predicts abnormal glucose metabolism","volume":"46","author":[{"family":"Williams","given":"Emily D."},{"family":"Magliano","given":"Dianna J."},{"family":"Tapp","given":"Robyn J."},{"family":"Oldenburg","given":"Brian F."},{"family":"Shaw","given":"Jonathan E."}],"issued":{"date-parts":[["2013",8]]}}}],"schema":"https://github.com/citation-style-language/schema/raw/master/csl-citation.json"} </w:instrText>
+      </w:r>
+      <w:r>
+        <w:fldChar w:fldCharType="separate"/>
+      </w:r>
+      <w:r>
+        <w:rPr>
+          <w:lang w:val="en-GB"/>
+        </w:rPr>
+        <w:t>(Williams et al., 2013)</w:t>
+      </w:r>
+      <w:r>
+        <w:fldChar w:fldCharType="end"/>
+      </w:r>
+      <w:r>
+        <w:t xml:space="preserve">. In a smaller study, patients with obesity and diabetes who also had depression stress had exacerbated biochemical changes associated with obesity, including lower adiponectin and higher cortisol, as compared to patients with diabetes and obesity without depression </w:t>
+      </w:r>
+      <w:r>
+        <w:fldChar w:fldCharType="begin"/>
+      </w:r>
+      <w:r>
+        <w:instrText xml:space="preserve"> ADDIN ZOTERO_ITEM CSL_CITATION {"citationID":"qb5nzjnv","properties":{"formattedCitation":"(Tyagi et al., 2021)","plainCitation":"(Tyagi et al., 2021)","noteIndex":0},"citationItems":[{"id":1810,"uris":["http://zotero.org/users/2695081/items/QVI959H8"],"itemData":{"id":1810,"type":"article-journal","abstract":"PURPOSE: Type 2 diabetes mellitus (T2DM), a metabolic disorder, remains associated with a physiological impairment affecting large populations worldwide. Onset of T2DM is multifactorial where obesity and abnormal basal metabolic rate are considered most critical. Of people diagnosed with T2DM, about 80% are also obese. It is also reported that obese individuals have an increased odds of developing depression, whereas T2DM is estimated to increase the incidence by two-fold. The preponderance of research data demonstrates that T2DM alters the serum level of cortisol and adiponectin which are known to be associated with neuronal physiology. The study explored, how a metabolic disorder like T2DM is linked with the altered plasma level of cortisol and adiponectin, the risk factors for stress and depression.\nPATIENTS AND METHODS: A cross-sectional population study was conducted in T2DM patients using a bimodal approach. First approach used questionnaires, (1) Patient Health Questionnaire (PHQ-9) and (2) Stress Coping Inventory Questionnaire (SCQ) to assess signs and symptoms of depression and stress, respectively, in T2DM patients. In the second approach, robust biochemical analysis was conducted for serum adiponectin and cortisol levels.\nRESULTS: An association of T2DM in stress and depression was evaluated in 158 subjects (105 T2DM obese patients and 53 healthy controls). A lower PHQ-9 score and adiponectin levels were seen in T2DM obese patients compared to healthy controls (p&lt;0.05). Further, results also depicted a lower adiponectin levels in T2DM obese patients with depression compared to T2DM obese patients without depression (p&lt;0.05). The study did not find a significant difference in cortisol serum levels among the T2DM and control groups. However, a higher level of serum cortisol was reported in T2DM obese patients with depression over those T2DM obese patients who lacked depression (p&lt;0.05).\nCONCLUSION: The findings suggest that T2DM obese patients might have a higher risk of developing stress and depression. Further, biochemical parameters, adiponectin and cortisol, might be the potential biomarkers for T2DM and may help in early diagnosis of these comorbid conditions.","container-title":"Diabetes, Metabolic Syndrome and Obesity: Targets and Therapy","DOI":"10.2147/DMSO.S294555","ISSN":"1178-7007","journalAbbreviation":"Diabetes Metab Syndr Obes","language":"eng","note":"PMID: 33623406\nPMCID: PMC7896784","page":"705-717","source":"PubMed","title":"Evaluation of Stress and Associated Biochemical Changes in Patients with Type 2 Diabetes Mellitus and Obesity","volume":"14","author":[{"family":"Tyagi","given":"Kanchan"},{"family":"Agarwal","given":"Nidhi Bharal"},{"family":"Kapur","given":"Prem"},{"family":"Kohli","given":"Sunil"},{"family":"Jalali","given":"Rajinder K."}],"issued":{"date-parts":[["2021"]]}}}],"schema":"https://github.com/citation-style-language/schema/raw/master/csl-citation.json"} </w:instrText>
+      </w:r>
+      <w:r>
+        <w:fldChar w:fldCharType="separate"/>
+      </w:r>
+      <w:r>
+        <w:rPr>
+          <w:lang w:val="en-GB"/>
+        </w:rPr>
+        <w:t>(Tyagi et al., 2021)</w:t>
+      </w:r>
+      <w:r>
+        <w:fldChar w:fldCharType="end"/>
+      </w:r>
+      <w:r>
+        <w:t>.</w:t>
+      </w:r>
+      <w:r>
+        <w:t xml:space="preserve">  </w:t>
+      </w:r>
+      <w:r>
+        <w:t>In this study, we assessed the effect of obesity on development of diabetes according to self</w:t>
+      </w:r>
+      <w:r>
+        <w:t>-</w:t>
+      </w:r>
+      <w:r>
+        <w:t xml:space="preserve">reported subjective stress in a large cohort. </w:t>
+      </w:r>
+    </w:p>
+    <w:p/>
+    <w:p/>
+    <w:p/>
+    <w:p>
+      <w:pPr>
+        <w:pStyle w:val="Heading1"/>
+      </w:pPr>
+      <w:r>
         <w:t>Methods</w:t>
       </w:r>
     </w:p>
@@ -67,6 +478,7 @@
     <w:p/>
     <w:p>
       <w:r>
+        <w:lastRenderedPageBreak/>
         <w:t xml:space="preserve">BMI was </w:t>
       </w:r>
       <w:r>
@@ -319,11 +731,7 @@
         <w:t>scores.</w:t>
       </w:r>
       <w:r>
-        <w:t xml:space="preserve">  Body mass indices above 25 and below 18.5 </w:t>
-      </w:r>
-      <w:r>
-        <w:lastRenderedPageBreak/>
-        <w:t xml:space="preserve">(underweight) were </w:t>
+        <w:t xml:space="preserve">  Body mass indices above 25 and below 18.5 (underweight) were </w:t>
       </w:r>
       <w:r>
         <w:t xml:space="preserve">both </w:t>
@@ -337,8 +745,6 @@
       <w:r>
         <w:t>among participants with type 2 diabetes, there was higher stress rates (47%) compared to those without (41%).</w:t>
       </w:r>
-      <w:bookmarkStart w:id="1" w:name="_GoBack"/>
-      <w:bookmarkEnd w:id="1"/>
     </w:p>
     <w:p/>
     <w:p>
@@ -395,9 +801,45 @@
         <w:pStyle w:val="Heading1"/>
       </w:pPr>
       <w:r>
+        <w:lastRenderedPageBreak/>
         <w:t>Acknowledgements</w:t>
       </w:r>
     </w:p>
+    <w:p/>
+    <w:p>
+      <w:r>
+        <w:t>We would like to thank the members of the Bridges lab for helpful discussions.  This work was supported by a pilot and feasibility grant from the Michigan Diabetes Research Center (</w:t>
+      </w:r>
+      <w:r>
+        <w:t xml:space="preserve">supported by </w:t>
+      </w:r>
+      <w:r>
+        <w:t>P30DK020572</w:t>
+      </w:r>
+      <w:r>
+        <w:t xml:space="preserve"> to DB) and grants from the National Institutes of Diabetes and Digestive Kidney Diseases (DK107535 to </w:t>
+      </w:r>
+      <w:commentRangeStart w:id="1"/>
+      <w:r>
+        <w:t>DB</w:t>
+      </w:r>
+      <w:commentRangeEnd w:id="1"/>
+      <w:r>
+        <w:rPr>
+          <w:rStyle w:val="CommentReference"/>
+        </w:rPr>
+        <w:commentReference w:id="1"/>
+      </w:r>
+      <w:r>
+        <w:t>).</w:t>
+      </w:r>
+      <w:r>
+        <w:t xml:space="preserve">  We would also like to thank the participants in the Michigan Genomics Initiative.</w:t>
+      </w:r>
+      <w:bookmarkStart w:id="2" w:name="_GoBack"/>
+      <w:bookmarkEnd w:id="2"/>
+    </w:p>
+    <w:p/>
     <w:p/>
     <w:p>
       <w:pPr>
@@ -547,18 +989,56 @@
       </w:r>
     </w:p>
   </w:comment>
+  <w:comment w:id="1" w:author="Dave Bridges" w:date="2024-04-12T11:07:00Z" w:initials="DB">
+    <w:p>
+      <w:pPr>
+        <w:pStyle w:val="CommentText"/>
+      </w:pPr>
+      <w:r>
+        <w:rPr>
+          <w:rStyle w:val="CommentReference"/>
+        </w:rPr>
+        <w:annotationRef/>
+      </w:r>
+      <w:r>
+        <w:t>@</w:t>
+      </w:r>
+      <w:proofErr w:type="spellStart"/>
+      <w:r>
+        <w:t>kate</w:t>
+      </w:r>
+      <w:proofErr w:type="spellEnd"/>
+      <w:r>
+        <w:t xml:space="preserve"> and </w:t>
+      </w:r>
+      <w:proofErr w:type="spellStart"/>
+      <w:r>
+        <w:t>irit</w:t>
+      </w:r>
+      <w:proofErr w:type="spellEnd"/>
+      <w:r>
+        <w:br/>
+      </w:r>
+      <w:r>
+        <w:br/>
+        <w:t>Do you have any other funding or conflicts of interest that you want to include or disclose.</w:t>
+      </w:r>
+    </w:p>
+  </w:comment>
 </w:comments>
 </file>
 
 <file path=word/commentsExtended.xml><?xml version="1.0" encoding="utf-8"?>
 <w15:commentsEx xmlns:wpc="http://schemas.microsoft.com/office/word/2010/wordprocessingCanvas" xmlns:cx="http://schemas.microsoft.com/office/drawing/2014/chartex" xmlns:cx1="http://schemas.microsoft.com/office/drawing/2015/9/8/chartex" xmlns:cx2="http://schemas.microsoft.com/office/drawing/2015/10/21/chartex" xmlns:cx3="http://schemas.microsoft.com/office/drawing/2016/5/9/chartex" xmlns:cx4="http://schemas.microsoft.com/office/drawing/2016/5/10/chartex" xmlns:cx5="http://schemas.microsoft.com/office/drawing/2016/5/11/chartex" xmlns:cx6="http://schemas.microsoft.com/office/drawing/2016/5/12/chartex" xmlns:cx7="http://schemas.microsoft.com/office/drawing/2016/5/13/chartex" xmlns:cx8="http://schemas.microsoft.com/office/drawing/2016/5/14/chartex" xmlns:mc="http://schemas.openxmlformats.org/markup-compatibility/2006" xmlns:aink="http://schemas.microsoft.com/office/drawing/2016/ink" xmlns:am3d="http://schemas.microsoft.com/office/drawing/2017/model3d" xmlns:o="urn:schemas-microsoft-com:office:office" xmlns:r="http://schemas.openxmlformats.org/officeDocument/2006/relationships" xmlns:m="http://schemas.openxmlformats.org/officeDocument/2006/math" xmlns:v="urn:schemas-microsoft-com:vml" xmlns:wp14="http://schemas.microsoft.com/office/word/2010/wordprocessingDrawing" xmlns:wp="http://schemas.openxmlformats.org/drawingml/2006/wordprocessingDrawing" xmlns:w10="urn:schemas-microsoft-com:office:word" xmlns:w="http://schemas.openxmlformats.org/wordprocessingml/2006/main" xmlns:w14="http://schemas.microsoft.com/office/word/2010/wordml" xmlns:w15="http://schemas.microsoft.com/office/word/2012/wordml" xmlns:w16cid="http://schemas.microsoft.com/office/word/2016/wordml/cid" xmlns:w16se="http://schemas.microsoft.com/office/word/2015/wordml/symex" xmlns:wpg="http://schemas.microsoft.com/office/word/2010/wordprocessingGroup" xmlns:wpi="http://schemas.microsoft.com/office/word/2010/wordprocessingInk" xmlns:wne="http://schemas.microsoft.com/office/word/2006/wordml" xmlns:wps="http://schemas.microsoft.com/office/word/2010/wordprocessingShape" mc:Ignorable="w14 w15 w16se w16cid wp14">
   <w15:commentEx w15:paraId="10DFA24D" w15:done="0"/>
+  <w15:commentEx w15:paraId="4DAD4B88" w15:done="0"/>
 </w15:commentsEx>
 </file>
 
 <file path=word/commentsIds.xml><?xml version="1.0" encoding="utf-8"?>
 <w16cid:commentsIds xmlns:wpc="http://schemas.microsoft.com/office/word/2010/wordprocessingCanvas" xmlns:cx="http://schemas.microsoft.com/office/drawing/2014/chartex" xmlns:cx1="http://schemas.microsoft.com/office/drawing/2015/9/8/chartex" xmlns:cx2="http://schemas.microsoft.com/office/drawing/2015/10/21/chartex" xmlns:cx3="http://schemas.microsoft.com/office/drawing/2016/5/9/chartex" xmlns:cx4="http://schemas.microsoft.com/office/drawing/2016/5/10/chartex" xmlns:cx5="http://schemas.microsoft.com/office/drawing/2016/5/11/chartex" xmlns:cx6="http://schemas.microsoft.com/office/drawing/2016/5/12/chartex" xmlns:cx7="http://schemas.microsoft.com/office/drawing/2016/5/13/chartex" xmlns:cx8="http://schemas.microsoft.com/office/drawing/2016/5/14/chartex" xmlns:mc="http://schemas.openxmlformats.org/markup-compatibility/2006" xmlns:aink="http://schemas.microsoft.com/office/drawing/2016/ink" xmlns:am3d="http://schemas.microsoft.com/office/drawing/2017/model3d" xmlns:o="urn:schemas-microsoft-com:office:office" xmlns:r="http://schemas.openxmlformats.org/officeDocument/2006/relationships" xmlns:m="http://schemas.openxmlformats.org/officeDocument/2006/math" xmlns:v="urn:schemas-microsoft-com:vml" xmlns:wp14="http://schemas.microsoft.com/office/word/2010/wordprocessingDrawing" xmlns:wp="http://schemas.openxmlformats.org/drawingml/2006/wordprocessingDrawing" xmlns:w10="urn:schemas-microsoft-com:office:word" xmlns:w="http://schemas.openxmlformats.org/wordprocessingml/2006/main" xmlns:w14="http://schemas.microsoft.com/office/word/2010/wordml" xmlns:w15="http://schemas.microsoft.com/office/word/2012/wordml" xmlns:w16cid="http://schemas.microsoft.com/office/word/2016/wordml/cid" xmlns:w16se="http://schemas.microsoft.com/office/word/2015/wordml/symex" xmlns:wpg="http://schemas.microsoft.com/office/word/2010/wordprocessingGroup" xmlns:wpi="http://schemas.microsoft.com/office/word/2010/wordprocessingInk" xmlns:wne="http://schemas.microsoft.com/office/word/2006/wordml" xmlns:wps="http://schemas.microsoft.com/office/word/2010/wordprocessingShape" mc:Ignorable="w14 w15 w16se w16cid wp14">
   <w16cid:commentId w16cid:paraId="10DFA24D" w16cid:durableId="29411550"/>
+  <w16cid:commentId w16cid:paraId="4DAD4B88" w16cid:durableId="29C39457"/>
 </w16cid:commentsIds>
 </file>
 
@@ -1020,7 +1500,6 @@
   <w:style w:type="character" w:default="1" w:styleId="DefaultParagraphFont">
     <w:name w:val="Default Paragraph Font"/>
     <w:uiPriority w:val="1"/>
-    <w:semiHidden/>
     <w:unhideWhenUsed/>
   </w:style>
   <w:style w:type="table" w:default="1" w:styleId="TableNormal">
@@ -1220,6 +1699,39 @@
       <w:spacing w:after="240"/>
       <w:ind w:hanging="384"/>
     </w:pPr>
+  </w:style>
+  <w:style w:type="paragraph" w:styleId="Title">
+    <w:name w:val="Title"/>
+    <w:basedOn w:val="Normal"/>
+    <w:next w:val="Normal"/>
+    <w:link w:val="TitleChar"/>
+    <w:uiPriority w:val="10"/>
+    <w:qFormat/>
+    <w:rsid w:val="00BA035B"/>
+    <w:pPr>
+      <w:contextualSpacing/>
+    </w:pPr>
+    <w:rPr>
+      <w:rFonts w:asciiTheme="majorHAnsi" w:eastAsiaTheme="majorEastAsia" w:hAnsiTheme="majorHAnsi" w:cstheme="majorBidi"/>
+      <w:spacing w:val="-10"/>
+      <w:kern w:val="28"/>
+      <w:sz w:val="56"/>
+      <w:szCs w:val="56"/>
+    </w:rPr>
+  </w:style>
+  <w:style w:type="character" w:customStyle="1" w:styleId="TitleChar">
+    <w:name w:val="Title Char"/>
+    <w:basedOn w:val="DefaultParagraphFont"/>
+    <w:link w:val="Title"/>
+    <w:uiPriority w:val="10"/>
+    <w:rsid w:val="00BA035B"/>
+    <w:rPr>
+      <w:rFonts w:asciiTheme="majorHAnsi" w:eastAsiaTheme="majorEastAsia" w:hAnsiTheme="majorHAnsi" w:cstheme="majorBidi"/>
+      <w:spacing w:val="-10"/>
+      <w:kern w:val="28"/>
+      <w:sz w:val="56"/>
+      <w:szCs w:val="56"/>
+    </w:rPr>
   </w:style>
 </w:styles>
 </file>

</xml_diff>

<commit_message>
Minor changes to discussion
</commit_message>
<xml_diff>
--- a/manuscript/Obesity-Stress/Manuscript.docx
+++ b/manuscript/Obesity-Stress/Manuscript.docx
@@ -817,6 +817,29 @@
         <w:t>For PSS measures we evaluated the interaction between obesity and stress by both PSS quartile and as a linear predictor.</w:t>
       </w:r>
     </w:p>
+    <w:p/>
+    <w:p>
+      <w:r>
+        <w:t xml:space="preserve">Finally, we tested whether the interaction between obesity and perceived stress was consistent across demographic categories.  We found that the interaction was stronger in males </w:t>
+      </w:r>
+      <w:commentRangeStart w:id="2"/>
+      <w:r>
+        <w:t>(21%) than females (0.3%), and stronger in Asian (49%) and Black (19%) participants</w:t>
+      </w:r>
+      <w:commentRangeEnd w:id="2"/>
+      <w:r>
+        <w:t xml:space="preserve"> than White (13%) or Hispanic/Latino (-45%) participants, though neither stress x obesity x gender or stress x obesity x race/ethnicity interactions reached statistical significance.  In the case of both females and Latino and Hispanic participants this is due to effects of stress on diabetes rates in non-obese participants (Figure 2B and D).  In both groups, the effects of perceived stress on diabetes prevalence are true in both obese and non-obese participants.</w:t>
+      </w:r>
+      <w:r>
+        <w:rPr>
+          <w:rStyle w:val="CommentReference"/>
+        </w:rPr>
+        <w:commentReference w:id="2"/>
+      </w:r>
+      <w:r>
+        <w:t xml:space="preserve"> </w:t>
+      </w:r>
+    </w:p>
     <w:p>
       <w:pPr>
         <w:pStyle w:val="Heading2"/>
@@ -838,19 +861,19 @@
       <w:r>
         <w:t xml:space="preserve">Given the enhancement of obesity-associated diabetes prevalence in these participants, we then evaluated several other obesity and stress-linked chronic diseases using the same approach.  </w:t>
       </w:r>
-      <w:commentRangeStart w:id="2"/>
+      <w:commentRangeStart w:id="3"/>
       <w:r>
         <w:t xml:space="preserve">In Table </w:t>
       </w:r>
       <w:r>
         <w:t>3 we describe the raw and adjusted associations between obesity and stress on hypertension, arrhythmia and liver disease.</w:t>
       </w:r>
-      <w:commentRangeEnd w:id="2"/>
+      <w:commentRangeEnd w:id="3"/>
       <w:r>
         <w:rPr>
           <w:rStyle w:val="CommentReference"/>
         </w:rPr>
-        <w:commentReference w:id="2"/>
+        <w:commentReference w:id="3"/>
       </w:r>
       <w:r>
         <w:t xml:space="preserve">  These data suggest that enhanced risk of obesity and perceived stress on diabetes is not </w:t>
@@ -858,8 +881,6 @@
       <w:r>
         <w:t>broadly true across these other conditions.</w:t>
       </w:r>
-      <w:bookmarkStart w:id="3" w:name="_GoBack"/>
-      <w:bookmarkEnd w:id="3"/>
     </w:p>
     <w:p/>
     <w:p>
@@ -879,7 +900,11 @@
         <w:t xml:space="preserve">  The higher reported stress in </w:t>
       </w:r>
       <w:r>
-        <w:t xml:space="preserve">participants with BMI &gt;30 (43-48%) relative to those with BMI between 18.5 and 30 may reflect weight stigma and could represent a positive feedback loop wherein obesity-linked psychosocial stress may enhance diabetes risk in this population.  We observe enhanced obesity-associated perceived stress in females with BMI &gt;30 (47%) compared to BMI &lt;30 (42%) than in males (42% vs 39%, </w:t>
+        <w:t xml:space="preserve">participants with BMI &gt;30 (43-48%) relative to those with BMI between 18.5 and 30 may reflect weight stigma and could represent a positive feedback loop wherein obesity-linked psychosocial stress may enhance diabetes risk in this population.  We observe enhanced </w:t>
+      </w:r>
+      <w:r>
+        <w:lastRenderedPageBreak/>
+        <w:t xml:space="preserve">obesity-associated perceived stress in females with BMI &gt;30 (47%) compared to BMI &lt;30 (42%) than in males (42% vs 39%, </w:t>
       </w:r>
       <w:proofErr w:type="spellStart"/>
       <w:r>
@@ -944,6 +969,47 @@
           <w:rStyle w:val="CommentReference"/>
         </w:rPr>
         <w:commentReference w:id="4"/>
+      </w:r>
+      <w:r>
+        <w:t xml:space="preserve">  Interestingly though, when treated separately males had a stronger obesity-stress </w:t>
+      </w:r>
+      <w:r>
+        <w:t xml:space="preserve">interaction than females potentially indicating sex or gender based differences in the way that </w:t>
+      </w:r>
+      <w:r>
+        <w:t xml:space="preserve">perceived </w:t>
+      </w:r>
+      <w:r>
+        <w:t>stress affects the pathophysiology of type 2 diabetes in humans</w:t>
+      </w:r>
+      <w:r>
+        <w:t xml:space="preserve">.  This is the opposite trend observed for job related stress and diabetes incidence in the Whitehall II study, which showed a stronger obesity-stress-diabetes relationship in females than in males </w:t>
+      </w:r>
+      <w:r>
+        <w:fldChar w:fldCharType="begin"/>
+      </w:r>
+      <w:r>
+        <w:instrText xml:space="preserve"> ADDIN ZOTERO_ITEM CSL_CITATION {"citationID":"7NoAOV3t","properties":{"formattedCitation":"(6)","plainCitation":"(6)","noteIndex":0},"citationItems":[{"id":"wYajtxYE/VWhUmnxe","uris":["http://zotero.org/users/2695081/items/3FLNIKRN"],"itemData":{"id":"wYajtxYE/VWhUmnxe","type":"article-journal","abstract":"Psychosocial work stress has been linked to higher risk of type 2 diabetes (T2DM), with the effect being consistently higher among women than men. Also, work stress has been linked to prospective weight gain among obese men but weight loss among lean men. Here, we aimed to examine the interaction between work stress and obesity in relation to T2DM risk in a gender-specific manner. We studied 5,568 white middle-aged men and women in the Whitehall II study, who were free from diabetes at analysis baseline (1993). After 1993, diabetes was ascertained at six consecutive phases by an oral glucose tolerance test supplemented by self-reports. Cox regression analysis was used to assess the association between job strain (high job demands/low job control) and 18-year incident T2DM stratifying by BMI (BMI &lt;30 kg/m(2) vs. BMI ≥30 kg/m(2)). Overall, work stress was associated with incident T2DM among women (hazard ratio (HR) 1.41: 95% confidence intervals: 1.02; 1.95) but not among men (HR 0.87: 95% confidence interval 0.69; 1.11) (P(INTERACTION) = 0.017). Among men, work stress was associated with a lower risk of T2DM in nonobese (HR 0.70: 0.53; 0.93) but not in obese individuals (P(INTERACTION) = 0.17). Among women, work stress was associated with higher risk of T2DM in the obese (HR 2.01: 1.06; 3.92) but not in the nonobese (P(INTERACTION) = 0.005). Gender and body weight status play a critical role in determining the direction of the association between psychosocial stress and T2DM. The potential effect-modifying role of gender and obesity should not be ignored by future studies looking at stress-disease associations.","container-title":"Obesity (Silver Spring, Md.)","DOI":"10.1038/oby.2011.95","ISSN":"1930-739X","issue":"2","journalAbbreviation":"Obesity (Silver Spring)","language":"eng","note":"PMID: 21593804","page":"428-433","source":"PubMed","title":"Work stress, obesity and the risk of type 2 diabetes: gender-specific bidirectional effect in the Whitehall II study","title-short":"Work stress, obesity and the risk of type 2 diabetes","volume":"20","author":[{"family":"Heraclides","given":"Alexandros M."},{"family":"Chandola","given":"Tarani"},{"family":"Witte","given":"Daniel R."},{"family":"Brunner","given":"Eric J."}],"issued":{"date-parts":[["2012",2]]}}}],"schema":"https://github.com/citation-style-language/schema/raw/master/csl-citation.json"} </w:instrText>
+      </w:r>
+      <w:r>
+        <w:fldChar w:fldCharType="separate"/>
+      </w:r>
+      <w:r>
+        <w:rPr>
+          <w:noProof/>
+        </w:rPr>
+        <w:t>(6)</w:t>
+      </w:r>
+      <w:r>
+        <w:fldChar w:fldCharType="end"/>
+      </w:r>
+      <w:r>
+        <w:t>.  This could be due to either different populations, or the differences between perceived stress and job-related stress and how they impact have gender-specific effects</w:t>
+      </w:r>
+      <w:bookmarkStart w:id="5" w:name="_GoBack"/>
+      <w:bookmarkEnd w:id="5"/>
+      <w:r>
+        <w:t>.</w:t>
       </w:r>
     </w:p>
     <w:p>
@@ -966,22 +1032,18 @@
         <w:t>P30DK020572</w:t>
       </w:r>
       <w:r>
-        <w:t xml:space="preserve"> to DB) and grants from the National Institutes of Diabetes and </w:t>
-      </w:r>
-      <w:r>
-        <w:lastRenderedPageBreak/>
-        <w:t xml:space="preserve">Digestive Kidney Diseases (DK107535 to </w:t>
-      </w:r>
-      <w:commentRangeStart w:id="5"/>
+        <w:t xml:space="preserve"> to DB) and grants from the National Institutes of Diabetes and Digestive Kidney Diseases (DK107535 to </w:t>
+      </w:r>
+      <w:commentRangeStart w:id="6"/>
       <w:r>
         <w:t>DB</w:t>
       </w:r>
-      <w:commentRangeEnd w:id="5"/>
+      <w:commentRangeEnd w:id="6"/>
       <w:r>
         <w:rPr>
           <w:rStyle w:val="CommentReference"/>
         </w:rPr>
-        <w:commentReference w:id="5"/>
+        <w:commentReference w:id="6"/>
       </w:r>
       <w:r>
         <w:t>).</w:t>
@@ -1986,7 +2048,23 @@
       </w:r>
     </w:p>
   </w:comment>
-  <w:comment w:id="2" w:author="Dave Bridges" w:date="2024-04-12T12:26:00Z" w:initials="DB">
+  <w:comment w:id="2" w:author="Dave Bridges" w:date="2024-04-12T12:34:00Z" w:initials="DB">
+    <w:p>
+      <w:pPr>
+        <w:pStyle w:val="CommentText"/>
+      </w:pPr>
+      <w:r>
+        <w:rPr>
+          <w:rStyle w:val="CommentReference"/>
+        </w:rPr>
+        <w:annotationRef/>
+      </w:r>
+      <w:r>
+        <w:t>Recheck these numbers</w:t>
+      </w:r>
+    </w:p>
+  </w:comment>
+  <w:comment w:id="3" w:author="Dave Bridges" w:date="2024-04-12T12:26:00Z" w:initials="DB">
     <w:p>
       <w:pPr>
         <w:pStyle w:val="CommentText"/>
@@ -2608,7 +2686,7 @@
       </w:r>
     </w:p>
   </w:comment>
-  <w:comment w:id="5" w:author="Dave Bridges" w:date="2024-04-12T11:07:00Z" w:initials="DB">
+  <w:comment w:id="6" w:author="Dave Bridges" w:date="2024-04-12T11:07:00Z" w:initials="DB">
     <w:p>
       <w:pPr>
         <w:pStyle w:val="CommentText"/>
@@ -2651,6 +2729,7 @@
 <w15:commentsEx xmlns:wpc="http://schemas.microsoft.com/office/word/2010/wordprocessingCanvas" xmlns:cx="http://schemas.microsoft.com/office/drawing/2014/chartex" xmlns:cx1="http://schemas.microsoft.com/office/drawing/2015/9/8/chartex" xmlns:cx2="http://schemas.microsoft.com/office/drawing/2015/10/21/chartex" xmlns:cx3="http://schemas.microsoft.com/office/drawing/2016/5/9/chartex" xmlns:cx4="http://schemas.microsoft.com/office/drawing/2016/5/10/chartex" xmlns:cx5="http://schemas.microsoft.com/office/drawing/2016/5/11/chartex" xmlns:cx6="http://schemas.microsoft.com/office/drawing/2016/5/12/chartex" xmlns:cx7="http://schemas.microsoft.com/office/drawing/2016/5/13/chartex" xmlns:cx8="http://schemas.microsoft.com/office/drawing/2016/5/14/chartex" xmlns:mc="http://schemas.openxmlformats.org/markup-compatibility/2006" xmlns:aink="http://schemas.microsoft.com/office/drawing/2016/ink" xmlns:am3d="http://schemas.microsoft.com/office/drawing/2017/model3d" xmlns:o="urn:schemas-microsoft-com:office:office" xmlns:r="http://schemas.openxmlformats.org/officeDocument/2006/relationships" xmlns:m="http://schemas.openxmlformats.org/officeDocument/2006/math" xmlns:v="urn:schemas-microsoft-com:vml" xmlns:wp14="http://schemas.microsoft.com/office/word/2010/wordprocessingDrawing" xmlns:wp="http://schemas.openxmlformats.org/drawingml/2006/wordprocessingDrawing" xmlns:w10="urn:schemas-microsoft-com:office:word" xmlns:w="http://schemas.openxmlformats.org/wordprocessingml/2006/main" xmlns:w14="http://schemas.microsoft.com/office/word/2010/wordml" xmlns:w15="http://schemas.microsoft.com/office/word/2012/wordml" xmlns:w16cid="http://schemas.microsoft.com/office/word/2016/wordml/cid" xmlns:w16se="http://schemas.microsoft.com/office/word/2015/wordml/symex" xmlns:wpg="http://schemas.microsoft.com/office/word/2010/wordprocessingGroup" xmlns:wpi="http://schemas.microsoft.com/office/word/2010/wordprocessingInk" xmlns:wne="http://schemas.microsoft.com/office/word/2006/wordml" xmlns:wps="http://schemas.microsoft.com/office/word/2010/wordprocessingShape" mc:Ignorable="w14 w15 w16se w16cid wp14">
   <w15:commentEx w15:paraId="10DFA24D" w15:done="0"/>
   <w15:commentEx w15:paraId="4FA6F45D" w15:done="0"/>
+  <w15:commentEx w15:paraId="5B10A6FF" w15:done="0"/>
   <w15:commentEx w15:paraId="620828B1" w15:done="0"/>
   <w15:commentEx w15:paraId="6B0600C2" w15:done="0"/>
   <w15:commentEx w15:paraId="4DAD4B88" w15:done="0"/>
@@ -2661,6 +2740,7 @@
 <w16cid:commentsIds xmlns:wpc="http://schemas.microsoft.com/office/word/2010/wordprocessingCanvas" xmlns:cx="http://schemas.microsoft.com/office/drawing/2014/chartex" xmlns:cx1="http://schemas.microsoft.com/office/drawing/2015/9/8/chartex" xmlns:cx2="http://schemas.microsoft.com/office/drawing/2015/10/21/chartex" xmlns:cx3="http://schemas.microsoft.com/office/drawing/2016/5/9/chartex" xmlns:cx4="http://schemas.microsoft.com/office/drawing/2016/5/10/chartex" xmlns:cx5="http://schemas.microsoft.com/office/drawing/2016/5/11/chartex" xmlns:cx6="http://schemas.microsoft.com/office/drawing/2016/5/12/chartex" xmlns:cx7="http://schemas.microsoft.com/office/drawing/2016/5/13/chartex" xmlns:cx8="http://schemas.microsoft.com/office/drawing/2016/5/14/chartex" xmlns:mc="http://schemas.openxmlformats.org/markup-compatibility/2006" xmlns:aink="http://schemas.microsoft.com/office/drawing/2016/ink" xmlns:am3d="http://schemas.microsoft.com/office/drawing/2017/model3d" xmlns:o="urn:schemas-microsoft-com:office:office" xmlns:r="http://schemas.openxmlformats.org/officeDocument/2006/relationships" xmlns:m="http://schemas.openxmlformats.org/officeDocument/2006/math" xmlns:v="urn:schemas-microsoft-com:vml" xmlns:wp14="http://schemas.microsoft.com/office/word/2010/wordprocessingDrawing" xmlns:wp="http://schemas.openxmlformats.org/drawingml/2006/wordprocessingDrawing" xmlns:w10="urn:schemas-microsoft-com:office:word" xmlns:w="http://schemas.openxmlformats.org/wordprocessingml/2006/main" xmlns:w14="http://schemas.microsoft.com/office/word/2010/wordml" xmlns:w15="http://schemas.microsoft.com/office/word/2012/wordml" xmlns:w16cid="http://schemas.microsoft.com/office/word/2016/wordml/cid" xmlns:w16se="http://schemas.microsoft.com/office/word/2015/wordml/symex" xmlns:wpg="http://schemas.microsoft.com/office/word/2010/wordprocessingGroup" xmlns:wpi="http://schemas.microsoft.com/office/word/2010/wordprocessingInk" xmlns:wne="http://schemas.microsoft.com/office/word/2006/wordml" xmlns:wps="http://schemas.microsoft.com/office/word/2010/wordprocessingShape" mc:Ignorable="w14 w15 w16se w16cid wp14">
   <w16cid:commentId w16cid:paraId="10DFA24D" w16cid:durableId="29411550"/>
   <w16cid:commentId w16cid:paraId="4FA6F45D" w16cid:durableId="29C3A1B4"/>
+  <w16cid:commentId w16cid:paraId="5B10A6FF" w16cid:durableId="29C3A8EF"/>
   <w16cid:commentId w16cid:paraId="620828B1" w16cid:durableId="29C3A6FB"/>
   <w16cid:commentId w16cid:paraId="6B0600C2" w16cid:durableId="29C39F1A"/>
   <w16cid:commentId w16cid:paraId="4DAD4B88" w16cid:durableId="29C39457"/>

</xml_diff>

<commit_message>
Made revisions and parts of the tables
</commit_message>
<xml_diff>
--- a/manuscript/Obesity-Stress/Manuscript.docx
+++ b/manuscript/Obesity-Stress/Manuscript.docx
@@ -1,6 +1,6 @@
 
 <file path=word/document.xml><?xml version="1.0" encoding="utf-8"?>
-<w:document xmlns:wpc="http://schemas.microsoft.com/office/word/2010/wordprocessingCanvas" xmlns:cx="http://schemas.microsoft.com/office/drawing/2014/chartex" xmlns:cx1="http://schemas.microsoft.com/office/drawing/2015/9/8/chartex" xmlns:cx2="http://schemas.microsoft.com/office/drawing/2015/10/21/chartex" xmlns:cx3="http://schemas.microsoft.com/office/drawing/2016/5/9/chartex" xmlns:cx4="http://schemas.microsoft.com/office/drawing/2016/5/10/chartex" xmlns:cx5="http://schemas.microsoft.com/office/drawing/2016/5/11/chartex" xmlns:cx6="http://schemas.microsoft.com/office/drawing/2016/5/12/chartex" xmlns:cx7="http://schemas.microsoft.com/office/drawing/2016/5/13/chartex" xmlns:cx8="http://schemas.microsoft.com/office/drawing/2016/5/14/chartex" xmlns:mc="http://schemas.openxmlformats.org/markup-compatibility/2006" xmlns:aink="http://schemas.microsoft.com/office/drawing/2016/ink" xmlns:am3d="http://schemas.microsoft.com/office/drawing/2017/model3d" xmlns:o="urn:schemas-microsoft-com:office:office" xmlns:r="http://schemas.openxmlformats.org/officeDocument/2006/relationships" xmlns:m="http://schemas.openxmlformats.org/officeDocument/2006/math" xmlns:v="urn:schemas-microsoft-com:vml" xmlns:wp14="http://schemas.microsoft.com/office/word/2010/wordprocessingDrawing" xmlns:wp="http://schemas.openxmlformats.org/drawingml/2006/wordprocessingDrawing" xmlns:w10="urn:schemas-microsoft-com:office:word" xmlns:w="http://schemas.openxmlformats.org/wordprocessingml/2006/main" xmlns:w14="http://schemas.microsoft.com/office/word/2010/wordml" xmlns:w15="http://schemas.microsoft.com/office/word/2012/wordml" xmlns:w16cid="http://schemas.microsoft.com/office/word/2016/wordml/cid" xmlns:w16se="http://schemas.microsoft.com/office/word/2015/wordml/symex" xmlns:wpg="http://schemas.microsoft.com/office/word/2010/wordprocessingGroup" xmlns:wpi="http://schemas.microsoft.com/office/word/2010/wordprocessingInk" xmlns:wne="http://schemas.microsoft.com/office/word/2006/wordml" xmlns:wps="http://schemas.microsoft.com/office/word/2010/wordprocessingShape" mc:Ignorable="w14 w15 w16se w16cid wp14">
+<w:document xmlns:wpc="http://schemas.microsoft.com/office/word/2010/wordprocessingCanvas" xmlns:cx="http://schemas.microsoft.com/office/drawing/2014/chartex" xmlns:cx1="http://schemas.microsoft.com/office/drawing/2015/9/8/chartex" xmlns:cx2="http://schemas.microsoft.com/office/drawing/2015/10/21/chartex" xmlns:cx3="http://schemas.microsoft.com/office/drawing/2016/5/9/chartex" xmlns:cx4="http://schemas.microsoft.com/office/drawing/2016/5/10/chartex" xmlns:cx5="http://schemas.microsoft.com/office/drawing/2016/5/11/chartex" xmlns:cx6="http://schemas.microsoft.com/office/drawing/2016/5/12/chartex" xmlns:cx7="http://schemas.microsoft.com/office/drawing/2016/5/13/chartex" xmlns:cx8="http://schemas.microsoft.com/office/drawing/2016/5/14/chartex" xmlns:mc="http://schemas.openxmlformats.org/markup-compatibility/2006" xmlns:aink="http://schemas.microsoft.com/office/drawing/2016/ink" xmlns:am3d="http://schemas.microsoft.com/office/drawing/2017/model3d" xmlns:o="urn:schemas-microsoft-com:office:office" xmlns:oel="http://schemas.microsoft.com/office/2019/extlst" xmlns:r="http://schemas.openxmlformats.org/officeDocument/2006/relationships" xmlns:m="http://schemas.openxmlformats.org/officeDocument/2006/math" xmlns:v="urn:schemas-microsoft-com:vml" xmlns:wp14="http://schemas.microsoft.com/office/word/2010/wordprocessingDrawing" xmlns:wp="http://schemas.openxmlformats.org/drawingml/2006/wordprocessingDrawing" xmlns:w10="urn:schemas-microsoft-com:office:word" xmlns:w="http://schemas.openxmlformats.org/wordprocessingml/2006/main" xmlns:w14="http://schemas.microsoft.com/office/word/2010/wordml" xmlns:w15="http://schemas.microsoft.com/office/word/2012/wordml" xmlns:w16cex="http://schemas.microsoft.com/office/word/2018/wordml/cex" xmlns:w16cid="http://schemas.microsoft.com/office/word/2016/wordml/cid" xmlns:w16="http://schemas.microsoft.com/office/word/2018/wordml" xmlns:w16sdtdh="http://schemas.microsoft.com/office/word/2020/wordml/sdtdatahash" xmlns:w16se="http://schemas.microsoft.com/office/word/2015/wordml/symex" xmlns:wpg="http://schemas.microsoft.com/office/word/2010/wordprocessingGroup" xmlns:wpi="http://schemas.microsoft.com/office/word/2010/wordprocessingInk" xmlns:wne="http://schemas.microsoft.com/office/word/2006/wordml" xmlns:wps="http://schemas.microsoft.com/office/word/2010/wordprocessingShape" mc:Ignorable="w14 w15 w16se w16cid w16 w16cex w16sdtdh wp14">
   <w:body>
     <w:p>
       <w:pPr>
@@ -145,19 +145,15 @@
       <w:r>
         <w:t>. Physiological pathways induced by chronic stress, including dysfunctional hypothalamic-</w:t>
       </w:r>
-      <w:proofErr w:type="spellStart"/>
-      <w:r>
-        <w:t>pitutary</w:t>
-      </w:r>
-      <w:proofErr w:type="spellEnd"/>
+      <w:r>
+        <w:t>pituitary</w:t>
+      </w:r>
       <w:r>
         <w:t xml:space="preserve">-adrenal axis </w:t>
       </w:r>
-      <w:proofErr w:type="spellStart"/>
-      <w:r>
-        <w:t>activaty</w:t>
-      </w:r>
-      <w:proofErr w:type="spellEnd"/>
+      <w:r>
+        <w:t>activity</w:t>
+      </w:r>
       <w:r>
         <w:t xml:space="preserve"> and hyperactivation of the sympathetic nervous system, can disrupt glucose homeostasis, leading to insulin resistance – a key precursor to type 2 diabetes </w:t>
       </w:r>
@@ -390,7 +386,26 @@
         <w:t>defined for each participant</w:t>
       </w:r>
       <w:r>
-        <w:t xml:space="preserve"> by taking the median value if multiple measurements were available. To </w:t>
+        <w:t xml:space="preserve"> by taking the median value if multiple measurements were available. </w:t>
+      </w:r>
+      <w:r>
+        <w:t xml:space="preserve">Prior to sensitivity analyses we dichotomized participants as BMI greater or less </w:t>
+      </w:r>
+      <w:r>
+        <w:lastRenderedPageBreak/>
+        <w:t>than 30 kg/m</w:t>
+      </w:r>
+      <w:r>
+        <w:rPr>
+          <w:vertAlign w:val="superscript"/>
+        </w:rPr>
+        <w:t>2</w:t>
+      </w:r>
+      <w:r>
+        <w:t xml:space="preserve">.  </w:t>
+      </w:r>
+      <w:r>
+        <w:t xml:space="preserve">To </w:t>
       </w:r>
       <w:r>
         <w:t>estimate the</w:t>
@@ -414,11 +429,7 @@
         <w:t>aggregate</w:t>
       </w:r>
       <w:r>
-        <w:t xml:space="preserve"> sum </w:t>
-      </w:r>
-      <w:r>
-        <w:lastRenderedPageBreak/>
-        <w:t>of the PSS4 score and stratified as above or below the median score (</w:t>
+        <w:t xml:space="preserve"> sum of the PSS4 score and stratified as above or below the median score (</w:t>
       </w:r>
       <w:r>
         <w:t>5 out of 16</w:t>
@@ -505,7 +516,13 @@
     </w:p>
     <w:p>
       <w:r>
-        <w:t xml:space="preserve">Significance for this study was set at an alpha of 0.05.  </w:t>
+        <w:t xml:space="preserve">Significance for this study was set at an </w:t>
+      </w:r>
+      <w:r>
+        <w:t>p&lt;</w:t>
+      </w:r>
+      <w:r>
+        <w:t xml:space="preserve"> 0.05.  </w:t>
       </w:r>
       <w:r>
         <w:t xml:space="preserve">Data are reported as +/- standard error of the mean.  </w:t>
@@ -548,6 +565,9 @@
       </w:r>
       <w:r>
         <w:t xml:space="preserve"> </w:t>
+      </w:r>
+      <w:r>
+        <w:t xml:space="preserve">Multivariate analyses were performed by stepwise addition of covariates.  Sensitivity analyses were performed using BMI and PSS scores as a continuous variable, and with PSS scores as a continuous variable.  We also did subgroup analyses within each demographic group testing for effect modification of the obesity-stress relationship on diabetes incidence.  </w:t>
       </w:r>
     </w:p>
     <w:p/>
@@ -574,7 +594,19 @@
         <w:t xml:space="preserve">Among the participants in this study, </w:t>
       </w:r>
       <w:r>
-        <w:t xml:space="preserve">the median age was 52 +/- 13, </w:t>
+        <w:t xml:space="preserve">the median age was </w:t>
+      </w:r>
+      <w:r>
+        <w:t>53</w:t>
+      </w:r>
+      <w:r>
+        <w:t xml:space="preserve"> </w:t>
+      </w:r>
+      <w:r>
+        <w:t>years</w:t>
+      </w:r>
+      <w:r>
+        <w:t xml:space="preserve">, </w:t>
       </w:r>
       <w:r>
         <w:t xml:space="preserve">with </w:t>
@@ -592,7 +624,13 @@
         <w:t xml:space="preserve"> mean </w:t>
       </w:r>
       <w:r>
-        <w:t>BMI of 29.8 +/- 7 kg/m</w:t>
+        <w:t xml:space="preserve">BMI of </w:t>
+      </w:r>
+      <w:r>
+        <w:t>30</w:t>
+      </w:r>
+      <w:r>
+        <w:t xml:space="preserve"> kg/m</w:t>
       </w:r>
       <w:r>
         <w:rPr>
@@ -616,7 +654,19 @@
         <w:t xml:space="preserve">Table 1).  </w:t>
       </w:r>
       <w:r>
-        <w:t xml:space="preserve">15% of this population was diagnosed with type 2 diabetes. </w:t>
+        <w:t xml:space="preserve">15% of </w:t>
+      </w:r>
+      <w:r>
+        <w:t xml:space="preserve">the participants </w:t>
+      </w:r>
+      <w:r>
+        <w:t>w</w:t>
+      </w:r>
+      <w:r>
+        <w:t>ere</w:t>
+      </w:r>
+      <w:r>
+        <w:t xml:space="preserve"> diagnosed with type 2 diabetes. </w:t>
       </w:r>
       <w:r>
         <w:t>We stratified this population as low or high</w:t>
@@ -631,13 +681,19 @@
         <w:t xml:space="preserve">their PSS score at enrollment.  </w:t>
       </w:r>
       <w:r>
-        <w:t>As shown in Table 1, several demographic factors were significantly different between participants with high PSS scores including race (higher in Black and Hispanic or Latino participants), male gender (</w:t>
+        <w:t xml:space="preserve">As shown in Table 1, several demographic factors were significantly different between participants with high PSS scores including race (higher in Black and Hispanic or Latino participants), </w:t>
+      </w:r>
+      <w:r>
+        <w:t>fe</w:t>
+      </w:r>
+      <w:r>
+        <w:t>male gender (</w:t>
       </w:r>
       <w:r>
         <w:t xml:space="preserve">5% </w:t>
       </w:r>
       <w:r>
-        <w:t>lower</w:t>
+        <w:t>higher than male</w:t>
       </w:r>
       <w:r>
         <w:t xml:space="preserve">), younger age (particularly under 60 years old), and the </w:t>
@@ -667,10 +723,13 @@
         <w:t>positively associated with a higher likelihood of perceived stress.</w:t>
       </w:r>
       <w:r>
-        <w:t xml:space="preserve">  We noted that </w:t>
-      </w:r>
-      <w:r>
-        <w:t xml:space="preserve">among participants with type 2 diabetes, there </w:t>
+        <w:t xml:space="preserve">  </w:t>
+      </w:r>
+      <w:r>
+        <w:t>Among</w:t>
+      </w:r>
+      <w:r>
+        <w:t xml:space="preserve"> participants with type 2 diabetes, there </w:t>
       </w:r>
       <w:r>
         <w:t>were more participants reporting</w:t>
@@ -694,7 +753,13 @@
         <w:t>, p</w:t>
       </w:r>
       <w:r>
-        <w:t xml:space="preserve"> = 4.5 x 10</w:t>
+        <w:t xml:space="preserve"> = </w:t>
+      </w:r>
+      <w:r>
+        <w:t>6</w:t>
+      </w:r>
+      <w:r>
+        <w:t xml:space="preserve"> x 10</w:t>
       </w:r>
       <w:r>
         <w:rPr>
@@ -739,102 +804,170 @@
         <w:t xml:space="preserve">  </w:t>
       </w:r>
       <w:r>
-        <w:t xml:space="preserve">We stratified participants into those with a BMI above or below 30 kg/m2 and with above or below median stress.  As expected, participants with obesity had higher type 2 diabetes prevalence than those with a BMI under 30 (unadjusted odds ratio 3.1 +/- 1.0).  As Figure </w:t>
-      </w:r>
-      <w:r>
+        <w:t>We stratified participants into those with a BMI above or below 30 kg/m</w:t>
+      </w:r>
+      <w:r>
+        <w:rPr>
+          <w:vertAlign w:val="superscript"/>
+        </w:rPr>
         <w:t>2</w:t>
       </w:r>
       <w:r>
+        <w:t xml:space="preserve"> and with above or below median stress.  As expected, participants with obesity had higher type 2 diabetes </w:t>
+      </w:r>
+      <w:r>
+        <w:lastRenderedPageBreak/>
+        <w:t xml:space="preserve">prevalence than those with a BMI under 30 (unadjusted odds ratio 3.1 +/- 1.0).  </w:t>
+      </w:r>
+      <w:r>
+        <w:t xml:space="preserve">While diabetes rates were higher in male participants with than females (11.6% vs 6.8% among participants without obesity; 26.9% vs 22.1% in participants with obesity), the effect of obesity was somewhat attenuated in male participants (Obesity effect was 38% reduced in male participants </w:t>
+      </w:r>
+      <w:proofErr w:type="spellStart"/>
+      <w:r>
+        <w:t>p</w:t>
+      </w:r>
+      <w:r>
+        <w:rPr>
+          <w:vertAlign w:val="subscript"/>
+        </w:rPr>
+        <w:t>gender</w:t>
+      </w:r>
+      <w:proofErr w:type="spellEnd"/>
+      <w:r>
+        <w:rPr>
+          <w:vertAlign w:val="subscript"/>
+        </w:rPr>
+        <w:t xml:space="preserve"> x obesity</w:t>
+      </w:r>
+      <w:r>
+        <w:t>=4.5 x 10</w:t>
+      </w:r>
+      <w:r>
+        <w:rPr>
+          <w:vertAlign w:val="superscript"/>
+        </w:rPr>
+        <w:t>-8</w:t>
+      </w:r>
+      <w:r>
+        <w:t xml:space="preserve">).  </w:t>
+      </w:r>
+      <w:r>
+        <w:t xml:space="preserve">As Figure </w:t>
+      </w:r>
+      <w:r>
+        <w:t>2</w:t>
+      </w:r>
+      <w:r>
         <w:t>A</w:t>
       </w:r>
       <w:r>
-        <w:t xml:space="preserve"> shows, there is a significant elevation in diabetes prevalence in high stress, participants with obesity (26.8%) relative to low stress, participants with obesity (22.2%, p=</w:t>
+        <w:t xml:space="preserve"> shows, there </w:t>
+      </w:r>
+      <w:r>
+        <w:t>was</w:t>
+      </w:r>
+      <w:r>
+        <w:t xml:space="preserve"> a significant elevation in diabetes prevalence </w:t>
+      </w:r>
+      <w:r>
+        <w:t xml:space="preserve">for </w:t>
+      </w:r>
+      <w:r>
+        <w:t>participants with obesity</w:t>
+      </w:r>
+      <w:r>
+        <w:t xml:space="preserve"> who reported elevated perceived stress</w:t>
+      </w:r>
+      <w:r>
+        <w:t xml:space="preserve"> (26.8%) relative to </w:t>
+      </w:r>
+      <w:r>
+        <w:t xml:space="preserve">those reporting </w:t>
+      </w:r>
+      <w:r>
+        <w:t>low stress (22.2%)</w:t>
+      </w:r>
+      <w:r>
+        <w:t xml:space="preserve">.  </w:t>
+      </w:r>
+      <w:r>
+        <w:t xml:space="preserve">Perceived stress was associated with 13% increased diabetes prevalence in participants without obesity (p=0.005) but was </w:t>
+      </w:r>
+      <w:proofErr w:type="gramStart"/>
+      <w:r>
+        <w:t>increased  27</w:t>
+      </w:r>
+      <w:proofErr w:type="gramEnd"/>
+      <w:r>
+        <w:t xml:space="preserve">% in participants with obesity (p=XXX).  This represented a synergistic interaction between obesity and perceived stress on diabetes risk (12% increase, p=0.056).  </w:t>
+      </w:r>
+      <w:r>
+        <w:t xml:space="preserve">This effect was similar across gender, and neighborhood socioeconomic status (Figure </w:t>
+      </w:r>
+      <w:r>
+        <w:t>2</w:t>
+      </w:r>
+      <w:r>
+        <w:t xml:space="preserve">B-C).  The effect was consistent across race and ethnicities, with the exception of Hispanic or </w:t>
+      </w:r>
+      <w:r>
+        <w:t>L</w:t>
+      </w:r>
+      <w:r>
+        <w:t>atino participants who had enhanced diabetes rates in high stress participants with and without obesity.</w:t>
+      </w:r>
+      <w:r>
+        <w:t xml:space="preserve">  </w:t>
+      </w:r>
+    </w:p>
+    <w:p/>
+    <w:p>
+      <w:r>
+        <w:t>Multivariate analyses of the interaction between obesity status and stress are shown in Table 2.  The synergistic effect of perceived stress and obesity increased type 2 diabetes risk by approximately 18.5 +/- 6.7 % and was robust to adjustments for gender, age, ethnicity, and socioeconomic status.</w:t>
+      </w:r>
+    </w:p>
+    <w:p/>
+    <w:p>
+      <w:r>
+        <w:t>We performed several sensitivity analyses</w:t>
+      </w:r>
+      <w:r>
+        <w:t xml:space="preserve"> to probe this relationship</w:t>
+      </w:r>
+      <w:r>
+        <w:t>.</w:t>
+      </w:r>
+    </w:p>
+    <w:p/>
+    <w:p>
+      <w:r>
+        <w:t>We stratified BMI into subcategories (underweight, overweight, class I, II, and II obese) as well as treating it as a linear covariate.</w:t>
+      </w:r>
+    </w:p>
+    <w:p/>
+    <w:p>
+      <w:r>
+        <w:t>For PSS measures we evaluated the interaction between obesity and stress by both PSS quartile and as a linear predictor.</w:t>
+      </w:r>
+    </w:p>
+    <w:p/>
+    <w:p>
+      <w:r>
+        <w:t xml:space="preserve">Finally, we tested whether the interaction between obesity and perceived stress was consistent across demographic categories.  We found that the interaction was stronger in males </w:t>
       </w:r>
       <w:commentRangeStart w:id="1"/>
       <w:r>
-        <w:t>XXX</w:t>
+        <w:t>(21%) than females (0.3%), and stronger in Asian (49%) and Black (19%) participants</w:t>
       </w:r>
       <w:commentRangeEnd w:id="1"/>
       <w:r>
+        <w:t xml:space="preserve"> than White (13%) or Hispanic/Latino (-45%) participants, though neither stress x obesity x gender or stress x obesity x race/ethnicity interactions reached statistical significance.  In the case of both females and Latino and Hispanic participants this is due to effects of stress on diabetes rates in non-obese participants (Figure 2B and D).  In both groups, the effects of perceived stress on diabetes prevalence are true in both obese and non-obese participants.</w:t>
+      </w:r>
+      <w:r>
         <w:rPr>
           <w:rStyle w:val="CommentReference"/>
         </w:rPr>
         <w:commentReference w:id="1"/>
-      </w:r>
-      <w:r>
-        <w:t>)</w:t>
-      </w:r>
-      <w:r>
-        <w:t xml:space="preserve">.  This effect was similar across gender, and neighborhood socioeconomic status (Figure </w:t>
-      </w:r>
-      <w:r>
-        <w:t>2</w:t>
-      </w:r>
-      <w:r>
-        <w:t xml:space="preserve">B-C).  The effect was </w:t>
-      </w:r>
-      <w:r>
-        <w:lastRenderedPageBreak/>
-        <w:t xml:space="preserve">consistent across race and ethnicities, with the exception of Hispanic or </w:t>
-      </w:r>
-      <w:r>
-        <w:t>L</w:t>
-      </w:r>
-      <w:r>
-        <w:t>atino participants who had enhanced diabetes rates in high stress participants with and without obesity.</w:t>
-      </w:r>
-      <w:r>
-        <w:t xml:space="preserve">  </w:t>
-      </w:r>
-    </w:p>
-    <w:p/>
-    <w:p>
-      <w:r>
-        <w:t>Multivariate analyses of the interaction between obesity status and stress are shown in Table 2.  The synergistic effect of perceived stress and obesity increased type 2 diabetes risk by approximately 18.5 +/- 6.7 % and was robust to adjustments for gender, age, ethnicity, and socioeconomic status.</w:t>
-      </w:r>
-    </w:p>
-    <w:p/>
-    <w:p>
-      <w:r>
-        <w:t>We performed several sensitivity analyses</w:t>
-      </w:r>
-      <w:r>
-        <w:t xml:space="preserve"> to probe this relationship</w:t>
-      </w:r>
-      <w:r>
-        <w:t>.</w:t>
-      </w:r>
-    </w:p>
-    <w:p/>
-    <w:p>
-      <w:r>
-        <w:t>We stratified BMI into subcategories (underweight, overweight, class I, II, and II obese) as well as treating it as a linear covariate.</w:t>
-      </w:r>
-    </w:p>
-    <w:p/>
-    <w:p>
-      <w:r>
-        <w:t>For PSS measures we evaluated the interaction between obesity and stress by both PSS quartile and as a linear predictor.</w:t>
-      </w:r>
-    </w:p>
-    <w:p/>
-    <w:p>
-      <w:r>
-        <w:t xml:space="preserve">Finally, we tested whether the interaction between obesity and perceived stress was consistent across demographic categories.  We found that the interaction was stronger in males </w:t>
-      </w:r>
-      <w:commentRangeStart w:id="2"/>
-      <w:r>
-        <w:t>(21%) than females (0.3%), and stronger in Asian (49%) and Black (19%) participants</w:t>
-      </w:r>
-      <w:commentRangeEnd w:id="2"/>
-      <w:r>
-        <w:t xml:space="preserve"> than White (13%) or Hispanic/Latino (-45%) participants, though neither stress x obesity x gender or stress x obesity x race/ethnicity interactions reached statistical significance.  In the case of both females and Latino and Hispanic participants this is due to effects of stress on diabetes rates in non-obese participants (Figure 2B and D).  In both groups, the effects of perceived stress on diabetes prevalence are true in both obese and non-obese participants.</w:t>
-      </w:r>
-      <w:r>
-        <w:rPr>
-          <w:rStyle w:val="CommentReference"/>
-        </w:rPr>
-        <w:commentReference w:id="2"/>
       </w:r>
       <w:r>
         <w:t xml:space="preserve"> </w:t>
@@ -861,19 +994,23 @@
       <w:r>
         <w:t xml:space="preserve">Given the enhancement of obesity-associated diabetes prevalence in these participants, we then evaluated several other obesity and stress-linked chronic diseases using the same approach.  </w:t>
       </w:r>
-      <w:commentRangeStart w:id="3"/>
+      <w:commentRangeStart w:id="2"/>
       <w:r>
         <w:t xml:space="preserve">In Table </w:t>
       </w:r>
       <w:r>
-        <w:t>3 we describe the raw and adjusted associations between obesity and stress on hypertension, arrhythmia and liver disease.</w:t>
-      </w:r>
-      <w:commentRangeEnd w:id="3"/>
+        <w:t xml:space="preserve">3 we describe the raw and adjusted associations between obesity and stress </w:t>
+      </w:r>
+      <w:r>
+        <w:lastRenderedPageBreak/>
+        <w:t>on hypertension, arrhythmia and liver disease.</w:t>
+      </w:r>
+      <w:commentRangeEnd w:id="2"/>
       <w:r>
         <w:rPr>
           <w:rStyle w:val="CommentReference"/>
         </w:rPr>
-        <w:commentReference w:id="3"/>
+        <w:commentReference w:id="2"/>
       </w:r>
       <w:r>
         <w:t xml:space="preserve">  These data suggest that enhanced risk of obesity and perceived stress on diabetes is not </w:t>
@@ -900,11 +1037,7 @@
         <w:t xml:space="preserve">  The higher reported stress in </w:t>
       </w:r>
       <w:r>
-        <w:t xml:space="preserve">participants with BMI &gt;30 (43-48%) relative to those with BMI between 18.5 and 30 may reflect weight stigma and could represent a positive feedback loop wherein obesity-linked psychosocial stress may enhance diabetes risk in this population.  We observe enhanced </w:t>
-      </w:r>
-      <w:r>
-        <w:lastRenderedPageBreak/>
-        <w:t xml:space="preserve">obesity-associated perceived stress in females with BMI &gt;30 (47%) compared to BMI &lt;30 (42%) than in males (42% vs 39%, </w:t>
+        <w:t xml:space="preserve">participants with BMI &gt;30 (43-48%) relative to those with BMI between 18.5 and 30 may reflect weight stigma and could represent a positive feedback loop wherein obesity-linked psychosocial stress may enhance diabetes risk in this population.  We observe enhanced obesity-associated perceived stress in females with BMI &gt;30 (47%) compared to BMI &lt;30 (42%) than in males (42% vs 39%, </w:t>
       </w:r>
       <w:proofErr w:type="spellStart"/>
       <w:r>
@@ -938,7 +1071,7 @@
       <w:r>
         <w:t xml:space="preserve">= 0.0026), consistent with higher rates of weight discrimination in </w:t>
       </w:r>
-      <w:commentRangeStart w:id="4"/>
+      <w:commentRangeStart w:id="3"/>
       <w:r>
         <w:t xml:space="preserve">women </w:t>
       </w:r>
@@ -963,12 +1096,12 @@
       <w:r>
         <w:t>.</w:t>
       </w:r>
-      <w:commentRangeEnd w:id="4"/>
+      <w:commentRangeEnd w:id="3"/>
       <w:r>
         <w:rPr>
           <w:rStyle w:val="CommentReference"/>
         </w:rPr>
-        <w:commentReference w:id="4"/>
+        <w:commentReference w:id="3"/>
       </w:r>
       <w:r>
         <w:t xml:space="preserve">  Interestingly though, when treated separately males had a stronger obesity-stress </w:t>
@@ -1004,12 +1137,7 @@
         <w:fldChar w:fldCharType="end"/>
       </w:r>
       <w:r>
-        <w:t>.  This could be due to either different populations, or the differences between perceived stress and job-related stress and how they impact have gender-specific effects</w:t>
-      </w:r>
-      <w:bookmarkStart w:id="5" w:name="_GoBack"/>
-      <w:bookmarkEnd w:id="5"/>
-      <w:r>
-        <w:t>.</w:t>
+        <w:t>.  This could be due to either different populations, or the differences between perceived stress and job-related stress and how they impact have gender-specific effects.</w:t>
       </w:r>
     </w:p>
     <w:p>
@@ -1034,16 +1162,16 @@
       <w:r>
         <w:t xml:space="preserve"> to DB) and grants from the National Institutes of Diabetes and Digestive Kidney Diseases (DK107535 to </w:t>
       </w:r>
-      <w:commentRangeStart w:id="6"/>
+      <w:commentRangeStart w:id="4"/>
       <w:r>
         <w:t>DB</w:t>
       </w:r>
-      <w:commentRangeEnd w:id="6"/>
+      <w:commentRangeEnd w:id="4"/>
       <w:r>
         <w:rPr>
           <w:rStyle w:val="CommentReference"/>
         </w:rPr>
-        <w:commentReference w:id="6"/>
+        <w:commentReference w:id="4"/>
       </w:r>
       <w:r>
         <w:t>).</w:t>
@@ -1110,35 +1238,7 @@
           <w:rFonts w:ascii="Calibri" w:cs="Calibri"/>
         </w:rPr>
         <w:tab/>
-        <w:t xml:space="preserve">Klein S, </w:t>
-      </w:r>
-      <w:proofErr w:type="spellStart"/>
-      <w:r>
-        <w:rPr>
-          <w:rFonts w:ascii="Calibri" w:cs="Calibri"/>
-        </w:rPr>
-        <w:t>Gastaldelli</w:t>
-      </w:r>
-      <w:proofErr w:type="spellEnd"/>
-      <w:r>
-        <w:rPr>
-          <w:rFonts w:ascii="Calibri" w:cs="Calibri"/>
-        </w:rPr>
-        <w:t xml:space="preserve"> A, </w:t>
-      </w:r>
-      <w:proofErr w:type="spellStart"/>
-      <w:r>
-        <w:rPr>
-          <w:rFonts w:ascii="Calibri" w:cs="Calibri"/>
-        </w:rPr>
-        <w:t>Yki-Järvinen</w:t>
-      </w:r>
-      <w:proofErr w:type="spellEnd"/>
-      <w:r>
-        <w:rPr>
-          <w:rFonts w:ascii="Calibri" w:cs="Calibri"/>
-        </w:rPr>
-        <w:t xml:space="preserve"> H, Scherer PE. Why does obesity cause diabetes? </w:t>
+        <w:t xml:space="preserve">Klein S, Gastaldelli A, Yki-Järvinen H, Scherer PE. Why does obesity cause diabetes? </w:t>
       </w:r>
       <w:r>
         <w:rPr>
@@ -1152,21 +1252,7 @@
         <w:rPr>
           <w:rFonts w:ascii="Calibri" w:cs="Calibri"/>
         </w:rPr>
-        <w:t xml:space="preserve"> </w:t>
-      </w:r>
-      <w:proofErr w:type="gramStart"/>
-      <w:r>
-        <w:rPr>
-          <w:rFonts w:ascii="Calibri" w:cs="Calibri"/>
-        </w:rPr>
-        <w:t>2022;34:11</w:t>
-      </w:r>
-      <w:proofErr w:type="gramEnd"/>
-      <w:r>
-        <w:rPr>
-          <w:rFonts w:ascii="Calibri" w:cs="Calibri"/>
-        </w:rPr>
-        <w:t>–20.</w:t>
+        <w:t xml:space="preserve"> 2022;34:11–20.</w:t>
       </w:r>
     </w:p>
     <w:p>
@@ -1187,96 +1273,105 @@
           <w:rFonts w:ascii="Calibri" w:cs="Calibri"/>
         </w:rPr>
         <w:tab/>
-      </w:r>
-      <w:proofErr w:type="spellStart"/>
-      <w:r>
-        <w:rPr>
-          <w:rFonts w:ascii="Calibri" w:cs="Calibri"/>
-        </w:rPr>
-        <w:t>Ingrosso</w:t>
-      </w:r>
-      <w:proofErr w:type="spellEnd"/>
-      <w:r>
-        <w:rPr>
-          <w:rFonts w:ascii="Calibri" w:cs="Calibri"/>
-        </w:rPr>
-        <w:t xml:space="preserve"> DMF, Primavera M, </w:t>
-      </w:r>
-      <w:proofErr w:type="spellStart"/>
-      <w:r>
-        <w:rPr>
-          <w:rFonts w:ascii="Calibri" w:cs="Calibri"/>
-        </w:rPr>
-        <w:t>Samvelyan</w:t>
-      </w:r>
-      <w:proofErr w:type="spellEnd"/>
-      <w:r>
-        <w:rPr>
-          <w:rFonts w:ascii="Calibri" w:cs="Calibri"/>
-        </w:rPr>
-        <w:t xml:space="preserve"> S, </w:t>
-      </w:r>
-      <w:proofErr w:type="spellStart"/>
-      <w:r>
-        <w:rPr>
-          <w:rFonts w:ascii="Calibri" w:cs="Calibri"/>
-        </w:rPr>
-        <w:t>Tagi</w:t>
-      </w:r>
-      <w:proofErr w:type="spellEnd"/>
-      <w:r>
-        <w:rPr>
-          <w:rFonts w:ascii="Calibri" w:cs="Calibri"/>
-        </w:rPr>
-        <w:t xml:space="preserve"> VM, Chiarelli F. Stress and Diabetes Mellitus: Pathogenetic Mechanisms and Clinical Outcome. </w:t>
-      </w:r>
-      <w:proofErr w:type="spellStart"/>
+        <w:t xml:space="preserve">Ingrosso DMF, Primavera M, Samvelyan S, Tagi VM, Chiarelli F. Stress and Diabetes Mellitus: Pathogenetic Mechanisms and Clinical Outcome. </w:t>
+      </w:r>
       <w:r>
         <w:rPr>
           <w:rFonts w:ascii="Calibri" w:cs="Calibri"/>
           <w:i/>
           <w:iCs/>
         </w:rPr>
-        <w:t>Horm</w:t>
-      </w:r>
-      <w:proofErr w:type="spellEnd"/>
+        <w:t>Horm Res Paediatr</w:t>
+      </w:r>
+      <w:r>
+        <w:rPr>
+          <w:rFonts w:ascii="Calibri" w:cs="Calibri"/>
+        </w:rPr>
+        <w:t xml:space="preserve"> 2023;96:34–43.</w:t>
+      </w:r>
+    </w:p>
+    <w:p>
+      <w:pPr>
+        <w:pStyle w:val="Bibliography"/>
+        <w:rPr>
+          <w:rFonts w:ascii="Calibri" w:cs="Calibri"/>
+        </w:rPr>
+      </w:pPr>
+      <w:r>
+        <w:rPr>
+          <w:rFonts w:ascii="Calibri" w:cs="Calibri"/>
+        </w:rPr>
+        <w:t xml:space="preserve">3. </w:t>
+      </w:r>
+      <w:r>
+        <w:rPr>
+          <w:rFonts w:ascii="Calibri" w:cs="Calibri"/>
+        </w:rPr>
+        <w:tab/>
+        <w:t xml:space="preserve">Tomiyama AJ. Stress and Obesity. </w:t>
+      </w:r>
       <w:r>
         <w:rPr>
           <w:rFonts w:ascii="Calibri" w:cs="Calibri"/>
           <w:i/>
           <w:iCs/>
         </w:rPr>
-        <w:t xml:space="preserve"> Res </w:t>
-      </w:r>
-      <w:proofErr w:type="spellStart"/>
+        <w:t>Annu Rev Psychol</w:t>
+      </w:r>
+      <w:r>
+        <w:rPr>
+          <w:rFonts w:ascii="Calibri" w:cs="Calibri"/>
+        </w:rPr>
+        <w:t xml:space="preserve"> 2019;70:703–718.</w:t>
+      </w:r>
+    </w:p>
+    <w:p>
+      <w:pPr>
+        <w:pStyle w:val="Bibliography"/>
+        <w:rPr>
+          <w:rFonts w:ascii="Calibri" w:cs="Calibri"/>
+        </w:rPr>
+      </w:pPr>
+      <w:r>
+        <w:rPr>
+          <w:rFonts w:ascii="Calibri" w:cs="Calibri"/>
+        </w:rPr>
+        <w:t xml:space="preserve">4. </w:t>
+      </w:r>
+      <w:r>
+        <w:rPr>
+          <w:rFonts w:ascii="Calibri" w:cs="Calibri"/>
+        </w:rPr>
+        <w:tab/>
+        <w:t xml:space="preserve">Harvey I, Stephenson EJ, Redd JR, </w:t>
+      </w:r>
       <w:r>
         <w:rPr>
           <w:rFonts w:ascii="Calibri" w:cs="Calibri"/>
           <w:i/>
           <w:iCs/>
         </w:rPr>
-        <w:t>Paediatr</w:t>
-      </w:r>
-      <w:proofErr w:type="spellEnd"/>
-      <w:r>
-        <w:rPr>
-          <w:rFonts w:ascii="Calibri" w:cs="Calibri"/>
-        </w:rPr>
-        <w:t xml:space="preserve"> </w:t>
-      </w:r>
-      <w:proofErr w:type="gramStart"/>
-      <w:r>
-        <w:rPr>
-          <w:rFonts w:ascii="Calibri" w:cs="Calibri"/>
-        </w:rPr>
-        <w:t>2023;96:34</w:t>
-      </w:r>
-      <w:proofErr w:type="gramEnd"/>
-      <w:r>
-        <w:rPr>
-          <w:rFonts w:ascii="Calibri" w:cs="Calibri"/>
-        </w:rPr>
-        <w:t>–43.</w:t>
+        <w:t>et al.</w:t>
+      </w:r>
+      <w:r>
+        <w:rPr>
+          <w:rFonts w:ascii="Calibri" w:cs="Calibri"/>
+        </w:rPr>
+        <w:t xml:space="preserve"> Glucocorticoid-Induced Metabolic Disturbances Are Exacerbated in Obese Male Mice. </w:t>
+      </w:r>
+      <w:r>
+        <w:rPr>
+          <w:rFonts w:ascii="Calibri" w:cs="Calibri"/>
+          <w:i/>
+          <w:iCs/>
+        </w:rPr>
+        <w:t>Endocrinology</w:t>
+      </w:r>
+      <w:r>
+        <w:rPr>
+          <w:rFonts w:ascii="Calibri" w:cs="Calibri"/>
+        </w:rPr>
+        <w:t xml:space="preserve"> 2018;159:2275–2287.</w:t>
       </w:r>
     </w:p>
     <w:p>
@@ -1290,75 +1385,77 @@
         <w:rPr>
           <w:rFonts w:ascii="Calibri" w:cs="Calibri"/>
         </w:rPr>
-        <w:t xml:space="preserve">3. </w:t>
+        <w:t xml:space="preserve">5. </w:t>
       </w:r>
       <w:r>
         <w:rPr>
           <w:rFonts w:ascii="Calibri" w:cs="Calibri"/>
         </w:rPr>
         <w:tab/>
-      </w:r>
-      <w:proofErr w:type="spellStart"/>
-      <w:r>
-        <w:rPr>
-          <w:rFonts w:ascii="Calibri" w:cs="Calibri"/>
-        </w:rPr>
-        <w:t>Tomiyama</w:t>
-      </w:r>
-      <w:proofErr w:type="spellEnd"/>
-      <w:r>
-        <w:rPr>
-          <w:rFonts w:ascii="Calibri" w:cs="Calibri"/>
-        </w:rPr>
-        <w:t xml:space="preserve"> AJ. Stress and Obesity. </w:t>
-      </w:r>
-      <w:proofErr w:type="spellStart"/>
+        <w:t xml:space="preserve">Gunder LC, Harvey I, Redd JR, </w:t>
+      </w:r>
       <w:r>
         <w:rPr>
           <w:rFonts w:ascii="Calibri" w:cs="Calibri"/>
           <w:i/>
           <w:iCs/>
         </w:rPr>
-        <w:t>Annu</w:t>
-      </w:r>
-      <w:proofErr w:type="spellEnd"/>
+        <w:t>et al.</w:t>
+      </w:r>
+      <w:r>
+        <w:rPr>
+          <w:rFonts w:ascii="Calibri" w:cs="Calibri"/>
+        </w:rPr>
+        <w:t xml:space="preserve"> Obesity Augments Glucocorticoid-Dependent Muscle Atrophy in Male C57BL/6J Mice. </w:t>
+      </w:r>
       <w:r>
         <w:rPr>
           <w:rFonts w:ascii="Calibri" w:cs="Calibri"/>
           <w:i/>
           <w:iCs/>
         </w:rPr>
-        <w:t xml:space="preserve"> Rev </w:t>
-      </w:r>
-      <w:proofErr w:type="spellStart"/>
+        <w:t>Biomedicines</w:t>
+      </w:r>
+      <w:r>
+        <w:rPr>
+          <w:rFonts w:ascii="Calibri" w:cs="Calibri"/>
+        </w:rPr>
+        <w:t xml:space="preserve"> 2020;8:420.</w:t>
+      </w:r>
+    </w:p>
+    <w:p>
+      <w:pPr>
+        <w:pStyle w:val="Bibliography"/>
+        <w:rPr>
+          <w:rFonts w:ascii="Calibri" w:cs="Calibri"/>
+        </w:rPr>
+      </w:pPr>
+      <w:r>
+        <w:rPr>
+          <w:rFonts w:ascii="Calibri" w:cs="Calibri"/>
+        </w:rPr>
+        <w:t xml:space="preserve">6. </w:t>
+      </w:r>
+      <w:r>
+        <w:rPr>
+          <w:rFonts w:ascii="Calibri" w:cs="Calibri"/>
+        </w:rPr>
+        <w:tab/>
+        <w:t xml:space="preserve">Heraclides AM, Chandola T, Witte DR, Brunner EJ. Work stress, obesity and the risk of type 2 diabetes: gender-specific bidirectional effect in the Whitehall II study. </w:t>
+      </w:r>
       <w:r>
         <w:rPr>
           <w:rFonts w:ascii="Calibri" w:cs="Calibri"/>
           <w:i/>
           <w:iCs/>
         </w:rPr>
-        <w:t>Psychol</w:t>
-      </w:r>
-      <w:proofErr w:type="spellEnd"/>
-      <w:r>
-        <w:rPr>
-          <w:rFonts w:ascii="Calibri" w:cs="Calibri"/>
-        </w:rPr>
-        <w:t xml:space="preserve"> </w:t>
-      </w:r>
-      <w:proofErr w:type="gramStart"/>
-      <w:r>
-        <w:rPr>
-          <w:rFonts w:ascii="Calibri" w:cs="Calibri"/>
-        </w:rPr>
-        <w:t>2019;70:703</w:t>
-      </w:r>
-      <w:proofErr w:type="gramEnd"/>
-      <w:r>
-        <w:rPr>
-          <w:rFonts w:ascii="Calibri" w:cs="Calibri"/>
-        </w:rPr>
-        <w:t>–718.</w:t>
+        <w:t>Obesity (Silver Spring)</w:t>
+      </w:r>
+      <w:r>
+        <w:rPr>
+          <w:rFonts w:ascii="Calibri" w:cs="Calibri"/>
+        </w:rPr>
+        <w:t xml:space="preserve"> 2012;20:428–433.</w:t>
       </w:r>
     </w:p>
     <w:p>
@@ -1372,14 +1469,14 @@
         <w:rPr>
           <w:rFonts w:ascii="Calibri" w:cs="Calibri"/>
         </w:rPr>
-        <w:t xml:space="preserve">4. </w:t>
+        <w:t xml:space="preserve">7. </w:t>
       </w:r>
       <w:r>
         <w:rPr>
           <w:rFonts w:ascii="Calibri" w:cs="Calibri"/>
         </w:rPr>
         <w:tab/>
-        <w:t xml:space="preserve">Harvey I, Stephenson EJ, Redd JR, </w:t>
+        <w:t xml:space="preserve">Williams ED, Magliano DJ, Tapp RJ, Oldenburg BF, Shaw JE. Psychosocial stress predicts abnormal glucose metabolism: the Australian Diabetes, Obesity and Lifestyle (AusDiab) study. </w:t>
       </w:r>
       <w:r>
         <w:rPr>
@@ -1387,13 +1484,34 @@
           <w:i/>
           <w:iCs/>
         </w:rPr>
-        <w:t>et al.</w:t>
-      </w:r>
-      <w:r>
-        <w:rPr>
-          <w:rFonts w:ascii="Calibri" w:cs="Calibri"/>
-        </w:rPr>
-        <w:t xml:space="preserve"> Glucocorticoid-Induced Metabolic Disturbances Are Exacerbated in Obese Male Mice. </w:t>
+        <w:t>Ann Behav Med</w:t>
+      </w:r>
+      <w:r>
+        <w:rPr>
+          <w:rFonts w:ascii="Calibri" w:cs="Calibri"/>
+        </w:rPr>
+        <w:t xml:space="preserve"> 2013;46:62–72.</w:t>
+      </w:r>
+    </w:p>
+    <w:p>
+      <w:pPr>
+        <w:pStyle w:val="Bibliography"/>
+        <w:rPr>
+          <w:rFonts w:ascii="Calibri" w:cs="Calibri"/>
+        </w:rPr>
+      </w:pPr>
+      <w:r>
+        <w:rPr>
+          <w:rFonts w:ascii="Calibri" w:cs="Calibri"/>
+        </w:rPr>
+        <w:t xml:space="preserve">8. </w:t>
+      </w:r>
+      <w:r>
+        <w:rPr>
+          <w:rFonts w:ascii="Calibri" w:cs="Calibri"/>
+        </w:rPr>
+        <w:tab/>
+        <w:t xml:space="preserve">Tyagi K, Agarwal NB, Kapur P, Kohli S, Jalali RK. Evaluation of Stress and Associated Biochemical Changes in Patients with Type 2 Diabetes Mellitus and Obesity. </w:t>
       </w:r>
       <w:r>
         <w:rPr>
@@ -1401,27 +1519,13 @@
           <w:i/>
           <w:iCs/>
         </w:rPr>
-        <w:t>Endocrinology</w:t>
-      </w:r>
-      <w:r>
-        <w:rPr>
-          <w:rFonts w:ascii="Calibri" w:cs="Calibri"/>
-        </w:rPr>
-        <w:t xml:space="preserve"> </w:t>
-      </w:r>
-      <w:proofErr w:type="gramStart"/>
-      <w:r>
-        <w:rPr>
-          <w:rFonts w:ascii="Calibri" w:cs="Calibri"/>
-        </w:rPr>
-        <w:t>2018;159:2275</w:t>
-      </w:r>
-      <w:proofErr w:type="gramEnd"/>
-      <w:r>
-        <w:rPr>
-          <w:rFonts w:ascii="Calibri" w:cs="Calibri"/>
-        </w:rPr>
-        <w:t>–2287.</w:t>
+        <w:t>Diabetes Metab Syndr Obes</w:t>
+      </w:r>
+      <w:r>
+        <w:rPr>
+          <w:rFonts w:ascii="Calibri" w:cs="Calibri"/>
+        </w:rPr>
+        <w:t xml:space="preserve"> 2021;14:705–717.</w:t>
       </w:r>
     </w:p>
     <w:p>
@@ -1435,27 +1539,14 @@
         <w:rPr>
           <w:rFonts w:ascii="Calibri" w:cs="Calibri"/>
         </w:rPr>
-        <w:t xml:space="preserve">5. </w:t>
+        <w:t xml:space="preserve">9. </w:t>
       </w:r>
       <w:r>
         <w:rPr>
           <w:rFonts w:ascii="Calibri" w:cs="Calibri"/>
         </w:rPr>
         <w:tab/>
-      </w:r>
-      <w:proofErr w:type="spellStart"/>
-      <w:r>
-        <w:rPr>
-          <w:rFonts w:ascii="Calibri" w:cs="Calibri"/>
-        </w:rPr>
-        <w:t>Gunder</w:t>
-      </w:r>
-      <w:proofErr w:type="spellEnd"/>
-      <w:r>
-        <w:rPr>
-          <w:rFonts w:ascii="Calibri" w:cs="Calibri"/>
-        </w:rPr>
-        <w:t xml:space="preserve"> LC, Harvey I, Redd JR, </w:t>
+        <w:t xml:space="preserve">Zawistowski M, Fritsche LG, Pandit A, </w:t>
       </w:r>
       <w:r>
         <w:rPr>
@@ -1469,7 +1560,7 @@
         <w:rPr>
           <w:rFonts w:ascii="Calibri" w:cs="Calibri"/>
         </w:rPr>
-        <w:t xml:space="preserve"> Obesity Augments Glucocorticoid-Dependent Muscle Atrophy in Male C57BL/6J Mice. </w:t>
+        <w:t xml:space="preserve"> The Michigan Genomics Initiative: A biobank linking genotypes and electronic clinical records in Michigan Medicine patients. </w:t>
       </w:r>
       <w:r>
         <w:rPr>
@@ -1477,27 +1568,13 @@
           <w:i/>
           <w:iCs/>
         </w:rPr>
-        <w:t>Biomedicines</w:t>
-      </w:r>
-      <w:r>
-        <w:rPr>
-          <w:rFonts w:ascii="Calibri" w:cs="Calibri"/>
-        </w:rPr>
-        <w:t xml:space="preserve"> </w:t>
-      </w:r>
-      <w:proofErr w:type="gramStart"/>
-      <w:r>
-        <w:rPr>
-          <w:rFonts w:ascii="Calibri" w:cs="Calibri"/>
-        </w:rPr>
-        <w:t>2020;8:420</w:t>
-      </w:r>
-      <w:proofErr w:type="gramEnd"/>
-      <w:r>
-        <w:rPr>
-          <w:rFonts w:ascii="Calibri" w:cs="Calibri"/>
-        </w:rPr>
-        <w:t>.</w:t>
+        <w:t>Cell Genomics</w:t>
+      </w:r>
+      <w:r>
+        <w:rPr>
+          <w:rFonts w:ascii="Calibri" w:cs="Calibri"/>
+        </w:rPr>
+        <w:t xml:space="preserve"> 2023;0.</w:t>
       </w:r>
     </w:p>
     <w:p>
@@ -1511,41 +1588,35 @@
         <w:rPr>
           <w:rFonts w:ascii="Calibri" w:cs="Calibri"/>
         </w:rPr>
-        <w:t xml:space="preserve">6. </w:t>
+        <w:t xml:space="preserve">10. </w:t>
       </w:r>
       <w:r>
         <w:rPr>
           <w:rFonts w:ascii="Calibri" w:cs="Calibri"/>
         </w:rPr>
         <w:tab/>
-      </w:r>
-      <w:proofErr w:type="spellStart"/>
-      <w:r>
-        <w:rPr>
-          <w:rFonts w:ascii="Calibri" w:cs="Calibri"/>
-        </w:rPr>
-        <w:t>Heraclides</w:t>
-      </w:r>
-      <w:proofErr w:type="spellEnd"/>
-      <w:r>
-        <w:rPr>
-          <w:rFonts w:ascii="Calibri" w:cs="Calibri"/>
-        </w:rPr>
-        <w:t xml:space="preserve"> AM, </w:t>
-      </w:r>
-      <w:proofErr w:type="spellStart"/>
-      <w:r>
-        <w:rPr>
-          <w:rFonts w:ascii="Calibri" w:cs="Calibri"/>
-        </w:rPr>
-        <w:t>Chandola</w:t>
-      </w:r>
-      <w:proofErr w:type="spellEnd"/>
-      <w:r>
-        <w:rPr>
-          <w:rFonts w:ascii="Calibri" w:cs="Calibri"/>
-        </w:rPr>
-        <w:t xml:space="preserve"> T, Witte DR, Brunner EJ. Work stress, obesity and the risk of type 2 diabetes: gender-specific bidirectional effect in the Whitehall II study. </w:t>
+        <w:t>R Core Team. R: A Language and Environment for Statistical Computing. 2019.</w:t>
+      </w:r>
+    </w:p>
+    <w:p>
+      <w:pPr>
+        <w:pStyle w:val="Bibliography"/>
+        <w:rPr>
+          <w:rFonts w:ascii="Calibri" w:cs="Calibri"/>
+        </w:rPr>
+      </w:pPr>
+      <w:r>
+        <w:rPr>
+          <w:rFonts w:ascii="Calibri" w:cs="Calibri"/>
+        </w:rPr>
+        <w:t xml:space="preserve">11. </w:t>
+      </w:r>
+      <w:r>
+        <w:rPr>
+          <w:rFonts w:ascii="Calibri" w:cs="Calibri"/>
+        </w:rPr>
+        <w:tab/>
+        <w:t xml:space="preserve">Sattler KM, Deane FP, Tapsell L, Kelly PJ. Gender differences in the relationship of weight-based stigmatisation with motivation to exercise and physical activity in overweight individuals. </w:t>
       </w:r>
       <w:r>
         <w:rPr>
@@ -1553,445 +1624,83 @@
           <w:i/>
           <w:iCs/>
         </w:rPr>
-        <w:t>Obesity (Silver Spring)</w:t>
-      </w:r>
-      <w:r>
-        <w:rPr>
-          <w:rFonts w:ascii="Calibri" w:cs="Calibri"/>
-        </w:rPr>
-        <w:t xml:space="preserve"> </w:t>
-      </w:r>
+        <w:t>Health Psychol Open</w:t>
+      </w:r>
+      <w:r>
+        <w:rPr>
+          <w:rFonts w:ascii="Calibri" w:cs="Calibri"/>
+        </w:rPr>
+        <w:t xml:space="preserve"> 2018;5:2055102918759691.</w:t>
+      </w:r>
+    </w:p>
+    <w:p>
+      <w:r>
+        <w:fldChar w:fldCharType="end"/>
+      </w:r>
+    </w:p>
+    <w:p>
+      <w:r>
+        <w:br w:type="page"/>
+      </w:r>
+    </w:p>
+    <w:p>
+      <w:r>
+        <w:lastRenderedPageBreak/>
+        <w:t>Figure and Table Legends</w:t>
+      </w:r>
+    </w:p>
+    <w:p/>
+    <w:p/>
+    <w:p>
+      <w:r>
+        <w:t>Table 1</w:t>
+      </w:r>
+    </w:p>
+    <w:p/>
+    <w:p>
+      <w:r>
+        <w:t xml:space="preserve">Table 2: </w:t>
+      </w:r>
+      <w:r>
+        <w:rPr>
+          <w:b/>
+          <w:bCs/>
+        </w:rPr>
+        <w:t xml:space="preserve">Stepwise multivariate modeling of the </w:t>
+      </w:r>
+      <w:proofErr w:type="spellStart"/>
       <w:proofErr w:type="gramStart"/>
       <w:r>
         <w:rPr>
-          <w:rFonts w:ascii="Calibri" w:cs="Calibri"/>
-        </w:rPr>
-        <w:t>2012;20:428</w:t>
-      </w:r>
+          <w:b/>
+          <w:bCs/>
+        </w:rPr>
+        <w:t>obesity:stress</w:t>
+      </w:r>
+      <w:proofErr w:type="spellEnd"/>
       <w:proofErr w:type="gramEnd"/>
       <w:r>
         <w:rPr>
-          <w:rFonts w:ascii="Calibri" w:cs="Calibri"/>
-        </w:rPr>
-        <w:t>–433.</w:t>
-      </w:r>
-    </w:p>
-    <w:p>
-      <w:pPr>
-        <w:pStyle w:val="Bibliography"/>
-        <w:rPr>
-          <w:rFonts w:ascii="Calibri" w:cs="Calibri"/>
-        </w:rPr>
-      </w:pPr>
-      <w:r>
-        <w:rPr>
-          <w:rFonts w:ascii="Calibri" w:cs="Calibri"/>
-        </w:rPr>
-        <w:t xml:space="preserve">7. </w:t>
-      </w:r>
-      <w:r>
-        <w:rPr>
-          <w:rFonts w:ascii="Calibri" w:cs="Calibri"/>
-        </w:rPr>
-        <w:tab/>
-        <w:t xml:space="preserve">Williams ED, </w:t>
-      </w:r>
-      <w:proofErr w:type="spellStart"/>
-      <w:r>
-        <w:rPr>
-          <w:rFonts w:ascii="Calibri" w:cs="Calibri"/>
-        </w:rPr>
-        <w:t>Magliano</w:t>
-      </w:r>
-      <w:proofErr w:type="spellEnd"/>
-      <w:r>
-        <w:rPr>
-          <w:rFonts w:ascii="Calibri" w:cs="Calibri"/>
-        </w:rPr>
-        <w:t xml:space="preserve"> DJ, </w:t>
-      </w:r>
-      <w:proofErr w:type="spellStart"/>
-      <w:r>
-        <w:rPr>
-          <w:rFonts w:ascii="Calibri" w:cs="Calibri"/>
-        </w:rPr>
-        <w:t>Tapp</w:t>
-      </w:r>
-      <w:proofErr w:type="spellEnd"/>
-      <w:r>
-        <w:rPr>
-          <w:rFonts w:ascii="Calibri" w:cs="Calibri"/>
-        </w:rPr>
-        <w:t xml:space="preserve"> RJ, Oldenburg BF, Shaw JE. Psychosocial stress predicts abnormal glucose metabolism: the Australian Diabetes, Obesity and Lifestyle (</w:t>
-      </w:r>
-      <w:proofErr w:type="spellStart"/>
-      <w:r>
-        <w:rPr>
-          <w:rFonts w:ascii="Calibri" w:cs="Calibri"/>
-        </w:rPr>
-        <w:t>AusDiab</w:t>
-      </w:r>
-      <w:proofErr w:type="spellEnd"/>
-      <w:r>
-        <w:rPr>
-          <w:rFonts w:ascii="Calibri" w:cs="Calibri"/>
-        </w:rPr>
-        <w:t xml:space="preserve">) study. </w:t>
-      </w:r>
-      <w:r>
-        <w:rPr>
-          <w:rFonts w:ascii="Calibri" w:cs="Calibri"/>
-          <w:i/>
-          <w:iCs/>
-        </w:rPr>
-        <w:t xml:space="preserve">Ann </w:t>
-      </w:r>
-      <w:proofErr w:type="spellStart"/>
-      <w:r>
-        <w:rPr>
-          <w:rFonts w:ascii="Calibri" w:cs="Calibri"/>
-          <w:i/>
-          <w:iCs/>
-        </w:rPr>
-        <w:t>Behav</w:t>
-      </w:r>
-      <w:proofErr w:type="spellEnd"/>
-      <w:r>
-        <w:rPr>
-          <w:rFonts w:ascii="Calibri" w:cs="Calibri"/>
-          <w:i/>
-          <w:iCs/>
-        </w:rPr>
-        <w:t xml:space="preserve"> Med</w:t>
-      </w:r>
-      <w:r>
-        <w:rPr>
-          <w:rFonts w:ascii="Calibri" w:cs="Calibri"/>
-        </w:rPr>
-        <w:t xml:space="preserve"> </w:t>
-      </w:r>
-      <w:proofErr w:type="gramStart"/>
-      <w:r>
-        <w:rPr>
-          <w:rFonts w:ascii="Calibri" w:cs="Calibri"/>
-        </w:rPr>
-        <w:t>2013;46:62</w:t>
-      </w:r>
-      <w:proofErr w:type="gramEnd"/>
-      <w:r>
-        <w:rPr>
-          <w:rFonts w:ascii="Calibri" w:cs="Calibri"/>
-        </w:rPr>
-        <w:t>–72.</w:t>
-      </w:r>
-    </w:p>
-    <w:p>
-      <w:pPr>
-        <w:pStyle w:val="Bibliography"/>
-        <w:rPr>
-          <w:rFonts w:ascii="Calibri" w:cs="Calibri"/>
-        </w:rPr>
-      </w:pPr>
-      <w:r>
-        <w:rPr>
-          <w:rFonts w:ascii="Calibri" w:cs="Calibri"/>
-        </w:rPr>
-        <w:t xml:space="preserve">8. </w:t>
-      </w:r>
-      <w:r>
-        <w:rPr>
-          <w:rFonts w:ascii="Calibri" w:cs="Calibri"/>
-        </w:rPr>
-        <w:tab/>
-        <w:t xml:space="preserve">Tyagi K, Agarwal NB, </w:t>
-      </w:r>
-      <w:proofErr w:type="spellStart"/>
-      <w:r>
-        <w:rPr>
-          <w:rFonts w:ascii="Calibri" w:cs="Calibri"/>
-        </w:rPr>
-        <w:t>Kapur</w:t>
-      </w:r>
-      <w:proofErr w:type="spellEnd"/>
-      <w:r>
-        <w:rPr>
-          <w:rFonts w:ascii="Calibri" w:cs="Calibri"/>
-        </w:rPr>
-        <w:t xml:space="preserve"> P, Kohli S, </w:t>
-      </w:r>
-      <w:proofErr w:type="spellStart"/>
-      <w:r>
-        <w:rPr>
-          <w:rFonts w:ascii="Calibri" w:cs="Calibri"/>
-        </w:rPr>
-        <w:t>Jalali</w:t>
-      </w:r>
-      <w:proofErr w:type="spellEnd"/>
-      <w:r>
-        <w:rPr>
-          <w:rFonts w:ascii="Calibri" w:cs="Calibri"/>
-        </w:rPr>
-        <w:t xml:space="preserve"> RK. Evaluation of Stress and Associated Biochemical Changes in Patients with Type 2 Diabetes Mellitus and Obesity. </w:t>
-      </w:r>
-      <w:r>
-        <w:rPr>
-          <w:rFonts w:ascii="Calibri" w:cs="Calibri"/>
-          <w:i/>
-          <w:iCs/>
-        </w:rPr>
-        <w:t xml:space="preserve">Diabetes </w:t>
-      </w:r>
-      <w:proofErr w:type="spellStart"/>
-      <w:r>
-        <w:rPr>
-          <w:rFonts w:ascii="Calibri" w:cs="Calibri"/>
-          <w:i/>
-          <w:iCs/>
-        </w:rPr>
-        <w:t>Metab</w:t>
-      </w:r>
-      <w:proofErr w:type="spellEnd"/>
-      <w:r>
-        <w:rPr>
-          <w:rFonts w:ascii="Calibri" w:cs="Calibri"/>
-          <w:i/>
-          <w:iCs/>
-        </w:rPr>
-        <w:t xml:space="preserve"> </w:t>
-      </w:r>
-      <w:proofErr w:type="spellStart"/>
-      <w:r>
-        <w:rPr>
-          <w:rFonts w:ascii="Calibri" w:cs="Calibri"/>
-          <w:i/>
-          <w:iCs/>
-        </w:rPr>
-        <w:t>Syndr</w:t>
-      </w:r>
-      <w:proofErr w:type="spellEnd"/>
-      <w:r>
-        <w:rPr>
-          <w:rFonts w:ascii="Calibri" w:cs="Calibri"/>
-          <w:i/>
-          <w:iCs/>
-        </w:rPr>
-        <w:t xml:space="preserve"> </w:t>
-      </w:r>
-      <w:proofErr w:type="spellStart"/>
-      <w:r>
-        <w:rPr>
-          <w:rFonts w:ascii="Calibri" w:cs="Calibri"/>
-          <w:i/>
-          <w:iCs/>
-        </w:rPr>
-        <w:t>Obes</w:t>
-      </w:r>
-      <w:proofErr w:type="spellEnd"/>
-      <w:r>
-        <w:rPr>
-          <w:rFonts w:ascii="Calibri" w:cs="Calibri"/>
-        </w:rPr>
-        <w:t xml:space="preserve"> </w:t>
-      </w:r>
-      <w:proofErr w:type="gramStart"/>
-      <w:r>
-        <w:rPr>
-          <w:rFonts w:ascii="Calibri" w:cs="Calibri"/>
-        </w:rPr>
-        <w:t>2021;14:705</w:t>
-      </w:r>
-      <w:proofErr w:type="gramEnd"/>
-      <w:r>
-        <w:rPr>
-          <w:rFonts w:ascii="Calibri" w:cs="Calibri"/>
-        </w:rPr>
-        <w:t>–717.</w:t>
-      </w:r>
-    </w:p>
-    <w:p>
-      <w:pPr>
-        <w:pStyle w:val="Bibliography"/>
-        <w:rPr>
-          <w:rFonts w:ascii="Calibri" w:cs="Calibri"/>
-        </w:rPr>
-      </w:pPr>
-      <w:r>
-        <w:rPr>
-          <w:rFonts w:ascii="Calibri" w:cs="Calibri"/>
-        </w:rPr>
-        <w:t xml:space="preserve">9. </w:t>
-      </w:r>
-      <w:r>
-        <w:rPr>
-          <w:rFonts w:ascii="Calibri" w:cs="Calibri"/>
-        </w:rPr>
-        <w:tab/>
-      </w:r>
-      <w:proofErr w:type="spellStart"/>
-      <w:r>
-        <w:rPr>
-          <w:rFonts w:ascii="Calibri" w:cs="Calibri"/>
-        </w:rPr>
-        <w:t>Zawistowski</w:t>
-      </w:r>
-      <w:proofErr w:type="spellEnd"/>
-      <w:r>
-        <w:rPr>
-          <w:rFonts w:ascii="Calibri" w:cs="Calibri"/>
-        </w:rPr>
-        <w:t xml:space="preserve"> M, </w:t>
-      </w:r>
-      <w:proofErr w:type="spellStart"/>
-      <w:r>
-        <w:rPr>
-          <w:rFonts w:ascii="Calibri" w:cs="Calibri"/>
-        </w:rPr>
-        <w:t>Fritsche</w:t>
-      </w:r>
-      <w:proofErr w:type="spellEnd"/>
-      <w:r>
-        <w:rPr>
-          <w:rFonts w:ascii="Calibri" w:cs="Calibri"/>
-        </w:rPr>
-        <w:t xml:space="preserve"> LG, Pandit A, </w:t>
-      </w:r>
-      <w:r>
-        <w:rPr>
-          <w:rFonts w:ascii="Calibri" w:cs="Calibri"/>
-          <w:i/>
-          <w:iCs/>
-        </w:rPr>
-        <w:t>et al.</w:t>
-      </w:r>
-      <w:r>
-        <w:rPr>
-          <w:rFonts w:ascii="Calibri" w:cs="Calibri"/>
-        </w:rPr>
-        <w:t xml:space="preserve"> The Michigan Genomics Initiative: A biobank linking genotypes and electronic clinical records in Michigan Medicine patients. </w:t>
-      </w:r>
-      <w:r>
-        <w:rPr>
-          <w:rFonts w:ascii="Calibri" w:cs="Calibri"/>
-          <w:i/>
-          <w:iCs/>
-        </w:rPr>
-        <w:t>Cell Genomics</w:t>
-      </w:r>
-      <w:r>
-        <w:rPr>
-          <w:rFonts w:ascii="Calibri" w:cs="Calibri"/>
-        </w:rPr>
-        <w:t xml:space="preserve"> 2023;0.</w:t>
-      </w:r>
-    </w:p>
-    <w:p>
-      <w:pPr>
-        <w:pStyle w:val="Bibliography"/>
-        <w:rPr>
-          <w:rFonts w:ascii="Calibri" w:cs="Calibri"/>
-        </w:rPr>
-      </w:pPr>
-      <w:r>
-        <w:rPr>
-          <w:rFonts w:ascii="Calibri" w:cs="Calibri"/>
-        </w:rPr>
-        <w:t xml:space="preserve">10. </w:t>
-      </w:r>
-      <w:r>
-        <w:rPr>
-          <w:rFonts w:ascii="Calibri" w:cs="Calibri"/>
-        </w:rPr>
-        <w:tab/>
-        <w:t>R Core Team. R: A Language and Environment for Statistical Computing. 2019.</w:t>
-      </w:r>
-    </w:p>
-    <w:p>
-      <w:pPr>
-        <w:pStyle w:val="Bibliography"/>
-        <w:rPr>
-          <w:rFonts w:ascii="Calibri" w:cs="Calibri"/>
-        </w:rPr>
-      </w:pPr>
-      <w:r>
-        <w:rPr>
-          <w:rFonts w:ascii="Calibri" w:cs="Calibri"/>
-        </w:rPr>
-        <w:t xml:space="preserve">11. </w:t>
-      </w:r>
-      <w:r>
-        <w:rPr>
-          <w:rFonts w:ascii="Calibri" w:cs="Calibri"/>
-        </w:rPr>
-        <w:tab/>
-        <w:t xml:space="preserve">Sattler KM, Deane FP, Tapsell L, Kelly PJ. Gender differences in the relationship of weight-based </w:t>
-      </w:r>
-      <w:proofErr w:type="spellStart"/>
-      <w:r>
-        <w:rPr>
-          <w:rFonts w:ascii="Calibri" w:cs="Calibri"/>
-        </w:rPr>
-        <w:t>stigmatisation</w:t>
-      </w:r>
-      <w:proofErr w:type="spellEnd"/>
-      <w:r>
-        <w:rPr>
-          <w:rFonts w:ascii="Calibri" w:cs="Calibri"/>
-        </w:rPr>
-        <w:t xml:space="preserve"> with motivation to exercise and physical activity in overweight individuals. </w:t>
-      </w:r>
-      <w:r>
-        <w:rPr>
-          <w:rFonts w:ascii="Calibri" w:cs="Calibri"/>
-          <w:i/>
-          <w:iCs/>
-        </w:rPr>
-        <w:t xml:space="preserve">Health </w:t>
-      </w:r>
-      <w:proofErr w:type="spellStart"/>
-      <w:r>
-        <w:rPr>
-          <w:rFonts w:ascii="Calibri" w:cs="Calibri"/>
-          <w:i/>
-          <w:iCs/>
-        </w:rPr>
-        <w:t>Psychol</w:t>
-      </w:r>
-      <w:proofErr w:type="spellEnd"/>
-      <w:r>
-        <w:rPr>
-          <w:rFonts w:ascii="Calibri" w:cs="Calibri"/>
-          <w:i/>
-          <w:iCs/>
-        </w:rPr>
-        <w:t xml:space="preserve"> Open</w:t>
-      </w:r>
-      <w:r>
-        <w:rPr>
-          <w:rFonts w:ascii="Calibri" w:cs="Calibri"/>
-        </w:rPr>
-        <w:t xml:space="preserve"> </w:t>
-      </w:r>
-      <w:proofErr w:type="gramStart"/>
-      <w:r>
-        <w:rPr>
-          <w:rFonts w:ascii="Calibri" w:cs="Calibri"/>
-        </w:rPr>
-        <w:t>2018;5:2055102918759691</w:t>
-      </w:r>
-      <w:proofErr w:type="gramEnd"/>
-      <w:r>
-        <w:rPr>
-          <w:rFonts w:ascii="Calibri" w:cs="Calibri"/>
-        </w:rPr>
-        <w:t>.</w:t>
-      </w:r>
-    </w:p>
-    <w:p>
-      <w:r>
-        <w:fldChar w:fldCharType="end"/>
-      </w:r>
-      <w:r>
-        <w:t xml:space="preserve"> </w:t>
+          <w:b/>
+          <w:bCs/>
+        </w:rPr>
+        <w:t xml:space="preserve"> interaction.</w:t>
+      </w:r>
+      <w:r>
+        <w:rPr>
+          <w:b/>
+          <w:bCs/>
+        </w:rPr>
+        <w:t xml:space="preserve">  </w:t>
+      </w:r>
+      <w:r>
+        <w:t>Beta coefficients and p-value for the obesity x stress interaction term for the effects on type 2 diabetes prevalence.</w:t>
+      </w:r>
+    </w:p>
+    <w:p/>
+    <w:p>
+      <w:r>
+        <w:t>Table 3: The relationship between perceived stress and obesity on prevalence of other chronic diseases.</w:t>
       </w:r>
     </w:p>
     <w:p/>
@@ -2007,7 +1716,7 @@
 </file>
 
 <file path=word/comments.xml><?xml version="1.0" encoding="utf-8"?>
-<w:comments xmlns:wpc="http://schemas.microsoft.com/office/word/2010/wordprocessingCanvas" xmlns:cx="http://schemas.microsoft.com/office/drawing/2014/chartex" xmlns:cx1="http://schemas.microsoft.com/office/drawing/2015/9/8/chartex" xmlns:cx2="http://schemas.microsoft.com/office/drawing/2015/10/21/chartex" xmlns:cx3="http://schemas.microsoft.com/office/drawing/2016/5/9/chartex" xmlns:cx4="http://schemas.microsoft.com/office/drawing/2016/5/10/chartex" xmlns:cx5="http://schemas.microsoft.com/office/drawing/2016/5/11/chartex" xmlns:cx6="http://schemas.microsoft.com/office/drawing/2016/5/12/chartex" xmlns:cx7="http://schemas.microsoft.com/office/drawing/2016/5/13/chartex" xmlns:cx8="http://schemas.microsoft.com/office/drawing/2016/5/14/chartex" xmlns:mc="http://schemas.openxmlformats.org/markup-compatibility/2006" xmlns:aink="http://schemas.microsoft.com/office/drawing/2016/ink" xmlns:am3d="http://schemas.microsoft.com/office/drawing/2017/model3d" xmlns:o="urn:schemas-microsoft-com:office:office" xmlns:r="http://schemas.openxmlformats.org/officeDocument/2006/relationships" xmlns:m="http://schemas.openxmlformats.org/officeDocument/2006/math" xmlns:v="urn:schemas-microsoft-com:vml" xmlns:wp14="http://schemas.microsoft.com/office/word/2010/wordprocessingDrawing" xmlns:wp="http://schemas.openxmlformats.org/drawingml/2006/wordprocessingDrawing" xmlns:w10="urn:schemas-microsoft-com:office:word" xmlns:w="http://schemas.openxmlformats.org/wordprocessingml/2006/main" xmlns:w14="http://schemas.microsoft.com/office/word/2010/wordml" xmlns:w15="http://schemas.microsoft.com/office/word/2012/wordml" xmlns:w16cid="http://schemas.microsoft.com/office/word/2016/wordml/cid" xmlns:w16se="http://schemas.microsoft.com/office/word/2015/wordml/symex" xmlns:wpg="http://schemas.microsoft.com/office/word/2010/wordprocessingGroup" xmlns:wpi="http://schemas.microsoft.com/office/word/2010/wordprocessingInk" xmlns:wne="http://schemas.microsoft.com/office/word/2006/wordml" xmlns:wps="http://schemas.microsoft.com/office/word/2010/wordprocessingShape" mc:Ignorable="w14 w15 w16se w16cid wp14">
+<w:comments xmlns:wpc="http://schemas.microsoft.com/office/word/2010/wordprocessingCanvas" xmlns:cx="http://schemas.microsoft.com/office/drawing/2014/chartex" xmlns:cx1="http://schemas.microsoft.com/office/drawing/2015/9/8/chartex" xmlns:cx2="http://schemas.microsoft.com/office/drawing/2015/10/21/chartex" xmlns:cx3="http://schemas.microsoft.com/office/drawing/2016/5/9/chartex" xmlns:cx4="http://schemas.microsoft.com/office/drawing/2016/5/10/chartex" xmlns:cx5="http://schemas.microsoft.com/office/drawing/2016/5/11/chartex" xmlns:cx6="http://schemas.microsoft.com/office/drawing/2016/5/12/chartex" xmlns:cx7="http://schemas.microsoft.com/office/drawing/2016/5/13/chartex" xmlns:cx8="http://schemas.microsoft.com/office/drawing/2016/5/14/chartex" xmlns:mc="http://schemas.openxmlformats.org/markup-compatibility/2006" xmlns:aink="http://schemas.microsoft.com/office/drawing/2016/ink" xmlns:am3d="http://schemas.microsoft.com/office/drawing/2017/model3d" xmlns:o="urn:schemas-microsoft-com:office:office" xmlns:oel="http://schemas.microsoft.com/office/2019/extlst" xmlns:r="http://schemas.openxmlformats.org/officeDocument/2006/relationships" xmlns:m="http://schemas.openxmlformats.org/officeDocument/2006/math" xmlns:v="urn:schemas-microsoft-com:vml" xmlns:wp14="http://schemas.microsoft.com/office/word/2010/wordprocessingDrawing" xmlns:wp="http://schemas.openxmlformats.org/drawingml/2006/wordprocessingDrawing" xmlns:w10="urn:schemas-microsoft-com:office:word" xmlns:w="http://schemas.openxmlformats.org/wordprocessingml/2006/main" xmlns:w14="http://schemas.microsoft.com/office/word/2010/wordml" xmlns:w15="http://schemas.microsoft.com/office/word/2012/wordml" xmlns:w16cex="http://schemas.microsoft.com/office/word/2018/wordml/cex" xmlns:w16cid="http://schemas.microsoft.com/office/word/2016/wordml/cid" xmlns:w16="http://schemas.microsoft.com/office/word/2018/wordml" xmlns:w16sdtdh="http://schemas.microsoft.com/office/word/2020/wordml/sdtdatahash" xmlns:w16se="http://schemas.microsoft.com/office/word/2015/wordml/symex" xmlns:wpg="http://schemas.microsoft.com/office/word/2010/wordprocessingGroup" xmlns:wpi="http://schemas.microsoft.com/office/word/2010/wordprocessingInk" xmlns:wne="http://schemas.microsoft.com/office/word/2006/wordml" xmlns:wps="http://schemas.microsoft.com/office/word/2010/wordprocessingShape" mc:Ignorable="w14 w15 w16se w16cid w16 w16cex w16sdtdh wp14">
   <w:comment w:id="0" w:author="Dave Bridges" w:date="2024-01-04T11:30:00Z" w:initials="DB">
     <w:p>
       <w:pPr>
@@ -2020,19 +1729,11 @@
         <w:annotationRef/>
       </w:r>
       <w:r>
-        <w:t>@</w:t>
-      </w:r>
-      <w:proofErr w:type="spellStart"/>
-      <w:r>
-        <w:t>kate</w:t>
-      </w:r>
-      <w:proofErr w:type="spellEnd"/>
-      <w:r>
-        <w:t xml:space="preserve"> are there standardized ways to cite these data?</w:t>
+        <w:t>@kate are there standardized ways to cite these data?</w:t>
       </w:r>
     </w:p>
   </w:comment>
-  <w:comment w:id="1" w:author="Dave Bridges" w:date="2024-04-12T12:04:00Z" w:initials="DB">
+  <w:comment w:id="1" w:author="Dave Bridges" w:date="2024-04-12T12:34:00Z" w:initials="DB">
     <w:p>
       <w:pPr>
         <w:pStyle w:val="CommentText"/>
@@ -2044,11 +1745,11 @@
         <w:annotationRef/>
       </w:r>
       <w:r>
-        <w:t>Calculate this.</w:t>
+        <w:t>Recheck these numbers</w:t>
       </w:r>
     </w:p>
   </w:comment>
-  <w:comment w:id="2" w:author="Dave Bridges" w:date="2024-04-12T12:34:00Z" w:initials="DB">
+  <w:comment w:id="2" w:author="Dave Bridges" w:date="2024-04-12T12:26:00Z" w:initials="DB">
     <w:p>
       <w:pPr>
         <w:pStyle w:val="CommentText"/>
@@ -2060,27 +1761,11 @@
         <w:annotationRef/>
       </w:r>
       <w:r>
-        <w:t>Recheck these numbers</w:t>
+        <w:t>Write about this</w:t>
       </w:r>
     </w:p>
   </w:comment>
-  <w:comment w:id="3" w:author="Dave Bridges" w:date="2024-04-12T12:26:00Z" w:initials="DB">
-    <w:p>
-      <w:pPr>
-        <w:pStyle w:val="CommentText"/>
-      </w:pPr>
-      <w:r>
-        <w:rPr>
-          <w:rStyle w:val="CommentReference"/>
-        </w:rPr>
-        <w:annotationRef/>
-      </w:r>
-      <w:r>
-        <w:t>Write about this</w:t>
-      </w:r>
-    </w:p>
-  </w:comment>
-  <w:comment w:id="4" w:author="Dave Bridges" w:date="2024-04-12T11:52:00Z" w:initials="DB">
+  <w:comment w:id="3" w:author="Dave Bridges" w:date="2024-04-12T11:52:00Z" w:initials="DB">
     <w:p>
       <w:r>
         <w:rPr>
@@ -2130,146 +1815,7 @@
         </w:rPr>
         <w:t>; </w:t>
       </w:r>
-      <w:proofErr w:type="spellStart"/>
-      <w:r>
-        <w:fldChar w:fldCharType="begin"/>
-      </w:r>
-      <w:r>
-        <w:instrText xml:space="preserve"> HYPERLINK "https://www.ncbi.nlm.nih.gov/pmc/articles/PMC5846936/" \l "bibr31-2055102918759691" </w:instrText>
-      </w:r>
-      <w:r>
-        <w:fldChar w:fldCharType="separate"/>
-      </w:r>
-      <w:r>
-        <w:rPr>
-          <w:rStyle w:val="Hyperlink"/>
-          <w:rFonts w:ascii="Cambria" w:hAnsi="Cambria"/>
-          <w:color w:val="376FAA"/>
-          <w:sz w:val="30"/>
-          <w:szCs w:val="30"/>
-          <w:shd w:val="clear" w:color="auto" w:fill="FFFFFF"/>
-        </w:rPr>
-        <w:t>Puhl</w:t>
-      </w:r>
-      <w:proofErr w:type="spellEnd"/>
-      <w:r>
-        <w:rPr>
-          <w:rStyle w:val="Hyperlink"/>
-          <w:rFonts w:ascii="Cambria" w:hAnsi="Cambria"/>
-          <w:color w:val="376FAA"/>
-          <w:sz w:val="30"/>
-          <w:szCs w:val="30"/>
-          <w:shd w:val="clear" w:color="auto" w:fill="FFFFFF"/>
-        </w:rPr>
-        <w:t xml:space="preserve"> and Brownell, 2006</w:t>
-      </w:r>
-      <w:r>
-        <w:fldChar w:fldCharType="end"/>
-      </w:r>
-      <w:r>
-        <w:rPr>
-          <w:rFonts w:ascii="Cambria" w:hAnsi="Cambria"/>
-          <w:color w:val="212121"/>
-          <w:sz w:val="30"/>
-          <w:szCs w:val="30"/>
-          <w:shd w:val="clear" w:color="auto" w:fill="FFFFFF"/>
-        </w:rPr>
-        <w:t>; </w:t>
-      </w:r>
-      <w:proofErr w:type="spellStart"/>
-      <w:r>
-        <w:fldChar w:fldCharType="begin"/>
-      </w:r>
-      <w:r>
-        <w:instrText xml:space="preserve"> HYPERLINK "https://www.ncbi.nlm.nih.gov/pmc/articles/PMC5846936/" \l "bibr34-2055102918759691" </w:instrText>
-      </w:r>
-      <w:r>
-        <w:fldChar w:fldCharType="separate"/>
-      </w:r>
-      <w:r>
-        <w:rPr>
-          <w:rStyle w:val="Hyperlink"/>
-          <w:rFonts w:ascii="Cambria" w:hAnsi="Cambria"/>
-          <w:color w:val="376FAA"/>
-          <w:sz w:val="30"/>
-          <w:szCs w:val="30"/>
-          <w:shd w:val="clear" w:color="auto" w:fill="FFFFFF"/>
-        </w:rPr>
-        <w:t>Salwen</w:t>
-      </w:r>
-      <w:proofErr w:type="spellEnd"/>
-      <w:r>
-        <w:rPr>
-          <w:rStyle w:val="Hyperlink"/>
-          <w:rFonts w:ascii="Cambria" w:hAnsi="Cambria"/>
-          <w:color w:val="376FAA"/>
-          <w:sz w:val="30"/>
-          <w:szCs w:val="30"/>
-          <w:shd w:val="clear" w:color="auto" w:fill="FFFFFF"/>
-        </w:rPr>
-        <w:t xml:space="preserve"> et al., 2015</w:t>
-      </w:r>
-      <w:r>
-        <w:fldChar w:fldCharType="end"/>
-      </w:r>
-      <w:r>
-        <w:rPr>
-          <w:rFonts w:ascii="Cambria" w:hAnsi="Cambria"/>
-          <w:color w:val="212121"/>
-          <w:sz w:val="30"/>
-          <w:szCs w:val="30"/>
-          <w:shd w:val="clear" w:color="auto" w:fill="FFFFFF"/>
-        </w:rPr>
-        <w:t>; </w:t>
-      </w:r>
-      <w:proofErr w:type="spellStart"/>
-      <w:r>
-        <w:fldChar w:fldCharType="begin"/>
-      </w:r>
-      <w:r>
-        <w:instrText xml:space="preserve"> HYPERLINK "https://www.ncbi.nlm.nih.gov/pmc/articles/PMC5846936/" \l "bibr47-2055102918759691" </w:instrText>
-      </w:r>
-      <w:r>
-        <w:fldChar w:fldCharType="separate"/>
-      </w:r>
-      <w:r>
-        <w:rPr>
-          <w:rStyle w:val="Hyperlink"/>
-          <w:rFonts w:ascii="Cambria" w:hAnsi="Cambria"/>
-          <w:color w:val="376FAA"/>
-          <w:sz w:val="30"/>
-          <w:szCs w:val="30"/>
-          <w:shd w:val="clear" w:color="auto" w:fill="FFFFFF"/>
-        </w:rPr>
-        <w:t>Vartanian</w:t>
-      </w:r>
-      <w:proofErr w:type="spellEnd"/>
-      <w:r>
-        <w:rPr>
-          <w:rStyle w:val="Hyperlink"/>
-          <w:rFonts w:ascii="Cambria" w:hAnsi="Cambria"/>
-          <w:color w:val="376FAA"/>
-          <w:sz w:val="30"/>
-          <w:szCs w:val="30"/>
-          <w:shd w:val="clear" w:color="auto" w:fill="FFFFFF"/>
-        </w:rPr>
-        <w:t>, 2015</w:t>
-      </w:r>
-      <w:r>
-        <w:fldChar w:fldCharType="end"/>
-      </w:r>
-      <w:r>
-        <w:rPr>
-          <w:rFonts w:ascii="Cambria" w:hAnsi="Cambria"/>
-          <w:color w:val="212121"/>
-          <w:sz w:val="30"/>
-          <w:szCs w:val="30"/>
-          <w:shd w:val="clear" w:color="auto" w:fill="FFFFFF"/>
-        </w:rPr>
-        <w:t>; </w:t>
-      </w:r>
-      <w:hyperlink r:id="rId2" w:anchor="bibr50-2055102918759691" w:history="1">
-        <w:proofErr w:type="spellStart"/>
+      <w:hyperlink r:id="rId2" w:anchor="bibr31-2055102918759691" w:history="1">
         <w:r>
           <w:rPr>
             <w:rStyle w:val="Hyperlink"/>
@@ -2279,9 +1825,20 @@
             <w:szCs w:val="30"/>
             <w:shd w:val="clear" w:color="auto" w:fill="FFFFFF"/>
           </w:rPr>
-          <w:t>Vartanian</w:t>
+          <w:t>Puhl and Brownell, 2006</w:t>
         </w:r>
-        <w:proofErr w:type="spellEnd"/>
+      </w:hyperlink>
+      <w:r>
+        <w:rPr>
+          <w:rFonts w:ascii="Cambria" w:hAnsi="Cambria"/>
+          <w:color w:val="212121"/>
+          <w:sz w:val="30"/>
+          <w:szCs w:val="30"/>
+          <w:shd w:val="clear" w:color="auto" w:fill="FFFFFF"/>
+        </w:rPr>
+        <w:t>; </w:t>
+      </w:r>
+      <w:hyperlink r:id="rId3" w:anchor="bibr34-2055102918759691" w:history="1">
         <w:r>
           <w:rPr>
             <w:rStyle w:val="Hyperlink"/>
@@ -2291,7 +1848,7 @@
             <w:szCs w:val="30"/>
             <w:shd w:val="clear" w:color="auto" w:fill="FFFFFF"/>
           </w:rPr>
-          <w:t xml:space="preserve"> et al., 2014</w:t>
+          <w:t>Salwen et al., 2015</w:t>
         </w:r>
       </w:hyperlink>
       <w:r>
@@ -2304,42 +1861,19 @@
         </w:rPr>
         <w:t>; </w:t>
       </w:r>
-      <w:proofErr w:type="spellStart"/>
-      <w:r>
-        <w:fldChar w:fldCharType="begin"/>
-      </w:r>
-      <w:r>
-        <w:instrText xml:space="preserve"> HYPERLINK "https://www.ncbi.nlm.nih.gov/pmc/articles/PMC5846936/" \l "bibr48-2055102918759691" </w:instrText>
-      </w:r>
-      <w:r>
-        <w:fldChar w:fldCharType="separate"/>
-      </w:r>
-      <w:r>
-        <w:rPr>
-          <w:rStyle w:val="Hyperlink"/>
-          <w:rFonts w:ascii="Cambria" w:hAnsi="Cambria"/>
-          <w:color w:val="376FAA"/>
-          <w:sz w:val="30"/>
-          <w:szCs w:val="30"/>
-          <w:shd w:val="clear" w:color="auto" w:fill="FFFFFF"/>
-        </w:rPr>
-        <w:t>Vartanian</w:t>
-      </w:r>
-      <w:proofErr w:type="spellEnd"/>
-      <w:r>
-        <w:rPr>
-          <w:rStyle w:val="Hyperlink"/>
-          <w:rFonts w:ascii="Cambria" w:hAnsi="Cambria"/>
-          <w:color w:val="376FAA"/>
-          <w:sz w:val="30"/>
-          <w:szCs w:val="30"/>
-          <w:shd w:val="clear" w:color="auto" w:fill="FFFFFF"/>
-        </w:rPr>
-        <w:t xml:space="preserve"> and Novak, 2011</w:t>
-      </w:r>
-      <w:r>
-        <w:fldChar w:fldCharType="end"/>
-      </w:r>
+      <w:hyperlink r:id="rId4" w:anchor="bibr47-2055102918759691" w:history="1">
+        <w:r>
+          <w:rPr>
+            <w:rStyle w:val="Hyperlink"/>
+            <w:rFonts w:ascii="Cambria" w:hAnsi="Cambria"/>
+            <w:color w:val="376FAA"/>
+            <w:sz w:val="30"/>
+            <w:szCs w:val="30"/>
+            <w:shd w:val="clear" w:color="auto" w:fill="FFFFFF"/>
+          </w:rPr>
+          <w:t>Vartanian, 2015</w:t>
+        </w:r>
+      </w:hyperlink>
       <w:r>
         <w:rPr>
           <w:rFonts w:ascii="Cambria" w:hAnsi="Cambria"/>
@@ -2348,44 +1882,21 @@
           <w:szCs w:val="30"/>
           <w:shd w:val="clear" w:color="auto" w:fill="FFFFFF"/>
         </w:rPr>
-        <w:t>;), while others have found females experience higher rates of weight stigma and discrimination than males (</w:t>
-      </w:r>
-      <w:proofErr w:type="spellStart"/>
-      <w:r>
-        <w:fldChar w:fldCharType="begin"/>
-      </w:r>
-      <w:r>
-        <w:instrText xml:space="preserve"> HYPERLINK "https://www.ncbi.nlm.nih.gov/pmc/articles/PMC5846936/" \l "bibr1-2055102918759691" </w:instrText>
-      </w:r>
-      <w:r>
-        <w:fldChar w:fldCharType="separate"/>
-      </w:r>
-      <w:r>
-        <w:rPr>
-          <w:rStyle w:val="Hyperlink"/>
-          <w:rFonts w:ascii="Cambria" w:hAnsi="Cambria"/>
-          <w:color w:val="376FAA"/>
-          <w:sz w:val="30"/>
-          <w:szCs w:val="30"/>
-          <w:shd w:val="clear" w:color="auto" w:fill="FFFFFF"/>
-        </w:rPr>
-        <w:t>Andreyeva</w:t>
-      </w:r>
-      <w:proofErr w:type="spellEnd"/>
-      <w:r>
-        <w:rPr>
-          <w:rStyle w:val="Hyperlink"/>
-          <w:rFonts w:ascii="Cambria" w:hAnsi="Cambria"/>
-          <w:color w:val="376FAA"/>
-          <w:sz w:val="30"/>
-          <w:szCs w:val="30"/>
-          <w:shd w:val="clear" w:color="auto" w:fill="FFFFFF"/>
-        </w:rPr>
-        <w:t xml:space="preserve"> et al., 2008</w:t>
-      </w:r>
-      <w:r>
-        <w:fldChar w:fldCharType="end"/>
-      </w:r>
+        <w:t>; </w:t>
+      </w:r>
+      <w:hyperlink r:id="rId5" w:anchor="bibr50-2055102918759691" w:history="1">
+        <w:r>
+          <w:rPr>
+            <w:rStyle w:val="Hyperlink"/>
+            <w:rFonts w:ascii="Cambria" w:hAnsi="Cambria"/>
+            <w:color w:val="376FAA"/>
+            <w:sz w:val="30"/>
+            <w:szCs w:val="30"/>
+            <w:shd w:val="clear" w:color="auto" w:fill="FFFFFF"/>
+          </w:rPr>
+          <w:t>Vartanian et al., 2014</w:t>
+        </w:r>
+      </w:hyperlink>
       <w:r>
         <w:rPr>
           <w:rFonts w:ascii="Cambria" w:hAnsi="Cambria"/>
@@ -2396,7 +1907,53 @@
         </w:rPr>
         <w:t>; </w:t>
       </w:r>
-      <w:hyperlink r:id="rId3" w:anchor="bibr12-2055102918759691" w:history="1">
+      <w:hyperlink r:id="rId6" w:anchor="bibr48-2055102918759691" w:history="1">
+        <w:r>
+          <w:rPr>
+            <w:rStyle w:val="Hyperlink"/>
+            <w:rFonts w:ascii="Cambria" w:hAnsi="Cambria"/>
+            <w:color w:val="376FAA"/>
+            <w:sz w:val="30"/>
+            <w:szCs w:val="30"/>
+            <w:shd w:val="clear" w:color="auto" w:fill="FFFFFF"/>
+          </w:rPr>
+          <w:t>Vartanian and Novak, 2011</w:t>
+        </w:r>
+      </w:hyperlink>
+      <w:r>
+        <w:rPr>
+          <w:rFonts w:ascii="Cambria" w:hAnsi="Cambria"/>
+          <w:color w:val="212121"/>
+          <w:sz w:val="30"/>
+          <w:szCs w:val="30"/>
+          <w:shd w:val="clear" w:color="auto" w:fill="FFFFFF"/>
+        </w:rPr>
+        <w:t>;), while others have found females experience higher rates of weight stigma and discrimination than males (</w:t>
+      </w:r>
+      <w:hyperlink r:id="rId7" w:anchor="bibr1-2055102918759691" w:history="1">
+        <w:r>
+          <w:rPr>
+            <w:rStyle w:val="Hyperlink"/>
+            <w:rFonts w:ascii="Cambria" w:hAnsi="Cambria"/>
+            <w:color w:val="376FAA"/>
+            <w:sz w:val="30"/>
+            <w:szCs w:val="30"/>
+            <w:shd w:val="clear" w:color="auto" w:fill="FFFFFF"/>
+          </w:rPr>
+          <w:t>Andreyeva et al., 2008</w:t>
+        </w:r>
+      </w:hyperlink>
+      <w:r>
+        <w:rPr>
+          <w:rFonts w:ascii="Cambria" w:hAnsi="Cambria"/>
+          <w:color w:val="212121"/>
+          <w:sz w:val="30"/>
+          <w:szCs w:val="30"/>
+          <w:shd w:val="clear" w:color="auto" w:fill="FFFFFF"/>
+        </w:rPr>
+        <w:t>; </w:t>
+      </w:r>
+      <w:hyperlink r:id="rId8" w:anchor="bibr12-2055102918759691" w:history="1">
         <w:r>
           <w:rPr>
             <w:rStyle w:val="Hyperlink"/>
@@ -2419,7 +1976,7 @@
         </w:rPr>
         <w:t>; </w:t>
       </w:r>
-      <w:hyperlink r:id="rId4" w:anchor="bibr14-2055102918759691" w:history="1">
+      <w:hyperlink r:id="rId9" w:anchor="bibr14-2055102918759691" w:history="1">
         <w:r>
           <w:rPr>
             <w:rStyle w:val="Hyperlink"/>
@@ -2442,148 +1999,7 @@
         </w:rPr>
         <w:t>; </w:t>
       </w:r>
-      <w:proofErr w:type="spellStart"/>
-      <w:r>
-        <w:fldChar w:fldCharType="begin"/>
-      </w:r>
-      <w:r>
-        <w:instrText xml:space="preserve"> HYPERLINK "https://www.ncbi.nlm.nih.gov/pmc/articles/PMC5846936/" \l "bibr15-2055102918759691" </w:instrText>
-      </w:r>
-      <w:r>
-        <w:fldChar w:fldCharType="separate"/>
-      </w:r>
-      <w:r>
-        <w:rPr>
-          <w:rStyle w:val="Hyperlink"/>
-          <w:rFonts w:ascii="Cambria" w:hAnsi="Cambria"/>
-          <w:color w:val="376FAA"/>
-          <w:sz w:val="30"/>
-          <w:szCs w:val="30"/>
-          <w:shd w:val="clear" w:color="auto" w:fill="FFFFFF"/>
-        </w:rPr>
-        <w:t>Fikkan</w:t>
-      </w:r>
-      <w:proofErr w:type="spellEnd"/>
-      <w:r>
-        <w:rPr>
-          <w:rStyle w:val="Hyperlink"/>
-          <w:rFonts w:ascii="Cambria" w:hAnsi="Cambria"/>
-          <w:color w:val="376FAA"/>
-          <w:sz w:val="30"/>
-          <w:szCs w:val="30"/>
-          <w:shd w:val="clear" w:color="auto" w:fill="FFFFFF"/>
-        </w:rPr>
-        <w:t xml:space="preserve"> and </w:t>
-      </w:r>
-      <w:proofErr w:type="spellStart"/>
-      <w:r>
-        <w:rPr>
-          <w:rStyle w:val="Hyperlink"/>
-          <w:rFonts w:ascii="Cambria" w:hAnsi="Cambria"/>
-          <w:color w:val="376FAA"/>
-          <w:sz w:val="30"/>
-          <w:szCs w:val="30"/>
-          <w:shd w:val="clear" w:color="auto" w:fill="FFFFFF"/>
-        </w:rPr>
-        <w:t>Rothblum</w:t>
-      </w:r>
-      <w:proofErr w:type="spellEnd"/>
-      <w:r>
-        <w:rPr>
-          <w:rStyle w:val="Hyperlink"/>
-          <w:rFonts w:ascii="Cambria" w:hAnsi="Cambria"/>
-          <w:color w:val="376FAA"/>
-          <w:sz w:val="30"/>
-          <w:szCs w:val="30"/>
-          <w:shd w:val="clear" w:color="auto" w:fill="FFFFFF"/>
-        </w:rPr>
-        <w:t>, 2012</w:t>
-      </w:r>
-      <w:r>
-        <w:fldChar w:fldCharType="end"/>
-      </w:r>
-      <w:r>
-        <w:rPr>
-          <w:rFonts w:ascii="Cambria" w:hAnsi="Cambria"/>
-          <w:color w:val="212121"/>
-          <w:sz w:val="30"/>
-          <w:szCs w:val="30"/>
-          <w:shd w:val="clear" w:color="auto" w:fill="FFFFFF"/>
-        </w:rPr>
-        <w:t>; </w:t>
-      </w:r>
-      <w:proofErr w:type="spellStart"/>
-      <w:r>
-        <w:fldChar w:fldCharType="begin"/>
-      </w:r>
-      <w:r>
-        <w:instrText xml:space="preserve"> HYPERLINK "https://www.ncbi.nlm.nih.gov/pmc/articles/PMC5846936/" \l "bibr19-2055102918759691" </w:instrText>
-      </w:r>
-      <w:r>
-        <w:fldChar w:fldCharType="separate"/>
-      </w:r>
-      <w:r>
-        <w:rPr>
-          <w:rStyle w:val="Hyperlink"/>
-          <w:rFonts w:ascii="Cambria" w:hAnsi="Cambria"/>
-          <w:color w:val="376FAA"/>
-          <w:sz w:val="30"/>
-          <w:szCs w:val="30"/>
-          <w:shd w:val="clear" w:color="auto" w:fill="FFFFFF"/>
-        </w:rPr>
-        <w:t>Hebl</w:t>
-      </w:r>
-      <w:proofErr w:type="spellEnd"/>
-      <w:r>
-        <w:rPr>
-          <w:rStyle w:val="Hyperlink"/>
-          <w:rFonts w:ascii="Cambria" w:hAnsi="Cambria"/>
-          <w:color w:val="376FAA"/>
-          <w:sz w:val="30"/>
-          <w:szCs w:val="30"/>
-          <w:shd w:val="clear" w:color="auto" w:fill="FFFFFF"/>
-        </w:rPr>
-        <w:t xml:space="preserve"> and </w:t>
-      </w:r>
-      <w:proofErr w:type="spellStart"/>
-      <w:r>
-        <w:rPr>
-          <w:rStyle w:val="Hyperlink"/>
-          <w:rFonts w:ascii="Cambria" w:hAnsi="Cambria"/>
-          <w:color w:val="376FAA"/>
-          <w:sz w:val="30"/>
-          <w:szCs w:val="30"/>
-          <w:shd w:val="clear" w:color="auto" w:fill="FFFFFF"/>
-        </w:rPr>
-        <w:t>Turchin</w:t>
-      </w:r>
-      <w:proofErr w:type="spellEnd"/>
-      <w:r>
-        <w:rPr>
-          <w:rStyle w:val="Hyperlink"/>
-          <w:rFonts w:ascii="Cambria" w:hAnsi="Cambria"/>
-          <w:color w:val="376FAA"/>
-          <w:sz w:val="30"/>
-          <w:szCs w:val="30"/>
-          <w:shd w:val="clear" w:color="auto" w:fill="FFFFFF"/>
-        </w:rPr>
-        <w:t>, 2005</w:t>
-      </w:r>
-      <w:r>
-        <w:fldChar w:fldCharType="end"/>
-      </w:r>
-      <w:r>
-        <w:rPr>
-          <w:rFonts w:ascii="Cambria" w:hAnsi="Cambria"/>
-          <w:color w:val="212121"/>
-          <w:sz w:val="30"/>
-          <w:szCs w:val="30"/>
-          <w:shd w:val="clear" w:color="auto" w:fill="FFFFFF"/>
-        </w:rPr>
-        <w:t>; </w:t>
-      </w:r>
-      <w:hyperlink r:id="rId5" w:anchor="bibr32-2055102918759691" w:history="1">
-        <w:proofErr w:type="spellStart"/>
+      <w:hyperlink r:id="rId10" w:anchor="bibr15-2055102918759691" w:history="1">
         <w:r>
           <w:rPr>
             <w:rStyle w:val="Hyperlink"/>
@@ -2593,9 +2009,20 @@
             <w:szCs w:val="30"/>
             <w:shd w:val="clear" w:color="auto" w:fill="FFFFFF"/>
           </w:rPr>
-          <w:t>Puhl</w:t>
+          <w:t>Fikkan and Rothblum, 2012</w:t>
         </w:r>
-        <w:proofErr w:type="spellEnd"/>
+      </w:hyperlink>
+      <w:r>
+        <w:rPr>
+          <w:rFonts w:ascii="Cambria" w:hAnsi="Cambria"/>
+          <w:color w:val="212121"/>
+          <w:sz w:val="30"/>
+          <w:szCs w:val="30"/>
+          <w:shd w:val="clear" w:color="auto" w:fill="FFFFFF"/>
+        </w:rPr>
+        <w:t>; </w:t>
+      </w:r>
+      <w:hyperlink r:id="rId11" w:anchor="bibr19-2055102918759691" w:history="1">
         <w:r>
           <w:rPr>
             <w:rStyle w:val="Hyperlink"/>
@@ -2605,7 +2032,7 @@
             <w:szCs w:val="30"/>
             <w:shd w:val="clear" w:color="auto" w:fill="FFFFFF"/>
           </w:rPr>
-          <w:t xml:space="preserve"> et al., 2008</w:t>
+          <w:t>Hebl and Turchin, 2005</w:t>
         </w:r>
       </w:hyperlink>
       <w:r>
@@ -2618,42 +2045,19 @@
         </w:rPr>
         <w:t>; </w:t>
       </w:r>
-      <w:proofErr w:type="spellStart"/>
-      <w:r>
-        <w:fldChar w:fldCharType="begin"/>
-      </w:r>
-      <w:r>
-        <w:instrText xml:space="preserve"> HYPERLINK "https://www.ncbi.nlm.nih.gov/pmc/articles/PMC5846936/" \l "bibr43-2055102918759691" </w:instrText>
-      </w:r>
-      <w:r>
-        <w:fldChar w:fldCharType="separate"/>
-      </w:r>
-      <w:r>
-        <w:rPr>
-          <w:rStyle w:val="Hyperlink"/>
-          <w:rFonts w:ascii="Cambria" w:hAnsi="Cambria"/>
-          <w:color w:val="376FAA"/>
-          <w:sz w:val="30"/>
-          <w:szCs w:val="30"/>
-          <w:shd w:val="clear" w:color="auto" w:fill="FFFFFF"/>
-        </w:rPr>
-        <w:t>Spahlholz</w:t>
-      </w:r>
-      <w:proofErr w:type="spellEnd"/>
-      <w:r>
-        <w:rPr>
-          <w:rStyle w:val="Hyperlink"/>
-          <w:rFonts w:ascii="Cambria" w:hAnsi="Cambria"/>
-          <w:color w:val="376FAA"/>
-          <w:sz w:val="30"/>
-          <w:szCs w:val="30"/>
-          <w:shd w:val="clear" w:color="auto" w:fill="FFFFFF"/>
-        </w:rPr>
-        <w:t xml:space="preserve"> et al., 2016</w:t>
-      </w:r>
-      <w:r>
-        <w:fldChar w:fldCharType="end"/>
-      </w:r>
+      <w:hyperlink r:id="rId12" w:anchor="bibr32-2055102918759691" w:history="1">
+        <w:r>
+          <w:rPr>
+            <w:rStyle w:val="Hyperlink"/>
+            <w:rFonts w:ascii="Cambria" w:hAnsi="Cambria"/>
+            <w:color w:val="376FAA"/>
+            <w:sz w:val="30"/>
+            <w:szCs w:val="30"/>
+            <w:shd w:val="clear" w:color="auto" w:fill="FFFFFF"/>
+          </w:rPr>
+          <w:t>Puhl et al., 2008</w:t>
+        </w:r>
+      </w:hyperlink>
       <w:r>
         <w:rPr>
           <w:rFonts w:ascii="Cambria" w:hAnsi="Cambria"/>
@@ -2662,6 +2066,29 @@
           <w:szCs w:val="30"/>
           <w:shd w:val="clear" w:color="auto" w:fill="FFFFFF"/>
         </w:rPr>
+        <w:t>; </w:t>
+      </w:r>
+      <w:hyperlink r:id="rId13" w:anchor="bibr43-2055102918759691" w:history="1">
+        <w:r>
+          <w:rPr>
+            <w:rStyle w:val="Hyperlink"/>
+            <w:rFonts w:ascii="Cambria" w:hAnsi="Cambria"/>
+            <w:color w:val="376FAA"/>
+            <w:sz w:val="30"/>
+            <w:szCs w:val="30"/>
+            <w:shd w:val="clear" w:color="auto" w:fill="FFFFFF"/>
+          </w:rPr>
+          <w:t>Spahlholz et al., 2016</w:t>
+        </w:r>
+      </w:hyperlink>
+      <w:r>
+        <w:rPr>
+          <w:rFonts w:ascii="Cambria" w:hAnsi="Cambria"/>
+          <w:color w:val="212121"/>
+          <w:sz w:val="30"/>
+          <w:szCs w:val="30"/>
+          <w:shd w:val="clear" w:color="auto" w:fill="FFFFFF"/>
+        </w:rPr>
         <w:t>)</w:t>
       </w:r>
     </w:p>
@@ -2674,19 +2101,11 @@
       </w:r>
       <w:r>
         <w:br/>
-        <w:t>@</w:t>
-      </w:r>
-      <w:proofErr w:type="spellStart"/>
-      <w:r>
-        <w:t>kate</w:t>
-      </w:r>
-      <w:proofErr w:type="spellEnd"/>
-      <w:r>
-        <w:t xml:space="preserve"> do you have a better sense of whether this is true?</w:t>
+        <w:t>@kate do you have a better sense of whether this is true?</w:t>
       </w:r>
     </w:p>
   </w:comment>
-  <w:comment w:id="6" w:author="Dave Bridges" w:date="2024-04-12T11:07:00Z" w:initials="DB">
+  <w:comment w:id="4" w:author="Dave Bridges" w:date="2024-04-12T11:07:00Z" w:initials="DB">
     <w:p>
       <w:pPr>
         <w:pStyle w:val="CommentText"/>
@@ -2700,19 +2119,9 @@
       <w:r>
         <w:t>@</w:t>
       </w:r>
-      <w:proofErr w:type="spellStart"/>
-      <w:r>
-        <w:t>kate</w:t>
-      </w:r>
-      <w:proofErr w:type="spellEnd"/>
-      <w:r>
-        <w:t xml:space="preserve"> and </w:t>
-      </w:r>
-      <w:proofErr w:type="spellStart"/>
-      <w:r>
-        <w:t>irit</w:t>
-      </w:r>
-      <w:proofErr w:type="spellEnd"/>
+      <w:r>
+        <w:t>kate and irit</w:t>
+      </w:r>
       <w:r>
         <w:br/>
       </w:r>
@@ -2726,9 +2135,8 @@
 </file>
 
 <file path=word/commentsExtended.xml><?xml version="1.0" encoding="utf-8"?>
-<w15:commentsEx xmlns:wpc="http://schemas.microsoft.com/office/word/2010/wordprocessingCanvas" xmlns:cx="http://schemas.microsoft.com/office/drawing/2014/chartex" xmlns:cx1="http://schemas.microsoft.com/office/drawing/2015/9/8/chartex" xmlns:cx2="http://schemas.microsoft.com/office/drawing/2015/10/21/chartex" xmlns:cx3="http://schemas.microsoft.com/office/drawing/2016/5/9/chartex" xmlns:cx4="http://schemas.microsoft.com/office/drawing/2016/5/10/chartex" xmlns:cx5="http://schemas.microsoft.com/office/drawing/2016/5/11/chartex" xmlns:cx6="http://schemas.microsoft.com/office/drawing/2016/5/12/chartex" xmlns:cx7="http://schemas.microsoft.com/office/drawing/2016/5/13/chartex" xmlns:cx8="http://schemas.microsoft.com/office/drawing/2016/5/14/chartex" xmlns:mc="http://schemas.openxmlformats.org/markup-compatibility/2006" xmlns:aink="http://schemas.microsoft.com/office/drawing/2016/ink" xmlns:am3d="http://schemas.microsoft.com/office/drawing/2017/model3d" xmlns:o="urn:schemas-microsoft-com:office:office" xmlns:r="http://schemas.openxmlformats.org/officeDocument/2006/relationships" xmlns:m="http://schemas.openxmlformats.org/officeDocument/2006/math" xmlns:v="urn:schemas-microsoft-com:vml" xmlns:wp14="http://schemas.microsoft.com/office/word/2010/wordprocessingDrawing" xmlns:wp="http://schemas.openxmlformats.org/drawingml/2006/wordprocessingDrawing" xmlns:w10="urn:schemas-microsoft-com:office:word" xmlns:w="http://schemas.openxmlformats.org/wordprocessingml/2006/main" xmlns:w14="http://schemas.microsoft.com/office/word/2010/wordml" xmlns:w15="http://schemas.microsoft.com/office/word/2012/wordml" xmlns:w16cid="http://schemas.microsoft.com/office/word/2016/wordml/cid" xmlns:w16se="http://schemas.microsoft.com/office/word/2015/wordml/symex" xmlns:wpg="http://schemas.microsoft.com/office/word/2010/wordprocessingGroup" xmlns:wpi="http://schemas.microsoft.com/office/word/2010/wordprocessingInk" xmlns:wne="http://schemas.microsoft.com/office/word/2006/wordml" xmlns:wps="http://schemas.microsoft.com/office/word/2010/wordprocessingShape" mc:Ignorable="w14 w15 w16se w16cid wp14">
+<w15:commentsEx xmlns:wpc="http://schemas.microsoft.com/office/word/2010/wordprocessingCanvas" xmlns:cx="http://schemas.microsoft.com/office/drawing/2014/chartex" xmlns:cx1="http://schemas.microsoft.com/office/drawing/2015/9/8/chartex" xmlns:cx2="http://schemas.microsoft.com/office/drawing/2015/10/21/chartex" xmlns:cx3="http://schemas.microsoft.com/office/drawing/2016/5/9/chartex" xmlns:cx4="http://schemas.microsoft.com/office/drawing/2016/5/10/chartex" xmlns:cx5="http://schemas.microsoft.com/office/drawing/2016/5/11/chartex" xmlns:cx6="http://schemas.microsoft.com/office/drawing/2016/5/12/chartex" xmlns:cx7="http://schemas.microsoft.com/office/drawing/2016/5/13/chartex" xmlns:cx8="http://schemas.microsoft.com/office/drawing/2016/5/14/chartex" xmlns:mc="http://schemas.openxmlformats.org/markup-compatibility/2006" xmlns:aink="http://schemas.microsoft.com/office/drawing/2016/ink" xmlns:am3d="http://schemas.microsoft.com/office/drawing/2017/model3d" xmlns:o="urn:schemas-microsoft-com:office:office" xmlns:oel="http://schemas.microsoft.com/office/2019/extlst" xmlns:r="http://schemas.openxmlformats.org/officeDocument/2006/relationships" xmlns:m="http://schemas.openxmlformats.org/officeDocument/2006/math" xmlns:v="urn:schemas-microsoft-com:vml" xmlns:wp14="http://schemas.microsoft.com/office/word/2010/wordprocessingDrawing" xmlns:wp="http://schemas.openxmlformats.org/drawingml/2006/wordprocessingDrawing" xmlns:w10="urn:schemas-microsoft-com:office:word" xmlns:w="http://schemas.openxmlformats.org/wordprocessingml/2006/main" xmlns:w14="http://schemas.microsoft.com/office/word/2010/wordml" xmlns:w15="http://schemas.microsoft.com/office/word/2012/wordml" xmlns:w16cex="http://schemas.microsoft.com/office/word/2018/wordml/cex" xmlns:w16cid="http://schemas.microsoft.com/office/word/2016/wordml/cid" xmlns:w16="http://schemas.microsoft.com/office/word/2018/wordml" xmlns:w16sdtdh="http://schemas.microsoft.com/office/word/2020/wordml/sdtdatahash" xmlns:w16se="http://schemas.microsoft.com/office/word/2015/wordml/symex" xmlns:wpg="http://schemas.microsoft.com/office/word/2010/wordprocessingGroup" xmlns:wpi="http://schemas.microsoft.com/office/word/2010/wordprocessingInk" xmlns:wne="http://schemas.microsoft.com/office/word/2006/wordml" xmlns:wps="http://schemas.microsoft.com/office/word/2010/wordprocessingShape" mc:Ignorable="w14 w15 w16se w16cid w16 w16cex w16sdtdh wp14">
   <w15:commentEx w15:paraId="10DFA24D" w15:done="0"/>
-  <w15:commentEx w15:paraId="4FA6F45D" w15:done="0"/>
   <w15:commentEx w15:paraId="5B10A6FF" w15:done="0"/>
   <w15:commentEx w15:paraId="620828B1" w15:done="0"/>
   <w15:commentEx w15:paraId="6B0600C2" w15:done="0"/>
@@ -2737,9 +2145,8 @@
 </file>
 
 <file path=word/commentsIds.xml><?xml version="1.0" encoding="utf-8"?>
-<w16cid:commentsIds xmlns:wpc="http://schemas.microsoft.com/office/word/2010/wordprocessingCanvas" xmlns:cx="http://schemas.microsoft.com/office/drawing/2014/chartex" xmlns:cx1="http://schemas.microsoft.com/office/drawing/2015/9/8/chartex" xmlns:cx2="http://schemas.microsoft.com/office/drawing/2015/10/21/chartex" xmlns:cx3="http://schemas.microsoft.com/office/drawing/2016/5/9/chartex" xmlns:cx4="http://schemas.microsoft.com/office/drawing/2016/5/10/chartex" xmlns:cx5="http://schemas.microsoft.com/office/drawing/2016/5/11/chartex" xmlns:cx6="http://schemas.microsoft.com/office/drawing/2016/5/12/chartex" xmlns:cx7="http://schemas.microsoft.com/office/drawing/2016/5/13/chartex" xmlns:cx8="http://schemas.microsoft.com/office/drawing/2016/5/14/chartex" xmlns:mc="http://schemas.openxmlformats.org/markup-compatibility/2006" xmlns:aink="http://schemas.microsoft.com/office/drawing/2016/ink" xmlns:am3d="http://schemas.microsoft.com/office/drawing/2017/model3d" xmlns:o="urn:schemas-microsoft-com:office:office" xmlns:r="http://schemas.openxmlformats.org/officeDocument/2006/relationships" xmlns:m="http://schemas.openxmlformats.org/officeDocument/2006/math" xmlns:v="urn:schemas-microsoft-com:vml" xmlns:wp14="http://schemas.microsoft.com/office/word/2010/wordprocessingDrawing" xmlns:wp="http://schemas.openxmlformats.org/drawingml/2006/wordprocessingDrawing" xmlns:w10="urn:schemas-microsoft-com:office:word" xmlns:w="http://schemas.openxmlformats.org/wordprocessingml/2006/main" xmlns:w14="http://schemas.microsoft.com/office/word/2010/wordml" xmlns:w15="http://schemas.microsoft.com/office/word/2012/wordml" xmlns:w16cid="http://schemas.microsoft.com/office/word/2016/wordml/cid" xmlns:w16se="http://schemas.microsoft.com/office/word/2015/wordml/symex" xmlns:wpg="http://schemas.microsoft.com/office/word/2010/wordprocessingGroup" xmlns:wpi="http://schemas.microsoft.com/office/word/2010/wordprocessingInk" xmlns:wne="http://schemas.microsoft.com/office/word/2006/wordml" xmlns:wps="http://schemas.microsoft.com/office/word/2010/wordprocessingShape" mc:Ignorable="w14 w15 w16se w16cid wp14">
+<w16cid:commentsIds xmlns:wpc="http://schemas.microsoft.com/office/word/2010/wordprocessingCanvas" xmlns:cx="http://schemas.microsoft.com/office/drawing/2014/chartex" xmlns:cx1="http://schemas.microsoft.com/office/drawing/2015/9/8/chartex" xmlns:cx2="http://schemas.microsoft.com/office/drawing/2015/10/21/chartex" xmlns:cx3="http://schemas.microsoft.com/office/drawing/2016/5/9/chartex" xmlns:cx4="http://schemas.microsoft.com/office/drawing/2016/5/10/chartex" xmlns:cx5="http://schemas.microsoft.com/office/drawing/2016/5/11/chartex" xmlns:cx6="http://schemas.microsoft.com/office/drawing/2016/5/12/chartex" xmlns:cx7="http://schemas.microsoft.com/office/drawing/2016/5/13/chartex" xmlns:cx8="http://schemas.microsoft.com/office/drawing/2016/5/14/chartex" xmlns:mc="http://schemas.openxmlformats.org/markup-compatibility/2006" xmlns:aink="http://schemas.microsoft.com/office/drawing/2016/ink" xmlns:am3d="http://schemas.microsoft.com/office/drawing/2017/model3d" xmlns:o="urn:schemas-microsoft-com:office:office" xmlns:oel="http://schemas.microsoft.com/office/2019/extlst" xmlns:r="http://schemas.openxmlformats.org/officeDocument/2006/relationships" xmlns:m="http://schemas.openxmlformats.org/officeDocument/2006/math" xmlns:v="urn:schemas-microsoft-com:vml" xmlns:wp14="http://schemas.microsoft.com/office/word/2010/wordprocessingDrawing" xmlns:wp="http://schemas.openxmlformats.org/drawingml/2006/wordprocessingDrawing" xmlns:w10="urn:schemas-microsoft-com:office:word" xmlns:w="http://schemas.openxmlformats.org/wordprocessingml/2006/main" xmlns:w14="http://schemas.microsoft.com/office/word/2010/wordml" xmlns:w15="http://schemas.microsoft.com/office/word/2012/wordml" xmlns:w16cex="http://schemas.microsoft.com/office/word/2018/wordml/cex" xmlns:w16cid="http://schemas.microsoft.com/office/word/2016/wordml/cid" xmlns:w16="http://schemas.microsoft.com/office/word/2018/wordml" xmlns:w16sdtdh="http://schemas.microsoft.com/office/word/2020/wordml/sdtdatahash" xmlns:w16se="http://schemas.microsoft.com/office/word/2015/wordml/symex" xmlns:wpg="http://schemas.microsoft.com/office/word/2010/wordprocessingGroup" xmlns:wpi="http://schemas.microsoft.com/office/word/2010/wordprocessingInk" xmlns:wne="http://schemas.microsoft.com/office/word/2006/wordml" xmlns:wps="http://schemas.microsoft.com/office/word/2010/wordprocessingShape" mc:Ignorable="w14 w15 w16se w16cid w16 w16cex w16sdtdh wp14">
   <w16cid:commentId w16cid:paraId="10DFA24D" w16cid:durableId="29411550"/>
-  <w16cid:commentId w16cid:paraId="4FA6F45D" w16cid:durableId="29C3A1B4"/>
   <w16cid:commentId w16cid:paraId="5B10A6FF" w16cid:durableId="29C3A8EF"/>
   <w16cid:commentId w16cid:paraId="620828B1" w16cid:durableId="29C3A6FB"/>
   <w16cid:commentId w16cid:paraId="6B0600C2" w16cid:durableId="29C39F1A"/>
@@ -2748,7 +2155,7 @@
 </file>
 
 <file path=word/styles.xml><?xml version="1.0" encoding="utf-8"?>
-<w:styles xmlns:mc="http://schemas.openxmlformats.org/markup-compatibility/2006" xmlns:r="http://schemas.openxmlformats.org/officeDocument/2006/relationships" xmlns:w="http://schemas.openxmlformats.org/wordprocessingml/2006/main" xmlns:w14="http://schemas.microsoft.com/office/word/2010/wordml" xmlns:w15="http://schemas.microsoft.com/office/word/2012/wordml" xmlns:w16cid="http://schemas.microsoft.com/office/word/2016/wordml/cid" xmlns:w16se="http://schemas.microsoft.com/office/word/2015/wordml/symex" mc:Ignorable="w14 w15 w16se w16cid">
+<w:styles xmlns:mc="http://schemas.openxmlformats.org/markup-compatibility/2006" xmlns:r="http://schemas.openxmlformats.org/officeDocument/2006/relationships" xmlns:w="http://schemas.openxmlformats.org/wordprocessingml/2006/main" xmlns:w14="http://schemas.microsoft.com/office/word/2010/wordml" xmlns:w15="http://schemas.microsoft.com/office/word/2012/wordml" xmlns:w16cex="http://schemas.microsoft.com/office/word/2018/wordml/cex" xmlns:w16cid="http://schemas.microsoft.com/office/word/2016/wordml/cid" xmlns:w16="http://schemas.microsoft.com/office/word/2018/wordml" xmlns:w16sdtdh="http://schemas.microsoft.com/office/word/2020/wordml/sdtdatahash" xmlns:w16se="http://schemas.microsoft.com/office/word/2015/wordml/symex" mc:Ignorable="w14 w15 w16se w16cid w16 w16cex w16sdtdh">
   <w:docDefaults>
     <w:rPrDefault>
       <w:rPr>
@@ -2760,7 +2167,7 @@
     </w:rPrDefault>
     <w:pPrDefault/>
   </w:docDefaults>
-  <w:latentStyles w:defLockedState="0" w:defUIPriority="99" w:defSemiHidden="0" w:defUnhideWhenUsed="0" w:defQFormat="0" w:count="375">
+  <w:latentStyles w:defLockedState="0" w:defUIPriority="99" w:defSemiHidden="0" w:defUnhideWhenUsed="0" w:defQFormat="0" w:count="376">
     <w:lsdException w:name="Normal" w:uiPriority="0" w:qFormat="1"/>
     <w:lsdException w:name="heading 1" w:uiPriority="9" w:qFormat="1"/>
     <w:lsdException w:name="heading 2" w:semiHidden="1" w:uiPriority="9" w:unhideWhenUsed="1" w:qFormat="1"/>
@@ -3134,6 +2541,7 @@
     <w:lsdException w:name="List Table 7 Colorful Accent 6" w:uiPriority="52"/>
     <w:lsdException w:name="Mention" w:semiHidden="1" w:unhideWhenUsed="1"/>
     <w:lsdException w:name="Smart Hyperlink" w:semiHidden="1" w:unhideWhenUsed="1"/>
+    <w:lsdException w:name="Smart Link" w:semiHidden="1" w:unhideWhenUsed="1"/>
   </w:latentStyles>
   <w:style w:type="paragraph" w:default="1" w:styleId="Normal">
     <w:name w:val="Normal"/>
@@ -3205,6 +2613,7 @@
   <w:style w:type="character" w:default="1" w:styleId="DefaultParagraphFont">
     <w:name w:val="Default Paragraph Font"/>
     <w:uiPriority w:val="1"/>
+    <w:semiHidden/>
     <w:unhideWhenUsed/>
   </w:style>
   <w:style w:type="table" w:default="1" w:styleId="TableNormal">

</xml_diff>

<commit_message>
Updated results and discussion
</commit_message>
<xml_diff>
--- a/manuscript/Obesity-Stress/Manuscript.docx
+++ b/manuscript/Obesity-Stress/Manuscript.docx
@@ -45,7 +45,11 @@
       </w:r>
     </w:p>
     <w:p/>
-    <w:p/>
+    <w:p>
+      <w:r>
+        <w:t>Via multivariate modelling, accounting for differences in gender, age, race/ethnicity, and socioeconomic status we found that perceived stress enhanced type 2 prevalence by 13% above that expected by obesity or stress alone.</w:t>
+      </w:r>
+    </w:p>
     <w:p>
       <w:pPr>
         <w:rPr>
@@ -80,7 +84,7 @@
         <w:fldChar w:fldCharType="begin"/>
       </w:r>
       <w:r>
-        <w:instrText xml:space="preserve"> ADDIN ZOTERO_ITEM CSL_CITATION {"citationID":"PFInBGkp","properties":{"formattedCitation":"(1)","plainCitation":"(1)","noteIndex":0},"citationItems":[{"id":"wYajtxYE/aNG2Y68D","uris":["http://zotero.org/users/2695081/items/YEZFY7CW"],"itemData":{"id":"wYajtxYE/aNG2Y68D","type":"article-journal","container-title":"Cell Metabolism","DOI":"10.1016/j.cmet.2021.12.012","ISSN":"15504131","issue":"1","journalAbbreviation":"Cell Metabolism","language":"en","page":"11-20","source":"DOI.org (Crossref)","title":"Why does obesity cause diabetes?","volume":"34","author":[{"family":"Klein","given":"Samuel"},{"family":"Gastaldelli","given":"Amalia"},{"family":"Yki-Järvinen","given":"Hannele"},{"family":"Scherer","given":"Philipp E."}],"issued":{"date-parts":[["2022",1]]}}}],"schema":"https://github.com/citation-style-language/schema/raw/master/csl-citation.json"} </w:instrText>
+        <w:instrText xml:space="preserve"> ADDIN ZOTERO_ITEM CSL_CITATION {"citationID":"PFInBGkp","properties":{"formattedCitation":"(1)","plainCitation":"(1)","noteIndex":0},"citationItems":[{"id":"9zI9GZ7V/hV33GpYx","uris":["http://zotero.org/users/2695081/items/YEZFY7CW"],"itemData":{"id":"wYajtxYE/aNG2Y68D","type":"article-journal","container-title":"Cell Metabolism","DOI":"10.1016/j.cmet.2021.12.012","ISSN":"15504131","issue":"1","journalAbbreviation":"Cell Metabolism","language":"en","page":"11-20","source":"DOI.org (Crossref)","title":"Why does obesity cause diabetes?","volume":"34","author":[{"family":"Klein","given":"Samuel"},{"family":"Gastaldelli","given":"Amalia"},{"family":"Yki-Järvinen","given":"Hannele"},{"family":"Scherer","given":"Philipp E."}],"issued":{"date-parts":[["2022",1]]}}}],"schema":"https://github.com/citation-style-language/schema/raw/master/csl-citation.json"} </w:instrText>
       </w:r>
       <w:r>
         <w:fldChar w:fldCharType="separate"/>
@@ -107,7 +111,7 @@
         <w:fldChar w:fldCharType="begin"/>
       </w:r>
       <w:r>
-        <w:instrText xml:space="preserve"> ADDIN ZOTERO_ITEM CSL_CITATION {"citationID":"M57XEHIn","properties":{"formattedCitation":"(2)","plainCitation":"(2)","noteIndex":0},"citationItems":[{"id":"wYajtxYE/gfILpTet","uris":["http://zotero.org/users/2695081/items/NFIEYI62"],"itemData":{"id":1813,"type":"article-journal","abstract":"Evidence suggests that psychological and physical stress are relevant triggering factors for the onset of type 1 diabetes (T1D) and type 2 diabetes (T2D). The underlying mechanisms involve a complex neuroendocrine structure, involving the central nervous system and the periphery. Psychological stress leads to an increase of serum glucocorticoid concentrations and catecholamines release increasing the insulin need and the insulin resistance. According to the β-cell stress hypothesis, also causes of increased insulin demand, such as rapid growth, overweight, puberty, low physical activity, trauma, infections, and glucose overload, are potentially relevant factors in development of T1D. It has also been demonstrated that chronic stress and obesity form a vicious circle which leads to a definitive metabolic failure, increasing the risk of developing T2D. In this review, we will provide the most recent data concerning the role of stress in the outcomes of T1D and T2D, with a focus on the role of physical and psychological stress on the onset of T1D.","container-title":"Hormone Research in Paediatrics","DOI":"10.1159/000522431","ISSN":"1663-2826","issue":"1","journalAbbreviation":"Horm Res Paediatr","language":"eng","note":"PMID: 35124671","page":"34-43","source":"PubMed","title":"Stress and Diabetes Mellitus: Pathogenetic Mechanisms and Clinical Outcome","title-short":"Stress and Diabetes Mellitus","volume":"96","author":[{"family":"Ingrosso","given":"Diletta Maria Francesca"},{"family":"Primavera","given":"Marina"},{"family":"Samvelyan","given":"Sona"},{"family":"Tagi","given":"Veronica Maria"},{"family":"Chiarelli","given":"Francesco"}],"issued":{"date-parts":[["2023"]]}}}],"schema":"https://github.com/citation-style-language/schema/raw/master/csl-citation.json"} </w:instrText>
+        <w:instrText xml:space="preserve"> ADDIN ZOTERO_ITEM CSL_CITATION {"citationID":"M57XEHIn","properties":{"formattedCitation":"(2)","plainCitation":"(2)","noteIndex":0},"citationItems":[{"id":"9zI9GZ7V/ZZktq7ou","uris":["http://zotero.org/users/2695081/items/NFIEYI62"],"itemData":{"id":1813,"type":"article-journal","abstract":"Evidence suggests that psychological and physical stress are relevant triggering factors for the onset of type 1 diabetes (T1D) and type 2 diabetes (T2D). The underlying mechanisms involve a complex neuroendocrine structure, involving the central nervous system and the periphery. Psychological stress leads to an increase of serum glucocorticoid concentrations and catecholamines release increasing the insulin need and the insulin resistance. According to the β-cell stress hypothesis, also causes of increased insulin demand, such as rapid growth, overweight, puberty, low physical activity, trauma, infections, and glucose overload, are potentially relevant factors in development of T1D. It has also been demonstrated that chronic stress and obesity form a vicious circle which leads to a definitive metabolic failure, increasing the risk of developing T2D. In this review, we will provide the most recent data concerning the role of stress in the outcomes of T1D and T2D, with a focus on the role of physical and psychological stress on the onset of T1D.","container-title":"Hormone Research in Paediatrics","DOI":"10.1159/000522431","ISSN":"1663-2826","issue":"1","journalAbbreviation":"Horm Res Paediatr","language":"eng","note":"PMID: 35124671","page":"34-43","source":"PubMed","title":"Stress and Diabetes Mellitus: Pathogenetic Mechanisms and Clinical Outcome","title-short":"Stress and Diabetes Mellitus","volume":"96","author":[{"family":"Ingrosso","given":"Diletta Maria Francesca"},{"family":"Primavera","given":"Marina"},{"family":"Samvelyan","given":"Sona"},{"family":"Tagi","given":"Veronica Maria"},{"family":"Chiarelli","given":"Francesco"}],"issued":{"date-parts":[["2023"]]}}}],"schema":"https://github.com/citation-style-language/schema/raw/master/csl-citation.json"} </w:instrText>
       </w:r>
       <w:r>
         <w:fldChar w:fldCharType="separate"/>
@@ -128,7 +132,7 @@
         <w:fldChar w:fldCharType="begin"/>
       </w:r>
       <w:r>
-        <w:instrText xml:space="preserve"> ADDIN ZOTERO_ITEM CSL_CITATION {"citationID":"uXca1Ecw","properties":{"formattedCitation":"(3)","plainCitation":"(3)","noteIndex":0},"citationItems":[{"id":"wYajtxYE/nDHUFloU","uris":["http://zotero.org/users/2695081/items/9FN2SLJA"],"itemData":{"id":1825,"type":"article-journal","abstract":"Many pathways connect stress and obesity, two highly prevalent problems facing society today. First, stress interferes with cognitive processes such as executive function and self-regulation. Second, stress can affect behavior by inducing overeating and consumption of foods that are high in calories, fat, or sugar; by decreasing physical activity; and by shortening sleep. Third, stress triggers physiological changes in the hypothalamic-pituitary-adrenal axis, reward processing in the brain, and possibly the gut microbiome. Finally, stress can stimulate production of biochemical hormones and peptides such as leptin, ghrelin, and neuropeptide Y. Obesity itself can be a stressful state due to the high prevalence of weight stigma. This article therefore traces the contribution of weight stigma to stress and obesogenic processes, ultimately describing a vicious cycle of stress to obesity to stigma to stress. Current obesity prevention efforts focus solely on eating and exercise; the evidence reviewed in this article points to stress as an important but currently overlooked public policy target.","container-title":"Annual Review of Psychology","DOI":"10.1146/annurev-psych-010418-102936","ISSN":"0066-4308, 1545-2085","issue":"1","journalAbbreviation":"Annu. Rev. Psychol.","language":"en","page":"703-718","source":"DOI.org (Crossref)","title":"Stress and Obesity","volume":"70","author":[{"family":"Tomiyama","given":"A. Janet"}],"issued":{"date-parts":[["2019",1,4]]}}}],"schema":"https://github.com/citation-style-language/schema/raw/master/csl-citation.json"} </w:instrText>
+        <w:instrText xml:space="preserve"> ADDIN ZOTERO_ITEM CSL_CITATION {"citationID":"uXca1Ecw","properties":{"formattedCitation":"(3)","plainCitation":"(3)","noteIndex":0},"citationItems":[{"id":"9zI9GZ7V/Tl2mVMOZ","uris":["http://zotero.org/users/2695081/items/9FN2SLJA"],"itemData":{"id":1825,"type":"article-journal","abstract":"Many pathways connect stress and obesity, two highly prevalent problems facing society today. First, stress interferes with cognitive processes such as executive function and self-regulation. Second, stress can affect behavior by inducing overeating and consumption of foods that are high in calories, fat, or sugar; by decreasing physical activity; and by shortening sleep. Third, stress triggers physiological changes in the hypothalamic-pituitary-adrenal axis, reward processing in the brain, and possibly the gut microbiome. Finally, stress can stimulate production of biochemical hormones and peptides such as leptin, ghrelin, and neuropeptide Y. Obesity itself can be a stressful state due to the high prevalence of weight stigma. This article therefore traces the contribution of weight stigma to stress and obesogenic processes, ultimately describing a vicious cycle of stress to obesity to stigma to stress. Current obesity prevention efforts focus solely on eating and exercise; the evidence reviewed in this article points to stress as an important but currently overlooked public policy target.","container-title":"Annual Review of Psychology","DOI":"10.1146/annurev-psych-010418-102936","ISSN":"0066-4308, 1545-2085","issue":"1","journalAbbreviation":"Annu. Rev. Psychol.","language":"en","page":"703-718","source":"DOI.org (Crossref)","title":"Stress and Obesity","volume":"70","author":[{"family":"Tomiyama","given":"A. Janet"}],"issued":{"date-parts":[["2019",1,4]]}}}],"schema":"https://github.com/citation-style-language/schema/raw/master/csl-citation.json"} </w:instrText>
       </w:r>
       <w:r>
         <w:fldChar w:fldCharType="separate"/>
@@ -161,7 +165,7 @@
         <w:fldChar w:fldCharType="begin"/>
       </w:r>
       <w:r>
-        <w:instrText xml:space="preserve"> ADDIN ZOTERO_ITEM CSL_CITATION {"citationID":"g6EUyo8B","properties":{"formattedCitation":"(2)","plainCitation":"(2)","noteIndex":0},"citationItems":[{"id":"wYajtxYE/gfILpTet","uris":["http://zotero.org/users/2695081/items/NFIEYI62"],"itemData":{"id":1813,"type":"article-journal","abstract":"Evidence suggests that psychological and physical stress are relevant triggering factors for the onset of type 1 diabetes (T1D) and type 2 diabetes (T2D). The underlying mechanisms involve a complex neuroendocrine structure, involving the central nervous system and the periphery. Psychological stress leads to an increase of serum glucocorticoid concentrations and catecholamines release increasing the insulin need and the insulin resistance. According to the β-cell stress hypothesis, also causes of increased insulin demand, such as rapid growth, overweight, puberty, low physical activity, trauma, infections, and glucose overload, are potentially relevant factors in development of T1D. It has also been demonstrated that chronic stress and obesity form a vicious circle which leads to a definitive metabolic failure, increasing the risk of developing T2D. In this review, we will provide the most recent data concerning the role of stress in the outcomes of T1D and T2D, with a focus on the role of physical and psychological stress on the onset of T1D.","container-title":"Hormone Research in Paediatrics","DOI":"10.1159/000522431","ISSN":"1663-2826","issue":"1","journalAbbreviation":"Horm Res Paediatr","language":"eng","note":"PMID: 35124671","page":"34-43","source":"PubMed","title":"Stress and Diabetes Mellitus: Pathogenetic Mechanisms and Clinical Outcome","title-short":"Stress and Diabetes Mellitus","volume":"96","author":[{"family":"Ingrosso","given":"Diletta Maria Francesca"},{"family":"Primavera","given":"Marina"},{"family":"Samvelyan","given":"Sona"},{"family":"Tagi","given":"Veronica Maria"},{"family":"Chiarelli","given":"Francesco"}],"issued":{"date-parts":[["2023"]]}}}],"schema":"https://github.com/citation-style-language/schema/raw/master/csl-citation.json"} </w:instrText>
+        <w:instrText xml:space="preserve"> ADDIN ZOTERO_ITEM CSL_CITATION {"citationID":"g6EUyo8B","properties":{"formattedCitation":"(2)","plainCitation":"(2)","noteIndex":0},"citationItems":[{"id":"9zI9GZ7V/ZZktq7ou","uris":["http://zotero.org/users/2695081/items/NFIEYI62"],"itemData":{"id":1813,"type":"article-journal","abstract":"Evidence suggests that psychological and physical stress are relevant triggering factors for the onset of type 1 diabetes (T1D) and type 2 diabetes (T2D). The underlying mechanisms involve a complex neuroendocrine structure, involving the central nervous system and the periphery. Psychological stress leads to an increase of serum glucocorticoid concentrations and catecholamines release increasing the insulin need and the insulin resistance. According to the β-cell stress hypothesis, also causes of increased insulin demand, such as rapid growth, overweight, puberty, low physical activity, trauma, infections, and glucose overload, are potentially relevant factors in development of T1D. It has also been demonstrated that chronic stress and obesity form a vicious circle which leads to a definitive metabolic failure, increasing the risk of developing T2D. In this review, we will provide the most recent data concerning the role of stress in the outcomes of T1D and T2D, with a focus on the role of physical and psychological stress on the onset of T1D.","container-title":"Hormone Research in Paediatrics","DOI":"10.1159/000522431","ISSN":"1663-2826","issue":"1","journalAbbreviation":"Horm Res Paediatr","language":"eng","note":"PMID: 35124671","page":"34-43","source":"PubMed","title":"Stress and Diabetes Mellitus: Pathogenetic Mechanisms and Clinical Outcome","title-short":"Stress and Diabetes Mellitus","volume":"96","author":[{"family":"Ingrosso","given":"Diletta Maria Francesca"},{"family":"Primavera","given":"Marina"},{"family":"Samvelyan","given":"Sona"},{"family":"Tagi","given":"Veronica Maria"},{"family":"Chiarelli","given":"Francesco"}],"issued":{"date-parts":[["2023"]]}}}],"schema":"https://github.com/citation-style-language/schema/raw/master/csl-citation.json"} </w:instrText>
       </w:r>
       <w:r>
         <w:fldChar w:fldCharType="separate"/>
@@ -185,7 +189,7 @@
         <w:fldChar w:fldCharType="begin"/>
       </w:r>
       <w:r>
-        <w:instrText xml:space="preserve"> ADDIN ZOTERO_ITEM CSL_CITATION {"citationID":"FfVoWjjp","properties":{"formattedCitation":"(3)","plainCitation":"(3)","noteIndex":0},"citationItems":[{"id":"wYajtxYE/nDHUFloU","uris":["http://zotero.org/users/2695081/items/9FN2SLJA"],"itemData":{"id":1825,"type":"article-journal","abstract":"Many pathways connect stress and obesity, two highly prevalent problems facing society today. First, stress interferes with cognitive processes such as executive function and self-regulation. Second, stress can affect behavior by inducing overeating and consumption of foods that are high in calories, fat, or sugar; by decreasing physical activity; and by shortening sleep. Third, stress triggers physiological changes in the hypothalamic-pituitary-adrenal axis, reward processing in the brain, and possibly the gut microbiome. Finally, stress can stimulate production of biochemical hormones and peptides such as leptin, ghrelin, and neuropeptide Y. Obesity itself can be a stressful state due to the high prevalence of weight stigma. This article therefore traces the contribution of weight stigma to stress and obesogenic processes, ultimately describing a vicious cycle of stress to obesity to stigma to stress. Current obesity prevention efforts focus solely on eating and exercise; the evidence reviewed in this article points to stress as an important but currently overlooked public policy target.","container-title":"Annual Review of Psychology","DOI":"10.1146/annurev-psych-010418-102936","ISSN":"0066-4308, 1545-2085","issue":"1","journalAbbreviation":"Annu. Rev. Psychol.","language":"en","page":"703-718","source":"DOI.org (Crossref)","title":"Stress and Obesity","volume":"70","author":[{"family":"Tomiyama","given":"A. Janet"}],"issued":{"date-parts":[["2019",1,4]]}}}],"schema":"https://github.com/citation-style-language/schema/raw/master/csl-citation.json"} </w:instrText>
+        <w:instrText xml:space="preserve"> ADDIN ZOTERO_ITEM CSL_CITATION {"citationID":"FfVoWjjp","properties":{"formattedCitation":"(3)","plainCitation":"(3)","noteIndex":0},"citationItems":[{"id":"9zI9GZ7V/Tl2mVMOZ","uris":["http://zotero.org/users/2695081/items/9FN2SLJA"],"itemData":{"id":1825,"type":"article-journal","abstract":"Many pathways connect stress and obesity, two highly prevalent problems facing society today. First, stress interferes with cognitive processes such as executive function and self-regulation. Second, stress can affect behavior by inducing overeating and consumption of foods that are high in calories, fat, or sugar; by decreasing physical activity; and by shortening sleep. Third, stress triggers physiological changes in the hypothalamic-pituitary-adrenal axis, reward processing in the brain, and possibly the gut microbiome. Finally, stress can stimulate production of biochemical hormones and peptides such as leptin, ghrelin, and neuropeptide Y. Obesity itself can be a stressful state due to the high prevalence of weight stigma. This article therefore traces the contribution of weight stigma to stress and obesogenic processes, ultimately describing a vicious cycle of stress to obesity to stigma to stress. Current obesity prevention efforts focus solely on eating and exercise; the evidence reviewed in this article points to stress as an important but currently overlooked public policy target.","container-title":"Annual Review of Psychology","DOI":"10.1146/annurev-psych-010418-102936","ISSN":"0066-4308, 1545-2085","issue":"1","journalAbbreviation":"Annu. Rev. Psychol.","language":"en","page":"703-718","source":"DOI.org (Crossref)","title":"Stress and Obesity","volume":"70","author":[{"family":"Tomiyama","given":"A. Janet"}],"issued":{"date-parts":[["2019",1,4]]}}}],"schema":"https://github.com/citation-style-language/schema/raw/master/csl-citation.json"} </w:instrText>
       </w:r>
       <w:r>
         <w:fldChar w:fldCharType="separate"/>
@@ -222,7 +226,7 @@
         <w:fldChar w:fldCharType="begin"/>
       </w:r>
       <w:r>
-        <w:instrText xml:space="preserve"> ADDIN ZOTERO_ITEM CSL_CITATION {"citationID":"5aWkX9TS","properties":{"formattedCitation":"(4, 5)","plainCitation":"(4, 5)","noteIndex":0},"citationItems":[{"id":"wYajtxYE/3CcNHHSM","uris":["http://zotero.org/users/2695081/items/ABIIT6F6"],"itemData":{"id":1829,"type":"article-journal","container-title":"Endocrinology","DOI":"10.1210/en.2018-00147","ISSN":"1945-7170","issue":"6","language":"en","page":"2275-2287","source":"DOI.org (Crossref)","title":"Glucocorticoid-Induced Metabolic Disturbances Are Exacerbated in Obese Male Mice","volume":"159","author":[{"family":"Harvey","given":"Innocence"},{"family":"Stephenson","given":"Erin J"},{"family":"Redd","given":"JeAnna R"},{"family":"Tran","given":"Quynh T"},{"family":"Hochberg","given":"Irit"},{"family":"Qi","given":"Nathan"},{"family":"Bridges","given":"Dave"}],"issued":{"date-parts":[["2018",6,1]]}}},{"id":"wYajtxYE/4E01BWQ9","uris":["http://zotero.org/users/2695081/items/455VREYL"],"itemData":{"id":"wYajtxYE/4E01BWQ9","type":"article-journal","abstract":"Glucocorticoids promote muscle atrophy by inducing a class of proteins called atrogenes, resulting in reductions in muscle size and strength. In this work, we evaluated whether a mouse model with pre-existing diet-induced obesity had altered glucocorticoid responsiveness. We observed that all animals treated with the synthetic glucocorticoid dexamethasone had reduced strength, but that obesity exacerbated this effect. These changes were concordant with more pronounced reductions in muscle size, particularly in Type II muscle fibers, and potentiated induction of atrogene expression in the obese mice relative to lean mice. Furthermore, we show that the reductions in lean mass do not fully account for the dexamethasone-induced insulin resistance observed in these mice. Together, these data suggest that obesity potentiates glucocorticoid-induced muscle atrophy.","container-title":"Biomedicines","DOI":"10.3390/biomedicines8100420","ISSN":"2227-9059","issue":"10","journalAbbreviation":"Biomedicines","language":"en","page":"420","source":"DOI.org (Crossref)","title":"Obesity Augments Glucocorticoid-Dependent Muscle Atrophy in Male C57BL/6J Mice","volume":"8","author":[{"family":"Gunder","given":"Laura C."},{"family":"Harvey","given":"Innocence"},{"family":"Redd","given":"JeAnna R."},{"family":"Davis","given":"Carol S."},{"family":"AL-Tamimi","given":"Ayat"},{"family":"Brooks","given":"Susan V."},{"family":"Bridges","given":"Dave"}],"issued":{"date-parts":[["2020",10,15]]}}}],"schema":"https://github.com/citation-style-language/schema/raw/master/csl-citation.json"} </w:instrText>
+        <w:instrText xml:space="preserve"> ADDIN ZOTERO_ITEM CSL_CITATION {"citationID":"5aWkX9TS","properties":{"formattedCitation":"(4, 5)","plainCitation":"(4, 5)","noteIndex":0},"citationItems":[{"id":"9zI9GZ7V/tHgRCS7c","uris":["http://zotero.org/users/2695081/items/ABIIT6F6"],"itemData":{"id":1829,"type":"article-journal","container-title":"Endocrinology","DOI":"10.1210/en.2018-00147","ISSN":"1945-7170","issue":"6","language":"en","page":"2275-2287","source":"DOI.org (Crossref)","title":"Glucocorticoid-Induced Metabolic Disturbances Are Exacerbated in Obese Male Mice","volume":"159","author":[{"family":"Harvey","given":"Innocence"},{"family":"Stephenson","given":"Erin J"},{"family":"Redd","given":"JeAnna R"},{"family":"Tran","given":"Quynh T"},{"family":"Hochberg","given":"Irit"},{"family":"Qi","given":"Nathan"},{"family":"Bridges","given":"Dave"}],"issued":{"date-parts":[["2018",6,1]]}}},{"id":"9zI9GZ7V/3nlM5iac","uris":["http://zotero.org/users/2695081/items/455VREYL"],"itemData":{"id":"wYajtxYE/4E01BWQ9","type":"article-journal","abstract":"Glucocorticoids promote muscle atrophy by inducing a class of proteins called atrogenes, resulting in reductions in muscle size and strength. In this work, we evaluated whether a mouse model with pre-existing diet-induced obesity had altered glucocorticoid responsiveness. We observed that all animals treated with the synthetic glucocorticoid dexamethasone had reduced strength, but that obesity exacerbated this effect. These changes were concordant with more pronounced reductions in muscle size, particularly in Type II muscle fibers, and potentiated induction of atrogene expression in the obese mice relative to lean mice. Furthermore, we show that the reductions in lean mass do not fully account for the dexamethasone-induced insulin resistance observed in these mice. Together, these data suggest that obesity potentiates glucocorticoid-induced muscle atrophy.","container-title":"Biomedicines","DOI":"10.3390/biomedicines8100420","ISSN":"2227-9059","issue":"10","journalAbbreviation":"Biomedicines","language":"en","page":"420","source":"DOI.org (Crossref)","title":"Obesity Augments Glucocorticoid-Dependent Muscle Atrophy in Male C57BL/6J Mice","volume":"8","author":[{"family":"Gunder","given":"Laura C."},{"family":"Harvey","given":"Innocence"},{"family":"Redd","given":"JeAnna R."},{"family":"Davis","given":"Carol S."},{"family":"AL-Tamimi","given":"Ayat"},{"family":"Brooks","given":"Susan V."},{"family":"Bridges","given":"Dave"}],"issued":{"date-parts":[["2020",10,15]]}}}],"schema":"https://github.com/citation-style-language/schema/raw/master/csl-citation.json"} </w:instrText>
       </w:r>
       <w:r>
         <w:fldChar w:fldCharType="separate"/>
@@ -249,7 +253,7 @@
         <w:fldChar w:fldCharType="begin"/>
       </w:r>
       <w:r>
-        <w:instrText xml:space="preserve"> ADDIN ZOTERO_ITEM CSL_CITATION {"citationID":"K8XBA9DN","properties":{"formattedCitation":"(6)","plainCitation":"(6)","noteIndex":0},"citationItems":[{"id":"wYajtxYE/VWhUmnxe","uris":["http://zotero.org/users/2695081/items/3FLNIKRN"],"itemData":{"id":1804,"type":"article-journal","abstract":"Psychosocial work stress has been linked to higher risk of type 2 diabetes (T2DM), with the effect being consistently higher among women than men. Also, work stress has been linked to prospective weight gain among obese men but weight loss among lean men. Here, we aimed to examine the interaction between work stress and obesity in relation to T2DM risk in a gender-specific manner. We studied 5,568 white middle-aged men and women in the Whitehall II study, who were free from diabetes at analysis baseline (1993). After 1993, diabetes was ascertained at six consecutive phases by an oral glucose tolerance test supplemented by self-reports. Cox regression analysis was used to assess the association between job strain (high job demands/low job control) and 18-year incident T2DM stratifying by BMI (BMI &lt;30 kg/m(2) vs. BMI ≥30 kg/m(2)). Overall, work stress was associated with incident T2DM among women (hazard ratio (HR) 1.41: 95% confidence intervals: 1.02; 1.95) but not among men (HR 0.87: 95% confidence interval 0.69; 1.11) (P(INTERACTION) = 0.017). Among men, work stress was associated with a lower risk of T2DM in nonobese (HR 0.70: 0.53; 0.93) but not in obese individuals (P(INTERACTION) = 0.17). Among women, work stress was associated with higher risk of T2DM in the obese (HR 2.01: 1.06; 3.92) but not in the nonobese (P(INTERACTION) = 0.005). Gender and body weight status play a critical role in determining the direction of the association between psychosocial stress and T2DM. The potential effect-modifying role of gender and obesity should not be ignored by future studies looking at stress-disease associations.","container-title":"Obesity (Silver Spring, Md.)","DOI":"10.1038/oby.2011.95","ISSN":"1930-739X","issue":"2","journalAbbreviation":"Obesity (Silver Spring)","language":"eng","note":"PMID: 21593804","page":"428-433","source":"PubMed","title":"Work stress, obesity and the risk of type 2 diabetes: gender-specific bidirectional effect in the Whitehall II study","title-short":"Work stress, obesity and the risk of type 2 diabetes","volume":"20","author":[{"family":"Heraclides","given":"Alexandros M."},{"family":"Chandola","given":"Tarani"},{"family":"Witte","given":"Daniel R."},{"family":"Brunner","given":"Eric J."}],"issued":{"date-parts":[["2012",2]]}}}],"schema":"https://github.com/citation-style-language/schema/raw/master/csl-citation.json"} </w:instrText>
+        <w:instrText xml:space="preserve"> ADDIN ZOTERO_ITEM CSL_CITATION {"citationID":"K8XBA9DN","properties":{"formattedCitation":"(6)","plainCitation":"(6)","noteIndex":0},"citationItems":[{"id":"9zI9GZ7V/BhbSUH95","uris":["http://zotero.org/users/2695081/items/3FLNIKRN"],"itemData":{"id":1804,"type":"article-journal","abstract":"Psychosocial work stress has been linked to higher risk of type 2 diabetes (T2DM), with the effect being consistently higher among women than men. Also, work stress has been linked to prospective weight gain among obese men but weight loss among lean men. Here, we aimed to examine the interaction between work stress and obesity in relation to T2DM risk in a gender-specific manner. We studied 5,568 white middle-aged men and women in the Whitehall II study, who were free from diabetes at analysis baseline (1993). After 1993, diabetes was ascertained at six consecutive phases by an oral glucose tolerance test supplemented by self-reports. Cox regression analysis was used to assess the association between job strain (high job demands/low job control) and 18-year incident T2DM stratifying by BMI (BMI &lt;30 kg/m(2) vs. BMI ≥30 kg/m(2)). Overall, work stress was associated with incident T2DM among women (hazard ratio (HR) 1.41: 95% confidence intervals: 1.02; 1.95) but not among men (HR 0.87: 95% confidence interval 0.69; 1.11) (P(INTERACTION) = 0.017). Among men, work stress was associated with a lower risk of T2DM in nonobese (HR 0.70: 0.53; 0.93) but not in obese individuals (P(INTERACTION) = 0.17). Among women, work stress was associated with higher risk of T2DM in the obese (HR 2.01: 1.06; 3.92) but not in the nonobese (P(INTERACTION) = 0.005). Gender and body weight status play a critical role in determining the direction of the association between psychosocial stress and T2DM. The potential effect-modifying role of gender and obesity should not be ignored by future studies looking at stress-disease associations.","container-title":"Obesity (Silver Spring, Md.)","DOI":"10.1038/oby.2011.95","ISSN":"1930-739X","issue":"2","journalAbbreviation":"Obesity (Silver Spring)","language":"eng","note":"PMID: 21593804","page":"428-433","source":"PubMed","title":"Work stress, obesity and the risk of type 2 diabetes: gender-specific bidirectional effect in the Whitehall II study","title-short":"Work stress, obesity and the risk of type 2 diabetes","volume":"20","author":[{"family":"Heraclides","given":"Alexandros M."},{"family":"Chandola","given":"Tarani"},{"family":"Witte","given":"Daniel R."},{"family":"Brunner","given":"Eric J."}],"issued":{"date-parts":[["2012",2]]}}}],"schema":"https://github.com/citation-style-language/schema/raw/master/csl-citation.json"} </w:instrText>
       </w:r>
       <w:r>
         <w:fldChar w:fldCharType="separate"/>
@@ -270,7 +274,7 @@
         <w:fldChar w:fldCharType="begin"/>
       </w:r>
       <w:r>
-        <w:instrText xml:space="preserve"> ADDIN ZOTERO_ITEM CSL_CITATION {"citationID":"AFe5E0pt","properties":{"formattedCitation":"(7)","plainCitation":"(7)","noteIndex":0},"citationItems":[{"id":"wYajtxYE/Wn2GQhiM","uris":["http://zotero.org/users/2695081/items/VA42I7LX"],"itemData":{"id":1807,"type":"article-journal","abstract":"BACKGROUND: The evidence supporting a relationship between stress and diabetes has been inconsistent.\nPURPOSE: This study examined the effects of stress on abnormal glucose metabolism, using a population-based sample of 3,759, with normoglycemia at baseline, from the Australian Diabetes, Obesity and Lifestyle study.\nMETHODS: Perceived stress and stressful life events were measured at baseline, with health behavior and anthropometric information also collected. Oral glucose tolerance tests were undertaken at baseline and 5-year follow-up. The primary outcome was the development of abnormal glucose metabolism (impaired fasting glucose, impaired glucose tolerance, and type 2 diabetes), according to WHO 1999 criteria.\nRESULTS: Perceived stress predicted incident abnormal glucose metabolism in women but not men, after multivariate adjustment. Life events showed an inconsistent relationship with abnormal glucose metabolism.\nCONCLUSIONS: Perceived stress predicted abnormal glucose metabolism in women. Healthcare professionals should consider psychosocial adversity when assessing risk factor profiles for the development of diabetes.","container-title":"Annals of Behavioral Medicine: A Publication of the Society of Behavioral Medicine","DOI":"10.1007/s12160-013-9473-y","ISSN":"1532-4796","issue":"1","journalAbbreviation":"Ann Behav Med","language":"eng","note":"PMID: 23389687","page":"62-72","source":"PubMed","title":"Psychosocial stress predicts abnormal glucose metabolism: the Australian Diabetes, Obesity and Lifestyle (AusDiab) study","title-short":"Psychosocial stress predicts abnormal glucose metabolism","volume":"46","author":[{"family":"Williams","given":"Emily D."},{"family":"Magliano","given":"Dianna J."},{"family":"Tapp","given":"Robyn J."},{"family":"Oldenburg","given":"Brian F."},{"family":"Shaw","given":"Jonathan E."}],"issued":{"date-parts":[["2013",8]]}}}],"schema":"https://github.com/citation-style-language/schema/raw/master/csl-citation.json"} </w:instrText>
+        <w:instrText xml:space="preserve"> ADDIN ZOTERO_ITEM CSL_CITATION {"citationID":"AFe5E0pt","properties":{"formattedCitation":"(7)","plainCitation":"(7)","noteIndex":0},"citationItems":[{"id":"9zI9GZ7V/Ao4qE2gy","uris":["http://zotero.org/users/2695081/items/VA42I7LX"],"itemData":{"id":1807,"type":"article-journal","abstract":"BACKGROUND: The evidence supporting a relationship between stress and diabetes has been inconsistent.\nPURPOSE: This study examined the effects of stress on abnormal glucose metabolism, using a population-based sample of 3,759, with normoglycemia at baseline, from the Australian Diabetes, Obesity and Lifestyle study.\nMETHODS: Perceived stress and stressful life events were measured at baseline, with health behavior and anthropometric information also collected. Oral glucose tolerance tests were undertaken at baseline and 5-year follow-up. The primary outcome was the development of abnormal glucose metabolism (impaired fasting glucose, impaired glucose tolerance, and type 2 diabetes), according to WHO 1999 criteria.\nRESULTS: Perceived stress predicted incident abnormal glucose metabolism in women but not men, after multivariate adjustment. Life events showed an inconsistent relationship with abnormal glucose metabolism.\nCONCLUSIONS: Perceived stress predicted abnormal glucose metabolism in women. Healthcare professionals should consider psychosocial adversity when assessing risk factor profiles for the development of diabetes.","container-title":"Annals of Behavioral Medicine: A Publication of the Society of Behavioral Medicine","DOI":"10.1007/s12160-013-9473-y","ISSN":"1532-4796","issue":"1","journalAbbreviation":"Ann Behav Med","language":"eng","note":"PMID: 23389687","page":"62-72","source":"PubMed","title":"Psychosocial stress predicts abnormal glucose metabolism: the Australian Diabetes, Obesity and Lifestyle (AusDiab) study","title-short":"Psychosocial stress predicts abnormal glucose metabolism","volume":"46","author":[{"family":"Williams","given":"Emily D."},{"family":"Magliano","given":"Dianna J."},{"family":"Tapp","given":"Robyn J."},{"family":"Oldenburg","given":"Brian F."},{"family":"Shaw","given":"Jonathan E."}],"issued":{"date-parts":[["2013",8]]}}}],"schema":"https://github.com/citation-style-language/schema/raw/master/csl-citation.json"} </w:instrText>
       </w:r>
       <w:r>
         <w:fldChar w:fldCharType="separate"/>
@@ -291,7 +295,7 @@
         <w:fldChar w:fldCharType="begin"/>
       </w:r>
       <w:r>
-        <w:instrText xml:space="preserve"> ADDIN ZOTERO_ITEM CSL_CITATION {"citationID":"qb5nzjnv","properties":{"formattedCitation":"(8)","plainCitation":"(8)","noteIndex":0},"citationItems":[{"id":"wYajtxYE/5tvKQn8H","uris":["http://zotero.org/users/2695081/items/QVI959H8"],"itemData":{"id":1810,"type":"article-journal","abstract":"PURPOSE: Type 2 diabetes mellitus (T2DM), a metabolic disorder, remains associated with a physiological impairment affecting large populations worldwide. Onset of T2DM is multifactorial where obesity and abnormal basal metabolic rate are considered most critical. Of people diagnosed with T2DM, about 80% are also obese. It is also reported that obese individuals have an increased odds of developing depression, whereas T2DM is estimated to increase the incidence by two-fold. The preponderance of research data demonstrates that T2DM alters the serum level of cortisol and adiponectin which are known to be associated with neuronal physiology. The study explored, how a metabolic disorder like T2DM is linked with the altered plasma level of cortisol and adiponectin, the risk factors for stress and depression.\nPATIENTS AND METHODS: A cross-sectional population study was conducted in T2DM patients using a bimodal approach. First approach used questionnaires, (1) Patient Health Questionnaire (PHQ-9) and (2) Stress Coping Inventory Questionnaire (SCQ) to assess signs and symptoms of depression and stress, respectively, in T2DM patients. In the second approach, robust biochemical analysis was conducted for serum adiponectin and cortisol levels.\nRESULTS: An association of T2DM in stress and depression was evaluated in 158 subjects (105 T2DM obese patients and 53 healthy controls). A lower PHQ-9 score and adiponectin levels were seen in T2DM obese patients compared to healthy controls (p&lt;0.05). Further, results also depicted a lower adiponectin levels in T2DM obese patients with depression compared to T2DM obese patients without depression (p&lt;0.05). The study did not find a significant difference in cortisol serum levels among the T2DM and control groups. However, a higher level of serum cortisol was reported in T2DM obese patients with depression over those T2DM obese patients who lacked depression (p&lt;0.05).\nCONCLUSION: The findings suggest that T2DM obese patients might have a higher risk of developing stress and depression. Further, biochemical parameters, adiponectin and cortisol, might be the potential biomarkers for T2DM and may help in early diagnosis of these comorbid conditions.","container-title":"Diabetes, Metabolic Syndrome and Obesity: Targets and Therapy","DOI":"10.2147/DMSO.S294555","ISSN":"1178-7007","journalAbbreviation":"Diabetes Metab Syndr Obes","language":"eng","note":"PMID: 33623406\nPMCID: PMC7896784","page":"705-717","source":"PubMed","title":"Evaluation of Stress and Associated Biochemical Changes in Patients with Type 2 Diabetes Mellitus and Obesity","volume":"14","author":[{"family":"Tyagi","given":"Kanchan"},{"family":"Agarwal","given":"Nidhi Bharal"},{"family":"Kapur","given":"Prem"},{"family":"Kohli","given":"Sunil"},{"family":"Jalali","given":"Rajinder K."}],"issued":{"date-parts":[["2021"]]}}}],"schema":"https://github.com/citation-style-language/schema/raw/master/csl-citation.json"} </w:instrText>
+        <w:instrText xml:space="preserve"> ADDIN ZOTERO_ITEM CSL_CITATION {"citationID":"qb5nzjnv","properties":{"formattedCitation":"(8)","plainCitation":"(8)","noteIndex":0},"citationItems":[{"id":"9zI9GZ7V/5X9iGiQc","uris":["http://zotero.org/users/2695081/items/QVI959H8"],"itemData":{"id":1810,"type":"article-journal","abstract":"PURPOSE: Type 2 diabetes mellitus (T2DM), a metabolic disorder, remains associated with a physiological impairment affecting large populations worldwide. Onset of T2DM is multifactorial where obesity and abnormal basal metabolic rate are considered most critical. Of people diagnosed with T2DM, about 80% are also obese. It is also reported that obese individuals have an increased odds of developing depression, whereas T2DM is estimated to increase the incidence by two-fold. The preponderance of research data demonstrates that T2DM alters the serum level of cortisol and adiponectin which are known to be associated with neuronal physiology. The study explored, how a metabolic disorder like T2DM is linked with the altered plasma level of cortisol and adiponectin, the risk factors for stress and depression.\nPATIENTS AND METHODS: A cross-sectional population study was conducted in T2DM patients using a bimodal approach. First approach used questionnaires, (1) Patient Health Questionnaire (PHQ-9) and (2) Stress Coping Inventory Questionnaire (SCQ) to assess signs and symptoms of depression and stress, respectively, in T2DM patients. In the second approach, robust biochemical analysis was conducted for serum adiponectin and cortisol levels.\nRESULTS: An association of T2DM in stress and depression was evaluated in 158 subjects (105 T2DM obese patients and 53 healthy controls). A lower PHQ-9 score and adiponectin levels were seen in T2DM obese patients compared to healthy controls (p&lt;0.05). Further, results also depicted a lower adiponectin levels in T2DM obese patients with depression compared to T2DM obese patients without depression (p&lt;0.05). The study did not find a significant difference in cortisol serum levels among the T2DM and control groups. However, a higher level of serum cortisol was reported in T2DM obese patients with depression over those T2DM obese patients who lacked depression (p&lt;0.05).\nCONCLUSION: The findings suggest that T2DM obese patients might have a higher risk of developing stress and depression. Further, biochemical parameters, adiponectin and cortisol, might be the potential biomarkers for T2DM and may help in early diagnosis of these comorbid conditions.","container-title":"Diabetes, Metabolic Syndrome and Obesity: Targets and Therapy","DOI":"10.2147/DMSO.S294555","ISSN":"1178-7007","journalAbbreviation":"Diabetes Metab Syndr Obes","language":"eng","note":"PMID: 33623406\nPMCID: PMC7896784","page":"705-717","source":"PubMed","title":"Evaluation of Stress and Associated Biochemical Changes in Patients with Type 2 Diabetes Mellitus and Obesity","volume":"14","author":[{"family":"Tyagi","given":"Kanchan"},{"family":"Agarwal","given":"Nidhi Bharal"},{"family":"Kapur","given":"Prem"},{"family":"Kohli","given":"Sunil"},{"family":"Jalali","given":"Rajinder K."}],"issued":{"date-parts":[["2021"]]}}}],"schema":"https://github.com/citation-style-language/schema/raw/master/csl-citation.json"} </w:instrText>
       </w:r>
       <w:r>
         <w:fldChar w:fldCharType="separate"/>
@@ -341,7 +345,7 @@
         <w:fldChar w:fldCharType="begin"/>
       </w:r>
       <w:r>
-        <w:instrText xml:space="preserve"> ADDIN ZOTERO_ITEM CSL_CITATION {"citationID":"qKNTupiX","properties":{"formattedCitation":"(9)","plainCitation":"(9)","noteIndex":0},"citationItems":[{"id":10863,"uris":["http://zotero.org/users/7317906/items/H4A3P2LK"],"itemData":{"id":10863,"type":"article-journal","container-title":"Cell Genomics","DOI":"10.1016/j.xgen.2023.100257","ISSN":"2666-979X","issue":"0","journalAbbreviation":"Cell Genomics","language":"English","note":"publisher: Elsevier","source":"www.cell.com","title":"The Michigan Genomics Initiative: A biobank linking genotypes and electronic clinical records in Michigan Medicine patients","title-short":"The Michigan Genomics Initiative","URL":"https://www.cell.com/cell-genomics/abstract/S2666-979X(23)00013-7","volume":"0","author":[{"family":"Zawistowski","given":"Matthew"},{"family":"Fritsche","given":"Lars G."},{"family":"Pandit","given":"Anita"},{"family":"Vanderwerff","given":"Brett"},{"family":"Patil","given":"Snehal"},{"family":"Schmidt","given":"Ellen M."},{"family":"VandeHaar","given":"Peter"},{"family":"Willer","given":"Cristen J."},{"family":"Brummett","given":"Chad M."},{"family":"Kheterpal","given":"Sachin"},{"family":"Zhou","given":"Xiang"},{"family":"Boehnke","given":"Michael"},{"family":"Abecasis","given":"Gonçalo R."},{"family":"Zöllner","given":"Sebastian"}],"accessed":{"date-parts":[["2023",2,1]]},"issued":{"date-parts":[["2023",1,31]]},"citation-key":"zawistowskiMichiganGenomicsInitiative2023"}}],"schema":"https://github.com/citation-style-language/schema/raw/master/csl-citation.json"} </w:instrText>
+        <w:instrText xml:space="preserve"> ADDIN ZOTERO_ITEM CSL_CITATION {"citationID":"qKNTupiX","properties":{"formattedCitation":"(9)","plainCitation":"(9)","noteIndex":0},"citationItems":[{"id":9537,"uris":["http://zotero.org/users/7317906/items/H4A3P2LK"],"itemData":{"id":9537,"type":"article-journal","container-title":"Cell Genomics","DOI":"10.1016/j.xgen.2023.100257","ISSN":"2666-979X","issue":"0","journalAbbreviation":"Cell Genomics","language":"English","note":"publisher: Elsevier","source":"www.cell.com","title":"The Michigan Genomics Initiative: A biobank linking genotypes and electronic clinical records in Michigan Medicine patients","title-short":"The Michigan Genomics Initiative","URL":"https://www.cell.com/cell-genomics/abstract/S2666-979X(23)00013-7","volume":"0","author":[{"family":"Zawistowski","given":"Matthew"},{"family":"Fritsche","given":"Lars G."},{"family":"Pandit","given":"Anita"},{"family":"Vanderwerff","given":"Brett"},{"family":"Patil","given":"Snehal"},{"family":"Schmidt","given":"Ellen M."},{"family":"VandeHaar","given":"Peter"},{"family":"Willer","given":"Cristen J."},{"family":"Brummett","given":"Chad M."},{"family":"Kheterpal","given":"Sachin"},{"family":"Zhou","given":"Xiang"},{"family":"Boehnke","given":"Michael"},{"family":"Abecasis","given":"Gonçalo R."},{"family":"Zöllner","given":"Sebastian"}],"accessed":{"date-parts":[["2023",2,1]]},"issued":{"date-parts":[["2023",1,31]]},"citation-key":"zawistowskiMichiganGenomicsInitiative2023a"}}],"schema":"https://github.com/citation-style-language/schema/raw/master/csl-citation.json"} </w:instrText>
       </w:r>
       <w:r>
         <w:fldChar w:fldCharType="separate"/>
@@ -503,6 +507,23 @@
       </w:r>
       <w:r>
         <w:t xml:space="preserve"> was indicated by an ICD9 or ICD10 coded diagnosis in the participant’s electronic medical record.</w:t>
+      </w:r>
+      <w:r>
+        <w:t xml:space="preserve">  Race and ethnicity </w:t>
+      </w:r>
+      <w:proofErr w:type="gramStart"/>
+      <w:r>
+        <w:t>was</w:t>
+      </w:r>
+      <w:proofErr w:type="gramEnd"/>
+      <w:r>
+        <w:t xml:space="preserve"> defined as Asian, Black, White, Hispanic/Latino, or Other.</w:t>
+      </w:r>
+      <w:r>
+        <w:t xml:space="preserve">  The latter group includes those who self-reported </w:t>
+      </w:r>
+      <w:r>
+        <w:t>their race as Other/Unknown/Declined, and groups with under 200 participants (American Indian, n=175; Pacific Islander, n=28).</w:t>
       </w:r>
     </w:p>
     <w:p/>
@@ -534,7 +555,7 @@
         <w:fldChar w:fldCharType="begin"/>
       </w:r>
       <w:r>
-        <w:instrText xml:space="preserve"> ADDIN ZOTERO_ITEM CSL_CITATION {"citationID":"0725YfVK","properties":{"formattedCitation":"(10)","plainCitation":"(10)","noteIndex":0},"citationItems":[{"id":8905,"uris":["http://zotero.org/users/7317906/items/3HZT7KXK"],"itemData":{"id":8905,"type":"document","note":"Citation Key: base\npublisher-place: Vienna, Austria","publisher":"R Foundation for Statistical Computing","title":"R: A Language and Environment for Statistical Computing","URL":"http://www.r-project.org/","author":[{"literal":"R Core Team"}],"accessed":{"date-parts":[["2010",10,22]]},"issued":{"date-parts":[["2019"]]},"citation-key":"base"}}],"schema":"https://github.com/citation-style-language/schema/raw/master/csl-citation.json"} </w:instrText>
+        <w:instrText xml:space="preserve"> ADDIN ZOTERO_ITEM CSL_CITATION {"citationID":"0725YfVK","properties":{"formattedCitation":"(10)","plainCitation":"(10)","noteIndex":0},"citationItems":[{"id":8230,"uris":["http://zotero.org/users/7317906/items/3HZT7KXK"],"itemData":{"id":8230,"type":"document","note":"Citation Key: base\npublisher-place: Vienna, Austria","publisher":"R Foundation for Statistical Computing","title":"R: A Language and Environment for Statistical Computing","URL":"http://www.r-project.org/","author":[{"literal":"R Core Team"}],"accessed":{"date-parts":[["2010",10,22]]},"issued":{"date-parts":[["2019"]]},"citation-key":"base"}}],"schema":"https://github.com/citation-style-language/schema/raw/master/csl-citation.json"} </w:instrText>
       </w:r>
       <w:r>
         <w:fldChar w:fldCharType="separate"/>
@@ -798,6 +819,7 @@
     <w:p/>
     <w:p>
       <w:r>
+        <w:lastRenderedPageBreak/>
         <w:t>We next evaluated how obesity modified the stress-diabetes relationship in these participants.</w:t>
       </w:r>
       <w:r>
@@ -813,11 +835,7 @@
         <w:t>2</w:t>
       </w:r>
       <w:r>
-        <w:t xml:space="preserve"> and with above or below median stress.  As expected, participants with obesity had higher type 2 diabetes </w:t>
-      </w:r>
-      <w:r>
-        <w:lastRenderedPageBreak/>
-        <w:t xml:space="preserve">prevalence than those with a BMI under 30 (unadjusted odds ratio 3.1 +/- 1.0).  </w:t>
+        <w:t xml:space="preserve"> and with above or below median stress.  As expected, participants with obesity had higher type 2 diabetes prevalence than those with a BMI under 30 (unadjusted odds ratio 3.1 +/- 1.0).  </w:t>
       </w:r>
       <w:r>
         <w:t xml:space="preserve">While diabetes rates were higher in male participants with than females (11.6% vs 6.8% among participants without obesity; 26.9% vs 22.1% in participants with obesity), the effect of obesity was somewhat attenuated in male participants (Obesity effect was 38% reduced in male participants </w:t>
@@ -891,7 +909,19 @@
         <w:t xml:space="preserve">.  </w:t>
       </w:r>
       <w:r>
-        <w:t xml:space="preserve">Perceived stress was associated with 13% increased diabetes prevalence in participants without obesity (p=0.005) but was </w:t>
+        <w:t>Perceived stress was associated with 1</w:t>
+      </w:r>
+      <w:r>
+        <w:t>4</w:t>
+      </w:r>
+      <w:r>
+        <w:t>% increased diabetes prevalence in participants without obesity (p=0.005</w:t>
+      </w:r>
+      <w:r>
+        <w:t>3</w:t>
+      </w:r>
+      <w:r>
+        <w:t xml:space="preserve">) but was </w:t>
       </w:r>
       <w:proofErr w:type="gramStart"/>
       <w:r>
@@ -899,7 +929,19 @@
       </w:r>
       <w:proofErr w:type="gramEnd"/>
       <w:r>
-        <w:t xml:space="preserve">% in participants with obesity (p=XXX).  This represented a synergistic interaction between obesity and perceived stress on diabetes risk (12% increase, p=0.056).  </w:t>
+        <w:t>% in participants with obesity (p=</w:t>
+      </w:r>
+      <w:r>
+        <w:t>2.2 x 10</w:t>
+      </w:r>
+      <w:r>
+        <w:rPr>
+          <w:vertAlign w:val="superscript"/>
+        </w:rPr>
+        <w:t>-11</w:t>
+      </w:r>
+      <w:r>
+        <w:t xml:space="preserve">).  This represented a synergistic interaction between obesity and perceived stress on diabetes risk (12% increase, p=0.056).  </w:t>
       </w:r>
       <w:r>
         <w:t xml:space="preserve">This effect was similar across gender, and neighborhood socioeconomic status (Figure </w:t>
@@ -923,54 +965,93 @@
     <w:p/>
     <w:p>
       <w:r>
-        <w:t>Multivariate analyses of the interaction between obesity status and stress are shown in Table 2.  The synergistic effect of perceived stress and obesity increased type 2 diabetes risk by approximately 18.5 +/- 6.7 % and was robust to adjustments for gender, age, ethnicity, and socioeconomic status.</w:t>
+        <w:t>Multivariate analyses of the interaction between obesity status and stress are shown in Table 2.</w:t>
+      </w:r>
+      <w:r>
+        <w:t xml:space="preserve">  We stepwise added potential confounders including age, gender (and modification of the gender by gender of the obesity-diabetes relationship), race/ethnicity and neighborhood disadvantage (as a proxy for socioeconomic status). </w:t>
+      </w:r>
+      <w:r>
+        <w:t xml:space="preserve">  </w:t>
+      </w:r>
+      <w:r>
+        <w:t xml:space="preserve">After these adjustments, we estimated the </w:t>
+      </w:r>
+      <w:proofErr w:type="spellStart"/>
+      <w:r>
+        <w:t>the</w:t>
+      </w:r>
+      <w:proofErr w:type="spellEnd"/>
+      <w:r>
+        <w:t xml:space="preserve"> synergistic effect of perceived stress and obesity </w:t>
+      </w:r>
+      <w:r>
+        <w:t>on</w:t>
+      </w:r>
+      <w:r>
+        <w:t xml:space="preserve"> type 2 diabetes risk by </w:t>
+      </w:r>
+      <w:r>
+        <w:t>13</w:t>
+      </w:r>
+      <w:r>
+        <w:t xml:space="preserve"> +/- 6.</w:t>
+      </w:r>
+      <w:r>
+        <w:t>3</w:t>
+      </w:r>
+      <w:r>
+        <w:t xml:space="preserve"> %</w:t>
+      </w:r>
+      <w:r>
+        <w:t>.</w:t>
       </w:r>
     </w:p>
     <w:p/>
     <w:p>
       <w:r>
-        <w:t>We performed several sensitivity analyses</w:t>
-      </w:r>
-      <w:r>
-        <w:t xml:space="preserve"> to probe this relationship</w:t>
-      </w:r>
-      <w:r>
-        <w:t>.</w:t>
-      </w:r>
-    </w:p>
-    <w:p/>
-    <w:p>
-      <w:r>
-        <w:t>We stratified BMI into subcategories (underweight, overweight, class I, II, and II obese) as well as treating it as a linear covariate.</w:t>
-      </w:r>
-    </w:p>
-    <w:p/>
-    <w:p>
-      <w:r>
-        <w:t>For PSS measures we evaluated the interaction between obesity and stress by both PSS quartile and as a linear predictor.</w:t>
-      </w:r>
-    </w:p>
-    <w:p/>
-    <w:p>
-      <w:r>
-        <w:t xml:space="preserve">Finally, we tested whether the interaction between obesity and perceived stress was consistent across demographic categories.  We found that the interaction was stronger in males </w:t>
-      </w:r>
-      <w:commentRangeStart w:id="1"/>
-      <w:r>
-        <w:t>(21%) than females (0.3%), and stronger in Asian (49%) and Black (19%) participants</w:t>
-      </w:r>
-      <w:commentRangeEnd w:id="1"/>
-      <w:r>
-        <w:t xml:space="preserve"> than White (13%) or Hispanic/Latino (-45%) participants, though neither stress x obesity x gender or stress x obesity x race/ethnicity interactions reached statistical significance.  In the case of both females and Latino and Hispanic participants this is due to effects of stress on diabetes rates in non-obese participants (Figure 2B and D).  In both groups, the effects of perceived stress on diabetes prevalence are true in both obese and non-obese participants.</w:t>
-      </w:r>
-      <w:r>
-        <w:rPr>
-          <w:rStyle w:val="CommentReference"/>
-        </w:rPr>
-        <w:commentReference w:id="1"/>
-      </w:r>
-      <w:r>
-        <w:t xml:space="preserve"> </w:t>
+        <w:t>W</w:t>
+      </w:r>
+      <w:r>
+        <w:t xml:space="preserve">e </w:t>
+      </w:r>
+      <w:r>
+        <w:t>examined</w:t>
+      </w:r>
+      <w:r>
+        <w:t xml:space="preserve"> whether the interaction between obesity and perceived stress was consistent across demographic categories.  We found that the interaction was stronger in males (21%) than females (0.3%), and stronger in Asian (49%) and Black (19%) participants than White (13%) or Hispanic/Latino (-45%) participants, though neither stress x obesity x gender or stress x obesity x race/ethnicity interactions reached statistical significance.  </w:t>
+      </w:r>
+      <w:r>
+        <w:t xml:space="preserve">We also found that in the lowest SES category, the effect was lower than the upper three quartiles.  </w:t>
+      </w:r>
+      <w:r>
+        <w:t xml:space="preserve">In the case of </w:t>
+      </w:r>
+      <w:r>
+        <w:t>lower SES,</w:t>
+      </w:r>
+      <w:r>
+        <w:t xml:space="preserve"> females and Latino and Hispanic participants this is due to </w:t>
+      </w:r>
+      <w:r>
+        <w:t xml:space="preserve">similar </w:t>
+      </w:r>
+      <w:r>
+        <w:t xml:space="preserve">effects of stress on diabetes rates in </w:t>
+      </w:r>
+      <w:r>
+        <w:t xml:space="preserve">both </w:t>
+      </w:r>
+      <w:r>
+        <w:t xml:space="preserve">non-obese </w:t>
+      </w:r>
+      <w:r>
+        <w:t xml:space="preserve">and obese </w:t>
+      </w:r>
+      <w:r>
+        <w:t xml:space="preserve">participants (Figure 2B and D).  </w:t>
+      </w:r>
+      <w:r>
+        <w:t xml:space="preserve"> We next tested whether participants with obesity reporting elevated stress were more obese, but we found slightly larger average BMI in both the low vs high perceived stress groups (36.0 vs 36.6 kg/m2)</w:t>
       </w:r>
     </w:p>
     <w:p>
@@ -994,23 +1075,19 @@
       <w:r>
         <w:t xml:space="preserve">Given the enhancement of obesity-associated diabetes prevalence in these participants, we then evaluated several other obesity and stress-linked chronic diseases using the same approach.  </w:t>
       </w:r>
-      <w:commentRangeStart w:id="2"/>
+      <w:commentRangeStart w:id="1"/>
       <w:r>
         <w:t xml:space="preserve">In Table </w:t>
       </w:r>
       <w:r>
-        <w:t xml:space="preserve">3 we describe the raw and adjusted associations between obesity and stress </w:t>
-      </w:r>
-      <w:r>
-        <w:lastRenderedPageBreak/>
-        <w:t>on hypertension, arrhythmia and liver disease.</w:t>
-      </w:r>
-      <w:commentRangeEnd w:id="2"/>
+        <w:t>3 we describe the raw and adjusted associations between obesity and stress on hypertension, arrhythmia and liver disease.</w:t>
+      </w:r>
+      <w:commentRangeEnd w:id="1"/>
       <w:r>
         <w:rPr>
           <w:rStyle w:val="CommentReference"/>
         </w:rPr>
-        <w:commentReference w:id="2"/>
+        <w:commentReference w:id="1"/>
       </w:r>
       <w:r>
         <w:t xml:space="preserve">  These data suggest that enhanced risk of obesity and perceived stress on diabetes is not </w:t>
@@ -1071,15 +1148,123 @@
       <w:r>
         <w:t xml:space="preserve">= 0.0026), consistent with higher rates of weight discrimination in </w:t>
       </w:r>
+      <w:commentRangeStart w:id="2"/>
+      <w:r>
+        <w:t xml:space="preserve">women </w:t>
+      </w:r>
+      <w:r>
+        <w:fldChar w:fldCharType="begin"/>
+      </w:r>
+      <w:r>
+        <w:instrText xml:space="preserve"> ADDIN ZOTERO_ITEM CSL_CITATION {"citationID":"uEUVukVw","properties":{"formattedCitation":"(11)","plainCitation":"(11)","noteIndex":0},"citationItems":[{"id":11485,"uris":["http://zotero.org/users/7317906/items/2VPGKQ72"],"itemData":{"id":11485,"type":"article-journal","abstract":"Weight stigma is related to lower levels of motivation to exercise in overweight and obesity. This study explored the nature of the relationship between stigma, motivation to exercise and physical activity while accounting for gender differences. Participants were 439 adults with overweight and obesity (mean body mass index = 32.18 kg/m2, standard deviation = 4.09 kg/m2). Females reported significantly more frequent stigma experiences than males. Mediation models found a conditional direct effect of weight stigma for males, with higher frequency of stigma experiences related to higher levels of walking and vigorous physical activity. A conditional indirect effect was found for females for walking, moderate and vigorous levels of physical activity, with higher weight stigma related to lower autonomous motivation, and lower levels of physical activity. Findings suggest that males and females are affected differently by weight-stigma experiences.","container-title":"Health Psychology Open","DOI":"10.1177/2055102918759691","ISSN":"2055-1029","issue":"1","journalAbbreviation":"Health Psychol Open","note":"PMID: 29552349\nPMCID: PMC5846936","page":"2055102918759691","source":"PubMed Central","title":"Gender differences in the relationship of weight-based stigmatisation with motivation to exercise and physical activity in overweight individuals","volume":"5","author":[{"family":"Sattler","given":"Krystal M"},{"family":"Deane","given":"Frank P"},{"family":"Tapsell","given":"Linda"},{"family":"Kelly","given":"Peter J"}],"issued":{"date-parts":[["2018",3,8]]},"citation-key":"sattlerGenderDifferencesRelationship2018"}}],"schema":"https://github.com/citation-style-language/schema/raw/master/csl-citation.json"} </w:instrText>
+      </w:r>
+      <w:r>
+        <w:fldChar w:fldCharType="separate"/>
+      </w:r>
+      <w:r>
+        <w:rPr>
+          <w:noProof/>
+        </w:rPr>
+        <w:t>(11)</w:t>
+      </w:r>
+      <w:r>
+        <w:fldChar w:fldCharType="end"/>
+      </w:r>
+      <w:r>
+        <w:t>.</w:t>
+      </w:r>
+      <w:commentRangeEnd w:id="2"/>
+      <w:r>
+        <w:rPr>
+          <w:rStyle w:val="CommentReference"/>
+        </w:rPr>
+        <w:commentReference w:id="2"/>
+      </w:r>
+      <w:r>
+        <w:t xml:space="preserve">  Interestingly though, when treated separately males had a stronger obesity-stress </w:t>
+      </w:r>
+      <w:r>
+        <w:t xml:space="preserve">interaction than females potentially indicating sex or gender based differences in the way that </w:t>
+      </w:r>
+      <w:r>
+        <w:t xml:space="preserve">perceived </w:t>
+      </w:r>
+      <w:r>
+        <w:t>stress affects the pathophysiology of type 2 diabetes in humans</w:t>
+      </w:r>
+      <w:r>
+        <w:t xml:space="preserve">.  This is the opposite trend observed for job related stress and diabetes incidence in the Whitehall II study, which showed a stronger obesity-stress-diabetes relationship in females than in males </w:t>
+      </w:r>
+      <w:r>
+        <w:fldChar w:fldCharType="begin"/>
+      </w:r>
+      <w:r>
+        <w:instrText xml:space="preserve"> ADDIN ZOTERO_ITEM CSL_CITATION {"citationID":"7NoAOV3t","properties":{"formattedCitation":"(6)","plainCitation":"(6)","noteIndex":0},"citationItems":[{"id":"9zI9GZ7V/BhbSUH95","uris":["http://zotero.org/users/2695081/items/3FLNIKRN"],"itemData":{"id":"wYajtxYE/VWhUmnxe","type":"article-journal","abstract":"Psychosocial work stress has been linked to higher risk of type 2 diabetes (T2DM), with the effect being consistently higher among women than men. Also, work stress has been linked to prospective weight gain among obese men but weight loss among lean men. Here, we aimed to examine the interaction between work stress and obesity in relation to T2DM risk in a gender-specific manner. We studied 5,568 white middle-aged men and women in the Whitehall II study, who were free from diabetes at analysis baseline (1993). After 1993, diabetes was ascertained at six consecutive phases by an oral glucose tolerance test supplemented by self-reports. Cox regression analysis was used to assess the association between job strain (high job demands/low job control) and 18-year incident T2DM stratifying by BMI (BMI &lt;30 kg/m(2) vs. BMI ≥30 kg/m(2)). Overall, work stress was associated with incident T2DM among women (hazard ratio (HR) 1.41: 95% confidence intervals: 1.02; 1.95) but not among men (HR 0.87: 95% confidence interval 0.69; 1.11) (P(INTERACTION) = 0.017). Among men, work stress was associated with a lower risk of T2DM in nonobese (HR 0.70: 0.53; 0.93) but not in obese individuals (P(INTERACTION) = 0.17). Among women, work stress was associated with higher risk of T2DM in the obese (HR 2.01: 1.06; 3.92) but not in the nonobese (P(INTERACTION) = 0.005). Gender and body weight status play a critical role in determining the direction of the association between psychosocial stress and T2DM. The potential effect-modifying role of gender and obesity should not be ignored by future studies looking at stress-disease associations.","container-title":"Obesity (Silver Spring, Md.)","DOI":"10.1038/oby.2011.95","ISSN":"1930-739X","issue":"2","journalAbbreviation":"Obesity (Silver Spring)","language":"eng","note":"PMID: 21593804","page":"428-433","source":"PubMed","title":"Work stress, obesity and the risk of type 2 diabetes: gender-specific bidirectional effect in the Whitehall II study","title-short":"Work stress, obesity and the risk of type 2 diabetes","volume":"20","author":[{"family":"Heraclides","given":"Alexandros M."},{"family":"Chandola","given":"Tarani"},{"family":"Witte","given":"Daniel R."},{"family":"Brunner","given":"Eric J."}],"issued":{"date-parts":[["2012",2]]}}}],"schema":"https://github.com/citation-style-language/schema/raw/master/csl-citation.json"} </w:instrText>
+      </w:r>
+      <w:r>
+        <w:fldChar w:fldCharType="separate"/>
+      </w:r>
+      <w:r>
+        <w:rPr>
+          <w:noProof/>
+        </w:rPr>
+        <w:t>(6)</w:t>
+      </w:r>
+      <w:r>
+        <w:fldChar w:fldCharType="end"/>
+      </w:r>
+      <w:r>
+        <w:t>.  This could be due to either different populations, or the differences between perceived stress and job-related stress and how they impact have gender-specific effects.</w:t>
+      </w:r>
+    </w:p>
+    <w:p/>
+    <w:p>
+      <w:r>
+        <w:t>It is intriguing that the synergistic relationship between obesity and stress is most prominent in participants with type 2 diabetes, but is not evident for hypertension, liver disease, chronic pulmonary disease or heart failure.  Each of these had a substantial obesity-related or stress-related elevated risk</w:t>
+      </w:r>
+      <w:r>
+        <w:t xml:space="preserve">, but in our population these risk factors appeared additive rather than </w:t>
+      </w:r>
       <w:commentRangeStart w:id="3"/>
       <w:r>
-        <w:t xml:space="preserve">women </w:t>
+        <w:t>synergistic</w:t>
+      </w:r>
+      <w:commentRangeEnd w:id="3"/>
+      <w:r>
+        <w:rPr>
+          <w:rStyle w:val="CommentReference"/>
+        </w:rPr>
+        <w:commentReference w:id="3"/>
+      </w:r>
+      <w:r>
+        <w:t xml:space="preserve">.  </w:t>
+      </w:r>
+    </w:p>
+    <w:p/>
+    <w:p>
+      <w:r>
+        <w:t>There are several limitations to this cross-sectional analysis, most notably whether elevated perceived stress was a cause or consequence of obesity-related diabetes associations</w:t>
+      </w:r>
+      <w:r>
+        <w:t>.  At this stage we think it is plausible that the distress related to chronic disease</w:t>
+      </w:r>
+      <w:r>
+        <w:t xml:space="preserve"> (either obesity or type 2 diabetes)</w:t>
+      </w:r>
+      <w:r>
+        <w:t xml:space="preserve"> could enhance perceived stress as a form of reverse causality.  We hypothesize that this is less likely, as it is only true for type 2 diabetes, but not other comorbidities tested.  It is also possible that the slightly elevated average BMI </w:t>
+      </w:r>
+      <w:r>
+        <w:t>in the participants with high PSS scores and obesity could imply that higher stress increases BMI, enhancing diabetes risk, consistent with the COBWEBS model</w:t>
+      </w:r>
+      <w:r>
+        <w:t xml:space="preserve"> wherein obesity-related stress enhances food intake and obesity, exacerbating weight-related metabolic disease </w:t>
       </w:r>
       <w:r>
         <w:fldChar w:fldCharType="begin"/>
       </w:r>
       <w:r>
-        <w:instrText xml:space="preserve"> ADDIN ZOTERO_ITEM CSL_CITATION {"citationID":"uEUVukVw","properties":{"formattedCitation":"(11)","plainCitation":"(11)","noteIndex":0},"citationItems":[{"id":11611,"uris":["http://zotero.org/users/7317906/items/2VPGKQ72"],"itemData":{"id":11611,"type":"article-journal","abstract":"Weight stigma is related to lower levels of motivation to exercise in overweight and obesity. This study explored the nature of the relationship between stigma, motivation to exercise and physical activity while accounting for gender differences. Participants were 439 adults with overweight and obesity (mean body mass index = 32.18 kg/m2, standard deviation = 4.09 kg/m2). Females reported significantly more frequent stigma experiences than males. Mediation models found a conditional direct effect of weight stigma for males, with higher frequency of stigma experiences related to higher levels of walking and vigorous physical activity. A conditional indirect effect was found for females for walking, moderate and vigorous levels of physical activity, with higher weight stigma related to lower autonomous motivation, and lower levels of physical activity. Findings suggest that males and females are affected differently by weight-stigma experiences.","container-title":"Health Psychology Open","DOI":"10.1177/2055102918759691","ISSN":"2055-1029","issue":"1","journalAbbreviation":"Health Psychol Open","note":"PMID: 29552349\nPMCID: PMC5846936","page":"2055102918759691","source":"PubMed Central","title":"Gender differences in the relationship of weight-based stigmatisation with motivation to exercise and physical activity in overweight individuals","volume":"5","author":[{"family":"Sattler","given":"Krystal M"},{"family":"Deane","given":"Frank P"},{"family":"Tapsell","given":"Linda"},{"family":"Kelly","given":"Peter J"}],"issued":{"date-parts":[["2018",3,8]]},"citation-key":"sattlerGenderDifferencesRelationship2018"}}],"schema":"https://github.com/citation-style-language/schema/raw/master/csl-citation.json"} </w:instrText>
+        <w:instrText xml:space="preserve"> ADDIN ZOTERO_ITEM CSL_CITATION {"citationID":"gUypn5QT","properties":{"formattedCitation":"(12)","plainCitation":"(12)","noteIndex":0},"citationItems":[{"id":1482,"uris":["http://zotero.org/users/7317906/items/5I96XRCC"],"itemData":{"id":1482,"type":"article-journal","abstract":"Weight stigma is highly pervasive, but its consequences are understudied. This review draws from theory in social psychology, health psychology, and neuroendocrinology to construct an original, generative model called the cyclic obesity/weight-based stigma (COBWEBS) model. This model characterizes weight stigma as a \"vicious cycle\" - a positive feedback loop wherein weight stigma begets weight gain. This happens through increased eating behavior and increased cortisol secretion governed by behavioral, emotional, and physiological mechanisms, which are theorized to ultimately result in weight gain and difficulty of weight loss. The purpose of this review is to evaluate the existing literature for evidence supporting such a model, propose ways in which individuals enter, fight against, and exit the cycle, and conclude by outlining fruitful future directions in this nascent yet important area of research. © 2014 Elsevier Ltd.","container-title":"Appetite","DOI":"10.1016/j.appet.2014.06.108","ISSN":"10958304","note":"PMID: 24997407\npublisher: Elsevier Ltd\nCitation Key: Tomiyama2014a\nISBN: 1095-8304 (Electronic)\\r0195-6663 (Linking)","page":"8-15","title":"Weight stigma is stressful. A review of evidence for the cyclic Obesity/weight-based stigma model","volume":"82","author":[{"family":"Tomiyama","given":"A. Janet"}],"issued":{"date-parts":[["2014"]]},"citation-key":"Tomiyama2014a"}}],"schema":"https://github.com/citation-style-language/schema/raw/master/csl-citation.json"} </w:instrText>
       </w:r>
       <w:r>
         <w:fldChar w:fldCharType="separate"/>
@@ -1088,41 +1273,41 @@
         <w:rPr>
           <w:noProof/>
         </w:rPr>
-        <w:t>(11)</w:t>
+        <w:t>(12)</w:t>
       </w:r>
       <w:r>
         <w:fldChar w:fldCharType="end"/>
       </w:r>
       <w:r>
-        <w:t>.</w:t>
-      </w:r>
-      <w:commentRangeEnd w:id="3"/>
-      <w:r>
-        <w:rPr>
-          <w:rStyle w:val="CommentReference"/>
-        </w:rPr>
-        <w:commentReference w:id="3"/>
-      </w:r>
-      <w:r>
-        <w:t xml:space="preserve">  Interestingly though, when treated separately males had a stronger obesity-stress </w:t>
-      </w:r>
-      <w:r>
-        <w:t xml:space="preserve">interaction than females potentially indicating sex or gender based differences in the way that </w:t>
-      </w:r>
-      <w:r>
-        <w:t xml:space="preserve">perceived </w:t>
-      </w:r>
-      <w:r>
-        <w:t>stress affects the pathophysiology of type 2 diabetes in humans</w:t>
-      </w:r>
-      <w:r>
-        <w:t xml:space="preserve">.  This is the opposite trend observed for job related stress and diabetes incidence in the Whitehall II study, which showed a stronger obesity-stress-diabetes relationship in females than in males </w:t>
+        <w:t>.  Again, we hypothesize that this is unlikely given the relatively small increase in mean BMI (&lt;1 kg/m</w:t>
+      </w:r>
+      <w:r>
+        <w:rPr>
+          <w:vertAlign w:val="superscript"/>
+        </w:rPr>
+        <w:t>2</w:t>
+      </w:r>
+      <w:r>
+        <w:t>).  In terms of generalizability, the population in this study is a majority white, relatively affluent group of participants who have a relatively high age and number of co-morbidities, as is expected for a hospital-based cohort.</w:t>
+      </w:r>
+      <w:r>
+        <w:t xml:space="preserve">  Finally, we are limited by a single self-reported measure of perceived stress and the cross-sectional nature of this study.</w:t>
+      </w:r>
+    </w:p>
+    <w:p/>
+    <w:p>
+      <w:r>
+        <w:t xml:space="preserve">There are several important strengths to this work including a large sample size, consistent and validated measures of perceived stress and well documented disease and sociodemographic factors.  To our knowledge this is the first report of perceived stress enhancing obesity-related </w:t>
+      </w:r>
+      <w:r>
+        <w:lastRenderedPageBreak/>
+        <w:t xml:space="preserve">diabetes risk, and consistent with the Whitehall II studies showing similar effects for job-related stress </w:t>
       </w:r>
       <w:r>
         <w:fldChar w:fldCharType="begin"/>
       </w:r>
       <w:r>
-        <w:instrText xml:space="preserve"> ADDIN ZOTERO_ITEM CSL_CITATION {"citationID":"7NoAOV3t","properties":{"formattedCitation":"(6)","plainCitation":"(6)","noteIndex":0},"citationItems":[{"id":"wYajtxYE/VWhUmnxe","uris":["http://zotero.org/users/2695081/items/3FLNIKRN"],"itemData":{"id":"wYajtxYE/VWhUmnxe","type":"article-journal","abstract":"Psychosocial work stress has been linked to higher risk of type 2 diabetes (T2DM), with the effect being consistently higher among women than men. Also, work stress has been linked to prospective weight gain among obese men but weight loss among lean men. Here, we aimed to examine the interaction between work stress and obesity in relation to T2DM risk in a gender-specific manner. We studied 5,568 white middle-aged men and women in the Whitehall II study, who were free from diabetes at analysis baseline (1993). After 1993, diabetes was ascertained at six consecutive phases by an oral glucose tolerance test supplemented by self-reports. Cox regression analysis was used to assess the association between job strain (high job demands/low job control) and 18-year incident T2DM stratifying by BMI (BMI &lt;30 kg/m(2) vs. BMI ≥30 kg/m(2)). Overall, work stress was associated with incident T2DM among women (hazard ratio (HR) 1.41: 95% confidence intervals: 1.02; 1.95) but not among men (HR 0.87: 95% confidence interval 0.69; 1.11) (P(INTERACTION) = 0.017). Among men, work stress was associated with a lower risk of T2DM in nonobese (HR 0.70: 0.53; 0.93) but not in obese individuals (P(INTERACTION) = 0.17). Among women, work stress was associated with higher risk of T2DM in the obese (HR 2.01: 1.06; 3.92) but not in the nonobese (P(INTERACTION) = 0.005). Gender and body weight status play a critical role in determining the direction of the association between psychosocial stress and T2DM. The potential effect-modifying role of gender and obesity should not be ignored by future studies looking at stress-disease associations.","container-title":"Obesity (Silver Spring, Md.)","DOI":"10.1038/oby.2011.95","ISSN":"1930-739X","issue":"2","journalAbbreviation":"Obesity (Silver Spring)","language":"eng","note":"PMID: 21593804","page":"428-433","source":"PubMed","title":"Work stress, obesity and the risk of type 2 diabetes: gender-specific bidirectional effect in the Whitehall II study","title-short":"Work stress, obesity and the risk of type 2 diabetes","volume":"20","author":[{"family":"Heraclides","given":"Alexandros M."},{"family":"Chandola","given":"Tarani"},{"family":"Witte","given":"Daniel R."},{"family":"Brunner","given":"Eric J."}],"issued":{"date-parts":[["2012",2]]}}}],"schema":"https://github.com/citation-style-language/schema/raw/master/csl-citation.json"} </w:instrText>
+        <w:instrText xml:space="preserve"> ADDIN ZOTERO_ITEM CSL_CITATION {"citationID":"tmOtPEdO","properties":{"formattedCitation":"(6)","plainCitation":"(6)","noteIndex":0},"citationItems":[{"id":"9zI9GZ7V/BhbSUH95","uris":["http://zotero.org/users/2695081/items/3FLNIKRN"],"itemData":{"id":"9zI9GZ7V/BhbSUH95","type":"article-journal","abstract":"Psychosocial work stress has been linked to higher risk of type 2 diabetes (T2DM), with the effect being consistently higher among women than men. Also, work stress has been linked to prospective weight gain among obese men but weight loss among lean men. Here, we aimed to examine the interaction between work stress and obesity in relation to T2DM risk in a gender-specific manner. We studied 5,568 white middle-aged men and women in the Whitehall II study, who were free from diabetes at analysis baseline (1993). After 1993, diabetes was ascertained at six consecutive phases by an oral glucose tolerance test supplemented by self-reports. Cox regression analysis was used to assess the association between job strain (high job demands/low job control) and 18-year incident T2DM stratifying by BMI (BMI &lt;30 kg/m(2) vs. BMI ≥30 kg/m(2)). Overall, work stress was associated with incident T2DM among women (hazard ratio (HR) 1.41: 95% confidence intervals: 1.02; 1.95) but not among men (HR 0.87: 95% confidence interval 0.69; 1.11) (P(INTERACTION) = 0.017). Among men, work stress was associated with a lower risk of T2DM in nonobese (HR 0.70: 0.53; 0.93) but not in obese individuals (P(INTERACTION) = 0.17). Among women, work stress was associated with higher risk of T2DM in the obese (HR 2.01: 1.06; 3.92) but not in the nonobese (P(INTERACTION) = 0.005). Gender and body weight status play a critical role in determining the direction of the association between psychosocial stress and T2DM. The potential effect-modifying role of gender and obesity should not be ignored by future studies looking at stress-disease associations.","container-title":"Obesity (Silver Spring, Md.)","DOI":"10.1038/oby.2011.95","ISSN":"1930-739X","issue":"2","journalAbbreviation":"Obesity (Silver Spring)","language":"eng","note":"PMID: 21593804","page":"428-433","source":"PubMed","title":"Work stress, obesity and the risk of type 2 diabetes: gender-specific bidirectional effect in the Whitehall II study","title-short":"Work stress, obesity and the risk of type 2 diabetes","volume":"20","author":[{"family":"Heraclides","given":"Alexandros M."},{"family":"Chandola","given":"Tarani"},{"family":"Witte","given":"Daniel R."},{"family":"Brunner","given":"Eric J."}],"issued":{"date-parts":[["2012",2]]}}}],"schema":"https://github.com/citation-style-language/schema/raw/master/csl-citation.json"} </w:instrText>
       </w:r>
       <w:r>
         <w:fldChar w:fldCharType="separate"/>
@@ -1137,7 +1322,69 @@
         <w:fldChar w:fldCharType="end"/>
       </w:r>
       <w:r>
-        <w:t>.  This could be due to either different populations, or the differences between perceived stress and job-related stress and how they impact have gender-specific effects.</w:t>
+        <w:t xml:space="preserve">.  </w:t>
+      </w:r>
+      <w:r>
+        <w:t xml:space="preserve">This data is in alignment with our pre-clinical mouse studies that show an elevated risk of </w:t>
+      </w:r>
+      <w:proofErr w:type="spellStart"/>
+      <w:r>
+        <w:t>dysglycemia</w:t>
+      </w:r>
+      <w:proofErr w:type="spellEnd"/>
+      <w:r>
+        <w:t xml:space="preserve"> in obese mice treated with glucocorticoids </w:t>
+      </w:r>
+      <w:r>
+        <w:fldChar w:fldCharType="begin"/>
+      </w:r>
+      <w:r>
+        <w:instrText xml:space="preserve"> ADDIN ZOTERO_ITEM CSL_CITATION {"citationID":"60pJs55V","properties":{"formattedCitation":"(4, 5)","plainCitation":"(4, 5)","noteIndex":0},"citationItems":[{"id":"9zI9GZ7V/tHgRCS7c","uris":["http://zotero.org/users/2695081/items/ABIIT6F6"],"itemData":{"id":"9zI9GZ7V/tHgRCS7c","type":"article-journal","container-title":"Endocrinology","DOI":"10.1210/en.2018-00147","ISSN":"1945-7170","issue":"6","language":"en","page":"2275-2287","source":"DOI.org (Crossref)","title":"Glucocorticoid-Induced Metabolic Disturbances Are Exacerbated in Obese Male Mice","volume":"159","author":[{"family":"Harvey","given":"Innocence"},{"family":"Stephenson","given":"Erin J"},{"family":"Redd","given":"JeAnna R"},{"family":"Tran","given":"Quynh T"},{"family":"Hochberg","given":"Irit"},{"family":"Qi","given":"Nathan"},{"family":"Bridges","given":"Dave"}],"issued":{"date-parts":[["2018",6,1]]}}},{"id":"9zI9GZ7V/3nlM5iac","uris":["http://zotero.org/users/2695081/items/455VREYL"],"itemData":{"id":"9zI9GZ7V/3nlM5iac","type":"article-journal","abstract":"Glucocorticoids promote muscle atrophy by inducing a class of proteins called atrogenes, resulting in reductions in muscle size and strength. In this work, we evaluated whether a mouse model with pre-existing diet-induced obesity had altered glucocorticoid responsiveness. We observed that all animals treated with the synthetic glucocorticoid dexamethasone had reduced strength, but that obesity exacerbated this effect. These changes were concordant with more pronounced reductions in muscle size, particularly in Type II muscle fibers, and potentiated induction of atrogene expression in the obese mice relative to lean mice. Furthermore, we show that the reductions in lean mass do not fully account for the dexamethasone-induced insulin resistance observed in these mice. Together, these data suggest that obesity potentiates glucocorticoid-induced muscle atrophy.","container-title":"Biomedicines","DOI":"10.3390/biomedicines8100420","ISSN":"2227-9059","issue":"10","journalAbbreviation":"Biomedicines","language":"en","page":"420","source":"DOI.org (Crossref)","title":"Obesity Augments Glucocorticoid-Dependent Muscle Atrophy in Male C57BL/6J Mice","volume":"8","author":[{"family":"Gunder","given":"Laura C."},{"family":"Harvey","given":"Innocence"},{"family":"Redd","given":"JeAnna R."},{"family":"Davis","given":"Carol S."},{"family":"AL-Tamimi","given":"Ayat"},{"family":"Brooks","given":"Susan V."},{"family":"Bridges","given":"Dave"}],"issued":{"date-parts":[["2020",10,15]]}}}],"schema":"https://github.com/citation-style-language/schema/raw/master/csl-citation.json"} </w:instrText>
+      </w:r>
+      <w:r>
+        <w:fldChar w:fldCharType="separate"/>
+      </w:r>
+      <w:r>
+        <w:rPr>
+          <w:noProof/>
+        </w:rPr>
+        <w:t>(4, 5)</w:t>
+      </w:r>
+      <w:r>
+        <w:fldChar w:fldCharType="end"/>
+      </w:r>
+      <w:r>
+        <w:t xml:space="preserve">, and in human patients with Cushing’s disease </w:t>
+      </w:r>
+      <w:r>
+        <w:fldChar w:fldCharType="begin"/>
+      </w:r>
+      <w:r>
+        <w:instrText xml:space="preserve"> ADDIN ZOTERO_ITEM CSL_CITATION {"citationID":"zW7FcRAf","properties":{"formattedCitation":"(13)","plainCitation":"(13)","noteIndex":0},"citationItems":[{"id":4127,"uris":["http://zotero.org/users/7317906/items/2YQBFJRJ"],"itemData":{"id":4127,"type":"article-journal","abstract":"Glucocorticoids have major effects on adipose tissue metabolism. To study tissue mRNA expression changes induced by chronic elevated endogenous glucocorticoids, we performed RNA sequencing on subcutaneous adipose tissue from patients with Cushing's disease (n=5) compared to patients with non-functioning pituitary adenomas (n=11). We found higher expression of transcripts involved in several metabolic pathways, including lipogenesis, proteolysis and glucose oxidation as well as decreased expression of transcripts involved in inflammation and protein synthesis. To further study this in a model system, we subjected mice to dexamethasone treatment for 12 weeks and analyzed their inguinal (subcutaneous) fat pads, which led to similar findings. Additionally, mice treated with dexamethasone showed drastic decreases in lean body mass as well as increased fat mass, further supporting the human transcriptomic data. These data provide insight to transcriptional changes that may be responsible for the co-morbidities associated with chronic elevations of glucocorticoids.","container-title":"Journal of Molecular Endocrinology","DOI":"10.1530/JME-15-0119","ISSN":"0952-5041","issue":"2","note":"PMID: 26150553\nCitation Key: Hochberg2015a","page":"81-94","title":"Gene expression changes in subcutaneous adipose tissue due to Cushing's disease","volume":"55","author":[{"family":"Hochberg","given":"Irit"},{"family":"Harvey","given":"Innocence"},{"family":"Tran","given":"Quynh T."},{"family":"Stephenson","given":"Erin J."},{"family":"Barkan","given":"Ariel L"},{"family":"Saltiel","given":"Alan R."},{"family":"Chandler","given":"William F."},{"family":"Bridges","given":"Dave"}],"issued":{"date-parts":[["2015",10]]},"citation-key":"Hochberg2015a"}}],"schema":"https://github.com/citation-style-language/schema/raw/master/csl-citation.json"} </w:instrText>
+      </w:r>
+      <w:r>
+        <w:fldChar w:fldCharType="separate"/>
+      </w:r>
+      <w:r>
+        <w:rPr>
+          <w:noProof/>
+        </w:rPr>
+        <w:t>(13)</w:t>
+      </w:r>
+      <w:r>
+        <w:fldChar w:fldCharType="end"/>
+      </w:r>
+      <w:r>
+        <w:t xml:space="preserve">.  </w:t>
+      </w:r>
+      <w:r>
+        <w:t xml:space="preserve">Together these data suggest that stress-related interventions could be </w:t>
+      </w:r>
+      <w:r>
+        <w:t>more effectively</w:t>
+      </w:r>
+      <w:r>
+        <w:t xml:space="preserve"> targeted to those with obesity, and that evaluation of psychosocial stress could be a valuable addition to the treatment and prevention of type 2 diabetes. </w:t>
       </w:r>
     </w:p>
     <w:p>
@@ -1238,7 +1485,35 @@
           <w:rFonts w:ascii="Calibri" w:cs="Calibri"/>
         </w:rPr>
         <w:tab/>
-        <w:t xml:space="preserve">Klein S, Gastaldelli A, Yki-Järvinen H, Scherer PE. Why does obesity cause diabetes? </w:t>
+        <w:t xml:space="preserve">Klein S, </w:t>
+      </w:r>
+      <w:proofErr w:type="spellStart"/>
+      <w:r>
+        <w:rPr>
+          <w:rFonts w:ascii="Calibri" w:cs="Calibri"/>
+        </w:rPr>
+        <w:t>Gastaldelli</w:t>
+      </w:r>
+      <w:proofErr w:type="spellEnd"/>
+      <w:r>
+        <w:rPr>
+          <w:rFonts w:ascii="Calibri" w:cs="Calibri"/>
+        </w:rPr>
+        <w:t xml:space="preserve"> A, </w:t>
+      </w:r>
+      <w:proofErr w:type="spellStart"/>
+      <w:r>
+        <w:rPr>
+          <w:rFonts w:ascii="Calibri" w:cs="Calibri"/>
+        </w:rPr>
+        <w:t>Yki-Järvinen</w:t>
+      </w:r>
+      <w:proofErr w:type="spellEnd"/>
+      <w:r>
+        <w:rPr>
+          <w:rFonts w:ascii="Calibri" w:cs="Calibri"/>
+        </w:rPr>
+        <w:t xml:space="preserve"> H, Scherer PE. Why does obesity cause diabetes? </w:t>
       </w:r>
       <w:r>
         <w:rPr>
@@ -1252,7 +1527,21 @@
         <w:rPr>
           <w:rFonts w:ascii="Calibri" w:cs="Calibri"/>
         </w:rPr>
-        <w:t xml:space="preserve"> 2022;34:11–20.</w:t>
+        <w:t xml:space="preserve"> </w:t>
+      </w:r>
+      <w:proofErr w:type="gramStart"/>
+      <w:r>
+        <w:rPr>
+          <w:rFonts w:ascii="Calibri" w:cs="Calibri"/>
+        </w:rPr>
+        <w:t>2022;34:11</w:t>
+      </w:r>
+      <w:proofErr w:type="gramEnd"/>
+      <w:r>
+        <w:rPr>
+          <w:rFonts w:ascii="Calibri" w:cs="Calibri"/>
+        </w:rPr>
+        <w:t>–20.</w:t>
       </w:r>
     </w:p>
     <w:p>
@@ -1273,21 +1562,96 @@
           <w:rFonts w:ascii="Calibri" w:cs="Calibri"/>
         </w:rPr>
         <w:tab/>
-        <w:t xml:space="preserve">Ingrosso DMF, Primavera M, Samvelyan S, Tagi VM, Chiarelli F. Stress and Diabetes Mellitus: Pathogenetic Mechanisms and Clinical Outcome. </w:t>
-      </w:r>
+      </w:r>
+      <w:proofErr w:type="spellStart"/>
+      <w:r>
+        <w:rPr>
+          <w:rFonts w:ascii="Calibri" w:cs="Calibri"/>
+        </w:rPr>
+        <w:t>Ingrosso</w:t>
+      </w:r>
+      <w:proofErr w:type="spellEnd"/>
+      <w:r>
+        <w:rPr>
+          <w:rFonts w:ascii="Calibri" w:cs="Calibri"/>
+        </w:rPr>
+        <w:t xml:space="preserve"> DMF, Primavera M, </w:t>
+      </w:r>
+      <w:proofErr w:type="spellStart"/>
+      <w:r>
+        <w:rPr>
+          <w:rFonts w:ascii="Calibri" w:cs="Calibri"/>
+        </w:rPr>
+        <w:t>Samvelyan</w:t>
+      </w:r>
+      <w:proofErr w:type="spellEnd"/>
+      <w:r>
+        <w:rPr>
+          <w:rFonts w:ascii="Calibri" w:cs="Calibri"/>
+        </w:rPr>
+        <w:t xml:space="preserve"> S, </w:t>
+      </w:r>
+      <w:proofErr w:type="spellStart"/>
+      <w:r>
+        <w:rPr>
+          <w:rFonts w:ascii="Calibri" w:cs="Calibri"/>
+        </w:rPr>
+        <w:t>Tagi</w:t>
+      </w:r>
+      <w:proofErr w:type="spellEnd"/>
+      <w:r>
+        <w:rPr>
+          <w:rFonts w:ascii="Calibri" w:cs="Calibri"/>
+        </w:rPr>
+        <w:t xml:space="preserve"> VM, Chiarelli F. Stress and Diabetes Mellitus: Pathogenetic Mechanisms and Clinical Outcome. </w:t>
+      </w:r>
+      <w:proofErr w:type="spellStart"/>
       <w:r>
         <w:rPr>
           <w:rFonts w:ascii="Calibri" w:cs="Calibri"/>
           <w:i/>
           <w:iCs/>
         </w:rPr>
-        <w:t>Horm Res Paediatr</w:t>
-      </w:r>
-      <w:r>
-        <w:rPr>
-          <w:rFonts w:ascii="Calibri" w:cs="Calibri"/>
-        </w:rPr>
-        <w:t xml:space="preserve"> 2023;96:34–43.</w:t>
+        <w:t>Horm</w:t>
+      </w:r>
+      <w:proofErr w:type="spellEnd"/>
+      <w:r>
+        <w:rPr>
+          <w:rFonts w:ascii="Calibri" w:cs="Calibri"/>
+          <w:i/>
+          <w:iCs/>
+        </w:rPr>
+        <w:t xml:space="preserve"> Res </w:t>
+      </w:r>
+      <w:proofErr w:type="spellStart"/>
+      <w:r>
+        <w:rPr>
+          <w:rFonts w:ascii="Calibri" w:cs="Calibri"/>
+          <w:i/>
+          <w:iCs/>
+        </w:rPr>
+        <w:t>Paediatr</w:t>
+      </w:r>
+      <w:proofErr w:type="spellEnd"/>
+      <w:r>
+        <w:rPr>
+          <w:rFonts w:ascii="Calibri" w:cs="Calibri"/>
+        </w:rPr>
+        <w:t xml:space="preserve"> </w:t>
+      </w:r>
+      <w:proofErr w:type="gramStart"/>
+      <w:r>
+        <w:rPr>
+          <w:rFonts w:ascii="Calibri" w:cs="Calibri"/>
+        </w:rPr>
+        <w:t>2023;96:34</w:t>
+      </w:r>
+      <w:proofErr w:type="gramEnd"/>
+      <w:r>
+        <w:rPr>
+          <w:rFonts w:ascii="Calibri" w:cs="Calibri"/>
+        </w:rPr>
+        <w:t>–43.</w:t>
       </w:r>
     </w:p>
     <w:p>
@@ -1310,19 +1674,43 @@
         <w:tab/>
         <w:t xml:space="preserve">Tomiyama AJ. Stress and Obesity. </w:t>
       </w:r>
+      <w:proofErr w:type="spellStart"/>
       <w:r>
         <w:rPr>
           <w:rFonts w:ascii="Calibri" w:cs="Calibri"/>
           <w:i/>
           <w:iCs/>
         </w:rPr>
-        <w:t>Annu Rev Psychol</w:t>
-      </w:r>
-      <w:r>
-        <w:rPr>
-          <w:rFonts w:ascii="Calibri" w:cs="Calibri"/>
-        </w:rPr>
-        <w:t xml:space="preserve"> 2019;70:703–718.</w:t>
+        <w:t>Annu</w:t>
+      </w:r>
+      <w:proofErr w:type="spellEnd"/>
+      <w:r>
+        <w:rPr>
+          <w:rFonts w:ascii="Calibri" w:cs="Calibri"/>
+          <w:i/>
+          <w:iCs/>
+        </w:rPr>
+        <w:t xml:space="preserve"> Rev Psychol</w:t>
+      </w:r>
+      <w:r>
+        <w:rPr>
+          <w:rFonts w:ascii="Calibri" w:cs="Calibri"/>
+        </w:rPr>
+        <w:t xml:space="preserve"> </w:t>
+      </w:r>
+      <w:proofErr w:type="gramStart"/>
+      <w:r>
+        <w:rPr>
+          <w:rFonts w:ascii="Calibri" w:cs="Calibri"/>
+        </w:rPr>
+        <w:t>2019;70:703</w:t>
+      </w:r>
+      <w:proofErr w:type="gramEnd"/>
+      <w:r>
+        <w:rPr>
+          <w:rFonts w:ascii="Calibri" w:cs="Calibri"/>
+        </w:rPr>
+        <w:t>–718.</w:t>
       </w:r>
     </w:p>
     <w:p>
@@ -1371,7 +1759,21 @@
         <w:rPr>
           <w:rFonts w:ascii="Calibri" w:cs="Calibri"/>
         </w:rPr>
-        <w:t xml:space="preserve"> 2018;159:2275–2287.</w:t>
+        <w:t xml:space="preserve"> </w:t>
+      </w:r>
+      <w:proofErr w:type="gramStart"/>
+      <w:r>
+        <w:rPr>
+          <w:rFonts w:ascii="Calibri" w:cs="Calibri"/>
+        </w:rPr>
+        <w:t>2018;159:2275</w:t>
+      </w:r>
+      <w:proofErr w:type="gramEnd"/>
+      <w:r>
+        <w:rPr>
+          <w:rFonts w:ascii="Calibri" w:cs="Calibri"/>
+        </w:rPr>
+        <w:t>–2287.</w:t>
       </w:r>
     </w:p>
     <w:p>
@@ -1392,7 +1794,20 @@
           <w:rFonts w:ascii="Calibri" w:cs="Calibri"/>
         </w:rPr>
         <w:tab/>
-        <w:t xml:space="preserve">Gunder LC, Harvey I, Redd JR, </w:t>
+      </w:r>
+      <w:proofErr w:type="spellStart"/>
+      <w:r>
+        <w:rPr>
+          <w:rFonts w:ascii="Calibri" w:cs="Calibri"/>
+        </w:rPr>
+        <w:t>Gunder</w:t>
+      </w:r>
+      <w:proofErr w:type="spellEnd"/>
+      <w:r>
+        <w:rPr>
+          <w:rFonts w:ascii="Calibri" w:cs="Calibri"/>
+        </w:rPr>
+        <w:t xml:space="preserve"> LC, Harvey I, Redd JR, </w:t>
       </w:r>
       <w:r>
         <w:rPr>
@@ -1420,7 +1835,21 @@
         <w:rPr>
           <w:rFonts w:ascii="Calibri" w:cs="Calibri"/>
         </w:rPr>
-        <w:t xml:space="preserve"> 2020;8:420.</w:t>
+        <w:t xml:space="preserve"> </w:t>
+      </w:r>
+      <w:proofErr w:type="gramStart"/>
+      <w:r>
+        <w:rPr>
+          <w:rFonts w:ascii="Calibri" w:cs="Calibri"/>
+        </w:rPr>
+        <w:t>2020;8:420</w:t>
+      </w:r>
+      <w:proofErr w:type="gramEnd"/>
+      <w:r>
+        <w:rPr>
+          <w:rFonts w:ascii="Calibri" w:cs="Calibri"/>
+        </w:rPr>
+        <w:t>.</w:t>
       </w:r>
     </w:p>
     <w:p>
@@ -1441,7 +1870,34 @@
           <w:rFonts w:ascii="Calibri" w:cs="Calibri"/>
         </w:rPr>
         <w:tab/>
-        <w:t xml:space="preserve">Heraclides AM, Chandola T, Witte DR, Brunner EJ. Work stress, obesity and the risk of type 2 diabetes: gender-specific bidirectional effect in the Whitehall II study. </w:t>
+      </w:r>
+      <w:proofErr w:type="spellStart"/>
+      <w:r>
+        <w:rPr>
+          <w:rFonts w:ascii="Calibri" w:cs="Calibri"/>
+        </w:rPr>
+        <w:t>Heraclides</w:t>
+      </w:r>
+      <w:proofErr w:type="spellEnd"/>
+      <w:r>
+        <w:rPr>
+          <w:rFonts w:ascii="Calibri" w:cs="Calibri"/>
+        </w:rPr>
+        <w:t xml:space="preserve"> AM, </w:t>
+      </w:r>
+      <w:proofErr w:type="spellStart"/>
+      <w:r>
+        <w:rPr>
+          <w:rFonts w:ascii="Calibri" w:cs="Calibri"/>
+        </w:rPr>
+        <w:t>Chandola</w:t>
+      </w:r>
+      <w:proofErr w:type="spellEnd"/>
+      <w:r>
+        <w:rPr>
+          <w:rFonts w:ascii="Calibri" w:cs="Calibri"/>
+        </w:rPr>
+        <w:t xml:space="preserve"> T, Witte DR, Brunner EJ. Work stress, obesity and the risk of type 2 diabetes: gender-specific bidirectional effect in the Whitehall II study. </w:t>
       </w:r>
       <w:r>
         <w:rPr>
@@ -1455,7 +1911,21 @@
         <w:rPr>
           <w:rFonts w:ascii="Calibri" w:cs="Calibri"/>
         </w:rPr>
-        <w:t xml:space="preserve"> 2012;20:428–433.</w:t>
+        <w:t xml:space="preserve"> </w:t>
+      </w:r>
+      <w:proofErr w:type="gramStart"/>
+      <w:r>
+        <w:rPr>
+          <w:rFonts w:ascii="Calibri" w:cs="Calibri"/>
+        </w:rPr>
+        <w:t>2012;20:428</w:t>
+      </w:r>
+      <w:proofErr w:type="gramEnd"/>
+      <w:r>
+        <w:rPr>
+          <w:rFonts w:ascii="Calibri" w:cs="Calibri"/>
+        </w:rPr>
+        <w:t>–433.</w:t>
       </w:r>
     </w:p>
     <w:p>
@@ -1476,7 +1946,35 @@
           <w:rFonts w:ascii="Calibri" w:cs="Calibri"/>
         </w:rPr>
         <w:tab/>
-        <w:t xml:space="preserve">Williams ED, Magliano DJ, Tapp RJ, Oldenburg BF, Shaw JE. Psychosocial stress predicts abnormal glucose metabolism: the Australian Diabetes, Obesity and Lifestyle (AusDiab) study. </w:t>
+        <w:t xml:space="preserve">Williams ED, Magliano DJ, </w:t>
+      </w:r>
+      <w:proofErr w:type="spellStart"/>
+      <w:r>
+        <w:rPr>
+          <w:rFonts w:ascii="Calibri" w:cs="Calibri"/>
+        </w:rPr>
+        <w:t>Tapp</w:t>
+      </w:r>
+      <w:proofErr w:type="spellEnd"/>
+      <w:r>
+        <w:rPr>
+          <w:rFonts w:ascii="Calibri" w:cs="Calibri"/>
+        </w:rPr>
+        <w:t xml:space="preserve"> RJ, Oldenburg BF, Shaw JE. Psychosocial stress predicts abnormal glucose metabolism: the Australian Diabetes, Obesity and Lifestyle (</w:t>
+      </w:r>
+      <w:proofErr w:type="spellStart"/>
+      <w:r>
+        <w:rPr>
+          <w:rFonts w:ascii="Calibri" w:cs="Calibri"/>
+        </w:rPr>
+        <w:t>AusDiab</w:t>
+      </w:r>
+      <w:proofErr w:type="spellEnd"/>
+      <w:r>
+        <w:rPr>
+          <w:rFonts w:ascii="Calibri" w:cs="Calibri"/>
+        </w:rPr>
+        <w:t xml:space="preserve">) study. </w:t>
       </w:r>
       <w:r>
         <w:rPr>
@@ -1484,13 +1982,45 @@
           <w:i/>
           <w:iCs/>
         </w:rPr>
-        <w:t>Ann Behav Med</w:t>
-      </w:r>
-      <w:r>
-        <w:rPr>
-          <w:rFonts w:ascii="Calibri" w:cs="Calibri"/>
-        </w:rPr>
-        <w:t xml:space="preserve"> 2013;46:62–72.</w:t>
+        <w:t xml:space="preserve">Ann </w:t>
+      </w:r>
+      <w:proofErr w:type="spellStart"/>
+      <w:r>
+        <w:rPr>
+          <w:rFonts w:ascii="Calibri" w:cs="Calibri"/>
+          <w:i/>
+          <w:iCs/>
+        </w:rPr>
+        <w:t>Behav</w:t>
+      </w:r>
+      <w:proofErr w:type="spellEnd"/>
+      <w:r>
+        <w:rPr>
+          <w:rFonts w:ascii="Calibri" w:cs="Calibri"/>
+          <w:i/>
+          <w:iCs/>
+        </w:rPr>
+        <w:t xml:space="preserve"> Med</w:t>
+      </w:r>
+      <w:r>
+        <w:rPr>
+          <w:rFonts w:ascii="Calibri" w:cs="Calibri"/>
+        </w:rPr>
+        <w:t xml:space="preserve"> </w:t>
+      </w:r>
+      <w:proofErr w:type="gramStart"/>
+      <w:r>
+        <w:rPr>
+          <w:rFonts w:ascii="Calibri" w:cs="Calibri"/>
+        </w:rPr>
+        <w:t>2013;46:62</w:t>
+      </w:r>
+      <w:proofErr w:type="gramEnd"/>
+      <w:r>
+        <w:rPr>
+          <w:rFonts w:ascii="Calibri" w:cs="Calibri"/>
+        </w:rPr>
+        <w:t>–72.</w:t>
       </w:r>
     </w:p>
     <w:p>
@@ -1511,7 +2041,35 @@
           <w:rFonts w:ascii="Calibri" w:cs="Calibri"/>
         </w:rPr>
         <w:tab/>
-        <w:t xml:space="preserve">Tyagi K, Agarwal NB, Kapur P, Kohli S, Jalali RK. Evaluation of Stress and Associated Biochemical Changes in Patients with Type 2 Diabetes Mellitus and Obesity. </w:t>
+        <w:t xml:space="preserve">Tyagi K, Agarwal NB, </w:t>
+      </w:r>
+      <w:proofErr w:type="spellStart"/>
+      <w:r>
+        <w:rPr>
+          <w:rFonts w:ascii="Calibri" w:cs="Calibri"/>
+        </w:rPr>
+        <w:t>Kapur</w:t>
+      </w:r>
+      <w:proofErr w:type="spellEnd"/>
+      <w:r>
+        <w:rPr>
+          <w:rFonts w:ascii="Calibri" w:cs="Calibri"/>
+        </w:rPr>
+        <w:t xml:space="preserve"> P, Kohli S, </w:t>
+      </w:r>
+      <w:proofErr w:type="spellStart"/>
+      <w:r>
+        <w:rPr>
+          <w:rFonts w:ascii="Calibri" w:cs="Calibri"/>
+        </w:rPr>
+        <w:t>Jalali</w:t>
+      </w:r>
+      <w:proofErr w:type="spellEnd"/>
+      <w:r>
+        <w:rPr>
+          <w:rFonts w:ascii="Calibri" w:cs="Calibri"/>
+        </w:rPr>
+        <w:t xml:space="preserve"> RK. Evaluation of Stress and Associated Biochemical Changes in Patients with Type 2 Diabetes Mellitus and Obesity. </w:t>
       </w:r>
       <w:r>
         <w:rPr>
@@ -1519,13 +2077,73 @@
           <w:i/>
           <w:iCs/>
         </w:rPr>
-        <w:t>Diabetes Metab Syndr Obes</w:t>
-      </w:r>
-      <w:r>
-        <w:rPr>
-          <w:rFonts w:ascii="Calibri" w:cs="Calibri"/>
-        </w:rPr>
-        <w:t xml:space="preserve"> 2021;14:705–717.</w:t>
+        <w:t xml:space="preserve">Diabetes </w:t>
+      </w:r>
+      <w:proofErr w:type="spellStart"/>
+      <w:r>
+        <w:rPr>
+          <w:rFonts w:ascii="Calibri" w:cs="Calibri"/>
+          <w:i/>
+          <w:iCs/>
+        </w:rPr>
+        <w:t>Metab</w:t>
+      </w:r>
+      <w:proofErr w:type="spellEnd"/>
+      <w:r>
+        <w:rPr>
+          <w:rFonts w:ascii="Calibri" w:cs="Calibri"/>
+          <w:i/>
+          <w:iCs/>
+        </w:rPr>
+        <w:t xml:space="preserve"> </w:t>
+      </w:r>
+      <w:proofErr w:type="spellStart"/>
+      <w:r>
+        <w:rPr>
+          <w:rFonts w:ascii="Calibri" w:cs="Calibri"/>
+          <w:i/>
+          <w:iCs/>
+        </w:rPr>
+        <w:t>Syndr</w:t>
+      </w:r>
+      <w:proofErr w:type="spellEnd"/>
+      <w:r>
+        <w:rPr>
+          <w:rFonts w:ascii="Calibri" w:cs="Calibri"/>
+          <w:i/>
+          <w:iCs/>
+        </w:rPr>
+        <w:t xml:space="preserve"> </w:t>
+      </w:r>
+      <w:proofErr w:type="spellStart"/>
+      <w:r>
+        <w:rPr>
+          <w:rFonts w:ascii="Calibri" w:cs="Calibri"/>
+          <w:i/>
+          <w:iCs/>
+        </w:rPr>
+        <w:t>Obes</w:t>
+      </w:r>
+      <w:proofErr w:type="spellEnd"/>
+      <w:r>
+        <w:rPr>
+          <w:rFonts w:ascii="Calibri" w:cs="Calibri"/>
+        </w:rPr>
+        <w:t xml:space="preserve"> </w:t>
+      </w:r>
+      <w:proofErr w:type="gramStart"/>
+      <w:r>
+        <w:rPr>
+          <w:rFonts w:ascii="Calibri" w:cs="Calibri"/>
+        </w:rPr>
+        <w:t>2021;14:705</w:t>
+      </w:r>
+      <w:proofErr w:type="gramEnd"/>
+      <w:r>
+        <w:rPr>
+          <w:rFonts w:ascii="Calibri" w:cs="Calibri"/>
+        </w:rPr>
+        <w:t>–717.</w:t>
       </w:r>
     </w:p>
     <w:p>
@@ -1546,7 +2164,20 @@
           <w:rFonts w:ascii="Calibri" w:cs="Calibri"/>
         </w:rPr>
         <w:tab/>
-        <w:t xml:space="preserve">Zawistowski M, Fritsche LG, Pandit A, </w:t>
+      </w:r>
+      <w:proofErr w:type="spellStart"/>
+      <w:r>
+        <w:rPr>
+          <w:rFonts w:ascii="Calibri" w:cs="Calibri"/>
+        </w:rPr>
+        <w:t>Zawistowski</w:t>
+      </w:r>
+      <w:proofErr w:type="spellEnd"/>
+      <w:r>
+        <w:rPr>
+          <w:rFonts w:ascii="Calibri" w:cs="Calibri"/>
+        </w:rPr>
+        <w:t xml:space="preserve"> M, Fritsche LG, Pandit A, </w:t>
       </w:r>
       <w:r>
         <w:rPr>
@@ -1616,7 +2247,21 @@
           <w:rFonts w:ascii="Calibri" w:cs="Calibri"/>
         </w:rPr>
         <w:tab/>
-        <w:t xml:space="preserve">Sattler KM, Deane FP, Tapsell L, Kelly PJ. Gender differences in the relationship of weight-based stigmatisation with motivation to exercise and physical activity in overweight individuals. </w:t>
+        <w:t xml:space="preserve">Sattler KM, Deane FP, Tapsell L, Kelly PJ. Gender differences in the relationship of weight-based </w:t>
+      </w:r>
+      <w:proofErr w:type="spellStart"/>
+      <w:r>
+        <w:rPr>
+          <w:rFonts w:ascii="Calibri" w:cs="Calibri"/>
+        </w:rPr>
+        <w:t>stigmatisation</w:t>
+      </w:r>
+      <w:proofErr w:type="spellEnd"/>
+      <w:r>
+        <w:rPr>
+          <w:rFonts w:ascii="Calibri" w:cs="Calibri"/>
+        </w:rPr>
+        <w:t xml:space="preserve"> with motivation to exercise and physical activity in overweight individuals. </w:t>
       </w:r>
       <w:r>
         <w:rPr>
@@ -1630,7 +2275,133 @@
         <w:rPr>
           <w:rFonts w:ascii="Calibri" w:cs="Calibri"/>
         </w:rPr>
-        <w:t xml:space="preserve"> 2018;5:2055102918759691.</w:t>
+        <w:t xml:space="preserve"> </w:t>
+      </w:r>
+      <w:proofErr w:type="gramStart"/>
+      <w:r>
+        <w:rPr>
+          <w:rFonts w:ascii="Calibri" w:cs="Calibri"/>
+        </w:rPr>
+        <w:t>2018;5:2055102918759691</w:t>
+      </w:r>
+      <w:proofErr w:type="gramEnd"/>
+      <w:r>
+        <w:rPr>
+          <w:rFonts w:ascii="Calibri" w:cs="Calibri"/>
+        </w:rPr>
+        <w:t>.</w:t>
+      </w:r>
+    </w:p>
+    <w:p>
+      <w:pPr>
+        <w:pStyle w:val="Bibliography"/>
+        <w:rPr>
+          <w:rFonts w:ascii="Calibri" w:cs="Calibri"/>
+        </w:rPr>
+      </w:pPr>
+      <w:r>
+        <w:rPr>
+          <w:rFonts w:ascii="Calibri" w:cs="Calibri"/>
+        </w:rPr>
+        <w:t xml:space="preserve">12. </w:t>
+      </w:r>
+      <w:r>
+        <w:rPr>
+          <w:rFonts w:ascii="Calibri" w:cs="Calibri"/>
+        </w:rPr>
+        <w:tab/>
+        <w:t xml:space="preserve">Tomiyama AJ. Weight stigma is stressful. A review of evidence for the cyclic Obesity/weight-based stigma model. </w:t>
+      </w:r>
+      <w:r>
+        <w:rPr>
+          <w:rFonts w:ascii="Calibri" w:cs="Calibri"/>
+          <w:i/>
+          <w:iCs/>
+        </w:rPr>
+        <w:t>Appetite</w:t>
+      </w:r>
+      <w:r>
+        <w:rPr>
+          <w:rFonts w:ascii="Calibri" w:cs="Calibri"/>
+        </w:rPr>
+        <w:t xml:space="preserve"> </w:t>
+      </w:r>
+      <w:proofErr w:type="gramStart"/>
+      <w:r>
+        <w:rPr>
+          <w:rFonts w:ascii="Calibri" w:cs="Calibri"/>
+        </w:rPr>
+        <w:t>2014;82:8</w:t>
+      </w:r>
+      <w:proofErr w:type="gramEnd"/>
+      <w:r>
+        <w:rPr>
+          <w:rFonts w:ascii="Calibri" w:cs="Calibri"/>
+        </w:rPr>
+        <w:t>–15.</w:t>
+      </w:r>
+    </w:p>
+    <w:p>
+      <w:pPr>
+        <w:pStyle w:val="Bibliography"/>
+        <w:rPr>
+          <w:rFonts w:ascii="Calibri" w:cs="Calibri"/>
+        </w:rPr>
+      </w:pPr>
+      <w:r>
+        <w:rPr>
+          <w:rFonts w:ascii="Calibri" w:cs="Calibri"/>
+        </w:rPr>
+        <w:t xml:space="preserve">13. </w:t>
+      </w:r>
+      <w:r>
+        <w:rPr>
+          <w:rFonts w:ascii="Calibri" w:cs="Calibri"/>
+        </w:rPr>
+        <w:tab/>
+        <w:t xml:space="preserve">Hochberg I, Harvey I, Tran QT, </w:t>
+      </w:r>
+      <w:r>
+        <w:rPr>
+          <w:rFonts w:ascii="Calibri" w:cs="Calibri"/>
+          <w:i/>
+          <w:iCs/>
+        </w:rPr>
+        <w:t>et al.</w:t>
+      </w:r>
+      <w:r>
+        <w:rPr>
+          <w:rFonts w:ascii="Calibri" w:cs="Calibri"/>
+        </w:rPr>
+        <w:t xml:space="preserve"> Gene expression changes in subcutaneous adipose tissue due to Cushing’s disease. </w:t>
+      </w:r>
+      <w:r>
+        <w:rPr>
+          <w:rFonts w:ascii="Calibri" w:cs="Calibri"/>
+          <w:i/>
+          <w:iCs/>
+        </w:rPr>
+        <w:t>Journal of Molecular Endocrinology</w:t>
+      </w:r>
+      <w:r>
+        <w:rPr>
+          <w:rFonts w:ascii="Calibri" w:cs="Calibri"/>
+        </w:rPr>
+        <w:t xml:space="preserve"> </w:t>
+      </w:r>
+      <w:proofErr w:type="gramStart"/>
+      <w:r>
+        <w:rPr>
+          <w:rFonts w:ascii="Calibri" w:cs="Calibri"/>
+        </w:rPr>
+        <w:t>2015;55:81</w:t>
+      </w:r>
+      <w:proofErr w:type="gramEnd"/>
+      <w:r>
+        <w:rPr>
+          <w:rFonts w:ascii="Calibri" w:cs="Calibri"/>
+        </w:rPr>
+        <w:t>–94.</w:t>
       </w:r>
     </w:p>
     <w:p>
@@ -1644,6 +2415,9 @@
       </w:r>
     </w:p>
     <w:p>
+      <w:pPr>
+        <w:pStyle w:val="Heading1"/>
+      </w:pPr>
       <w:r>
         <w:lastRenderedPageBreak/>
         <w:t>Figure and Table Legends</w:t>
@@ -1733,7 +2507,7 @@
       </w:r>
     </w:p>
   </w:comment>
-  <w:comment w:id="1" w:author="Dave Bridges" w:date="2024-04-12T12:34:00Z" w:initials="DB">
+  <w:comment w:id="1" w:author="Dave Bridges" w:date="2024-04-12T12:26:00Z" w:initials="DB">
     <w:p>
       <w:pPr>
         <w:pStyle w:val="CommentText"/>
@@ -1745,27 +2519,11 @@
         <w:annotationRef/>
       </w:r>
       <w:r>
-        <w:t>Recheck these numbers</w:t>
+        <w:t>Write about this</w:t>
       </w:r>
     </w:p>
   </w:comment>
-  <w:comment w:id="2" w:author="Dave Bridges" w:date="2024-04-12T12:26:00Z" w:initials="DB">
-    <w:p>
-      <w:pPr>
-        <w:pStyle w:val="CommentText"/>
-      </w:pPr>
-      <w:r>
-        <w:rPr>
-          <w:rStyle w:val="CommentReference"/>
-        </w:rPr>
-        <w:annotationRef/>
-      </w:r>
-      <w:r>
-        <w:t>Write about this</w:t>
-      </w:r>
-    </w:p>
-  </w:comment>
-  <w:comment w:id="3" w:author="Dave Bridges" w:date="2024-04-12T11:52:00Z" w:initials="DB">
+  <w:comment w:id="2" w:author="Dave Bridges" w:date="2024-04-12T11:52:00Z" w:initials="DB">
     <w:p>
       <w:r>
         <w:rPr>
@@ -2105,6 +2863,24 @@
       </w:r>
     </w:p>
   </w:comment>
+  <w:comment w:id="3" w:author="Dave Bridges" w:date="2024-04-24T09:48:00Z" w:initials="DB">
+    <w:p>
+      <w:r>
+        <w:rPr>
+          <w:rStyle w:val="CommentReference"/>
+        </w:rPr>
+        <w:annotationRef/>
+      </w:r>
+      <w:r>
+        <w:rPr>
+          <w:color w:val="000000"/>
+          <w:sz w:val="20"/>
+          <w:szCs w:val="20"/>
+        </w:rPr>
+        <w:t>@irit do you want to say some more about the lack of effects of stress on hypertension here?</w:t>
+      </w:r>
+    </w:p>
+  </w:comment>
   <w:comment w:id="4" w:author="Dave Bridges" w:date="2024-04-12T11:07:00Z" w:initials="DB">
     <w:p>
       <w:pPr>
@@ -2117,10 +2893,7 @@
         <w:annotationRef/>
       </w:r>
       <w:r>
-        <w:t>@</w:t>
-      </w:r>
-      <w:r>
-        <w:t>kate and irit</w:t>
+        <w:t>@kate and irit</w:t>
       </w:r>
       <w:r>
         <w:br/>
@@ -2137,21 +2910,35 @@
 <file path=word/commentsExtended.xml><?xml version="1.0" encoding="utf-8"?>
 <w15:commentsEx xmlns:wpc="http://schemas.microsoft.com/office/word/2010/wordprocessingCanvas" xmlns:cx="http://schemas.microsoft.com/office/drawing/2014/chartex" xmlns:cx1="http://schemas.microsoft.com/office/drawing/2015/9/8/chartex" xmlns:cx2="http://schemas.microsoft.com/office/drawing/2015/10/21/chartex" xmlns:cx3="http://schemas.microsoft.com/office/drawing/2016/5/9/chartex" xmlns:cx4="http://schemas.microsoft.com/office/drawing/2016/5/10/chartex" xmlns:cx5="http://schemas.microsoft.com/office/drawing/2016/5/11/chartex" xmlns:cx6="http://schemas.microsoft.com/office/drawing/2016/5/12/chartex" xmlns:cx7="http://schemas.microsoft.com/office/drawing/2016/5/13/chartex" xmlns:cx8="http://schemas.microsoft.com/office/drawing/2016/5/14/chartex" xmlns:mc="http://schemas.openxmlformats.org/markup-compatibility/2006" xmlns:aink="http://schemas.microsoft.com/office/drawing/2016/ink" xmlns:am3d="http://schemas.microsoft.com/office/drawing/2017/model3d" xmlns:o="urn:schemas-microsoft-com:office:office" xmlns:oel="http://schemas.microsoft.com/office/2019/extlst" xmlns:r="http://schemas.openxmlformats.org/officeDocument/2006/relationships" xmlns:m="http://schemas.openxmlformats.org/officeDocument/2006/math" xmlns:v="urn:schemas-microsoft-com:vml" xmlns:wp14="http://schemas.microsoft.com/office/word/2010/wordprocessingDrawing" xmlns:wp="http://schemas.openxmlformats.org/drawingml/2006/wordprocessingDrawing" xmlns:w10="urn:schemas-microsoft-com:office:word" xmlns:w="http://schemas.openxmlformats.org/wordprocessingml/2006/main" xmlns:w14="http://schemas.microsoft.com/office/word/2010/wordml" xmlns:w15="http://schemas.microsoft.com/office/word/2012/wordml" xmlns:w16cex="http://schemas.microsoft.com/office/word/2018/wordml/cex" xmlns:w16cid="http://schemas.microsoft.com/office/word/2016/wordml/cid" xmlns:w16="http://schemas.microsoft.com/office/word/2018/wordml" xmlns:w16sdtdh="http://schemas.microsoft.com/office/word/2020/wordml/sdtdatahash" xmlns:w16se="http://schemas.microsoft.com/office/word/2015/wordml/symex" xmlns:wpg="http://schemas.microsoft.com/office/word/2010/wordprocessingGroup" xmlns:wpi="http://schemas.microsoft.com/office/word/2010/wordprocessingInk" xmlns:wne="http://schemas.microsoft.com/office/word/2006/wordml" xmlns:wps="http://schemas.microsoft.com/office/word/2010/wordprocessingShape" mc:Ignorable="w14 w15 w16se w16cid w16 w16cex w16sdtdh wp14">
   <w15:commentEx w15:paraId="10DFA24D" w15:done="0"/>
-  <w15:commentEx w15:paraId="5B10A6FF" w15:done="0"/>
   <w15:commentEx w15:paraId="620828B1" w15:done="0"/>
   <w15:commentEx w15:paraId="6B0600C2" w15:done="0"/>
+  <w15:commentEx w15:paraId="5C843C51" w15:done="0"/>
   <w15:commentEx w15:paraId="4DAD4B88" w15:done="0"/>
 </w15:commentsEx>
+</file>
+
+<file path=word/commentsExtensible.xml><?xml version="1.0" encoding="utf-8"?>
+<w16cex:commentsExtensible xmlns:wpc="http://schemas.microsoft.com/office/word/2010/wordprocessingCanvas" xmlns:cx="http://schemas.microsoft.com/office/drawing/2014/chartex" xmlns:cx1="http://schemas.microsoft.com/office/drawing/2015/9/8/chartex" xmlns:cx2="http://schemas.microsoft.com/office/drawing/2015/10/21/chartex" xmlns:cx3="http://schemas.microsoft.com/office/drawing/2016/5/9/chartex" xmlns:cx4="http://schemas.microsoft.com/office/drawing/2016/5/10/chartex" xmlns:cx5="http://schemas.microsoft.com/office/drawing/2016/5/11/chartex" xmlns:cx6="http://schemas.microsoft.com/office/drawing/2016/5/12/chartex" xmlns:cx7="http://schemas.microsoft.com/office/drawing/2016/5/13/chartex" xmlns:cx8="http://schemas.microsoft.com/office/drawing/2016/5/14/chartex" xmlns:cr="http://schemas.microsoft.com/office/comments/2020/reactions" xmlns:mc="http://schemas.openxmlformats.org/markup-compatibility/2006" xmlns:aink="http://schemas.microsoft.com/office/drawing/2016/ink" xmlns:am3d="http://schemas.microsoft.com/office/drawing/2017/model3d" xmlns:o="urn:schemas-microsoft-com:office:office" xmlns:oel="http://schemas.microsoft.com/office/2019/extlst" xmlns:r="http://schemas.openxmlformats.org/officeDocument/2006/relationships" xmlns:m="http://schemas.openxmlformats.org/officeDocument/2006/math" xmlns:v="urn:schemas-microsoft-com:vml" xmlns:wp14="http://schemas.microsoft.com/office/word/2010/wordprocessingDrawing" xmlns:wp="http://schemas.openxmlformats.org/drawingml/2006/wordprocessingDrawing" xmlns:w10="urn:schemas-microsoft-com:office:word" xmlns:w="http://schemas.openxmlformats.org/wordprocessingml/2006/main" xmlns:w14="http://schemas.microsoft.com/office/word/2010/wordml" xmlns:w15="http://schemas.microsoft.com/office/word/2012/wordml" xmlns:w16cex="http://schemas.microsoft.com/office/word/2018/wordml/cex" xmlns:w16cid="http://schemas.microsoft.com/office/word/2016/wordml/cid" xmlns:w16="http://schemas.microsoft.com/office/word/2018/wordml" xmlns:w16sdtdh="http://schemas.microsoft.com/office/word/2020/wordml/sdtdatahash" xmlns:w16se="http://schemas.microsoft.com/office/word/2015/wordml/symex" xmlns:wpg="http://schemas.microsoft.com/office/word/2010/wordprocessingGroup" xmlns:wpi="http://schemas.microsoft.com/office/word/2010/wordprocessingInk" xmlns:wne="http://schemas.microsoft.com/office/word/2006/wordml" xmlns:wps="http://schemas.microsoft.com/office/word/2010/wordprocessingShape" mc:Ignorable="w14 w15 w16se w16cid w16 w16cex w16sdtdh cr wp14">
+  <w16cex:commentExtensible w16cex:durableId="2BE31721" w16cex:dateUtc="2024-04-24T13:48:00Z"/>
+</w16cex:commentsExtensible>
 </file>
 
 <file path=word/commentsIds.xml><?xml version="1.0" encoding="utf-8"?>
 <w16cid:commentsIds xmlns:wpc="http://schemas.microsoft.com/office/word/2010/wordprocessingCanvas" xmlns:cx="http://schemas.microsoft.com/office/drawing/2014/chartex" xmlns:cx1="http://schemas.microsoft.com/office/drawing/2015/9/8/chartex" xmlns:cx2="http://schemas.microsoft.com/office/drawing/2015/10/21/chartex" xmlns:cx3="http://schemas.microsoft.com/office/drawing/2016/5/9/chartex" xmlns:cx4="http://schemas.microsoft.com/office/drawing/2016/5/10/chartex" xmlns:cx5="http://schemas.microsoft.com/office/drawing/2016/5/11/chartex" xmlns:cx6="http://schemas.microsoft.com/office/drawing/2016/5/12/chartex" xmlns:cx7="http://schemas.microsoft.com/office/drawing/2016/5/13/chartex" xmlns:cx8="http://schemas.microsoft.com/office/drawing/2016/5/14/chartex" xmlns:mc="http://schemas.openxmlformats.org/markup-compatibility/2006" xmlns:aink="http://schemas.microsoft.com/office/drawing/2016/ink" xmlns:am3d="http://schemas.microsoft.com/office/drawing/2017/model3d" xmlns:o="urn:schemas-microsoft-com:office:office" xmlns:oel="http://schemas.microsoft.com/office/2019/extlst" xmlns:r="http://schemas.openxmlformats.org/officeDocument/2006/relationships" xmlns:m="http://schemas.openxmlformats.org/officeDocument/2006/math" xmlns:v="urn:schemas-microsoft-com:vml" xmlns:wp14="http://schemas.microsoft.com/office/word/2010/wordprocessingDrawing" xmlns:wp="http://schemas.openxmlformats.org/drawingml/2006/wordprocessingDrawing" xmlns:w10="urn:schemas-microsoft-com:office:word" xmlns:w="http://schemas.openxmlformats.org/wordprocessingml/2006/main" xmlns:w14="http://schemas.microsoft.com/office/word/2010/wordml" xmlns:w15="http://schemas.microsoft.com/office/word/2012/wordml" xmlns:w16cex="http://schemas.microsoft.com/office/word/2018/wordml/cex" xmlns:w16cid="http://schemas.microsoft.com/office/word/2016/wordml/cid" xmlns:w16="http://schemas.microsoft.com/office/word/2018/wordml" xmlns:w16sdtdh="http://schemas.microsoft.com/office/word/2020/wordml/sdtdatahash" xmlns:w16se="http://schemas.microsoft.com/office/word/2015/wordml/symex" xmlns:wpg="http://schemas.microsoft.com/office/word/2010/wordprocessingGroup" xmlns:wpi="http://schemas.microsoft.com/office/word/2010/wordprocessingInk" xmlns:wne="http://schemas.microsoft.com/office/word/2006/wordml" xmlns:wps="http://schemas.microsoft.com/office/word/2010/wordprocessingShape" mc:Ignorable="w14 w15 w16se w16cid w16 w16cex w16sdtdh wp14">
   <w16cid:commentId w16cid:paraId="10DFA24D" w16cid:durableId="29411550"/>
-  <w16cid:commentId w16cid:paraId="5B10A6FF" w16cid:durableId="29C3A8EF"/>
   <w16cid:commentId w16cid:paraId="620828B1" w16cid:durableId="29C3A6FB"/>
   <w16cid:commentId w16cid:paraId="6B0600C2" w16cid:durableId="29C39F1A"/>
+  <w16cid:commentId w16cid:paraId="5C843C51" w16cid:durableId="2BE31721"/>
   <w16cid:commentId w16cid:paraId="4DAD4B88" w16cid:durableId="29C39457"/>
 </w16cid:commentsIds>
+</file>
+
+<file path=word/people.xml><?xml version="1.0" encoding="utf-8"?>
+<w15:people xmlns:wpc="http://schemas.microsoft.com/office/word/2010/wordprocessingCanvas" xmlns:cx="http://schemas.microsoft.com/office/drawing/2014/chartex" xmlns:cx1="http://schemas.microsoft.com/office/drawing/2015/9/8/chartex" xmlns:cx2="http://schemas.microsoft.com/office/drawing/2015/10/21/chartex" xmlns:cx3="http://schemas.microsoft.com/office/drawing/2016/5/9/chartex" xmlns:cx4="http://schemas.microsoft.com/office/drawing/2016/5/10/chartex" xmlns:cx5="http://schemas.microsoft.com/office/drawing/2016/5/11/chartex" xmlns:cx6="http://schemas.microsoft.com/office/drawing/2016/5/12/chartex" xmlns:cx7="http://schemas.microsoft.com/office/drawing/2016/5/13/chartex" xmlns:cx8="http://schemas.microsoft.com/office/drawing/2016/5/14/chartex" xmlns:mc="http://schemas.openxmlformats.org/markup-compatibility/2006" xmlns:aink="http://schemas.microsoft.com/office/drawing/2016/ink" xmlns:am3d="http://schemas.microsoft.com/office/drawing/2017/model3d" xmlns:o="urn:schemas-microsoft-com:office:office" xmlns:oel="http://schemas.microsoft.com/office/2019/extlst" xmlns:r="http://schemas.openxmlformats.org/officeDocument/2006/relationships" xmlns:m="http://schemas.openxmlformats.org/officeDocument/2006/math" xmlns:v="urn:schemas-microsoft-com:vml" xmlns:wp14="http://schemas.microsoft.com/office/word/2010/wordprocessingDrawing" xmlns:wp="http://schemas.openxmlformats.org/drawingml/2006/wordprocessingDrawing" xmlns:w10="urn:schemas-microsoft-com:office:word" xmlns:w="http://schemas.openxmlformats.org/wordprocessingml/2006/main" xmlns:w14="http://schemas.microsoft.com/office/word/2010/wordml" xmlns:w15="http://schemas.microsoft.com/office/word/2012/wordml" xmlns:w16cex="http://schemas.microsoft.com/office/word/2018/wordml/cex" xmlns:w16cid="http://schemas.microsoft.com/office/word/2016/wordml/cid" xmlns:w16="http://schemas.microsoft.com/office/word/2018/wordml" xmlns:w16sdtdh="http://schemas.microsoft.com/office/word/2020/wordml/sdtdatahash" xmlns:w16se="http://schemas.microsoft.com/office/word/2015/wordml/symex" xmlns:wpg="http://schemas.microsoft.com/office/word/2010/wordprocessingGroup" xmlns:wpi="http://schemas.microsoft.com/office/word/2010/wordprocessingInk" xmlns:wne="http://schemas.microsoft.com/office/word/2006/wordml" xmlns:wps="http://schemas.microsoft.com/office/word/2010/wordprocessingShape" mc:Ignorable="w14 w15 w16se w16cid w16 w16cex w16sdtdh wp14">
+  <w15:person w15:author="Dave Bridges">
+    <w15:presenceInfo w15:providerId="None" w15:userId="Dave Bridges"/>
+  </w15:person>
+</w15:people>
 </file>
 
 <file path=word/styles.xml><?xml version="1.0" encoding="utf-8"?>

</xml_diff>

<commit_message>
Updated analyses of comorbidities
</commit_message>
<xml_diff>
--- a/manuscript/Obesity-Stress/Manuscript.docx
+++ b/manuscript/Obesity-Stress/Manuscript.docx
@@ -84,7 +84,7 @@
         <w:fldChar w:fldCharType="begin"/>
       </w:r>
       <w:r>
-        <w:instrText xml:space="preserve"> ADDIN ZOTERO_ITEM CSL_CITATION {"citationID":"PFInBGkp","properties":{"formattedCitation":"(1)","plainCitation":"(1)","noteIndex":0},"citationItems":[{"id":"9zI9GZ7V/hV33GpYx","uris":["http://zotero.org/users/2695081/items/YEZFY7CW"],"itemData":{"id":"wYajtxYE/aNG2Y68D","type":"article-journal","container-title":"Cell Metabolism","DOI":"10.1016/j.cmet.2021.12.012","ISSN":"15504131","issue":"1","journalAbbreviation":"Cell Metabolism","language":"en","page":"11-20","source":"DOI.org (Crossref)","title":"Why does obesity cause diabetes?","volume":"34","author":[{"family":"Klein","given":"Samuel"},{"family":"Gastaldelli","given":"Amalia"},{"family":"Yki-Järvinen","given":"Hannele"},{"family":"Scherer","given":"Philipp E."}],"issued":{"date-parts":[["2022",1]]}}}],"schema":"https://github.com/citation-style-language/schema/raw/master/csl-citation.json"} </w:instrText>
+        <w:instrText xml:space="preserve"> ADDIN ZOTERO_ITEM CSL_CITATION {"citationID":"PFInBGkp","properties":{"formattedCitation":"(1)","plainCitation":"(1)","noteIndex":0},"citationItems":[{"id":"DNVojJss/wFXtUxbW","uris":["http://zotero.org/users/2695081/items/YEZFY7CW"],"itemData":{"id":"wYajtxYE/aNG2Y68D","type":"article-journal","container-title":"Cell Metabolism","DOI":"10.1016/j.cmet.2021.12.012","ISSN":"15504131","issue":"1","journalAbbreviation":"Cell Metabolism","language":"en","page":"11-20","source":"DOI.org (Crossref)","title":"Why does obesity cause diabetes?","volume":"34","author":[{"family":"Klein","given":"Samuel"},{"family":"Gastaldelli","given":"Amalia"},{"family":"Yki-Järvinen","given":"Hannele"},{"family":"Scherer","given":"Philipp E."}],"issued":{"date-parts":[["2022",1]]}}}],"schema":"https://github.com/citation-style-language/schema/raw/master/csl-citation.json"} </w:instrText>
       </w:r>
       <w:r>
         <w:fldChar w:fldCharType="separate"/>
@@ -111,7 +111,7 @@
         <w:fldChar w:fldCharType="begin"/>
       </w:r>
       <w:r>
-        <w:instrText xml:space="preserve"> ADDIN ZOTERO_ITEM CSL_CITATION {"citationID":"M57XEHIn","properties":{"formattedCitation":"(2)","plainCitation":"(2)","noteIndex":0},"citationItems":[{"id":"9zI9GZ7V/ZZktq7ou","uris":["http://zotero.org/users/2695081/items/NFIEYI62"],"itemData":{"id":1813,"type":"article-journal","abstract":"Evidence suggests that psychological and physical stress are relevant triggering factors for the onset of type 1 diabetes (T1D) and type 2 diabetes (T2D). The underlying mechanisms involve a complex neuroendocrine structure, involving the central nervous system and the periphery. Psychological stress leads to an increase of serum glucocorticoid concentrations and catecholamines release increasing the insulin need and the insulin resistance. According to the β-cell stress hypothesis, also causes of increased insulin demand, such as rapid growth, overweight, puberty, low physical activity, trauma, infections, and glucose overload, are potentially relevant factors in development of T1D. It has also been demonstrated that chronic stress and obesity form a vicious circle which leads to a definitive metabolic failure, increasing the risk of developing T2D. In this review, we will provide the most recent data concerning the role of stress in the outcomes of T1D and T2D, with a focus on the role of physical and psychological stress on the onset of T1D.","container-title":"Hormone Research in Paediatrics","DOI":"10.1159/000522431","ISSN":"1663-2826","issue":"1","journalAbbreviation":"Horm Res Paediatr","language":"eng","note":"PMID: 35124671","page":"34-43","source":"PubMed","title":"Stress and Diabetes Mellitus: Pathogenetic Mechanisms and Clinical Outcome","title-short":"Stress and Diabetes Mellitus","volume":"96","author":[{"family":"Ingrosso","given":"Diletta Maria Francesca"},{"family":"Primavera","given":"Marina"},{"family":"Samvelyan","given":"Sona"},{"family":"Tagi","given":"Veronica Maria"},{"family":"Chiarelli","given":"Francesco"}],"issued":{"date-parts":[["2023"]]}}}],"schema":"https://github.com/citation-style-language/schema/raw/master/csl-citation.json"} </w:instrText>
+        <w:instrText xml:space="preserve"> ADDIN ZOTERO_ITEM CSL_CITATION {"citationID":"M57XEHIn","properties":{"formattedCitation":"(2)","plainCitation":"(2)","noteIndex":0},"citationItems":[{"id":"DNVojJss/JvUt2zVY","uris":["http://zotero.org/users/2695081/items/NFIEYI62"],"itemData":{"id":1813,"type":"article-journal","abstract":"Evidence suggests that psychological and physical stress are relevant triggering factors for the onset of type 1 diabetes (T1D) and type 2 diabetes (T2D). The underlying mechanisms involve a complex neuroendocrine structure, involving the central nervous system and the periphery. Psychological stress leads to an increase of serum glucocorticoid concentrations and catecholamines release increasing the insulin need and the insulin resistance. According to the β-cell stress hypothesis, also causes of increased insulin demand, such as rapid growth, overweight, puberty, low physical activity, trauma, infections, and glucose overload, are potentially relevant factors in development of T1D. It has also been demonstrated that chronic stress and obesity form a vicious circle which leads to a definitive metabolic failure, increasing the risk of developing T2D. In this review, we will provide the most recent data concerning the role of stress in the outcomes of T1D and T2D, with a focus on the role of physical and psychological stress on the onset of T1D.","container-title":"Hormone Research in Paediatrics","DOI":"10.1159/000522431","ISSN":"1663-2826","issue":"1","journalAbbreviation":"Horm Res Paediatr","language":"eng","note":"PMID: 35124671","page":"34-43","source":"PubMed","title":"Stress and Diabetes Mellitus: Pathogenetic Mechanisms and Clinical Outcome","title-short":"Stress and Diabetes Mellitus","volume":"96","author":[{"family":"Ingrosso","given":"Diletta Maria Francesca"},{"family":"Primavera","given":"Marina"},{"family":"Samvelyan","given":"Sona"},{"family":"Tagi","given":"Veronica Maria"},{"family":"Chiarelli","given":"Francesco"}],"issued":{"date-parts":[["2023"]]}}}],"schema":"https://github.com/citation-style-language/schema/raw/master/csl-citation.json"} </w:instrText>
       </w:r>
       <w:r>
         <w:fldChar w:fldCharType="separate"/>
@@ -132,7 +132,7 @@
         <w:fldChar w:fldCharType="begin"/>
       </w:r>
       <w:r>
-        <w:instrText xml:space="preserve"> ADDIN ZOTERO_ITEM CSL_CITATION {"citationID":"uXca1Ecw","properties":{"formattedCitation":"(3)","plainCitation":"(3)","noteIndex":0},"citationItems":[{"id":"9zI9GZ7V/Tl2mVMOZ","uris":["http://zotero.org/users/2695081/items/9FN2SLJA"],"itemData":{"id":1825,"type":"article-journal","abstract":"Many pathways connect stress and obesity, two highly prevalent problems facing society today. First, stress interferes with cognitive processes such as executive function and self-regulation. Second, stress can affect behavior by inducing overeating and consumption of foods that are high in calories, fat, or sugar; by decreasing physical activity; and by shortening sleep. Third, stress triggers physiological changes in the hypothalamic-pituitary-adrenal axis, reward processing in the brain, and possibly the gut microbiome. Finally, stress can stimulate production of biochemical hormones and peptides such as leptin, ghrelin, and neuropeptide Y. Obesity itself can be a stressful state due to the high prevalence of weight stigma. This article therefore traces the contribution of weight stigma to stress and obesogenic processes, ultimately describing a vicious cycle of stress to obesity to stigma to stress. Current obesity prevention efforts focus solely on eating and exercise; the evidence reviewed in this article points to stress as an important but currently overlooked public policy target.","container-title":"Annual Review of Psychology","DOI":"10.1146/annurev-psych-010418-102936","ISSN":"0066-4308, 1545-2085","issue":"1","journalAbbreviation":"Annu. Rev. Psychol.","language":"en","page":"703-718","source":"DOI.org (Crossref)","title":"Stress and Obesity","volume":"70","author":[{"family":"Tomiyama","given":"A. Janet"}],"issued":{"date-parts":[["2019",1,4]]}}}],"schema":"https://github.com/citation-style-language/schema/raw/master/csl-citation.json"} </w:instrText>
+        <w:instrText xml:space="preserve"> ADDIN ZOTERO_ITEM CSL_CITATION {"citationID":"uXca1Ecw","properties":{"formattedCitation":"(3)","plainCitation":"(3)","noteIndex":0},"citationItems":[{"id":"DNVojJss/ZF5iML6h","uris":["http://zotero.org/users/2695081/items/9FN2SLJA"],"itemData":{"id":1825,"type":"article-journal","abstract":"Many pathways connect stress and obesity, two highly prevalent problems facing society today. First, stress interferes with cognitive processes such as executive function and self-regulation. Second, stress can affect behavior by inducing overeating and consumption of foods that are high in calories, fat, or sugar; by decreasing physical activity; and by shortening sleep. Third, stress triggers physiological changes in the hypothalamic-pituitary-adrenal axis, reward processing in the brain, and possibly the gut microbiome. Finally, stress can stimulate production of biochemical hormones and peptides such as leptin, ghrelin, and neuropeptide Y. Obesity itself can be a stressful state due to the high prevalence of weight stigma. This article therefore traces the contribution of weight stigma to stress and obesogenic processes, ultimately describing a vicious cycle of stress to obesity to stigma to stress. Current obesity prevention efforts focus solely on eating and exercise; the evidence reviewed in this article points to stress as an important but currently overlooked public policy target.","container-title":"Annual Review of Psychology","DOI":"10.1146/annurev-psych-010418-102936","ISSN":"0066-4308, 1545-2085","issue":"1","journalAbbreviation":"Annu. Rev. Psychol.","language":"en","page":"703-718","source":"DOI.org (Crossref)","title":"Stress and Obesity","volume":"70","author":[{"family":"Tomiyama","given":"A. Janet"}],"issued":{"date-parts":[["2019",1,4]]}}}],"schema":"https://github.com/citation-style-language/schema/raw/master/csl-citation.json"} </w:instrText>
       </w:r>
       <w:r>
         <w:fldChar w:fldCharType="separate"/>
@@ -165,7 +165,7 @@
         <w:fldChar w:fldCharType="begin"/>
       </w:r>
       <w:r>
-        <w:instrText xml:space="preserve"> ADDIN ZOTERO_ITEM CSL_CITATION {"citationID":"g6EUyo8B","properties":{"formattedCitation":"(2)","plainCitation":"(2)","noteIndex":0},"citationItems":[{"id":"9zI9GZ7V/ZZktq7ou","uris":["http://zotero.org/users/2695081/items/NFIEYI62"],"itemData":{"id":1813,"type":"article-journal","abstract":"Evidence suggests that psychological and physical stress are relevant triggering factors for the onset of type 1 diabetes (T1D) and type 2 diabetes (T2D). The underlying mechanisms involve a complex neuroendocrine structure, involving the central nervous system and the periphery. Psychological stress leads to an increase of serum glucocorticoid concentrations and catecholamines release increasing the insulin need and the insulin resistance. According to the β-cell stress hypothesis, also causes of increased insulin demand, such as rapid growth, overweight, puberty, low physical activity, trauma, infections, and glucose overload, are potentially relevant factors in development of T1D. It has also been demonstrated that chronic stress and obesity form a vicious circle which leads to a definitive metabolic failure, increasing the risk of developing T2D. In this review, we will provide the most recent data concerning the role of stress in the outcomes of T1D and T2D, with a focus on the role of physical and psychological stress on the onset of T1D.","container-title":"Hormone Research in Paediatrics","DOI":"10.1159/000522431","ISSN":"1663-2826","issue":"1","journalAbbreviation":"Horm Res Paediatr","language":"eng","note":"PMID: 35124671","page":"34-43","source":"PubMed","title":"Stress and Diabetes Mellitus: Pathogenetic Mechanisms and Clinical Outcome","title-short":"Stress and Diabetes Mellitus","volume":"96","author":[{"family":"Ingrosso","given":"Diletta Maria Francesca"},{"family":"Primavera","given":"Marina"},{"family":"Samvelyan","given":"Sona"},{"family":"Tagi","given":"Veronica Maria"},{"family":"Chiarelli","given":"Francesco"}],"issued":{"date-parts":[["2023"]]}}}],"schema":"https://github.com/citation-style-language/schema/raw/master/csl-citation.json"} </w:instrText>
+        <w:instrText xml:space="preserve"> ADDIN ZOTERO_ITEM CSL_CITATION {"citationID":"g6EUyo8B","properties":{"formattedCitation":"(2)","plainCitation":"(2)","noteIndex":0},"citationItems":[{"id":"DNVojJss/JvUt2zVY","uris":["http://zotero.org/users/2695081/items/NFIEYI62"],"itemData":{"id":1813,"type":"article-journal","abstract":"Evidence suggests that psychological and physical stress are relevant triggering factors for the onset of type 1 diabetes (T1D) and type 2 diabetes (T2D). The underlying mechanisms involve a complex neuroendocrine structure, involving the central nervous system and the periphery. Psychological stress leads to an increase of serum glucocorticoid concentrations and catecholamines release increasing the insulin need and the insulin resistance. According to the β-cell stress hypothesis, also causes of increased insulin demand, such as rapid growth, overweight, puberty, low physical activity, trauma, infections, and glucose overload, are potentially relevant factors in development of T1D. It has also been demonstrated that chronic stress and obesity form a vicious circle which leads to a definitive metabolic failure, increasing the risk of developing T2D. In this review, we will provide the most recent data concerning the role of stress in the outcomes of T1D and T2D, with a focus on the role of physical and psychological stress on the onset of T1D.","container-title":"Hormone Research in Paediatrics","DOI":"10.1159/000522431","ISSN":"1663-2826","issue":"1","journalAbbreviation":"Horm Res Paediatr","language":"eng","note":"PMID: 35124671","page":"34-43","source":"PubMed","title":"Stress and Diabetes Mellitus: Pathogenetic Mechanisms and Clinical Outcome","title-short":"Stress and Diabetes Mellitus","volume":"96","author":[{"family":"Ingrosso","given":"Diletta Maria Francesca"},{"family":"Primavera","given":"Marina"},{"family":"Samvelyan","given":"Sona"},{"family":"Tagi","given":"Veronica Maria"},{"family":"Chiarelli","given":"Francesco"}],"issued":{"date-parts":[["2023"]]}}}],"schema":"https://github.com/citation-style-language/schema/raw/master/csl-citation.json"} </w:instrText>
       </w:r>
       <w:r>
         <w:fldChar w:fldCharType="separate"/>
@@ -189,7 +189,7 @@
         <w:fldChar w:fldCharType="begin"/>
       </w:r>
       <w:r>
-        <w:instrText xml:space="preserve"> ADDIN ZOTERO_ITEM CSL_CITATION {"citationID":"FfVoWjjp","properties":{"formattedCitation":"(3)","plainCitation":"(3)","noteIndex":0},"citationItems":[{"id":"9zI9GZ7V/Tl2mVMOZ","uris":["http://zotero.org/users/2695081/items/9FN2SLJA"],"itemData":{"id":1825,"type":"article-journal","abstract":"Many pathways connect stress and obesity, two highly prevalent problems facing society today. First, stress interferes with cognitive processes such as executive function and self-regulation. Second, stress can affect behavior by inducing overeating and consumption of foods that are high in calories, fat, or sugar; by decreasing physical activity; and by shortening sleep. Third, stress triggers physiological changes in the hypothalamic-pituitary-adrenal axis, reward processing in the brain, and possibly the gut microbiome. Finally, stress can stimulate production of biochemical hormones and peptides such as leptin, ghrelin, and neuropeptide Y. Obesity itself can be a stressful state due to the high prevalence of weight stigma. This article therefore traces the contribution of weight stigma to stress and obesogenic processes, ultimately describing a vicious cycle of stress to obesity to stigma to stress. Current obesity prevention efforts focus solely on eating and exercise; the evidence reviewed in this article points to stress as an important but currently overlooked public policy target.","container-title":"Annual Review of Psychology","DOI":"10.1146/annurev-psych-010418-102936","ISSN":"0066-4308, 1545-2085","issue":"1","journalAbbreviation":"Annu. Rev. Psychol.","language":"en","page":"703-718","source":"DOI.org (Crossref)","title":"Stress and Obesity","volume":"70","author":[{"family":"Tomiyama","given":"A. Janet"}],"issued":{"date-parts":[["2019",1,4]]}}}],"schema":"https://github.com/citation-style-language/schema/raw/master/csl-citation.json"} </w:instrText>
+        <w:instrText xml:space="preserve"> ADDIN ZOTERO_ITEM CSL_CITATION {"citationID":"FfVoWjjp","properties":{"formattedCitation":"(3)","plainCitation":"(3)","noteIndex":0},"citationItems":[{"id":"DNVojJss/ZF5iML6h","uris":["http://zotero.org/users/2695081/items/9FN2SLJA"],"itemData":{"id":1825,"type":"article-journal","abstract":"Many pathways connect stress and obesity, two highly prevalent problems facing society today. First, stress interferes with cognitive processes such as executive function and self-regulation. Second, stress can affect behavior by inducing overeating and consumption of foods that are high in calories, fat, or sugar; by decreasing physical activity; and by shortening sleep. Third, stress triggers physiological changes in the hypothalamic-pituitary-adrenal axis, reward processing in the brain, and possibly the gut microbiome. Finally, stress can stimulate production of biochemical hormones and peptides such as leptin, ghrelin, and neuropeptide Y. Obesity itself can be a stressful state due to the high prevalence of weight stigma. This article therefore traces the contribution of weight stigma to stress and obesogenic processes, ultimately describing a vicious cycle of stress to obesity to stigma to stress. Current obesity prevention efforts focus solely on eating and exercise; the evidence reviewed in this article points to stress as an important but currently overlooked public policy target.","container-title":"Annual Review of Psychology","DOI":"10.1146/annurev-psych-010418-102936","ISSN":"0066-4308, 1545-2085","issue":"1","journalAbbreviation":"Annu. Rev. Psychol.","language":"en","page":"703-718","source":"DOI.org (Crossref)","title":"Stress and Obesity","volume":"70","author":[{"family":"Tomiyama","given":"A. Janet"}],"issued":{"date-parts":[["2019",1,4]]}}}],"schema":"https://github.com/citation-style-language/schema/raw/master/csl-citation.json"} </w:instrText>
       </w:r>
       <w:r>
         <w:fldChar w:fldCharType="separate"/>
@@ -226,7 +226,7 @@
         <w:fldChar w:fldCharType="begin"/>
       </w:r>
       <w:r>
-        <w:instrText xml:space="preserve"> ADDIN ZOTERO_ITEM CSL_CITATION {"citationID":"5aWkX9TS","properties":{"formattedCitation":"(4, 5)","plainCitation":"(4, 5)","noteIndex":0},"citationItems":[{"id":"9zI9GZ7V/tHgRCS7c","uris":["http://zotero.org/users/2695081/items/ABIIT6F6"],"itemData":{"id":1829,"type":"article-journal","container-title":"Endocrinology","DOI":"10.1210/en.2018-00147","ISSN":"1945-7170","issue":"6","language":"en","page":"2275-2287","source":"DOI.org (Crossref)","title":"Glucocorticoid-Induced Metabolic Disturbances Are Exacerbated in Obese Male Mice","volume":"159","author":[{"family":"Harvey","given":"Innocence"},{"family":"Stephenson","given":"Erin J"},{"family":"Redd","given":"JeAnna R"},{"family":"Tran","given":"Quynh T"},{"family":"Hochberg","given":"Irit"},{"family":"Qi","given":"Nathan"},{"family":"Bridges","given":"Dave"}],"issued":{"date-parts":[["2018",6,1]]}}},{"id":"9zI9GZ7V/3nlM5iac","uris":["http://zotero.org/users/2695081/items/455VREYL"],"itemData":{"id":"wYajtxYE/4E01BWQ9","type":"article-journal","abstract":"Glucocorticoids promote muscle atrophy by inducing a class of proteins called atrogenes, resulting in reductions in muscle size and strength. In this work, we evaluated whether a mouse model with pre-existing diet-induced obesity had altered glucocorticoid responsiveness. We observed that all animals treated with the synthetic glucocorticoid dexamethasone had reduced strength, but that obesity exacerbated this effect. These changes were concordant with more pronounced reductions in muscle size, particularly in Type II muscle fibers, and potentiated induction of atrogene expression in the obese mice relative to lean mice. Furthermore, we show that the reductions in lean mass do not fully account for the dexamethasone-induced insulin resistance observed in these mice. Together, these data suggest that obesity potentiates glucocorticoid-induced muscle atrophy.","container-title":"Biomedicines","DOI":"10.3390/biomedicines8100420","ISSN":"2227-9059","issue":"10","journalAbbreviation":"Biomedicines","language":"en","page":"420","source":"DOI.org (Crossref)","title":"Obesity Augments Glucocorticoid-Dependent Muscle Atrophy in Male C57BL/6J Mice","volume":"8","author":[{"family":"Gunder","given":"Laura C."},{"family":"Harvey","given":"Innocence"},{"family":"Redd","given":"JeAnna R."},{"family":"Davis","given":"Carol S."},{"family":"AL-Tamimi","given":"Ayat"},{"family":"Brooks","given":"Susan V."},{"family":"Bridges","given":"Dave"}],"issued":{"date-parts":[["2020",10,15]]}}}],"schema":"https://github.com/citation-style-language/schema/raw/master/csl-citation.json"} </w:instrText>
+        <w:instrText xml:space="preserve"> ADDIN ZOTERO_ITEM CSL_CITATION {"citationID":"5aWkX9TS","properties":{"formattedCitation":"(4, 5)","plainCitation":"(4, 5)","noteIndex":0},"citationItems":[{"id":"DNVojJss/JUJ2TG0Q","uris":["http://zotero.org/users/2695081/items/ABIIT6F6"],"itemData":{"id":1829,"type":"article-journal","container-title":"Endocrinology","DOI":"10.1210/en.2018-00147","ISSN":"1945-7170","issue":"6","language":"en","page":"2275-2287","source":"DOI.org (Crossref)","title":"Glucocorticoid-Induced Metabolic Disturbances Are Exacerbated in Obese Male Mice","volume":"159","author":[{"family":"Harvey","given":"Innocence"},{"family":"Stephenson","given":"Erin J"},{"family":"Redd","given":"JeAnna R"},{"family":"Tran","given":"Quynh T"},{"family":"Hochberg","given":"Irit"},{"family":"Qi","given":"Nathan"},{"family":"Bridges","given":"Dave"}],"issued":{"date-parts":[["2018",6,1]]}}},{"id":"DNVojJss/6l3QDrs3","uris":["http://zotero.org/users/2695081/items/455VREYL"],"itemData":{"id":"wYajtxYE/4E01BWQ9","type":"article-journal","abstract":"Glucocorticoids promote muscle atrophy by inducing a class of proteins called atrogenes, resulting in reductions in muscle size and strength. In this work, we evaluated whether a mouse model with pre-existing diet-induced obesity had altered glucocorticoid responsiveness. We observed that all animals treated with the synthetic glucocorticoid dexamethasone had reduced strength, but that obesity exacerbated this effect. These changes were concordant with more pronounced reductions in muscle size, particularly in Type II muscle fibers, and potentiated induction of atrogene expression in the obese mice relative to lean mice. Furthermore, we show that the reductions in lean mass do not fully account for the dexamethasone-induced insulin resistance observed in these mice. Together, these data suggest that obesity potentiates glucocorticoid-induced muscle atrophy.","container-title":"Biomedicines","DOI":"10.3390/biomedicines8100420","ISSN":"2227-9059","issue":"10","journalAbbreviation":"Biomedicines","language":"en","page":"420","source":"DOI.org (Crossref)","title":"Obesity Augments Glucocorticoid-Dependent Muscle Atrophy in Male C57BL/6J Mice","volume":"8","author":[{"family":"Gunder","given":"Laura C."},{"family":"Harvey","given":"Innocence"},{"family":"Redd","given":"JeAnna R."},{"family":"Davis","given":"Carol S."},{"family":"AL-Tamimi","given":"Ayat"},{"family":"Brooks","given":"Susan V."},{"family":"Bridges","given":"Dave"}],"issued":{"date-parts":[["2020",10,15]]}}}],"schema":"https://github.com/citation-style-language/schema/raw/master/csl-citation.json"} </w:instrText>
       </w:r>
       <w:r>
         <w:fldChar w:fldCharType="separate"/>
@@ -253,7 +253,7 @@
         <w:fldChar w:fldCharType="begin"/>
       </w:r>
       <w:r>
-        <w:instrText xml:space="preserve"> ADDIN ZOTERO_ITEM CSL_CITATION {"citationID":"K8XBA9DN","properties":{"formattedCitation":"(6)","plainCitation":"(6)","noteIndex":0},"citationItems":[{"id":"9zI9GZ7V/BhbSUH95","uris":["http://zotero.org/users/2695081/items/3FLNIKRN"],"itemData":{"id":1804,"type":"article-journal","abstract":"Psychosocial work stress has been linked to higher risk of type 2 diabetes (T2DM), with the effect being consistently higher among women than men. Also, work stress has been linked to prospective weight gain among obese men but weight loss among lean men. Here, we aimed to examine the interaction between work stress and obesity in relation to T2DM risk in a gender-specific manner. We studied 5,568 white middle-aged men and women in the Whitehall II study, who were free from diabetes at analysis baseline (1993). After 1993, diabetes was ascertained at six consecutive phases by an oral glucose tolerance test supplemented by self-reports. Cox regression analysis was used to assess the association between job strain (high job demands/low job control) and 18-year incident T2DM stratifying by BMI (BMI &lt;30 kg/m(2) vs. BMI ≥30 kg/m(2)). Overall, work stress was associated with incident T2DM among women (hazard ratio (HR) 1.41: 95% confidence intervals: 1.02; 1.95) but not among men (HR 0.87: 95% confidence interval 0.69; 1.11) (P(INTERACTION) = 0.017). Among men, work stress was associated with a lower risk of T2DM in nonobese (HR 0.70: 0.53; 0.93) but not in obese individuals (P(INTERACTION) = 0.17). Among women, work stress was associated with higher risk of T2DM in the obese (HR 2.01: 1.06; 3.92) but not in the nonobese (P(INTERACTION) = 0.005). Gender and body weight status play a critical role in determining the direction of the association between psychosocial stress and T2DM. The potential effect-modifying role of gender and obesity should not be ignored by future studies looking at stress-disease associations.","container-title":"Obesity (Silver Spring, Md.)","DOI":"10.1038/oby.2011.95","ISSN":"1930-739X","issue":"2","journalAbbreviation":"Obesity (Silver Spring)","language":"eng","note":"PMID: 21593804","page":"428-433","source":"PubMed","title":"Work stress, obesity and the risk of type 2 diabetes: gender-specific bidirectional effect in the Whitehall II study","title-short":"Work stress, obesity and the risk of type 2 diabetes","volume":"20","author":[{"family":"Heraclides","given":"Alexandros M."},{"family":"Chandola","given":"Tarani"},{"family":"Witte","given":"Daniel R."},{"family":"Brunner","given":"Eric J."}],"issued":{"date-parts":[["2012",2]]}}}],"schema":"https://github.com/citation-style-language/schema/raw/master/csl-citation.json"} </w:instrText>
+        <w:instrText xml:space="preserve"> ADDIN ZOTERO_ITEM CSL_CITATION {"citationID":"K8XBA9DN","properties":{"formattedCitation":"(6)","plainCitation":"(6)","noteIndex":0},"citationItems":[{"id":"DNVojJss/E9uQonSR","uris":["http://zotero.org/users/2695081/items/3FLNIKRN"],"itemData":{"id":1804,"type":"article-journal","abstract":"Psychosocial work stress has been linked to higher risk of type 2 diabetes (T2DM), with the effect being consistently higher among women than men. Also, work stress has been linked to prospective weight gain among obese men but weight loss among lean men. Here, we aimed to examine the interaction between work stress and obesity in relation to T2DM risk in a gender-specific manner. We studied 5,568 white middle-aged men and women in the Whitehall II study, who were free from diabetes at analysis baseline (1993). After 1993, diabetes was ascertained at six consecutive phases by an oral glucose tolerance test supplemented by self-reports. Cox regression analysis was used to assess the association between job strain (high job demands/low job control) and 18-year incident T2DM stratifying by BMI (BMI &lt;30 kg/m(2) vs. BMI ≥30 kg/m(2)). Overall, work stress was associated with incident T2DM among women (hazard ratio (HR) 1.41: 95% confidence intervals: 1.02; 1.95) but not among men (HR 0.87: 95% confidence interval 0.69; 1.11) (P(INTERACTION) = 0.017). Among men, work stress was associated with a lower risk of T2DM in nonobese (HR 0.70: 0.53; 0.93) but not in obese individuals (P(INTERACTION) = 0.17). Among women, work stress was associated with higher risk of T2DM in the obese (HR 2.01: 1.06; 3.92) but not in the nonobese (P(INTERACTION) = 0.005). Gender and body weight status play a critical role in determining the direction of the association between psychosocial stress and T2DM. The potential effect-modifying role of gender and obesity should not be ignored by future studies looking at stress-disease associations.","container-title":"Obesity (Silver Spring, Md.)","DOI":"10.1038/oby.2011.95","ISSN":"1930-739X","issue":"2","journalAbbreviation":"Obesity (Silver Spring)","language":"eng","note":"PMID: 21593804","page":"428-433","source":"PubMed","title":"Work stress, obesity and the risk of type 2 diabetes: gender-specific bidirectional effect in the Whitehall II study","title-short":"Work stress, obesity and the risk of type 2 diabetes","volume":"20","author":[{"family":"Heraclides","given":"Alexandros M."},{"family":"Chandola","given":"Tarani"},{"family":"Witte","given":"Daniel R."},{"family":"Brunner","given":"Eric J."}],"issued":{"date-parts":[["2012",2]]}}}],"schema":"https://github.com/citation-style-language/schema/raw/master/csl-citation.json"} </w:instrText>
       </w:r>
       <w:r>
         <w:fldChar w:fldCharType="separate"/>
@@ -274,7 +274,7 @@
         <w:fldChar w:fldCharType="begin"/>
       </w:r>
       <w:r>
-        <w:instrText xml:space="preserve"> ADDIN ZOTERO_ITEM CSL_CITATION {"citationID":"AFe5E0pt","properties":{"formattedCitation":"(7)","plainCitation":"(7)","noteIndex":0},"citationItems":[{"id":"9zI9GZ7V/Ao4qE2gy","uris":["http://zotero.org/users/2695081/items/VA42I7LX"],"itemData":{"id":1807,"type":"article-journal","abstract":"BACKGROUND: The evidence supporting a relationship between stress and diabetes has been inconsistent.\nPURPOSE: This study examined the effects of stress on abnormal glucose metabolism, using a population-based sample of 3,759, with normoglycemia at baseline, from the Australian Diabetes, Obesity and Lifestyle study.\nMETHODS: Perceived stress and stressful life events were measured at baseline, with health behavior and anthropometric information also collected. Oral glucose tolerance tests were undertaken at baseline and 5-year follow-up. The primary outcome was the development of abnormal glucose metabolism (impaired fasting glucose, impaired glucose tolerance, and type 2 diabetes), according to WHO 1999 criteria.\nRESULTS: Perceived stress predicted incident abnormal glucose metabolism in women but not men, after multivariate adjustment. Life events showed an inconsistent relationship with abnormal glucose metabolism.\nCONCLUSIONS: Perceived stress predicted abnormal glucose metabolism in women. Healthcare professionals should consider psychosocial adversity when assessing risk factor profiles for the development of diabetes.","container-title":"Annals of Behavioral Medicine: A Publication of the Society of Behavioral Medicine","DOI":"10.1007/s12160-013-9473-y","ISSN":"1532-4796","issue":"1","journalAbbreviation":"Ann Behav Med","language":"eng","note":"PMID: 23389687","page":"62-72","source":"PubMed","title":"Psychosocial stress predicts abnormal glucose metabolism: the Australian Diabetes, Obesity and Lifestyle (AusDiab) study","title-short":"Psychosocial stress predicts abnormal glucose metabolism","volume":"46","author":[{"family":"Williams","given":"Emily D."},{"family":"Magliano","given":"Dianna J."},{"family":"Tapp","given":"Robyn J."},{"family":"Oldenburg","given":"Brian F."},{"family":"Shaw","given":"Jonathan E."}],"issued":{"date-parts":[["2013",8]]}}}],"schema":"https://github.com/citation-style-language/schema/raw/master/csl-citation.json"} </w:instrText>
+        <w:instrText xml:space="preserve"> ADDIN ZOTERO_ITEM CSL_CITATION {"citationID":"AFe5E0pt","properties":{"formattedCitation":"(7)","plainCitation":"(7)","noteIndex":0},"citationItems":[{"id":"DNVojJss/k2htEuhp","uris":["http://zotero.org/users/2695081/items/VA42I7LX"],"itemData":{"id":1807,"type":"article-journal","abstract":"BACKGROUND: The evidence supporting a relationship between stress and diabetes has been inconsistent.\nPURPOSE: This study examined the effects of stress on abnormal glucose metabolism, using a population-based sample of 3,759, with normoglycemia at baseline, from the Australian Diabetes, Obesity and Lifestyle study.\nMETHODS: Perceived stress and stressful life events were measured at baseline, with health behavior and anthropometric information also collected. Oral glucose tolerance tests were undertaken at baseline and 5-year follow-up. The primary outcome was the development of abnormal glucose metabolism (impaired fasting glucose, impaired glucose tolerance, and type 2 diabetes), according to WHO 1999 criteria.\nRESULTS: Perceived stress predicted incident abnormal glucose metabolism in women but not men, after multivariate adjustment. Life events showed an inconsistent relationship with abnormal glucose metabolism.\nCONCLUSIONS: Perceived stress predicted abnormal glucose metabolism in women. Healthcare professionals should consider psychosocial adversity when assessing risk factor profiles for the development of diabetes.","container-title":"Annals of Behavioral Medicine: A Publication of the Society of Behavioral Medicine","DOI":"10.1007/s12160-013-9473-y","ISSN":"1532-4796","issue":"1","journalAbbreviation":"Ann Behav Med","language":"eng","note":"PMID: 23389687","page":"62-72","source":"PubMed","title":"Psychosocial stress predicts abnormal glucose metabolism: the Australian Diabetes, Obesity and Lifestyle (AusDiab) study","title-short":"Psychosocial stress predicts abnormal glucose metabolism","volume":"46","author":[{"family":"Williams","given":"Emily D."},{"family":"Magliano","given":"Dianna J."},{"family":"Tapp","given":"Robyn J."},{"family":"Oldenburg","given":"Brian F."},{"family":"Shaw","given":"Jonathan E."}],"issued":{"date-parts":[["2013",8]]}}}],"schema":"https://github.com/citation-style-language/schema/raw/master/csl-citation.json"} </w:instrText>
       </w:r>
       <w:r>
         <w:fldChar w:fldCharType="separate"/>
@@ -295,7 +295,7 @@
         <w:fldChar w:fldCharType="begin"/>
       </w:r>
       <w:r>
-        <w:instrText xml:space="preserve"> ADDIN ZOTERO_ITEM CSL_CITATION {"citationID":"qb5nzjnv","properties":{"formattedCitation":"(8)","plainCitation":"(8)","noteIndex":0},"citationItems":[{"id":"9zI9GZ7V/5X9iGiQc","uris":["http://zotero.org/users/2695081/items/QVI959H8"],"itemData":{"id":1810,"type":"article-journal","abstract":"PURPOSE: Type 2 diabetes mellitus (T2DM), a metabolic disorder, remains associated with a physiological impairment affecting large populations worldwide. Onset of T2DM is multifactorial where obesity and abnormal basal metabolic rate are considered most critical. Of people diagnosed with T2DM, about 80% are also obese. It is also reported that obese individuals have an increased odds of developing depression, whereas T2DM is estimated to increase the incidence by two-fold. The preponderance of research data demonstrates that T2DM alters the serum level of cortisol and adiponectin which are known to be associated with neuronal physiology. The study explored, how a metabolic disorder like T2DM is linked with the altered plasma level of cortisol and adiponectin, the risk factors for stress and depression.\nPATIENTS AND METHODS: A cross-sectional population study was conducted in T2DM patients using a bimodal approach. First approach used questionnaires, (1) Patient Health Questionnaire (PHQ-9) and (2) Stress Coping Inventory Questionnaire (SCQ) to assess signs and symptoms of depression and stress, respectively, in T2DM patients. In the second approach, robust biochemical analysis was conducted for serum adiponectin and cortisol levels.\nRESULTS: An association of T2DM in stress and depression was evaluated in 158 subjects (105 T2DM obese patients and 53 healthy controls). A lower PHQ-9 score and adiponectin levels were seen in T2DM obese patients compared to healthy controls (p&lt;0.05). Further, results also depicted a lower adiponectin levels in T2DM obese patients with depression compared to T2DM obese patients without depression (p&lt;0.05). The study did not find a significant difference in cortisol serum levels among the T2DM and control groups. However, a higher level of serum cortisol was reported in T2DM obese patients with depression over those T2DM obese patients who lacked depression (p&lt;0.05).\nCONCLUSION: The findings suggest that T2DM obese patients might have a higher risk of developing stress and depression. Further, biochemical parameters, adiponectin and cortisol, might be the potential biomarkers for T2DM and may help in early diagnosis of these comorbid conditions.","container-title":"Diabetes, Metabolic Syndrome and Obesity: Targets and Therapy","DOI":"10.2147/DMSO.S294555","ISSN":"1178-7007","journalAbbreviation":"Diabetes Metab Syndr Obes","language":"eng","note":"PMID: 33623406\nPMCID: PMC7896784","page":"705-717","source":"PubMed","title":"Evaluation of Stress and Associated Biochemical Changes in Patients with Type 2 Diabetes Mellitus and Obesity","volume":"14","author":[{"family":"Tyagi","given":"Kanchan"},{"family":"Agarwal","given":"Nidhi Bharal"},{"family":"Kapur","given":"Prem"},{"family":"Kohli","given":"Sunil"},{"family":"Jalali","given":"Rajinder K."}],"issued":{"date-parts":[["2021"]]}}}],"schema":"https://github.com/citation-style-language/schema/raw/master/csl-citation.json"} </w:instrText>
+        <w:instrText xml:space="preserve"> ADDIN ZOTERO_ITEM CSL_CITATION {"citationID":"qb5nzjnv","properties":{"formattedCitation":"(8)","plainCitation":"(8)","noteIndex":0},"citationItems":[{"id":"DNVojJss/IedZdPG7","uris":["http://zotero.org/users/2695081/items/QVI959H8"],"itemData":{"id":1810,"type":"article-journal","abstract":"PURPOSE: Type 2 diabetes mellitus (T2DM), a metabolic disorder, remains associated with a physiological impairment affecting large populations worldwide. Onset of T2DM is multifactorial where obesity and abnormal basal metabolic rate are considered most critical. Of people diagnosed with T2DM, about 80% are also obese. It is also reported that obese individuals have an increased odds of developing depression, whereas T2DM is estimated to increase the incidence by two-fold. The preponderance of research data demonstrates that T2DM alters the serum level of cortisol and adiponectin which are known to be associated with neuronal physiology. The study explored, how a metabolic disorder like T2DM is linked with the altered plasma level of cortisol and adiponectin, the risk factors for stress and depression.\nPATIENTS AND METHODS: A cross-sectional population study was conducted in T2DM patients using a bimodal approach. First approach used questionnaires, (1) Patient Health Questionnaire (PHQ-9) and (2) Stress Coping Inventory Questionnaire (SCQ) to assess signs and symptoms of depression and stress, respectively, in T2DM patients. In the second approach, robust biochemical analysis was conducted for serum adiponectin and cortisol levels.\nRESULTS: An association of T2DM in stress and depression was evaluated in 158 subjects (105 T2DM obese patients and 53 healthy controls). A lower PHQ-9 score and adiponectin levels were seen in T2DM obese patients compared to healthy controls (p&lt;0.05). Further, results also depicted a lower adiponectin levels in T2DM obese patients with depression compared to T2DM obese patients without depression (p&lt;0.05). The study did not find a significant difference in cortisol serum levels among the T2DM and control groups. However, a higher level of serum cortisol was reported in T2DM obese patients with depression over those T2DM obese patients who lacked depression (p&lt;0.05).\nCONCLUSION: The findings suggest that T2DM obese patients might have a higher risk of developing stress and depression. Further, biochemical parameters, adiponectin and cortisol, might be the potential biomarkers for T2DM and may help in early diagnosis of these comorbid conditions.","container-title":"Diabetes, Metabolic Syndrome and Obesity: Targets and Therapy","DOI":"10.2147/DMSO.S294555","ISSN":"1178-7007","journalAbbreviation":"Diabetes Metab Syndr Obes","language":"eng","note":"PMID: 33623406\nPMCID: PMC7896784","page":"705-717","source":"PubMed","title":"Evaluation of Stress and Associated Biochemical Changes in Patients with Type 2 Diabetes Mellitus and Obesity","volume":"14","author":[{"family":"Tyagi","given":"Kanchan"},{"family":"Agarwal","given":"Nidhi Bharal"},{"family":"Kapur","given":"Prem"},{"family":"Kohli","given":"Sunil"},{"family":"Jalali","given":"Rajinder K."}],"issued":{"date-parts":[["2021"]]}}}],"schema":"https://github.com/citation-style-language/schema/raw/master/csl-citation.json"} </w:instrText>
       </w:r>
       <w:r>
         <w:fldChar w:fldCharType="separate"/>
@@ -525,6 +525,38 @@
       <w:r>
         <w:t>their race as Other/Unknown/Declined, and groups with under 200 participants (American Indian, n=175; Pacific Islander, n=28).</w:t>
       </w:r>
+      <w:r>
+        <w:t xml:space="preserve">  Comorbidities were assessed using </w:t>
+      </w:r>
+      <w:proofErr w:type="spellStart"/>
+      <w:r>
+        <w:t>Elixhauser</w:t>
+      </w:r>
+      <w:proofErr w:type="spellEnd"/>
+      <w:r>
+        <w:t xml:space="preserve"> comorbidity indices computed from ICD9 and ICD19 codes e</w:t>
+      </w:r>
+      <w:r>
+        <w:fldChar w:fldCharType="begin"/>
+      </w:r>
+      <w:r>
+        <w:instrText xml:space="preserve"> ADDIN ZOTERO_ITEM CSL_CITATION {"citationID":"NpzuWU2y","properties":{"formattedCitation":"(10)","plainCitation":"(10)","noteIndex":0},"citationItems":[{"id":11488,"uris":["http://zotero.org/users/7317906/items/JMLH32L3"],"itemData":{"id":11488,"type":"article-journal","abstract":"OBJECTIVES: This study attempts to develop a comprehensive set of comorbidity measures for use with large administrative inpatient datasets.\nMETHODS: The study involved clinical and empirical review of comorbidity measures, development of a framework that attempts to segregate comorbidities from other aspects of the patient's condition, development of a comorbidity algorithm, and testing on heterogeneous and homogeneous patient groups. Data were drawn from all adult, nonmaternal inpatients from 438 acute care hospitals in California in 1992 (n = 1,779,167). Outcome measures were those commonly available in administrative data: length of stay, hospital charges, and in-hospital death.\nRESULTS: A comprehensive set of 30 comorbidity measures was developed. The comorbidities were associated with substantial increases in length of stay, hospital charges, and mortality both for heterogeneous and homogeneous disease groups. Several comorbidities are described that are important predictors of outcomes, yet commonly are not measured. These include mental disorders, drug and alcohol abuse, obesity, coagulopathy, weight loss, and fluid and electrolyte disorders.\nCONCLUSIONS: The comorbidities had independent effects on outcomes and probably should not be simplified as an index because they affect outcomes differently among different patient groups. The present method addresses some of the limitations of previous measures. It is based on a comprehensive approach to identifying comorbidities and separates them from the primary reason for hospitalization, resulting in an expanded set of comorbidities that easily is applied without further refinement to administrative data for a wide range of diseases.","container-title":"Medical Care","DOI":"10.1097/00005650-199801000-00004","ISSN":"0025-7079","issue":"1","journalAbbreviation":"Med Care","language":"eng","note":"PMID: 9431328","page":"8-27","source":"PubMed","title":"Comorbidity measures for use with administrative data","volume":"36","author":[{"family":"Elixhauser","given":"A."},{"family":"Steiner","given":"C."},{"family":"Harris","given":"D. R."},{"family":"Coffey","given":"R. M."}],"issued":{"date-parts":[["1998",1]]},"citation-key":"elixhauserComorbidityMeasuresUse1998"}}],"schema":"https://github.com/citation-style-language/schema/raw/master/csl-citation.json"} </w:instrText>
+      </w:r>
+      <w:r>
+        <w:fldChar w:fldCharType="separate"/>
+      </w:r>
+      <w:r>
+        <w:rPr>
+          <w:noProof/>
+        </w:rPr>
+        <w:t>(10)</w:t>
+      </w:r>
+      <w:r>
+        <w:fldChar w:fldCharType="end"/>
+      </w:r>
+      <w:r>
+        <w:t xml:space="preserve">.  For hypertension, both complicated and uncomplicated hypertension were combined into one group.  </w:t>
+      </w:r>
     </w:p>
     <w:p/>
     <w:p>
@@ -555,7 +587,7 @@
         <w:fldChar w:fldCharType="begin"/>
       </w:r>
       <w:r>
-        <w:instrText xml:space="preserve"> ADDIN ZOTERO_ITEM CSL_CITATION {"citationID":"0725YfVK","properties":{"formattedCitation":"(10)","plainCitation":"(10)","noteIndex":0},"citationItems":[{"id":8230,"uris":["http://zotero.org/users/7317906/items/3HZT7KXK"],"itemData":{"id":8230,"type":"document","note":"Citation Key: base\npublisher-place: Vienna, Austria","publisher":"R Foundation for Statistical Computing","title":"R: A Language and Environment for Statistical Computing","URL":"http://www.r-project.org/","author":[{"literal":"R Core Team"}],"accessed":{"date-parts":[["2010",10,22]]},"issued":{"date-parts":[["2019"]]},"citation-key":"base"}}],"schema":"https://github.com/citation-style-language/schema/raw/master/csl-citation.json"} </w:instrText>
+        <w:instrText xml:space="preserve"> ADDIN ZOTERO_ITEM CSL_CITATION {"citationID":"0725YfVK","properties":{"formattedCitation":"(11)","plainCitation":"(11)","noteIndex":0},"citationItems":[{"id":8230,"uris":["http://zotero.org/users/7317906/items/3HZT7KXK"],"itemData":{"id":8230,"type":"document","note":"Citation Key: base\npublisher-place: Vienna, Austria","publisher":"R Foundation for Statistical Computing","title":"R: A Language and Environment for Statistical Computing","URL":"http://www.r-project.org/","author":[{"literal":"R Core Team"}],"accessed":{"date-parts":[["2010",10,22]]},"issued":{"date-parts":[["2019"]]},"citation-key":"base"}}],"schema":"https://github.com/citation-style-language/schema/raw/master/csl-citation.json"} </w:instrText>
       </w:r>
       <w:r>
         <w:fldChar w:fldCharType="separate"/>
@@ -564,7 +596,7 @@
         <w:rPr>
           <w:noProof/>
         </w:rPr>
-        <w:t>(10)</w:t>
+        <w:t>(11)</w:t>
       </w:r>
       <w:r>
         <w:fldChar w:fldCharType="end"/>
@@ -798,6 +830,7 @@
         <w:pStyle w:val="Heading2"/>
       </w:pPr>
       <w:r>
+        <w:lastRenderedPageBreak/>
         <w:t xml:space="preserve">Perceived Stress Is </w:t>
       </w:r>
       <w:r>
@@ -819,7 +852,6 @@
     <w:p/>
     <w:p>
       <w:r>
-        <w:lastRenderedPageBreak/>
         <w:t>We next evaluated how obesity modified the stress-diabetes relationship in these participants.</w:t>
       </w:r>
       <w:r>
@@ -921,15 +953,13 @@
         <w:t>3</w:t>
       </w:r>
       <w:r>
-        <w:t xml:space="preserve">) but was </w:t>
-      </w:r>
-      <w:proofErr w:type="gramStart"/>
-      <w:r>
-        <w:t>increased  27</w:t>
-      </w:r>
-      <w:proofErr w:type="gramEnd"/>
-      <w:r>
-        <w:t>% in participants with obesity (p=</w:t>
+        <w:t xml:space="preserve">) but was increased </w:t>
+      </w:r>
+      <w:r>
+        <w:t>by</w:t>
+      </w:r>
+      <w:r>
+        <w:t xml:space="preserve"> 27% in participants with obesity (p=</w:t>
       </w:r>
       <w:r>
         <w:t>2.2 x 10</w:t>
@@ -974,13 +1004,14 @@
         <w:t xml:space="preserve">  </w:t>
       </w:r>
       <w:r>
-        <w:t xml:space="preserve">After these adjustments, we estimated the </w:t>
-      </w:r>
-      <w:proofErr w:type="spellStart"/>
-      <w:r>
-        <w:t>the</w:t>
-      </w:r>
-      <w:proofErr w:type="spellEnd"/>
+        <w:t xml:space="preserve">After these adjustments, we estimated </w:t>
+      </w:r>
+      <w:r>
+        <w:t>that</w:t>
+      </w:r>
+      <w:r>
+        <w:t xml:space="preserve"> the</w:t>
+      </w:r>
       <w:r>
         <w:t xml:space="preserve"> synergistic effect of perceived stress and obesity </w:t>
       </w:r>
@@ -988,7 +1019,13 @@
         <w:t>on</w:t>
       </w:r>
       <w:r>
-        <w:t xml:space="preserve"> type 2 diabetes risk by </w:t>
+        <w:t xml:space="preserve"> type 2 diabetes risk </w:t>
+      </w:r>
+      <w:r>
+        <w:t>is</w:t>
+      </w:r>
+      <w:r>
+        <w:t xml:space="preserve"> </w:t>
       </w:r>
       <w:r>
         <w:t>13</w:t>
@@ -1000,7 +1037,10 @@
         <w:t>3</w:t>
       </w:r>
       <w:r>
-        <w:t xml:space="preserve"> %</w:t>
+        <w:t>%</w:t>
+      </w:r>
+      <w:r>
+        <w:t xml:space="preserve"> (p=0.028)</w:t>
       </w:r>
       <w:r>
         <w:t>.</w:t>
@@ -1064,7 +1104,19 @@
         <w:pStyle w:val="Heading2"/>
       </w:pPr>
       <w:r>
-        <w:t>Perceived Stress Does Not Augment the Obesity Associated Prevalence of Hypertension, Cardiac Arrhythmia or Liver Disease</w:t>
+        <w:t>Perceived Stress Does Not</w:t>
+      </w:r>
+      <w:r>
+        <w:t xml:space="preserve"> Significantly</w:t>
+      </w:r>
+      <w:r>
+        <w:t xml:space="preserve"> Augment the Obesity Associated Prevalence of Hypertension, </w:t>
+      </w:r>
+      <w:r>
+        <w:t xml:space="preserve">Congestive Heart Failure, </w:t>
+      </w:r>
+      <w:r>
+        <w:t>Cardiac Arrhythmia or Liver Disease</w:t>
       </w:r>
       <w:r>
         <w:t xml:space="preserve"> </w:t>
@@ -1073,14 +1125,15 @@
     <w:p/>
     <w:p>
       <w:r>
-        <w:t xml:space="preserve">Given the enhancement of obesity-associated diabetes prevalence in these participants, we then evaluated several other obesity and stress-linked chronic diseases using the same approach.  </w:t>
+        <w:lastRenderedPageBreak/>
+        <w:t xml:space="preserve">Given the enhancement of obesity-associated diabetes prevalence in these participants, we then evaluated several other obesity and stress-linked chronic diseases using the same approach.  In </w:t>
       </w:r>
       <w:commentRangeStart w:id="1"/>
       <w:r>
-        <w:t xml:space="preserve">In Table </w:t>
-      </w:r>
-      <w:r>
-        <w:t>3 we describe the raw and adjusted associations between obesity and stress on hypertension, arrhythmia and liver disease.</w:t>
+        <w:t xml:space="preserve">Table </w:t>
+      </w:r>
+      <w:r>
+        <w:t xml:space="preserve">3 </w:t>
       </w:r>
       <w:commentRangeEnd w:id="1"/>
       <w:r>
@@ -1090,10 +1143,46 @@
         <w:commentReference w:id="1"/>
       </w:r>
       <w:r>
-        <w:t xml:space="preserve">  These data suggest that enhanced risk of obesity and perceived stress on diabetes is not </w:t>
-      </w:r>
-      <w:r>
-        <w:t>broadly true across these other conditions.</w:t>
+        <w:t>we describe the raw and adjusted associations between obesity and stress on hypertension, arrhythmia and liver disease.</w:t>
+      </w:r>
+      <w:r>
+        <w:t xml:space="preserve">  </w:t>
+      </w:r>
+      <w:r>
+        <w:t xml:space="preserve">Consistent with previous reports, we show that obesity is associated with the increased prevalence of each of these co-morbidities with relative risks ranging from 9.1 % increased cardiac arrythmia to 2.4x increased prevalence of hypertension after adjusting for confounders.  Similarly, perceived stress was also associated with the increased risk of each of these diseases (9.1% increased risk for arrythmia to </w:t>
+      </w:r>
+      <w:r>
+        <w:t>30% increased risk of congestive heart failure).  When we examined the interaction between perceived stress and obesity, none of these conditions had significant interactions in either the crude or adjusted models.  T</w:t>
+      </w:r>
+      <w:r>
+        <w:t xml:space="preserve">hese data suggest that </w:t>
+      </w:r>
+      <w:r>
+        <w:t xml:space="preserve">the </w:t>
+      </w:r>
+      <w:r>
+        <w:t>augmented</w:t>
+      </w:r>
+      <w:r>
+        <w:t xml:space="preserve"> risk of obesity </w:t>
+      </w:r>
+      <w:r>
+        <w:t>coupled with elevated</w:t>
+      </w:r>
+      <w:r>
+        <w:t xml:space="preserve"> perceived stress on diabetes is not </w:t>
+      </w:r>
+      <w:r>
+        <w:t>evident</w:t>
+      </w:r>
+      <w:r>
+        <w:t xml:space="preserve"> across these other conditions</w:t>
+      </w:r>
+      <w:r>
+        <w:t xml:space="preserve"> in this population</w:t>
+      </w:r>
+      <w:r>
+        <w:t>.</w:t>
       </w:r>
     </w:p>
     <w:p/>
@@ -1156,7 +1245,7 @@
         <w:fldChar w:fldCharType="begin"/>
       </w:r>
       <w:r>
-        <w:instrText xml:space="preserve"> ADDIN ZOTERO_ITEM CSL_CITATION {"citationID":"uEUVukVw","properties":{"formattedCitation":"(11)","plainCitation":"(11)","noteIndex":0},"citationItems":[{"id":11485,"uris":["http://zotero.org/users/7317906/items/2VPGKQ72"],"itemData":{"id":11485,"type":"article-journal","abstract":"Weight stigma is related to lower levels of motivation to exercise in overweight and obesity. This study explored the nature of the relationship between stigma, motivation to exercise and physical activity while accounting for gender differences. Participants were 439 adults with overweight and obesity (mean body mass index = 32.18 kg/m2, standard deviation = 4.09 kg/m2). Females reported significantly more frequent stigma experiences than males. Mediation models found a conditional direct effect of weight stigma for males, with higher frequency of stigma experiences related to higher levels of walking and vigorous physical activity. A conditional indirect effect was found for females for walking, moderate and vigorous levels of physical activity, with higher weight stigma related to lower autonomous motivation, and lower levels of physical activity. Findings suggest that males and females are affected differently by weight-stigma experiences.","container-title":"Health Psychology Open","DOI":"10.1177/2055102918759691","ISSN":"2055-1029","issue":"1","journalAbbreviation":"Health Psychol Open","note":"PMID: 29552349\nPMCID: PMC5846936","page":"2055102918759691","source":"PubMed Central","title":"Gender differences in the relationship of weight-based stigmatisation with motivation to exercise and physical activity in overweight individuals","volume":"5","author":[{"family":"Sattler","given":"Krystal M"},{"family":"Deane","given":"Frank P"},{"family":"Tapsell","given":"Linda"},{"family":"Kelly","given":"Peter J"}],"issued":{"date-parts":[["2018",3,8]]},"citation-key":"sattlerGenderDifferencesRelationship2018"}}],"schema":"https://github.com/citation-style-language/schema/raw/master/csl-citation.json"} </w:instrText>
+        <w:instrText xml:space="preserve"> ADDIN ZOTERO_ITEM CSL_CITATION {"citationID":"uEUVukVw","properties":{"formattedCitation":"(12)","plainCitation":"(12)","noteIndex":0},"citationItems":[{"id":11485,"uris":["http://zotero.org/users/7317906/items/2VPGKQ72"],"itemData":{"id":11485,"type":"article-journal","abstract":"Weight stigma is related to lower levels of motivation to exercise in overweight and obesity. This study explored the nature of the relationship between stigma, motivation to exercise and physical activity while accounting for gender differences. Participants were 439 adults with overweight and obesity (mean body mass index = 32.18 kg/m2, standard deviation = 4.09 kg/m2). Females reported significantly more frequent stigma experiences than males. Mediation models found a conditional direct effect of weight stigma for males, with higher frequency of stigma experiences related to higher levels of walking and vigorous physical activity. A conditional indirect effect was found for females for walking, moderate and vigorous levels of physical activity, with higher weight stigma related to lower autonomous motivation, and lower levels of physical activity. Findings suggest that males and females are affected differently by weight-stigma experiences.","container-title":"Health Psychology Open","DOI":"10.1177/2055102918759691","ISSN":"2055-1029","issue":"1","journalAbbreviation":"Health Psychol Open","note":"PMID: 29552349\nPMCID: PMC5846936","page":"2055102918759691","source":"PubMed Central","title":"Gender differences in the relationship of weight-based stigmatisation with motivation to exercise and physical activity in overweight individuals","volume":"5","author":[{"family":"Sattler","given":"Krystal M"},{"family":"Deane","given":"Frank P"},{"family":"Tapsell","given":"Linda"},{"family":"Kelly","given":"Peter J"}],"issued":{"date-parts":[["2018",3,8]]},"citation-key":"sattlerGenderDifferencesRelationship2018"}}],"schema":"https://github.com/citation-style-language/schema/raw/master/csl-citation.json"} </w:instrText>
       </w:r>
       <w:r>
         <w:fldChar w:fldCharType="separate"/>
@@ -1165,7 +1254,7 @@
         <w:rPr>
           <w:noProof/>
         </w:rPr>
-        <w:t>(11)</w:t>
+        <w:t>(12)</w:t>
       </w:r>
       <w:r>
         <w:fldChar w:fldCharType="end"/>
@@ -1199,7 +1288,7 @@
         <w:fldChar w:fldCharType="begin"/>
       </w:r>
       <w:r>
-        <w:instrText xml:space="preserve"> ADDIN ZOTERO_ITEM CSL_CITATION {"citationID":"7NoAOV3t","properties":{"formattedCitation":"(6)","plainCitation":"(6)","noteIndex":0},"citationItems":[{"id":"9zI9GZ7V/BhbSUH95","uris":["http://zotero.org/users/2695081/items/3FLNIKRN"],"itemData":{"id":"wYajtxYE/VWhUmnxe","type":"article-journal","abstract":"Psychosocial work stress has been linked to higher risk of type 2 diabetes (T2DM), with the effect being consistently higher among women than men. Also, work stress has been linked to prospective weight gain among obese men but weight loss among lean men. Here, we aimed to examine the interaction between work stress and obesity in relation to T2DM risk in a gender-specific manner. We studied 5,568 white middle-aged men and women in the Whitehall II study, who were free from diabetes at analysis baseline (1993). After 1993, diabetes was ascertained at six consecutive phases by an oral glucose tolerance test supplemented by self-reports. Cox regression analysis was used to assess the association between job strain (high job demands/low job control) and 18-year incident T2DM stratifying by BMI (BMI &lt;30 kg/m(2) vs. BMI ≥30 kg/m(2)). Overall, work stress was associated with incident T2DM among women (hazard ratio (HR) 1.41: 95% confidence intervals: 1.02; 1.95) but not among men (HR 0.87: 95% confidence interval 0.69; 1.11) (P(INTERACTION) = 0.017). Among men, work stress was associated with a lower risk of T2DM in nonobese (HR 0.70: 0.53; 0.93) but not in obese individuals (P(INTERACTION) = 0.17). Among women, work stress was associated with higher risk of T2DM in the obese (HR 2.01: 1.06; 3.92) but not in the nonobese (P(INTERACTION) = 0.005). Gender and body weight status play a critical role in determining the direction of the association between psychosocial stress and T2DM. The potential effect-modifying role of gender and obesity should not be ignored by future studies looking at stress-disease associations.","container-title":"Obesity (Silver Spring, Md.)","DOI":"10.1038/oby.2011.95","ISSN":"1930-739X","issue":"2","journalAbbreviation":"Obesity (Silver Spring)","language":"eng","note":"PMID: 21593804","page":"428-433","source":"PubMed","title":"Work stress, obesity and the risk of type 2 diabetes: gender-specific bidirectional effect in the Whitehall II study","title-short":"Work stress, obesity and the risk of type 2 diabetes","volume":"20","author":[{"family":"Heraclides","given":"Alexandros M."},{"family":"Chandola","given":"Tarani"},{"family":"Witte","given":"Daniel R."},{"family":"Brunner","given":"Eric J."}],"issued":{"date-parts":[["2012",2]]}}}],"schema":"https://github.com/citation-style-language/schema/raw/master/csl-citation.json"} </w:instrText>
+        <w:instrText xml:space="preserve"> ADDIN ZOTERO_ITEM CSL_CITATION {"citationID":"7NoAOV3t","properties":{"formattedCitation":"(6)","plainCitation":"(6)","noteIndex":0},"citationItems":[{"id":"DNVojJss/E9uQonSR","uris":["http://zotero.org/users/2695081/items/3FLNIKRN"],"itemData":{"id":"wYajtxYE/VWhUmnxe","type":"article-journal","abstract":"Psychosocial work stress has been linked to higher risk of type 2 diabetes (T2DM), with the effect being consistently higher among women than men. Also, work stress has been linked to prospective weight gain among obese men but weight loss among lean men. Here, we aimed to examine the interaction between work stress and obesity in relation to T2DM risk in a gender-specific manner. We studied 5,568 white middle-aged men and women in the Whitehall II study, who were free from diabetes at analysis baseline (1993). After 1993, diabetes was ascertained at six consecutive phases by an oral glucose tolerance test supplemented by self-reports. Cox regression analysis was used to assess the association between job strain (high job demands/low job control) and 18-year incident T2DM stratifying by BMI (BMI &lt;30 kg/m(2) vs. BMI ≥30 kg/m(2)). Overall, work stress was associated with incident T2DM among women (hazard ratio (HR) 1.41: 95% confidence intervals: 1.02; 1.95) but not among men (HR 0.87: 95% confidence interval 0.69; 1.11) (P(INTERACTION) = 0.017). Among men, work stress was associated with a lower risk of T2DM in nonobese (HR 0.70: 0.53; 0.93) but not in obese individuals (P(INTERACTION) = 0.17). Among women, work stress was associated with higher risk of T2DM in the obese (HR 2.01: 1.06; 3.92) but not in the nonobese (P(INTERACTION) = 0.005). Gender and body weight status play a critical role in determining the direction of the association between psychosocial stress and T2DM. The potential effect-modifying role of gender and obesity should not be ignored by future studies looking at stress-disease associations.","container-title":"Obesity (Silver Spring, Md.)","DOI":"10.1038/oby.2011.95","ISSN":"1930-739X","issue":"2","journalAbbreviation":"Obesity (Silver Spring)","language":"eng","note":"PMID: 21593804","page":"428-433","source":"PubMed","title":"Work stress, obesity and the risk of type 2 diabetes: gender-specific bidirectional effect in the Whitehall II study","title-short":"Work stress, obesity and the risk of type 2 diabetes","volume":"20","author":[{"family":"Heraclides","given":"Alexandros M."},{"family":"Chandola","given":"Tarani"},{"family":"Witte","given":"Daniel R."},{"family":"Brunner","given":"Eric J."}],"issued":{"date-parts":[["2012",2]]}}}],"schema":"https://github.com/citation-style-language/schema/raw/master/csl-citation.json"} </w:instrText>
       </w:r>
       <w:r>
         <w:fldChar w:fldCharType="separate"/>
@@ -1220,12 +1309,26 @@
     <w:p/>
     <w:p>
       <w:r>
-        <w:t>It is intriguing that the synergistic relationship between obesity and stress is most prominent in participants with type 2 diabetes, but is not evident for hypertension, liver disease, chronic pulmonary disease or heart failure.  Each of these had a substantial obesity-related or stress-related elevated risk</w:t>
+        <w:t xml:space="preserve">It is intriguing that the synergistic relationship between obesity and stress is most prominent in participants with type 2 diabetes, but is not evident for hypertension, liver disease, chronic pulmonary disease or </w:t>
+      </w:r>
+      <w:r>
+        <w:t xml:space="preserve">congestive </w:t>
+      </w:r>
+      <w:r>
+        <w:t xml:space="preserve">heart failure.  Each of these had a substantial obesity-related </w:t>
+      </w:r>
+      <w:r>
+        <w:t>and/</w:t>
+      </w:r>
+      <w:r>
+        <w:t>or stress-related elevated risk</w:t>
       </w:r>
       <w:r>
         <w:t xml:space="preserve">, but in our population these risk factors appeared additive rather than </w:t>
       </w:r>
       <w:commentRangeStart w:id="3"/>
+      <w:commentRangeStart w:id="4"/>
+      <w:commentRangeStart w:id="5"/>
       <w:r>
         <w:t>synergistic</w:t>
       </w:r>
@@ -1236,9 +1339,34 @@
         </w:rPr>
         <w:commentReference w:id="3"/>
       </w:r>
+      <w:commentRangeEnd w:id="4"/>
+      <w:r>
+        <w:rPr>
+          <w:rStyle w:val="CommentReference"/>
+        </w:rPr>
+        <w:commentReference w:id="4"/>
+      </w:r>
+      <w:commentRangeEnd w:id="5"/>
+      <w:r>
+        <w:rPr>
+          <w:rStyle w:val="CommentReference"/>
+        </w:rPr>
+        <w:commentReference w:id="5"/>
+      </w:r>
       <w:r>
         <w:t xml:space="preserve">.  </w:t>
       </w:r>
+      <w:r>
+        <w:t xml:space="preserve">This work suggests that elevated perceived stress is associated with each of </w:t>
+      </w:r>
+      <w:proofErr w:type="gramStart"/>
+      <w:r>
+        <w:t>these, but</w:t>
+      </w:r>
+      <w:proofErr w:type="gramEnd"/>
+      <w:r>
+        <w:t xml:space="preserve"> is only enhanced by obesity in the context of type 2 diabetes.</w:t>
+      </w:r>
     </w:p>
     <w:p/>
     <w:p>
@@ -1252,7 +1380,11 @@
         <w:t xml:space="preserve"> (either obesity or type 2 diabetes)</w:t>
       </w:r>
       <w:r>
-        <w:t xml:space="preserve"> could enhance perceived stress as a form of reverse causality.  We hypothesize that this is less likely, as it is only true for type 2 diabetes, but not other comorbidities tested.  It is also possible that the slightly elevated average BMI </w:t>
+        <w:t xml:space="preserve"> could enhance perceived stress as a form of reverse causality.  We hypothesize that </w:t>
+      </w:r>
+      <w:r>
+        <w:lastRenderedPageBreak/>
+        <w:t xml:space="preserve">this is less likely, as it is only true for type 2 diabetes, but not other comorbidities tested.  It is also possible that the slightly elevated average BMI </w:t>
       </w:r>
       <w:r>
         <w:t>in the participants with high PSS scores and obesity could imply that higher stress increases BMI, enhancing diabetes risk, consistent with the COBWEBS model</w:t>
@@ -1264,7 +1396,7 @@
         <w:fldChar w:fldCharType="begin"/>
       </w:r>
       <w:r>
-        <w:instrText xml:space="preserve"> ADDIN ZOTERO_ITEM CSL_CITATION {"citationID":"gUypn5QT","properties":{"formattedCitation":"(12)","plainCitation":"(12)","noteIndex":0},"citationItems":[{"id":1482,"uris":["http://zotero.org/users/7317906/items/5I96XRCC"],"itemData":{"id":1482,"type":"article-journal","abstract":"Weight stigma is highly pervasive, but its consequences are understudied. This review draws from theory in social psychology, health psychology, and neuroendocrinology to construct an original, generative model called the cyclic obesity/weight-based stigma (COBWEBS) model. This model characterizes weight stigma as a \"vicious cycle\" - a positive feedback loop wherein weight stigma begets weight gain. This happens through increased eating behavior and increased cortisol secretion governed by behavioral, emotional, and physiological mechanisms, which are theorized to ultimately result in weight gain and difficulty of weight loss. The purpose of this review is to evaluate the existing literature for evidence supporting such a model, propose ways in which individuals enter, fight against, and exit the cycle, and conclude by outlining fruitful future directions in this nascent yet important area of research. © 2014 Elsevier Ltd.","container-title":"Appetite","DOI":"10.1016/j.appet.2014.06.108","ISSN":"10958304","note":"PMID: 24997407\npublisher: Elsevier Ltd\nCitation Key: Tomiyama2014a\nISBN: 1095-8304 (Electronic)\\r0195-6663 (Linking)","page":"8-15","title":"Weight stigma is stressful. A review of evidence for the cyclic Obesity/weight-based stigma model","volume":"82","author":[{"family":"Tomiyama","given":"A. Janet"}],"issued":{"date-parts":[["2014"]]},"citation-key":"Tomiyama2014a"}}],"schema":"https://github.com/citation-style-language/schema/raw/master/csl-citation.json"} </w:instrText>
+        <w:instrText xml:space="preserve"> ADDIN ZOTERO_ITEM CSL_CITATION {"citationID":"gUypn5QT","properties":{"formattedCitation":"(13)","plainCitation":"(13)","noteIndex":0},"citationItems":[{"id":1482,"uris":["http://zotero.org/users/7317906/items/5I96XRCC"],"itemData":{"id":1482,"type":"article-journal","abstract":"Weight stigma is highly pervasive, but its consequences are understudied. This review draws from theory in social psychology, health psychology, and neuroendocrinology to construct an original, generative model called the cyclic obesity/weight-based stigma (COBWEBS) model. This model characterizes weight stigma as a \"vicious cycle\" - a positive feedback loop wherein weight stigma begets weight gain. This happens through increased eating behavior and increased cortisol secretion governed by behavioral, emotional, and physiological mechanisms, which are theorized to ultimately result in weight gain and difficulty of weight loss. The purpose of this review is to evaluate the existing literature for evidence supporting such a model, propose ways in which individuals enter, fight against, and exit the cycle, and conclude by outlining fruitful future directions in this nascent yet important area of research. © 2014 Elsevier Ltd.","container-title":"Appetite","DOI":"10.1016/j.appet.2014.06.108","ISSN":"10958304","note":"PMID: 24997407\npublisher: Elsevier Ltd\nCitation Key: Tomiyama2014a\nISBN: 1095-8304 (Electronic)\\r0195-6663 (Linking)","page":"8-15","title":"Weight stigma is stressful. A review of evidence for the cyclic Obesity/weight-based stigma model","volume":"82","author":[{"family":"Tomiyama","given":"A. Janet"}],"issued":{"date-parts":[["2014"]]},"citation-key":"Tomiyama2014a"}}],"schema":"https://github.com/citation-style-language/schema/raw/master/csl-citation.json"} </w:instrText>
       </w:r>
       <w:r>
         <w:fldChar w:fldCharType="separate"/>
@@ -1273,7 +1405,7 @@
         <w:rPr>
           <w:noProof/>
         </w:rPr>
-        <w:t>(12)</w:t>
+        <w:t>(13)</w:t>
       </w:r>
       <w:r>
         <w:fldChar w:fldCharType="end"/>
@@ -1297,17 +1429,13 @@
     <w:p/>
     <w:p>
       <w:r>
-        <w:t xml:space="preserve">There are several important strengths to this work including a large sample size, consistent and validated measures of perceived stress and well documented disease and sociodemographic factors.  To our knowledge this is the first report of perceived stress enhancing obesity-related </w:t>
-      </w:r>
-      <w:r>
-        <w:lastRenderedPageBreak/>
-        <w:t xml:space="preserve">diabetes risk, and consistent with the Whitehall II studies showing similar effects for job-related stress </w:t>
+        <w:t xml:space="preserve">There are several important strengths to this work including a large sample size, consistent and validated measures of perceived stress and well documented disease and sociodemographic factors.  To our knowledge this is the first report of perceived stress enhancing obesity-related diabetes risk, and consistent with the Whitehall II studies showing similar effects for job-related stress </w:t>
       </w:r>
       <w:r>
         <w:fldChar w:fldCharType="begin"/>
       </w:r>
       <w:r>
-        <w:instrText xml:space="preserve"> ADDIN ZOTERO_ITEM CSL_CITATION {"citationID":"tmOtPEdO","properties":{"formattedCitation":"(6)","plainCitation":"(6)","noteIndex":0},"citationItems":[{"id":"9zI9GZ7V/BhbSUH95","uris":["http://zotero.org/users/2695081/items/3FLNIKRN"],"itemData":{"id":"9zI9GZ7V/BhbSUH95","type":"article-journal","abstract":"Psychosocial work stress has been linked to higher risk of type 2 diabetes (T2DM), with the effect being consistently higher among women than men. Also, work stress has been linked to prospective weight gain among obese men but weight loss among lean men. Here, we aimed to examine the interaction between work stress and obesity in relation to T2DM risk in a gender-specific manner. We studied 5,568 white middle-aged men and women in the Whitehall II study, who were free from diabetes at analysis baseline (1993). After 1993, diabetes was ascertained at six consecutive phases by an oral glucose tolerance test supplemented by self-reports. Cox regression analysis was used to assess the association between job strain (high job demands/low job control) and 18-year incident T2DM stratifying by BMI (BMI &lt;30 kg/m(2) vs. BMI ≥30 kg/m(2)). Overall, work stress was associated with incident T2DM among women (hazard ratio (HR) 1.41: 95% confidence intervals: 1.02; 1.95) but not among men (HR 0.87: 95% confidence interval 0.69; 1.11) (P(INTERACTION) = 0.017). Among men, work stress was associated with a lower risk of T2DM in nonobese (HR 0.70: 0.53; 0.93) but not in obese individuals (P(INTERACTION) = 0.17). Among women, work stress was associated with higher risk of T2DM in the obese (HR 2.01: 1.06; 3.92) but not in the nonobese (P(INTERACTION) = 0.005). Gender and body weight status play a critical role in determining the direction of the association between psychosocial stress and T2DM. The potential effect-modifying role of gender and obesity should not be ignored by future studies looking at stress-disease associations.","container-title":"Obesity (Silver Spring, Md.)","DOI":"10.1038/oby.2011.95","ISSN":"1930-739X","issue":"2","journalAbbreviation":"Obesity (Silver Spring)","language":"eng","note":"PMID: 21593804","page":"428-433","source":"PubMed","title":"Work stress, obesity and the risk of type 2 diabetes: gender-specific bidirectional effect in the Whitehall II study","title-short":"Work stress, obesity and the risk of type 2 diabetes","volume":"20","author":[{"family":"Heraclides","given":"Alexandros M."},{"family":"Chandola","given":"Tarani"},{"family":"Witte","given":"Daniel R."},{"family":"Brunner","given":"Eric J."}],"issued":{"date-parts":[["2012",2]]}}}],"schema":"https://github.com/citation-style-language/schema/raw/master/csl-citation.json"} </w:instrText>
+        <w:instrText xml:space="preserve"> ADDIN ZOTERO_ITEM CSL_CITATION {"citationID":"tmOtPEdO","properties":{"formattedCitation":"(6)","plainCitation":"(6)","noteIndex":0},"citationItems":[{"id":"DNVojJss/E9uQonSR","uris":["http://zotero.org/users/2695081/items/3FLNIKRN"],"itemData":{"id":"9zI9GZ7V/BhbSUH95","type":"article-journal","abstract":"Psychosocial work stress has been linked to higher risk of type 2 diabetes (T2DM), with the effect being consistently higher among women than men. Also, work stress has been linked to prospective weight gain among obese men but weight loss among lean men. Here, we aimed to examine the interaction between work stress and obesity in relation to T2DM risk in a gender-specific manner. We studied 5,568 white middle-aged men and women in the Whitehall II study, who were free from diabetes at analysis baseline (1993). After 1993, diabetes was ascertained at six consecutive phases by an oral glucose tolerance test supplemented by self-reports. Cox regression analysis was used to assess the association between job strain (high job demands/low job control) and 18-year incident T2DM stratifying by BMI (BMI &lt;30 kg/m(2) vs. BMI ≥30 kg/m(2)). Overall, work stress was associated with incident T2DM among women (hazard ratio (HR) 1.41: 95% confidence intervals: 1.02; 1.95) but not among men (HR 0.87: 95% confidence interval 0.69; 1.11) (P(INTERACTION) = 0.017). Among men, work stress was associated with a lower risk of T2DM in nonobese (HR 0.70: 0.53; 0.93) but not in obese individuals (P(INTERACTION) = 0.17). Among women, work stress was associated with higher risk of T2DM in the obese (HR 2.01: 1.06; 3.92) but not in the nonobese (P(INTERACTION) = 0.005). Gender and body weight status play a critical role in determining the direction of the association between psychosocial stress and T2DM. The potential effect-modifying role of gender and obesity should not be ignored by future studies looking at stress-disease associations.","container-title":"Obesity (Silver Spring, Md.)","DOI":"10.1038/oby.2011.95","ISSN":"1930-739X","issue":"2","journalAbbreviation":"Obesity (Silver Spring)","language":"eng","note":"PMID: 21593804","page":"428-433","source":"PubMed","title":"Work stress, obesity and the risk of type 2 diabetes: gender-specific bidirectional effect in the Whitehall II study","title-short":"Work stress, obesity and the risk of type 2 diabetes","volume":"20","author":[{"family":"Heraclides","given":"Alexandros M."},{"family":"Chandola","given":"Tarani"},{"family":"Witte","given":"Daniel R."},{"family":"Brunner","given":"Eric J."}],"issued":{"date-parts":[["2012",2]]}}}],"schema":"https://github.com/citation-style-language/schema/raw/master/csl-citation.json"} </w:instrText>
       </w:r>
       <w:r>
         <w:fldChar w:fldCharType="separate"/>
@@ -1339,7 +1467,7 @@
         <w:fldChar w:fldCharType="begin"/>
       </w:r>
       <w:r>
-        <w:instrText xml:space="preserve"> ADDIN ZOTERO_ITEM CSL_CITATION {"citationID":"60pJs55V","properties":{"formattedCitation":"(4, 5)","plainCitation":"(4, 5)","noteIndex":0},"citationItems":[{"id":"9zI9GZ7V/tHgRCS7c","uris":["http://zotero.org/users/2695081/items/ABIIT6F6"],"itemData":{"id":"9zI9GZ7V/tHgRCS7c","type":"article-journal","container-title":"Endocrinology","DOI":"10.1210/en.2018-00147","ISSN":"1945-7170","issue":"6","language":"en","page":"2275-2287","source":"DOI.org (Crossref)","title":"Glucocorticoid-Induced Metabolic Disturbances Are Exacerbated in Obese Male Mice","volume":"159","author":[{"family":"Harvey","given":"Innocence"},{"family":"Stephenson","given":"Erin J"},{"family":"Redd","given":"JeAnna R"},{"family":"Tran","given":"Quynh T"},{"family":"Hochberg","given":"Irit"},{"family":"Qi","given":"Nathan"},{"family":"Bridges","given":"Dave"}],"issued":{"date-parts":[["2018",6,1]]}}},{"id":"9zI9GZ7V/3nlM5iac","uris":["http://zotero.org/users/2695081/items/455VREYL"],"itemData":{"id":"9zI9GZ7V/3nlM5iac","type":"article-journal","abstract":"Glucocorticoids promote muscle atrophy by inducing a class of proteins called atrogenes, resulting in reductions in muscle size and strength. In this work, we evaluated whether a mouse model with pre-existing diet-induced obesity had altered glucocorticoid responsiveness. We observed that all animals treated with the synthetic glucocorticoid dexamethasone had reduced strength, but that obesity exacerbated this effect. These changes were concordant with more pronounced reductions in muscle size, particularly in Type II muscle fibers, and potentiated induction of atrogene expression in the obese mice relative to lean mice. Furthermore, we show that the reductions in lean mass do not fully account for the dexamethasone-induced insulin resistance observed in these mice. Together, these data suggest that obesity potentiates glucocorticoid-induced muscle atrophy.","container-title":"Biomedicines","DOI":"10.3390/biomedicines8100420","ISSN":"2227-9059","issue":"10","journalAbbreviation":"Biomedicines","language":"en","page":"420","source":"DOI.org (Crossref)","title":"Obesity Augments Glucocorticoid-Dependent Muscle Atrophy in Male C57BL/6J Mice","volume":"8","author":[{"family":"Gunder","given":"Laura C."},{"family":"Harvey","given":"Innocence"},{"family":"Redd","given":"JeAnna R."},{"family":"Davis","given":"Carol S."},{"family":"AL-Tamimi","given":"Ayat"},{"family":"Brooks","given":"Susan V."},{"family":"Bridges","given":"Dave"}],"issued":{"date-parts":[["2020",10,15]]}}}],"schema":"https://github.com/citation-style-language/schema/raw/master/csl-citation.json"} </w:instrText>
+        <w:instrText xml:space="preserve"> ADDIN ZOTERO_ITEM CSL_CITATION {"citationID":"60pJs55V","properties":{"formattedCitation":"(4, 5)","plainCitation":"(4, 5)","noteIndex":0},"citationItems":[{"id":"DNVojJss/JUJ2TG0Q","uris":["http://zotero.org/users/2695081/items/ABIIT6F6"],"itemData":{"id":"9zI9GZ7V/tHgRCS7c","type":"article-journal","container-title":"Endocrinology","DOI":"10.1210/en.2018-00147","ISSN":"1945-7170","issue":"6","language":"en","page":"2275-2287","source":"DOI.org (Crossref)","title":"Glucocorticoid-Induced Metabolic Disturbances Are Exacerbated in Obese Male Mice","volume":"159","author":[{"family":"Harvey","given":"Innocence"},{"family":"Stephenson","given":"Erin J"},{"family":"Redd","given":"JeAnna R"},{"family":"Tran","given":"Quynh T"},{"family":"Hochberg","given":"Irit"},{"family":"Qi","given":"Nathan"},{"family":"Bridges","given":"Dave"}],"issued":{"date-parts":[["2018",6,1]]}}},{"id":"DNVojJss/6l3QDrs3","uris":["http://zotero.org/users/2695081/items/455VREYL"],"itemData":{"id":"9zI9GZ7V/3nlM5iac","type":"article-journal","abstract":"Glucocorticoids promote muscle atrophy by inducing a class of proteins called atrogenes, resulting in reductions in muscle size and strength. In this work, we evaluated whether a mouse model with pre-existing diet-induced obesity had altered glucocorticoid responsiveness. We observed that all animals treated with the synthetic glucocorticoid dexamethasone had reduced strength, but that obesity exacerbated this effect. These changes were concordant with more pronounced reductions in muscle size, particularly in Type II muscle fibers, and potentiated induction of atrogene expression in the obese mice relative to lean mice. Furthermore, we show that the reductions in lean mass do not fully account for the dexamethasone-induced insulin resistance observed in these mice. Together, these data suggest that obesity potentiates glucocorticoid-induced muscle atrophy.","container-title":"Biomedicines","DOI":"10.3390/biomedicines8100420","ISSN":"2227-9059","issue":"10","journalAbbreviation":"Biomedicines","language":"en","page":"420","source":"DOI.org (Crossref)","title":"Obesity Augments Glucocorticoid-Dependent Muscle Atrophy in Male C57BL/6J Mice","volume":"8","author":[{"family":"Gunder","given":"Laura C."},{"family":"Harvey","given":"Innocence"},{"family":"Redd","given":"JeAnna R."},{"family":"Davis","given":"Carol S."},{"family":"AL-Tamimi","given":"Ayat"},{"family":"Brooks","given":"Susan V."},{"family":"Bridges","given":"Dave"}],"issued":{"date-parts":[["2020",10,15]]}}}],"schema":"https://github.com/citation-style-language/schema/raw/master/csl-citation.json"} </w:instrText>
       </w:r>
       <w:r>
         <w:fldChar w:fldCharType="separate"/>
@@ -1360,7 +1488,7 @@
         <w:fldChar w:fldCharType="begin"/>
       </w:r>
       <w:r>
-        <w:instrText xml:space="preserve"> ADDIN ZOTERO_ITEM CSL_CITATION {"citationID":"zW7FcRAf","properties":{"formattedCitation":"(13)","plainCitation":"(13)","noteIndex":0},"citationItems":[{"id":4127,"uris":["http://zotero.org/users/7317906/items/2YQBFJRJ"],"itemData":{"id":4127,"type":"article-journal","abstract":"Glucocorticoids have major effects on adipose tissue metabolism. To study tissue mRNA expression changes induced by chronic elevated endogenous glucocorticoids, we performed RNA sequencing on subcutaneous adipose tissue from patients with Cushing's disease (n=5) compared to patients with non-functioning pituitary adenomas (n=11). We found higher expression of transcripts involved in several metabolic pathways, including lipogenesis, proteolysis and glucose oxidation as well as decreased expression of transcripts involved in inflammation and protein synthesis. To further study this in a model system, we subjected mice to dexamethasone treatment for 12 weeks and analyzed their inguinal (subcutaneous) fat pads, which led to similar findings. Additionally, mice treated with dexamethasone showed drastic decreases in lean body mass as well as increased fat mass, further supporting the human transcriptomic data. These data provide insight to transcriptional changes that may be responsible for the co-morbidities associated with chronic elevations of glucocorticoids.","container-title":"Journal of Molecular Endocrinology","DOI":"10.1530/JME-15-0119","ISSN":"0952-5041","issue":"2","note":"PMID: 26150553\nCitation Key: Hochberg2015a","page":"81-94","title":"Gene expression changes in subcutaneous adipose tissue due to Cushing's disease","volume":"55","author":[{"family":"Hochberg","given":"Irit"},{"family":"Harvey","given":"Innocence"},{"family":"Tran","given":"Quynh T."},{"family":"Stephenson","given":"Erin J."},{"family":"Barkan","given":"Ariel L"},{"family":"Saltiel","given":"Alan R."},{"family":"Chandler","given":"William F."},{"family":"Bridges","given":"Dave"}],"issued":{"date-parts":[["2015",10]]},"citation-key":"Hochberg2015a"}}],"schema":"https://github.com/citation-style-language/schema/raw/master/csl-citation.json"} </w:instrText>
+        <w:instrText xml:space="preserve"> ADDIN ZOTERO_ITEM CSL_CITATION {"citationID":"zW7FcRAf","properties":{"formattedCitation":"(14)","plainCitation":"(14)","noteIndex":0},"citationItems":[{"id":4127,"uris":["http://zotero.org/users/7317906/items/2YQBFJRJ"],"itemData":{"id":4127,"type":"article-journal","abstract":"Glucocorticoids have major effects on adipose tissue metabolism. To study tissue mRNA expression changes induced by chronic elevated endogenous glucocorticoids, we performed RNA sequencing on subcutaneous adipose tissue from patients with Cushing's disease (n=5) compared to patients with non-functioning pituitary adenomas (n=11). We found higher expression of transcripts involved in several metabolic pathways, including lipogenesis, proteolysis and glucose oxidation as well as decreased expression of transcripts involved in inflammation and protein synthesis. To further study this in a model system, we subjected mice to dexamethasone treatment for 12 weeks and analyzed their inguinal (subcutaneous) fat pads, which led to similar findings. Additionally, mice treated with dexamethasone showed drastic decreases in lean body mass as well as increased fat mass, further supporting the human transcriptomic data. These data provide insight to transcriptional changes that may be responsible for the co-morbidities associated with chronic elevations of glucocorticoids.","container-title":"Journal of Molecular Endocrinology","DOI":"10.1530/JME-15-0119","ISSN":"0952-5041","issue":"2","note":"PMID: 26150553\nCitation Key: Hochberg2015a","page":"81-94","title":"Gene expression changes in subcutaneous adipose tissue due to Cushing's disease","volume":"55","author":[{"family":"Hochberg","given":"Irit"},{"family":"Harvey","given":"Innocence"},{"family":"Tran","given":"Quynh T."},{"family":"Stephenson","given":"Erin J."},{"family":"Barkan","given":"Ariel L"},{"family":"Saltiel","given":"Alan R."},{"family":"Chandler","given":"William F."},{"family":"Bridges","given":"Dave"}],"issued":{"date-parts":[["2015",10]]},"citation-key":"Hochberg2015a"}}],"schema":"https://github.com/citation-style-language/schema/raw/master/csl-citation.json"} </w:instrText>
       </w:r>
       <w:r>
         <w:fldChar w:fldCharType="separate"/>
@@ -1369,7 +1497,7 @@
         <w:rPr>
           <w:noProof/>
         </w:rPr>
-        <w:t>(13)</w:t>
+        <w:t>(14)</w:t>
       </w:r>
       <w:r>
         <w:fldChar w:fldCharType="end"/>
@@ -1398,7 +1526,21 @@
     <w:p/>
     <w:p>
       <w:r>
-        <w:t>We would like to thank the members of the Bridges lab for helpful discussions.  This work was supported by a pilot and feasibility grant from the Michigan Diabetes Research Center (</w:t>
+        <w:t>We would like to thank the members of the Bridges lab for helpful discussions</w:t>
+      </w:r>
+      <w:r>
+        <w:t xml:space="preserve">, and Matthew </w:t>
+      </w:r>
+      <w:proofErr w:type="spellStart"/>
+      <w:r>
+        <w:t>Zawistowski</w:t>
+      </w:r>
+      <w:proofErr w:type="spellEnd"/>
+      <w:r>
+        <w:t xml:space="preserve"> (University of Michigan) for help with defining ICD based disease status</w:t>
+      </w:r>
+      <w:r>
+        <w:t>.  This work was supported by a pilot and feasibility grant from the Michigan Diabetes Research Center (</w:t>
       </w:r>
       <w:r>
         <w:t xml:space="preserve">supported by </w:t>
@@ -1409,16 +1551,16 @@
       <w:r>
         <w:t xml:space="preserve"> to DB) and grants from the National Institutes of Diabetes and Digestive Kidney Diseases (DK107535 to </w:t>
       </w:r>
-      <w:commentRangeStart w:id="4"/>
+      <w:commentRangeStart w:id="6"/>
       <w:r>
         <w:t>DB</w:t>
       </w:r>
-      <w:commentRangeEnd w:id="4"/>
+      <w:commentRangeEnd w:id="6"/>
       <w:r>
         <w:rPr>
           <w:rStyle w:val="CommentReference"/>
         </w:rPr>
-        <w:commentReference w:id="4"/>
+        <w:commentReference w:id="6"/>
       </w:r>
       <w:r>
         <w:t>).</w:t>
@@ -2226,7 +2368,48 @@
           <w:rFonts w:ascii="Calibri" w:cs="Calibri"/>
         </w:rPr>
         <w:tab/>
-        <w:t>R Core Team. R: A Language and Environment for Statistical Computing. 2019.</w:t>
+      </w:r>
+      <w:proofErr w:type="spellStart"/>
+      <w:r>
+        <w:rPr>
+          <w:rFonts w:ascii="Calibri" w:cs="Calibri"/>
+        </w:rPr>
+        <w:t>Elixhauser</w:t>
+      </w:r>
+      <w:proofErr w:type="spellEnd"/>
+      <w:r>
+        <w:rPr>
+          <w:rFonts w:ascii="Calibri" w:cs="Calibri"/>
+        </w:rPr>
+        <w:t xml:space="preserve"> A, Steiner C, Harris DR, Coffey RM. Comorbidity measures for use with administrative data. </w:t>
+      </w:r>
+      <w:r>
+        <w:rPr>
+          <w:rFonts w:ascii="Calibri" w:cs="Calibri"/>
+          <w:i/>
+          <w:iCs/>
+        </w:rPr>
+        <w:t>Med Care</w:t>
+      </w:r>
+      <w:r>
+        <w:rPr>
+          <w:rFonts w:ascii="Calibri" w:cs="Calibri"/>
+        </w:rPr>
+        <w:t xml:space="preserve"> </w:t>
+      </w:r>
+      <w:proofErr w:type="gramStart"/>
+      <w:r>
+        <w:rPr>
+          <w:rFonts w:ascii="Calibri" w:cs="Calibri"/>
+        </w:rPr>
+        <w:t>1998;36:8</w:t>
+      </w:r>
+      <w:proofErr w:type="gramEnd"/>
+      <w:r>
+        <w:rPr>
+          <w:rFonts w:ascii="Calibri" w:cs="Calibri"/>
+        </w:rPr>
+        <w:t>–27.</w:t>
       </w:r>
     </w:p>
     <w:p>
@@ -2247,6 +2430,27 @@
           <w:rFonts w:ascii="Calibri" w:cs="Calibri"/>
         </w:rPr>
         <w:tab/>
+        <w:t>R Core Team. R: A Language and Environment for Statistical Computing. 2019.</w:t>
+      </w:r>
+    </w:p>
+    <w:p>
+      <w:pPr>
+        <w:pStyle w:val="Bibliography"/>
+        <w:rPr>
+          <w:rFonts w:ascii="Calibri" w:cs="Calibri"/>
+        </w:rPr>
+      </w:pPr>
+      <w:r>
+        <w:rPr>
+          <w:rFonts w:ascii="Calibri" w:cs="Calibri"/>
+        </w:rPr>
+        <w:t xml:space="preserve">12. </w:t>
+      </w:r>
+      <w:r>
+        <w:rPr>
+          <w:rFonts w:ascii="Calibri" w:cs="Calibri"/>
+        </w:rPr>
+        <w:tab/>
         <w:t xml:space="preserve">Sattler KM, Deane FP, Tapsell L, Kelly PJ. Gender differences in the relationship of weight-based </w:t>
       </w:r>
       <w:proofErr w:type="spellStart"/>
@@ -2303,7 +2507,7 @@
         <w:rPr>
           <w:rFonts w:ascii="Calibri" w:cs="Calibri"/>
         </w:rPr>
-        <w:t xml:space="preserve">12. </w:t>
+        <w:t xml:space="preserve">13. </w:t>
       </w:r>
       <w:r>
         <w:rPr>
@@ -2352,7 +2556,7 @@
         <w:rPr>
           <w:rFonts w:ascii="Calibri" w:cs="Calibri"/>
         </w:rPr>
-        <w:t xml:space="preserve">13. </w:t>
+        <w:t xml:space="preserve">14. </w:t>
       </w:r>
       <w:r>
         <w:rPr>
@@ -2406,6 +2610,7 @@
     </w:p>
     <w:p>
       <w:r>
+        <w:lastRenderedPageBreak/>
         <w:fldChar w:fldCharType="end"/>
       </w:r>
     </w:p>
@@ -2507,11 +2712,8 @@
       </w:r>
     </w:p>
   </w:comment>
-  <w:comment w:id="1" w:author="Dave Bridges" w:date="2024-04-12T12:26:00Z" w:initials="DB">
-    <w:p>
-      <w:pPr>
-        <w:pStyle w:val="CommentText"/>
-      </w:pPr>
+  <w:comment w:id="1" w:author="Dave Bridges" w:date="2024-04-26T10:23:00Z" w:initials="DB">
+    <w:p>
       <w:r>
         <w:rPr>
           <w:rStyle w:val="CommentReference"/>
@@ -2519,7 +2721,12 @@
         <w:annotationRef/>
       </w:r>
       <w:r>
-        <w:t>Write about this</w:t>
+        <w:rPr>
+          <w:color w:val="000000"/>
+          <w:sz w:val="20"/>
+          <w:szCs w:val="20"/>
+        </w:rPr>
+        <w:t>Should we present figures for these data as well?</w:t>
       </w:r>
     </w:p>
   </w:comment>
@@ -2881,7 +3088,42 @@
       </w:r>
     </w:p>
   </w:comment>
-  <w:comment w:id="4" w:author="Dave Bridges" w:date="2024-04-12T11:07:00Z" w:initials="DB">
+  <w:comment w:id="4" w:author="Dave Bridges" w:date="2024-04-26T10:17:00Z" w:initials="DB">
+    <w:p>
+      <w:r>
+        <w:rPr>
+          <w:rStyle w:val="CommentReference"/>
+        </w:rPr>
+        <w:annotationRef/>
+      </w:r>
+      <w:r>
+        <w:rPr>
+          <w:color w:val="000000"/>
+          <w:sz w:val="20"/>
+          <w:szCs w:val="20"/>
+        </w:rPr>
+        <w:t xml:space="preserve">For what it’s worth there was an effect of stress in the fully adjusted model (no stress x obesity interaction).  In the crude model the relative risk for stress was 2.7 +/- 2.9% (estimate +/- SE), but when the covariates was added it went up to 16 +/- 3%.  </w:t>
+      </w:r>
+    </w:p>
+  </w:comment>
+  <w:comment w:id="5" w:author="Dave Bridges" w:date="2024-04-26T10:20:00Z" w:initials="DB">
+    <w:p>
+      <w:r>
+        <w:rPr>
+          <w:rStyle w:val="CommentReference"/>
+        </w:rPr>
+        <w:annotationRef/>
+      </w:r>
+      <w:r>
+        <w:rPr>
+          <w:sz w:val="20"/>
+          <w:szCs w:val="20"/>
+        </w:rPr>
+        <w:t>It looks like the major confounder that made stress significant for hypertension was age</w:t>
+      </w:r>
+    </w:p>
+  </w:comment>
+  <w:comment w:id="6" w:author="Dave Bridges" w:date="2024-04-12T11:07:00Z" w:initials="DB">
     <w:p>
       <w:pPr>
         <w:pStyle w:val="CommentText"/>
@@ -2910,25 +3152,32 @@
 <file path=word/commentsExtended.xml><?xml version="1.0" encoding="utf-8"?>
 <w15:commentsEx xmlns:wpc="http://schemas.microsoft.com/office/word/2010/wordprocessingCanvas" xmlns:cx="http://schemas.microsoft.com/office/drawing/2014/chartex" xmlns:cx1="http://schemas.microsoft.com/office/drawing/2015/9/8/chartex" xmlns:cx2="http://schemas.microsoft.com/office/drawing/2015/10/21/chartex" xmlns:cx3="http://schemas.microsoft.com/office/drawing/2016/5/9/chartex" xmlns:cx4="http://schemas.microsoft.com/office/drawing/2016/5/10/chartex" xmlns:cx5="http://schemas.microsoft.com/office/drawing/2016/5/11/chartex" xmlns:cx6="http://schemas.microsoft.com/office/drawing/2016/5/12/chartex" xmlns:cx7="http://schemas.microsoft.com/office/drawing/2016/5/13/chartex" xmlns:cx8="http://schemas.microsoft.com/office/drawing/2016/5/14/chartex" xmlns:mc="http://schemas.openxmlformats.org/markup-compatibility/2006" xmlns:aink="http://schemas.microsoft.com/office/drawing/2016/ink" xmlns:am3d="http://schemas.microsoft.com/office/drawing/2017/model3d" xmlns:o="urn:schemas-microsoft-com:office:office" xmlns:oel="http://schemas.microsoft.com/office/2019/extlst" xmlns:r="http://schemas.openxmlformats.org/officeDocument/2006/relationships" xmlns:m="http://schemas.openxmlformats.org/officeDocument/2006/math" xmlns:v="urn:schemas-microsoft-com:vml" xmlns:wp14="http://schemas.microsoft.com/office/word/2010/wordprocessingDrawing" xmlns:wp="http://schemas.openxmlformats.org/drawingml/2006/wordprocessingDrawing" xmlns:w10="urn:schemas-microsoft-com:office:word" xmlns:w="http://schemas.openxmlformats.org/wordprocessingml/2006/main" xmlns:w14="http://schemas.microsoft.com/office/word/2010/wordml" xmlns:w15="http://schemas.microsoft.com/office/word/2012/wordml" xmlns:w16cex="http://schemas.microsoft.com/office/word/2018/wordml/cex" xmlns:w16cid="http://schemas.microsoft.com/office/word/2016/wordml/cid" xmlns:w16="http://schemas.microsoft.com/office/word/2018/wordml" xmlns:w16sdtdh="http://schemas.microsoft.com/office/word/2020/wordml/sdtdatahash" xmlns:w16se="http://schemas.microsoft.com/office/word/2015/wordml/symex" xmlns:wpg="http://schemas.microsoft.com/office/word/2010/wordprocessingGroup" xmlns:wpi="http://schemas.microsoft.com/office/word/2010/wordprocessingInk" xmlns:wne="http://schemas.microsoft.com/office/word/2006/wordml" xmlns:wps="http://schemas.microsoft.com/office/word/2010/wordprocessingShape" mc:Ignorable="w14 w15 w16se w16cid w16 w16cex w16sdtdh wp14">
   <w15:commentEx w15:paraId="10DFA24D" w15:done="0"/>
-  <w15:commentEx w15:paraId="620828B1" w15:done="0"/>
+  <w15:commentEx w15:paraId="0C81528E" w15:done="0"/>
   <w15:commentEx w15:paraId="6B0600C2" w15:done="0"/>
   <w15:commentEx w15:paraId="5C843C51" w15:done="0"/>
+  <w15:commentEx w15:paraId="40BDD707" w15:paraIdParent="5C843C51" w15:done="0"/>
+  <w15:commentEx w15:paraId="157B073D" w15:paraIdParent="5C843C51" w15:done="0"/>
   <w15:commentEx w15:paraId="4DAD4B88" w15:done="0"/>
 </w15:commentsEx>
 </file>
 
 <file path=word/commentsExtensible.xml><?xml version="1.0" encoding="utf-8"?>
 <w16cex:commentsExtensible xmlns:wpc="http://schemas.microsoft.com/office/word/2010/wordprocessingCanvas" xmlns:cx="http://schemas.microsoft.com/office/drawing/2014/chartex" xmlns:cx1="http://schemas.microsoft.com/office/drawing/2015/9/8/chartex" xmlns:cx2="http://schemas.microsoft.com/office/drawing/2015/10/21/chartex" xmlns:cx3="http://schemas.microsoft.com/office/drawing/2016/5/9/chartex" xmlns:cx4="http://schemas.microsoft.com/office/drawing/2016/5/10/chartex" xmlns:cx5="http://schemas.microsoft.com/office/drawing/2016/5/11/chartex" xmlns:cx6="http://schemas.microsoft.com/office/drawing/2016/5/12/chartex" xmlns:cx7="http://schemas.microsoft.com/office/drawing/2016/5/13/chartex" xmlns:cx8="http://schemas.microsoft.com/office/drawing/2016/5/14/chartex" xmlns:cr="http://schemas.microsoft.com/office/comments/2020/reactions" xmlns:mc="http://schemas.openxmlformats.org/markup-compatibility/2006" xmlns:aink="http://schemas.microsoft.com/office/drawing/2016/ink" xmlns:am3d="http://schemas.microsoft.com/office/drawing/2017/model3d" xmlns:o="urn:schemas-microsoft-com:office:office" xmlns:oel="http://schemas.microsoft.com/office/2019/extlst" xmlns:r="http://schemas.openxmlformats.org/officeDocument/2006/relationships" xmlns:m="http://schemas.openxmlformats.org/officeDocument/2006/math" xmlns:v="urn:schemas-microsoft-com:vml" xmlns:wp14="http://schemas.microsoft.com/office/word/2010/wordprocessingDrawing" xmlns:wp="http://schemas.openxmlformats.org/drawingml/2006/wordprocessingDrawing" xmlns:w10="urn:schemas-microsoft-com:office:word" xmlns:w="http://schemas.openxmlformats.org/wordprocessingml/2006/main" xmlns:w14="http://schemas.microsoft.com/office/word/2010/wordml" xmlns:w15="http://schemas.microsoft.com/office/word/2012/wordml" xmlns:w16cex="http://schemas.microsoft.com/office/word/2018/wordml/cex" xmlns:w16cid="http://schemas.microsoft.com/office/word/2016/wordml/cid" xmlns:w16="http://schemas.microsoft.com/office/word/2018/wordml" xmlns:w16sdtdh="http://schemas.microsoft.com/office/word/2020/wordml/sdtdatahash" xmlns:w16se="http://schemas.microsoft.com/office/word/2015/wordml/symex" xmlns:wpg="http://schemas.microsoft.com/office/word/2010/wordprocessingGroup" xmlns:wpi="http://schemas.microsoft.com/office/word/2010/wordprocessingInk" xmlns:wne="http://schemas.microsoft.com/office/word/2006/wordml" xmlns:wps="http://schemas.microsoft.com/office/word/2010/wordprocessingShape" mc:Ignorable="w14 w15 w16se w16cid w16 w16cex w16sdtdh cr wp14">
+  <w16cex:commentExtensible w16cex:durableId="110DF523" w16cex:dateUtc="2024-04-26T14:23:00Z"/>
   <w16cex:commentExtensible w16cex:durableId="2BE31721" w16cex:dateUtc="2024-04-24T13:48:00Z"/>
+  <w16cex:commentExtensible w16cex:durableId="6BE55EE1" w16cex:dateUtc="2024-04-26T14:17:00Z"/>
+  <w16cex:commentExtensible w16cex:durableId="383DF9F7" w16cex:dateUtc="2024-04-26T14:20:00Z"/>
 </w16cex:commentsExtensible>
 </file>
 
 <file path=word/commentsIds.xml><?xml version="1.0" encoding="utf-8"?>
 <w16cid:commentsIds xmlns:wpc="http://schemas.microsoft.com/office/word/2010/wordprocessingCanvas" xmlns:cx="http://schemas.microsoft.com/office/drawing/2014/chartex" xmlns:cx1="http://schemas.microsoft.com/office/drawing/2015/9/8/chartex" xmlns:cx2="http://schemas.microsoft.com/office/drawing/2015/10/21/chartex" xmlns:cx3="http://schemas.microsoft.com/office/drawing/2016/5/9/chartex" xmlns:cx4="http://schemas.microsoft.com/office/drawing/2016/5/10/chartex" xmlns:cx5="http://schemas.microsoft.com/office/drawing/2016/5/11/chartex" xmlns:cx6="http://schemas.microsoft.com/office/drawing/2016/5/12/chartex" xmlns:cx7="http://schemas.microsoft.com/office/drawing/2016/5/13/chartex" xmlns:cx8="http://schemas.microsoft.com/office/drawing/2016/5/14/chartex" xmlns:mc="http://schemas.openxmlformats.org/markup-compatibility/2006" xmlns:aink="http://schemas.microsoft.com/office/drawing/2016/ink" xmlns:am3d="http://schemas.microsoft.com/office/drawing/2017/model3d" xmlns:o="urn:schemas-microsoft-com:office:office" xmlns:oel="http://schemas.microsoft.com/office/2019/extlst" xmlns:r="http://schemas.openxmlformats.org/officeDocument/2006/relationships" xmlns:m="http://schemas.openxmlformats.org/officeDocument/2006/math" xmlns:v="urn:schemas-microsoft-com:vml" xmlns:wp14="http://schemas.microsoft.com/office/word/2010/wordprocessingDrawing" xmlns:wp="http://schemas.openxmlformats.org/drawingml/2006/wordprocessingDrawing" xmlns:w10="urn:schemas-microsoft-com:office:word" xmlns:w="http://schemas.openxmlformats.org/wordprocessingml/2006/main" xmlns:w14="http://schemas.microsoft.com/office/word/2010/wordml" xmlns:w15="http://schemas.microsoft.com/office/word/2012/wordml" xmlns:w16cex="http://schemas.microsoft.com/office/word/2018/wordml/cex" xmlns:w16cid="http://schemas.microsoft.com/office/word/2016/wordml/cid" xmlns:w16="http://schemas.microsoft.com/office/word/2018/wordml" xmlns:w16sdtdh="http://schemas.microsoft.com/office/word/2020/wordml/sdtdatahash" xmlns:w16se="http://schemas.microsoft.com/office/word/2015/wordml/symex" xmlns:wpg="http://schemas.microsoft.com/office/word/2010/wordprocessingGroup" xmlns:wpi="http://schemas.microsoft.com/office/word/2010/wordprocessingInk" xmlns:wne="http://schemas.microsoft.com/office/word/2006/wordml" xmlns:wps="http://schemas.microsoft.com/office/word/2010/wordprocessingShape" mc:Ignorable="w14 w15 w16se w16cid w16 w16cex w16sdtdh wp14">
   <w16cid:commentId w16cid:paraId="10DFA24D" w16cid:durableId="29411550"/>
-  <w16cid:commentId w16cid:paraId="620828B1" w16cid:durableId="29C3A6FB"/>
+  <w16cid:commentId w16cid:paraId="0C81528E" w16cid:durableId="110DF523"/>
   <w16cid:commentId w16cid:paraId="6B0600C2" w16cid:durableId="29C39F1A"/>
   <w16cid:commentId w16cid:paraId="5C843C51" w16cid:durableId="2BE31721"/>
+  <w16cid:commentId w16cid:paraId="40BDD707" w16cid:durableId="6BE55EE1"/>
+  <w16cid:commentId w16cid:paraId="157B073D" w16cid:durableId="383DF9F7"/>
   <w16cid:commentId w16cid:paraId="4DAD4B88" w16cid:durableId="29C39457"/>
 </w16cid:commentsIds>
 </file>

</xml_diff>

<commit_message>
Updated figures and manuscript
</commit_message>
<xml_diff>
--- a/manuscript/Obesity-Stress/Manuscript.docx
+++ b/manuscript/Obesity-Stress/Manuscript.docx
@@ -47,7 +47,19 @@
     <w:p/>
     <w:p>
       <w:r>
-        <w:t>Via multivariate modelling, accounting for differences in gender, age, race/ethnicity, and socioeconomic status we found that perceived stress enhanced type 2 prevalence by 13% above that expected by obesity or stress alone.</w:t>
+        <w:t xml:space="preserve">Chronic psychosocial stress and obesity are both risk factors for type 2 diabetes.  In this study we evaluated data from the Michigan Genomics Initiative, a hospital-based cohort for the associations between perceived stress, obesity and type 2 diabetes prevalence.  Perceived stress was positively associated with type 2 diabetes, and this effect was enhanced in participants with obesity.  </w:t>
+      </w:r>
+      <w:r>
+        <w:t>Via multivariate modelling</w:t>
+      </w:r>
+      <w:r>
+        <w:t xml:space="preserve"> of this cross-sectional association</w:t>
+      </w:r>
+      <w:r>
+        <w:t>, accounting for differences in gender, age, race/ethnicity, and socioeconomic status we found that perceived stress enhanced type 2 prevalence by 13% above that expected by obesity or stress alone.</w:t>
+      </w:r>
+      <w:r>
+        <w:t xml:space="preserve">  Similar analyses evaluating the effects of obesity and self-reported psychosocial stress demonstrated additive but not synergistic effects on other obesity related comorbidities. These data support the hypothesis that obesity and chronic psychosocial stress augment the risk of type 2 diabetes.</w:t>
       </w:r>
     </w:p>
     <w:p>
@@ -1627,35 +1639,7 @@
           <w:rFonts w:ascii="Calibri" w:cs="Calibri"/>
         </w:rPr>
         <w:tab/>
-        <w:t xml:space="preserve">Klein S, </w:t>
-      </w:r>
-      <w:proofErr w:type="spellStart"/>
-      <w:r>
-        <w:rPr>
-          <w:rFonts w:ascii="Calibri" w:cs="Calibri"/>
-        </w:rPr>
-        <w:t>Gastaldelli</w:t>
-      </w:r>
-      <w:proofErr w:type="spellEnd"/>
-      <w:r>
-        <w:rPr>
-          <w:rFonts w:ascii="Calibri" w:cs="Calibri"/>
-        </w:rPr>
-        <w:t xml:space="preserve"> A, </w:t>
-      </w:r>
-      <w:proofErr w:type="spellStart"/>
-      <w:r>
-        <w:rPr>
-          <w:rFonts w:ascii="Calibri" w:cs="Calibri"/>
-        </w:rPr>
-        <w:t>Yki-Järvinen</w:t>
-      </w:r>
-      <w:proofErr w:type="spellEnd"/>
-      <w:r>
-        <w:rPr>
-          <w:rFonts w:ascii="Calibri" w:cs="Calibri"/>
-        </w:rPr>
-        <w:t xml:space="preserve"> H, Scherer PE. Why does obesity cause diabetes? </w:t>
+        <w:t xml:space="preserve">Klein S, Gastaldelli A, Yki-Järvinen H, Scherer PE. Why does obesity cause diabetes? </w:t>
       </w:r>
       <w:r>
         <w:rPr>
@@ -1669,21 +1653,7 @@
         <w:rPr>
           <w:rFonts w:ascii="Calibri" w:cs="Calibri"/>
         </w:rPr>
-        <w:t xml:space="preserve"> </w:t>
-      </w:r>
-      <w:proofErr w:type="gramStart"/>
-      <w:r>
-        <w:rPr>
-          <w:rFonts w:ascii="Calibri" w:cs="Calibri"/>
-        </w:rPr>
-        <w:t>2022;34:11</w:t>
-      </w:r>
-      <w:proofErr w:type="gramEnd"/>
-      <w:r>
-        <w:rPr>
-          <w:rFonts w:ascii="Calibri" w:cs="Calibri"/>
-        </w:rPr>
-        <w:t>–20.</w:t>
+        <w:t xml:space="preserve"> 2022;34:11–20.</w:t>
       </w:r>
     </w:p>
     <w:p>
@@ -1704,96 +1674,105 @@
           <w:rFonts w:ascii="Calibri" w:cs="Calibri"/>
         </w:rPr>
         <w:tab/>
-      </w:r>
-      <w:proofErr w:type="spellStart"/>
-      <w:r>
-        <w:rPr>
-          <w:rFonts w:ascii="Calibri" w:cs="Calibri"/>
-        </w:rPr>
-        <w:t>Ingrosso</w:t>
-      </w:r>
-      <w:proofErr w:type="spellEnd"/>
-      <w:r>
-        <w:rPr>
-          <w:rFonts w:ascii="Calibri" w:cs="Calibri"/>
-        </w:rPr>
-        <w:t xml:space="preserve"> DMF, Primavera M, </w:t>
-      </w:r>
-      <w:proofErr w:type="spellStart"/>
-      <w:r>
-        <w:rPr>
-          <w:rFonts w:ascii="Calibri" w:cs="Calibri"/>
-        </w:rPr>
-        <w:t>Samvelyan</w:t>
-      </w:r>
-      <w:proofErr w:type="spellEnd"/>
-      <w:r>
-        <w:rPr>
-          <w:rFonts w:ascii="Calibri" w:cs="Calibri"/>
-        </w:rPr>
-        <w:t xml:space="preserve"> S, </w:t>
-      </w:r>
-      <w:proofErr w:type="spellStart"/>
-      <w:r>
-        <w:rPr>
-          <w:rFonts w:ascii="Calibri" w:cs="Calibri"/>
-        </w:rPr>
-        <w:t>Tagi</w:t>
-      </w:r>
-      <w:proofErr w:type="spellEnd"/>
-      <w:r>
-        <w:rPr>
-          <w:rFonts w:ascii="Calibri" w:cs="Calibri"/>
-        </w:rPr>
-        <w:t xml:space="preserve"> VM, Chiarelli F. Stress and Diabetes Mellitus: Pathogenetic Mechanisms and Clinical Outcome. </w:t>
-      </w:r>
-      <w:proofErr w:type="spellStart"/>
+        <w:t xml:space="preserve">Ingrosso DMF, Primavera M, Samvelyan S, Tagi VM, Chiarelli F. Stress and Diabetes Mellitus: Pathogenetic Mechanisms and Clinical Outcome. </w:t>
+      </w:r>
       <w:r>
         <w:rPr>
           <w:rFonts w:ascii="Calibri" w:cs="Calibri"/>
           <w:i/>
           <w:iCs/>
         </w:rPr>
-        <w:t>Horm</w:t>
-      </w:r>
-      <w:proofErr w:type="spellEnd"/>
+        <w:t>Horm Res Paediatr</w:t>
+      </w:r>
+      <w:r>
+        <w:rPr>
+          <w:rFonts w:ascii="Calibri" w:cs="Calibri"/>
+        </w:rPr>
+        <w:t xml:space="preserve"> 2023;96:34–43.</w:t>
+      </w:r>
+    </w:p>
+    <w:p>
+      <w:pPr>
+        <w:pStyle w:val="Bibliography"/>
+        <w:rPr>
+          <w:rFonts w:ascii="Calibri" w:cs="Calibri"/>
+        </w:rPr>
+      </w:pPr>
+      <w:r>
+        <w:rPr>
+          <w:rFonts w:ascii="Calibri" w:cs="Calibri"/>
+        </w:rPr>
+        <w:t xml:space="preserve">3. </w:t>
+      </w:r>
+      <w:r>
+        <w:rPr>
+          <w:rFonts w:ascii="Calibri" w:cs="Calibri"/>
+        </w:rPr>
+        <w:tab/>
+        <w:t xml:space="preserve">Tomiyama AJ. Stress and Obesity. </w:t>
+      </w:r>
       <w:r>
         <w:rPr>
           <w:rFonts w:ascii="Calibri" w:cs="Calibri"/>
           <w:i/>
           <w:iCs/>
         </w:rPr>
-        <w:t xml:space="preserve"> Res </w:t>
-      </w:r>
-      <w:proofErr w:type="spellStart"/>
+        <w:t>Annu Rev Psychol</w:t>
+      </w:r>
+      <w:r>
+        <w:rPr>
+          <w:rFonts w:ascii="Calibri" w:cs="Calibri"/>
+        </w:rPr>
+        <w:t xml:space="preserve"> 2019;70:703–718.</w:t>
+      </w:r>
+    </w:p>
+    <w:p>
+      <w:pPr>
+        <w:pStyle w:val="Bibliography"/>
+        <w:rPr>
+          <w:rFonts w:ascii="Calibri" w:cs="Calibri"/>
+        </w:rPr>
+      </w:pPr>
+      <w:r>
+        <w:rPr>
+          <w:rFonts w:ascii="Calibri" w:cs="Calibri"/>
+        </w:rPr>
+        <w:t xml:space="preserve">4. </w:t>
+      </w:r>
+      <w:r>
+        <w:rPr>
+          <w:rFonts w:ascii="Calibri" w:cs="Calibri"/>
+        </w:rPr>
+        <w:tab/>
+        <w:t xml:space="preserve">Harvey I, Stephenson EJ, Redd JR, </w:t>
+      </w:r>
       <w:r>
         <w:rPr>
           <w:rFonts w:ascii="Calibri" w:cs="Calibri"/>
           <w:i/>
           <w:iCs/>
         </w:rPr>
-        <w:t>Paediatr</w:t>
-      </w:r>
-      <w:proofErr w:type="spellEnd"/>
-      <w:r>
-        <w:rPr>
-          <w:rFonts w:ascii="Calibri" w:cs="Calibri"/>
-        </w:rPr>
-        <w:t xml:space="preserve"> </w:t>
-      </w:r>
-      <w:proofErr w:type="gramStart"/>
-      <w:r>
-        <w:rPr>
-          <w:rFonts w:ascii="Calibri" w:cs="Calibri"/>
-        </w:rPr>
-        <w:t>2023;96:34</w:t>
-      </w:r>
-      <w:proofErr w:type="gramEnd"/>
-      <w:r>
-        <w:rPr>
-          <w:rFonts w:ascii="Calibri" w:cs="Calibri"/>
-        </w:rPr>
-        <w:t>–43.</w:t>
+        <w:t>et al.</w:t>
+      </w:r>
+      <w:r>
+        <w:rPr>
+          <w:rFonts w:ascii="Calibri" w:cs="Calibri"/>
+        </w:rPr>
+        <w:t xml:space="preserve"> Glucocorticoid-Induced Metabolic Disturbances Are Exacerbated in Obese Male Mice. </w:t>
+      </w:r>
+      <w:r>
+        <w:rPr>
+          <w:rFonts w:ascii="Calibri" w:cs="Calibri"/>
+          <w:i/>
+          <w:iCs/>
+        </w:rPr>
+        <w:t>Endocrinology</w:t>
+      </w:r>
+      <w:r>
+        <w:rPr>
+          <w:rFonts w:ascii="Calibri" w:cs="Calibri"/>
+        </w:rPr>
+        <w:t xml:space="preserve"> 2018;159:2275–2287.</w:t>
       </w:r>
     </w:p>
     <w:p>
@@ -1807,52 +1786,42 @@
         <w:rPr>
           <w:rFonts w:ascii="Calibri" w:cs="Calibri"/>
         </w:rPr>
-        <w:t xml:space="preserve">3. </w:t>
+        <w:t xml:space="preserve">5. </w:t>
       </w:r>
       <w:r>
         <w:rPr>
           <w:rFonts w:ascii="Calibri" w:cs="Calibri"/>
         </w:rPr>
         <w:tab/>
-        <w:t xml:space="preserve">Tomiyama AJ. Stress and Obesity. </w:t>
-      </w:r>
-      <w:proofErr w:type="spellStart"/>
+        <w:t xml:space="preserve">Gunder LC, Harvey I, Redd JR, </w:t>
+      </w:r>
       <w:r>
         <w:rPr>
           <w:rFonts w:ascii="Calibri" w:cs="Calibri"/>
           <w:i/>
           <w:iCs/>
         </w:rPr>
-        <w:t>Annu</w:t>
-      </w:r>
-      <w:proofErr w:type="spellEnd"/>
+        <w:t>et al.</w:t>
+      </w:r>
+      <w:r>
+        <w:rPr>
+          <w:rFonts w:ascii="Calibri" w:cs="Calibri"/>
+        </w:rPr>
+        <w:t xml:space="preserve"> Obesity Augments Glucocorticoid-Dependent Muscle Atrophy in Male C57BL/6J Mice. </w:t>
+      </w:r>
       <w:r>
         <w:rPr>
           <w:rFonts w:ascii="Calibri" w:cs="Calibri"/>
           <w:i/>
           <w:iCs/>
         </w:rPr>
-        <w:t xml:space="preserve"> Rev Psychol</w:t>
-      </w:r>
-      <w:r>
-        <w:rPr>
-          <w:rFonts w:ascii="Calibri" w:cs="Calibri"/>
-        </w:rPr>
-        <w:t xml:space="preserve"> </w:t>
-      </w:r>
-      <w:proofErr w:type="gramStart"/>
-      <w:r>
-        <w:rPr>
-          <w:rFonts w:ascii="Calibri" w:cs="Calibri"/>
-        </w:rPr>
-        <w:t>2019;70:703</w:t>
-      </w:r>
-      <w:proofErr w:type="gramEnd"/>
-      <w:r>
-        <w:rPr>
-          <w:rFonts w:ascii="Calibri" w:cs="Calibri"/>
-        </w:rPr>
-        <w:t>–718.</w:t>
+        <w:t>Biomedicines</w:t>
+      </w:r>
+      <w:r>
+        <w:rPr>
+          <w:rFonts w:ascii="Calibri" w:cs="Calibri"/>
+        </w:rPr>
+        <w:t xml:space="preserve"> 2020;8:420.</w:t>
       </w:r>
     </w:p>
     <w:p>
@@ -1866,14 +1835,14 @@
         <w:rPr>
           <w:rFonts w:ascii="Calibri" w:cs="Calibri"/>
         </w:rPr>
-        <w:t xml:space="preserve">4. </w:t>
+        <w:t xml:space="preserve">6. </w:t>
       </w:r>
       <w:r>
         <w:rPr>
           <w:rFonts w:ascii="Calibri" w:cs="Calibri"/>
         </w:rPr>
         <w:tab/>
-        <w:t xml:space="preserve">Harvey I, Stephenson EJ, Redd JR, </w:t>
+        <w:t xml:space="preserve">Heraclides AM, Chandola T, Witte DR, Brunner EJ. Work stress, obesity and the risk of type 2 diabetes: gender-specific bidirectional effect in the Whitehall II study. </w:t>
       </w:r>
       <w:r>
         <w:rPr>
@@ -1881,13 +1850,34 @@
           <w:i/>
           <w:iCs/>
         </w:rPr>
-        <w:t>et al.</w:t>
-      </w:r>
-      <w:r>
-        <w:rPr>
-          <w:rFonts w:ascii="Calibri" w:cs="Calibri"/>
-        </w:rPr>
-        <w:t xml:space="preserve"> Glucocorticoid-Induced Metabolic Disturbances Are Exacerbated in Obese Male Mice. </w:t>
+        <w:t>Obesity (Silver Spring)</w:t>
+      </w:r>
+      <w:r>
+        <w:rPr>
+          <w:rFonts w:ascii="Calibri" w:cs="Calibri"/>
+        </w:rPr>
+        <w:t xml:space="preserve"> 2012;20:428–433.</w:t>
+      </w:r>
+    </w:p>
+    <w:p>
+      <w:pPr>
+        <w:pStyle w:val="Bibliography"/>
+        <w:rPr>
+          <w:rFonts w:ascii="Calibri" w:cs="Calibri"/>
+        </w:rPr>
+      </w:pPr>
+      <w:r>
+        <w:rPr>
+          <w:rFonts w:ascii="Calibri" w:cs="Calibri"/>
+        </w:rPr>
+        <w:t xml:space="preserve">7. </w:t>
+      </w:r>
+      <w:r>
+        <w:rPr>
+          <w:rFonts w:ascii="Calibri" w:cs="Calibri"/>
+        </w:rPr>
+        <w:tab/>
+        <w:t xml:space="preserve">Williams ED, Magliano DJ, Tapp RJ, Oldenburg BF, Shaw JE. Psychosocial stress predicts abnormal glucose metabolism: the Australian Diabetes, Obesity and Lifestyle (AusDiab) study. </w:t>
       </w:r>
       <w:r>
         <w:rPr>
@@ -1895,27 +1885,13 @@
           <w:i/>
           <w:iCs/>
         </w:rPr>
-        <w:t>Endocrinology</w:t>
-      </w:r>
-      <w:r>
-        <w:rPr>
-          <w:rFonts w:ascii="Calibri" w:cs="Calibri"/>
-        </w:rPr>
-        <w:t xml:space="preserve"> </w:t>
-      </w:r>
-      <w:proofErr w:type="gramStart"/>
-      <w:r>
-        <w:rPr>
-          <w:rFonts w:ascii="Calibri" w:cs="Calibri"/>
-        </w:rPr>
-        <w:t>2018;159:2275</w:t>
-      </w:r>
-      <w:proofErr w:type="gramEnd"/>
-      <w:r>
-        <w:rPr>
-          <w:rFonts w:ascii="Calibri" w:cs="Calibri"/>
-        </w:rPr>
-        <w:t>–2287.</w:t>
+        <w:t>Ann Behav Med</w:t>
+      </w:r>
+      <w:r>
+        <w:rPr>
+          <w:rFonts w:ascii="Calibri" w:cs="Calibri"/>
+        </w:rPr>
+        <w:t xml:space="preserve"> 2013;46:62–72.</w:t>
       </w:r>
     </w:p>
     <w:p>
@@ -1929,27 +1905,14 @@
         <w:rPr>
           <w:rFonts w:ascii="Calibri" w:cs="Calibri"/>
         </w:rPr>
-        <w:t xml:space="preserve">5. </w:t>
+        <w:t xml:space="preserve">8. </w:t>
       </w:r>
       <w:r>
         <w:rPr>
           <w:rFonts w:ascii="Calibri" w:cs="Calibri"/>
         </w:rPr>
         <w:tab/>
-      </w:r>
-      <w:proofErr w:type="spellStart"/>
-      <w:r>
-        <w:rPr>
-          <w:rFonts w:ascii="Calibri" w:cs="Calibri"/>
-        </w:rPr>
-        <w:t>Gunder</w:t>
-      </w:r>
-      <w:proofErr w:type="spellEnd"/>
-      <w:r>
-        <w:rPr>
-          <w:rFonts w:ascii="Calibri" w:cs="Calibri"/>
-        </w:rPr>
-        <w:t xml:space="preserve"> LC, Harvey I, Redd JR, </w:t>
+        <w:t xml:space="preserve">Tyagi K, Agarwal NB, Kapur P, Kohli S, Jalali RK. Evaluation of Stress and Associated Biochemical Changes in Patients with Type 2 Diabetes Mellitus and Obesity. </w:t>
       </w:r>
       <w:r>
         <w:rPr>
@@ -1957,13 +1920,34 @@
           <w:i/>
           <w:iCs/>
         </w:rPr>
-        <w:t>et al.</w:t>
-      </w:r>
-      <w:r>
-        <w:rPr>
-          <w:rFonts w:ascii="Calibri" w:cs="Calibri"/>
-        </w:rPr>
-        <w:t xml:space="preserve"> Obesity Augments Glucocorticoid-Dependent Muscle Atrophy in Male C57BL/6J Mice. </w:t>
+        <w:t>Diabetes Metab Syndr Obes</w:t>
+      </w:r>
+      <w:r>
+        <w:rPr>
+          <w:rFonts w:ascii="Calibri" w:cs="Calibri"/>
+        </w:rPr>
+        <w:t xml:space="preserve"> 2021;14:705–717.</w:t>
+      </w:r>
+    </w:p>
+    <w:p>
+      <w:pPr>
+        <w:pStyle w:val="Bibliography"/>
+        <w:rPr>
+          <w:rFonts w:ascii="Calibri" w:cs="Calibri"/>
+        </w:rPr>
+      </w:pPr>
+      <w:r>
+        <w:rPr>
+          <w:rFonts w:ascii="Calibri" w:cs="Calibri"/>
+        </w:rPr>
+        <w:t xml:space="preserve">9. </w:t>
+      </w:r>
+      <w:r>
+        <w:rPr>
+          <w:rFonts w:ascii="Calibri" w:cs="Calibri"/>
+        </w:rPr>
+        <w:tab/>
+        <w:t xml:space="preserve">Zawistowski M, Fritsche LG, Pandit A, </w:t>
       </w:r>
       <w:r>
         <w:rPr>
@@ -1971,27 +1955,27 @@
           <w:i/>
           <w:iCs/>
         </w:rPr>
-        <w:t>Biomedicines</w:t>
-      </w:r>
-      <w:r>
-        <w:rPr>
-          <w:rFonts w:ascii="Calibri" w:cs="Calibri"/>
-        </w:rPr>
-        <w:t xml:space="preserve"> </w:t>
-      </w:r>
-      <w:proofErr w:type="gramStart"/>
-      <w:r>
-        <w:rPr>
-          <w:rFonts w:ascii="Calibri" w:cs="Calibri"/>
-        </w:rPr>
-        <w:t>2020;8:420</w:t>
-      </w:r>
-      <w:proofErr w:type="gramEnd"/>
-      <w:r>
-        <w:rPr>
-          <w:rFonts w:ascii="Calibri" w:cs="Calibri"/>
-        </w:rPr>
-        <w:t>.</w:t>
+        <w:t>et al.</w:t>
+      </w:r>
+      <w:r>
+        <w:rPr>
+          <w:rFonts w:ascii="Calibri" w:cs="Calibri"/>
+        </w:rPr>
+        <w:t xml:space="preserve"> The Michigan Genomics Initiative: A biobank linking genotypes and electronic clinical records in Michigan Medicine patients. </w:t>
+      </w:r>
+      <w:r>
+        <w:rPr>
+          <w:rFonts w:ascii="Calibri" w:cs="Calibri"/>
+          <w:i/>
+          <w:iCs/>
+        </w:rPr>
+        <w:t>Cell Genomics</w:t>
+      </w:r>
+      <w:r>
+        <w:rPr>
+          <w:rFonts w:ascii="Calibri" w:cs="Calibri"/>
+        </w:rPr>
+        <w:t xml:space="preserve"> 2023;0.</w:t>
       </w:r>
     </w:p>
     <w:p>
@@ -2005,41 +1989,14 @@
         <w:rPr>
           <w:rFonts w:ascii="Calibri" w:cs="Calibri"/>
         </w:rPr>
-        <w:t xml:space="preserve">6. </w:t>
+        <w:t xml:space="preserve">10. </w:t>
       </w:r>
       <w:r>
         <w:rPr>
           <w:rFonts w:ascii="Calibri" w:cs="Calibri"/>
         </w:rPr>
         <w:tab/>
-      </w:r>
-      <w:proofErr w:type="spellStart"/>
-      <w:r>
-        <w:rPr>
-          <w:rFonts w:ascii="Calibri" w:cs="Calibri"/>
-        </w:rPr>
-        <w:t>Heraclides</w:t>
-      </w:r>
-      <w:proofErr w:type="spellEnd"/>
-      <w:r>
-        <w:rPr>
-          <w:rFonts w:ascii="Calibri" w:cs="Calibri"/>
-        </w:rPr>
-        <w:t xml:space="preserve"> AM, </w:t>
-      </w:r>
-      <w:proofErr w:type="spellStart"/>
-      <w:r>
-        <w:rPr>
-          <w:rFonts w:ascii="Calibri" w:cs="Calibri"/>
-        </w:rPr>
-        <w:t>Chandola</w:t>
-      </w:r>
-      <w:proofErr w:type="spellEnd"/>
-      <w:r>
-        <w:rPr>
-          <w:rFonts w:ascii="Calibri" w:cs="Calibri"/>
-        </w:rPr>
-        <w:t xml:space="preserve"> T, Witte DR, Brunner EJ. Work stress, obesity and the risk of type 2 diabetes: gender-specific bidirectional effect in the Whitehall II study. </w:t>
+        <w:t xml:space="preserve">Elixhauser A, Steiner C, Harris DR, Coffey RM. Comorbidity measures for use with administrative data. </w:t>
       </w:r>
       <w:r>
         <w:rPr>
@@ -2047,27 +2004,13 @@
           <w:i/>
           <w:iCs/>
         </w:rPr>
-        <w:t>Obesity (Silver Spring)</w:t>
-      </w:r>
-      <w:r>
-        <w:rPr>
-          <w:rFonts w:ascii="Calibri" w:cs="Calibri"/>
-        </w:rPr>
-        <w:t xml:space="preserve"> </w:t>
-      </w:r>
-      <w:proofErr w:type="gramStart"/>
-      <w:r>
-        <w:rPr>
-          <w:rFonts w:ascii="Calibri" w:cs="Calibri"/>
-        </w:rPr>
-        <w:t>2012;20:428</w:t>
-      </w:r>
-      <w:proofErr w:type="gramEnd"/>
-      <w:r>
-        <w:rPr>
-          <w:rFonts w:ascii="Calibri" w:cs="Calibri"/>
-        </w:rPr>
-        <w:t>–433.</w:t>
+        <w:t>Med Care</w:t>
+      </w:r>
+      <w:r>
+        <w:rPr>
+          <w:rFonts w:ascii="Calibri" w:cs="Calibri"/>
+        </w:rPr>
+        <w:t xml:space="preserve"> 1998;36:8–27.</w:t>
       </w:r>
     </w:p>
     <w:p>
@@ -2081,42 +2024,35 @@
         <w:rPr>
           <w:rFonts w:ascii="Calibri" w:cs="Calibri"/>
         </w:rPr>
-        <w:t xml:space="preserve">7. </w:t>
+        <w:t xml:space="preserve">11. </w:t>
       </w:r>
       <w:r>
         <w:rPr>
           <w:rFonts w:ascii="Calibri" w:cs="Calibri"/>
         </w:rPr>
         <w:tab/>
-        <w:t xml:space="preserve">Williams ED, Magliano DJ, </w:t>
-      </w:r>
-      <w:proofErr w:type="spellStart"/>
-      <w:r>
-        <w:rPr>
-          <w:rFonts w:ascii="Calibri" w:cs="Calibri"/>
-        </w:rPr>
-        <w:t>Tapp</w:t>
-      </w:r>
-      <w:proofErr w:type="spellEnd"/>
-      <w:r>
-        <w:rPr>
-          <w:rFonts w:ascii="Calibri" w:cs="Calibri"/>
-        </w:rPr>
-        <w:t xml:space="preserve"> RJ, Oldenburg BF, Shaw JE. Psychosocial stress predicts abnormal glucose metabolism: the Australian Diabetes, Obesity and Lifestyle (</w:t>
-      </w:r>
-      <w:proofErr w:type="spellStart"/>
-      <w:r>
-        <w:rPr>
-          <w:rFonts w:ascii="Calibri" w:cs="Calibri"/>
-        </w:rPr>
-        <w:t>AusDiab</w:t>
-      </w:r>
-      <w:proofErr w:type="spellEnd"/>
-      <w:r>
-        <w:rPr>
-          <w:rFonts w:ascii="Calibri" w:cs="Calibri"/>
-        </w:rPr>
-        <w:t xml:space="preserve">) study. </w:t>
+        <w:t>R Core Team. R: A Language and Environment for Statistical Computing. 2019.</w:t>
+      </w:r>
+    </w:p>
+    <w:p>
+      <w:pPr>
+        <w:pStyle w:val="Bibliography"/>
+        <w:rPr>
+          <w:rFonts w:ascii="Calibri" w:cs="Calibri"/>
+        </w:rPr>
+      </w:pPr>
+      <w:r>
+        <w:rPr>
+          <w:rFonts w:ascii="Calibri" w:cs="Calibri"/>
+        </w:rPr>
+        <w:t xml:space="preserve">12. </w:t>
+      </w:r>
+      <w:r>
+        <w:rPr>
+          <w:rFonts w:ascii="Calibri" w:cs="Calibri"/>
+        </w:rPr>
+        <w:tab/>
+        <w:t xml:space="preserve">Sattler KM, Deane FP, Tapsell L, Kelly PJ. Gender differences in the relationship of weight-based stigmatisation with motivation to exercise and physical activity in overweight individuals. </w:t>
       </w:r>
       <w:r>
         <w:rPr>
@@ -2124,94 +2060,83 @@
           <w:i/>
           <w:iCs/>
         </w:rPr>
-        <w:t xml:space="preserve">Ann </w:t>
-      </w:r>
-      <w:proofErr w:type="spellStart"/>
+        <w:t>Health Psychol Open</w:t>
+      </w:r>
+      <w:r>
+        <w:rPr>
+          <w:rFonts w:ascii="Calibri" w:cs="Calibri"/>
+        </w:rPr>
+        <w:t xml:space="preserve"> 2018;5:2055102918759691.</w:t>
+      </w:r>
+    </w:p>
+    <w:p>
+      <w:pPr>
+        <w:pStyle w:val="Bibliography"/>
+        <w:rPr>
+          <w:rFonts w:ascii="Calibri" w:cs="Calibri"/>
+        </w:rPr>
+      </w:pPr>
+      <w:r>
+        <w:rPr>
+          <w:rFonts w:ascii="Calibri" w:cs="Calibri"/>
+        </w:rPr>
+        <w:t xml:space="preserve">13. </w:t>
+      </w:r>
+      <w:r>
+        <w:rPr>
+          <w:rFonts w:ascii="Calibri" w:cs="Calibri"/>
+        </w:rPr>
+        <w:tab/>
+        <w:t xml:space="preserve">Tomiyama AJ. Weight stigma is stressful. A review of evidence for the cyclic Obesity/weight-based stigma model. </w:t>
+      </w:r>
       <w:r>
         <w:rPr>
           <w:rFonts w:ascii="Calibri" w:cs="Calibri"/>
           <w:i/>
           <w:iCs/>
         </w:rPr>
-        <w:t>Behav</w:t>
-      </w:r>
-      <w:proofErr w:type="spellEnd"/>
+        <w:t>Appetite</w:t>
+      </w:r>
+      <w:r>
+        <w:rPr>
+          <w:rFonts w:ascii="Calibri" w:cs="Calibri"/>
+        </w:rPr>
+        <w:t xml:space="preserve"> 2014;82:8–15.</w:t>
+      </w:r>
+    </w:p>
+    <w:p>
+      <w:pPr>
+        <w:pStyle w:val="Bibliography"/>
+        <w:rPr>
+          <w:rFonts w:ascii="Calibri" w:cs="Calibri"/>
+        </w:rPr>
+      </w:pPr>
+      <w:r>
+        <w:rPr>
+          <w:rFonts w:ascii="Calibri" w:cs="Calibri"/>
+        </w:rPr>
+        <w:t xml:space="preserve">14. </w:t>
+      </w:r>
+      <w:r>
+        <w:rPr>
+          <w:rFonts w:ascii="Calibri" w:cs="Calibri"/>
+        </w:rPr>
+        <w:tab/>
+        <w:t xml:space="preserve">Hochberg I, Harvey I, Tran QT, </w:t>
+      </w:r>
       <w:r>
         <w:rPr>
           <w:rFonts w:ascii="Calibri" w:cs="Calibri"/>
           <w:i/>
           <w:iCs/>
         </w:rPr>
-        <w:t xml:space="preserve"> Med</w:t>
-      </w:r>
-      <w:r>
-        <w:rPr>
-          <w:rFonts w:ascii="Calibri" w:cs="Calibri"/>
-        </w:rPr>
-        <w:t xml:space="preserve"> </w:t>
-      </w:r>
-      <w:proofErr w:type="gramStart"/>
-      <w:r>
-        <w:rPr>
-          <w:rFonts w:ascii="Calibri" w:cs="Calibri"/>
-        </w:rPr>
-        <w:t>2013;46:62</w:t>
-      </w:r>
-      <w:proofErr w:type="gramEnd"/>
-      <w:r>
-        <w:rPr>
-          <w:rFonts w:ascii="Calibri" w:cs="Calibri"/>
-        </w:rPr>
-        <w:t>–72.</w:t>
-      </w:r>
-    </w:p>
-    <w:p>
-      <w:pPr>
-        <w:pStyle w:val="Bibliography"/>
-        <w:rPr>
-          <w:rFonts w:ascii="Calibri" w:cs="Calibri"/>
-        </w:rPr>
-      </w:pPr>
-      <w:r>
-        <w:rPr>
-          <w:rFonts w:ascii="Calibri" w:cs="Calibri"/>
-        </w:rPr>
-        <w:t xml:space="preserve">8. </w:t>
-      </w:r>
-      <w:r>
-        <w:rPr>
-          <w:rFonts w:ascii="Calibri" w:cs="Calibri"/>
-        </w:rPr>
-        <w:tab/>
-        <w:t xml:space="preserve">Tyagi K, Agarwal NB, </w:t>
-      </w:r>
-      <w:proofErr w:type="spellStart"/>
-      <w:r>
-        <w:rPr>
-          <w:rFonts w:ascii="Calibri" w:cs="Calibri"/>
-        </w:rPr>
-        <w:t>Kapur</w:t>
-      </w:r>
-      <w:proofErr w:type="spellEnd"/>
-      <w:r>
-        <w:rPr>
-          <w:rFonts w:ascii="Calibri" w:cs="Calibri"/>
-        </w:rPr>
-        <w:t xml:space="preserve"> P, Kohli S, </w:t>
-      </w:r>
-      <w:proofErr w:type="spellStart"/>
-      <w:r>
-        <w:rPr>
-          <w:rFonts w:ascii="Calibri" w:cs="Calibri"/>
-        </w:rPr>
-        <w:t>Jalali</w:t>
-      </w:r>
-      <w:proofErr w:type="spellEnd"/>
-      <w:r>
-        <w:rPr>
-          <w:rFonts w:ascii="Calibri" w:cs="Calibri"/>
-        </w:rPr>
-        <w:t xml:space="preserve"> RK. Evaluation of Stress and Associated Biochemical Changes in Patients with Type 2 Diabetes Mellitus and Obesity. </w:t>
+        <w:t>et al.</w:t>
+      </w:r>
+      <w:r>
+        <w:rPr>
+          <w:rFonts w:ascii="Calibri" w:cs="Calibri"/>
+        </w:rPr>
+        <w:t xml:space="preserve"> Gene expression changes in subcutaneous adipose tissue due to Cushing’s disease. </w:t>
       </w:r>
       <w:r>
         <w:rPr>
@@ -2219,393 +2144,13 @@
           <w:i/>
           <w:iCs/>
         </w:rPr>
-        <w:t xml:space="preserve">Diabetes </w:t>
-      </w:r>
-      <w:proofErr w:type="spellStart"/>
-      <w:r>
-        <w:rPr>
-          <w:rFonts w:ascii="Calibri" w:cs="Calibri"/>
-          <w:i/>
-          <w:iCs/>
-        </w:rPr>
-        <w:t>Metab</w:t>
-      </w:r>
-      <w:proofErr w:type="spellEnd"/>
-      <w:r>
-        <w:rPr>
-          <w:rFonts w:ascii="Calibri" w:cs="Calibri"/>
-          <w:i/>
-          <w:iCs/>
-        </w:rPr>
-        <w:t xml:space="preserve"> </w:t>
-      </w:r>
-      <w:proofErr w:type="spellStart"/>
-      <w:r>
-        <w:rPr>
-          <w:rFonts w:ascii="Calibri" w:cs="Calibri"/>
-          <w:i/>
-          <w:iCs/>
-        </w:rPr>
-        <w:t>Syndr</w:t>
-      </w:r>
-      <w:proofErr w:type="spellEnd"/>
-      <w:r>
-        <w:rPr>
-          <w:rFonts w:ascii="Calibri" w:cs="Calibri"/>
-          <w:i/>
-          <w:iCs/>
-        </w:rPr>
-        <w:t xml:space="preserve"> </w:t>
-      </w:r>
-      <w:proofErr w:type="spellStart"/>
-      <w:r>
-        <w:rPr>
-          <w:rFonts w:ascii="Calibri" w:cs="Calibri"/>
-          <w:i/>
-          <w:iCs/>
-        </w:rPr>
-        <w:t>Obes</w:t>
-      </w:r>
-      <w:proofErr w:type="spellEnd"/>
-      <w:r>
-        <w:rPr>
-          <w:rFonts w:ascii="Calibri" w:cs="Calibri"/>
-        </w:rPr>
-        <w:t xml:space="preserve"> </w:t>
-      </w:r>
-      <w:proofErr w:type="gramStart"/>
-      <w:r>
-        <w:rPr>
-          <w:rFonts w:ascii="Calibri" w:cs="Calibri"/>
-        </w:rPr>
-        <w:t>2021;14:705</w:t>
-      </w:r>
-      <w:proofErr w:type="gramEnd"/>
-      <w:r>
-        <w:rPr>
-          <w:rFonts w:ascii="Calibri" w:cs="Calibri"/>
-        </w:rPr>
-        <w:t>–717.</w:t>
-      </w:r>
-    </w:p>
-    <w:p>
-      <w:pPr>
-        <w:pStyle w:val="Bibliography"/>
-        <w:rPr>
-          <w:rFonts w:ascii="Calibri" w:cs="Calibri"/>
-        </w:rPr>
-      </w:pPr>
-      <w:r>
-        <w:rPr>
-          <w:rFonts w:ascii="Calibri" w:cs="Calibri"/>
-        </w:rPr>
-        <w:t xml:space="preserve">9. </w:t>
-      </w:r>
-      <w:r>
-        <w:rPr>
-          <w:rFonts w:ascii="Calibri" w:cs="Calibri"/>
-        </w:rPr>
-        <w:tab/>
-      </w:r>
-      <w:proofErr w:type="spellStart"/>
-      <w:r>
-        <w:rPr>
-          <w:rFonts w:ascii="Calibri" w:cs="Calibri"/>
-        </w:rPr>
-        <w:t>Zawistowski</w:t>
-      </w:r>
-      <w:proofErr w:type="spellEnd"/>
-      <w:r>
-        <w:rPr>
-          <w:rFonts w:ascii="Calibri" w:cs="Calibri"/>
-        </w:rPr>
-        <w:t xml:space="preserve"> M, Fritsche LG, Pandit A, </w:t>
-      </w:r>
-      <w:r>
-        <w:rPr>
-          <w:rFonts w:ascii="Calibri" w:cs="Calibri"/>
-          <w:i/>
-          <w:iCs/>
-        </w:rPr>
-        <w:t>et al.</w:t>
-      </w:r>
-      <w:r>
-        <w:rPr>
-          <w:rFonts w:ascii="Calibri" w:cs="Calibri"/>
-        </w:rPr>
-        <w:t xml:space="preserve"> The Michigan Genomics Initiative: A biobank linking genotypes and electronic clinical records in Michigan Medicine patients. </w:t>
-      </w:r>
-      <w:r>
-        <w:rPr>
-          <w:rFonts w:ascii="Calibri" w:cs="Calibri"/>
-          <w:i/>
-          <w:iCs/>
-        </w:rPr>
-        <w:t>Cell Genomics</w:t>
-      </w:r>
-      <w:r>
-        <w:rPr>
-          <w:rFonts w:ascii="Calibri" w:cs="Calibri"/>
-        </w:rPr>
-        <w:t xml:space="preserve"> 2023;0.</w:t>
-      </w:r>
-    </w:p>
-    <w:p>
-      <w:pPr>
-        <w:pStyle w:val="Bibliography"/>
-        <w:rPr>
-          <w:rFonts w:ascii="Calibri" w:cs="Calibri"/>
-        </w:rPr>
-      </w:pPr>
-      <w:r>
-        <w:rPr>
-          <w:rFonts w:ascii="Calibri" w:cs="Calibri"/>
-        </w:rPr>
-        <w:t xml:space="preserve">10. </w:t>
-      </w:r>
-      <w:r>
-        <w:rPr>
-          <w:rFonts w:ascii="Calibri" w:cs="Calibri"/>
-        </w:rPr>
-        <w:tab/>
-      </w:r>
-      <w:proofErr w:type="spellStart"/>
-      <w:r>
-        <w:rPr>
-          <w:rFonts w:ascii="Calibri" w:cs="Calibri"/>
-        </w:rPr>
-        <w:t>Elixhauser</w:t>
-      </w:r>
-      <w:proofErr w:type="spellEnd"/>
-      <w:r>
-        <w:rPr>
-          <w:rFonts w:ascii="Calibri" w:cs="Calibri"/>
-        </w:rPr>
-        <w:t xml:space="preserve"> A, Steiner C, Harris DR, Coffey RM. Comorbidity measures for use with administrative data. </w:t>
-      </w:r>
-      <w:r>
-        <w:rPr>
-          <w:rFonts w:ascii="Calibri" w:cs="Calibri"/>
-          <w:i/>
-          <w:iCs/>
-        </w:rPr>
-        <w:t>Med Care</w:t>
-      </w:r>
-      <w:r>
-        <w:rPr>
-          <w:rFonts w:ascii="Calibri" w:cs="Calibri"/>
-        </w:rPr>
-        <w:t xml:space="preserve"> </w:t>
-      </w:r>
-      <w:proofErr w:type="gramStart"/>
-      <w:r>
-        <w:rPr>
-          <w:rFonts w:ascii="Calibri" w:cs="Calibri"/>
-        </w:rPr>
-        <w:t>1998;36:8</w:t>
-      </w:r>
-      <w:proofErr w:type="gramEnd"/>
-      <w:r>
-        <w:rPr>
-          <w:rFonts w:ascii="Calibri" w:cs="Calibri"/>
-        </w:rPr>
-        <w:t>–27.</w:t>
-      </w:r>
-    </w:p>
-    <w:p>
-      <w:pPr>
-        <w:pStyle w:val="Bibliography"/>
-        <w:rPr>
-          <w:rFonts w:ascii="Calibri" w:cs="Calibri"/>
-        </w:rPr>
-      </w:pPr>
-      <w:r>
-        <w:rPr>
-          <w:rFonts w:ascii="Calibri" w:cs="Calibri"/>
-        </w:rPr>
-        <w:t xml:space="preserve">11. </w:t>
-      </w:r>
-      <w:r>
-        <w:rPr>
-          <w:rFonts w:ascii="Calibri" w:cs="Calibri"/>
-        </w:rPr>
-        <w:tab/>
-        <w:t>R Core Team. R: A Language and Environment for Statistical Computing. 2019.</w:t>
-      </w:r>
-    </w:p>
-    <w:p>
-      <w:pPr>
-        <w:pStyle w:val="Bibliography"/>
-        <w:rPr>
-          <w:rFonts w:ascii="Calibri" w:cs="Calibri"/>
-        </w:rPr>
-      </w:pPr>
-      <w:r>
-        <w:rPr>
-          <w:rFonts w:ascii="Calibri" w:cs="Calibri"/>
-        </w:rPr>
-        <w:t xml:space="preserve">12. </w:t>
-      </w:r>
-      <w:r>
-        <w:rPr>
-          <w:rFonts w:ascii="Calibri" w:cs="Calibri"/>
-        </w:rPr>
-        <w:tab/>
-        <w:t xml:space="preserve">Sattler KM, Deane FP, Tapsell L, Kelly PJ. Gender differences in the relationship of weight-based </w:t>
-      </w:r>
-      <w:proofErr w:type="spellStart"/>
-      <w:r>
-        <w:rPr>
-          <w:rFonts w:ascii="Calibri" w:cs="Calibri"/>
-        </w:rPr>
-        <w:t>stigmatisation</w:t>
-      </w:r>
-      <w:proofErr w:type="spellEnd"/>
-      <w:r>
-        <w:rPr>
-          <w:rFonts w:ascii="Calibri" w:cs="Calibri"/>
-        </w:rPr>
-        <w:t xml:space="preserve"> with motivation to exercise and physical activity in overweight individuals. </w:t>
-      </w:r>
-      <w:r>
-        <w:rPr>
-          <w:rFonts w:ascii="Calibri" w:cs="Calibri"/>
-          <w:i/>
-          <w:iCs/>
-        </w:rPr>
-        <w:t>Health Psychol Open</w:t>
-      </w:r>
-      <w:r>
-        <w:rPr>
-          <w:rFonts w:ascii="Calibri" w:cs="Calibri"/>
-        </w:rPr>
-        <w:t xml:space="preserve"> </w:t>
-      </w:r>
-      <w:proofErr w:type="gramStart"/>
-      <w:r>
-        <w:rPr>
-          <w:rFonts w:ascii="Calibri" w:cs="Calibri"/>
-        </w:rPr>
-        <w:t>2018;5:2055102918759691</w:t>
-      </w:r>
-      <w:proofErr w:type="gramEnd"/>
-      <w:r>
-        <w:rPr>
-          <w:rFonts w:ascii="Calibri" w:cs="Calibri"/>
-        </w:rPr>
-        <w:t>.</w:t>
-      </w:r>
-    </w:p>
-    <w:p>
-      <w:pPr>
-        <w:pStyle w:val="Bibliography"/>
-        <w:rPr>
-          <w:rFonts w:ascii="Calibri" w:cs="Calibri"/>
-        </w:rPr>
-      </w:pPr>
-      <w:r>
-        <w:rPr>
-          <w:rFonts w:ascii="Calibri" w:cs="Calibri"/>
-        </w:rPr>
-        <w:t xml:space="preserve">13. </w:t>
-      </w:r>
-      <w:r>
-        <w:rPr>
-          <w:rFonts w:ascii="Calibri" w:cs="Calibri"/>
-        </w:rPr>
-        <w:tab/>
-        <w:t xml:space="preserve">Tomiyama AJ. Weight stigma is stressful. A review of evidence for the cyclic Obesity/weight-based stigma model. </w:t>
-      </w:r>
-      <w:r>
-        <w:rPr>
-          <w:rFonts w:ascii="Calibri" w:cs="Calibri"/>
-          <w:i/>
-          <w:iCs/>
-        </w:rPr>
-        <w:t>Appetite</w:t>
-      </w:r>
-      <w:r>
-        <w:rPr>
-          <w:rFonts w:ascii="Calibri" w:cs="Calibri"/>
-        </w:rPr>
-        <w:t xml:space="preserve"> </w:t>
-      </w:r>
-      <w:proofErr w:type="gramStart"/>
-      <w:r>
-        <w:rPr>
-          <w:rFonts w:ascii="Calibri" w:cs="Calibri"/>
-        </w:rPr>
-        <w:t>2014;82:8</w:t>
-      </w:r>
-      <w:proofErr w:type="gramEnd"/>
-      <w:r>
-        <w:rPr>
-          <w:rFonts w:ascii="Calibri" w:cs="Calibri"/>
-        </w:rPr>
-        <w:t>–15.</w:t>
-      </w:r>
-    </w:p>
-    <w:p>
-      <w:pPr>
-        <w:pStyle w:val="Bibliography"/>
-        <w:rPr>
-          <w:rFonts w:ascii="Calibri" w:cs="Calibri"/>
-        </w:rPr>
-      </w:pPr>
-      <w:r>
-        <w:rPr>
-          <w:rFonts w:ascii="Calibri" w:cs="Calibri"/>
-        </w:rPr>
-        <w:t xml:space="preserve">14. </w:t>
-      </w:r>
-      <w:r>
-        <w:rPr>
-          <w:rFonts w:ascii="Calibri" w:cs="Calibri"/>
-        </w:rPr>
-        <w:tab/>
-        <w:t xml:space="preserve">Hochberg I, Harvey I, Tran QT, </w:t>
-      </w:r>
-      <w:r>
-        <w:rPr>
-          <w:rFonts w:ascii="Calibri" w:cs="Calibri"/>
-          <w:i/>
-          <w:iCs/>
-        </w:rPr>
-        <w:t>et al.</w:t>
-      </w:r>
-      <w:r>
-        <w:rPr>
-          <w:rFonts w:ascii="Calibri" w:cs="Calibri"/>
-        </w:rPr>
-        <w:t xml:space="preserve"> Gene expression changes in subcutaneous adipose tissue due to Cushing’s disease. </w:t>
-      </w:r>
-      <w:r>
-        <w:rPr>
-          <w:rFonts w:ascii="Calibri" w:cs="Calibri"/>
-          <w:i/>
-          <w:iCs/>
-        </w:rPr>
         <w:t>Journal of Molecular Endocrinology</w:t>
       </w:r>
       <w:r>
         <w:rPr>
           <w:rFonts w:ascii="Calibri" w:cs="Calibri"/>
         </w:rPr>
-        <w:t xml:space="preserve"> </w:t>
-      </w:r>
-      <w:proofErr w:type="gramStart"/>
-      <w:r>
-        <w:rPr>
-          <w:rFonts w:ascii="Calibri" w:cs="Calibri"/>
-        </w:rPr>
-        <w:t>2015;55:81</w:t>
-      </w:r>
-      <w:proofErr w:type="gramEnd"/>
-      <w:r>
-        <w:rPr>
-          <w:rFonts w:ascii="Calibri" w:cs="Calibri"/>
-        </w:rPr>
-        <w:t>–94.</w:t>
+        <w:t xml:space="preserve"> 2015;55:81–94.</w:t>
       </w:r>
     </w:p>
     <w:p>
@@ -2632,19 +2177,40 @@
     <w:p/>
     <w:p>
       <w:r>
-        <w:t>Table 1</w:t>
-      </w:r>
-    </w:p>
-    <w:p/>
-    <w:p>
-      <w:r>
-        <w:t xml:space="preserve">Table 2: </w:t>
-      </w:r>
-      <w:r>
         <w:rPr>
           <w:b/>
           <w:bCs/>
         </w:rPr>
+        <w:t>Table 1</w:t>
+      </w:r>
+      <w:r>
+        <w:rPr>
+          <w:b/>
+          <w:bCs/>
+        </w:rPr>
+        <w:t>: Demographics and perceive stress prevalence for this populations</w:t>
+      </w:r>
+      <w:r>
+        <w:t>.  Participants were stratified into high or low stress and prevalence calculated within each group.  Asterisks indicate significantly different prevalence relative to the total population.</w:t>
+      </w:r>
+    </w:p>
+    <w:p/>
+    <w:p>
+      <w:r>
+        <w:rPr>
+          <w:b/>
+          <w:bCs/>
+        </w:rPr>
+        <w:t>Table 2:</w:t>
+      </w:r>
+      <w:r>
+        <w:t xml:space="preserve"> </w:t>
+      </w:r>
+      <w:r>
+        <w:rPr>
+          <w:b/>
+          <w:bCs/>
+        </w:rPr>
         <w:t xml:space="preserve">Stepwise multivariate modeling of the </w:t>
       </w:r>
       <w:proofErr w:type="spellStart"/>
@@ -2673,13 +2239,72 @@
         <w:t xml:space="preserve">  </w:t>
       </w:r>
       <w:r>
-        <w:t>Beta coefficients and p-value for the obesity x stress interaction term for the effects on type 2 diabetes prevalence.</w:t>
+        <w:t xml:space="preserve">Beta coefficients and p-value for the obesity x stress interaction term for the </w:t>
+      </w:r>
+      <w:r>
+        <w:t xml:space="preserve">augmented </w:t>
+      </w:r>
+      <w:r>
+        <w:t>effects on type 2 diabetes prevalence.</w:t>
       </w:r>
     </w:p>
     <w:p/>
     <w:p>
       <w:r>
+        <w:rPr>
+          <w:b/>
+          <w:bCs/>
+        </w:rPr>
         <w:t>Table 3: The relationship between perceived stress and obesity on prevalence of other chronic diseases.</w:t>
+      </w:r>
+      <w:r>
+        <w:t xml:space="preserve">  Beta coefficients for obesity, perceived stress and interaction terms in both crude and multivariate adjusted models.  Multivariate adjustments included age, gender, race/ethnicity, and SES.  Asterisks indicate p&lt;0.05 for each beta coefficient.</w:t>
+      </w:r>
+    </w:p>
+    <w:p>
+      <w:pPr>
+        <w:rPr>
+          <w:b/>
+          <w:bCs/>
+        </w:rPr>
+      </w:pPr>
+    </w:p>
+    <w:p>
+      <w:pPr>
+        <w:rPr>
+          <w:b/>
+          <w:bCs/>
+        </w:rPr>
+      </w:pPr>
+      <w:r>
+        <w:rPr>
+          <w:b/>
+          <w:bCs/>
+        </w:rPr>
+        <w:t>Figure 1: CONSORT diagram describing participants included and excluded from this analysis.</w:t>
+      </w:r>
+    </w:p>
+    <w:p>
+      <w:pPr>
+        <w:rPr>
+          <w:b/>
+          <w:bCs/>
+        </w:rPr>
+      </w:pPr>
+    </w:p>
+    <w:p>
+      <w:r>
+        <w:rPr>
+          <w:b/>
+          <w:bCs/>
+        </w:rPr>
+        <w:t>Figure 2: Prevalence of type 2 diabetes stratified by obesity and perceived stress.</w:t>
+      </w:r>
+      <w:r>
+        <w:t xml:space="preserve">   </w:t>
+      </w:r>
+      <w:r>
+        <w:t>A) Stratified by obesity alone B) Stratified by obesity and gender C) Stratified by obesity and neighborhood disadvantage quartile as a proxy for SES (1 is lowest, 4 is highest), D) Stratified by race/ethnicity.</w:t>
       </w:r>
     </w:p>
     <w:p/>

</xml_diff>

<commit_message>
Removed "risk" from manuscript replaced with odds/prevalence
</commit_message>
<xml_diff>
--- a/manuscript/Obesity-Stress/Manuscript.docx
+++ b/manuscript/Obesity-Stress/Manuscript.docx
@@ -259,7 +259,13 @@
     <w:p/>
     <w:p>
       <w:r>
-        <w:t xml:space="preserve">In humans, although several key studies have identified a robust association between stress and the development of diabetes, most of these studies did not determine whether the metabolic effect of stress is different between obese and lean individuals. The only major study that addressed the combined effect of stress and obesity on diabetes is the Whitehall II study, that found that work stress strongly increased the risk of diabetes in obese women, with no apparent modulating effect in obese men and lean women, and a protective effect in lean men </w:t>
+        <w:t xml:space="preserve">In humans, although several key studies have identified a robust association between stress and the development of diabetes, most of these studies did not determine whether the metabolic effect of stress is different between obese and lean individuals. The only major study that addressed the combined effect of stress and obesity on diabetes is the Whitehall II study, that found that work stress strongly increased the </w:t>
+      </w:r>
+      <w:r>
+        <w:t>likelihood</w:t>
+      </w:r>
+      <w:r>
+        <w:t xml:space="preserve"> of diabetes in obese women, with no apparent modulating effect in obese men and lean women, and a protective effect in lean men </w:t>
       </w:r>
       <w:r>
         <w:fldChar w:fldCharType="begin"/>
@@ -986,7 +992,13 @@
         <w:t>-11</w:t>
       </w:r>
       <w:r>
-        <w:t xml:space="preserve">).  This represented a synergistic interaction between obesity and perceived stress on diabetes risk (12% increase, p=0.056).  </w:t>
+        <w:t xml:space="preserve">).  This represented a synergistic interaction between obesity and perceived stress on diabetes </w:t>
+      </w:r>
+      <w:r>
+        <w:t>prevalence</w:t>
+      </w:r>
+      <w:r>
+        <w:t xml:space="preserve"> (12% increase, p=0.056).  </w:t>
       </w:r>
       <w:r>
         <w:t xml:space="preserve">This effect was similar across gender, and neighborhood socioeconomic status (Figure </w:t>
@@ -1034,7 +1046,13 @@
         <w:t>on</w:t>
       </w:r>
       <w:r>
-        <w:t xml:space="preserve"> type 2 diabetes risk </w:t>
+        <w:t xml:space="preserve"> type 2 diabetes </w:t>
+      </w:r>
+      <w:r>
+        <w:t>prevalence</w:t>
+      </w:r>
+      <w:r>
+        <w:t xml:space="preserve"> </w:t>
       </w:r>
       <w:r>
         <w:t>is</w:t>
@@ -1164,10 +1182,40 @@
         <w:t xml:space="preserve">  </w:t>
       </w:r>
       <w:r>
-        <w:t xml:space="preserve">Consistent with previous reports, we show that obesity is associated with the increased prevalence of each of these co-morbidities with relative risks ranging from 9.1 % increased cardiac arrythmia to 2.4x increased prevalence of hypertension after adjusting for confounders.  Similarly, perceived stress was also associated with the increased risk of each of these diseases (9.1% increased risk for arrythmia to </w:t>
-      </w:r>
-      <w:r>
-        <w:t>30% increased risk of congestive heart failure).  When we examined the interaction between perceived stress and obesity, none of these conditions had significant interactions in either the crude or adjusted models.  T</w:t>
+        <w:t xml:space="preserve">Consistent with previous reports, we show that obesity is associated with the increased prevalence of each of these co-morbidities with </w:t>
+      </w:r>
+      <w:r>
+        <w:t>odds ratios</w:t>
+      </w:r>
+      <w:r>
+        <w:t xml:space="preserve"> ranging from </w:t>
+      </w:r>
+      <w:r>
+        <w:t xml:space="preserve">a </w:t>
+      </w:r>
+      <w:r>
+        <w:t xml:space="preserve">9.1 % increased cardiac arrythmia to 2.4x increased prevalence of hypertension after adjusting for confounders.  Similarly, perceived stress was also associated with the increased </w:t>
+      </w:r>
+      <w:r>
+        <w:t>likelihood</w:t>
+      </w:r>
+      <w:r>
+        <w:t xml:space="preserve"> of each of these diseases (9.1% increased </w:t>
+      </w:r>
+      <w:r>
+        <w:t>prevalence</w:t>
+      </w:r>
+      <w:r>
+        <w:t xml:space="preserve"> for arrythmia to </w:t>
+      </w:r>
+      <w:r>
+        <w:t xml:space="preserve">30% increased </w:t>
+      </w:r>
+      <w:r>
+        <w:t>prevalence</w:t>
+      </w:r>
+      <w:r>
+        <w:t xml:space="preserve"> of congestive heart failure).  When we examined the interaction between perceived stress and obesity, none of these conditions had significant interactions in either the crude or adjusted models.  T</w:t>
       </w:r>
       <w:r>
         <w:t xml:space="preserve">hese data suggest that </w:t>
@@ -1179,13 +1227,25 @@
         <w:t>augmented</w:t>
       </w:r>
       <w:r>
-        <w:t xml:space="preserve"> risk of obesity </w:t>
-      </w:r>
-      <w:r>
-        <w:t>coupled with elevated</w:t>
-      </w:r>
-      <w:r>
-        <w:t xml:space="preserve"> perceived stress on diabetes is not </w:t>
+        <w:t xml:space="preserve"> </w:t>
+      </w:r>
+      <w:r>
+        <w:t>prevalence</w:t>
+      </w:r>
+      <w:r>
+        <w:t xml:space="preserve"> of </w:t>
+      </w:r>
+      <w:r>
+        <w:t>type 2 diabetes</w:t>
+      </w:r>
+      <w:r>
+        <w:t xml:space="preserve"> </w:t>
+      </w:r>
+      <w:r>
+        <w:t>of obesity when coupled with psychosocial stress</w:t>
+      </w:r>
+      <w:r>
+        <w:t xml:space="preserve"> is not </w:t>
       </w:r>
       <w:r>
         <w:t>evident</w:t>
@@ -1218,7 +1278,13 @@
         <w:t xml:space="preserve">  The higher reported stress in </w:t>
       </w:r>
       <w:r>
-        <w:t xml:space="preserve">participants with BMI &gt;30 (43-48%) relative to those with BMI between 18.5 and 30 may reflect weight stigma and could represent a positive feedback loop wherein obesity-linked psychosocial stress may enhance diabetes risk in this population.  We observe enhanced obesity-associated perceived stress in females with BMI &gt;30 (47%) compared to BMI &lt;30 (42%) than in males (42% vs 39%, </w:t>
+        <w:t xml:space="preserve">participants with BMI &gt;30 (43-48%) relative to those with BMI between 18.5 and 30 may reflect weight stigma and could represent a positive feedback loop wherein obesity-linked psychosocial stress may enhance diabetes </w:t>
+      </w:r>
+      <w:r>
+        <w:t>prevalence</w:t>
+      </w:r>
+      <w:r>
+        <w:t xml:space="preserve"> in this population.  We observe enhanced obesity-associated perceived stress in females with BMI &gt;30 (47%) compared to BMI &lt;30 (42%) than in males (42% vs 39%, </w:t>
       </w:r>
       <w:proofErr w:type="spellStart"/>
       <w:r>
@@ -1336,10 +1402,13 @@
         <w:t>and/</w:t>
       </w:r>
       <w:r>
-        <w:t>or stress-related elevated risk</w:t>
-      </w:r>
-      <w:r>
-        <w:t xml:space="preserve">, but in our population these risk factors appeared additive rather than </w:t>
+        <w:t xml:space="preserve">or stress-related elevated </w:t>
+      </w:r>
+      <w:r>
+        <w:t>odds</w:t>
+      </w:r>
+      <w:r>
+        <w:t xml:space="preserve">, but in our population these factors appeared additive rather than </w:t>
       </w:r>
       <w:commentRangeStart w:id="3"/>
       <w:commentRangeStart w:id="4"/>
@@ -1402,7 +1471,13 @@
         <w:t xml:space="preserve">this is less likely, as it is only true for type 2 diabetes, but not other comorbidities tested.  It is also possible that the slightly elevated average BMI </w:t>
       </w:r>
       <w:r>
-        <w:t>in the participants with high PSS scores and obesity could imply that higher stress increases BMI, enhancing diabetes risk, consistent with the COBWEBS model</w:t>
+        <w:t xml:space="preserve">in the participants with high PSS scores and obesity could imply that higher stress increases BMI, enhancing diabetes </w:t>
+      </w:r>
+      <w:r>
+        <w:t>prevalence</w:t>
+      </w:r>
+      <w:r>
+        <w:t>, consistent with the COBWEBS model</w:t>
       </w:r>
       <w:r>
         <w:t xml:space="preserve"> wherein obesity-related stress enhances food intake and obesity, exacerbating weight-related metabolic disease </w:t>
@@ -1444,7 +1519,37 @@
     <w:p/>
     <w:p>
       <w:r>
-        <w:t xml:space="preserve">There are several important strengths to this work including a large sample size, consistent and validated measures of perceived stress and well documented disease and sociodemographic factors.  To our knowledge this is the first report of perceived stress enhancing obesity-related diabetes risk, and consistent with the Whitehall II studies showing similar effects for job-related stress </w:t>
+        <w:t xml:space="preserve">There are several important strengths to this work including a large sample size, consistent and validated measures of perceived stress and well documented disease and sociodemographic factors.  To our knowledge this is the first report </w:t>
+      </w:r>
+      <w:r>
+        <w:t>that</w:t>
+      </w:r>
+      <w:r>
+        <w:t xml:space="preserve"> perceived </w:t>
+      </w:r>
+      <w:r>
+        <w:t xml:space="preserve">psychosocial </w:t>
+      </w:r>
+      <w:r>
+        <w:t xml:space="preserve">stress </w:t>
+      </w:r>
+      <w:r>
+        <w:t>enhances</w:t>
+      </w:r>
+      <w:r>
+        <w:t xml:space="preserve"> obesity-related diabetes </w:t>
+      </w:r>
+      <w:r>
+        <w:t>prevalence</w:t>
+      </w:r>
+      <w:r>
+        <w:t xml:space="preserve">, and </w:t>
+      </w:r>
+      <w:r>
+        <w:t xml:space="preserve">is </w:t>
+      </w:r>
+      <w:r>
+        <w:t xml:space="preserve">consistent with the Whitehall II studies showing similar effects for job-related stress </w:t>
       </w:r>
       <w:r>
         <w:fldChar w:fldCharType="begin"/>
@@ -1468,7 +1573,13 @@
         <w:t xml:space="preserve">.  </w:t>
       </w:r>
       <w:r>
-        <w:t xml:space="preserve">This data is in alignment with our pre-clinical mouse studies that show an elevated risk of </w:t>
+        <w:t xml:space="preserve">This data is in alignment with our pre-clinical mouse studies that </w:t>
+      </w:r>
+      <w:r>
+        <w:t>demonstrate augmented</w:t>
+      </w:r>
+      <w:r>
+        <w:t xml:space="preserve"> </w:t>
       </w:r>
       <w:proofErr w:type="spellStart"/>
       <w:r>

</xml_diff>

<commit_message>
Made revisions based on IH discussions
</commit_message>
<xml_diff>
--- a/manuscript/Obesity-Stress/Manuscript.docx
+++ b/manuscript/Obesity-Stress/Manuscript.docx
@@ -47,7 +47,13 @@
     <w:p/>
     <w:p>
       <w:r>
-        <w:t xml:space="preserve">Chronic psychosocial stress and obesity are both risk factors for type 2 diabetes.  In this study we evaluated data from the Michigan Genomics Initiative, a hospital-based cohort for the associations between perceived stress, obesity and type 2 diabetes prevalence.  Perceived stress was positively associated with type 2 diabetes, and this effect was enhanced in participants with obesity.  </w:t>
+        <w:t>Chronic psychosocial stress and obesity are both risk factors for type 2 diabetes.  In this study we evaluated data from the Michigan Genomics Initiative, a hospital-based cohort</w:t>
+      </w:r>
+      <w:r>
+        <w:t>,</w:t>
+      </w:r>
+      <w:r>
+        <w:t xml:space="preserve"> for associations between perceived stress, obesity and type 2 diabetes prevalence.  Perceived stress was positively associated with type 2 diabetes, and this effect was enhanced in participants with obesity.  </w:t>
       </w:r>
       <w:r>
         <w:t>Via multivariate modelling</w:t>
@@ -56,7 +62,22 @@
         <w:t xml:space="preserve"> of this cross-sectional association</w:t>
       </w:r>
       <w:r>
-        <w:t>, accounting for differences in gender, age, race/ethnicity, and socioeconomic status we found that perceived stress enhanced type 2 prevalence by 13% above that expected by obesity or stress alone.</w:t>
+        <w:t xml:space="preserve">, accounting for differences in gender, age, race/ethnicity, and </w:t>
+      </w:r>
+      <w:r>
+        <w:t>neighborhood</w:t>
+      </w:r>
+      <w:r>
+        <w:t xml:space="preserve"> </w:t>
+      </w:r>
+      <w:r>
+        <w:t>disadvantage</w:t>
+      </w:r>
+      <w:r>
+        <w:t>,</w:t>
+      </w:r>
+      <w:r>
+        <w:t xml:space="preserve"> we found that perceived stress enhanced type 2 prevalence by 13% above that expected by obesity or stress alone.</w:t>
       </w:r>
       <w:r>
         <w:t xml:space="preserve">  Similar analyses evaluating the effects of obesity and self-reported psychosocial stress demonstrated additive but not synergistic effects on other obesity related comorbidities. These data support the hypothesis that obesity and chronic psychosocial stress augment the risk of type 2 diabetes.</w:t>
@@ -96,7 +117,7 @@
         <w:fldChar w:fldCharType="begin"/>
       </w:r>
       <w:r>
-        <w:instrText xml:space="preserve"> ADDIN ZOTERO_ITEM CSL_CITATION {"citationID":"PFInBGkp","properties":{"formattedCitation":"(1)","plainCitation":"(1)","noteIndex":0},"citationItems":[{"id":"DNVojJss/wFXtUxbW","uris":["http://zotero.org/users/2695081/items/YEZFY7CW"],"itemData":{"id":"wYajtxYE/aNG2Y68D","type":"article-journal","container-title":"Cell Metabolism","DOI":"10.1016/j.cmet.2021.12.012","ISSN":"15504131","issue":"1","journalAbbreviation":"Cell Metabolism","language":"en","page":"11-20","source":"DOI.org (Crossref)","title":"Why does obesity cause diabetes?","volume":"34","author":[{"family":"Klein","given":"Samuel"},{"family":"Gastaldelli","given":"Amalia"},{"family":"Yki-Järvinen","given":"Hannele"},{"family":"Scherer","given":"Philipp E."}],"issued":{"date-parts":[["2022",1]]}}}],"schema":"https://github.com/citation-style-language/schema/raw/master/csl-citation.json"} </w:instrText>
+        <w:instrText xml:space="preserve"> ADDIN ZOTERO_ITEM CSL_CITATION {"citationID":"PFInBGkp","properties":{"formattedCitation":"(1)","plainCitation":"(1)","noteIndex":0},"citationItems":[{"id":"fATidvy9/t169IEHb","uris":["http://zotero.org/users/2695081/items/YEZFY7CW"],"itemData":{"id":"wYajtxYE/aNG2Y68D","type":"article-journal","container-title":"Cell Metabolism","DOI":"10.1016/j.cmet.2021.12.012","ISSN":"15504131","issue":"1","journalAbbreviation":"Cell Metabolism","language":"en","page":"11-20","source":"DOI.org (Crossref)","title":"Why does obesity cause diabetes?","volume":"34","author":[{"family":"Klein","given":"Samuel"},{"family":"Gastaldelli","given":"Amalia"},{"family":"Yki-Järvinen","given":"Hannele"},{"family":"Scherer","given":"Philipp E."}],"issued":{"date-parts":[["2022",1]]}}}],"schema":"https://github.com/citation-style-language/schema/raw/master/csl-citation.json"} </w:instrText>
       </w:r>
       <w:r>
         <w:fldChar w:fldCharType="separate"/>
@@ -123,7 +144,7 @@
         <w:fldChar w:fldCharType="begin"/>
       </w:r>
       <w:r>
-        <w:instrText xml:space="preserve"> ADDIN ZOTERO_ITEM CSL_CITATION {"citationID":"M57XEHIn","properties":{"formattedCitation":"(2)","plainCitation":"(2)","noteIndex":0},"citationItems":[{"id":"DNVojJss/JvUt2zVY","uris":["http://zotero.org/users/2695081/items/NFIEYI62"],"itemData":{"id":1813,"type":"article-journal","abstract":"Evidence suggests that psychological and physical stress are relevant triggering factors for the onset of type 1 diabetes (T1D) and type 2 diabetes (T2D). The underlying mechanisms involve a complex neuroendocrine structure, involving the central nervous system and the periphery. Psychological stress leads to an increase of serum glucocorticoid concentrations and catecholamines release increasing the insulin need and the insulin resistance. According to the β-cell stress hypothesis, also causes of increased insulin demand, such as rapid growth, overweight, puberty, low physical activity, trauma, infections, and glucose overload, are potentially relevant factors in development of T1D. It has also been demonstrated that chronic stress and obesity form a vicious circle which leads to a definitive metabolic failure, increasing the risk of developing T2D. In this review, we will provide the most recent data concerning the role of stress in the outcomes of T1D and T2D, with a focus on the role of physical and psychological stress on the onset of T1D.","container-title":"Hormone Research in Paediatrics","DOI":"10.1159/000522431","ISSN":"1663-2826","issue":"1","journalAbbreviation":"Horm Res Paediatr","language":"eng","note":"PMID: 35124671","page":"34-43","source":"PubMed","title":"Stress and Diabetes Mellitus: Pathogenetic Mechanisms and Clinical Outcome","title-short":"Stress and Diabetes Mellitus","volume":"96","author":[{"family":"Ingrosso","given":"Diletta Maria Francesca"},{"family":"Primavera","given":"Marina"},{"family":"Samvelyan","given":"Sona"},{"family":"Tagi","given":"Veronica Maria"},{"family":"Chiarelli","given":"Francesco"}],"issued":{"date-parts":[["2023"]]}}}],"schema":"https://github.com/citation-style-language/schema/raw/master/csl-citation.json"} </w:instrText>
+        <w:instrText xml:space="preserve"> ADDIN ZOTERO_ITEM CSL_CITATION {"citationID":"M57XEHIn","properties":{"formattedCitation":"(2)","plainCitation":"(2)","noteIndex":0},"citationItems":[{"id":"fATidvy9/IUbJ3Cy4","uris":["http://zotero.org/users/2695081/items/NFIEYI62"],"itemData":{"id":1813,"type":"article-journal","abstract":"Evidence suggests that psychological and physical stress are relevant triggering factors for the onset of type 1 diabetes (T1D) and type 2 diabetes (T2D). The underlying mechanisms involve a complex neuroendocrine structure, involving the central nervous system and the periphery. Psychological stress leads to an increase of serum glucocorticoid concentrations and catecholamines release increasing the insulin need and the insulin resistance. According to the β-cell stress hypothesis, also causes of increased insulin demand, such as rapid growth, overweight, puberty, low physical activity, trauma, infections, and glucose overload, are potentially relevant factors in development of T1D. It has also been demonstrated that chronic stress and obesity form a vicious circle which leads to a definitive metabolic failure, increasing the risk of developing T2D. In this review, we will provide the most recent data concerning the role of stress in the outcomes of T1D and T2D, with a focus on the role of physical and psychological stress on the onset of T1D.","container-title":"Hormone Research in Paediatrics","DOI":"10.1159/000522431","ISSN":"1663-2826","issue":"1","journalAbbreviation":"Horm Res Paediatr","language":"eng","note":"PMID: 35124671","page":"34-43","source":"PubMed","title":"Stress and Diabetes Mellitus: Pathogenetic Mechanisms and Clinical Outcome","title-short":"Stress and Diabetes Mellitus","volume":"96","author":[{"family":"Ingrosso","given":"Diletta Maria Francesca"},{"family":"Primavera","given":"Marina"},{"family":"Samvelyan","given":"Sona"},{"family":"Tagi","given":"Veronica Maria"},{"family":"Chiarelli","given":"Francesco"}],"issued":{"date-parts":[["2023"]]}}}],"schema":"https://github.com/citation-style-language/schema/raw/master/csl-citation.json"} </w:instrText>
       </w:r>
       <w:r>
         <w:fldChar w:fldCharType="separate"/>
@@ -144,7 +165,7 @@
         <w:fldChar w:fldCharType="begin"/>
       </w:r>
       <w:r>
-        <w:instrText xml:space="preserve"> ADDIN ZOTERO_ITEM CSL_CITATION {"citationID":"uXca1Ecw","properties":{"formattedCitation":"(3)","plainCitation":"(3)","noteIndex":0},"citationItems":[{"id":"DNVojJss/ZF5iML6h","uris":["http://zotero.org/users/2695081/items/9FN2SLJA"],"itemData":{"id":1825,"type":"article-journal","abstract":"Many pathways connect stress and obesity, two highly prevalent problems facing society today. First, stress interferes with cognitive processes such as executive function and self-regulation. Second, stress can affect behavior by inducing overeating and consumption of foods that are high in calories, fat, or sugar; by decreasing physical activity; and by shortening sleep. Third, stress triggers physiological changes in the hypothalamic-pituitary-adrenal axis, reward processing in the brain, and possibly the gut microbiome. Finally, stress can stimulate production of biochemical hormones and peptides such as leptin, ghrelin, and neuropeptide Y. Obesity itself can be a stressful state due to the high prevalence of weight stigma. This article therefore traces the contribution of weight stigma to stress and obesogenic processes, ultimately describing a vicious cycle of stress to obesity to stigma to stress. Current obesity prevention efforts focus solely on eating and exercise; the evidence reviewed in this article points to stress as an important but currently overlooked public policy target.","container-title":"Annual Review of Psychology","DOI":"10.1146/annurev-psych-010418-102936","ISSN":"0066-4308, 1545-2085","issue":"1","journalAbbreviation":"Annu. Rev. Psychol.","language":"en","page":"703-718","source":"DOI.org (Crossref)","title":"Stress and Obesity","volume":"70","author":[{"family":"Tomiyama","given":"A. Janet"}],"issued":{"date-parts":[["2019",1,4]]}}}],"schema":"https://github.com/citation-style-language/schema/raw/master/csl-citation.json"} </w:instrText>
+        <w:instrText xml:space="preserve"> ADDIN ZOTERO_ITEM CSL_CITATION {"citationID":"uXca1Ecw","properties":{"formattedCitation":"(3)","plainCitation":"(3)","noteIndex":0},"citationItems":[{"id":"fATidvy9/KOoerl1a","uris":["http://zotero.org/users/2695081/items/9FN2SLJA"],"itemData":{"id":1825,"type":"article-journal","abstract":"Many pathways connect stress and obesity, two highly prevalent problems facing society today. First, stress interferes with cognitive processes such as executive function and self-regulation. Second, stress can affect behavior by inducing overeating and consumption of foods that are high in calories, fat, or sugar; by decreasing physical activity; and by shortening sleep. Third, stress triggers physiological changes in the hypothalamic-pituitary-adrenal axis, reward processing in the brain, and possibly the gut microbiome. Finally, stress can stimulate production of biochemical hormones and peptides such as leptin, ghrelin, and neuropeptide Y. Obesity itself can be a stressful state due to the high prevalence of weight stigma. This article therefore traces the contribution of weight stigma to stress and obesogenic processes, ultimately describing a vicious cycle of stress to obesity to stigma to stress. Current obesity prevention efforts focus solely on eating and exercise; the evidence reviewed in this article points to stress as an important but currently overlooked public policy target.","container-title":"Annual Review of Psychology","DOI":"10.1146/annurev-psych-010418-102936","ISSN":"0066-4308, 1545-2085","issue":"1","journalAbbreviation":"Annu. Rev. Psychol.","language":"en","page":"703-718","source":"DOI.org (Crossref)","title":"Stress and Obesity","volume":"70","author":[{"family":"Tomiyama","given":"A. Janet"}],"issued":{"date-parts":[["2019",1,4]]}}}],"schema":"https://github.com/citation-style-language/schema/raw/master/csl-citation.json"} </w:instrText>
       </w:r>
       <w:r>
         <w:fldChar w:fldCharType="separate"/>
@@ -177,7 +198,7 @@
         <w:fldChar w:fldCharType="begin"/>
       </w:r>
       <w:r>
-        <w:instrText xml:space="preserve"> ADDIN ZOTERO_ITEM CSL_CITATION {"citationID":"g6EUyo8B","properties":{"formattedCitation":"(2)","plainCitation":"(2)","noteIndex":0},"citationItems":[{"id":"DNVojJss/JvUt2zVY","uris":["http://zotero.org/users/2695081/items/NFIEYI62"],"itemData":{"id":1813,"type":"article-journal","abstract":"Evidence suggests that psychological and physical stress are relevant triggering factors for the onset of type 1 diabetes (T1D) and type 2 diabetes (T2D). The underlying mechanisms involve a complex neuroendocrine structure, involving the central nervous system and the periphery. Psychological stress leads to an increase of serum glucocorticoid concentrations and catecholamines release increasing the insulin need and the insulin resistance. According to the β-cell stress hypothesis, also causes of increased insulin demand, such as rapid growth, overweight, puberty, low physical activity, trauma, infections, and glucose overload, are potentially relevant factors in development of T1D. It has also been demonstrated that chronic stress and obesity form a vicious circle which leads to a definitive metabolic failure, increasing the risk of developing T2D. In this review, we will provide the most recent data concerning the role of stress in the outcomes of T1D and T2D, with a focus on the role of physical and psychological stress on the onset of T1D.","container-title":"Hormone Research in Paediatrics","DOI":"10.1159/000522431","ISSN":"1663-2826","issue":"1","journalAbbreviation":"Horm Res Paediatr","language":"eng","note":"PMID: 35124671","page":"34-43","source":"PubMed","title":"Stress and Diabetes Mellitus: Pathogenetic Mechanisms and Clinical Outcome","title-short":"Stress and Diabetes Mellitus","volume":"96","author":[{"family":"Ingrosso","given":"Diletta Maria Francesca"},{"family":"Primavera","given":"Marina"},{"family":"Samvelyan","given":"Sona"},{"family":"Tagi","given":"Veronica Maria"},{"family":"Chiarelli","given":"Francesco"}],"issued":{"date-parts":[["2023"]]}}}],"schema":"https://github.com/citation-style-language/schema/raw/master/csl-citation.json"} </w:instrText>
+        <w:instrText xml:space="preserve"> ADDIN ZOTERO_ITEM CSL_CITATION {"citationID":"g6EUyo8B","properties":{"formattedCitation":"(2)","plainCitation":"(2)","noteIndex":0},"citationItems":[{"id":"fATidvy9/IUbJ3Cy4","uris":["http://zotero.org/users/2695081/items/NFIEYI62"],"itemData":{"id":1813,"type":"article-journal","abstract":"Evidence suggests that psychological and physical stress are relevant triggering factors for the onset of type 1 diabetes (T1D) and type 2 diabetes (T2D). The underlying mechanisms involve a complex neuroendocrine structure, involving the central nervous system and the periphery. Psychological stress leads to an increase of serum glucocorticoid concentrations and catecholamines release increasing the insulin need and the insulin resistance. According to the β-cell stress hypothesis, also causes of increased insulin demand, such as rapid growth, overweight, puberty, low physical activity, trauma, infections, and glucose overload, are potentially relevant factors in development of T1D. It has also been demonstrated that chronic stress and obesity form a vicious circle which leads to a definitive metabolic failure, increasing the risk of developing T2D. In this review, we will provide the most recent data concerning the role of stress in the outcomes of T1D and T2D, with a focus on the role of physical and psychological stress on the onset of T1D.","container-title":"Hormone Research in Paediatrics","DOI":"10.1159/000522431","ISSN":"1663-2826","issue":"1","journalAbbreviation":"Horm Res Paediatr","language":"eng","note":"PMID: 35124671","page":"34-43","source":"PubMed","title":"Stress and Diabetes Mellitus: Pathogenetic Mechanisms and Clinical Outcome","title-short":"Stress and Diabetes Mellitus","volume":"96","author":[{"family":"Ingrosso","given":"Diletta Maria Francesca"},{"family":"Primavera","given":"Marina"},{"family":"Samvelyan","given":"Sona"},{"family":"Tagi","given":"Veronica Maria"},{"family":"Chiarelli","given":"Francesco"}],"issued":{"date-parts":[["2023"]]}}}],"schema":"https://github.com/citation-style-language/schema/raw/master/csl-citation.json"} </w:instrText>
       </w:r>
       <w:r>
         <w:fldChar w:fldCharType="separate"/>
@@ -192,7 +213,10 @@
         <w:fldChar w:fldCharType="end"/>
       </w:r>
       <w:r>
-        <w:t>. Furthermore, stress often correlates with unhealthy lifestyle choices, such as poor diet and physical inactivity, which are significant risk factors for obesity and diabetes</w:t>
+        <w:t xml:space="preserve">. </w:t>
+      </w:r>
+      <w:r>
+        <w:t>We have shown in mice that chronically elevated external glucocorticoids act synergistically with diet-induced obesity, leading to exacerbations in metabolic dysfunction</w:t>
       </w:r>
       <w:r>
         <w:t xml:space="preserve"> </w:t>
@@ -201,7 +225,49 @@
         <w:fldChar w:fldCharType="begin"/>
       </w:r>
       <w:r>
-        <w:instrText xml:space="preserve"> ADDIN ZOTERO_ITEM CSL_CITATION {"citationID":"FfVoWjjp","properties":{"formattedCitation":"(3)","plainCitation":"(3)","noteIndex":0},"citationItems":[{"id":"DNVojJss/ZF5iML6h","uris":["http://zotero.org/users/2695081/items/9FN2SLJA"],"itemData":{"id":1825,"type":"article-journal","abstract":"Many pathways connect stress and obesity, two highly prevalent problems facing society today. First, stress interferes with cognitive processes such as executive function and self-regulation. Second, stress can affect behavior by inducing overeating and consumption of foods that are high in calories, fat, or sugar; by decreasing physical activity; and by shortening sleep. Third, stress triggers physiological changes in the hypothalamic-pituitary-adrenal axis, reward processing in the brain, and possibly the gut microbiome. Finally, stress can stimulate production of biochemical hormones and peptides such as leptin, ghrelin, and neuropeptide Y. Obesity itself can be a stressful state due to the high prevalence of weight stigma. This article therefore traces the contribution of weight stigma to stress and obesogenic processes, ultimately describing a vicious cycle of stress to obesity to stigma to stress. Current obesity prevention efforts focus solely on eating and exercise; the evidence reviewed in this article points to stress as an important but currently overlooked public policy target.","container-title":"Annual Review of Psychology","DOI":"10.1146/annurev-psych-010418-102936","ISSN":"0066-4308, 1545-2085","issue":"1","journalAbbreviation":"Annu. Rev. Psychol.","language":"en","page":"703-718","source":"DOI.org (Crossref)","title":"Stress and Obesity","volume":"70","author":[{"family":"Tomiyama","given":"A. Janet"}],"issued":{"date-parts":[["2019",1,4]]}}}],"schema":"https://github.com/citation-style-language/schema/raw/master/csl-citation.json"} </w:instrText>
+        <w:instrText xml:space="preserve"> ADDIN ZOTERO_ITEM CSL_CITATION {"citationID":"5aWkX9TS","properties":{"formattedCitation":"(4, 5)","plainCitation":"(4, 5)","noteIndex":0},"citationItems":[{"id":"fATidvy9/DRHt4VpV","uris":["http://zotero.org/users/2695081/items/ABIIT6F6"],"itemData":{"id":1829,"type":"article-journal","container-title":"Endocrinology","DOI":"10.1210/en.2018-00147","ISSN":"1945-7170","issue":"6","language":"en","page":"2275-2287","source":"DOI.org (Crossref)","title":"Glucocorticoid-Induced Metabolic Disturbances Are Exacerbated in Obese Male Mice","volume":"159","author":[{"family":"Harvey","given":"Innocence"},{"family":"Stephenson","given":"Erin J"},{"family":"Redd","given":"JeAnna R"},{"family":"Tran","given":"Quynh T"},{"family":"Hochberg","given":"Irit"},{"family":"Qi","given":"Nathan"},{"family":"Bridges","given":"Dave"}],"issued":{"date-parts":[["2018",6,1]]}}},{"id":"fATidvy9/57HHE831","uris":["http://zotero.org/users/2695081/items/455VREYL"],"itemData":{"id":"wYajtxYE/4E01BWQ9","type":"article-journal","abstract":"Glucocorticoids promote muscle atrophy by inducing a class of proteins called atrogenes, resulting in reductions in muscle size and strength. In this work, we evaluated whether a mouse model with pre-existing diet-induced obesity had altered glucocorticoid responsiveness. We observed that all animals treated with the synthetic glucocorticoid dexamethasone had reduced strength, but that obesity exacerbated this effect. These changes were concordant with more pronounced reductions in muscle size, particularly in Type II muscle fibers, and potentiated induction of atrogene expression in the obese mice relative to lean mice. Furthermore, we show that the reductions in lean mass do not fully account for the dexamethasone-induced insulin resistance observed in these mice. Together, these data suggest that obesity potentiates glucocorticoid-induced muscle atrophy.","container-title":"Biomedicines","DOI":"10.3390/biomedicines8100420","ISSN":"2227-9059","issue":"10","journalAbbreviation":"Biomedicines","language":"en","page":"420","source":"DOI.org (Crossref)","title":"Obesity Augments Glucocorticoid-Dependent Muscle Atrophy in Male C57BL/6J Mice","volume":"8","author":[{"family":"Gunder","given":"Laura C."},{"family":"Harvey","given":"Innocence"},{"family":"Redd","given":"JeAnna R."},{"family":"Davis","given":"Carol S."},{"family":"AL-Tamimi","given":"Ayat"},{"family":"Brooks","given":"Susan V."},{"family":"Bridges","given":"Dave"}],"issued":{"date-parts":[["2020",10,15]]}}}],"schema":"https://github.com/citation-style-language/schema/raw/master/csl-citation.json"} </w:instrText>
+      </w:r>
+      <w:r>
+        <w:fldChar w:fldCharType="separate"/>
+      </w:r>
+      <w:r>
+        <w:rPr>
+          <w:lang w:val="en-GB"/>
+        </w:rPr>
+        <w:t>(4, 5)</w:t>
+      </w:r>
+      <w:r>
+        <w:fldChar w:fldCharType="end"/>
+      </w:r>
+      <w:r>
+        <w:t xml:space="preserve">. </w:t>
+      </w:r>
+      <w:r>
+        <w:t xml:space="preserve"> </w:t>
+      </w:r>
+      <w:r>
+        <w:t xml:space="preserve">Furthermore, stress often correlates with unhealthy lifestyle choices, such as poor diet and physical inactivity, which are </w:t>
+      </w:r>
+      <w:r>
+        <w:t xml:space="preserve">also </w:t>
+      </w:r>
+      <w:r>
+        <w:t xml:space="preserve">significant risk factors for </w:t>
+      </w:r>
+      <w:r>
+        <w:t xml:space="preserve">both </w:t>
+      </w:r>
+      <w:r>
+        <w:t>obesity and diabetes</w:t>
+      </w:r>
+      <w:r>
+        <w:t xml:space="preserve"> </w:t>
+      </w:r>
+      <w:r>
+        <w:fldChar w:fldCharType="begin"/>
+      </w:r>
+      <w:r>
+        <w:instrText xml:space="preserve"> ADDIN ZOTERO_ITEM CSL_CITATION {"citationID":"FfVoWjjp","properties":{"formattedCitation":"(3)","plainCitation":"(3)","noteIndex":0},"citationItems":[{"id":"fATidvy9/KOoerl1a","uris":["http://zotero.org/users/2695081/items/9FN2SLJA"],"itemData":{"id":1825,"type":"article-journal","abstract":"Many pathways connect stress and obesity, two highly prevalent problems facing society today. First, stress interferes with cognitive processes such as executive function and self-regulation. Second, stress can affect behavior by inducing overeating and consumption of foods that are high in calories, fat, or sugar; by decreasing physical activity; and by shortening sleep. Third, stress triggers physiological changes in the hypothalamic-pituitary-adrenal axis, reward processing in the brain, and possibly the gut microbiome. Finally, stress can stimulate production of biochemical hormones and peptides such as leptin, ghrelin, and neuropeptide Y. Obesity itself can be a stressful state due to the high prevalence of weight stigma. This article therefore traces the contribution of weight stigma to stress and obesogenic processes, ultimately describing a vicious cycle of stress to obesity to stigma to stress. Current obesity prevention efforts focus solely on eating and exercise; the evidence reviewed in this article points to stress as an important but currently overlooked public policy target.","container-title":"Annual Review of Psychology","DOI":"10.1146/annurev-psych-010418-102936","ISSN":"0066-4308, 1545-2085","issue":"1","journalAbbreviation":"Annu. Rev. Psychol.","language":"en","page":"703-718","source":"DOI.org (Crossref)","title":"Stress and Obesity","volume":"70","author":[{"family":"Tomiyama","given":"A. Janet"}],"issued":{"date-parts":[["2019",1,4]]}}}],"schema":"https://github.com/citation-style-language/schema/raw/master/csl-citation.json"} </w:instrText>
       </w:r>
       <w:r>
         <w:fldChar w:fldCharType="separate"/>
@@ -223,22 +289,28 @@
         <w:t>.</w:t>
       </w:r>
       <w:r>
-        <w:t xml:space="preserve"> We have shown in mice that chronically elevated external glucocorticoids act </w:t>
-      </w:r>
-      <w:r>
-        <w:t>synergistically</w:t>
-      </w:r>
-      <w:r>
-        <w:t xml:space="preserve"> with diet-induced obesity, leading to exacerbations in metabolic dysfunction</w:t>
-      </w:r>
-      <w:r>
         <w:t xml:space="preserve"> </w:t>
       </w:r>
+    </w:p>
+    <w:p/>
+    <w:p>
+      <w:r>
+        <w:t xml:space="preserve">In humans, although several key studies have identified a robust association between stress and the development of diabetes, most of these studies did not determine whether the metabolic effect of stress is different between obese and lean individuals. </w:t>
+      </w:r>
+      <w:r>
+        <w:t>A selective effect of chronic stress on development of diabetes in wom</w:t>
+      </w:r>
+      <w:r>
+        <w:t>e</w:t>
+      </w:r>
+      <w:r>
+        <w:t xml:space="preserve">n but not in men was also demonstrated in the Australian Diabetes, Obesity and Lifestyle study </w:t>
+      </w:r>
       <w:r>
         <w:fldChar w:fldCharType="begin"/>
       </w:r>
       <w:r>
-        <w:instrText xml:space="preserve"> ADDIN ZOTERO_ITEM CSL_CITATION {"citationID":"5aWkX9TS","properties":{"formattedCitation":"(4, 5)","plainCitation":"(4, 5)","noteIndex":0},"citationItems":[{"id":"DNVojJss/JUJ2TG0Q","uris":["http://zotero.org/users/2695081/items/ABIIT6F6"],"itemData":{"id":1829,"type":"article-journal","container-title":"Endocrinology","DOI":"10.1210/en.2018-00147","ISSN":"1945-7170","issue":"6","language":"en","page":"2275-2287","source":"DOI.org (Crossref)","title":"Glucocorticoid-Induced Metabolic Disturbances Are Exacerbated in Obese Male Mice","volume":"159","author":[{"family":"Harvey","given":"Innocence"},{"family":"Stephenson","given":"Erin J"},{"family":"Redd","given":"JeAnna R"},{"family":"Tran","given":"Quynh T"},{"family":"Hochberg","given":"Irit"},{"family":"Qi","given":"Nathan"},{"family":"Bridges","given":"Dave"}],"issued":{"date-parts":[["2018",6,1]]}}},{"id":"DNVojJss/6l3QDrs3","uris":["http://zotero.org/users/2695081/items/455VREYL"],"itemData":{"id":"wYajtxYE/4E01BWQ9","type":"article-journal","abstract":"Glucocorticoids promote muscle atrophy by inducing a class of proteins called atrogenes, resulting in reductions in muscle size and strength. In this work, we evaluated whether a mouse model with pre-existing diet-induced obesity had altered glucocorticoid responsiveness. We observed that all animals treated with the synthetic glucocorticoid dexamethasone had reduced strength, but that obesity exacerbated this effect. These changes were concordant with more pronounced reductions in muscle size, particularly in Type II muscle fibers, and potentiated induction of atrogene expression in the obese mice relative to lean mice. Furthermore, we show that the reductions in lean mass do not fully account for the dexamethasone-induced insulin resistance observed in these mice. Together, these data suggest that obesity potentiates glucocorticoid-induced muscle atrophy.","container-title":"Biomedicines","DOI":"10.3390/biomedicines8100420","ISSN":"2227-9059","issue":"10","journalAbbreviation":"Biomedicines","language":"en","page":"420","source":"DOI.org (Crossref)","title":"Obesity Augments Glucocorticoid-Dependent Muscle Atrophy in Male C57BL/6J Mice","volume":"8","author":[{"family":"Gunder","given":"Laura C."},{"family":"Harvey","given":"Innocence"},{"family":"Redd","given":"JeAnna R."},{"family":"Davis","given":"Carol S."},{"family":"AL-Tamimi","given":"Ayat"},{"family":"Brooks","given":"Susan V."},{"family":"Bridges","given":"Dave"}],"issued":{"date-parts":[["2020",10,15]]}}}],"schema":"https://github.com/citation-style-language/schema/raw/master/csl-citation.json"} </w:instrText>
+        <w:instrText xml:space="preserve"> ADDIN ZOTERO_ITEM CSL_CITATION {"citationID":"AFe5E0pt","properties":{"formattedCitation":"(6)","plainCitation":"(6)","noteIndex":0},"citationItems":[{"id":"fATidvy9/kIsy3RR0","uris":["http://zotero.org/users/2695081/items/VA42I7LX"],"itemData":{"id":1807,"type":"article-journal","abstract":"BACKGROUND: The evidence supporting a relationship between stress and diabetes has been inconsistent.\nPURPOSE: This study examined the effects of stress on abnormal glucose metabolism, using a population-based sample of 3,759, with normoglycemia at baseline, from the Australian Diabetes, Obesity and Lifestyle study.\nMETHODS: Perceived stress and stressful life events were measured at baseline, with health behavior and anthropometric information also collected. Oral glucose tolerance tests were undertaken at baseline and 5-year follow-up. The primary outcome was the development of abnormal glucose metabolism (impaired fasting glucose, impaired glucose tolerance, and type 2 diabetes), according to WHO 1999 criteria.\nRESULTS: Perceived stress predicted incident abnormal glucose metabolism in women but not men, after multivariate adjustment. Life events showed an inconsistent relationship with abnormal glucose metabolism.\nCONCLUSIONS: Perceived stress predicted abnormal glucose metabolism in women. Healthcare professionals should consider psychosocial adversity when assessing risk factor profiles for the development of diabetes.","container-title":"Annals of Behavioral Medicine: A Publication of the Society of Behavioral Medicine","DOI":"10.1007/s12160-013-9473-y","ISSN":"1532-4796","issue":"1","journalAbbreviation":"Ann Behav Med","language":"eng","note":"PMID: 23389687","page":"62-72","source":"PubMed","title":"Psychosocial stress predicts abnormal glucose metabolism: the Australian Diabetes, Obesity and Lifestyle (AusDiab) study","title-short":"Psychosocial stress predicts abnormal glucose metabolism","volume":"46","author":[{"family":"Williams","given":"Emily D."},{"family":"Magliano","given":"Dianna J."},{"family":"Tapp","given":"Robyn J."},{"family":"Oldenburg","given":"Brian F."},{"family":"Shaw","given":"Jonathan E."}],"issued":{"date-parts":[["2013",8]]}}}],"schema":"https://github.com/citation-style-language/schema/raw/master/csl-citation.json"} </w:instrText>
       </w:r>
       <w:r>
         <w:fldChar w:fldCharType="separate"/>
@@ -247,104 +319,144 @@
         <w:rPr>
           <w:lang w:val="en-GB"/>
         </w:rPr>
-        <w:t>(4, 5)</w:t>
+        <w:t>(6)</w:t>
       </w:r>
       <w:r>
         <w:fldChar w:fldCharType="end"/>
       </w:r>
       <w:r>
+        <w:t xml:space="preserve">. </w:t>
+      </w:r>
+      <w:r>
+        <w:t xml:space="preserve">Longitudinally, adverse childhood experiences  </w:t>
+      </w:r>
+      <w:r>
+        <w:fldChar w:fldCharType="begin"/>
+      </w:r>
+      <w:r>
+        <w:instrText xml:space="preserve"> ADDIN ZOTERO_ITEM CSL_CITATION {"citationID":"xTFeHYVe","properties":{"formattedCitation":"(7)","plainCitation":"(7)","noteIndex":0},"citationItems":[{"id":11564,"uris":["http://zotero.org/users/7317906/items/M9DE89XP"],"itemData":{"id":11564,"type":"article-journal","abstract":"Background\nThe association between adverse childhood experiences (ACEs) and diabetes is unclear. This systematic review and meta-analysis aims to quantify the association between the number and types of ACEs and diabetes during adulthood based on available observational studies.\n\nMethods\nA comprehensive literature search of studies exploring the association between ACEs and diabetes was conducted in PubMed, Medline, and Embase databases until 15 April 2022. A random-effects model was used to pool odds ratios (ORs) and 95% confidence intervals (CIs) for the number and types of ACEs with diabetes. Regarding the association between the number of ACEs and diabetes, we used funnel plots to examine publication bias, subgroup analysis to explore sources of heterogeneity, and sensitivity analysis to explore the robustness of the pooled results.\n\nResults\nA total of 49 studies were included. Individuals with higher continuous ACEs (per each additional ACE: OR = 1.06, 95% CI = 1.02-1.10), any ACE (OR = 1.22, 95% CI = 1.16-1.28), or ≥4 ACEs (OR = 1.44, 95% CI = 1.27-1.63) were at an increased risk of diabetes in adulthood when compared with individuals without ACEs. Across specific ACE types, childhood economic adversity (OR = 1.11, 95% CI = 1.04-1.19), physical abuse (OR = 1.14, 95% CI = 1.07-1.21), sexual abuse (OR = 1.25, 95% CI = 1.12-1.39), verbal abuse (OR = 1.11, 95% CI = 1.03-1.20), and incarceration (OR = 1.22, 95% CI = 1.03-1.45) were associated with diabetes. However, neglect, emotional abuse, domestic violence, parental divorce or separation, parental death, and living with a family member with substance abuse or mental disorders were not significantly associated with diabetes.\n\nConclusions\nIndividuals with ACEs may have a cumulative risk for diabetes in adulthood. It is critical to prevent ACEs and build resilience in individuals affected by ACEs.","container-title":"Journal of Global Health","DOI":"10.7189/jogh.12.04082","ISSN":"2047-2978","journalAbbreviation":"J Glob Health","note":"PMID: 36318589\nPMCID: PMC9624439","page":"04082","source":"PubMed Central","title":"Adverse childhood experiences and risk of diabetes: A systematic review and meta-analysis","title-short":"Adverse childhood experiences and risk of diabetes","volume":"12","author":[{"family":"Zhu","given":"Siyu"},{"family":"Shan","given":"Shiyi"},{"family":"Liu","given":"Wen"},{"family":"Li","given":"Shuting"},{"family":"Hou","given":"Leying"},{"family":"Huang","given":"Xuanyin"},{"family":"Liu","given":"Yi"},{"family":"Yi","given":"Qian"},{"family":"Sun","given":"Weidi"},{"family":"Tang","given":"Kun"},{"family":"Adeloye","given":"Davies"},{"family":"Rudan","given":"Igor"},{"family":"Song","given":"Peige"}],"citation-key":"zhuAdverseChildhoodExperiences"}}],"schema":"https://github.com/citation-style-language/schema/raw/master/csl-citation.json"} </w:instrText>
+      </w:r>
+      <w:r>
+        <w:fldChar w:fldCharType="separate"/>
+      </w:r>
+      <w:r>
+        <w:rPr>
+          <w:noProof/>
+        </w:rPr>
+        <w:t>(7)</w:t>
+      </w:r>
+      <w:r>
+        <w:fldChar w:fldCharType="end"/>
+      </w:r>
+      <w:r>
         <w:t xml:space="preserve"> </w:t>
       </w:r>
+      <w:r>
+        <w:t xml:space="preserve">and job-related stress </w:t>
+      </w:r>
+      <w:r>
+        <w:fldChar w:fldCharType="begin"/>
+      </w:r>
+      <w:r>
+        <w:instrText xml:space="preserve"> ADDIN ZOTERO_ITEM CSL_CITATION {"citationID":"st3OFhFV","properties":{"formattedCitation":"(8)","plainCitation":"(8)","noteIndex":0},"citationItems":[{"id":8716,"uris":["http://zotero.org/users/7317906/items/K39JC8JQ"],"itemData":{"id":8716,"type":"article-journal","abstract":"OBJECTIVE - To investigate the effect of psychosocial stress at work on risk of type 2 diabetes, adjusting for conventional risk factors, among a sample of British, white-collar, middleaged men and women. RESEARCH DESIGN AND METHODS - This was a prospective analysis (1991-2004) from the Whitehall II cohort study. The current sample consists of 5,895 Caucasian middle-aged civil servants free from diabetes at baseline. Type 2 diabetes was ascertained by an oral glucose tolerance test supplemented by self-reports at baseline and four consecutive waves of data collection including two screening phases. The job strain and iso-strain models were used to assess psychosocial work stress. RESULTS- Iso-strain in the workplace was associated with a twofold higher risk of type 2 diabetes in age-adjusted analysis in women but not in men (hazard ratio 1.94 [95% CI 1.17-3.21). This effect remained robust to adjustment for socioeconomic position and outside work stressors and was only attenuated by 20% after adjustment for health behaviors, obesity, and other type 2 diabetes risk factors. CONCLUSIONS - Psychosocial work stress was an independent predictor of type 2 diabetes among women after a 15-year follow-up. This association was not explained by potential confounding and mediating factors. More evidence from prospective studies using the same work stress models is needed to support the current findings and provide further information on sex differences. © 2009 by the American Diabetes Association.","container-title":"Diabetes Care","DOI":"10.2337/dc09-0132","ISSN":"01495992","issue":"12","note":"PMID: 19720842\nCitation Key: Heraclides2009","page":"2230-2235","title":"Psychosocial stress at work doubles the risk of type 2 diabetes in middle-aged women: Evidence from the Whitehall II study","volume":"32","author":[{"family":"Heraclides","given":"Alexandros M."},{"family":"Chandola","given":"Tarani"},{"family":"Witte","given":"Daniel R."},{"family":"Brunner","given":"Eric J."}],"issued":{"date-parts":[["2009"]]},"citation-key":"Heraclides2009"}}],"schema":"https://github.com/citation-style-language/schema/raw/master/csl-citation.json"} </w:instrText>
+      </w:r>
+      <w:r>
+        <w:fldChar w:fldCharType="separate"/>
+      </w:r>
+      <w:r>
+        <w:rPr>
+          <w:noProof/>
+        </w:rPr>
+        <w:t>(8)</w:t>
+      </w:r>
+      <w:r>
+        <w:fldChar w:fldCharType="end"/>
+      </w:r>
+      <w:r>
+        <w:t xml:space="preserve"> are also associated with diabetes risk.  </w:t>
+      </w:r>
+      <w:r>
+        <w:t xml:space="preserve">The only major study that addressed the combined effect of stress and obesity on diabetes is the Whitehall II study, </w:t>
+      </w:r>
+      <w:r>
+        <w:t>which</w:t>
+      </w:r>
+      <w:r>
+        <w:t xml:space="preserve"> found that work stress strongly increased the </w:t>
+      </w:r>
+      <w:r>
+        <w:t>likelihood</w:t>
+      </w:r>
+      <w:r>
+        <w:t xml:space="preserve"> of diabetes in obese women, with no apparent effect in obese men </w:t>
+      </w:r>
+      <w:r>
+        <w:t>or</w:t>
+      </w:r>
+      <w:r>
+        <w:t xml:space="preserve"> lean women </w:t>
+      </w:r>
+      <w:r>
+        <w:fldChar w:fldCharType="begin"/>
+      </w:r>
+      <w:r>
+        <w:instrText xml:space="preserve"> ADDIN ZOTERO_ITEM CSL_CITATION {"citationID":"K8XBA9DN","properties":{"formattedCitation":"(9)","plainCitation":"(9)","noteIndex":0},"citationItems":[{"id":"fATidvy9/NEBiBgsN","uris":["http://zotero.org/users/2695081/items/3FLNIKRN"],"itemData":{"id":1804,"type":"article-journal","abstract":"Psychosocial work stress has been linked to higher risk of type 2 diabetes (T2DM), with the effect being consistently higher among women than men. Also, work stress has been linked to prospective weight gain among obese men but weight loss among lean men. Here, we aimed to examine the interaction between work stress and obesity in relation to T2DM risk in a gender-specific manner. We studied 5,568 white middle-aged men and women in the Whitehall II study, who were free from diabetes at analysis baseline (1993). After 1993, diabetes was ascertained at six consecutive phases by an oral glucose tolerance test supplemented by self-reports. Cox regression analysis was used to assess the association between job strain (high job demands/low job control) and 18-year incident T2DM stratifying by BMI (BMI &lt;30 kg/m(2) vs. BMI ≥30 kg/m(2)). Overall, work stress was associated with incident T2DM among women (hazard ratio (HR) 1.41: 95% confidence intervals: 1.02; 1.95) but not among men (HR 0.87: 95% confidence interval 0.69; 1.11) (P(INTERACTION) = 0.017). Among men, work stress was associated with a lower risk of T2DM in nonobese (HR 0.70: 0.53; 0.93) but not in obese individuals (P(INTERACTION) = 0.17). Among women, work stress was associated with higher risk of T2DM in the obese (HR 2.01: 1.06; 3.92) but not in the nonobese (P(INTERACTION) = 0.005). Gender and body weight status play a critical role in determining the direction of the association between psychosocial stress and T2DM. The potential effect-modifying role of gender and obesity should not be ignored by future studies looking at stress-disease associations.","container-title":"Obesity (Silver Spring, Md.)","DOI":"10.1038/oby.2011.95","ISSN":"1930-739X","issue":"2","journalAbbreviation":"Obesity (Silver Spring)","language":"eng","note":"PMID: 21593804","page":"428-433","source":"PubMed","title":"Work stress, obesity and the risk of type 2 diabetes: gender-specific bidirectional effect in the Whitehall II study","title-short":"Work stress, obesity and the risk of type 2 diabetes","volume":"20","author":[{"family":"Heraclides","given":"Alexandros M."},{"family":"Chandola","given":"Tarani"},{"family":"Witte","given":"Daniel R."},{"family":"Brunner","given":"Eric J."}],"issued":{"date-parts":[["2012",2]]}}}],"schema":"https://github.com/citation-style-language/schema/raw/master/csl-citation.json"} </w:instrText>
+      </w:r>
+      <w:r>
+        <w:fldChar w:fldCharType="separate"/>
+      </w:r>
+      <w:r>
+        <w:rPr>
+          <w:lang w:val="en-GB"/>
+        </w:rPr>
+        <w:t>(9)</w:t>
+      </w:r>
+      <w:r>
+        <w:fldChar w:fldCharType="end"/>
+      </w:r>
+      <w:r>
+        <w:t xml:space="preserve">.  In a smaller study, patients with obesity and diabetes who also had depression stress had exacerbated biochemical changes associated with obesity, including lower adiponectin and higher cortisol, as compared to patients with diabetes and obesity without depression </w:t>
+      </w:r>
+      <w:r>
+        <w:fldChar w:fldCharType="begin"/>
+      </w:r>
+      <w:r>
+        <w:instrText xml:space="preserve"> ADDIN ZOTERO_ITEM CSL_CITATION {"citationID":"qb5nzjnv","properties":{"formattedCitation":"(10)","plainCitation":"(10)","noteIndex":0},"citationItems":[{"id":"fATidvy9/443Oi9Cd","uris":["http://zotero.org/users/2695081/items/QVI959H8"],"itemData":{"id":1810,"type":"article-journal","abstract":"PURPOSE: Type 2 diabetes mellitus (T2DM), a metabolic disorder, remains associated with a physiological impairment affecting large populations worldwide. Onset of T2DM is multifactorial where obesity and abnormal basal metabolic rate are considered most critical. Of people diagnosed with T2DM, about 80% are also obese. It is also reported that obese individuals have an increased odds of developing depression, whereas T2DM is estimated to increase the incidence by two-fold. The preponderance of research data demonstrates that T2DM alters the serum level of cortisol and adiponectin which are known to be associated with neuronal physiology. The study explored, how a metabolic disorder like T2DM is linked with the altered plasma level of cortisol and adiponectin, the risk factors for stress and depression.\nPATIENTS AND METHODS: A cross-sectional population study was conducted in T2DM patients using a bimodal approach. First approach used questionnaires, (1) Patient Health Questionnaire (PHQ-9) and (2) Stress Coping Inventory Questionnaire (SCQ) to assess signs and symptoms of depression and stress, respectively, in T2DM patients. In the second approach, robust biochemical analysis was conducted for serum adiponectin and cortisol levels.\nRESULTS: An association of T2DM in stress and depression was evaluated in 158 subjects (105 T2DM obese patients and 53 healthy controls). A lower PHQ-9 score and adiponectin levels were seen in T2DM obese patients compared to healthy controls (p&lt;0.05). Further, results also depicted a lower adiponectin levels in T2DM obese patients with depression compared to T2DM obese patients without depression (p&lt;0.05). The study did not find a significant difference in cortisol serum levels among the T2DM and control groups. However, a higher level of serum cortisol was reported in T2DM obese patients with depression over those T2DM obese patients who lacked depression (p&lt;0.05).\nCONCLUSION: The findings suggest that T2DM obese patients might have a higher risk of developing stress and depression. Further, biochemical parameters, adiponectin and cortisol, might be the potential biomarkers for T2DM and may help in early diagnosis of these comorbid conditions.","container-title":"Diabetes, Metabolic Syndrome and Obesity: Targets and Therapy","DOI":"10.2147/DMSO.S294555","ISSN":"1178-7007","journalAbbreviation":"Diabetes Metab Syndr Obes","language":"eng","note":"PMID: 33623406\nPMCID: PMC7896784","page":"705-717","source":"PubMed","title":"Evaluation of Stress and Associated Biochemical Changes in Patients with Type 2 Diabetes Mellitus and Obesity","volume":"14","author":[{"family":"Tyagi","given":"Kanchan"},{"family":"Agarwal","given":"Nidhi Bharal"},{"family":"Kapur","given":"Prem"},{"family":"Kohli","given":"Sunil"},{"family":"Jalali","given":"Rajinder K."}],"issued":{"date-parts":[["2021"]]}}}],"schema":"https://github.com/citation-style-language/schema/raw/master/csl-citation.json"} </w:instrText>
+      </w:r>
+      <w:r>
+        <w:fldChar w:fldCharType="separate"/>
+      </w:r>
+      <w:r>
+        <w:rPr>
+          <w:lang w:val="en-GB"/>
+        </w:rPr>
+        <w:t>(10)</w:t>
+      </w:r>
+      <w:r>
+        <w:fldChar w:fldCharType="end"/>
+      </w:r>
+      <w:r>
+        <w:t>.</w:t>
+      </w:r>
+      <w:r>
+        <w:t xml:space="preserve">  </w:t>
+      </w:r>
     </w:p>
     <w:p/>
     <w:p>
       <w:r>
-        <w:t xml:space="preserve">In humans, although several key studies have identified a robust association between stress and the development of diabetes, most of these studies did not determine whether the metabolic effect of stress is different between obese and lean individuals. The only major study that addressed the combined effect of stress and obesity on diabetes is the Whitehall II study, that found that work stress strongly increased the </w:t>
-      </w:r>
-      <w:r>
-        <w:t>likelihood</w:t>
-      </w:r>
-      <w:r>
-        <w:t xml:space="preserve"> of diabetes in obese women, with no apparent modulating effect in obese men and lean women, and a protective effect in lean men </w:t>
-      </w:r>
-      <w:r>
-        <w:fldChar w:fldCharType="begin"/>
-      </w:r>
-      <w:r>
-        <w:instrText xml:space="preserve"> ADDIN ZOTERO_ITEM CSL_CITATION {"citationID":"K8XBA9DN","properties":{"formattedCitation":"(6)","plainCitation":"(6)","noteIndex":0},"citationItems":[{"id":"DNVojJss/E9uQonSR","uris":["http://zotero.org/users/2695081/items/3FLNIKRN"],"itemData":{"id":1804,"type":"article-journal","abstract":"Psychosocial work stress has been linked to higher risk of type 2 diabetes (T2DM), with the effect being consistently higher among women than men. Also, work stress has been linked to prospective weight gain among obese men but weight loss among lean men. Here, we aimed to examine the interaction between work stress and obesity in relation to T2DM risk in a gender-specific manner. We studied 5,568 white middle-aged men and women in the Whitehall II study, who were free from diabetes at analysis baseline (1993). After 1993, diabetes was ascertained at six consecutive phases by an oral glucose tolerance test supplemented by self-reports. Cox regression analysis was used to assess the association between job strain (high job demands/low job control) and 18-year incident T2DM stratifying by BMI (BMI &lt;30 kg/m(2) vs. BMI ≥30 kg/m(2)). Overall, work stress was associated with incident T2DM among women (hazard ratio (HR) 1.41: 95% confidence intervals: 1.02; 1.95) but not among men (HR 0.87: 95% confidence interval 0.69; 1.11) (P(INTERACTION) = 0.017). Among men, work stress was associated with a lower risk of T2DM in nonobese (HR 0.70: 0.53; 0.93) but not in obese individuals (P(INTERACTION) = 0.17). Among women, work stress was associated with higher risk of T2DM in the obese (HR 2.01: 1.06; 3.92) but not in the nonobese (P(INTERACTION) = 0.005). Gender and body weight status play a critical role in determining the direction of the association between psychosocial stress and T2DM. The potential effect-modifying role of gender and obesity should not be ignored by future studies looking at stress-disease associations.","container-title":"Obesity (Silver Spring, Md.)","DOI":"10.1038/oby.2011.95","ISSN":"1930-739X","issue":"2","journalAbbreviation":"Obesity (Silver Spring)","language":"eng","note":"PMID: 21593804","page":"428-433","source":"PubMed","title":"Work stress, obesity and the risk of type 2 diabetes: gender-specific bidirectional effect in the Whitehall II study","title-short":"Work stress, obesity and the risk of type 2 diabetes","volume":"20","author":[{"family":"Heraclides","given":"Alexandros M."},{"family":"Chandola","given":"Tarani"},{"family":"Witte","given":"Daniel R."},{"family":"Brunner","given":"Eric J."}],"issued":{"date-parts":[["2012",2]]}}}],"schema":"https://github.com/citation-style-language/schema/raw/master/csl-citation.json"} </w:instrText>
-      </w:r>
-      <w:r>
-        <w:fldChar w:fldCharType="separate"/>
-      </w:r>
-      <w:r>
-        <w:rPr>
-          <w:lang w:val="en-GB"/>
-        </w:rPr>
-        <w:t>(6)</w:t>
-      </w:r>
-      <w:r>
-        <w:fldChar w:fldCharType="end"/>
-      </w:r>
-      <w:r>
-        <w:t xml:space="preserve">.  A selective effect of chronic stress on development of diabetes in woman but not in men was also demonstrated in the Australian Diabetes, Obesity and Lifestyle study </w:t>
-      </w:r>
-      <w:r>
-        <w:fldChar w:fldCharType="begin"/>
-      </w:r>
-      <w:r>
-        <w:instrText xml:space="preserve"> ADDIN ZOTERO_ITEM CSL_CITATION {"citationID":"AFe5E0pt","properties":{"formattedCitation":"(7)","plainCitation":"(7)","noteIndex":0},"citationItems":[{"id":"DNVojJss/k2htEuhp","uris":["http://zotero.org/users/2695081/items/VA42I7LX"],"itemData":{"id":1807,"type":"article-journal","abstract":"BACKGROUND: The evidence supporting a relationship between stress and diabetes has been inconsistent.\nPURPOSE: This study examined the effects of stress on abnormal glucose metabolism, using a population-based sample of 3,759, with normoglycemia at baseline, from the Australian Diabetes, Obesity and Lifestyle study.\nMETHODS: Perceived stress and stressful life events were measured at baseline, with health behavior and anthropometric information also collected. Oral glucose tolerance tests were undertaken at baseline and 5-year follow-up. The primary outcome was the development of abnormal glucose metabolism (impaired fasting glucose, impaired glucose tolerance, and type 2 diabetes), according to WHO 1999 criteria.\nRESULTS: Perceived stress predicted incident abnormal glucose metabolism in women but not men, after multivariate adjustment. Life events showed an inconsistent relationship with abnormal glucose metabolism.\nCONCLUSIONS: Perceived stress predicted abnormal glucose metabolism in women. Healthcare professionals should consider psychosocial adversity when assessing risk factor profiles for the development of diabetes.","container-title":"Annals of Behavioral Medicine: A Publication of the Society of Behavioral Medicine","DOI":"10.1007/s12160-013-9473-y","ISSN":"1532-4796","issue":"1","journalAbbreviation":"Ann Behav Med","language":"eng","note":"PMID: 23389687","page":"62-72","source":"PubMed","title":"Psychosocial stress predicts abnormal glucose metabolism: the Australian Diabetes, Obesity and Lifestyle (AusDiab) study","title-short":"Psychosocial stress predicts abnormal glucose metabolism","volume":"46","author":[{"family":"Williams","given":"Emily D."},{"family":"Magliano","given":"Dianna J."},{"family":"Tapp","given":"Robyn J."},{"family":"Oldenburg","given":"Brian F."},{"family":"Shaw","given":"Jonathan E."}],"issued":{"date-parts":[["2013",8]]}}}],"schema":"https://github.com/citation-style-language/schema/raw/master/csl-citation.json"} </w:instrText>
-      </w:r>
-      <w:r>
-        <w:fldChar w:fldCharType="separate"/>
-      </w:r>
-      <w:r>
-        <w:rPr>
-          <w:lang w:val="en-GB"/>
-        </w:rPr>
-        <w:t>(7)</w:t>
-      </w:r>
-      <w:r>
-        <w:fldChar w:fldCharType="end"/>
-      </w:r>
-      <w:r>
-        <w:t xml:space="preserve">. In a smaller study, patients with obesity and diabetes who also had depression stress had exacerbated biochemical changes associated with obesity, including lower adiponectin and higher cortisol, as compared to patients with diabetes and obesity without depression </w:t>
-      </w:r>
-      <w:r>
-        <w:fldChar w:fldCharType="begin"/>
-      </w:r>
-      <w:r>
-        <w:instrText xml:space="preserve"> ADDIN ZOTERO_ITEM CSL_CITATION {"citationID":"qb5nzjnv","properties":{"formattedCitation":"(8)","plainCitation":"(8)","noteIndex":0},"citationItems":[{"id":"DNVojJss/IedZdPG7","uris":["http://zotero.org/users/2695081/items/QVI959H8"],"itemData":{"id":1810,"type":"article-journal","abstract":"PURPOSE: Type 2 diabetes mellitus (T2DM), a metabolic disorder, remains associated with a physiological impairment affecting large populations worldwide. Onset of T2DM is multifactorial where obesity and abnormal basal metabolic rate are considered most critical. Of people diagnosed with T2DM, about 80% are also obese. It is also reported that obese individuals have an increased odds of developing depression, whereas T2DM is estimated to increase the incidence by two-fold. The preponderance of research data demonstrates that T2DM alters the serum level of cortisol and adiponectin which are known to be associated with neuronal physiology. The study explored, how a metabolic disorder like T2DM is linked with the altered plasma level of cortisol and adiponectin, the risk factors for stress and depression.\nPATIENTS AND METHODS: A cross-sectional population study was conducted in T2DM patients using a bimodal approach. First approach used questionnaires, (1) Patient Health Questionnaire (PHQ-9) and (2) Stress Coping Inventory Questionnaire (SCQ) to assess signs and symptoms of depression and stress, respectively, in T2DM patients. In the second approach, robust biochemical analysis was conducted for serum adiponectin and cortisol levels.\nRESULTS: An association of T2DM in stress and depression was evaluated in 158 subjects (105 T2DM obese patients and 53 healthy controls). A lower PHQ-9 score and adiponectin levels were seen in T2DM obese patients compared to healthy controls (p&lt;0.05). Further, results also depicted a lower adiponectin levels in T2DM obese patients with depression compared to T2DM obese patients without depression (p&lt;0.05). The study did not find a significant difference in cortisol serum levels among the T2DM and control groups. However, a higher level of serum cortisol was reported in T2DM obese patients with depression over those T2DM obese patients who lacked depression (p&lt;0.05).\nCONCLUSION: The findings suggest that T2DM obese patients might have a higher risk of developing stress and depression. Further, biochemical parameters, adiponectin and cortisol, might be the potential biomarkers for T2DM and may help in early diagnosis of these comorbid conditions.","container-title":"Diabetes, Metabolic Syndrome and Obesity: Targets and Therapy","DOI":"10.2147/DMSO.S294555","ISSN":"1178-7007","journalAbbreviation":"Diabetes Metab Syndr Obes","language":"eng","note":"PMID: 33623406\nPMCID: PMC7896784","page":"705-717","source":"PubMed","title":"Evaluation of Stress and Associated Biochemical Changes in Patients with Type 2 Diabetes Mellitus and Obesity","volume":"14","author":[{"family":"Tyagi","given":"Kanchan"},{"family":"Agarwal","given":"Nidhi Bharal"},{"family":"Kapur","given":"Prem"},{"family":"Kohli","given":"Sunil"},{"family":"Jalali","given":"Rajinder K."}],"issued":{"date-parts":[["2021"]]}}}],"schema":"https://github.com/citation-style-language/schema/raw/master/csl-citation.json"} </w:instrText>
-      </w:r>
-      <w:r>
-        <w:fldChar w:fldCharType="separate"/>
-      </w:r>
-      <w:r>
-        <w:rPr>
-          <w:lang w:val="en-GB"/>
-        </w:rPr>
-        <w:t>(8)</w:t>
-      </w:r>
-      <w:r>
-        <w:fldChar w:fldCharType="end"/>
-      </w:r>
-      <w:r>
-        <w:t>.</w:t>
-      </w:r>
-      <w:r>
-        <w:t xml:space="preserve">  </w:t>
-      </w:r>
-      <w:r>
         <w:t>In this study, we assessed the effect of obesity on development of diabetes according to self</w:t>
       </w:r>
       <w:r>
         <w:t>-</w:t>
       </w:r>
       <w:r>
-        <w:t xml:space="preserve">reported subjective stress in a large cohort. </w:t>
-      </w:r>
-    </w:p>
-    <w:p/>
-    <w:p/>
+        <w:t>reported subjective stress in a large cohort.</w:t>
+      </w:r>
+      <w:r>
+        <w:t xml:space="preserve">  We show that participants with obesity reporting elevated psychosocial stress had higher diabetes prevalence compared to participants with obesity not reporting elevated perceived stress levels.</w:t>
+      </w:r>
+    </w:p>
     <w:p/>
     <w:p>
       <w:pPr>
@@ -357,13 +469,16 @@
     <w:p/>
     <w:p>
       <w:r>
-        <w:t xml:space="preserve">Patients were recruited to the Michigan Genomics Initiative as previously described </w:t>
+        <w:t>Participants</w:t>
+      </w:r>
+      <w:r>
+        <w:t xml:space="preserve"> were recruited to the Michigan Genomics Initiative as previously described </w:t>
       </w:r>
       <w:r>
         <w:fldChar w:fldCharType="begin"/>
       </w:r>
       <w:r>
-        <w:instrText xml:space="preserve"> ADDIN ZOTERO_ITEM CSL_CITATION {"citationID":"qKNTupiX","properties":{"formattedCitation":"(9)","plainCitation":"(9)","noteIndex":0},"citationItems":[{"id":9537,"uris":["http://zotero.org/users/7317906/items/H4A3P2LK"],"itemData":{"id":9537,"type":"article-journal","container-title":"Cell Genomics","DOI":"10.1016/j.xgen.2023.100257","ISSN":"2666-979X","issue":"0","journalAbbreviation":"Cell Genomics","language":"English","note":"publisher: Elsevier","source":"www.cell.com","title":"The Michigan Genomics Initiative: A biobank linking genotypes and electronic clinical records in Michigan Medicine patients","title-short":"The Michigan Genomics Initiative","URL":"https://www.cell.com/cell-genomics/abstract/S2666-979X(23)00013-7","volume":"0","author":[{"family":"Zawistowski","given":"Matthew"},{"family":"Fritsche","given":"Lars G."},{"family":"Pandit","given":"Anita"},{"family":"Vanderwerff","given":"Brett"},{"family":"Patil","given":"Snehal"},{"family":"Schmidt","given":"Ellen M."},{"family":"VandeHaar","given":"Peter"},{"family":"Willer","given":"Cristen J."},{"family":"Brummett","given":"Chad M."},{"family":"Kheterpal","given":"Sachin"},{"family":"Zhou","given":"Xiang"},{"family":"Boehnke","given":"Michael"},{"family":"Abecasis","given":"Gonçalo R."},{"family":"Zöllner","given":"Sebastian"}],"accessed":{"date-parts":[["2023",2,1]]},"issued":{"date-parts":[["2023",1,31]]},"citation-key":"zawistowskiMichiganGenomicsInitiative2023a"}}],"schema":"https://github.com/citation-style-language/schema/raw/master/csl-citation.json"} </w:instrText>
+        <w:instrText xml:space="preserve"> ADDIN ZOTERO_ITEM CSL_CITATION {"citationID":"qKNTupiX","properties":{"formattedCitation":"(11)","plainCitation":"(11)","noteIndex":0},"citationItems":[{"id":9537,"uris":["http://zotero.org/users/7317906/items/H4A3P2LK"],"itemData":{"id":9537,"type":"article-journal","container-title":"Cell Genomics","DOI":"10.1016/j.xgen.2023.100257","ISSN":"2666-979X","issue":"0","journalAbbreviation":"Cell Genomics","language":"English","note":"publisher: Elsevier","source":"www.cell.com","title":"The Michigan Genomics Initiative: A biobank linking genotypes and electronic clinical records in Michigan Medicine patients","title-short":"The Michigan Genomics Initiative","URL":"https://www.cell.com/cell-genomics/abstract/S2666-979X(23)00013-7","volume":"0","author":[{"family":"Zawistowski","given":"Matthew"},{"family":"Fritsche","given":"Lars G."},{"family":"Pandit","given":"Anita"},{"family":"Vanderwerff","given":"Brett"},{"family":"Patil","given":"Snehal"},{"family":"Schmidt","given":"Ellen M."},{"family":"VandeHaar","given":"Peter"},{"family":"Willer","given":"Cristen J."},{"family":"Brummett","given":"Chad M."},{"family":"Kheterpal","given":"Sachin"},{"family":"Zhou","given":"Xiang"},{"family":"Boehnke","given":"Michael"},{"family":"Abecasis","given":"Gonçalo R."},{"family":"Zöllner","given":"Sebastian"}],"accessed":{"date-parts":[["2023",2,1]]},"issued":{"date-parts":[["2023",1,31]]},"citation-key":"zawistowskiMichiganGenomicsInitiative2023a"}}],"schema":"https://github.com/citation-style-language/schema/raw/master/csl-citation.json"} </w:instrText>
       </w:r>
       <w:r>
         <w:fldChar w:fldCharType="separate"/>
@@ -372,19 +487,52 @@
         <w:rPr>
           <w:noProof/>
         </w:rPr>
-        <w:t>(9)</w:t>
+        <w:t>(11)</w:t>
       </w:r>
       <w:r>
         <w:fldChar w:fldCharType="end"/>
       </w:r>
       <w:r>
-        <w:t xml:space="preserve">.  These patients are in a hospital setting, over 18 and were asked to opt-in to this cohort between 2012 and 2022.  This study was a secondary analysis of these data (University of Michigan Internal Review Board </w:t>
+        <w:t xml:space="preserve">.  These </w:t>
+      </w:r>
+      <w:r>
+        <w:t>participants</w:t>
+      </w:r>
+      <w:r>
+        <w:t xml:space="preserve"> are in a hospital setting, over 18 and were asked to opt-in to this cohort between 2012 and 2022.  This study was a secondary analysis of these data (University of Michigan Internal Review Board </w:t>
       </w:r>
       <w:r>
         <w:t>HUM00219435</w:t>
       </w:r>
       <w:r>
-        <w:t xml:space="preserve">).  At enrollment, patients were asked a series of questionnaires including a Perceived Stress Survey (PSS4) and </w:t>
+        <w:t xml:space="preserve">).  At enrollment, </w:t>
+      </w:r>
+      <w:r>
+        <w:t>participants</w:t>
+      </w:r>
+      <w:r>
+        <w:t xml:space="preserve"> were asked a series of questionnaires including a Perceived Stress Survey (PSS4</w:t>
+      </w:r>
+      <w:r>
+        <w:t xml:space="preserve">; </w:t>
+      </w:r>
+      <w:r>
+        <w:fldChar w:fldCharType="begin"/>
+      </w:r>
+      <w:r>
+        <w:instrText xml:space="preserve"> ADDIN ZOTERO_ITEM CSL_CITATION {"citationID":"EnGmjrNk","properties":{"formattedCitation":"(12)","plainCitation":"(12)","noteIndex":0},"citationItems":[{"id":11570,"uris":["http://zotero.org/users/7317906/items/V278SV5V"],"itemData":{"id":11570,"type":"article-journal","container-title":"Journal of Health and Social Behavior","ISSN":"0022-1465","issue":"4","journalAbbreviation":"J Health Soc Behav","language":"eng","note":"PMID: 6668417","page":"385-396","source":"PubMed","title":"A global measure of perceived stress","volume":"24","author":[{"family":"Cohen","given":"S."},{"family":"Kamarck","given":"T."},{"family":"Mermelstein","given":"R."}],"issued":{"date-parts":[["1983",12]]},"citation-key":"cohenGlobalMeasurePerceived1983"}}],"schema":"https://github.com/citation-style-language/schema/raw/master/csl-citation.json"} </w:instrText>
+      </w:r>
+      <w:r>
+        <w:fldChar w:fldCharType="separate"/>
+      </w:r>
+      <w:r>
+        <w:t>(12)</w:t>
+      </w:r>
+      <w:r>
+        <w:fldChar w:fldCharType="end"/>
+      </w:r>
+      <w:r>
+        <w:t xml:space="preserve">) and </w:t>
       </w:r>
       <w:r>
         <w:t>their</w:t>
@@ -405,6 +553,7 @@
     <w:p/>
     <w:p>
       <w:r>
+        <w:lastRenderedPageBreak/>
         <w:t xml:space="preserve">BMI was </w:t>
       </w:r>
       <w:r>
@@ -414,11 +563,7 @@
         <w:t xml:space="preserve"> by taking the median value if multiple measurements were available. </w:t>
       </w:r>
       <w:r>
-        <w:t xml:space="preserve">Prior to sensitivity analyses we dichotomized participants as BMI greater or less </w:t>
-      </w:r>
-      <w:r>
-        <w:lastRenderedPageBreak/>
-        <w:t>than 30 kg/m</w:t>
+        <w:t>Prior to sensitivity analyses we dichotomized participants as BMI greater or less than 30 kg/m</w:t>
       </w:r>
       <w:r>
         <w:rPr>
@@ -466,7 +611,13 @@
         <w:t xml:space="preserve">  </w:t>
       </w:r>
       <w:r>
-        <w:t xml:space="preserve">Socioeconomic status of participants was approximated by constructing a neighborhood affluence score based on their census block connected to the </w:t>
+        <w:t xml:space="preserve">Socioeconomic status of participants was approximated by constructing a neighborhood </w:t>
+      </w:r>
+      <w:r>
+        <w:t>disadvantage</w:t>
+      </w:r>
+      <w:r>
+        <w:t xml:space="preserve"> score based on their census block connected to the </w:t>
       </w:r>
       <w:commentRangeStart w:id="0"/>
       <w:r>
@@ -478,6 +629,27 @@
       </w:r>
       <w:proofErr w:type="spellEnd"/>
       <w:r>
+        <w:t xml:space="preserve">; </w:t>
+      </w:r>
+      <w:r>
+        <w:fldChar w:fldCharType="begin"/>
+      </w:r>
+      <w:r>
+        <w:instrText xml:space="preserve"> ADDIN ZOTERO_ITEM CSL_CITATION {"citationID":"mt5HuRYp","properties":{"formattedCitation":"(13)","plainCitation":"(13)","noteIndex":0},"citationItems":[{"id":11572,"uris":["http://zotero.org/users/7317906/items/QI3T6XGC"],"itemData":{"id":11572,"type":"dataset","DOI":"10.3886/ICPSR38528.v3","publisher":"Inter-university Consortium for Political and Social Research [distributor]","title":"National Neighborhood Data Archive (NaNDA): Socioeconomic Status and Demographic Characteristics of Census Tracts and ZIP Code Tabulation Areas, United States, 2000-2020","author":[{"family":"Clarke","given":"Philippa"},{"family":"Noppert","given":"Grace"},{"family":"Melendez","given":"Robert"},{"family":"Chenoweth","given":"Megan"},{"family":"Gypin","given":"Lindsay"}],"issued":{"date-parts":[["2023"]]},"citation-key":"clarkeNationalNeighborhoodData2023"}}],"schema":"https://github.com/citation-style-language/schema/raw/master/csl-citation.json"} </w:instrText>
+      </w:r>
+      <w:r>
+        <w:fldChar w:fldCharType="separate"/>
+      </w:r>
+      <w:r>
+        <w:rPr>
+          <w:noProof/>
+        </w:rPr>
+        <w:t>(13)</w:t>
+      </w:r>
+      <w:r>
+        <w:fldChar w:fldCharType="end"/>
+      </w:r>
+      <w:r>
         <w:t>)</w:t>
       </w:r>
       <w:r>
@@ -515,6 +687,24 @@
         <w:t>proportion with a professional occupation</w:t>
       </w:r>
       <w:r>
+        <w:t xml:space="preserve"> with </w:t>
+      </w:r>
+      <w:r>
+        <w:t>quartile 1</w:t>
+      </w:r>
+      <w:r>
+        <w:t xml:space="preserve"> being the</w:t>
+      </w:r>
+      <w:r>
+        <w:t xml:space="preserve"> least</w:t>
+      </w:r>
+      <w:r>
+        <w:t xml:space="preserve"> </w:t>
+      </w:r>
+      <w:r>
+        <w:t>disadvantage</w:t>
+      </w:r>
+      <w:r>
         <w:t>.</w:t>
       </w:r>
       <w:r>
@@ -532,11 +722,9 @@
       <w:r>
         <w:t xml:space="preserve">  Race and ethnicity </w:t>
       </w:r>
-      <w:proofErr w:type="gramStart"/>
-      <w:r>
-        <w:t>was</w:t>
-      </w:r>
-      <w:proofErr w:type="gramEnd"/>
+      <w:r>
+        <w:t>were</w:t>
+      </w:r>
       <w:r>
         <w:t xml:space="preserve"> defined as Asian, Black, White, Hispanic/Latino, or Other.</w:t>
       </w:r>
@@ -555,13 +743,13 @@
       </w:r>
       <w:proofErr w:type="spellEnd"/>
       <w:r>
-        <w:t xml:space="preserve"> comorbidity indices computed from ICD9 and ICD19 codes e</w:t>
+        <w:t xml:space="preserve"> comorbidity indices computed from ICD9 and ICD19 codes </w:t>
       </w:r>
       <w:r>
         <w:fldChar w:fldCharType="begin"/>
       </w:r>
       <w:r>
-        <w:instrText xml:space="preserve"> ADDIN ZOTERO_ITEM CSL_CITATION {"citationID":"NpzuWU2y","properties":{"formattedCitation":"(10)","plainCitation":"(10)","noteIndex":0},"citationItems":[{"id":11488,"uris":["http://zotero.org/users/7317906/items/JMLH32L3"],"itemData":{"id":11488,"type":"article-journal","abstract":"OBJECTIVES: This study attempts to develop a comprehensive set of comorbidity measures for use with large administrative inpatient datasets.\nMETHODS: The study involved clinical and empirical review of comorbidity measures, development of a framework that attempts to segregate comorbidities from other aspects of the patient's condition, development of a comorbidity algorithm, and testing on heterogeneous and homogeneous patient groups. Data were drawn from all adult, nonmaternal inpatients from 438 acute care hospitals in California in 1992 (n = 1,779,167). Outcome measures were those commonly available in administrative data: length of stay, hospital charges, and in-hospital death.\nRESULTS: A comprehensive set of 30 comorbidity measures was developed. The comorbidities were associated with substantial increases in length of stay, hospital charges, and mortality both for heterogeneous and homogeneous disease groups. Several comorbidities are described that are important predictors of outcomes, yet commonly are not measured. These include mental disorders, drug and alcohol abuse, obesity, coagulopathy, weight loss, and fluid and electrolyte disorders.\nCONCLUSIONS: The comorbidities had independent effects on outcomes and probably should not be simplified as an index because they affect outcomes differently among different patient groups. The present method addresses some of the limitations of previous measures. It is based on a comprehensive approach to identifying comorbidities and separates them from the primary reason for hospitalization, resulting in an expanded set of comorbidities that easily is applied without further refinement to administrative data for a wide range of diseases.","container-title":"Medical Care","DOI":"10.1097/00005650-199801000-00004","ISSN":"0025-7079","issue":"1","journalAbbreviation":"Med Care","language":"eng","note":"PMID: 9431328","page":"8-27","source":"PubMed","title":"Comorbidity measures for use with administrative data","volume":"36","author":[{"family":"Elixhauser","given":"A."},{"family":"Steiner","given":"C."},{"family":"Harris","given":"D. R."},{"family":"Coffey","given":"R. M."}],"issued":{"date-parts":[["1998",1]]},"citation-key":"elixhauserComorbidityMeasuresUse1998"}}],"schema":"https://github.com/citation-style-language/schema/raw/master/csl-citation.json"} </w:instrText>
+        <w:instrText xml:space="preserve"> ADDIN ZOTERO_ITEM CSL_CITATION {"citationID":"NpzuWU2y","properties":{"formattedCitation":"(14)","plainCitation":"(14)","noteIndex":0},"citationItems":[{"id":11488,"uris":["http://zotero.org/users/7317906/items/JMLH32L3"],"itemData":{"id":11488,"type":"article-journal","abstract":"OBJECTIVES: This study attempts to develop a comprehensive set of comorbidity measures for use with large administrative inpatient datasets.\nMETHODS: The study involved clinical and empirical review of comorbidity measures, development of a framework that attempts to segregate comorbidities from other aspects of the patient's condition, development of a comorbidity algorithm, and testing on heterogeneous and homogeneous patient groups. Data were drawn from all adult, nonmaternal inpatients from 438 acute care hospitals in California in 1992 (n = 1,779,167). Outcome measures were those commonly available in administrative data: length of stay, hospital charges, and in-hospital death.\nRESULTS: A comprehensive set of 30 comorbidity measures was developed. The comorbidities were associated with substantial increases in length of stay, hospital charges, and mortality both for heterogeneous and homogeneous disease groups. Several comorbidities are described that are important predictors of outcomes, yet commonly are not measured. These include mental disorders, drug and alcohol abuse, obesity, coagulopathy, weight loss, and fluid and electrolyte disorders.\nCONCLUSIONS: The comorbidities had independent effects on outcomes and probably should not be simplified as an index because they affect outcomes differently among different patient groups. The present method addresses some of the limitations of previous measures. It is based on a comprehensive approach to identifying comorbidities and separates them from the primary reason for hospitalization, resulting in an expanded set of comorbidities that easily is applied without further refinement to administrative data for a wide range of diseases.","container-title":"Medical Care","DOI":"10.1097/00005650-199801000-00004","ISSN":"0025-7079","issue":"1","journalAbbreviation":"Med Care","language":"eng","note":"PMID: 9431328","page":"8-27","source":"PubMed","title":"Comorbidity measures for use with administrative data","volume":"36","author":[{"family":"Elixhauser","given":"A."},{"family":"Steiner","given":"C."},{"family":"Harris","given":"D. R."},{"family":"Coffey","given":"R. M."}],"issued":{"date-parts":[["1998",1]]},"citation-key":"elixhauserComorbidityMeasuresUse1998"}}],"schema":"https://github.com/citation-style-language/schema/raw/master/csl-citation.json"} </w:instrText>
       </w:r>
       <w:r>
         <w:fldChar w:fldCharType="separate"/>
@@ -570,7 +758,7 @@
         <w:rPr>
           <w:noProof/>
         </w:rPr>
-        <w:t>(10)</w:t>
+        <w:t>(14)</w:t>
       </w:r>
       <w:r>
         <w:fldChar w:fldCharType="end"/>
@@ -608,7 +796,7 @@
         <w:fldChar w:fldCharType="begin"/>
       </w:r>
       <w:r>
-        <w:instrText xml:space="preserve"> ADDIN ZOTERO_ITEM CSL_CITATION {"citationID":"0725YfVK","properties":{"formattedCitation":"(11)","plainCitation":"(11)","noteIndex":0},"citationItems":[{"id":8230,"uris":["http://zotero.org/users/7317906/items/3HZT7KXK"],"itemData":{"id":8230,"type":"document","note":"Citation Key: base\npublisher-place: Vienna, Austria","publisher":"R Foundation for Statistical Computing","title":"R: A Language and Environment for Statistical Computing","URL":"http://www.r-project.org/","author":[{"literal":"R Core Team"}],"accessed":{"date-parts":[["2010",10,22]]},"issued":{"date-parts":[["2019"]]},"citation-key":"base"}}],"schema":"https://github.com/citation-style-language/schema/raw/master/csl-citation.json"} </w:instrText>
+        <w:instrText xml:space="preserve"> ADDIN ZOTERO_ITEM CSL_CITATION {"citationID":"0725YfVK","properties":{"formattedCitation":"(15)","plainCitation":"(15)","noteIndex":0},"citationItems":[{"id":8230,"uris":["http://zotero.org/users/7317906/items/3HZT7KXK"],"itemData":{"id":8230,"type":"document","note":"Citation Key: base\npublisher-place: Vienna, Austria","publisher":"R Foundation for Statistical Computing","title":"R: A Language and Environment for Statistical Computing","URL":"http://www.r-project.org/","author":[{"literal":"R Core Team"}],"accessed":{"date-parts":[["2010",10,22]]},"issued":{"date-parts":[["2019"]]},"citation-key":"base"}}],"schema":"https://github.com/citation-style-language/schema/raw/master/csl-citation.json"} </w:instrText>
       </w:r>
       <w:r>
         <w:fldChar w:fldCharType="separate"/>
@@ -617,7 +805,7 @@
         <w:rPr>
           <w:noProof/>
         </w:rPr>
-        <w:t>(11)</w:t>
+        <w:t>(15)</w:t>
       </w:r>
       <w:r>
         <w:fldChar w:fldCharType="end"/>
@@ -773,13 +961,16 @@
         <w:t xml:space="preserve">), younger age (particularly under 60 years old), and the </w:t>
       </w:r>
       <w:r>
-        <w:t xml:space="preserve">lower </w:t>
+        <w:t>higher</w:t>
+      </w:r>
+      <w:r>
+        <w:t xml:space="preserve"> </w:t>
       </w:r>
       <w:r>
         <w:t xml:space="preserve">neighborhood </w:t>
       </w:r>
       <w:r>
-        <w:t>affluence</w:t>
+        <w:t>disadvantage</w:t>
       </w:r>
       <w:r>
         <w:t xml:space="preserve"> </w:t>
@@ -800,6 +991,7 @@
         <w:t xml:space="preserve">  </w:t>
       </w:r>
       <w:r>
+        <w:lastRenderedPageBreak/>
         <w:t>Among</w:t>
       </w:r>
       <w:r>
@@ -851,7 +1043,6 @@
         <w:pStyle w:val="Heading2"/>
       </w:pPr>
       <w:r>
-        <w:lastRenderedPageBreak/>
         <w:t xml:space="preserve">Perceived Stress Is </w:t>
       </w:r>
       <w:r>
@@ -1001,13 +1192,25 @@
         <w:t xml:space="preserve"> (12% increase, p=0.056).  </w:t>
       </w:r>
       <w:r>
-        <w:t xml:space="preserve">This effect was similar across gender, and neighborhood socioeconomic status (Figure </w:t>
+        <w:t xml:space="preserve">This effect was similar across gender, and neighborhood </w:t>
+      </w:r>
+      <w:r>
+        <w:t>disadvantage</w:t>
+      </w:r>
+      <w:r>
+        <w:t xml:space="preserve"> (Figure </w:t>
       </w:r>
       <w:r>
         <w:t>2</w:t>
       </w:r>
       <w:r>
-        <w:t xml:space="preserve">B-C).  The effect was consistent across race and ethnicities, with the exception of Hispanic or </w:t>
+        <w:t xml:space="preserve">B-C).  The effect was consistent across race and ethnicities, </w:t>
+      </w:r>
+      <w:r>
+        <w:t>apart from</w:t>
+      </w:r>
+      <w:r>
+        <w:t xml:space="preserve"> Hispanic or </w:t>
       </w:r>
       <w:r>
         <w:t>L</w:t>
@@ -1091,16 +1294,42 @@
         <w:t>examined</w:t>
       </w:r>
       <w:r>
-        <w:t xml:space="preserve"> whether the interaction between obesity and perceived stress was consistent across demographic categories.  We found that the interaction was stronger in males (21%) than females (0.3%), and stronger in Asian (49%) and Black (19%) participants than White (13%) or Hispanic/Latino (-45%) participants, though neither stress x obesity x gender or stress x obesity x race/ethnicity interactions reached statistical significance.  </w:t>
-      </w:r>
-      <w:r>
-        <w:t xml:space="preserve">We also found that in the lowest SES category, the effect was lower than the upper three quartiles.  </w:t>
+        <w:t xml:space="preserve"> whether the interaction between obesity and perceived stress was consistent across demographic categories.  We found that the interaction was stronger in males (21%) than females (0.3%), and stronger in Asian (49%) and Black (19%) participants than White (13%) or Hispanic/Latino (-45%) participants, though neither stress x obesity x gender </w:t>
+      </w:r>
+      <w:proofErr w:type="gramStart"/>
+      <w:r>
+        <w:t>or</w:t>
+      </w:r>
+      <w:proofErr w:type="gramEnd"/>
+      <w:r>
+        <w:t xml:space="preserve"> stress x obesity x race/ethnicity interactions reached statistical significance.  </w:t>
+      </w:r>
+      <w:r>
+        <w:t xml:space="preserve">We also found that in the </w:t>
+      </w:r>
+      <w:r>
+        <w:t>group with the highest neighborhood disadvantage</w:t>
+      </w:r>
+      <w:r>
+        <w:t xml:space="preserve">, the </w:t>
+      </w:r>
+      <w:r>
+        <w:t>synergistic effect</w:t>
+      </w:r>
+      <w:r>
+        <w:t xml:space="preserve"> of obesity and psychosocial stress</w:t>
+      </w:r>
+      <w:r>
+        <w:t xml:space="preserve"> was lower than the upper three quartiles.  </w:t>
       </w:r>
       <w:r>
         <w:t xml:space="preserve">In the case of </w:t>
       </w:r>
       <w:r>
-        <w:t>lower SES,</w:t>
+        <w:t>higher neighborhood disadvantage</w:t>
+      </w:r>
+      <w:r>
+        <w:t>,</w:t>
       </w:r>
       <w:r>
         <w:t xml:space="preserve"> females and Latino and Hispanic participants this is due to </w:t>
@@ -1124,7 +1353,69 @@
         <w:t xml:space="preserve">participants (Figure 2B and D).  </w:t>
       </w:r>
       <w:r>
-        <w:t xml:space="preserve"> We next tested whether participants with obesity reporting elevated stress were more obese, but we found slightly larger average BMI in both the low vs high perceived stress groups (36.0 vs 36.6 kg/m2)</w:t>
+        <w:t xml:space="preserve"> We next tested whether participants with obesity reporting elevated stress were more obese</w:t>
+      </w:r>
+      <w:r>
+        <w:t xml:space="preserve">.  </w:t>
+      </w:r>
+      <w:r>
+        <w:t xml:space="preserve"> </w:t>
+      </w:r>
+      <w:r>
+        <w:t>Indeed</w:t>
+      </w:r>
+      <w:r>
+        <w:t>,</w:t>
+      </w:r>
+      <w:r>
+        <w:t xml:space="preserve"> we found </w:t>
+      </w:r>
+      <w:r>
+        <w:t xml:space="preserve">that </w:t>
+      </w:r>
+      <w:r>
+        <w:t>participants</w:t>
+      </w:r>
+      <w:r>
+        <w:t xml:space="preserve"> with obesity with lower perceive stress had slightly lower</w:t>
+      </w:r>
+      <w:r>
+        <w:t xml:space="preserve"> average BMI </w:t>
+      </w:r>
+      <w:r>
+        <w:t>(36.0 kg/m</w:t>
+      </w:r>
+      <w:r>
+        <w:rPr>
+          <w:vertAlign w:val="superscript"/>
+        </w:rPr>
+        <w:t>2</w:t>
+      </w:r>
+      <w:r>
+        <w:t>) than those reporting higher perceived stress (</w:t>
+      </w:r>
+      <w:r>
+        <w:t>36.6 kg/m</w:t>
+      </w:r>
+      <w:r>
+        <w:rPr>
+          <w:vertAlign w:val="superscript"/>
+        </w:rPr>
+        <w:t>2</w:t>
+      </w:r>
+      <w:r>
+        <w:t>, p=</w:t>
+      </w:r>
+      <w:proofErr w:type="spellStart"/>
+      <w:r>
+        <w:t>xxxx</w:t>
+      </w:r>
+      <w:proofErr w:type="spellEnd"/>
+      <w:r>
+        <w:t>)</w:t>
+      </w:r>
+      <w:r>
+        <w:t>.</w:t>
       </w:r>
     </w:p>
     <w:p>
@@ -1158,7 +1449,6 @@
     <w:p/>
     <w:p>
       <w:r>
-        <w:lastRenderedPageBreak/>
         <w:t xml:space="preserve">Given the enhancement of obesity-associated diabetes prevalence in these participants, we then evaluated several other obesity and stress-linked chronic diseases using the same approach.  In </w:t>
       </w:r>
       <w:commentRangeStart w:id="1"/>
@@ -1176,7 +1466,41 @@
         <w:commentReference w:id="1"/>
       </w:r>
       <w:r>
-        <w:t>we describe the raw and adjusted associations between obesity and stress on hypertension, arrhythmia and liver disease.</w:t>
+        <w:t xml:space="preserve">we describe the raw and adjusted associations between obesity and stress on </w:t>
+      </w:r>
+      <w:commentRangeStart w:id="2"/>
+      <w:r>
+        <w:t>hypertension</w:t>
+      </w:r>
+      <w:commentRangeEnd w:id="2"/>
+      <w:r>
+        <w:rPr>
+          <w:rStyle w:val="CommentReference"/>
+        </w:rPr>
+        <w:commentReference w:id="2"/>
+      </w:r>
+      <w:r>
+        <w:t>, arrhythmia</w:t>
+      </w:r>
+      <w:r>
+        <w:t>, chronic pulmonary disease, congestive heart failure,</w:t>
+      </w:r>
+      <w:r>
+        <w:t xml:space="preserve"> and </w:t>
+      </w:r>
+      <w:commentRangeStart w:id="3"/>
+      <w:r>
+        <w:t xml:space="preserve">liver </w:t>
+      </w:r>
+      <w:commentRangeEnd w:id="3"/>
+      <w:r>
+        <w:rPr>
+          <w:rStyle w:val="CommentReference"/>
+        </w:rPr>
+        <w:commentReference w:id="3"/>
+      </w:r>
+      <w:r>
+        <w:t>disease.</w:t>
       </w:r>
       <w:r>
         <w:t xml:space="preserve">  </w:t>
@@ -1272,19 +1596,82 @@
     <w:p/>
     <w:p>
       <w:r>
-        <w:t>The causes of stress in this study are not known, and are beyond the scope of this study.  We note that participants who are female, younger, underweight or obese, Black, and who reside in higher SES neighborhoods report higher stress than other groups.</w:t>
-      </w:r>
-      <w:r>
-        <w:t xml:space="preserve">  The higher reported stress in </w:t>
-      </w:r>
-      <w:r>
-        <w:t xml:space="preserve">participants with BMI &gt;30 (43-48%) relative to those with BMI between 18.5 and 30 may reflect weight stigma and could represent a positive feedback loop wherein obesity-linked psychosocial stress may enhance diabetes </w:t>
+        <w:t xml:space="preserve">The causes of stress in this study are not </w:t>
+      </w:r>
+      <w:proofErr w:type="gramStart"/>
+      <w:r>
+        <w:t>known, and</w:t>
+      </w:r>
+      <w:proofErr w:type="gramEnd"/>
+      <w:r>
+        <w:t xml:space="preserve"> are beyond the scope of this study.  We note that participants who are female, younger, underweight or obese, Black, and who reside in </w:t>
+      </w:r>
+      <w:r>
+        <w:t>higher</w:t>
+      </w:r>
+      <w:r>
+        <w:t xml:space="preserve"> </w:t>
+      </w:r>
+      <w:r>
+        <w:t>disadvantaged</w:t>
+      </w:r>
+      <w:r>
+        <w:t xml:space="preserve"> neighborhoods report higher stress than other groups.</w:t>
+      </w:r>
+      <w:r>
+        <w:t xml:space="preserve">  </w:t>
+      </w:r>
+      <w:r>
+        <w:t xml:space="preserve">There are well established longitudinal connections between psychosocial stress and </w:t>
+      </w:r>
+      <w:commentRangeStart w:id="4"/>
+      <w:r>
+        <w:t>risk</w:t>
+      </w:r>
+      <w:commentRangeEnd w:id="4"/>
+      <w:r>
+        <w:t xml:space="preserve"> of obesity</w:t>
+      </w:r>
+      <w:r>
+        <w:rPr>
+          <w:rStyle w:val="CommentReference"/>
+        </w:rPr>
+        <w:commentReference w:id="4"/>
+      </w:r>
+      <w:r>
+        <w:t xml:space="preserve">.  </w:t>
+      </w:r>
+      <w:r>
+        <w:t xml:space="preserve">There was a J-shaped relationship between BMI and perceived stress.   For the small number (0.7%, n=283) of participants that are underweight this could be due to advanced age or other chronic diseases.  </w:t>
+      </w:r>
+      <w:commentRangeStart w:id="5"/>
+      <w:r>
+        <w:t xml:space="preserve">The higher reported stress in </w:t>
+      </w:r>
+      <w:r>
+        <w:t xml:space="preserve">participants with BMI &gt;30 (43-48%) relative to those with BMI between 18.5 and 30 may </w:t>
+      </w:r>
+      <w:r>
+        <w:t xml:space="preserve">also </w:t>
+      </w:r>
+      <w:r>
+        <w:t xml:space="preserve">reflect weight stigma and could represent a positive feedback loop wherein obesity-linked psychosocial stress may enhance diabetes </w:t>
       </w:r>
       <w:r>
         <w:t>prevalence</w:t>
       </w:r>
       <w:r>
-        <w:t xml:space="preserve"> in this population.  We observe enhanced obesity-associated perceived stress in females with BMI &gt;30 (47%) compared to BMI &lt;30 (42%) than in males (42% vs 39%, </w:t>
+        <w:t xml:space="preserve"> in this population</w:t>
+      </w:r>
+      <w:commentRangeEnd w:id="5"/>
+      <w:r>
+        <w:rPr>
+          <w:rStyle w:val="CommentReference"/>
+        </w:rPr>
+        <w:commentReference w:id="5"/>
+      </w:r>
+      <w:r>
+        <w:t xml:space="preserve">.  We observe enhanced obesity-associated perceived stress in females with BMI &gt;30 (47%) compared to BMI &lt;30 (42%) than in males (42% vs 39%, </w:t>
       </w:r>
       <w:proofErr w:type="spellStart"/>
       <w:r>
@@ -1318,7 +1705,7 @@
       <w:r>
         <w:t xml:space="preserve">= 0.0026), consistent with higher rates of weight discrimination in </w:t>
       </w:r>
-      <w:commentRangeStart w:id="2"/>
+      <w:commentRangeStart w:id="6"/>
       <w:r>
         <w:t xml:space="preserve">women </w:t>
       </w:r>
@@ -1326,7 +1713,7 @@
         <w:fldChar w:fldCharType="begin"/>
       </w:r>
       <w:r>
-        <w:instrText xml:space="preserve"> ADDIN ZOTERO_ITEM CSL_CITATION {"citationID":"uEUVukVw","properties":{"formattedCitation":"(12)","plainCitation":"(12)","noteIndex":0},"citationItems":[{"id":11485,"uris":["http://zotero.org/users/7317906/items/2VPGKQ72"],"itemData":{"id":11485,"type":"article-journal","abstract":"Weight stigma is related to lower levels of motivation to exercise in overweight and obesity. This study explored the nature of the relationship between stigma, motivation to exercise and physical activity while accounting for gender differences. Participants were 439 adults with overweight and obesity (mean body mass index = 32.18 kg/m2, standard deviation = 4.09 kg/m2). Females reported significantly more frequent stigma experiences than males. Mediation models found a conditional direct effect of weight stigma for males, with higher frequency of stigma experiences related to higher levels of walking and vigorous physical activity. A conditional indirect effect was found for females for walking, moderate and vigorous levels of physical activity, with higher weight stigma related to lower autonomous motivation, and lower levels of physical activity. Findings suggest that males and females are affected differently by weight-stigma experiences.","container-title":"Health Psychology Open","DOI":"10.1177/2055102918759691","ISSN":"2055-1029","issue":"1","journalAbbreviation":"Health Psychol Open","note":"PMID: 29552349\nPMCID: PMC5846936","page":"2055102918759691","source":"PubMed Central","title":"Gender differences in the relationship of weight-based stigmatisation with motivation to exercise and physical activity in overweight individuals","volume":"5","author":[{"family":"Sattler","given":"Krystal M"},{"family":"Deane","given":"Frank P"},{"family":"Tapsell","given":"Linda"},{"family":"Kelly","given":"Peter J"}],"issued":{"date-parts":[["2018",3,8]]},"citation-key":"sattlerGenderDifferencesRelationship2018"}}],"schema":"https://github.com/citation-style-language/schema/raw/master/csl-citation.json"} </w:instrText>
+        <w:instrText xml:space="preserve"> ADDIN ZOTERO_ITEM CSL_CITATION {"citationID":"uEUVukVw","properties":{"formattedCitation":"(16)","plainCitation":"(16)","noteIndex":0},"citationItems":[{"id":11485,"uris":["http://zotero.org/users/7317906/items/2VPGKQ72"],"itemData":{"id":11485,"type":"article-journal","abstract":"Weight stigma is related to lower levels of motivation to exercise in overweight and obesity. This study explored the nature of the relationship between stigma, motivation to exercise and physical activity while accounting for gender differences. Participants were 439 adults with overweight and obesity (mean body mass index = 32.18 kg/m2, standard deviation = 4.09 kg/m2). Females reported significantly more frequent stigma experiences than males. Mediation models found a conditional direct effect of weight stigma for males, with higher frequency of stigma experiences related to higher levels of walking and vigorous physical activity. A conditional indirect effect was found for females for walking, moderate and vigorous levels of physical activity, with higher weight stigma related to lower autonomous motivation, and lower levels of physical activity. Findings suggest that males and females are affected differently by weight-stigma experiences.","container-title":"Health Psychology Open","DOI":"10.1177/2055102918759691","ISSN":"2055-1029","issue":"1","journalAbbreviation":"Health Psychol Open","note":"PMID: 29552349\nPMCID: PMC5846936","page":"2055102918759691","source":"PubMed Central","title":"Gender differences in the relationship of weight-based stigmatisation with motivation to exercise and physical activity in overweight individuals","volume":"5","author":[{"family":"Sattler","given":"Krystal M"},{"family":"Deane","given":"Frank P"},{"family":"Tapsell","given":"Linda"},{"family":"Kelly","given":"Peter J"}],"issued":{"date-parts":[["2018",3,8]]},"citation-key":"sattlerGenderDifferencesRelationship2018"}}],"schema":"https://github.com/citation-style-language/schema/raw/master/csl-citation.json"} </w:instrText>
       </w:r>
       <w:r>
         <w:fldChar w:fldCharType="separate"/>
@@ -1335,7 +1722,7 @@
         <w:rPr>
           <w:noProof/>
         </w:rPr>
-        <w:t>(12)</w:t>
+        <w:t>(16)</w:t>
       </w:r>
       <w:r>
         <w:fldChar w:fldCharType="end"/>
@@ -1343,12 +1730,12 @@
       <w:r>
         <w:t>.</w:t>
       </w:r>
-      <w:commentRangeEnd w:id="2"/>
+      <w:commentRangeEnd w:id="6"/>
       <w:r>
         <w:rPr>
           <w:rStyle w:val="CommentReference"/>
         </w:rPr>
-        <w:commentReference w:id="2"/>
+        <w:commentReference w:id="6"/>
       </w:r>
       <w:r>
         <w:t xml:space="preserve">  Interestingly though, when treated separately males had a stronger obesity-stress </w:t>
@@ -1369,7 +1756,7 @@
         <w:fldChar w:fldCharType="begin"/>
       </w:r>
       <w:r>
-        <w:instrText xml:space="preserve"> ADDIN ZOTERO_ITEM CSL_CITATION {"citationID":"7NoAOV3t","properties":{"formattedCitation":"(6)","plainCitation":"(6)","noteIndex":0},"citationItems":[{"id":"DNVojJss/E9uQonSR","uris":["http://zotero.org/users/2695081/items/3FLNIKRN"],"itemData":{"id":"wYajtxYE/VWhUmnxe","type":"article-journal","abstract":"Psychosocial work stress has been linked to higher risk of type 2 diabetes (T2DM), with the effect being consistently higher among women than men. Also, work stress has been linked to prospective weight gain among obese men but weight loss among lean men. Here, we aimed to examine the interaction between work stress and obesity in relation to T2DM risk in a gender-specific manner. We studied 5,568 white middle-aged men and women in the Whitehall II study, who were free from diabetes at analysis baseline (1993). After 1993, diabetes was ascertained at six consecutive phases by an oral glucose tolerance test supplemented by self-reports. Cox regression analysis was used to assess the association between job strain (high job demands/low job control) and 18-year incident T2DM stratifying by BMI (BMI &lt;30 kg/m(2) vs. BMI ≥30 kg/m(2)). Overall, work stress was associated with incident T2DM among women (hazard ratio (HR) 1.41: 95% confidence intervals: 1.02; 1.95) but not among men (HR 0.87: 95% confidence interval 0.69; 1.11) (P(INTERACTION) = 0.017). Among men, work stress was associated with a lower risk of T2DM in nonobese (HR 0.70: 0.53; 0.93) but not in obese individuals (P(INTERACTION) = 0.17). Among women, work stress was associated with higher risk of T2DM in the obese (HR 2.01: 1.06; 3.92) but not in the nonobese (P(INTERACTION) = 0.005). Gender and body weight status play a critical role in determining the direction of the association between psychosocial stress and T2DM. The potential effect-modifying role of gender and obesity should not be ignored by future studies looking at stress-disease associations.","container-title":"Obesity (Silver Spring, Md.)","DOI":"10.1038/oby.2011.95","ISSN":"1930-739X","issue":"2","journalAbbreviation":"Obesity (Silver Spring)","language":"eng","note":"PMID: 21593804","page":"428-433","source":"PubMed","title":"Work stress, obesity and the risk of type 2 diabetes: gender-specific bidirectional effect in the Whitehall II study","title-short":"Work stress, obesity and the risk of type 2 diabetes","volume":"20","author":[{"family":"Heraclides","given":"Alexandros M."},{"family":"Chandola","given":"Tarani"},{"family":"Witte","given":"Daniel R."},{"family":"Brunner","given":"Eric J."}],"issued":{"date-parts":[["2012",2]]}}}],"schema":"https://github.com/citation-style-language/schema/raw/master/csl-citation.json"} </w:instrText>
+        <w:instrText xml:space="preserve"> ADDIN ZOTERO_ITEM CSL_CITATION {"citationID":"7NoAOV3t","properties":{"formattedCitation":"(9)","plainCitation":"(9)","noteIndex":0},"citationItems":[{"id":"fATidvy9/NEBiBgsN","uris":["http://zotero.org/users/2695081/items/3FLNIKRN"],"itemData":{"id":"wYajtxYE/VWhUmnxe","type":"article-journal","abstract":"Psychosocial work stress has been linked to higher risk of type 2 diabetes (T2DM), with the effect being consistently higher among women than men. Also, work stress has been linked to prospective weight gain among obese men but weight loss among lean men. Here, we aimed to examine the interaction between work stress and obesity in relation to T2DM risk in a gender-specific manner. We studied 5,568 white middle-aged men and women in the Whitehall II study, who were free from diabetes at analysis baseline (1993). After 1993, diabetes was ascertained at six consecutive phases by an oral glucose tolerance test supplemented by self-reports. Cox regression analysis was used to assess the association between job strain (high job demands/low job control) and 18-year incident T2DM stratifying by BMI (BMI &lt;30 kg/m(2) vs. BMI ≥30 kg/m(2)). Overall, work stress was associated with incident T2DM among women (hazard ratio (HR) 1.41: 95% confidence intervals: 1.02; 1.95) but not among men (HR 0.87: 95% confidence interval 0.69; 1.11) (P(INTERACTION) = 0.017). Among men, work stress was associated with a lower risk of T2DM in nonobese (HR 0.70: 0.53; 0.93) but not in obese individuals (P(INTERACTION) = 0.17). Among women, work stress was associated with higher risk of T2DM in the obese (HR 2.01: 1.06; 3.92) but not in the nonobese (P(INTERACTION) = 0.005). Gender and body weight status play a critical role in determining the direction of the association between psychosocial stress and T2DM. The potential effect-modifying role of gender and obesity should not be ignored by future studies looking at stress-disease associations.","container-title":"Obesity (Silver Spring, Md.)","DOI":"10.1038/oby.2011.95","ISSN":"1930-739X","issue":"2","journalAbbreviation":"Obesity (Silver Spring)","language":"eng","note":"PMID: 21593804","page":"428-433","source":"PubMed","title":"Work stress, obesity and the risk of type 2 diabetes: gender-specific bidirectional effect in the Whitehall II study","title-short":"Work stress, obesity and the risk of type 2 diabetes","volume":"20","author":[{"family":"Heraclides","given":"Alexandros M."},{"family":"Chandola","given":"Tarani"},{"family":"Witte","given":"Daniel R."},{"family":"Brunner","given":"Eric J."}],"issued":{"date-parts":[["2012",2]]}}}],"schema":"https://github.com/citation-style-language/schema/raw/master/csl-citation.json"} </w:instrText>
       </w:r>
       <w:r>
         <w:fldChar w:fldCharType="separate"/>
@@ -1378,19 +1765,23 @@
         <w:rPr>
           <w:noProof/>
         </w:rPr>
-        <w:t>(6)</w:t>
+        <w:t>(9)</w:t>
       </w:r>
       <w:r>
         <w:fldChar w:fldCharType="end"/>
       </w:r>
       <w:r>
-        <w:t>.  This could be due to either different populations, or the differences between perceived stress and job-related stress and how they impact have gender-specific effects.</w:t>
+        <w:t>.  This could be due to either different populations, or the differences between perceived stress and job-related stress and gender-specific effects.</w:t>
       </w:r>
     </w:p>
     <w:p/>
     <w:p>
       <w:r>
-        <w:t xml:space="preserve">It is intriguing that the synergistic relationship between obesity and stress is most prominent in participants with type 2 diabetes, but is not evident for hypertension, liver disease, chronic pulmonary disease or </w:t>
+        <w:t xml:space="preserve">It is intriguing that the synergistic relationship between obesity and stress is most prominent in participants with type 2 diabetes, but is not evident for hypertension, liver disease, chronic </w:t>
+      </w:r>
+      <w:r>
+        <w:lastRenderedPageBreak/>
+        <w:t xml:space="preserve">pulmonary disease or </w:t>
       </w:r>
       <w:r>
         <w:t xml:space="preserve">congestive </w:t>
@@ -1410,32 +1801,32 @@
       <w:r>
         <w:t xml:space="preserve">, but in our population these factors appeared additive rather than </w:t>
       </w:r>
-      <w:commentRangeStart w:id="3"/>
-      <w:commentRangeStart w:id="4"/>
-      <w:commentRangeStart w:id="5"/>
+      <w:commentRangeStart w:id="7"/>
+      <w:commentRangeStart w:id="8"/>
+      <w:commentRangeStart w:id="9"/>
       <w:r>
         <w:t>synergistic</w:t>
       </w:r>
-      <w:commentRangeEnd w:id="3"/>
+      <w:commentRangeEnd w:id="7"/>
       <w:r>
         <w:rPr>
           <w:rStyle w:val="CommentReference"/>
         </w:rPr>
-        <w:commentReference w:id="3"/>
-      </w:r>
-      <w:commentRangeEnd w:id="4"/>
+        <w:commentReference w:id="7"/>
+      </w:r>
+      <w:commentRangeEnd w:id="8"/>
       <w:r>
         <w:rPr>
           <w:rStyle w:val="CommentReference"/>
         </w:rPr>
-        <w:commentReference w:id="4"/>
-      </w:r>
-      <w:commentRangeEnd w:id="5"/>
+        <w:commentReference w:id="8"/>
+      </w:r>
+      <w:commentRangeEnd w:id="9"/>
       <w:r>
         <w:rPr>
           <w:rStyle w:val="CommentReference"/>
         </w:rPr>
-        <w:commentReference w:id="5"/>
+        <w:commentReference w:id="9"/>
       </w:r>
       <w:r>
         <w:t xml:space="preserve">.  </w:t>
@@ -1464,11 +1855,7 @@
         <w:t xml:space="preserve"> (either obesity or type 2 diabetes)</w:t>
       </w:r>
       <w:r>
-        <w:t xml:space="preserve"> could enhance perceived stress as a form of reverse causality.  We hypothesize that </w:t>
-      </w:r>
-      <w:r>
-        <w:lastRenderedPageBreak/>
-        <w:t xml:space="preserve">this is less likely, as it is only true for type 2 diabetes, but not other comorbidities tested.  It is also possible that the slightly elevated average BMI </w:t>
+        <w:t xml:space="preserve"> could enhance perceived stress as a form of reverse causality.  We hypothesize that this is less likely, as it is only true for type 2 diabetes, but not other comorbidities tested.  It is also possible that the slightly elevated average BMI </w:t>
       </w:r>
       <w:r>
         <w:t xml:space="preserve">in the participants with high PSS scores and obesity could imply that higher stress increases BMI, enhancing diabetes </w:t>
@@ -1486,7 +1873,7 @@
         <w:fldChar w:fldCharType="begin"/>
       </w:r>
       <w:r>
-        <w:instrText xml:space="preserve"> ADDIN ZOTERO_ITEM CSL_CITATION {"citationID":"gUypn5QT","properties":{"formattedCitation":"(13)","plainCitation":"(13)","noteIndex":0},"citationItems":[{"id":1482,"uris":["http://zotero.org/users/7317906/items/5I96XRCC"],"itemData":{"id":1482,"type":"article-journal","abstract":"Weight stigma is highly pervasive, but its consequences are understudied. This review draws from theory in social psychology, health psychology, and neuroendocrinology to construct an original, generative model called the cyclic obesity/weight-based stigma (COBWEBS) model. This model characterizes weight stigma as a \"vicious cycle\" - a positive feedback loop wherein weight stigma begets weight gain. This happens through increased eating behavior and increased cortisol secretion governed by behavioral, emotional, and physiological mechanisms, which are theorized to ultimately result in weight gain and difficulty of weight loss. The purpose of this review is to evaluate the existing literature for evidence supporting such a model, propose ways in which individuals enter, fight against, and exit the cycle, and conclude by outlining fruitful future directions in this nascent yet important area of research. © 2014 Elsevier Ltd.","container-title":"Appetite","DOI":"10.1016/j.appet.2014.06.108","ISSN":"10958304","note":"PMID: 24997407\npublisher: Elsevier Ltd\nCitation Key: Tomiyama2014a\nISBN: 1095-8304 (Electronic)\\r0195-6663 (Linking)","page":"8-15","title":"Weight stigma is stressful. A review of evidence for the cyclic Obesity/weight-based stigma model","volume":"82","author":[{"family":"Tomiyama","given":"A. Janet"}],"issued":{"date-parts":[["2014"]]},"citation-key":"Tomiyama2014a"}}],"schema":"https://github.com/citation-style-language/schema/raw/master/csl-citation.json"} </w:instrText>
+        <w:instrText xml:space="preserve"> ADDIN ZOTERO_ITEM CSL_CITATION {"citationID":"gUypn5QT","properties":{"formattedCitation":"(17)","plainCitation":"(17)","noteIndex":0},"citationItems":[{"id":1482,"uris":["http://zotero.org/users/7317906/items/5I96XRCC"],"itemData":{"id":1482,"type":"article-journal","abstract":"Weight stigma is highly pervasive, but its consequences are understudied. This review draws from theory in social psychology, health psychology, and neuroendocrinology to construct an original, generative model called the cyclic obesity/weight-based stigma (COBWEBS) model. This model characterizes weight stigma as a \"vicious cycle\" - a positive feedback loop wherein weight stigma begets weight gain. This happens through increased eating behavior and increased cortisol secretion governed by behavioral, emotional, and physiological mechanisms, which are theorized to ultimately result in weight gain and difficulty of weight loss. The purpose of this review is to evaluate the existing literature for evidence supporting such a model, propose ways in which individuals enter, fight against, and exit the cycle, and conclude by outlining fruitful future directions in this nascent yet important area of research. © 2014 Elsevier Ltd.","container-title":"Appetite","DOI":"10.1016/j.appet.2014.06.108","ISSN":"10958304","note":"PMID: 24997407\npublisher: Elsevier Ltd\nCitation Key: Tomiyama2014a\nISBN: 1095-8304 (Electronic)\\r0195-6663 (Linking)","page":"8-15","title":"Weight stigma is stressful. A review of evidence for the cyclic Obesity/weight-based stigma model","volume":"82","author":[{"family":"Tomiyama","given":"A. Janet"}],"issued":{"date-parts":[["2014"]]},"citation-key":"Tomiyama2014a"}}],"schema":"https://github.com/citation-style-language/schema/raw/master/csl-citation.json"} </w:instrText>
       </w:r>
       <w:r>
         <w:fldChar w:fldCharType="separate"/>
@@ -1495,22 +1882,19 @@
         <w:rPr>
           <w:noProof/>
         </w:rPr>
-        <w:t>(13)</w:t>
+        <w:t>(17)</w:t>
       </w:r>
       <w:r>
         <w:fldChar w:fldCharType="end"/>
       </w:r>
       <w:r>
-        <w:t>.  Again, we hypothesize that this is unlikely given the relatively small increase in mean BMI (&lt;1 kg/m</w:t>
-      </w:r>
-      <w:r>
-        <w:rPr>
-          <w:vertAlign w:val="superscript"/>
-        </w:rPr>
-        <w:t>2</w:t>
-      </w:r>
-      <w:r>
-        <w:t>).  In terms of generalizability, the population in this study is a majority white, relatively affluent group of participants who have a relatively high age and number of co-morbidities, as is expected for a hospital-based cohort.</w:t>
+        <w:t xml:space="preserve">.  </w:t>
+      </w:r>
+      <w:r>
+        <w:t xml:space="preserve">In </w:t>
+      </w:r>
+      <w:r>
+        <w:t>terms of generalizability, the population in this study is a majority white, relatively affluent group of participants who have a relatively high age and number of co-morbidities, as is expected for a hospital-based cohort.</w:t>
       </w:r>
       <w:r>
         <w:t xml:space="preserve">  Finally, we are limited by a single self-reported measure of perceived stress and the cross-sectional nature of this study.</w:t>
@@ -1555,7 +1939,7 @@
         <w:fldChar w:fldCharType="begin"/>
       </w:r>
       <w:r>
-        <w:instrText xml:space="preserve"> ADDIN ZOTERO_ITEM CSL_CITATION {"citationID":"tmOtPEdO","properties":{"formattedCitation":"(6)","plainCitation":"(6)","noteIndex":0},"citationItems":[{"id":"DNVojJss/E9uQonSR","uris":["http://zotero.org/users/2695081/items/3FLNIKRN"],"itemData":{"id":"9zI9GZ7V/BhbSUH95","type":"article-journal","abstract":"Psychosocial work stress has been linked to higher risk of type 2 diabetes (T2DM), with the effect being consistently higher among women than men. Also, work stress has been linked to prospective weight gain among obese men but weight loss among lean men. Here, we aimed to examine the interaction between work stress and obesity in relation to T2DM risk in a gender-specific manner. We studied 5,568 white middle-aged men and women in the Whitehall II study, who were free from diabetes at analysis baseline (1993). After 1993, diabetes was ascertained at six consecutive phases by an oral glucose tolerance test supplemented by self-reports. Cox regression analysis was used to assess the association between job strain (high job demands/low job control) and 18-year incident T2DM stratifying by BMI (BMI &lt;30 kg/m(2) vs. BMI ≥30 kg/m(2)). Overall, work stress was associated with incident T2DM among women (hazard ratio (HR) 1.41: 95% confidence intervals: 1.02; 1.95) but not among men (HR 0.87: 95% confidence interval 0.69; 1.11) (P(INTERACTION) = 0.017). Among men, work stress was associated with a lower risk of T2DM in nonobese (HR 0.70: 0.53; 0.93) but not in obese individuals (P(INTERACTION) = 0.17). Among women, work stress was associated with higher risk of T2DM in the obese (HR 2.01: 1.06; 3.92) but not in the nonobese (P(INTERACTION) = 0.005). Gender and body weight status play a critical role in determining the direction of the association between psychosocial stress and T2DM. The potential effect-modifying role of gender and obesity should not be ignored by future studies looking at stress-disease associations.","container-title":"Obesity (Silver Spring, Md.)","DOI":"10.1038/oby.2011.95","ISSN":"1930-739X","issue":"2","journalAbbreviation":"Obesity (Silver Spring)","language":"eng","note":"PMID: 21593804","page":"428-433","source":"PubMed","title":"Work stress, obesity and the risk of type 2 diabetes: gender-specific bidirectional effect in the Whitehall II study","title-short":"Work stress, obesity and the risk of type 2 diabetes","volume":"20","author":[{"family":"Heraclides","given":"Alexandros M."},{"family":"Chandola","given":"Tarani"},{"family":"Witte","given":"Daniel R."},{"family":"Brunner","given":"Eric J."}],"issued":{"date-parts":[["2012",2]]}}}],"schema":"https://github.com/citation-style-language/schema/raw/master/csl-citation.json"} </w:instrText>
+        <w:instrText xml:space="preserve"> ADDIN ZOTERO_ITEM CSL_CITATION {"citationID":"tmOtPEdO","properties":{"formattedCitation":"(9)","plainCitation":"(9)","noteIndex":0},"citationItems":[{"id":"fATidvy9/NEBiBgsN","uris":["http://zotero.org/users/2695081/items/3FLNIKRN"],"itemData":{"id":"9zI9GZ7V/BhbSUH95","type":"article-journal","abstract":"Psychosocial work stress has been linked to higher risk of type 2 diabetes (T2DM), with the effect being consistently higher among women than men. Also, work stress has been linked to prospective weight gain among obese men but weight loss among lean men. Here, we aimed to examine the interaction between work stress and obesity in relation to T2DM risk in a gender-specific manner. We studied 5,568 white middle-aged men and women in the Whitehall II study, who were free from diabetes at analysis baseline (1993). After 1993, diabetes was ascertained at six consecutive phases by an oral glucose tolerance test supplemented by self-reports. Cox regression analysis was used to assess the association between job strain (high job demands/low job control) and 18-year incident T2DM stratifying by BMI (BMI &lt;30 kg/m(2) vs. BMI ≥30 kg/m(2)). Overall, work stress was associated with incident T2DM among women (hazard ratio (HR) 1.41: 95% confidence intervals: 1.02; 1.95) but not among men (HR 0.87: 95% confidence interval 0.69; 1.11) (P(INTERACTION) = 0.017). Among men, work stress was associated with a lower risk of T2DM in nonobese (HR 0.70: 0.53; 0.93) but not in obese individuals (P(INTERACTION) = 0.17). Among women, work stress was associated with higher risk of T2DM in the obese (HR 2.01: 1.06; 3.92) but not in the nonobese (P(INTERACTION) = 0.005). Gender and body weight status play a critical role in determining the direction of the association between psychosocial stress and T2DM. The potential effect-modifying role of gender and obesity should not be ignored by future studies looking at stress-disease associations.","container-title":"Obesity (Silver Spring, Md.)","DOI":"10.1038/oby.2011.95","ISSN":"1930-739X","issue":"2","journalAbbreviation":"Obesity (Silver Spring)","language":"eng","note":"PMID: 21593804","page":"428-433","source":"PubMed","title":"Work stress, obesity and the risk of type 2 diabetes: gender-specific bidirectional effect in the Whitehall II study","title-short":"Work stress, obesity and the risk of type 2 diabetes","volume":"20","author":[{"family":"Heraclides","given":"Alexandros M."},{"family":"Chandola","given":"Tarani"},{"family":"Witte","given":"Daniel R."},{"family":"Brunner","given":"Eric J."}],"issued":{"date-parts":[["2012",2]]}}}],"schema":"https://github.com/citation-style-language/schema/raw/master/csl-citation.json"} </w:instrText>
       </w:r>
       <w:r>
         <w:fldChar w:fldCharType="separate"/>
@@ -1564,7 +1948,7 @@
         <w:rPr>
           <w:noProof/>
         </w:rPr>
-        <w:t>(6)</w:t>
+        <w:t>(9)</w:t>
       </w:r>
       <w:r>
         <w:fldChar w:fldCharType="end"/>
@@ -1593,7 +1977,7 @@
         <w:fldChar w:fldCharType="begin"/>
       </w:r>
       <w:r>
-        <w:instrText xml:space="preserve"> ADDIN ZOTERO_ITEM CSL_CITATION {"citationID":"60pJs55V","properties":{"formattedCitation":"(4, 5)","plainCitation":"(4, 5)","noteIndex":0},"citationItems":[{"id":"DNVojJss/JUJ2TG0Q","uris":["http://zotero.org/users/2695081/items/ABIIT6F6"],"itemData":{"id":"9zI9GZ7V/tHgRCS7c","type":"article-journal","container-title":"Endocrinology","DOI":"10.1210/en.2018-00147","ISSN":"1945-7170","issue":"6","language":"en","page":"2275-2287","source":"DOI.org (Crossref)","title":"Glucocorticoid-Induced Metabolic Disturbances Are Exacerbated in Obese Male Mice","volume":"159","author":[{"family":"Harvey","given":"Innocence"},{"family":"Stephenson","given":"Erin J"},{"family":"Redd","given":"JeAnna R"},{"family":"Tran","given":"Quynh T"},{"family":"Hochberg","given":"Irit"},{"family":"Qi","given":"Nathan"},{"family":"Bridges","given":"Dave"}],"issued":{"date-parts":[["2018",6,1]]}}},{"id":"DNVojJss/6l3QDrs3","uris":["http://zotero.org/users/2695081/items/455VREYL"],"itemData":{"id":"9zI9GZ7V/3nlM5iac","type":"article-journal","abstract":"Glucocorticoids promote muscle atrophy by inducing a class of proteins called atrogenes, resulting in reductions in muscle size and strength. In this work, we evaluated whether a mouse model with pre-existing diet-induced obesity had altered glucocorticoid responsiveness. We observed that all animals treated with the synthetic glucocorticoid dexamethasone had reduced strength, but that obesity exacerbated this effect. These changes were concordant with more pronounced reductions in muscle size, particularly in Type II muscle fibers, and potentiated induction of atrogene expression in the obese mice relative to lean mice. Furthermore, we show that the reductions in lean mass do not fully account for the dexamethasone-induced insulin resistance observed in these mice. Together, these data suggest that obesity potentiates glucocorticoid-induced muscle atrophy.","container-title":"Biomedicines","DOI":"10.3390/biomedicines8100420","ISSN":"2227-9059","issue":"10","journalAbbreviation":"Biomedicines","language":"en","page":"420","source":"DOI.org (Crossref)","title":"Obesity Augments Glucocorticoid-Dependent Muscle Atrophy in Male C57BL/6J Mice","volume":"8","author":[{"family":"Gunder","given":"Laura C."},{"family":"Harvey","given":"Innocence"},{"family":"Redd","given":"JeAnna R."},{"family":"Davis","given":"Carol S."},{"family":"AL-Tamimi","given":"Ayat"},{"family":"Brooks","given":"Susan V."},{"family":"Bridges","given":"Dave"}],"issued":{"date-parts":[["2020",10,15]]}}}],"schema":"https://github.com/citation-style-language/schema/raw/master/csl-citation.json"} </w:instrText>
+        <w:instrText xml:space="preserve"> ADDIN ZOTERO_ITEM CSL_CITATION {"citationID":"60pJs55V","properties":{"formattedCitation":"(4, 5)","plainCitation":"(4, 5)","noteIndex":0},"citationItems":[{"id":"fATidvy9/DRHt4VpV","uris":["http://zotero.org/users/2695081/items/ABIIT6F6"],"itemData":{"id":"9zI9GZ7V/tHgRCS7c","type":"article-journal","container-title":"Endocrinology","DOI":"10.1210/en.2018-00147","ISSN":"1945-7170","issue":"6","language":"en","page":"2275-2287","source":"DOI.org (Crossref)","title":"Glucocorticoid-Induced Metabolic Disturbances Are Exacerbated in Obese Male Mice","volume":"159","author":[{"family":"Harvey","given":"Innocence"},{"family":"Stephenson","given":"Erin J"},{"family":"Redd","given":"JeAnna R"},{"family":"Tran","given":"Quynh T"},{"family":"Hochberg","given":"Irit"},{"family":"Qi","given":"Nathan"},{"family":"Bridges","given":"Dave"}],"issued":{"date-parts":[["2018",6,1]]}}},{"id":"fATidvy9/57HHE831","uris":["http://zotero.org/users/2695081/items/455VREYL"],"itemData":{"id":"9zI9GZ7V/3nlM5iac","type":"article-journal","abstract":"Glucocorticoids promote muscle atrophy by inducing a class of proteins called atrogenes, resulting in reductions in muscle size and strength. In this work, we evaluated whether a mouse model with pre-existing diet-induced obesity had altered glucocorticoid responsiveness. We observed that all animals treated with the synthetic glucocorticoid dexamethasone had reduced strength, but that obesity exacerbated this effect. These changes were concordant with more pronounced reductions in muscle size, particularly in Type II muscle fibers, and potentiated induction of atrogene expression in the obese mice relative to lean mice. Furthermore, we show that the reductions in lean mass do not fully account for the dexamethasone-induced insulin resistance observed in these mice. Together, these data suggest that obesity potentiates glucocorticoid-induced muscle atrophy.","container-title":"Biomedicines","DOI":"10.3390/biomedicines8100420","ISSN":"2227-9059","issue":"10","journalAbbreviation":"Biomedicines","language":"en","page":"420","source":"DOI.org (Crossref)","title":"Obesity Augments Glucocorticoid-Dependent Muscle Atrophy in Male C57BL/6J Mice","volume":"8","author":[{"family":"Gunder","given":"Laura C."},{"family":"Harvey","given":"Innocence"},{"family":"Redd","given":"JeAnna R."},{"family":"Davis","given":"Carol S."},{"family":"AL-Tamimi","given":"Ayat"},{"family":"Brooks","given":"Susan V."},{"family":"Bridges","given":"Dave"}],"issued":{"date-parts":[["2020",10,15]]}}}],"schema":"https://github.com/citation-style-language/schema/raw/master/csl-citation.json"} </w:instrText>
       </w:r>
       <w:r>
         <w:fldChar w:fldCharType="separate"/>
@@ -1614,7 +1998,7 @@
         <w:fldChar w:fldCharType="begin"/>
       </w:r>
       <w:r>
-        <w:instrText xml:space="preserve"> ADDIN ZOTERO_ITEM CSL_CITATION {"citationID":"zW7FcRAf","properties":{"formattedCitation":"(14)","plainCitation":"(14)","noteIndex":0},"citationItems":[{"id":4127,"uris":["http://zotero.org/users/7317906/items/2YQBFJRJ"],"itemData":{"id":4127,"type":"article-journal","abstract":"Glucocorticoids have major effects on adipose tissue metabolism. To study tissue mRNA expression changes induced by chronic elevated endogenous glucocorticoids, we performed RNA sequencing on subcutaneous adipose tissue from patients with Cushing's disease (n=5) compared to patients with non-functioning pituitary adenomas (n=11). We found higher expression of transcripts involved in several metabolic pathways, including lipogenesis, proteolysis and glucose oxidation as well as decreased expression of transcripts involved in inflammation and protein synthesis. To further study this in a model system, we subjected mice to dexamethasone treatment for 12 weeks and analyzed their inguinal (subcutaneous) fat pads, which led to similar findings. Additionally, mice treated with dexamethasone showed drastic decreases in lean body mass as well as increased fat mass, further supporting the human transcriptomic data. These data provide insight to transcriptional changes that may be responsible for the co-morbidities associated with chronic elevations of glucocorticoids.","container-title":"Journal of Molecular Endocrinology","DOI":"10.1530/JME-15-0119","ISSN":"0952-5041","issue":"2","note":"PMID: 26150553\nCitation Key: Hochberg2015a","page":"81-94","title":"Gene expression changes in subcutaneous adipose tissue due to Cushing's disease","volume":"55","author":[{"family":"Hochberg","given":"Irit"},{"family":"Harvey","given":"Innocence"},{"family":"Tran","given":"Quynh T."},{"family":"Stephenson","given":"Erin J."},{"family":"Barkan","given":"Ariel L"},{"family":"Saltiel","given":"Alan R."},{"family":"Chandler","given":"William F."},{"family":"Bridges","given":"Dave"}],"issued":{"date-parts":[["2015",10]]},"citation-key":"Hochberg2015a"}}],"schema":"https://github.com/citation-style-language/schema/raw/master/csl-citation.json"} </w:instrText>
+        <w:instrText xml:space="preserve"> ADDIN ZOTERO_ITEM CSL_CITATION {"citationID":"zW7FcRAf","properties":{"formattedCitation":"(18)","plainCitation":"(18)","noteIndex":0},"citationItems":[{"id":4127,"uris":["http://zotero.org/users/7317906/items/2YQBFJRJ"],"itemData":{"id":4127,"type":"article-journal","abstract":"Glucocorticoids have major effects on adipose tissue metabolism. To study tissue mRNA expression changes induced by chronic elevated endogenous glucocorticoids, we performed RNA sequencing on subcutaneous adipose tissue from patients with Cushing's disease (n=5) compared to patients with non-functioning pituitary adenomas (n=11). We found higher expression of transcripts involved in several metabolic pathways, including lipogenesis, proteolysis and glucose oxidation as well as decreased expression of transcripts involved in inflammation and protein synthesis. To further study this in a model system, we subjected mice to dexamethasone treatment for 12 weeks and analyzed their inguinal (subcutaneous) fat pads, which led to similar findings. Additionally, mice treated with dexamethasone showed drastic decreases in lean body mass as well as increased fat mass, further supporting the human transcriptomic data. These data provide insight to transcriptional changes that may be responsible for the co-morbidities associated with chronic elevations of glucocorticoids.","container-title":"Journal of Molecular Endocrinology","DOI":"10.1530/JME-15-0119","ISSN":"0952-5041","issue":"2","note":"PMID: 26150553\nCitation Key: Hochberg2015a","page":"81-94","title":"Gene expression changes in subcutaneous adipose tissue due to Cushing's disease","volume":"55","author":[{"family":"Hochberg","given":"Irit"},{"family":"Harvey","given":"Innocence"},{"family":"Tran","given":"Quynh T."},{"family":"Stephenson","given":"Erin J."},{"family":"Barkan","given":"Ariel L"},{"family":"Saltiel","given":"Alan R."},{"family":"Chandler","given":"William F."},{"family":"Bridges","given":"Dave"}],"issued":{"date-parts":[["2015",10]]},"citation-key":"Hochberg2015a"}}],"schema":"https://github.com/citation-style-language/schema/raw/master/csl-citation.json"} </w:instrText>
       </w:r>
       <w:r>
         <w:fldChar w:fldCharType="separate"/>
@@ -1623,7 +2007,7 @@
         <w:rPr>
           <w:noProof/>
         </w:rPr>
-        <w:t>(14)</w:t>
+        <w:t>(18)</w:t>
       </w:r>
       <w:r>
         <w:fldChar w:fldCharType="end"/>
@@ -1675,21 +2059,45 @@
         <w:t>P30DK020572</w:t>
       </w:r>
       <w:r>
-        <w:t xml:space="preserve"> to DB) and grants from the National Institutes of Diabetes and Digestive Kidney Diseases (DK107535 to </w:t>
-      </w:r>
-      <w:commentRangeStart w:id="6"/>
+        <w:t xml:space="preserve"> to DB) and </w:t>
+      </w:r>
+      <w:r>
+        <w:t>support</w:t>
+      </w:r>
+      <w:r>
+        <w:t xml:space="preserve"> from the National Institutes of Diabetes and Digestive Kidney Diseases (</w:t>
+      </w:r>
+      <w:r>
+        <w:t>R01</w:t>
+      </w:r>
+      <w:r>
+        <w:t xml:space="preserve">DK107535 to </w:t>
+      </w:r>
+      <w:commentRangeStart w:id="10"/>
       <w:r>
         <w:t>DB</w:t>
       </w:r>
-      <w:commentRangeEnd w:id="6"/>
+      <w:commentRangeEnd w:id="10"/>
       <w:r>
         <w:rPr>
           <w:rStyle w:val="CommentReference"/>
         </w:rPr>
-        <w:commentReference w:id="6"/>
-      </w:r>
-      <w:r>
-        <w:t>).</w:t>
+        <w:commentReference w:id="10"/>
+      </w:r>
+      <w:r>
+        <w:t>)</w:t>
+      </w:r>
+      <w:r>
+        <w:t xml:space="preserve"> and National Institutes of Environmental Health Sciences (P42</w:t>
+      </w:r>
+      <w:r>
+        <w:t>ES013648</w:t>
+      </w:r>
+      <w:r>
+        <w:t xml:space="preserve"> to DB)</w:t>
+      </w:r>
+      <w:r>
+        <w:t>.</w:t>
       </w:r>
       <w:r>
         <w:t xml:space="preserve">  </w:t>
@@ -1713,6 +2121,7 @@
         </w:rPr>
       </w:pPr>
       <w:r>
+        <w:lastRenderedPageBreak/>
         <w:br w:type="page"/>
       </w:r>
     </w:p>
@@ -1956,7 +2365,7 @@
           <w:rFonts w:ascii="Calibri" w:cs="Calibri"/>
         </w:rPr>
         <w:tab/>
-        <w:t xml:space="preserve">Heraclides AM, Chandola T, Witte DR, Brunner EJ. Work stress, obesity and the risk of type 2 diabetes: gender-specific bidirectional effect in the Whitehall II study. </w:t>
+        <w:t xml:space="preserve">Williams ED, Magliano DJ, Tapp RJ, Oldenburg BF, Shaw JE. Psychosocial stress predicts abnormal glucose metabolism: the Australian Diabetes, Obesity and Lifestyle (AusDiab) study. </w:t>
       </w:r>
       <w:r>
         <w:rPr>
@@ -1964,13 +2373,13 @@
           <w:i/>
           <w:iCs/>
         </w:rPr>
-        <w:t>Obesity (Silver Spring)</w:t>
-      </w:r>
-      <w:r>
-        <w:rPr>
-          <w:rFonts w:ascii="Calibri" w:cs="Calibri"/>
-        </w:rPr>
-        <w:t xml:space="preserve"> 2012;20:428–433.</w:t>
+        <w:t>Ann Behav Med</w:t>
+      </w:r>
+      <w:r>
+        <w:rPr>
+          <w:rFonts w:ascii="Calibri" w:cs="Calibri"/>
+        </w:rPr>
+        <w:t xml:space="preserve"> 2013;46:62–72.</w:t>
       </w:r>
     </w:p>
     <w:p>
@@ -1991,7 +2400,7 @@
           <w:rFonts w:ascii="Calibri" w:cs="Calibri"/>
         </w:rPr>
         <w:tab/>
-        <w:t xml:space="preserve">Williams ED, Magliano DJ, Tapp RJ, Oldenburg BF, Shaw JE. Psychosocial stress predicts abnormal glucose metabolism: the Australian Diabetes, Obesity and Lifestyle (AusDiab) study. </w:t>
+        <w:t xml:space="preserve">Zhu S, Shan S, Liu W, </w:t>
       </w:r>
       <w:r>
         <w:rPr>
@@ -1999,13 +2408,27 @@
           <w:i/>
           <w:iCs/>
         </w:rPr>
-        <w:t>Ann Behav Med</w:t>
-      </w:r>
-      <w:r>
-        <w:rPr>
-          <w:rFonts w:ascii="Calibri" w:cs="Calibri"/>
-        </w:rPr>
-        <w:t xml:space="preserve"> 2013;46:62–72.</w:t>
+        <w:t>et al.</w:t>
+      </w:r>
+      <w:r>
+        <w:rPr>
+          <w:rFonts w:ascii="Calibri" w:cs="Calibri"/>
+        </w:rPr>
+        <w:t xml:space="preserve"> Adverse childhood experiences and risk of diabetes: A systematic review and meta-analysis. </w:t>
+      </w:r>
+      <w:r>
+        <w:rPr>
+          <w:rFonts w:ascii="Calibri" w:cs="Calibri"/>
+          <w:i/>
+          <w:iCs/>
+        </w:rPr>
+        <w:t>J Glob Health</w:t>
+      </w:r>
+      <w:r>
+        <w:rPr>
+          <w:rFonts w:ascii="Calibri" w:cs="Calibri"/>
+        </w:rPr>
+        <w:t xml:space="preserve"> 12:04082.</w:t>
       </w:r>
     </w:p>
     <w:p>
@@ -2026,7 +2449,7 @@
           <w:rFonts w:ascii="Calibri" w:cs="Calibri"/>
         </w:rPr>
         <w:tab/>
-        <w:t xml:space="preserve">Tyagi K, Agarwal NB, Kapur P, Kohli S, Jalali RK. Evaluation of Stress and Associated Biochemical Changes in Patients with Type 2 Diabetes Mellitus and Obesity. </w:t>
+        <w:t xml:space="preserve">Heraclides AM, Chandola T, Witte DR, Brunner EJ. Psychosocial stress at work doubles the risk of type 2 diabetes in middle-aged women: Evidence from the Whitehall II study. </w:t>
       </w:r>
       <w:r>
         <w:rPr>
@@ -2034,13 +2457,13 @@
           <w:i/>
           <w:iCs/>
         </w:rPr>
-        <w:t>Diabetes Metab Syndr Obes</w:t>
-      </w:r>
-      <w:r>
-        <w:rPr>
-          <w:rFonts w:ascii="Calibri" w:cs="Calibri"/>
-        </w:rPr>
-        <w:t xml:space="preserve"> 2021;14:705–717.</w:t>
+        <w:t>Diabetes Care</w:t>
+      </w:r>
+      <w:r>
+        <w:rPr>
+          <w:rFonts w:ascii="Calibri" w:cs="Calibri"/>
+        </w:rPr>
+        <w:t xml:space="preserve"> 2009;32:2230–2235.</w:t>
       </w:r>
     </w:p>
     <w:p>
@@ -2061,7 +2484,7 @@
           <w:rFonts w:ascii="Calibri" w:cs="Calibri"/>
         </w:rPr>
         <w:tab/>
-        <w:t xml:space="preserve">Zawistowski M, Fritsche LG, Pandit A, </w:t>
+        <w:t xml:space="preserve">Heraclides AM, Chandola T, Witte DR, Brunner EJ. Work stress, obesity and the risk of type 2 diabetes: gender-specific bidirectional effect in the Whitehall II study. </w:t>
       </w:r>
       <w:r>
         <w:rPr>
@@ -2069,13 +2492,34 @@
           <w:i/>
           <w:iCs/>
         </w:rPr>
-        <w:t>et al.</w:t>
-      </w:r>
-      <w:r>
-        <w:rPr>
-          <w:rFonts w:ascii="Calibri" w:cs="Calibri"/>
-        </w:rPr>
-        <w:t xml:space="preserve"> The Michigan Genomics Initiative: A biobank linking genotypes and electronic clinical records in Michigan Medicine patients. </w:t>
+        <w:t>Obesity (Silver Spring)</w:t>
+      </w:r>
+      <w:r>
+        <w:rPr>
+          <w:rFonts w:ascii="Calibri" w:cs="Calibri"/>
+        </w:rPr>
+        <w:t xml:space="preserve"> 2012;20:428–433.</w:t>
+      </w:r>
+    </w:p>
+    <w:p>
+      <w:pPr>
+        <w:pStyle w:val="Bibliography"/>
+        <w:rPr>
+          <w:rFonts w:ascii="Calibri" w:cs="Calibri"/>
+        </w:rPr>
+      </w:pPr>
+      <w:r>
+        <w:rPr>
+          <w:rFonts w:ascii="Calibri" w:cs="Calibri"/>
+        </w:rPr>
+        <w:t xml:space="preserve">10. </w:t>
+      </w:r>
+      <w:r>
+        <w:rPr>
+          <w:rFonts w:ascii="Calibri" w:cs="Calibri"/>
+        </w:rPr>
+        <w:tab/>
+        <w:t xml:space="preserve">Tyagi K, Agarwal NB, Kapur P, Kohli S, Jalali RK. Evaluation of Stress and Associated Biochemical Changes in Patients with Type 2 Diabetes Mellitus and Obesity. </w:t>
       </w:r>
       <w:r>
         <w:rPr>
@@ -2083,13 +2527,13 @@
           <w:i/>
           <w:iCs/>
         </w:rPr>
-        <w:t>Cell Genomics</w:t>
-      </w:r>
-      <w:r>
-        <w:rPr>
-          <w:rFonts w:ascii="Calibri" w:cs="Calibri"/>
-        </w:rPr>
-        <w:t xml:space="preserve"> 2023;0.</w:t>
+        <w:t>Diabetes Metab Syndr Obes</w:t>
+      </w:r>
+      <w:r>
+        <w:rPr>
+          <w:rFonts w:ascii="Calibri" w:cs="Calibri"/>
+        </w:rPr>
+        <w:t xml:space="preserve"> 2021;14:705–717.</w:t>
       </w:r>
     </w:p>
     <w:p>
@@ -2103,7 +2547,113 @@
         <w:rPr>
           <w:rFonts w:ascii="Calibri" w:cs="Calibri"/>
         </w:rPr>
-        <w:t xml:space="preserve">10. </w:t>
+        <w:t xml:space="preserve">11. </w:t>
+      </w:r>
+      <w:r>
+        <w:rPr>
+          <w:rFonts w:ascii="Calibri" w:cs="Calibri"/>
+        </w:rPr>
+        <w:tab/>
+        <w:t xml:space="preserve">Zawistowski M, Fritsche LG, Pandit A, </w:t>
+      </w:r>
+      <w:r>
+        <w:rPr>
+          <w:rFonts w:ascii="Calibri" w:cs="Calibri"/>
+          <w:i/>
+          <w:iCs/>
+        </w:rPr>
+        <w:t>et al.</w:t>
+      </w:r>
+      <w:r>
+        <w:rPr>
+          <w:rFonts w:ascii="Calibri" w:cs="Calibri"/>
+        </w:rPr>
+        <w:t xml:space="preserve"> The Michigan Genomics Initiative: A biobank linking genotypes and electronic clinical records in Michigan Medicine patients. </w:t>
+      </w:r>
+      <w:r>
+        <w:rPr>
+          <w:rFonts w:ascii="Calibri" w:cs="Calibri"/>
+          <w:i/>
+          <w:iCs/>
+        </w:rPr>
+        <w:t>Cell Genomics</w:t>
+      </w:r>
+      <w:r>
+        <w:rPr>
+          <w:rFonts w:ascii="Calibri" w:cs="Calibri"/>
+        </w:rPr>
+        <w:t xml:space="preserve"> 2023;0.</w:t>
+      </w:r>
+    </w:p>
+    <w:p>
+      <w:pPr>
+        <w:pStyle w:val="Bibliography"/>
+        <w:rPr>
+          <w:rFonts w:ascii="Calibri" w:cs="Calibri"/>
+        </w:rPr>
+      </w:pPr>
+      <w:r>
+        <w:rPr>
+          <w:rFonts w:ascii="Calibri" w:cs="Calibri"/>
+        </w:rPr>
+        <w:t xml:space="preserve">12. </w:t>
+      </w:r>
+      <w:r>
+        <w:rPr>
+          <w:rFonts w:ascii="Calibri" w:cs="Calibri"/>
+        </w:rPr>
+        <w:tab/>
+        <w:t xml:space="preserve">Cohen S, Kamarck T, Mermelstein R. A global measure of perceived stress. </w:t>
+      </w:r>
+      <w:r>
+        <w:rPr>
+          <w:rFonts w:ascii="Calibri" w:cs="Calibri"/>
+          <w:i/>
+          <w:iCs/>
+        </w:rPr>
+        <w:t>J Health Soc Behav</w:t>
+      </w:r>
+      <w:r>
+        <w:rPr>
+          <w:rFonts w:ascii="Calibri" w:cs="Calibri"/>
+        </w:rPr>
+        <w:t xml:space="preserve"> 1983;24:385–396.</w:t>
+      </w:r>
+    </w:p>
+    <w:p>
+      <w:pPr>
+        <w:pStyle w:val="Bibliography"/>
+        <w:rPr>
+          <w:rFonts w:ascii="Calibri" w:cs="Calibri"/>
+        </w:rPr>
+      </w:pPr>
+      <w:r>
+        <w:rPr>
+          <w:rFonts w:ascii="Calibri" w:cs="Calibri"/>
+        </w:rPr>
+        <w:t xml:space="preserve">13. </w:t>
+      </w:r>
+      <w:r>
+        <w:rPr>
+          <w:rFonts w:ascii="Calibri" w:cs="Calibri"/>
+        </w:rPr>
+        <w:tab/>
+        <w:t>Clarke P, Noppert G, Melendez R, Chenoweth M, Gypin L. National Neighborhood Data Archive (NaNDA): Socioeconomic Status and Demographic Characteristics of Census Tracts and ZIP Code Tabulation Areas, United States, 2000-2020. 2023.</w:t>
+      </w:r>
+    </w:p>
+    <w:p>
+      <w:pPr>
+        <w:pStyle w:val="Bibliography"/>
+        <w:rPr>
+          <w:rFonts w:ascii="Calibri" w:cs="Calibri"/>
+        </w:rPr>
+      </w:pPr>
+      <w:r>
+        <w:rPr>
+          <w:rFonts w:ascii="Calibri" w:cs="Calibri"/>
+        </w:rPr>
+        <w:lastRenderedPageBreak/>
+        <w:t xml:space="preserve">14. </w:t>
       </w:r>
       <w:r>
         <w:rPr>
@@ -2138,7 +2688,7 @@
         <w:rPr>
           <w:rFonts w:ascii="Calibri" w:cs="Calibri"/>
         </w:rPr>
-        <w:t xml:space="preserve">11. </w:t>
+        <w:t xml:space="preserve">15. </w:t>
       </w:r>
       <w:r>
         <w:rPr>
@@ -2159,7 +2709,7 @@
         <w:rPr>
           <w:rFonts w:ascii="Calibri" w:cs="Calibri"/>
         </w:rPr>
-        <w:t xml:space="preserve">12. </w:t>
+        <w:t xml:space="preserve">16. </w:t>
       </w:r>
       <w:r>
         <w:rPr>
@@ -2194,7 +2744,7 @@
         <w:rPr>
           <w:rFonts w:ascii="Calibri" w:cs="Calibri"/>
         </w:rPr>
-        <w:t xml:space="preserve">13. </w:t>
+        <w:t xml:space="preserve">17. </w:t>
       </w:r>
       <w:r>
         <w:rPr>
@@ -2229,7 +2779,7 @@
         <w:rPr>
           <w:rFonts w:ascii="Calibri" w:cs="Calibri"/>
         </w:rPr>
-        <w:t xml:space="preserve">14. </w:t>
+        <w:t xml:space="preserve">18. </w:t>
       </w:r>
       <w:r>
         <w:rPr>
@@ -2269,7 +2819,6 @@
     </w:p>
     <w:p>
       <w:r>
-        <w:lastRenderedPageBreak/>
         <w:fldChar w:fldCharType="end"/>
       </w:r>
     </w:p>
@@ -2372,7 +2921,27 @@
         <w:t>Table 3: The relationship between perceived stress and obesity on prevalence of other chronic diseases.</w:t>
       </w:r>
       <w:r>
-        <w:t xml:space="preserve">  Beta coefficients for obesity, perceived stress and interaction terms in both crude and multivariate adjusted models.  Multivariate adjustments included age, gender, race/ethnicity, and SES.  Asterisks indicate p&lt;0.05 for each beta coefficient.</w:t>
+        <w:t xml:space="preserve">  Beta coefficients for obesity, perceived stress and interaction terms in both crude and multivariate adjusted models.  Multivariate adjustments included age, gender, race/ethnicity, and </w:t>
+      </w:r>
+      <w:r>
+        <w:t>neighborhood disadvantage (</w:t>
+      </w:r>
+      <w:commentRangeStart w:id="11"/>
+      <w:r>
+        <w:t>with one being lowest disadvantage)</w:t>
+      </w:r>
+      <w:r>
+        <w:t xml:space="preserve">.  </w:t>
+      </w:r>
+      <w:commentRangeEnd w:id="11"/>
+      <w:r>
+        <w:rPr>
+          <w:rStyle w:val="CommentReference"/>
+        </w:rPr>
+        <w:commentReference w:id="11"/>
+      </w:r>
+      <w:r>
+        <w:t>Asterisks indicate p&lt;0.05 for each beta coefficient.</w:t>
       </w:r>
     </w:p>
     <w:p>
@@ -2469,7 +3038,79 @@
       </w:r>
     </w:p>
   </w:comment>
-  <w:comment w:id="2" w:author="Dave Bridges" w:date="2024-04-12T11:52:00Z" w:initials="DB">
+  <w:comment w:id="2" w:author="Dave Bridges" w:date="2024-06-25T16:26:00Z" w:initials="DB">
+    <w:p>
+      <w:r>
+        <w:rPr>
+          <w:rStyle w:val="CommentReference"/>
+        </w:rPr>
+        <w:annotationRef/>
+      </w:r>
+      <w:r>
+        <w:rPr>
+          <w:color w:val="000000"/>
+          <w:sz w:val="20"/>
+          <w:szCs w:val="20"/>
+        </w:rPr>
+        <w:t>Remove Htn from T3</w:t>
+      </w:r>
+    </w:p>
+  </w:comment>
+  <w:comment w:id="3" w:author="Dave Bridges" w:date="2024-06-25T16:27:00Z" w:initials="DB">
+    <w:p>
+      <w:r>
+        <w:rPr>
+          <w:rStyle w:val="CommentReference"/>
+        </w:rPr>
+        <w:annotationRef/>
+      </w:r>
+      <w:r>
+        <w:rPr>
+          <w:color w:val="000000"/>
+          <w:sz w:val="20"/>
+          <w:szCs w:val="20"/>
+        </w:rPr>
+        <w:t>Pull MASLD codes</w:t>
+      </w:r>
+    </w:p>
+  </w:comment>
+  <w:comment w:id="4" w:author="Dave Bridges" w:date="2024-06-25T12:04:00Z" w:initials="DB">
+    <w:p>
+      <w:r>
+        <w:rPr>
+          <w:rStyle w:val="CommentReference"/>
+        </w:rPr>
+        <w:annotationRef/>
+      </w:r>
+      <w:r>
+        <w:rPr>
+          <w:color w:val="000000"/>
+          <w:sz w:val="20"/>
+          <w:szCs w:val="20"/>
+        </w:rPr>
+        <w:t>Add refs from PM</w:t>
+      </w:r>
+    </w:p>
+  </w:comment>
+  <w:comment w:id="5" w:author="Dave Bridges" w:date="2024-06-25T11:50:00Z" w:initials="DB">
+    <w:p>
+      <w:r>
+        <w:rPr>
+          <w:rStyle w:val="CommentReference"/>
+        </w:rPr>
+        <w:annotationRef/>
+      </w:r>
+      <w:r>
+        <w:rPr>
+          <w:color w:val="000000"/>
+          <w:sz w:val="20"/>
+          <w:szCs w:val="20"/>
+        </w:rPr>
+        <w:t>Reverse</w:t>
+      </w:r>
+    </w:p>
+  </w:comment>
+  <w:comment w:id="6" w:author="Dave Bridges" w:date="2024-04-12T11:52:00Z" w:initials="DB">
     <w:p>
       <w:r>
         <w:rPr>
@@ -2809,7 +3450,7 @@
       </w:r>
     </w:p>
   </w:comment>
-  <w:comment w:id="3" w:author="Dave Bridges" w:date="2024-04-24T09:48:00Z" w:initials="DB">
+  <w:comment w:id="7" w:author="Dave Bridges" w:date="2024-04-24T09:48:00Z" w:initials="DB">
     <w:p>
       <w:r>
         <w:rPr>
@@ -2827,7 +3468,7 @@
       </w:r>
     </w:p>
   </w:comment>
-  <w:comment w:id="4" w:author="Dave Bridges" w:date="2024-04-26T10:17:00Z" w:initials="DB">
+  <w:comment w:id="8" w:author="Dave Bridges" w:date="2024-04-26T10:17:00Z" w:initials="DB">
     <w:p>
       <w:r>
         <w:rPr>
@@ -2845,7 +3486,7 @@
       </w:r>
     </w:p>
   </w:comment>
-  <w:comment w:id="5" w:author="Dave Bridges" w:date="2024-04-26T10:20:00Z" w:initials="DB">
+  <w:comment w:id="9" w:author="Dave Bridges" w:date="2024-04-26T10:20:00Z" w:initials="DB">
     <w:p>
       <w:r>
         <w:rPr>
@@ -2862,7 +3503,7 @@
       </w:r>
     </w:p>
   </w:comment>
-  <w:comment w:id="6" w:author="Dave Bridges" w:date="2024-04-12T11:07:00Z" w:initials="DB">
+  <w:comment w:id="10" w:author="Dave Bridges" w:date="2024-04-12T11:07:00Z" w:initials="DB">
     <w:p>
       <w:pPr>
         <w:pStyle w:val="CommentText"/>
@@ -2882,6 +3523,24 @@
       <w:r>
         <w:br/>
         <w:t>Do you have any other funding or conflicts of interest that you want to include or disclose.</w:t>
+      </w:r>
+    </w:p>
+  </w:comment>
+  <w:comment w:id="11" w:author="Dave Bridges" w:date="2024-06-25T12:19:00Z" w:initials="DB">
+    <w:p>
+      <w:r>
+        <w:rPr>
+          <w:rStyle w:val="CommentReference"/>
+        </w:rPr>
+        <w:annotationRef/>
+      </w:r>
+      <w:r>
+        <w:rPr>
+          <w:color w:val="000000"/>
+          <w:sz w:val="20"/>
+          <w:szCs w:val="20"/>
+        </w:rPr>
+        <w:t>@Kate make this sound better</w:t>
       </w:r>
     </w:p>
   </w:comment>
@@ -2892,20 +3551,30 @@
 <w15:commentsEx xmlns:wpc="http://schemas.microsoft.com/office/word/2010/wordprocessingCanvas" xmlns:cx="http://schemas.microsoft.com/office/drawing/2014/chartex" xmlns:cx1="http://schemas.microsoft.com/office/drawing/2015/9/8/chartex" xmlns:cx2="http://schemas.microsoft.com/office/drawing/2015/10/21/chartex" xmlns:cx3="http://schemas.microsoft.com/office/drawing/2016/5/9/chartex" xmlns:cx4="http://schemas.microsoft.com/office/drawing/2016/5/10/chartex" xmlns:cx5="http://schemas.microsoft.com/office/drawing/2016/5/11/chartex" xmlns:cx6="http://schemas.microsoft.com/office/drawing/2016/5/12/chartex" xmlns:cx7="http://schemas.microsoft.com/office/drawing/2016/5/13/chartex" xmlns:cx8="http://schemas.microsoft.com/office/drawing/2016/5/14/chartex" xmlns:mc="http://schemas.openxmlformats.org/markup-compatibility/2006" xmlns:aink="http://schemas.microsoft.com/office/drawing/2016/ink" xmlns:am3d="http://schemas.microsoft.com/office/drawing/2017/model3d" xmlns:o="urn:schemas-microsoft-com:office:office" xmlns:oel="http://schemas.microsoft.com/office/2019/extlst" xmlns:r="http://schemas.openxmlformats.org/officeDocument/2006/relationships" xmlns:m="http://schemas.openxmlformats.org/officeDocument/2006/math" xmlns:v="urn:schemas-microsoft-com:vml" xmlns:wp14="http://schemas.microsoft.com/office/word/2010/wordprocessingDrawing" xmlns:wp="http://schemas.openxmlformats.org/drawingml/2006/wordprocessingDrawing" xmlns:w10="urn:schemas-microsoft-com:office:word" xmlns:w="http://schemas.openxmlformats.org/wordprocessingml/2006/main" xmlns:w14="http://schemas.microsoft.com/office/word/2010/wordml" xmlns:w15="http://schemas.microsoft.com/office/word/2012/wordml" xmlns:w16cex="http://schemas.microsoft.com/office/word/2018/wordml/cex" xmlns:w16cid="http://schemas.microsoft.com/office/word/2016/wordml/cid" xmlns:w16="http://schemas.microsoft.com/office/word/2018/wordml" xmlns:w16sdtdh="http://schemas.microsoft.com/office/word/2020/wordml/sdtdatahash" xmlns:w16se="http://schemas.microsoft.com/office/word/2015/wordml/symex" xmlns:wpg="http://schemas.microsoft.com/office/word/2010/wordprocessingGroup" xmlns:wpi="http://schemas.microsoft.com/office/word/2010/wordprocessingInk" xmlns:wne="http://schemas.microsoft.com/office/word/2006/wordml" xmlns:wps="http://schemas.microsoft.com/office/word/2010/wordprocessingShape" mc:Ignorable="w14 w15 w16se w16cid w16 w16cex w16sdtdh wp14">
   <w15:commentEx w15:paraId="10DFA24D" w15:done="0"/>
   <w15:commentEx w15:paraId="0C81528E" w15:done="0"/>
+  <w15:commentEx w15:paraId="22E8FD1D" w15:done="0"/>
+  <w15:commentEx w15:paraId="4BE3F8F8" w15:done="0"/>
+  <w15:commentEx w15:paraId="31F55D03" w15:done="0"/>
+  <w15:commentEx w15:paraId="3030B64F" w15:done="0"/>
   <w15:commentEx w15:paraId="6B0600C2" w15:done="0"/>
   <w15:commentEx w15:paraId="5C843C51" w15:done="0"/>
   <w15:commentEx w15:paraId="40BDD707" w15:paraIdParent="5C843C51" w15:done="0"/>
   <w15:commentEx w15:paraId="157B073D" w15:paraIdParent="5C843C51" w15:done="0"/>
   <w15:commentEx w15:paraId="4DAD4B88" w15:done="0"/>
+  <w15:commentEx w15:paraId="43259844" w15:done="0"/>
 </w15:commentsEx>
 </file>
 
 <file path=word/commentsExtensible.xml><?xml version="1.0" encoding="utf-8"?>
 <w16cex:commentsExtensible xmlns:wpc="http://schemas.microsoft.com/office/word/2010/wordprocessingCanvas" xmlns:cx="http://schemas.microsoft.com/office/drawing/2014/chartex" xmlns:cx1="http://schemas.microsoft.com/office/drawing/2015/9/8/chartex" xmlns:cx2="http://schemas.microsoft.com/office/drawing/2015/10/21/chartex" xmlns:cx3="http://schemas.microsoft.com/office/drawing/2016/5/9/chartex" xmlns:cx4="http://schemas.microsoft.com/office/drawing/2016/5/10/chartex" xmlns:cx5="http://schemas.microsoft.com/office/drawing/2016/5/11/chartex" xmlns:cx6="http://schemas.microsoft.com/office/drawing/2016/5/12/chartex" xmlns:cx7="http://schemas.microsoft.com/office/drawing/2016/5/13/chartex" xmlns:cx8="http://schemas.microsoft.com/office/drawing/2016/5/14/chartex" xmlns:cr="http://schemas.microsoft.com/office/comments/2020/reactions" xmlns:mc="http://schemas.openxmlformats.org/markup-compatibility/2006" xmlns:aink="http://schemas.microsoft.com/office/drawing/2016/ink" xmlns:am3d="http://schemas.microsoft.com/office/drawing/2017/model3d" xmlns:o="urn:schemas-microsoft-com:office:office" xmlns:oel="http://schemas.microsoft.com/office/2019/extlst" xmlns:r="http://schemas.openxmlformats.org/officeDocument/2006/relationships" xmlns:m="http://schemas.openxmlformats.org/officeDocument/2006/math" xmlns:v="urn:schemas-microsoft-com:vml" xmlns:wp14="http://schemas.microsoft.com/office/word/2010/wordprocessingDrawing" xmlns:wp="http://schemas.openxmlformats.org/drawingml/2006/wordprocessingDrawing" xmlns:w10="urn:schemas-microsoft-com:office:word" xmlns:w="http://schemas.openxmlformats.org/wordprocessingml/2006/main" xmlns:w14="http://schemas.microsoft.com/office/word/2010/wordml" xmlns:w15="http://schemas.microsoft.com/office/word/2012/wordml" xmlns:w16cex="http://schemas.microsoft.com/office/word/2018/wordml/cex" xmlns:w16cid="http://schemas.microsoft.com/office/word/2016/wordml/cid" xmlns:w16="http://schemas.microsoft.com/office/word/2018/wordml" xmlns:w16sdtdh="http://schemas.microsoft.com/office/word/2020/wordml/sdtdatahash" xmlns:w16se="http://schemas.microsoft.com/office/word/2015/wordml/symex" xmlns:wpg="http://schemas.microsoft.com/office/word/2010/wordprocessingGroup" xmlns:wpi="http://schemas.microsoft.com/office/word/2010/wordprocessingInk" xmlns:wne="http://schemas.microsoft.com/office/word/2006/wordml" xmlns:wps="http://schemas.microsoft.com/office/word/2010/wordprocessingShape" mc:Ignorable="w14 w15 w16se w16cid w16 w16cex w16sdtdh cr wp14">
   <w16cex:commentExtensible w16cex:durableId="110DF523" w16cex:dateUtc="2024-04-26T14:23:00Z"/>
+  <w16cex:commentExtensible w16cex:durableId="0FC52800" w16cex:dateUtc="2024-06-25T20:26:00Z"/>
+  <w16cex:commentExtensible w16cex:durableId="6D4E274A" w16cex:dateUtc="2024-06-25T20:27:00Z"/>
+  <w16cex:commentExtensible w16cex:durableId="36BE09A4" w16cex:dateUtc="2024-06-25T16:04:00Z"/>
+  <w16cex:commentExtensible w16cex:durableId="5AFB66B0" w16cex:dateUtc="2024-06-25T15:50:00Z"/>
   <w16cex:commentExtensible w16cex:durableId="2BE31721" w16cex:dateUtc="2024-04-24T13:48:00Z"/>
   <w16cex:commentExtensible w16cex:durableId="6BE55EE1" w16cex:dateUtc="2024-04-26T14:17:00Z"/>
   <w16cex:commentExtensible w16cex:durableId="383DF9F7" w16cex:dateUtc="2024-04-26T14:20:00Z"/>
+  <w16cex:commentExtensible w16cex:durableId="763F340D" w16cex:dateUtc="2024-06-25T16:19:00Z"/>
 </w16cex:commentsExtensible>
 </file>
 
@@ -2913,11 +3582,16 @@
 <w16cid:commentsIds xmlns:wpc="http://schemas.microsoft.com/office/word/2010/wordprocessingCanvas" xmlns:cx="http://schemas.microsoft.com/office/drawing/2014/chartex" xmlns:cx1="http://schemas.microsoft.com/office/drawing/2015/9/8/chartex" xmlns:cx2="http://schemas.microsoft.com/office/drawing/2015/10/21/chartex" xmlns:cx3="http://schemas.microsoft.com/office/drawing/2016/5/9/chartex" xmlns:cx4="http://schemas.microsoft.com/office/drawing/2016/5/10/chartex" xmlns:cx5="http://schemas.microsoft.com/office/drawing/2016/5/11/chartex" xmlns:cx6="http://schemas.microsoft.com/office/drawing/2016/5/12/chartex" xmlns:cx7="http://schemas.microsoft.com/office/drawing/2016/5/13/chartex" xmlns:cx8="http://schemas.microsoft.com/office/drawing/2016/5/14/chartex" xmlns:mc="http://schemas.openxmlformats.org/markup-compatibility/2006" xmlns:aink="http://schemas.microsoft.com/office/drawing/2016/ink" xmlns:am3d="http://schemas.microsoft.com/office/drawing/2017/model3d" xmlns:o="urn:schemas-microsoft-com:office:office" xmlns:oel="http://schemas.microsoft.com/office/2019/extlst" xmlns:r="http://schemas.openxmlformats.org/officeDocument/2006/relationships" xmlns:m="http://schemas.openxmlformats.org/officeDocument/2006/math" xmlns:v="urn:schemas-microsoft-com:vml" xmlns:wp14="http://schemas.microsoft.com/office/word/2010/wordprocessingDrawing" xmlns:wp="http://schemas.openxmlformats.org/drawingml/2006/wordprocessingDrawing" xmlns:w10="urn:schemas-microsoft-com:office:word" xmlns:w="http://schemas.openxmlformats.org/wordprocessingml/2006/main" xmlns:w14="http://schemas.microsoft.com/office/word/2010/wordml" xmlns:w15="http://schemas.microsoft.com/office/word/2012/wordml" xmlns:w16cex="http://schemas.microsoft.com/office/word/2018/wordml/cex" xmlns:w16cid="http://schemas.microsoft.com/office/word/2016/wordml/cid" xmlns:w16="http://schemas.microsoft.com/office/word/2018/wordml" xmlns:w16sdtdh="http://schemas.microsoft.com/office/word/2020/wordml/sdtdatahash" xmlns:w16se="http://schemas.microsoft.com/office/word/2015/wordml/symex" xmlns:wpg="http://schemas.microsoft.com/office/word/2010/wordprocessingGroup" xmlns:wpi="http://schemas.microsoft.com/office/word/2010/wordprocessingInk" xmlns:wne="http://schemas.microsoft.com/office/word/2006/wordml" xmlns:wps="http://schemas.microsoft.com/office/word/2010/wordprocessingShape" mc:Ignorable="w14 w15 w16se w16cid w16 w16cex w16sdtdh wp14">
   <w16cid:commentId w16cid:paraId="10DFA24D" w16cid:durableId="29411550"/>
   <w16cid:commentId w16cid:paraId="0C81528E" w16cid:durableId="110DF523"/>
+  <w16cid:commentId w16cid:paraId="22E8FD1D" w16cid:durableId="0FC52800"/>
+  <w16cid:commentId w16cid:paraId="4BE3F8F8" w16cid:durableId="6D4E274A"/>
+  <w16cid:commentId w16cid:paraId="31F55D03" w16cid:durableId="36BE09A4"/>
+  <w16cid:commentId w16cid:paraId="3030B64F" w16cid:durableId="5AFB66B0"/>
   <w16cid:commentId w16cid:paraId="6B0600C2" w16cid:durableId="29C39F1A"/>
   <w16cid:commentId w16cid:paraId="5C843C51" w16cid:durableId="2BE31721"/>
   <w16cid:commentId w16cid:paraId="40BDD707" w16cid:durableId="6BE55EE1"/>
   <w16cid:commentId w16cid:paraId="157B073D" w16cid:durableId="383DF9F7"/>
   <w16cid:commentId w16cid:paraId="4DAD4B88" w16cid:durableId="29C39457"/>
+  <w16cid:commentId w16cid:paraId="43259844" w16cid:durableId="763F340D"/>
 </w16cid:commentsIds>
 </file>
 

</xml_diff>

<commit_message>
Removed reference to hypertension in manuscript and tables
</commit_message>
<xml_diff>
--- a/manuscript/Obesity-Stress/Manuscript.docx
+++ b/manuscript/Obesity-Stress/Manuscript.docx
@@ -764,7 +764,7 @@
         <w:fldChar w:fldCharType="end"/>
       </w:r>
       <w:r>
-        <w:t xml:space="preserve">.  For hypertension, both complicated and uncomplicated hypertension were combined into one group.  </w:t>
+        <w:t xml:space="preserve">.  </w:t>
       </w:r>
     </w:p>
     <w:p/>
@@ -991,7 +991,6 @@
         <w:t xml:space="preserve">  </w:t>
       </w:r>
       <w:r>
-        <w:lastRenderedPageBreak/>
         <w:t>Among</w:t>
       </w:r>
       <w:r>
@@ -1296,13 +1295,11 @@
       <w:r>
         <w:t xml:space="preserve"> whether the interaction between obesity and perceived stress was consistent across demographic categories.  We found that the interaction was stronger in males (21%) than females (0.3%), and stronger in Asian (49%) and Black (19%) participants than White (13%) or Hispanic/Latino (-45%) participants, though neither stress x obesity x gender </w:t>
       </w:r>
-      <w:proofErr w:type="gramStart"/>
-      <w:r>
-        <w:t>or</w:t>
-      </w:r>
-      <w:proofErr w:type="gramEnd"/>
-      <w:r>
-        <w:t xml:space="preserve"> stress x obesity x race/ethnicity interactions reached statistical significance.  </w:t>
+      <w:r>
+        <w:t>n</w:t>
+      </w:r>
+      <w:r>
+        <w:t xml:space="preserve">or stress x obesity x race/ethnicity interactions reached statistical significance.  </w:t>
       </w:r>
       <w:r>
         <w:t xml:space="preserve">We also found that in the </w:t>
@@ -1434,138 +1431,142 @@
         <w:t xml:space="preserve"> Significantly</w:t>
       </w:r>
       <w:r>
-        <w:t xml:space="preserve"> Augment the Obesity Associated Prevalence of Hypertension, </w:t>
-      </w:r>
-      <w:r>
-        <w:t xml:space="preserve">Congestive Heart Failure, </w:t>
-      </w:r>
-      <w:r>
-        <w:t>Cardiac Arrhythmia or Liver Disease</w:t>
+        <w:t xml:space="preserve"> Modify the Prevalence of Other Obesity-Related Co-Morbidities</w:t>
+      </w:r>
+    </w:p>
+    <w:p/>
+    <w:p>
+      <w:r>
+        <w:t xml:space="preserve">Given the enhancement of obesity-associated diabetes prevalence in these participants, we then evaluated several other obesity and stress-linked chronic diseases using the same approach.  In </w:t>
+      </w:r>
+      <w:commentRangeStart w:id="1"/>
+      <w:r>
+        <w:t xml:space="preserve">Table </w:t>
+      </w:r>
+      <w:r>
+        <w:t xml:space="preserve">3 </w:t>
+      </w:r>
+      <w:commentRangeEnd w:id="1"/>
+      <w:r>
+        <w:rPr>
+          <w:rStyle w:val="CommentReference"/>
+        </w:rPr>
+        <w:commentReference w:id="1"/>
+      </w:r>
+      <w:r>
+        <w:t>we describe the raw and adjusted associations between obesity and stress on arrhythmia</w:t>
+      </w:r>
+      <w:r>
+        <w:t>, chronic pulmonary disease, congestive heart failure,</w:t>
+      </w:r>
+      <w:r>
+        <w:t xml:space="preserve"> and liver disease.</w:t>
+      </w:r>
+      <w:r>
+        <w:t xml:space="preserve">  </w:t>
+      </w:r>
+      <w:r>
+        <w:t xml:space="preserve">Consistent with previous reports, we show that obesity is associated with the increased prevalence of each of these co-morbidities with </w:t>
+      </w:r>
+      <w:r>
+        <w:t>odds ratios</w:t>
+      </w:r>
+      <w:r>
+        <w:t xml:space="preserve"> ranging from </w:t>
+      </w:r>
+      <w:r>
+        <w:t xml:space="preserve">a </w:t>
+      </w:r>
+      <w:r>
+        <w:t xml:space="preserve">9.1 % increased </w:t>
+      </w:r>
+      <w:r>
+        <w:t xml:space="preserve">prevalence of </w:t>
+      </w:r>
+      <w:r>
+        <w:t xml:space="preserve">cardiac arrythmia to </w:t>
+      </w:r>
+      <w:r>
+        <w:t>a 1.4</w:t>
+      </w:r>
+      <w:r>
+        <w:t xml:space="preserve">x increased prevalence of </w:t>
+      </w:r>
+      <w:r>
+        <w:t>congestive heart failure</w:t>
+      </w:r>
+      <w:r>
+        <w:t xml:space="preserve"> after adjusting for confounders.  </w:t>
+      </w:r>
+      <w:r>
+        <w:t>P</w:t>
+      </w:r>
+      <w:r>
+        <w:t xml:space="preserve">erceived stress was also associated with the increased </w:t>
+      </w:r>
+      <w:r>
+        <w:t>likelihood</w:t>
+      </w:r>
+      <w:r>
+        <w:t xml:space="preserve"> of </w:t>
+      </w:r>
+      <w:r>
+        <w:t>most</w:t>
+      </w:r>
+      <w:r>
+        <w:t xml:space="preserve"> of these </w:t>
+      </w:r>
+      <w:r>
+        <w:t xml:space="preserve">diseases in both crude and </w:t>
+      </w:r>
+      <w:proofErr w:type="gramStart"/>
+      <w:r>
+        <w:t>fully-adjusted</w:t>
+      </w:r>
+      <w:proofErr w:type="gramEnd"/>
+      <w:r>
+        <w:t xml:space="preserve"> models</w:t>
+      </w:r>
+      <w:r>
+        <w:t xml:space="preserve">.  </w:t>
+      </w:r>
+      <w:r>
+        <w:t>However, in contrast to what we observed for type 2 diabetes, when</w:t>
+      </w:r>
+      <w:r>
+        <w:t xml:space="preserve"> we examined the interaction between perceived stress and obesity, none of these </w:t>
+      </w:r>
+      <w:r>
+        <w:t>interactions reached significance</w:t>
+      </w:r>
+      <w:r>
+        <w:t xml:space="preserve"> in either the crude or adjusted models.  T</w:t>
+      </w:r>
+      <w:r>
+        <w:t xml:space="preserve">hese data suggest that </w:t>
+      </w:r>
+      <w:r>
+        <w:t xml:space="preserve">the </w:t>
+      </w:r>
+      <w:r>
+        <w:t>augmented</w:t>
       </w:r>
       <w:r>
         <w:t xml:space="preserve"> </w:t>
       </w:r>
-    </w:p>
-    <w:p/>
-    <w:p>
-      <w:r>
-        <w:t xml:space="preserve">Given the enhancement of obesity-associated diabetes prevalence in these participants, we then evaluated several other obesity and stress-linked chronic diseases using the same approach.  In </w:t>
-      </w:r>
-      <w:commentRangeStart w:id="1"/>
-      <w:r>
-        <w:t xml:space="preserve">Table </w:t>
-      </w:r>
-      <w:r>
-        <w:t xml:space="preserve">3 </w:t>
-      </w:r>
-      <w:commentRangeEnd w:id="1"/>
-      <w:r>
-        <w:rPr>
-          <w:rStyle w:val="CommentReference"/>
-        </w:rPr>
-        <w:commentReference w:id="1"/>
-      </w:r>
-      <w:r>
-        <w:t xml:space="preserve">we describe the raw and adjusted associations between obesity and stress on </w:t>
-      </w:r>
-      <w:commentRangeStart w:id="2"/>
-      <w:r>
-        <w:t>hypertension</w:t>
-      </w:r>
-      <w:commentRangeEnd w:id="2"/>
-      <w:r>
-        <w:rPr>
-          <w:rStyle w:val="CommentReference"/>
-        </w:rPr>
-        <w:commentReference w:id="2"/>
-      </w:r>
-      <w:r>
-        <w:t>, arrhythmia</w:t>
-      </w:r>
-      <w:r>
-        <w:t>, chronic pulmonary disease, congestive heart failure,</w:t>
-      </w:r>
-      <w:r>
-        <w:t xml:space="preserve"> and </w:t>
-      </w:r>
-      <w:commentRangeStart w:id="3"/>
-      <w:r>
-        <w:t xml:space="preserve">liver </w:t>
-      </w:r>
-      <w:commentRangeEnd w:id="3"/>
-      <w:r>
-        <w:rPr>
-          <w:rStyle w:val="CommentReference"/>
-        </w:rPr>
-        <w:commentReference w:id="3"/>
-      </w:r>
-      <w:r>
-        <w:t>disease.</w:t>
-      </w:r>
-      <w:r>
-        <w:t xml:space="preserve">  </w:t>
-      </w:r>
-      <w:r>
-        <w:t xml:space="preserve">Consistent with previous reports, we show that obesity is associated with the increased prevalence of each of these co-morbidities with </w:t>
-      </w:r>
-      <w:r>
-        <w:t>odds ratios</w:t>
-      </w:r>
-      <w:r>
-        <w:t xml:space="preserve"> ranging from </w:t>
-      </w:r>
-      <w:r>
-        <w:t xml:space="preserve">a </w:t>
-      </w:r>
-      <w:r>
-        <w:t xml:space="preserve">9.1 % increased cardiac arrythmia to 2.4x increased prevalence of hypertension after adjusting for confounders.  Similarly, perceived stress was also associated with the increased </w:t>
-      </w:r>
-      <w:r>
-        <w:t>likelihood</w:t>
-      </w:r>
-      <w:r>
-        <w:t xml:space="preserve"> of each of these diseases (9.1% increased </w:t>
-      </w:r>
       <w:r>
         <w:t>prevalence</w:t>
       </w:r>
       <w:r>
-        <w:t xml:space="preserve"> for arrythmia to </w:t>
-      </w:r>
-      <w:r>
-        <w:t xml:space="preserve">30% increased </w:t>
-      </w:r>
-      <w:r>
-        <w:t>prevalence</w:t>
-      </w:r>
-      <w:r>
-        <w:t xml:space="preserve"> of congestive heart failure).  When we examined the interaction between perceived stress and obesity, none of these conditions had significant interactions in either the crude or adjusted models.  T</w:t>
-      </w:r>
-      <w:r>
-        <w:t xml:space="preserve">hese data suggest that </w:t>
-      </w:r>
-      <w:r>
-        <w:t xml:space="preserve">the </w:t>
-      </w:r>
-      <w:r>
-        <w:t>augmented</w:t>
+        <w:t xml:space="preserve"> of </w:t>
+      </w:r>
+      <w:r>
+        <w:t>type 2 diabetes</w:t>
       </w:r>
       <w:r>
         <w:t xml:space="preserve"> </w:t>
       </w:r>
       <w:r>
-        <w:t>prevalence</w:t>
-      </w:r>
-      <w:r>
-        <w:t xml:space="preserve"> of </w:t>
-      </w:r>
-      <w:r>
-        <w:t>type 2 diabetes</w:t>
-      </w:r>
-      <w:r>
-        <w:t xml:space="preserve"> </w:t>
-      </w:r>
-      <w:r>
         <w:t>of obesity when coupled with psychosocial stress</w:t>
       </w:r>
       <w:r>
@@ -1575,7 +1576,10 @@
         <w:t>evident</w:t>
       </w:r>
       <w:r>
-        <w:t xml:space="preserve"> across these other conditions</w:t>
+        <w:t xml:space="preserve"> across these other </w:t>
+      </w:r>
+      <w:r>
+        <w:t>co-morbidities</w:t>
       </w:r>
       <w:r>
         <w:t xml:space="preserve"> in this population</w:t>
@@ -1622,98 +1626,113 @@
         <w:t xml:space="preserve">  </w:t>
       </w:r>
       <w:r>
-        <w:t xml:space="preserve">There are well established longitudinal connections between psychosocial stress and </w:t>
-      </w:r>
-      <w:commentRangeStart w:id="4"/>
-      <w:r>
-        <w:t>risk</w:t>
-      </w:r>
-      <w:commentRangeEnd w:id="4"/>
-      <w:r>
-        <w:t xml:space="preserve"> of obesity</w:t>
-      </w:r>
+        <w:t xml:space="preserve">There are well established longitudinal connections between psychosocial stress and risk of obesity.  </w:t>
+      </w:r>
+      <w:r>
+        <w:t xml:space="preserve">There was a J-shaped relationship between BMI and perceived stress.   For the small number (0.7%, n=283) of participants that are underweight this could be due to advanced age or other chronic diseases.  </w:t>
+      </w:r>
+      <w:r>
+        <w:t xml:space="preserve">The higher reported stress in </w:t>
+      </w:r>
+      <w:r>
+        <w:t xml:space="preserve">participants with BMI &gt;30 (43-48%) relative to those with BMI between 18.5 and 30 may </w:t>
+      </w:r>
+      <w:r>
+        <w:t xml:space="preserve">also </w:t>
+      </w:r>
+      <w:r>
+        <w:t xml:space="preserve">reflect weight stigma and could represent a positive feedback loop wherein obesity-linked psychosocial stress may enhance diabetes </w:t>
+      </w:r>
+      <w:r>
+        <w:t>prevalence</w:t>
+      </w:r>
+      <w:r>
+        <w:t xml:space="preserve"> in this population.  We observe enhanced obesity-associated perceived stress in females with BMI &gt;30 (47%) compared to BMI &lt;30 (42%) than in males (42% vs 39%, </w:t>
+      </w:r>
+      <w:proofErr w:type="spellStart"/>
+      <w:r>
+        <w:t>p</w:t>
+      </w:r>
+      <w:r>
+        <w:rPr>
+          <w:vertAlign w:val="subscript"/>
+        </w:rPr>
+        <w:t>Gender</w:t>
+      </w:r>
+      <w:proofErr w:type="spellEnd"/>
+      <w:r>
+        <w:rPr>
+          <w:vertAlign w:val="subscript"/>
+        </w:rPr>
+        <w:t xml:space="preserve"> x </w:t>
+      </w:r>
+      <w:r>
+        <w:rPr>
+          <w:vertAlign w:val="subscript"/>
+        </w:rPr>
+        <w:t>Obesity Status</w:t>
+      </w:r>
+      <w:r>
+        <w:rPr>
+          <w:vertAlign w:val="subscript"/>
+        </w:rPr>
+        <w:t xml:space="preserve"> </w:t>
+      </w:r>
+      <w:r>
+        <w:t xml:space="preserve">= 0.0026), consistent with higher rates of weight discrimination in </w:t>
+      </w:r>
+      <w:commentRangeStart w:id="2"/>
+      <w:r>
+        <w:t xml:space="preserve">women </w:t>
+      </w:r>
+      <w:r>
+        <w:fldChar w:fldCharType="begin"/>
+      </w:r>
+      <w:r>
+        <w:instrText xml:space="preserve"> ADDIN ZOTERO_ITEM CSL_CITATION {"citationID":"uEUVukVw","properties":{"formattedCitation":"(16)","plainCitation":"(16)","noteIndex":0},"citationItems":[{"id":11485,"uris":["http://zotero.org/users/7317906/items/2VPGKQ72"],"itemData":{"id":11485,"type":"article-journal","abstract":"Weight stigma is related to lower levels of motivation to exercise in overweight and obesity. This study explored the nature of the relationship between stigma, motivation to exercise and physical activity while accounting for gender differences. Participants were 439 adults with overweight and obesity (mean body mass index = 32.18 kg/m2, standard deviation = 4.09 kg/m2). Females reported significantly more frequent stigma experiences than males. Mediation models found a conditional direct effect of weight stigma for males, with higher frequency of stigma experiences related to higher levels of walking and vigorous physical activity. A conditional indirect effect was found for females for walking, moderate and vigorous levels of physical activity, with higher weight stigma related to lower autonomous motivation, and lower levels of physical activity. Findings suggest that males and females are affected differently by weight-stigma experiences.","container-title":"Health Psychology Open","DOI":"10.1177/2055102918759691","ISSN":"2055-1029","issue":"1","journalAbbreviation":"Health Psychol Open","note":"PMID: 29552349\nPMCID: PMC5846936","page":"2055102918759691","source":"PubMed Central","title":"Gender differences in the relationship of weight-based stigmatisation with motivation to exercise and physical activity in overweight individuals","volume":"5","author":[{"family":"Sattler","given":"Krystal M"},{"family":"Deane","given":"Frank P"},{"family":"Tapsell","given":"Linda"},{"family":"Kelly","given":"Peter J"}],"issued":{"date-parts":[["2018",3,8]]},"citation-key":"sattlerGenderDifferencesRelationship2018"}}],"schema":"https://github.com/citation-style-language/schema/raw/master/csl-citation.json"} </w:instrText>
+      </w:r>
+      <w:r>
+        <w:fldChar w:fldCharType="separate"/>
+      </w:r>
+      <w:r>
+        <w:rPr>
+          <w:noProof/>
+        </w:rPr>
+        <w:t>(16)</w:t>
+      </w:r>
+      <w:r>
+        <w:fldChar w:fldCharType="end"/>
+      </w:r>
+      <w:r>
+        <w:t>.</w:t>
+      </w:r>
+      <w:commentRangeEnd w:id="2"/>
       <w:r>
         <w:rPr>
           <w:rStyle w:val="CommentReference"/>
         </w:rPr>
-        <w:commentReference w:id="4"/>
-      </w:r>
-      <w:r>
-        <w:t xml:space="preserve">.  </w:t>
-      </w:r>
-      <w:r>
-        <w:t xml:space="preserve">There was a J-shaped relationship between BMI and perceived stress.   For the small number (0.7%, n=283) of participants that are underweight this could be due to advanced age or other chronic diseases.  </w:t>
-      </w:r>
-      <w:commentRangeStart w:id="5"/>
-      <w:r>
-        <w:t xml:space="preserve">The higher reported stress in </w:t>
-      </w:r>
-      <w:r>
-        <w:t xml:space="preserve">participants with BMI &gt;30 (43-48%) relative to those with BMI between 18.5 and 30 may </w:t>
-      </w:r>
-      <w:r>
-        <w:t xml:space="preserve">also </w:t>
-      </w:r>
-      <w:r>
-        <w:t xml:space="preserve">reflect weight stigma and could represent a positive feedback loop wherein obesity-linked psychosocial stress may enhance diabetes </w:t>
-      </w:r>
-      <w:r>
-        <w:t>prevalence</w:t>
-      </w:r>
-      <w:r>
-        <w:t xml:space="preserve"> in this population</w:t>
-      </w:r>
-      <w:commentRangeEnd w:id="5"/>
-      <w:r>
-        <w:rPr>
-          <w:rStyle w:val="CommentReference"/>
-        </w:rPr>
-        <w:commentReference w:id="5"/>
-      </w:r>
-      <w:r>
-        <w:t xml:space="preserve">.  We observe enhanced obesity-associated perceived stress in females with BMI &gt;30 (47%) compared to BMI &lt;30 (42%) than in males (42% vs 39%, </w:t>
-      </w:r>
-      <w:proofErr w:type="spellStart"/>
-      <w:r>
-        <w:t>p</w:t>
-      </w:r>
-      <w:r>
-        <w:rPr>
-          <w:vertAlign w:val="subscript"/>
-        </w:rPr>
-        <w:t>Gender</w:t>
-      </w:r>
-      <w:proofErr w:type="spellEnd"/>
-      <w:r>
-        <w:rPr>
-          <w:vertAlign w:val="subscript"/>
-        </w:rPr>
-        <w:t xml:space="preserve"> x </w:t>
-      </w:r>
-      <w:r>
-        <w:rPr>
-          <w:vertAlign w:val="subscript"/>
-        </w:rPr>
-        <w:t>Obesity Status</w:t>
-      </w:r>
-      <w:r>
-        <w:rPr>
-          <w:vertAlign w:val="subscript"/>
-        </w:rPr>
-        <w:t xml:space="preserve"> </w:t>
-      </w:r>
-      <w:r>
-        <w:t xml:space="preserve">= 0.0026), consistent with higher rates of weight discrimination in </w:t>
-      </w:r>
-      <w:commentRangeStart w:id="6"/>
-      <w:r>
-        <w:t xml:space="preserve">women </w:t>
+        <w:commentReference w:id="2"/>
+      </w:r>
+      <w:r>
+        <w:t xml:space="preserve">  Interestingly though, when treated separately males had a stronger obesity-stress </w:t>
+      </w:r>
+      <w:r>
+        <w:t xml:space="preserve">interaction than females potentially indicating sex or gender based differences in the way that </w:t>
+      </w:r>
+      <w:r>
+        <w:t xml:space="preserve">perceived </w:t>
+      </w:r>
+      <w:r>
+        <w:t>stress affects the pathophysiology of type 2 diabetes in humans</w:t>
+      </w:r>
+      <w:r>
+        <w:t xml:space="preserve">.  This is the opposite trend observed for job related stress and diabetes incidence in the Whitehall II study, which showed a stronger obesity-stress-diabetes relationship in females than in males </w:t>
       </w:r>
       <w:r>
         <w:fldChar w:fldCharType="begin"/>
       </w:r>
       <w:r>
-        <w:instrText xml:space="preserve"> ADDIN ZOTERO_ITEM CSL_CITATION {"citationID":"uEUVukVw","properties":{"formattedCitation":"(16)","plainCitation":"(16)","noteIndex":0},"citationItems":[{"id":11485,"uris":["http://zotero.org/users/7317906/items/2VPGKQ72"],"itemData":{"id":11485,"type":"article-journal","abstract":"Weight stigma is related to lower levels of motivation to exercise in overweight and obesity. This study explored the nature of the relationship between stigma, motivation to exercise and physical activity while accounting for gender differences. Participants were 439 adults with overweight and obesity (mean body mass index = 32.18 kg/m2, standard deviation = 4.09 kg/m2). Females reported significantly more frequent stigma experiences than males. Mediation models found a conditional direct effect of weight stigma for males, with higher frequency of stigma experiences related to higher levels of walking and vigorous physical activity. A conditional indirect effect was found for females for walking, moderate and vigorous levels of physical activity, with higher weight stigma related to lower autonomous motivation, and lower levels of physical activity. Findings suggest that males and females are affected differently by weight-stigma experiences.","container-title":"Health Psychology Open","DOI":"10.1177/2055102918759691","ISSN":"2055-1029","issue":"1","journalAbbreviation":"Health Psychol Open","note":"PMID: 29552349\nPMCID: PMC5846936","page":"2055102918759691","source":"PubMed Central","title":"Gender differences in the relationship of weight-based stigmatisation with motivation to exercise and physical activity in overweight individuals","volume":"5","author":[{"family":"Sattler","given":"Krystal M"},{"family":"Deane","given":"Frank P"},{"family":"Tapsell","given":"Linda"},{"family":"Kelly","given":"Peter J"}],"issued":{"date-parts":[["2018",3,8]]},"citation-key":"sattlerGenderDifferencesRelationship2018"}}],"schema":"https://github.com/citation-style-language/schema/raw/master/csl-citation.json"} </w:instrText>
+        <w:instrText xml:space="preserve"> ADDIN ZOTERO_ITEM CSL_CITATION {"citationID":"7NoAOV3t","properties":{"formattedCitation":"(9)","plainCitation":"(9)","noteIndex":0},"citationItems":[{"id":"fATidvy9/NEBiBgsN","uris":["http://zotero.org/users/2695081/items/3FLNIKRN"],"itemData":{"id":"wYajtxYE/VWhUmnxe","type":"article-journal","abstract":"Psychosocial work stress has been linked to higher risk of type 2 diabetes (T2DM), with the effect being consistently higher among women than men. Also, work stress has been linked to prospective weight gain among obese men but weight loss among lean men. Here, we aimed to examine the interaction between work stress and obesity in relation to T2DM risk in a gender-specific manner. We studied 5,568 white middle-aged men and women in the Whitehall II study, who were free from diabetes at analysis baseline (1993). After 1993, diabetes was ascertained at six consecutive phases by an oral glucose tolerance test supplemented by self-reports. Cox regression analysis was used to assess the association between job strain (high job demands/low job control) and 18-year incident T2DM stratifying by BMI (BMI &lt;30 kg/m(2) vs. BMI ≥30 kg/m(2)). Overall, work stress was associated with incident T2DM among women (hazard ratio (HR) 1.41: 95% confidence intervals: 1.02; 1.95) but not among men (HR 0.87: 95% confidence interval 0.69; 1.11) (P(INTERACTION) = 0.017). Among men, work stress was associated with a lower risk of T2DM in nonobese (HR 0.70: 0.53; 0.93) but not in obese individuals (P(INTERACTION) = 0.17). Among women, work stress was associated with higher risk of T2DM in the obese (HR 2.01: 1.06; 3.92) but not in the nonobese (P(INTERACTION) = 0.005). Gender and body weight status play a critical role in determining the direction of the association between psychosocial stress and T2DM. The potential effect-modifying role of gender and obesity should not be ignored by future studies looking at stress-disease associations.","container-title":"Obesity (Silver Spring, Md.)","DOI":"10.1038/oby.2011.95","ISSN":"1930-739X","issue":"2","journalAbbreviation":"Obesity (Silver Spring)","language":"eng","note":"PMID: 21593804","page":"428-433","source":"PubMed","title":"Work stress, obesity and the risk of type 2 diabetes: gender-specific bidirectional effect in the Whitehall II study","title-short":"Work stress, obesity and the risk of type 2 diabetes","volume":"20","author":[{"family":"Heraclides","given":"Alexandros M."},{"family":"Chandola","given":"Tarani"},{"family":"Witte","given":"Daniel R."},{"family":"Brunner","given":"Eric J."}],"issued":{"date-parts":[["2012",2]]}}}],"schema":"https://github.com/citation-style-language/schema/raw/master/csl-citation.json"} </w:instrText>
       </w:r>
       <w:r>
         <w:fldChar w:fldCharType="separate"/>
@@ -1722,66 +1741,20 @@
         <w:rPr>
           <w:noProof/>
         </w:rPr>
-        <w:t>(16)</w:t>
+        <w:t>(9)</w:t>
       </w:r>
       <w:r>
         <w:fldChar w:fldCharType="end"/>
       </w:r>
       <w:r>
-        <w:t>.</w:t>
-      </w:r>
-      <w:commentRangeEnd w:id="6"/>
-      <w:r>
-        <w:rPr>
-          <w:rStyle w:val="CommentReference"/>
-        </w:rPr>
-        <w:commentReference w:id="6"/>
-      </w:r>
-      <w:r>
-        <w:t xml:space="preserve">  Interestingly though, when treated separately males had a stronger obesity-stress </w:t>
-      </w:r>
-      <w:r>
-        <w:t xml:space="preserve">interaction than females potentially indicating sex or gender based differences in the way that </w:t>
-      </w:r>
-      <w:r>
-        <w:t xml:space="preserve">perceived </w:t>
-      </w:r>
-      <w:r>
-        <w:t>stress affects the pathophysiology of type 2 diabetes in humans</w:t>
-      </w:r>
-      <w:r>
-        <w:t xml:space="preserve">.  This is the opposite trend observed for job related stress and diabetes incidence in the Whitehall II study, which showed a stronger obesity-stress-diabetes relationship in females than in males </w:t>
-      </w:r>
-      <w:r>
-        <w:fldChar w:fldCharType="begin"/>
-      </w:r>
-      <w:r>
-        <w:instrText xml:space="preserve"> ADDIN ZOTERO_ITEM CSL_CITATION {"citationID":"7NoAOV3t","properties":{"formattedCitation":"(9)","plainCitation":"(9)","noteIndex":0},"citationItems":[{"id":"fATidvy9/NEBiBgsN","uris":["http://zotero.org/users/2695081/items/3FLNIKRN"],"itemData":{"id":"wYajtxYE/VWhUmnxe","type":"article-journal","abstract":"Psychosocial work stress has been linked to higher risk of type 2 diabetes (T2DM), with the effect being consistently higher among women than men. Also, work stress has been linked to prospective weight gain among obese men but weight loss among lean men. Here, we aimed to examine the interaction between work stress and obesity in relation to T2DM risk in a gender-specific manner. We studied 5,568 white middle-aged men and women in the Whitehall II study, who were free from diabetes at analysis baseline (1993). After 1993, diabetes was ascertained at six consecutive phases by an oral glucose tolerance test supplemented by self-reports. Cox regression analysis was used to assess the association between job strain (high job demands/low job control) and 18-year incident T2DM stratifying by BMI (BMI &lt;30 kg/m(2) vs. BMI ≥30 kg/m(2)). Overall, work stress was associated with incident T2DM among women (hazard ratio (HR) 1.41: 95% confidence intervals: 1.02; 1.95) but not among men (HR 0.87: 95% confidence interval 0.69; 1.11) (P(INTERACTION) = 0.017). Among men, work stress was associated with a lower risk of T2DM in nonobese (HR 0.70: 0.53; 0.93) but not in obese individuals (P(INTERACTION) = 0.17). Among women, work stress was associated with higher risk of T2DM in the obese (HR 2.01: 1.06; 3.92) but not in the nonobese (P(INTERACTION) = 0.005). Gender and body weight status play a critical role in determining the direction of the association between psychosocial stress and T2DM. The potential effect-modifying role of gender and obesity should not be ignored by future studies looking at stress-disease associations.","container-title":"Obesity (Silver Spring, Md.)","DOI":"10.1038/oby.2011.95","ISSN":"1930-739X","issue":"2","journalAbbreviation":"Obesity (Silver Spring)","language":"eng","note":"PMID: 21593804","page":"428-433","source":"PubMed","title":"Work stress, obesity and the risk of type 2 diabetes: gender-specific bidirectional effect in the Whitehall II study","title-short":"Work stress, obesity and the risk of type 2 diabetes","volume":"20","author":[{"family":"Heraclides","given":"Alexandros M."},{"family":"Chandola","given":"Tarani"},{"family":"Witte","given":"Daniel R."},{"family":"Brunner","given":"Eric J."}],"issued":{"date-parts":[["2012",2]]}}}],"schema":"https://github.com/citation-style-language/schema/raw/master/csl-citation.json"} </w:instrText>
-      </w:r>
-      <w:r>
-        <w:fldChar w:fldCharType="separate"/>
-      </w:r>
-      <w:r>
-        <w:rPr>
-          <w:noProof/>
-        </w:rPr>
-        <w:t>(9)</w:t>
-      </w:r>
-      <w:r>
-        <w:fldChar w:fldCharType="end"/>
-      </w:r>
-      <w:r>
         <w:t>.  This could be due to either different populations, or the differences between perceived stress and job-related stress and gender-specific effects.</w:t>
       </w:r>
     </w:p>
     <w:p/>
     <w:p>
       <w:r>
-        <w:t xml:space="preserve">It is intriguing that the synergistic relationship between obesity and stress is most prominent in participants with type 2 diabetes, but is not evident for hypertension, liver disease, chronic </w:t>
-      </w:r>
-      <w:r>
         <w:lastRenderedPageBreak/>
-        <w:t xml:space="preserve">pulmonary disease or </w:t>
+        <w:t xml:space="preserve">It is intriguing that the synergistic relationship between obesity and stress is most prominent in participants with type 2 diabetes, but is not evident for liver disease, chronic pulmonary disease or </w:t>
       </w:r>
       <w:r>
         <w:t xml:space="preserve">congestive </w:t>
@@ -1799,37 +1772,7 @@
         <w:t>odds</w:t>
       </w:r>
       <w:r>
-        <w:t xml:space="preserve">, but in our population these factors appeared additive rather than </w:t>
-      </w:r>
-      <w:commentRangeStart w:id="7"/>
-      <w:commentRangeStart w:id="8"/>
-      <w:commentRangeStart w:id="9"/>
-      <w:r>
-        <w:t>synergistic</w:t>
-      </w:r>
-      <w:commentRangeEnd w:id="7"/>
-      <w:r>
-        <w:rPr>
-          <w:rStyle w:val="CommentReference"/>
-        </w:rPr>
-        <w:commentReference w:id="7"/>
-      </w:r>
-      <w:commentRangeEnd w:id="8"/>
-      <w:r>
-        <w:rPr>
-          <w:rStyle w:val="CommentReference"/>
-        </w:rPr>
-        <w:commentReference w:id="8"/>
-      </w:r>
-      <w:commentRangeEnd w:id="9"/>
-      <w:r>
-        <w:rPr>
-          <w:rStyle w:val="CommentReference"/>
-        </w:rPr>
-        <w:commentReference w:id="9"/>
-      </w:r>
-      <w:r>
-        <w:t xml:space="preserve">.  </w:t>
+        <w:t xml:space="preserve">, but in our population these factors appeared additive rather than synergistic.  </w:t>
       </w:r>
       <w:r>
         <w:t xml:space="preserve">This work suggests that elevated perceived stress is associated with each of </w:t>
@@ -2073,16 +2016,16 @@
       <w:r>
         <w:t xml:space="preserve">DK107535 to </w:t>
       </w:r>
-      <w:commentRangeStart w:id="10"/>
+      <w:commentRangeStart w:id="3"/>
       <w:r>
         <w:t>DB</w:t>
       </w:r>
-      <w:commentRangeEnd w:id="10"/>
+      <w:commentRangeEnd w:id="3"/>
       <w:r>
         <w:rPr>
           <w:rStyle w:val="CommentReference"/>
         </w:rPr>
-        <w:commentReference w:id="10"/>
+        <w:commentReference w:id="3"/>
       </w:r>
       <w:r>
         <w:t>)</w:t>
@@ -2121,7 +2064,6 @@
         </w:rPr>
       </w:pPr>
       <w:r>
-        <w:lastRenderedPageBreak/>
         <w:br w:type="page"/>
       </w:r>
     </w:p>
@@ -2924,24 +2866,10 @@
         <w:t xml:space="preserve">  Beta coefficients for obesity, perceived stress and interaction terms in both crude and multivariate adjusted models.  Multivariate adjustments included age, gender, race/ethnicity, and </w:t>
       </w:r>
       <w:r>
-        <w:t>neighborhood disadvantage (</w:t>
-      </w:r>
-      <w:commentRangeStart w:id="11"/>
-      <w:r>
-        <w:t>with one being lowest disadvantage)</w:t>
-      </w:r>
-      <w:r>
-        <w:t xml:space="preserve">.  </w:t>
-      </w:r>
-      <w:commentRangeEnd w:id="11"/>
-      <w:r>
-        <w:rPr>
-          <w:rStyle w:val="CommentReference"/>
-        </w:rPr>
-        <w:commentReference w:id="11"/>
-      </w:r>
-      <w:r>
-        <w:t>Asterisks indicate p&lt;0.05 for each beta coefficient.</w:t>
+        <w:t>neighborhood disadvantage</w:t>
+      </w:r>
+      <w:r>
+        <w:t>.  Asterisks indicate p&lt;0.05 for each beta coefficient.</w:t>
       </w:r>
     </w:p>
     <w:p>
@@ -3038,79 +2966,7 @@
       </w:r>
     </w:p>
   </w:comment>
-  <w:comment w:id="2" w:author="Dave Bridges" w:date="2024-06-25T16:26:00Z" w:initials="DB">
-    <w:p>
-      <w:r>
-        <w:rPr>
-          <w:rStyle w:val="CommentReference"/>
-        </w:rPr>
-        <w:annotationRef/>
-      </w:r>
-      <w:r>
-        <w:rPr>
-          <w:color w:val="000000"/>
-          <w:sz w:val="20"/>
-          <w:szCs w:val="20"/>
-        </w:rPr>
-        <w:t>Remove Htn from T3</w:t>
-      </w:r>
-    </w:p>
-  </w:comment>
-  <w:comment w:id="3" w:author="Dave Bridges" w:date="2024-06-25T16:27:00Z" w:initials="DB">
-    <w:p>
-      <w:r>
-        <w:rPr>
-          <w:rStyle w:val="CommentReference"/>
-        </w:rPr>
-        <w:annotationRef/>
-      </w:r>
-      <w:r>
-        <w:rPr>
-          <w:color w:val="000000"/>
-          <w:sz w:val="20"/>
-          <w:szCs w:val="20"/>
-        </w:rPr>
-        <w:t>Pull MASLD codes</w:t>
-      </w:r>
-    </w:p>
-  </w:comment>
-  <w:comment w:id="4" w:author="Dave Bridges" w:date="2024-06-25T12:04:00Z" w:initials="DB">
-    <w:p>
-      <w:r>
-        <w:rPr>
-          <w:rStyle w:val="CommentReference"/>
-        </w:rPr>
-        <w:annotationRef/>
-      </w:r>
-      <w:r>
-        <w:rPr>
-          <w:color w:val="000000"/>
-          <w:sz w:val="20"/>
-          <w:szCs w:val="20"/>
-        </w:rPr>
-        <w:t>Add refs from PM</w:t>
-      </w:r>
-    </w:p>
-  </w:comment>
-  <w:comment w:id="5" w:author="Dave Bridges" w:date="2024-06-25T11:50:00Z" w:initials="DB">
-    <w:p>
-      <w:r>
-        <w:rPr>
-          <w:rStyle w:val="CommentReference"/>
-        </w:rPr>
-        <w:annotationRef/>
-      </w:r>
-      <w:r>
-        <w:rPr>
-          <w:color w:val="000000"/>
-          <w:sz w:val="20"/>
-          <w:szCs w:val="20"/>
-        </w:rPr>
-        <w:t>Reverse</w:t>
-      </w:r>
-    </w:p>
-  </w:comment>
-  <w:comment w:id="6" w:author="Dave Bridges" w:date="2024-04-12T11:52:00Z" w:initials="DB">
+  <w:comment w:id="2" w:author="Dave Bridges" w:date="2024-04-12T11:52:00Z" w:initials="DB">
     <w:p>
       <w:r>
         <w:rPr>
@@ -3450,60 +3306,7 @@
       </w:r>
     </w:p>
   </w:comment>
-  <w:comment w:id="7" w:author="Dave Bridges" w:date="2024-04-24T09:48:00Z" w:initials="DB">
-    <w:p>
-      <w:r>
-        <w:rPr>
-          <w:rStyle w:val="CommentReference"/>
-        </w:rPr>
-        <w:annotationRef/>
-      </w:r>
-      <w:r>
-        <w:rPr>
-          <w:color w:val="000000"/>
-          <w:sz w:val="20"/>
-          <w:szCs w:val="20"/>
-        </w:rPr>
-        <w:t>@irit do you want to say some more about the lack of effects of stress on hypertension here?</w:t>
-      </w:r>
-    </w:p>
-  </w:comment>
-  <w:comment w:id="8" w:author="Dave Bridges" w:date="2024-04-26T10:17:00Z" w:initials="DB">
-    <w:p>
-      <w:r>
-        <w:rPr>
-          <w:rStyle w:val="CommentReference"/>
-        </w:rPr>
-        <w:annotationRef/>
-      </w:r>
-      <w:r>
-        <w:rPr>
-          <w:color w:val="000000"/>
-          <w:sz w:val="20"/>
-          <w:szCs w:val="20"/>
-        </w:rPr>
-        <w:t xml:space="preserve">For what it’s worth there was an effect of stress in the fully adjusted model (no stress x obesity interaction).  In the crude model the relative risk for stress was 2.7 +/- 2.9% (estimate +/- SE), but when the covariates was added it went up to 16 +/- 3%.  </w:t>
-      </w:r>
-    </w:p>
-  </w:comment>
-  <w:comment w:id="9" w:author="Dave Bridges" w:date="2024-04-26T10:20:00Z" w:initials="DB">
-    <w:p>
-      <w:r>
-        <w:rPr>
-          <w:rStyle w:val="CommentReference"/>
-        </w:rPr>
-        <w:annotationRef/>
-      </w:r>
-      <w:r>
-        <w:rPr>
-          <w:sz w:val="20"/>
-          <w:szCs w:val="20"/>
-        </w:rPr>
-        <w:t>It looks like the major confounder that made stress significant for hypertension was age</w:t>
-      </w:r>
-    </w:p>
-  </w:comment>
-  <w:comment w:id="10" w:author="Dave Bridges" w:date="2024-04-12T11:07:00Z" w:initials="DB">
+  <w:comment w:id="3" w:author="Dave Bridges" w:date="2024-04-12T11:07:00Z" w:initials="DB">
     <w:p>
       <w:pPr>
         <w:pStyle w:val="CommentText"/>
@@ -3523,24 +3326,6 @@
       <w:r>
         <w:br/>
         <w:t>Do you have any other funding or conflicts of interest that you want to include or disclose.</w:t>
-      </w:r>
-    </w:p>
-  </w:comment>
-  <w:comment w:id="11" w:author="Dave Bridges" w:date="2024-06-25T12:19:00Z" w:initials="DB">
-    <w:p>
-      <w:r>
-        <w:rPr>
-          <w:rStyle w:val="CommentReference"/>
-        </w:rPr>
-        <w:annotationRef/>
-      </w:r>
-      <w:r>
-        <w:rPr>
-          <w:color w:val="000000"/>
-          <w:sz w:val="20"/>
-          <w:szCs w:val="20"/>
-        </w:rPr>
-        <w:t>@Kate make this sound better</w:t>
       </w:r>
     </w:p>
   </w:comment>
@@ -3551,30 +3336,14 @@
 <w15:commentsEx xmlns:wpc="http://schemas.microsoft.com/office/word/2010/wordprocessingCanvas" xmlns:cx="http://schemas.microsoft.com/office/drawing/2014/chartex" xmlns:cx1="http://schemas.microsoft.com/office/drawing/2015/9/8/chartex" xmlns:cx2="http://schemas.microsoft.com/office/drawing/2015/10/21/chartex" xmlns:cx3="http://schemas.microsoft.com/office/drawing/2016/5/9/chartex" xmlns:cx4="http://schemas.microsoft.com/office/drawing/2016/5/10/chartex" xmlns:cx5="http://schemas.microsoft.com/office/drawing/2016/5/11/chartex" xmlns:cx6="http://schemas.microsoft.com/office/drawing/2016/5/12/chartex" xmlns:cx7="http://schemas.microsoft.com/office/drawing/2016/5/13/chartex" xmlns:cx8="http://schemas.microsoft.com/office/drawing/2016/5/14/chartex" xmlns:mc="http://schemas.openxmlformats.org/markup-compatibility/2006" xmlns:aink="http://schemas.microsoft.com/office/drawing/2016/ink" xmlns:am3d="http://schemas.microsoft.com/office/drawing/2017/model3d" xmlns:o="urn:schemas-microsoft-com:office:office" xmlns:oel="http://schemas.microsoft.com/office/2019/extlst" xmlns:r="http://schemas.openxmlformats.org/officeDocument/2006/relationships" xmlns:m="http://schemas.openxmlformats.org/officeDocument/2006/math" xmlns:v="urn:schemas-microsoft-com:vml" xmlns:wp14="http://schemas.microsoft.com/office/word/2010/wordprocessingDrawing" xmlns:wp="http://schemas.openxmlformats.org/drawingml/2006/wordprocessingDrawing" xmlns:w10="urn:schemas-microsoft-com:office:word" xmlns:w="http://schemas.openxmlformats.org/wordprocessingml/2006/main" xmlns:w14="http://schemas.microsoft.com/office/word/2010/wordml" xmlns:w15="http://schemas.microsoft.com/office/word/2012/wordml" xmlns:w16cex="http://schemas.microsoft.com/office/word/2018/wordml/cex" xmlns:w16cid="http://schemas.microsoft.com/office/word/2016/wordml/cid" xmlns:w16="http://schemas.microsoft.com/office/word/2018/wordml" xmlns:w16sdtdh="http://schemas.microsoft.com/office/word/2020/wordml/sdtdatahash" xmlns:w16se="http://schemas.microsoft.com/office/word/2015/wordml/symex" xmlns:wpg="http://schemas.microsoft.com/office/word/2010/wordprocessingGroup" xmlns:wpi="http://schemas.microsoft.com/office/word/2010/wordprocessingInk" xmlns:wne="http://schemas.microsoft.com/office/word/2006/wordml" xmlns:wps="http://schemas.microsoft.com/office/word/2010/wordprocessingShape" mc:Ignorable="w14 w15 w16se w16cid w16 w16cex w16sdtdh wp14">
   <w15:commentEx w15:paraId="10DFA24D" w15:done="0"/>
   <w15:commentEx w15:paraId="0C81528E" w15:done="0"/>
-  <w15:commentEx w15:paraId="22E8FD1D" w15:done="0"/>
-  <w15:commentEx w15:paraId="4BE3F8F8" w15:done="0"/>
-  <w15:commentEx w15:paraId="31F55D03" w15:done="0"/>
-  <w15:commentEx w15:paraId="3030B64F" w15:done="0"/>
   <w15:commentEx w15:paraId="6B0600C2" w15:done="0"/>
-  <w15:commentEx w15:paraId="5C843C51" w15:done="0"/>
-  <w15:commentEx w15:paraId="40BDD707" w15:paraIdParent="5C843C51" w15:done="0"/>
-  <w15:commentEx w15:paraId="157B073D" w15:paraIdParent="5C843C51" w15:done="0"/>
   <w15:commentEx w15:paraId="4DAD4B88" w15:done="0"/>
-  <w15:commentEx w15:paraId="43259844" w15:done="0"/>
 </w15:commentsEx>
 </file>
 
 <file path=word/commentsExtensible.xml><?xml version="1.0" encoding="utf-8"?>
 <w16cex:commentsExtensible xmlns:wpc="http://schemas.microsoft.com/office/word/2010/wordprocessingCanvas" xmlns:cx="http://schemas.microsoft.com/office/drawing/2014/chartex" xmlns:cx1="http://schemas.microsoft.com/office/drawing/2015/9/8/chartex" xmlns:cx2="http://schemas.microsoft.com/office/drawing/2015/10/21/chartex" xmlns:cx3="http://schemas.microsoft.com/office/drawing/2016/5/9/chartex" xmlns:cx4="http://schemas.microsoft.com/office/drawing/2016/5/10/chartex" xmlns:cx5="http://schemas.microsoft.com/office/drawing/2016/5/11/chartex" xmlns:cx6="http://schemas.microsoft.com/office/drawing/2016/5/12/chartex" xmlns:cx7="http://schemas.microsoft.com/office/drawing/2016/5/13/chartex" xmlns:cx8="http://schemas.microsoft.com/office/drawing/2016/5/14/chartex" xmlns:cr="http://schemas.microsoft.com/office/comments/2020/reactions" xmlns:mc="http://schemas.openxmlformats.org/markup-compatibility/2006" xmlns:aink="http://schemas.microsoft.com/office/drawing/2016/ink" xmlns:am3d="http://schemas.microsoft.com/office/drawing/2017/model3d" xmlns:o="urn:schemas-microsoft-com:office:office" xmlns:oel="http://schemas.microsoft.com/office/2019/extlst" xmlns:r="http://schemas.openxmlformats.org/officeDocument/2006/relationships" xmlns:m="http://schemas.openxmlformats.org/officeDocument/2006/math" xmlns:v="urn:schemas-microsoft-com:vml" xmlns:wp14="http://schemas.microsoft.com/office/word/2010/wordprocessingDrawing" xmlns:wp="http://schemas.openxmlformats.org/drawingml/2006/wordprocessingDrawing" xmlns:w10="urn:schemas-microsoft-com:office:word" xmlns:w="http://schemas.openxmlformats.org/wordprocessingml/2006/main" xmlns:w14="http://schemas.microsoft.com/office/word/2010/wordml" xmlns:w15="http://schemas.microsoft.com/office/word/2012/wordml" xmlns:w16cex="http://schemas.microsoft.com/office/word/2018/wordml/cex" xmlns:w16cid="http://schemas.microsoft.com/office/word/2016/wordml/cid" xmlns:w16="http://schemas.microsoft.com/office/word/2018/wordml" xmlns:w16sdtdh="http://schemas.microsoft.com/office/word/2020/wordml/sdtdatahash" xmlns:w16se="http://schemas.microsoft.com/office/word/2015/wordml/symex" xmlns:wpg="http://schemas.microsoft.com/office/word/2010/wordprocessingGroup" xmlns:wpi="http://schemas.microsoft.com/office/word/2010/wordprocessingInk" xmlns:wne="http://schemas.microsoft.com/office/word/2006/wordml" xmlns:wps="http://schemas.microsoft.com/office/word/2010/wordprocessingShape" mc:Ignorable="w14 w15 w16se w16cid w16 w16cex w16sdtdh cr wp14">
   <w16cex:commentExtensible w16cex:durableId="110DF523" w16cex:dateUtc="2024-04-26T14:23:00Z"/>
-  <w16cex:commentExtensible w16cex:durableId="0FC52800" w16cex:dateUtc="2024-06-25T20:26:00Z"/>
-  <w16cex:commentExtensible w16cex:durableId="6D4E274A" w16cex:dateUtc="2024-06-25T20:27:00Z"/>
-  <w16cex:commentExtensible w16cex:durableId="36BE09A4" w16cex:dateUtc="2024-06-25T16:04:00Z"/>
-  <w16cex:commentExtensible w16cex:durableId="5AFB66B0" w16cex:dateUtc="2024-06-25T15:50:00Z"/>
-  <w16cex:commentExtensible w16cex:durableId="2BE31721" w16cex:dateUtc="2024-04-24T13:48:00Z"/>
-  <w16cex:commentExtensible w16cex:durableId="6BE55EE1" w16cex:dateUtc="2024-04-26T14:17:00Z"/>
-  <w16cex:commentExtensible w16cex:durableId="383DF9F7" w16cex:dateUtc="2024-04-26T14:20:00Z"/>
-  <w16cex:commentExtensible w16cex:durableId="763F340D" w16cex:dateUtc="2024-06-25T16:19:00Z"/>
 </w16cex:commentsExtensible>
 </file>
 
@@ -3582,16 +3351,8 @@
 <w16cid:commentsIds xmlns:wpc="http://schemas.microsoft.com/office/word/2010/wordprocessingCanvas" xmlns:cx="http://schemas.microsoft.com/office/drawing/2014/chartex" xmlns:cx1="http://schemas.microsoft.com/office/drawing/2015/9/8/chartex" xmlns:cx2="http://schemas.microsoft.com/office/drawing/2015/10/21/chartex" xmlns:cx3="http://schemas.microsoft.com/office/drawing/2016/5/9/chartex" xmlns:cx4="http://schemas.microsoft.com/office/drawing/2016/5/10/chartex" xmlns:cx5="http://schemas.microsoft.com/office/drawing/2016/5/11/chartex" xmlns:cx6="http://schemas.microsoft.com/office/drawing/2016/5/12/chartex" xmlns:cx7="http://schemas.microsoft.com/office/drawing/2016/5/13/chartex" xmlns:cx8="http://schemas.microsoft.com/office/drawing/2016/5/14/chartex" xmlns:mc="http://schemas.openxmlformats.org/markup-compatibility/2006" xmlns:aink="http://schemas.microsoft.com/office/drawing/2016/ink" xmlns:am3d="http://schemas.microsoft.com/office/drawing/2017/model3d" xmlns:o="urn:schemas-microsoft-com:office:office" xmlns:oel="http://schemas.microsoft.com/office/2019/extlst" xmlns:r="http://schemas.openxmlformats.org/officeDocument/2006/relationships" xmlns:m="http://schemas.openxmlformats.org/officeDocument/2006/math" xmlns:v="urn:schemas-microsoft-com:vml" xmlns:wp14="http://schemas.microsoft.com/office/word/2010/wordprocessingDrawing" xmlns:wp="http://schemas.openxmlformats.org/drawingml/2006/wordprocessingDrawing" xmlns:w10="urn:schemas-microsoft-com:office:word" xmlns:w="http://schemas.openxmlformats.org/wordprocessingml/2006/main" xmlns:w14="http://schemas.microsoft.com/office/word/2010/wordml" xmlns:w15="http://schemas.microsoft.com/office/word/2012/wordml" xmlns:w16cex="http://schemas.microsoft.com/office/word/2018/wordml/cex" xmlns:w16cid="http://schemas.microsoft.com/office/word/2016/wordml/cid" xmlns:w16="http://schemas.microsoft.com/office/word/2018/wordml" xmlns:w16sdtdh="http://schemas.microsoft.com/office/word/2020/wordml/sdtdatahash" xmlns:w16se="http://schemas.microsoft.com/office/word/2015/wordml/symex" xmlns:wpg="http://schemas.microsoft.com/office/word/2010/wordprocessingGroup" xmlns:wpi="http://schemas.microsoft.com/office/word/2010/wordprocessingInk" xmlns:wne="http://schemas.microsoft.com/office/word/2006/wordml" xmlns:wps="http://schemas.microsoft.com/office/word/2010/wordprocessingShape" mc:Ignorable="w14 w15 w16se w16cid w16 w16cex w16sdtdh wp14">
   <w16cid:commentId w16cid:paraId="10DFA24D" w16cid:durableId="29411550"/>
   <w16cid:commentId w16cid:paraId="0C81528E" w16cid:durableId="110DF523"/>
-  <w16cid:commentId w16cid:paraId="22E8FD1D" w16cid:durableId="0FC52800"/>
-  <w16cid:commentId w16cid:paraId="4BE3F8F8" w16cid:durableId="6D4E274A"/>
-  <w16cid:commentId w16cid:paraId="31F55D03" w16cid:durableId="36BE09A4"/>
-  <w16cid:commentId w16cid:paraId="3030B64F" w16cid:durableId="5AFB66B0"/>
   <w16cid:commentId w16cid:paraId="6B0600C2" w16cid:durableId="29C39F1A"/>
-  <w16cid:commentId w16cid:paraId="5C843C51" w16cid:durableId="2BE31721"/>
-  <w16cid:commentId w16cid:paraId="40BDD707" w16cid:durableId="6BE55EE1"/>
-  <w16cid:commentId w16cid:paraId="157B073D" w16cid:durableId="383DF9F7"/>
   <w16cid:commentId w16cid:paraId="4DAD4B88" w16cid:durableId="29C39457"/>
-  <w16cid:commentId w16cid:paraId="43259844" w16cid:durableId="763F340D"/>
 </w16cid:commentsIds>
 </file>
 

</xml_diff>

<commit_message>
Several more revisions about the results
</commit_message>
<xml_diff>
--- a/manuscript/Obesity-Stress/Manuscript.docx
+++ b/manuscript/Obesity-Stress/Manuscript.docx
@@ -1402,12 +1402,7 @@
       </w:pPr>
       <w:ins w:id="122" w:author="Dave Bridges" w:date="2024-08-28T17:24:00Z">
         <w:r>
-          <w:t>We took a cross-sectional approach to evaluate participants likelihood o</w:t>
-        </w:r>
-        <w:bookmarkStart w:id="123" w:name="_GoBack"/>
-        <w:bookmarkEnd w:id="123"/>
-        <w:r>
-          <w:t xml:space="preserve">f a diagnosis of Type 2 Diabetes.  </w:t>
+          <w:t xml:space="preserve">We took a cross-sectional approach to evaluate participants likelihood of a diagnosis of Type 2 Diabetes.  </w:t>
         </w:r>
       </w:ins>
       <w:r>
@@ -1437,7 +1432,7 @@
       <w:r>
         <w:t xml:space="preserve">.  </w:t>
       </w:r>
-      <w:commentRangeStart w:id="124"/>
+      <w:commentRangeStart w:id="123"/>
       <w:r>
         <w:t xml:space="preserve">These </w:t>
       </w:r>
@@ -1447,17 +1442,17 @@
       <w:r>
         <w:t xml:space="preserve"> are in a hospital setting, </w:t>
       </w:r>
-      <w:commentRangeEnd w:id="124"/>
-      <w:r>
-        <w:rPr>
-          <w:rStyle w:val="CommentReference"/>
-        </w:rPr>
-        <w:commentReference w:id="124"/>
+      <w:commentRangeEnd w:id="123"/>
+      <w:r>
+        <w:rPr>
+          <w:rStyle w:val="CommentReference"/>
+        </w:rPr>
+        <w:commentReference w:id="123"/>
       </w:r>
       <w:r>
         <w:t>over 18</w:t>
       </w:r>
-      <w:ins w:id="125" w:author="Bauer, Kate" w:date="2024-08-28T09:52:00Z">
+      <w:ins w:id="124" w:author="Bauer, Kate" w:date="2024-08-28T09:52:00Z">
         <w:r>
           <w:t>,</w:t>
         </w:r>
@@ -1465,22 +1460,22 @@
       <w:r>
         <w:t xml:space="preserve"> and were asked to opt-in to </w:t>
       </w:r>
-      <w:commentRangeStart w:id="126"/>
+      <w:commentRangeStart w:id="125"/>
       <w:r>
         <w:t xml:space="preserve">this cohort </w:t>
       </w:r>
-      <w:commentRangeEnd w:id="126"/>
-      <w:r>
-        <w:rPr>
-          <w:rStyle w:val="CommentReference"/>
-        </w:rPr>
-        <w:commentReference w:id="126"/>
+      <w:commentRangeEnd w:id="125"/>
+      <w:r>
+        <w:rPr>
+          <w:rStyle w:val="CommentReference"/>
+        </w:rPr>
+        <w:commentReference w:id="125"/>
       </w:r>
       <w:r>
         <w:t xml:space="preserve">between 2012 and 2022.  </w:t>
       </w:r>
-      <w:moveFromRangeStart w:id="127" w:author="Bauer, Kate" w:date="2024-08-28T09:54:00Z" w:name="move175731268"/>
-      <w:moveFrom w:id="128" w:author="Bauer, Kate" w:date="2024-08-28T09:54:00Z">
+      <w:moveFromRangeStart w:id="126" w:author="Bauer, Kate" w:date="2024-08-28T09:54:00Z" w:name="move175731268"/>
+      <w:moveFrom w:id="127" w:author="Bauer, Kate" w:date="2024-08-28T09:54:00Z">
         <w:r>
           <w:t xml:space="preserve">This study was a secondary analysis of these data (University of Michigan Internal Review Board </w:t>
         </w:r>
@@ -1491,7 +1486,7 @@
           <w:t xml:space="preserve">).  </w:t>
         </w:r>
       </w:moveFrom>
-      <w:moveFromRangeEnd w:id="127"/>
+      <w:moveFromRangeEnd w:id="126"/>
       <w:r>
         <w:t xml:space="preserve">At enrollment, </w:t>
       </w:r>
@@ -1501,12 +1496,12 @@
       <w:r>
         <w:t xml:space="preserve"> </w:t>
       </w:r>
-      <w:del w:id="129" w:author="Bauer, Kate" w:date="2024-08-28T09:54:00Z">
+      <w:del w:id="128" w:author="Bauer, Kate" w:date="2024-08-28T09:54:00Z">
         <w:r>
           <w:delText>were asked a</w:delText>
         </w:r>
       </w:del>
-      <w:ins w:id="130" w:author="Bauer, Kate" w:date="2024-08-28T09:54:00Z">
+      <w:ins w:id="129" w:author="Bauer, Kate" w:date="2024-08-28T09:54:00Z">
         <w:r>
           <w:t>completed a</w:t>
         </w:r>
@@ -1514,12 +1509,12 @@
       <w:r>
         <w:t xml:space="preserve"> series of questionnaires including </w:t>
       </w:r>
-      <w:ins w:id="131" w:author="Bauer, Kate" w:date="2024-08-28T09:53:00Z">
+      <w:ins w:id="130" w:author="Bauer, Kate" w:date="2024-08-28T09:53:00Z">
         <w:r>
           <w:t>the</w:t>
         </w:r>
       </w:ins>
-      <w:del w:id="132" w:author="Bauer, Kate" w:date="2024-08-28T09:53:00Z">
+      <w:del w:id="131" w:author="Bauer, Kate" w:date="2024-08-28T09:53:00Z">
         <w:r>
           <w:delText>a</w:delText>
         </w:r>
@@ -1548,7 +1543,7 @@
       <w:r>
         <w:t>)</w:t>
       </w:r>
-      <w:ins w:id="133" w:author="Bauer, Kate" w:date="2024-08-28T09:53:00Z">
+      <w:ins w:id="132" w:author="Bauer, Kate" w:date="2024-08-28T09:53:00Z">
         <w:r>
           <w:t>,</w:t>
         </w:r>
@@ -1556,7 +1551,7 @@
       <w:r>
         <w:t xml:space="preserve"> </w:t>
       </w:r>
-      <w:commentRangeStart w:id="134"/>
+      <w:commentRangeStart w:id="133"/>
       <w:r>
         <w:t xml:space="preserve">and </w:t>
       </w:r>
@@ -1570,18 +1565,18 @@
         <w:lastRenderedPageBreak/>
         <w:t xml:space="preserve">their electronic medical record. </w:t>
       </w:r>
-      <w:commentRangeEnd w:id="134"/>
-      <w:r>
-        <w:rPr>
-          <w:rStyle w:val="CommentReference"/>
-        </w:rPr>
-        <w:commentReference w:id="134"/>
+      <w:commentRangeEnd w:id="133"/>
+      <w:r>
+        <w:rPr>
+          <w:rStyle w:val="CommentReference"/>
+        </w:rPr>
+        <w:commentReference w:id="133"/>
       </w:r>
       <w:r>
         <w:t xml:space="preserve"> </w:t>
       </w:r>
-      <w:moveToRangeStart w:id="135" w:author="Bauer, Kate" w:date="2024-08-28T09:54:00Z" w:name="move175731268"/>
-      <w:moveTo w:id="136" w:author="Bauer, Kate" w:date="2024-08-28T09:54:00Z">
+      <w:moveToRangeStart w:id="134" w:author="Bauer, Kate" w:date="2024-08-28T09:54:00Z" w:name="move175731268"/>
+      <w:moveTo w:id="135" w:author="Bauer, Kate" w:date="2024-08-28T09:54:00Z">
         <w:r>
           <w:t xml:space="preserve">This study was a secondary analysis of these data (University of Michigan Internal Review Board </w:t>
         </w:r>
@@ -1592,27 +1587,41 @@
           <w:t xml:space="preserve">).  </w:t>
         </w:r>
       </w:moveTo>
-      <w:moveToRangeEnd w:id="135"/>
+      <w:moveToRangeEnd w:id="134"/>
       <w:r>
         <w:t xml:space="preserve">We excluded participants </w:t>
       </w:r>
+      <w:commentRangeStart w:id="136"/>
+      <w:r>
+        <w:t xml:space="preserve">without BMI </w:t>
+      </w:r>
       <w:commentRangeStart w:id="137"/>
       <w:r>
-        <w:t xml:space="preserve">without BMI </w:t>
+        <w:t>(</w:t>
+      </w:r>
+      <w:commentRangeEnd w:id="136"/>
+      <w:r>
+        <w:rPr>
+          <w:rStyle w:val="CommentReference"/>
+        </w:rPr>
+        <w:commentReference w:id="136"/>
+      </w:r>
+      <w:r>
+        <w:t xml:space="preserve">29 586 participants) </w:t>
+      </w:r>
+      <w:commentRangeEnd w:id="137"/>
+      <w:r>
+        <w:rPr>
+          <w:rStyle w:val="CommentReference"/>
+        </w:rPr>
+        <w:commentReference w:id="137"/>
+      </w:r>
+      <w:r>
+        <w:t xml:space="preserve">or PSS data (25 187) </w:t>
       </w:r>
       <w:commentRangeStart w:id="138"/>
       <w:r>
-        <w:t>(</w:t>
-      </w:r>
-      <w:commentRangeEnd w:id="137"/>
-      <w:r>
-        <w:rPr>
-          <w:rStyle w:val="CommentReference"/>
-        </w:rPr>
-        <w:commentReference w:id="137"/>
-      </w:r>
-      <w:r>
-        <w:t xml:space="preserve">29 586 participants) </w:t>
+        <w:t>or implausible BMI values (&gt;300; 1 participant</w:t>
       </w:r>
       <w:commentRangeEnd w:id="138"/>
       <w:r>
@@ -1621,21 +1630,7 @@
         </w:rPr>
         <w:commentReference w:id="138"/>
       </w:r>
-      <w:r>
-        <w:t xml:space="preserve">or PSS data (25 187) </w:t>
-      </w:r>
-      <w:commentRangeStart w:id="139"/>
-      <w:r>
-        <w:t>or implausible BMI values (&gt;300; 1 participant</w:t>
-      </w:r>
-      <w:commentRangeEnd w:id="139"/>
-      <w:r>
-        <w:rPr>
-          <w:rStyle w:val="CommentReference"/>
-        </w:rPr>
-        <w:commentReference w:id="139"/>
-      </w:r>
-      <w:ins w:id="140" w:author="Bauer, Kate" w:date="2024-08-28T09:56:00Z">
+      <w:ins w:id="139" w:author="Bauer, Kate" w:date="2024-08-28T09:56:00Z">
         <w:r>
           <w:t>)</w:t>
         </w:r>
@@ -1643,58 +1638,58 @@
       <w:r>
         <w:t xml:space="preserve">.  This resulted in a population </w:t>
       </w:r>
-      <w:commentRangeStart w:id="141"/>
+      <w:commentRangeStart w:id="140"/>
       <w:r>
         <w:t xml:space="preserve">of </w:t>
       </w:r>
       <w:r>
         <w:t>39</w:t>
       </w:r>
-      <w:ins w:id="142" w:author="Bauer, Kate" w:date="2024-08-28T09:57:00Z">
+      <w:ins w:id="141" w:author="Bauer, Kate" w:date="2024-08-28T09:57:00Z">
         <w:r>
           <w:t>,</w:t>
         </w:r>
       </w:ins>
-      <w:commentRangeStart w:id="143"/>
+      <w:commentRangeStart w:id="142"/>
       <w:r>
         <w:t>560</w:t>
       </w:r>
       <w:r>
         <w:t xml:space="preserve"> participants </w:t>
       </w:r>
-      <w:commentRangeEnd w:id="141"/>
-      <w:r>
-        <w:rPr>
-          <w:rStyle w:val="CommentReference"/>
-        </w:rPr>
-        <w:commentReference w:id="141"/>
+      <w:commentRangeEnd w:id="140"/>
+      <w:r>
+        <w:rPr>
+          <w:rStyle w:val="CommentReference"/>
+        </w:rPr>
+        <w:commentReference w:id="140"/>
       </w:r>
       <w:r>
         <w:t xml:space="preserve">see Figure 1).  </w:t>
       </w:r>
-      <w:commentRangeEnd w:id="143"/>
-      <w:r>
-        <w:rPr>
-          <w:rStyle w:val="CommentReference"/>
-        </w:rPr>
-        <w:commentReference w:id="143"/>
-      </w:r>
-    </w:p>
-    <w:p>
-      <w:pPr>
-        <w:rPr>
-          <w:ins w:id="144" w:author="Dave Bridges" w:date="2024-08-28T17:26:00Z"/>
+      <w:commentRangeEnd w:id="142"/>
+      <w:r>
+        <w:rPr>
+          <w:rStyle w:val="CommentReference"/>
+        </w:rPr>
+        <w:commentReference w:id="142"/>
+      </w:r>
+    </w:p>
+    <w:p>
+      <w:pPr>
+        <w:rPr>
+          <w:ins w:id="143" w:author="Dave Bridges" w:date="2024-08-28T17:26:00Z"/>
         </w:rPr>
       </w:pPr>
     </w:p>
     <w:p>
       <w:pPr>
         <w:pStyle w:val="Heading3"/>
-        <w:pPrChange w:id="145" w:author="Dave Bridges" w:date="2024-08-28T17:31:00Z">
+        <w:pPrChange w:id="144" w:author="Dave Bridges" w:date="2024-08-28T17:31:00Z">
           <w:pPr/>
         </w:pPrChange>
       </w:pPr>
-      <w:ins w:id="146" w:author="Dave Bridges" w:date="2024-08-28T17:26:00Z">
+      <w:ins w:id="145" w:author="Dave Bridges" w:date="2024-08-28T17:26:00Z">
         <w:r>
           <w:t>Measures</w:t>
         </w:r>
@@ -1702,34 +1697,54 @@
     </w:p>
     <w:p/>
     <w:p>
+      <w:commentRangeStart w:id="146"/>
       <w:commentRangeStart w:id="147"/>
       <w:commentRangeStart w:id="148"/>
+      <w:r>
+        <w:t xml:space="preserve">BMI was </w:t>
+      </w:r>
+      <w:commentRangeEnd w:id="146"/>
+      <w:r>
+        <w:rPr>
+          <w:rStyle w:val="CommentReference"/>
+        </w:rPr>
+        <w:commentReference w:id="146"/>
+      </w:r>
+      <w:r>
+        <w:t>defined for each participant</w:t>
+      </w:r>
+      <w:r>
+        <w:t xml:space="preserve"> by taking the median value if multiple measurements were available</w:t>
+      </w:r>
+      <w:commentRangeEnd w:id="147"/>
+      <w:r>
+        <w:rPr>
+          <w:rStyle w:val="CommentReference"/>
+        </w:rPr>
+        <w:commentReference w:id="147"/>
+      </w:r>
+      <w:r>
+        <w:t xml:space="preserve">. </w:t>
+      </w:r>
+      <w:commentRangeEnd w:id="148"/>
+      <w:r>
+        <w:rPr>
+          <w:rStyle w:val="CommentReference"/>
+        </w:rPr>
+        <w:commentReference w:id="148"/>
+      </w:r>
       <w:commentRangeStart w:id="149"/>
       <w:r>
-        <w:t xml:space="preserve">BMI was </w:t>
-      </w:r>
-      <w:commentRangeEnd w:id="147"/>
-      <w:r>
-        <w:rPr>
-          <w:rStyle w:val="CommentReference"/>
-        </w:rPr>
-        <w:commentReference w:id="147"/>
-      </w:r>
-      <w:r>
-        <w:t>defined for each participant</w:t>
-      </w:r>
-      <w:r>
-        <w:t xml:space="preserve"> by taking the median value if multiple measurements were available</w:t>
-      </w:r>
-      <w:commentRangeEnd w:id="148"/>
-      <w:r>
-        <w:rPr>
-          <w:rStyle w:val="CommentReference"/>
-        </w:rPr>
-        <w:commentReference w:id="148"/>
-      </w:r>
-      <w:r>
-        <w:t xml:space="preserve">. </w:t>
+        <w:t>Prior to sensitivity analyses we dichotomized participants as BMI greater or less than 30 kg/m</w:t>
+      </w:r>
+      <w:r>
+        <w:rPr>
+          <w:vertAlign w:val="superscript"/>
+        </w:rPr>
+        <w:t>2</w:t>
+      </w:r>
+      <w:r>
+        <w:t>.</w:t>
       </w:r>
       <w:commentRangeEnd w:id="149"/>
       <w:r>
@@ -1738,9 +1753,677 @@
         </w:rPr>
         <w:commentReference w:id="149"/>
       </w:r>
+      <w:r>
+        <w:t xml:space="preserve">  </w:t>
+      </w:r>
+      <w:r>
+        <w:t xml:space="preserve">To </w:t>
+      </w:r>
+      <w:r>
+        <w:t>estimate the</w:t>
+      </w:r>
+      <w:r>
+        <w:t xml:space="preserve"> </w:t>
+      </w:r>
+      <w:r>
+        <w:t>perceived</w:t>
+      </w:r>
+      <w:r>
+        <w:t xml:space="preserve"> stress </w:t>
+      </w:r>
+      <w:r>
+        <w:t xml:space="preserve">of the participants, </w:t>
+      </w:r>
       <w:commentRangeStart w:id="150"/>
       <w:r>
-        <w:t>Prior to sensitivity analyses we dichotomized participants as BMI greater or less than 30 kg/m</w:t>
+        <w:t xml:space="preserve">we used the </w:t>
+      </w:r>
+      <w:r>
+        <w:t>aggregate</w:t>
+      </w:r>
+      <w:r>
+        <w:t xml:space="preserve"> sum of the PSS4 score and stratified as above or below the median score (</w:t>
+      </w:r>
+      <w:r>
+        <w:t>5 out of 16</w:t>
+      </w:r>
+      <w:r>
+        <w:t>).</w:t>
+      </w:r>
+      <w:r>
+        <w:t xml:space="preserve">  </w:t>
+      </w:r>
+      <w:commentRangeEnd w:id="150"/>
+      <w:r>
+        <w:rPr>
+          <w:rStyle w:val="CommentReference"/>
+        </w:rPr>
+        <w:commentReference w:id="150"/>
+      </w:r>
+      <w:commentRangeStart w:id="151"/>
+      <w:r>
+        <w:t xml:space="preserve">Socioeconomic status of participants </w:t>
+      </w:r>
+      <w:commentRangeEnd w:id="151"/>
+      <w:r>
+        <w:rPr>
+          <w:rStyle w:val="CommentReference"/>
+        </w:rPr>
+        <w:commentReference w:id="151"/>
+      </w:r>
+      <w:r>
+        <w:t xml:space="preserve">was approximated by constructing a neighborhood </w:t>
+      </w:r>
+      <w:r>
+        <w:t>disadvantage</w:t>
+      </w:r>
+      <w:r>
+        <w:t xml:space="preserve"> score based on their census block connected to the </w:t>
+      </w:r>
+      <w:commentRangeStart w:id="152"/>
+      <w:commentRangeStart w:id="153"/>
+      <w:r>
+        <w:t>National Neighborhood Data Archive (</w:t>
+      </w:r>
+      <w:proofErr w:type="spellStart"/>
+      <w:r>
+        <w:t>NaNDA</w:t>
+      </w:r>
+      <w:proofErr w:type="spellEnd"/>
+      <w:r>
+        <w:t xml:space="preserve">; </w:t>
+      </w:r>
+      <w:r>
+        <w:fldChar w:fldCharType="begin"/>
+      </w:r>
+      <w:r>
+        <w:instrText xml:space="preserve"> ADDIN ZOTERO_ITEM CSL_CITATION {"citationID":"mt5HuRYp","properties":{"formattedCitation":"(13)","plainCitation":"(13)","noteIndex":0},"citationItems":[{"id":11572,"uris":["http://zotero.org/users/7317906/items/QI3T6XGC"],"itemData":{"id":11572,"type":"dataset","DOI":"10.3886/ICPSR38528.v3","publisher":"Inter-university Consortium for Political and Social Research [distributor]","title":"National Neighborhood Data Archive (NaNDA): Socioeconomic Status and Demographic Characteristics of Census Tracts and ZIP Code Tabulation Areas, United States, 2000-2020","author":[{"family":"Clarke","given":"Philippa"},{"family":"Noppert","given":"Grace"},{"family":"Melendez","given":"Robert"},{"family":"Chenoweth","given":"Megan"},{"family":"Gypin","given":"Lindsay"}],"issued":{"date-parts":[["2023"]]},"citation-key":"clarkeNationalNeighborhoodData2023"}}],"schema":"https://github.com/citation-style-language/schema/raw/master/csl-citation.json"} </w:instrText>
+      </w:r>
+      <w:r>
+        <w:fldChar w:fldCharType="separate"/>
+      </w:r>
+      <w:r>
+        <w:rPr>
+          <w:noProof/>
+        </w:rPr>
+        <w:t>(13)</w:t>
+      </w:r>
+      <w:r>
+        <w:fldChar w:fldCharType="end"/>
+      </w:r>
+      <w:r>
+        <w:t>)</w:t>
+      </w:r>
+      <w:r>
+        <w:t xml:space="preserve">.  This was in turn </w:t>
+      </w:r>
+      <w:r>
+        <w:t>linked</w:t>
+      </w:r>
+      <w:r>
+        <w:t xml:space="preserve"> to data from the American Community Survey (2013-2017).  </w:t>
+      </w:r>
+      <w:commentRangeEnd w:id="152"/>
+      <w:r>
+        <w:rPr>
+          <w:rStyle w:val="CommentReference"/>
+        </w:rPr>
+        <w:commentReference w:id="152"/>
+      </w:r>
+      <w:commentRangeEnd w:id="153"/>
+      <w:r>
+        <w:rPr>
+          <w:rStyle w:val="CommentReference"/>
+        </w:rPr>
+        <w:commentReference w:id="153"/>
+      </w:r>
+      <w:r>
+        <w:t>Participant</w:t>
+      </w:r>
+      <w:ins w:id="154" w:author="Bauer, Kate" w:date="2024-08-28T10:52:00Z">
+        <w:r>
+          <w:t>s</w:t>
+        </w:r>
+      </w:ins>
+      <w:r>
+        <w:t xml:space="preserve"> were assigned a quartile score based on the </w:t>
+      </w:r>
+      <w:ins w:id="155" w:author="Bauer, Kate" w:date="2024-08-28T10:52:00Z">
+        <w:r>
+          <w:t xml:space="preserve">1) </w:t>
+        </w:r>
+      </w:ins>
+      <w:r>
+        <w:t>proportion of</w:t>
+      </w:r>
+      <w:del w:id="156" w:author="Bauer, Kate" w:date="2024-08-28T10:52:00Z">
+        <w:r>
+          <w:delText xml:space="preserve"> families</w:delText>
+        </w:r>
+      </w:del>
+      <w:ins w:id="157" w:author="Bauer, Kate" w:date="2024-08-28T10:52:00Z">
+        <w:r>
+          <w:t xml:space="preserve"> households</w:t>
+        </w:r>
+      </w:ins>
+      <w:r>
+        <w:t xml:space="preserve"> </w:t>
+      </w:r>
+      <w:ins w:id="158" w:author="Bauer, Kate" w:date="2024-08-28T10:52:00Z">
+        <w:r>
+          <w:t xml:space="preserve">within their census block </w:t>
+        </w:r>
+      </w:ins>
+      <w:r>
+        <w:t xml:space="preserve">with an income greater than </w:t>
+      </w:r>
+      <w:r>
+        <w:t>$</w:t>
+      </w:r>
+      <w:r>
+        <w:t xml:space="preserve">75k, </w:t>
+      </w:r>
+      <w:ins w:id="159" w:author="Bauer, Kate" w:date="2024-08-28T10:52:00Z">
+        <w:r>
+          <w:t xml:space="preserve">2) </w:t>
+        </w:r>
+      </w:ins>
+      <w:r>
+        <w:t>p</w:t>
+      </w:r>
+      <w:commentRangeStart w:id="160"/>
+      <w:r>
+        <w:t>roportion</w:t>
+      </w:r>
+      <w:commentRangeEnd w:id="160"/>
+      <w:r>
+        <w:rPr>
+          <w:rStyle w:val="CommentReference"/>
+        </w:rPr>
+        <w:commentReference w:id="160"/>
+      </w:r>
+      <w:r>
+        <w:t xml:space="preserve"> with a bachelor’s degree or higher, </w:t>
+      </w:r>
+      <w:r>
+        <w:t xml:space="preserve">and </w:t>
+      </w:r>
+      <w:ins w:id="161" w:author="Bauer, Kate" w:date="2024-08-28T10:52:00Z">
+        <w:r>
+          <w:t xml:space="preserve">3) </w:t>
+        </w:r>
+      </w:ins>
+      <w:commentRangeStart w:id="162"/>
+      <w:r>
+        <w:t>proportion with a professional occupation</w:t>
+      </w:r>
+      <w:r>
+        <w:t xml:space="preserve"> </w:t>
+      </w:r>
+      <w:commentRangeEnd w:id="162"/>
+      <w:r>
+        <w:rPr>
+          <w:rStyle w:val="CommentReference"/>
+        </w:rPr>
+        <w:commentReference w:id="162"/>
+      </w:r>
+      <w:r>
+        <w:t xml:space="preserve">with </w:t>
+      </w:r>
+      <w:r>
+        <w:t>quartile 1</w:t>
+      </w:r>
+      <w:r>
+        <w:t xml:space="preserve"> being the</w:t>
+      </w:r>
+      <w:r>
+        <w:t xml:space="preserve"> least</w:t>
+      </w:r>
+      <w:r>
+        <w:t xml:space="preserve"> </w:t>
+      </w:r>
+      <w:r>
+        <w:t>disadvantage</w:t>
+      </w:r>
+      <w:r>
+        <w:t>.</w:t>
+      </w:r>
+      <w:r>
+        <w:rPr>
+          <w:rFonts w:ascii="Times New Roman" w:eastAsia="Times New Roman" w:hAnsi="Times New Roman" w:cs="Times New Roman"/>
+        </w:rPr>
+        <w:t xml:space="preserve">  </w:t>
+      </w:r>
+      <w:commentRangeStart w:id="163"/>
+      <w:r>
+        <w:t>Type 2 diabetes</w:t>
+      </w:r>
+      <w:r>
+        <w:t xml:space="preserve"> was indicated by an ICD9 or ICD10 coded diagnosis in the participant’s electronic medical record</w:t>
+      </w:r>
+      <w:commentRangeEnd w:id="163"/>
+      <w:r>
+        <w:rPr>
+          <w:rStyle w:val="CommentReference"/>
+        </w:rPr>
+        <w:commentReference w:id="163"/>
+      </w:r>
+      <w:r>
+        <w:t>.</w:t>
+      </w:r>
+      <w:r>
+        <w:t xml:space="preserve">  </w:t>
+      </w:r>
+      <w:commentRangeStart w:id="164"/>
+      <w:r>
+        <w:t xml:space="preserve">Race and ethnicity </w:t>
+      </w:r>
+      <w:r>
+        <w:t>were</w:t>
+      </w:r>
+      <w:r>
+        <w:t xml:space="preserve"> defined </w:t>
+      </w:r>
+      <w:del w:id="165" w:author="Dave Bridges" w:date="2024-08-28T17:30:00Z">
+        <w:r>
+          <w:delText xml:space="preserve">as </w:delText>
+        </w:r>
+      </w:del>
+      <w:ins w:id="166" w:author="Dave Bridges" w:date="2024-08-28T17:30:00Z">
+        <w:r>
+          <w:t>from self- reports of Race and Ethnicity as</w:t>
+        </w:r>
+        <w:r>
+          <w:t xml:space="preserve"> </w:t>
+        </w:r>
+      </w:ins>
+      <w:r>
+        <w:t>Asian, Black, White, Hispanic/Latino, or Other.</w:t>
+      </w:r>
+      <w:r>
+        <w:t xml:space="preserve">  The latter group includes those who self-reported </w:t>
+      </w:r>
+      <w:r>
+        <w:t>their race as Other/Unknown/Declined, and groups with under 200 participants (American Indian, n=175; Pacific Islander, n=28).</w:t>
+      </w:r>
+      <w:r>
+        <w:t xml:space="preserve"> </w:t>
+      </w:r>
+      <w:commentRangeEnd w:id="164"/>
+      <w:r>
+        <w:rPr>
+          <w:rStyle w:val="CommentReference"/>
+        </w:rPr>
+        <w:commentReference w:id="164"/>
+      </w:r>
+      <w:r>
+        <w:t xml:space="preserve"> </w:t>
+      </w:r>
+      <w:commentRangeStart w:id="167"/>
+      <w:r>
+        <w:t xml:space="preserve">Comorbidities were assessed using </w:t>
+      </w:r>
+      <w:proofErr w:type="spellStart"/>
+      <w:r>
+        <w:t>Elixhauser</w:t>
+      </w:r>
+      <w:proofErr w:type="spellEnd"/>
+      <w:r>
+        <w:t xml:space="preserve"> comorbidity indices</w:t>
+      </w:r>
+      <w:ins w:id="168" w:author="Dave Bridges" w:date="2024-08-28T17:31:00Z">
+        <w:r>
+          <w:t>, which were</w:t>
+        </w:r>
+      </w:ins>
+      <w:r>
+        <w:t xml:space="preserve"> computed </w:t>
+      </w:r>
+      <w:ins w:id="169" w:author="Dave Bridges" w:date="2024-08-28T17:31:00Z">
+        <w:r>
+          <w:t>at a participant-level</w:t>
+        </w:r>
+      </w:ins>
+      <w:ins w:id="170" w:author="Dave Bridges" w:date="2024-08-28T17:32:00Z">
+        <w:r>
+          <w:t xml:space="preserve"> </w:t>
+        </w:r>
+      </w:ins>
+      <w:r>
+        <w:t xml:space="preserve">from ICD9 and ICD19 codes </w:t>
+      </w:r>
+      <w:r>
+        <w:fldChar w:fldCharType="begin"/>
+      </w:r>
+      <w:r>
+        <w:instrText xml:space="preserve"> ADDIN ZOTERO_ITEM CSL_CITATION {"citationID":"NpzuWU2y","properties":{"formattedCitation":"(14)","plainCitation":"(14)","noteIndex":0},"citationItems":[{"id":11488,"uris":["http://zotero.org/users/7317906/items/JMLH32L3"],"itemData":{"id":11488,"type":"article-journal","abstract":"OBJECTIVES: This study attempts to develop a comprehensive set of comorbidity measures for use with large administrative inpatient datasets.\nMETHODS: The study involved clinical and empirical review of comorbidity measures, development of a framework that attempts to segregate comorbidities from other aspects of the patient's condition, development of a comorbidity algorithm, and testing on heterogeneous and homogeneous patient groups. Data were drawn from all adult, nonmaternal inpatients from 438 acute care hospitals in California in 1992 (n = 1,779,167). Outcome measures were those commonly available in administrative data: length of stay, hospital charges, and in-hospital death.\nRESULTS: A comprehensive set of 30 comorbidity measures was developed. The comorbidities were associated with substantial increases in length of stay, hospital charges, and mortality both for heterogeneous and homogeneous disease groups. Several comorbidities are described that are important predictors of outcomes, yet commonly are not measured. These include mental disorders, drug and alcohol abuse, obesity, coagulopathy, weight loss, and fluid and electrolyte disorders.\nCONCLUSIONS: The comorbidities had independent effects on outcomes and probably should not be simplified as an index because they affect outcomes differently among different patient groups. The present method addresses some of the limitations of previous measures. It is based on a comprehensive approach to identifying comorbidities and separates them from the primary reason for hospitalization, resulting in an expanded set of comorbidities that easily is applied without further refinement to administrative data for a wide range of diseases.","container-title":"Medical Care","DOI":"10.1097/00005650-199801000-00004","ISSN":"0025-7079","issue":"1","journalAbbreviation":"Med Care","language":"eng","note":"PMID: 9431328","page":"8-27","source":"PubMed","title":"Comorbidity measures for use with administrative data","volume":"36","author":[{"family":"Elixhauser","given":"A."},{"family":"Steiner","given":"C."},{"family":"Harris","given":"D. R."},{"family":"Coffey","given":"R. M."}],"issued":{"date-parts":[["1998",1]]},"citation-key":"elixhauserComorbidityMeasuresUse1998"}}],"schema":"https://github.com/citation-style-language/schema/raw/master/csl-citation.json"} </w:instrText>
+      </w:r>
+      <w:r>
+        <w:fldChar w:fldCharType="separate"/>
+      </w:r>
+      <w:r>
+        <w:rPr>
+          <w:noProof/>
+        </w:rPr>
+        <w:t>(14)</w:t>
+      </w:r>
+      <w:r>
+        <w:fldChar w:fldCharType="end"/>
+      </w:r>
+      <w:r>
+        <w:t xml:space="preserve">.  </w:t>
+      </w:r>
+      <w:commentRangeEnd w:id="167"/>
+      <w:r>
+        <w:rPr>
+          <w:rStyle w:val="CommentReference"/>
+        </w:rPr>
+        <w:commentReference w:id="167"/>
+      </w:r>
+    </w:p>
+    <w:p/>
+    <w:p>
+      <w:pPr>
+        <w:pStyle w:val="Heading3"/>
+      </w:pPr>
+      <w:r>
+        <w:t xml:space="preserve">Statistical </w:t>
+      </w:r>
+      <w:ins w:id="171" w:author="Dave Bridges" w:date="2024-08-28T17:31:00Z">
+        <w:r>
+          <w:t>A</w:t>
+        </w:r>
+      </w:ins>
+      <w:del w:id="172" w:author="Dave Bridges" w:date="2024-08-28T17:31:00Z">
+        <w:r>
+          <w:delText>a</w:delText>
+        </w:r>
+      </w:del>
+      <w:r>
+        <w:t>nalyses</w:t>
+      </w:r>
+    </w:p>
+    <w:p>
+      <w:r>
+        <w:t xml:space="preserve">Significance for this study was set at an </w:t>
+      </w:r>
+      <w:r>
+        <w:t>p&lt;</w:t>
+      </w:r>
+      <w:r>
+        <w:t xml:space="preserve"> 0.05.  </w:t>
+      </w:r>
+      <w:r>
+        <w:t xml:space="preserve">Data are reported as +/- standard error of the mean.  </w:t>
+      </w:r>
+      <w:r>
+        <w:t xml:space="preserve">All analyses were performed using R version 4.3.1 </w:t>
+      </w:r>
+      <w:r>
+        <w:fldChar w:fldCharType="begin"/>
+      </w:r>
+      <w:r>
+        <w:instrText xml:space="preserve"> ADDIN ZOTERO_ITEM CSL_CITATION {"citationID":"0725YfVK","properties":{"formattedCitation":"(15)","plainCitation":"(15)","noteIndex":0},"citationItems":[{"id":8230,"uris":["http://zotero.org/users/7317906/items/3HZT7KXK"],"itemData":{"id":8230,"type":"document","note":"Citation Key: base\npublisher-place: Vienna, Austria","publisher":"R Foundation for Statistical Computing","title":"R: A Language and Environment for Statistical Computing","URL":"http://www.r-project.org/","author":[{"literal":"R Core Team"}],"accessed":{"date-parts":[["2010",10,22]]},"issued":{"date-parts":[["2019"]]},"citation-key":"base"}}],"schema":"https://github.com/citation-style-language/schema/raw/master/csl-citation.json"} </w:instrText>
+      </w:r>
+      <w:r>
+        <w:fldChar w:fldCharType="separate"/>
+      </w:r>
+      <w:r>
+        <w:rPr>
+          <w:noProof/>
+        </w:rPr>
+        <w:t>(15)</w:t>
+      </w:r>
+      <w:r>
+        <w:fldChar w:fldCharType="end"/>
+      </w:r>
+      <w:r>
+        <w:t>.</w:t>
+      </w:r>
+      <w:r>
+        <w:t xml:space="preserve">  </w:t>
+      </w:r>
+      <w:commentRangeStart w:id="173"/>
+      <w:commentRangeStart w:id="174"/>
+      <w:del w:id="175" w:author="Dave Bridges" w:date="2024-08-28T17:33:00Z">
+        <w:r>
+          <w:delText xml:space="preserve">Univariate </w:delText>
+        </w:r>
+      </w:del>
+      <w:ins w:id="176" w:author="Dave Bridges" w:date="2024-08-28T17:33:00Z">
+        <w:r>
+          <w:t>Univariable</w:t>
+        </w:r>
+        <w:r>
+          <w:t xml:space="preserve"> </w:t>
+        </w:r>
+      </w:ins>
+      <w:r>
+        <w:t xml:space="preserve">analyses </w:t>
+      </w:r>
+      <w:commentRangeEnd w:id="173"/>
+      <w:r>
+        <w:rPr>
+          <w:rStyle w:val="CommentReference"/>
+        </w:rPr>
+        <w:commentReference w:id="173"/>
+      </w:r>
+      <w:commentRangeEnd w:id="174"/>
+      <w:r>
+        <w:rPr>
+          <w:rStyle w:val="CommentReference"/>
+        </w:rPr>
+        <w:commentReference w:id="174"/>
+      </w:r>
+      <w:r>
+        <w:t>were performed using logistic regressions</w:t>
+      </w:r>
+      <w:r>
+        <w:t xml:space="preserve"> </w:t>
+      </w:r>
+      <w:commentRangeStart w:id="177"/>
+      <w:r>
+        <w:t>with either type 2 diabetes diagnosis or above median PSS score as the outcome</w:t>
+      </w:r>
+      <w:r>
+        <w:t>.</w:t>
+      </w:r>
+      <w:commentRangeEnd w:id="177"/>
+      <w:r>
+        <w:rPr>
+          <w:rStyle w:val="CommentReference"/>
+        </w:rPr>
+        <w:commentReference w:id="177"/>
+      </w:r>
+      <w:r>
+        <w:t xml:space="preserve">  </w:t>
+      </w:r>
+      <w:r>
+        <w:t xml:space="preserve"> </w:t>
+      </w:r>
+      <w:del w:id="178" w:author="Dave Bridges" w:date="2024-08-28T17:34:00Z">
+        <w:r>
+          <w:delText xml:space="preserve">Multivariate </w:delText>
+        </w:r>
+      </w:del>
+      <w:proofErr w:type="spellStart"/>
+      <w:ins w:id="179" w:author="Dave Bridges" w:date="2024-08-28T17:34:00Z">
+        <w:r>
+          <w:t>Mulitivariable</w:t>
+        </w:r>
+        <w:proofErr w:type="spellEnd"/>
+        <w:r>
+          <w:t xml:space="preserve"> </w:t>
+        </w:r>
+      </w:ins>
+      <w:r>
+        <w:t xml:space="preserve">analyses were performed by </w:t>
+      </w:r>
+      <w:commentRangeStart w:id="180"/>
+      <w:r>
+        <w:t xml:space="preserve">stepwise addition of </w:t>
+      </w:r>
+      <w:ins w:id="181" w:author="Dave Bridges" w:date="2024-08-28T17:34:00Z">
+        <w:r>
+          <w:t xml:space="preserve">relevant </w:t>
+        </w:r>
+      </w:ins>
+      <w:r>
+        <w:t>covariates</w:t>
+      </w:r>
+      <w:commentRangeEnd w:id="180"/>
+      <w:r>
+        <w:rPr>
+          <w:rStyle w:val="CommentReference"/>
+        </w:rPr>
+        <w:commentReference w:id="180"/>
+      </w:r>
+      <w:r>
+        <w:t xml:space="preserve">.  Sensitivity analyses were performed using BMI and PSS scores as </w:t>
+      </w:r>
+      <w:del w:id="182" w:author="Bauer, Kate" w:date="2024-08-28T14:42:00Z">
+        <w:r>
+          <w:delText xml:space="preserve">a </w:delText>
+        </w:r>
+      </w:del>
+      <w:r>
+        <w:t>continuous variable</w:t>
+      </w:r>
+      <w:ins w:id="183" w:author="Bauer, Kate" w:date="2024-08-28T14:42:00Z">
+        <w:r>
+          <w:t>s</w:t>
+        </w:r>
+      </w:ins>
+      <w:r>
+        <w:t xml:space="preserve">, </w:t>
+      </w:r>
+      <w:commentRangeStart w:id="184"/>
+      <w:r>
+        <w:t xml:space="preserve">and with PSS scores as a continuous variable.  </w:t>
+      </w:r>
+      <w:commentRangeEnd w:id="184"/>
+      <w:r>
+        <w:rPr>
+          <w:rStyle w:val="CommentReference"/>
+        </w:rPr>
+        <w:commentReference w:id="184"/>
+      </w:r>
+      <w:r>
+        <w:t xml:space="preserve">We also did subgroup analyses within </w:t>
+      </w:r>
+      <w:commentRangeStart w:id="185"/>
+      <w:r>
+        <w:t xml:space="preserve">each </w:t>
+      </w:r>
+      <w:ins w:id="186" w:author="Dave Bridges" w:date="2024-08-28T17:35:00Z">
+        <w:r>
+          <w:t xml:space="preserve">gender and </w:t>
+        </w:r>
+      </w:ins>
+      <w:r>
+        <w:t xml:space="preserve">demographic group </w:t>
+      </w:r>
+      <w:commentRangeEnd w:id="185"/>
+      <w:r>
+        <w:rPr>
+          <w:rStyle w:val="CommentReference"/>
+        </w:rPr>
+        <w:commentReference w:id="185"/>
+      </w:r>
+      <w:r>
+        <w:t xml:space="preserve">testing for effect modification of the obesity-stress relationship on </w:t>
+      </w:r>
+      <w:commentRangeStart w:id="187"/>
+      <w:r>
+        <w:t xml:space="preserve">diabetes </w:t>
+      </w:r>
+      <w:del w:id="188" w:author="Dave Bridges" w:date="2024-08-28T17:35:00Z">
+        <w:r>
+          <w:delText>incidence</w:delText>
+        </w:r>
+      </w:del>
+      <w:ins w:id="189" w:author="Dave Bridges" w:date="2024-08-28T17:35:00Z">
+        <w:r>
+          <w:t>prevalence</w:t>
+        </w:r>
+      </w:ins>
+      <w:r>
+        <w:t xml:space="preserve">.  </w:t>
+      </w:r>
+      <w:commentRangeEnd w:id="187"/>
+      <w:r>
+        <w:rPr>
+          <w:rStyle w:val="CommentReference"/>
+        </w:rPr>
+        <w:commentReference w:id="187"/>
+      </w:r>
+    </w:p>
+    <w:p/>
+    <w:p>
+      <w:pPr>
+        <w:pStyle w:val="Heading1"/>
+      </w:pPr>
+      <w:r>
+        <w:t>Results</w:t>
+      </w:r>
+    </w:p>
+    <w:p/>
+    <w:p>
+      <w:pPr>
+        <w:pStyle w:val="Heading2"/>
+      </w:pPr>
+      <w:r>
+        <w:t>Self-Reported Perceived Stress is Associated with Type 2 Diabetes</w:t>
+      </w:r>
+    </w:p>
+    <w:p/>
+    <w:p>
+      <w:pPr>
+        <w:rPr>
+          <w:ins w:id="190" w:author="Bauer, Kate" w:date="2024-08-28T14:47:00Z"/>
+        </w:rPr>
+      </w:pPr>
+      <w:r>
+        <w:t xml:space="preserve">Among the participants in this study, </w:t>
+      </w:r>
+      <w:r>
+        <w:t xml:space="preserve">the median age was </w:t>
+      </w:r>
+      <w:r>
+        <w:t>53</w:t>
+      </w:r>
+      <w:r>
+        <w:t xml:space="preserve"> </w:t>
+      </w:r>
+      <w:r>
+        <w:t>years</w:t>
+      </w:r>
+      <w:r>
+        <w:t xml:space="preserve">, </w:t>
+      </w:r>
+      <w:r>
+        <w:t xml:space="preserve">with </w:t>
+      </w:r>
+      <w:r>
+        <w:t>5</w:t>
+      </w:r>
+      <w:r>
+        <w:t>3</w:t>
+      </w:r>
+      <w:r>
+        <w:t>% identifying as female and with a</w:t>
+      </w:r>
+      <w:r>
+        <w:t xml:space="preserve"> mean </w:t>
+      </w:r>
+      <w:r>
+        <w:t xml:space="preserve">BMI of </w:t>
+      </w:r>
+      <w:r>
+        <w:t>30</w:t>
+      </w:r>
+      <w:r>
+        <w:t xml:space="preserve"> kg/m</w:t>
       </w:r>
       <w:r>
         <w:rPr>
@@ -1749,1066 +2432,537 @@
         <w:t>2</w:t>
       </w:r>
       <w:r>
-        <w:t>.</w:t>
-      </w:r>
-      <w:commentRangeEnd w:id="150"/>
-      <w:r>
-        <w:rPr>
-          <w:rStyle w:val="CommentReference"/>
-        </w:rPr>
-        <w:commentReference w:id="150"/>
+        <w:t xml:space="preserve">.  </w:t>
+      </w:r>
+      <w:del w:id="191" w:author="Dave Bridges" w:date="2024-08-28T17:35:00Z">
+        <w:r>
+          <w:delText xml:space="preserve">The </w:delText>
+        </w:r>
+      </w:del>
+      <w:ins w:id="192" w:author="Dave Bridges" w:date="2024-08-28T17:35:00Z">
+        <w:r>
+          <w:t xml:space="preserve">Relative to the </w:t>
+        </w:r>
+      </w:ins>
+      <w:ins w:id="193" w:author="Dave Bridges" w:date="2024-08-28T17:37:00Z">
+        <w:r>
+          <w:t>United States</w:t>
+        </w:r>
+      </w:ins>
+      <w:ins w:id="194" w:author="Dave Bridges" w:date="2024-08-28T17:36:00Z">
+        <w:r>
+          <w:t xml:space="preserve"> </w:t>
+        </w:r>
+      </w:ins>
+      <w:ins w:id="195" w:author="Dave Bridges" w:date="2024-08-28T17:37:00Z">
+        <w:r>
+          <w:t xml:space="preserve">and Michigan </w:t>
+        </w:r>
+      </w:ins>
+      <w:proofErr w:type="spellStart"/>
+      <w:ins w:id="196" w:author="Dave Bridges" w:date="2024-08-28T17:38:00Z">
+        <w:r>
+          <w:lastRenderedPageBreak/>
+          <w:t>demogaphics</w:t>
+        </w:r>
+      </w:ins>
+      <w:proofErr w:type="spellEnd"/>
+      <w:ins w:id="197" w:author="Dave Bridges" w:date="2024-08-28T17:36:00Z">
+        <w:r>
+          <w:t>, our</w:t>
+        </w:r>
+      </w:ins>
+      <w:ins w:id="198" w:author="Dave Bridges" w:date="2024-08-28T17:35:00Z">
+        <w:r>
+          <w:t xml:space="preserve"> </w:t>
+        </w:r>
+      </w:ins>
+      <w:r>
+        <w:t xml:space="preserve">study </w:t>
+      </w:r>
+      <w:r>
+        <w:t xml:space="preserve">population </w:t>
+      </w:r>
+      <w:commentRangeStart w:id="199"/>
+      <w:r>
+        <w:t>disproportionately</w:t>
+      </w:r>
+      <w:commentRangeEnd w:id="199"/>
+      <w:r>
+        <w:rPr>
+          <w:rStyle w:val="CommentReference"/>
+        </w:rPr>
+        <w:commentReference w:id="199"/>
+      </w:r>
+      <w:r>
+        <w:t xml:space="preserve"> identified as White (</w:t>
+      </w:r>
+      <w:r>
+        <w:t xml:space="preserve">89%; </w:t>
+      </w:r>
+      <w:r>
+        <w:t xml:space="preserve">Table 1).  </w:t>
+      </w:r>
+      <w:r>
+        <w:t xml:space="preserve">15% of </w:t>
+      </w:r>
+      <w:r>
+        <w:t xml:space="preserve">the participants </w:t>
+      </w:r>
+      <w:r>
+        <w:t>w</w:t>
+      </w:r>
+      <w:r>
+        <w:t>ere</w:t>
+      </w:r>
+      <w:r>
+        <w:t xml:space="preserve"> diagnosed with type 2 diabetes</w:t>
+      </w:r>
+      <w:del w:id="200" w:author="Bauer, Kate" w:date="2024-08-28T14:47:00Z">
+        <w:r>
+          <w:delText xml:space="preserve">. </w:delText>
+        </w:r>
+        <w:r>
+          <w:delText>We stratified this population as low or high</w:delText>
+        </w:r>
+        <w:r>
+          <w:delText xml:space="preserve"> perceived</w:delText>
+        </w:r>
+        <w:r>
+          <w:delText xml:space="preserve"> stress based on </w:delText>
+        </w:r>
+        <w:r>
+          <w:delText>their PSS score at enrollment.</w:delText>
+        </w:r>
+      </w:del>
+      <w:ins w:id="201" w:author="Bauer, Kate" w:date="2024-08-28T14:47:00Z">
+        <w:r>
+          <w:t>.</w:t>
+        </w:r>
+      </w:ins>
+    </w:p>
+    <w:p>
+      <w:pPr>
+        <w:rPr>
+          <w:ins w:id="202" w:author="Bauer, Kate" w:date="2024-08-28T14:47:00Z"/>
+        </w:rPr>
+      </w:pPr>
+    </w:p>
+    <w:p>
+      <w:del w:id="203" w:author="Bauer, Kate" w:date="2024-08-28T14:47:00Z">
+        <w:r>
+          <w:delText xml:space="preserve">  </w:delText>
+        </w:r>
+      </w:del>
+      <w:r>
+        <w:t xml:space="preserve">As shown in Table 1, several demographic factors were significantly different between participants </w:t>
+      </w:r>
+      <w:commentRangeStart w:id="204"/>
+      <w:r>
+        <w:t xml:space="preserve">with high PSS scores </w:t>
+      </w:r>
+      <w:commentRangeEnd w:id="204"/>
+      <w:r>
+        <w:rPr>
+          <w:rStyle w:val="CommentReference"/>
+        </w:rPr>
+        <w:commentReference w:id="204"/>
+      </w:r>
+      <w:r>
+        <w:t xml:space="preserve">including race (higher in Black and Hispanic or Latino participants), </w:t>
+      </w:r>
+      <w:r>
+        <w:t>fe</w:t>
+      </w:r>
+      <w:r>
+        <w:t>male gender (</w:t>
+      </w:r>
+      <w:r>
+        <w:t xml:space="preserve">5% </w:t>
+      </w:r>
+      <w:r>
+        <w:t>higher than male</w:t>
+      </w:r>
+      <w:r>
+        <w:t xml:space="preserve">), younger age (particularly under 60 years old), and the </w:t>
+      </w:r>
+      <w:r>
+        <w:t>higher</w:t>
+      </w:r>
+      <w:r>
+        <w:t xml:space="preserve"> </w:t>
+      </w:r>
+      <w:r>
+        <w:t xml:space="preserve">neighborhood </w:t>
+      </w:r>
+      <w:r>
+        <w:t>disadvantage</w:t>
+      </w:r>
+      <w:r>
+        <w:t xml:space="preserve"> </w:t>
+      </w:r>
+      <w:r>
+        <w:t>scores.</w:t>
+      </w:r>
+      <w:r>
+        <w:t xml:space="preserve">  Body mass indices above 25 and below 18.5 (underweight) were </w:t>
+      </w:r>
+      <w:r>
+        <w:t xml:space="preserve">both </w:t>
+      </w:r>
+      <w:r>
+        <w:t>positively associated with a higher likelihood of perceived stress.</w:t>
       </w:r>
       <w:r>
         <w:t xml:space="preserve">  </w:t>
       </w:r>
       <w:r>
-        <w:t xml:space="preserve">To </w:t>
-      </w:r>
-      <w:r>
-        <w:t>estimate the</w:t>
+        <w:t>Among</w:t>
+      </w:r>
+      <w:r>
+        <w:t xml:space="preserve"> participants with type 2 diabetes, there </w:t>
+      </w:r>
+      <w:r>
+        <w:t>were more participants reporting</w:t>
       </w:r>
       <w:r>
         <w:t xml:space="preserve"> </w:t>
       </w:r>
       <w:r>
-        <w:t>perceived</w:t>
-      </w:r>
-      <w:r>
-        <w:t xml:space="preserve"> stress </w:t>
-      </w:r>
-      <w:r>
-        <w:t xml:space="preserve">of the participants, </w:t>
-      </w:r>
-      <w:commentRangeStart w:id="151"/>
-      <w:r>
-        <w:t xml:space="preserve">we used the </w:t>
-      </w:r>
-      <w:r>
-        <w:t>aggregate</w:t>
-      </w:r>
-      <w:r>
-        <w:t xml:space="preserve"> sum of the PSS4 score and stratified as above or below the median score (</w:t>
-      </w:r>
-      <w:r>
-        <w:t>5 out of 16</w:t>
+        <w:t xml:space="preserve">above </w:t>
+      </w:r>
+      <w:commentRangeStart w:id="205"/>
+      <w:r>
+        <w:t>average</w:t>
+      </w:r>
+      <w:r>
+        <w:t xml:space="preserve"> </w:t>
+      </w:r>
+      <w:ins w:id="206" w:author="Dave Bridges" w:date="2024-08-28T17:39:00Z">
+        <w:r>
+          <w:t>PSS scores</w:t>
+        </w:r>
+      </w:ins>
+      <w:del w:id="207" w:author="Dave Bridges" w:date="2024-08-28T17:38:00Z">
+        <w:r>
+          <w:delText>rates</w:delText>
+        </w:r>
+      </w:del>
+      <w:r>
+        <w:t xml:space="preserve"> (47%) </w:t>
+      </w:r>
+      <w:commentRangeEnd w:id="205"/>
+      <w:r>
+        <w:rPr>
+          <w:rStyle w:val="CommentReference"/>
+        </w:rPr>
+        <w:commentReference w:id="205"/>
+      </w:r>
+      <w:r>
+        <w:t>compared to those without</w:t>
+      </w:r>
+      <w:r>
+        <w:t xml:space="preserve"> type 2 diabetes</w:t>
+      </w:r>
+      <w:r>
+        <w:t xml:space="preserve"> (41%</w:t>
+      </w:r>
+      <w:r>
+        <w:t>, p</w:t>
+      </w:r>
+      <w:r>
+        <w:t xml:space="preserve"> = </w:t>
+      </w:r>
+      <w:commentRangeStart w:id="208"/>
+      <w:r>
+        <w:t>6</w:t>
+      </w:r>
+      <w:r>
+        <w:t xml:space="preserve"> x 10</w:t>
+      </w:r>
+      <w:r>
+        <w:rPr>
+          <w:vertAlign w:val="superscript"/>
+        </w:rPr>
+        <w:t>-18</w:t>
+      </w:r>
+      <w:commentRangeEnd w:id="208"/>
+      <w:r>
+        <w:rPr>
+          <w:rStyle w:val="CommentReference"/>
+        </w:rPr>
+        <w:commentReference w:id="208"/>
       </w:r>
       <w:r>
         <w:t>).</w:t>
       </w:r>
+    </w:p>
+    <w:p/>
+    <w:p>
+      <w:pPr>
+        <w:pStyle w:val="Heading2"/>
+      </w:pPr>
+      <w:r>
+        <w:t xml:space="preserve">Perceived Stress Is </w:t>
+      </w:r>
+      <w:r>
+        <w:t xml:space="preserve">More Strongly </w:t>
+      </w:r>
+      <w:r>
+        <w:t>Associated with Type 2 Diabetes in</w:t>
+      </w:r>
+      <w:r>
+        <w:t xml:space="preserve"> Participants with</w:t>
+      </w:r>
+      <w:r>
+        <w:t xml:space="preserve"> Obes</w:t>
+      </w:r>
+      <w:r>
+        <w:t>ity</w:t>
+      </w:r>
+    </w:p>
+    <w:p/>
+    <w:p>
+      <w:r>
+        <w:t>We next evaluated how obesity modified the stress-diabetes relationship in these participants.</w:t>
+      </w:r>
       <w:r>
         <w:t xml:space="preserve">  </w:t>
       </w:r>
-      <w:commentRangeEnd w:id="151"/>
-      <w:r>
-        <w:rPr>
-          <w:rStyle w:val="CommentReference"/>
-        </w:rPr>
-        <w:commentReference w:id="151"/>
-      </w:r>
-      <w:commentRangeStart w:id="152"/>
-      <w:r>
-        <w:t xml:space="preserve">Socioeconomic status of participants </w:t>
-      </w:r>
-      <w:commentRangeEnd w:id="152"/>
-      <w:r>
-        <w:rPr>
-          <w:rStyle w:val="CommentReference"/>
-        </w:rPr>
-        <w:commentReference w:id="152"/>
-      </w:r>
-      <w:r>
-        <w:t xml:space="preserve">was approximated by constructing a neighborhood </w:t>
-      </w:r>
-      <w:r>
-        <w:t>disadvantage</w:t>
-      </w:r>
-      <w:r>
-        <w:t xml:space="preserve"> score based on their census block connected to the </w:t>
-      </w:r>
-      <w:commentRangeStart w:id="153"/>
-      <w:commentRangeStart w:id="154"/>
-      <w:r>
-        <w:t>National Neighborhood Data Archive (</w:t>
-      </w:r>
-      <w:proofErr w:type="spellStart"/>
-      <w:r>
-        <w:t>NaNDA</w:t>
-      </w:r>
-      <w:proofErr w:type="spellEnd"/>
-      <w:r>
-        <w:t xml:space="preserve">; </w:t>
-      </w:r>
-      <w:r>
-        <w:fldChar w:fldCharType="begin"/>
-      </w:r>
-      <w:r>
-        <w:instrText xml:space="preserve"> ADDIN ZOTERO_ITEM CSL_CITATION {"citationID":"mt5HuRYp","properties":{"formattedCitation":"(13)","plainCitation":"(13)","noteIndex":0},"citationItems":[{"id":11572,"uris":["http://zotero.org/users/7317906/items/QI3T6XGC"],"itemData":{"id":11572,"type":"dataset","DOI":"10.3886/ICPSR38528.v3","publisher":"Inter-university Consortium for Political and Social Research [distributor]","title":"National Neighborhood Data Archive (NaNDA): Socioeconomic Status and Demographic Characteristics of Census Tracts and ZIP Code Tabulation Areas, United States, 2000-2020","author":[{"family":"Clarke","given":"Philippa"},{"family":"Noppert","given":"Grace"},{"family":"Melendez","given":"Robert"},{"family":"Chenoweth","given":"Megan"},{"family":"Gypin","given":"Lindsay"}],"issued":{"date-parts":[["2023"]]},"citation-key":"clarkeNationalNeighborhoodData2023"}}],"schema":"https://github.com/citation-style-language/schema/raw/master/csl-citation.json"} </w:instrText>
-      </w:r>
-      <w:r>
-        <w:fldChar w:fldCharType="separate"/>
-      </w:r>
-      <w:r>
-        <w:rPr>
-          <w:noProof/>
-        </w:rPr>
-        <w:t>(13)</w:t>
-      </w:r>
-      <w:r>
-        <w:fldChar w:fldCharType="end"/>
-      </w:r>
-      <w:r>
-        <w:t>)</w:t>
-      </w:r>
-      <w:r>
-        <w:t xml:space="preserve">.  This was in turn </w:t>
-      </w:r>
-      <w:r>
-        <w:t>linked</w:t>
-      </w:r>
-      <w:r>
-        <w:t xml:space="preserve"> to data from the American Community Survey (2013-2017).  </w:t>
-      </w:r>
-      <w:commentRangeEnd w:id="153"/>
-      <w:r>
-        <w:rPr>
-          <w:rStyle w:val="CommentReference"/>
-        </w:rPr>
-        <w:commentReference w:id="153"/>
-      </w:r>
-      <w:commentRangeEnd w:id="154"/>
-      <w:r>
-        <w:rPr>
-          <w:rStyle w:val="CommentReference"/>
-        </w:rPr>
-        <w:commentReference w:id="154"/>
-      </w:r>
-      <w:r>
-        <w:t>Participant</w:t>
-      </w:r>
-      <w:ins w:id="155" w:author="Bauer, Kate" w:date="2024-08-28T10:52:00Z">
-        <w:r>
-          <w:t>s</w:t>
-        </w:r>
-      </w:ins>
-      <w:r>
-        <w:t xml:space="preserve"> were assigned a quartile score based on the </w:t>
-      </w:r>
-      <w:ins w:id="156" w:author="Bauer, Kate" w:date="2024-08-28T10:52:00Z">
-        <w:r>
-          <w:t xml:space="preserve">1) </w:t>
-        </w:r>
-      </w:ins>
-      <w:r>
-        <w:t>proportion of</w:t>
-      </w:r>
-      <w:del w:id="157" w:author="Bauer, Kate" w:date="2024-08-28T10:52:00Z">
-        <w:r>
-          <w:delText xml:space="preserve"> families</w:delText>
+      <w:commentRangeStart w:id="209"/>
+      <w:r>
+        <w:t>We stratified participants into those with a BMI above or below 30 kg/m</w:t>
+      </w:r>
+      <w:r>
+        <w:rPr>
+          <w:vertAlign w:val="superscript"/>
+        </w:rPr>
+        <w:t>2</w:t>
+      </w:r>
+      <w:r>
+        <w:t xml:space="preserve"> and with above or below median stress.  </w:t>
+      </w:r>
+      <w:commentRangeEnd w:id="209"/>
+      <w:r>
+        <w:rPr>
+          <w:rStyle w:val="CommentReference"/>
+        </w:rPr>
+        <w:commentReference w:id="209"/>
+      </w:r>
+      <w:r>
+        <w:t xml:space="preserve">As expected, participants with obesity had higher type 2 diabetes prevalence than those with a BMI under 30 (unadjusted odds ratio 3.1 +/- 1.0).  </w:t>
+      </w:r>
+      <w:r>
+        <w:t xml:space="preserve">While diabetes rates were higher in male participants </w:t>
+      </w:r>
+      <w:del w:id="210" w:author="Bauer, Kate" w:date="2024-08-28T14:51:00Z">
+        <w:r>
+          <w:delText xml:space="preserve">with </w:delText>
         </w:r>
       </w:del>
-      <w:ins w:id="158" w:author="Bauer, Kate" w:date="2024-08-28T10:52:00Z">
-        <w:r>
-          <w:t xml:space="preserve"> households</w:t>
-        </w:r>
-      </w:ins>
-      <w:r>
-        <w:t xml:space="preserve"> </w:t>
-      </w:r>
-      <w:ins w:id="159" w:author="Bauer, Kate" w:date="2024-08-28T10:52:00Z">
-        <w:r>
-          <w:t xml:space="preserve">within their census block </w:t>
-        </w:r>
-      </w:ins>
-      <w:r>
-        <w:t xml:space="preserve">with an income greater than </w:t>
-      </w:r>
-      <w:r>
-        <w:t>$</w:t>
-      </w:r>
-      <w:r>
-        <w:t xml:space="preserve">75k, </w:t>
-      </w:r>
-      <w:ins w:id="160" w:author="Bauer, Kate" w:date="2024-08-28T10:52:00Z">
-        <w:r>
-          <w:t xml:space="preserve">2) </w:t>
-        </w:r>
-      </w:ins>
-      <w:r>
-        <w:t>p</w:t>
-      </w:r>
-      <w:commentRangeStart w:id="161"/>
-      <w:r>
-        <w:t>roportion</w:t>
-      </w:r>
-      <w:commentRangeEnd w:id="161"/>
-      <w:r>
-        <w:rPr>
-          <w:rStyle w:val="CommentReference"/>
-        </w:rPr>
-        <w:commentReference w:id="161"/>
-      </w:r>
-      <w:r>
-        <w:t xml:space="preserve"> with a bachelor’s degree or higher, </w:t>
-      </w:r>
-      <w:r>
-        <w:t xml:space="preserve">and </w:t>
-      </w:r>
-      <w:ins w:id="162" w:author="Bauer, Kate" w:date="2024-08-28T10:52:00Z">
-        <w:r>
-          <w:t xml:space="preserve">3) </w:t>
-        </w:r>
-      </w:ins>
-      <w:commentRangeStart w:id="163"/>
-      <w:r>
-        <w:t>proportion with a professional occupation</w:t>
-      </w:r>
-      <w:r>
-        <w:t xml:space="preserve"> </w:t>
-      </w:r>
-      <w:commentRangeEnd w:id="163"/>
-      <w:r>
-        <w:rPr>
-          <w:rStyle w:val="CommentReference"/>
-        </w:rPr>
-        <w:commentReference w:id="163"/>
-      </w:r>
-      <w:r>
-        <w:t xml:space="preserve">with </w:t>
-      </w:r>
-      <w:r>
-        <w:t>quartile 1</w:t>
-      </w:r>
-      <w:r>
-        <w:t xml:space="preserve"> being the</w:t>
-      </w:r>
-      <w:r>
-        <w:t xml:space="preserve"> least</w:t>
-      </w:r>
-      <w:r>
-        <w:t xml:space="preserve"> </w:t>
-      </w:r>
-      <w:r>
-        <w:t>disadvantage</w:t>
-      </w:r>
-      <w:r>
-        <w:t>.</w:t>
-      </w:r>
-      <w:r>
-        <w:rPr>
-          <w:rFonts w:ascii="Times New Roman" w:eastAsia="Times New Roman" w:hAnsi="Times New Roman" w:cs="Times New Roman"/>
-        </w:rPr>
-        <w:t xml:space="preserve">  </w:t>
-      </w:r>
-      <w:commentRangeStart w:id="164"/>
-      <w:r>
-        <w:t>Type 2 diabetes</w:t>
-      </w:r>
-      <w:r>
-        <w:t xml:space="preserve"> was indicated by an ICD9 or ICD10 coded diagnosis in the participant’s electronic medical record</w:t>
-      </w:r>
-      <w:commentRangeEnd w:id="164"/>
-      <w:r>
-        <w:rPr>
-          <w:rStyle w:val="CommentReference"/>
-        </w:rPr>
-        <w:commentReference w:id="164"/>
-      </w:r>
-      <w:r>
-        <w:t>.</w:t>
-      </w:r>
-      <w:r>
-        <w:t xml:space="preserve">  </w:t>
-      </w:r>
-      <w:commentRangeStart w:id="165"/>
-      <w:r>
-        <w:t xml:space="preserve">Race and ethnicity </w:t>
-      </w:r>
-      <w:r>
-        <w:t>were</w:t>
-      </w:r>
-      <w:r>
-        <w:t xml:space="preserve"> defined </w:t>
-      </w:r>
-      <w:del w:id="166" w:author="Dave Bridges" w:date="2024-08-28T17:30:00Z">
-        <w:r>
-          <w:delText xml:space="preserve">as </w:delText>
+      <w:r>
+        <w:t>than female</w:t>
+      </w:r>
+      <w:ins w:id="211" w:author="Bauer, Kate" w:date="2024-08-28T14:51:00Z">
+        <w:r>
+          <w:t xml:space="preserve"> participants</w:t>
+        </w:r>
+      </w:ins>
+      <w:del w:id="212" w:author="Bauer, Kate" w:date="2024-08-28T14:51:00Z">
+        <w:r>
+          <w:delText>s</w:delText>
         </w:r>
       </w:del>
-      <w:ins w:id="167" w:author="Dave Bridges" w:date="2024-08-28T17:30:00Z">
-        <w:r>
-          <w:t>from self- reports of Race and Ethnicity as</w:t>
+      <w:r>
+        <w:t xml:space="preserve"> (11.6% vs 6.8% among participants without obesity; 26.9% vs 22.1% in participants with obesity), </w:t>
+      </w:r>
+      <w:commentRangeStart w:id="213"/>
+      <w:r>
+        <w:t xml:space="preserve">the </w:t>
+      </w:r>
+      <w:commentRangeStart w:id="214"/>
+      <w:del w:id="215" w:author="Dave Bridges" w:date="2024-08-28T17:40:00Z">
+        <w:r>
+          <w:delText xml:space="preserve">effect </w:delText>
+        </w:r>
+      </w:del>
+      <w:ins w:id="216" w:author="Dave Bridges" w:date="2024-08-28T17:40:00Z">
+        <w:r>
+          <w:t>increased type 2 Diabetes prevalence</w:t>
         </w:r>
         <w:r>
           <w:t xml:space="preserve"> </w:t>
         </w:r>
-      </w:ins>
-      <w:r>
-        <w:t>Asian, Black, White, Hispanic/Latino, or Other.</w:t>
-      </w:r>
-      <w:r>
-        <w:t xml:space="preserve">  The latter group includes those who self-reported </w:t>
-      </w:r>
-      <w:r>
-        <w:t>their race as Other/Unknown/Declined, and groups with under 200 participants (American Indian, n=175; Pacific Islander, n=28).</w:t>
-      </w:r>
-      <w:r>
-        <w:t xml:space="preserve"> </w:t>
-      </w:r>
-      <w:commentRangeEnd w:id="165"/>
-      <w:r>
-        <w:rPr>
-          <w:rStyle w:val="CommentReference"/>
-        </w:rPr>
-        <w:commentReference w:id="165"/>
-      </w:r>
-      <w:r>
-        <w:t xml:space="preserve"> </w:t>
-      </w:r>
-      <w:commentRangeStart w:id="168"/>
-      <w:r>
-        <w:t xml:space="preserve">Comorbidities were assessed using </w:t>
-      </w:r>
-      <w:proofErr w:type="spellStart"/>
-      <w:r>
-        <w:t>Elixhauser</w:t>
-      </w:r>
-      <w:proofErr w:type="spellEnd"/>
-      <w:r>
-        <w:t xml:space="preserve"> comorbidity indices computed from ICD9 and ICD19 codes </w:t>
-      </w:r>
-      <w:r>
-        <w:fldChar w:fldCharType="begin"/>
-      </w:r>
-      <w:r>
-        <w:instrText xml:space="preserve"> ADDIN ZOTERO_ITEM CSL_CITATION {"citationID":"NpzuWU2y","properties":{"formattedCitation":"(14)","plainCitation":"(14)","noteIndex":0},"citationItems":[{"id":11488,"uris":["http://zotero.org/users/7317906/items/JMLH32L3"],"itemData":{"id":11488,"type":"article-journal","abstract":"OBJECTIVES: This study attempts to develop a comprehensive set of comorbidity measures for use with large administrative inpatient datasets.\nMETHODS: The study involved clinical and empirical review of comorbidity measures, development of a framework that attempts to segregate comorbidities from other aspects of the patient's condition, development of a comorbidity algorithm, and testing on heterogeneous and homogeneous patient groups. Data were drawn from all adult, nonmaternal inpatients from 438 acute care hospitals in California in 1992 (n = 1,779,167). Outcome measures were those commonly available in administrative data: length of stay, hospital charges, and in-hospital death.\nRESULTS: A comprehensive set of 30 comorbidity measures was developed. The comorbidities were associated with substantial increases in length of stay, hospital charges, and mortality both for heterogeneous and homogeneous disease groups. Several comorbidities are described that are important predictors of outcomes, yet commonly are not measured. These include mental disorders, drug and alcohol abuse, obesity, coagulopathy, weight loss, and fluid and electrolyte disorders.\nCONCLUSIONS: The comorbidities had independent effects on outcomes and probably should not be simplified as an index because they affect outcomes differently among different patient groups. The present method addresses some of the limitations of previous measures. It is based on a comprehensive approach to identifying comorbidities and separates them from the primary reason for hospitalization, resulting in an expanded set of comorbidities that easily is applied without further refinement to administrative data for a wide range of diseases.","container-title":"Medical Care","DOI":"10.1097/00005650-199801000-00004","ISSN":"0025-7079","issue":"1","journalAbbreviation":"Med Care","language":"eng","note":"PMID: 9431328","page":"8-27","source":"PubMed","title":"Comorbidity measures for use with administrative data","volume":"36","author":[{"family":"Elixhauser","given":"A."},{"family":"Steiner","given":"C."},{"family":"Harris","given":"D. R."},{"family":"Coffey","given":"R. M."}],"issued":{"date-parts":[["1998",1]]},"citation-key":"elixhauserComorbidityMeasuresUse1998"}}],"schema":"https://github.com/citation-style-language/schema/raw/master/csl-citation.json"} </w:instrText>
-      </w:r>
-      <w:r>
-        <w:fldChar w:fldCharType="separate"/>
-      </w:r>
-      <w:r>
-        <w:rPr>
-          <w:noProof/>
-        </w:rPr>
-        <w:t>(14)</w:t>
-      </w:r>
-      <w:r>
-        <w:fldChar w:fldCharType="end"/>
-      </w:r>
-      <w:r>
-        <w:t xml:space="preserve">.  </w:t>
-      </w:r>
-      <w:commentRangeEnd w:id="168"/>
-      <w:r>
-        <w:rPr>
-          <w:rStyle w:val="CommentReference"/>
-        </w:rPr>
-        <w:commentReference w:id="168"/>
-      </w:r>
-    </w:p>
-    <w:p/>
-    <w:p>
-      <w:pPr>
-        <w:pStyle w:val="Heading3"/>
-      </w:pPr>
-      <w:r>
-        <w:t xml:space="preserve">Statistical </w:t>
-      </w:r>
-      <w:ins w:id="169" w:author="Dave Bridges" w:date="2024-08-28T17:31:00Z">
-        <w:r>
-          <w:t>A</w:t>
-        </w:r>
-      </w:ins>
-      <w:del w:id="170" w:author="Dave Bridges" w:date="2024-08-28T17:31:00Z">
-        <w:r>
-          <w:delText>a</w:delText>
-        </w:r>
-      </w:del>
-      <w:r>
-        <w:t>nalyses</w:t>
-      </w:r>
-    </w:p>
-    <w:p>
-      <w:r>
-        <w:t xml:space="preserve">Significance for this study was set at an </w:t>
-      </w:r>
-      <w:r>
-        <w:t>p&lt;</w:t>
-      </w:r>
-      <w:r>
-        <w:t xml:space="preserve"> 0.05.  </w:t>
-      </w:r>
-      <w:r>
-        <w:t xml:space="preserve">Data are reported as +/- standard error of the mean.  </w:t>
-      </w:r>
-      <w:r>
-        <w:t xml:space="preserve">All analyses were performed using R version 4.3.1 </w:t>
-      </w:r>
-      <w:r>
-        <w:fldChar w:fldCharType="begin"/>
-      </w:r>
-      <w:r>
-        <w:instrText xml:space="preserve"> ADDIN ZOTERO_ITEM CSL_CITATION {"citationID":"0725YfVK","properties":{"formattedCitation":"(15)","plainCitation":"(15)","noteIndex":0},"citationItems":[{"id":8230,"uris":["http://zotero.org/users/7317906/items/3HZT7KXK"],"itemData":{"id":8230,"type":"document","note":"Citation Key: base\npublisher-place: Vienna, Austria","publisher":"R Foundation for Statistical Computing","title":"R: A Language and Environment for Statistical Computing","URL":"http://www.r-project.org/","author":[{"literal":"R Core Team"}],"accessed":{"date-parts":[["2010",10,22]]},"issued":{"date-parts":[["2019"]]},"citation-key":"base"}}],"schema":"https://github.com/citation-style-language/schema/raw/master/csl-citation.json"} </w:instrText>
-      </w:r>
-      <w:r>
-        <w:fldChar w:fldCharType="separate"/>
-      </w:r>
-      <w:r>
-        <w:rPr>
-          <w:noProof/>
-        </w:rPr>
-        <w:t>(15)</w:t>
-      </w:r>
-      <w:r>
-        <w:fldChar w:fldCharType="end"/>
-      </w:r>
-      <w:r>
-        <w:t>.</w:t>
-      </w:r>
-      <w:r>
-        <w:t xml:space="preserve">  </w:t>
-      </w:r>
-      <w:commentRangeStart w:id="171"/>
-      <w:r>
-        <w:t xml:space="preserve">Univariate analyses </w:t>
-      </w:r>
-      <w:commentRangeEnd w:id="171"/>
-      <w:r>
-        <w:rPr>
-          <w:rStyle w:val="CommentReference"/>
-        </w:rPr>
-        <w:commentReference w:id="171"/>
-      </w:r>
-      <w:r>
-        <w:t>were performed using logistic regressions</w:t>
-      </w:r>
-      <w:r>
-        <w:t xml:space="preserve"> </w:t>
-      </w:r>
-      <w:commentRangeStart w:id="172"/>
-      <w:r>
-        <w:t>with either type 2 diabetes diagnosis or above median PSS score as the outcome</w:t>
-      </w:r>
-      <w:r>
-        <w:t>.</w:t>
-      </w:r>
-      <w:commentRangeEnd w:id="172"/>
-      <w:r>
-        <w:rPr>
-          <w:rStyle w:val="CommentReference"/>
-        </w:rPr>
-        <w:commentReference w:id="172"/>
-      </w:r>
-      <w:r>
-        <w:t xml:space="preserve">  </w:t>
-      </w:r>
-      <w:r>
-        <w:t xml:space="preserve"> </w:t>
-      </w:r>
-      <w:r>
-        <w:t xml:space="preserve">Multivariate analyses were performed by </w:t>
-      </w:r>
-      <w:commentRangeStart w:id="173"/>
-      <w:r>
-        <w:t>stepwise addition of covariates</w:t>
-      </w:r>
-      <w:commentRangeEnd w:id="173"/>
-      <w:r>
-        <w:rPr>
-          <w:rStyle w:val="CommentReference"/>
-        </w:rPr>
-        <w:commentReference w:id="173"/>
-      </w:r>
-      <w:r>
-        <w:t xml:space="preserve">.  Sensitivity analyses were performed using BMI and PSS scores as </w:t>
-      </w:r>
-      <w:del w:id="174" w:author="Bauer, Kate" w:date="2024-08-28T14:42:00Z">
-        <w:r>
-          <w:delText xml:space="preserve">a </w:delText>
-        </w:r>
-      </w:del>
-      <w:r>
-        <w:t>continuous variable</w:t>
-      </w:r>
-      <w:ins w:id="175" w:author="Bauer, Kate" w:date="2024-08-28T14:42:00Z">
-        <w:r>
-          <w:t>s</w:t>
-        </w:r>
-      </w:ins>
-      <w:r>
-        <w:t xml:space="preserve">, </w:t>
-      </w:r>
-      <w:commentRangeStart w:id="176"/>
-      <w:r>
-        <w:t xml:space="preserve">and with PSS scores as a continuous variable.  </w:t>
-      </w:r>
-      <w:commentRangeEnd w:id="176"/>
-      <w:r>
-        <w:rPr>
-          <w:rStyle w:val="CommentReference"/>
-        </w:rPr>
-        <w:commentReference w:id="176"/>
-      </w:r>
-      <w:r>
-        <w:t xml:space="preserve">We also did subgroup analyses within </w:t>
-      </w:r>
-      <w:commentRangeStart w:id="177"/>
-      <w:r>
-        <w:t xml:space="preserve">each demographic group </w:t>
-      </w:r>
-      <w:commentRangeEnd w:id="177"/>
-      <w:r>
-        <w:rPr>
-          <w:rStyle w:val="CommentReference"/>
-        </w:rPr>
-        <w:commentReference w:id="177"/>
-      </w:r>
-      <w:r>
-        <w:t xml:space="preserve">testing for effect modification of the obesity-stress relationship on </w:t>
-      </w:r>
-      <w:commentRangeStart w:id="178"/>
-      <w:r>
-        <w:t xml:space="preserve">diabetes incidence.  </w:t>
-      </w:r>
-      <w:commentRangeEnd w:id="178"/>
-      <w:r>
-        <w:rPr>
-          <w:rStyle w:val="CommentReference"/>
-        </w:rPr>
-        <w:commentReference w:id="178"/>
-      </w:r>
-    </w:p>
-    <w:p/>
-    <w:p>
-      <w:pPr>
-        <w:pStyle w:val="Heading1"/>
-      </w:pPr>
-      <w:r>
-        <w:t>Results</w:t>
-      </w:r>
-    </w:p>
-    <w:p/>
-    <w:p>
-      <w:pPr>
-        <w:pStyle w:val="Heading2"/>
-      </w:pPr>
-      <w:r>
-        <w:t>Self-Reported Perceived Stress is Associated with Type 2 Diabetes</w:t>
-      </w:r>
-    </w:p>
-    <w:p/>
-    <w:p>
-      <w:pPr>
-        <w:rPr>
-          <w:ins w:id="179" w:author="Bauer, Kate" w:date="2024-08-28T14:47:00Z"/>
-        </w:rPr>
-      </w:pPr>
-      <w:r>
-        <w:t xml:space="preserve">Among the participants in this study, </w:t>
-      </w:r>
-      <w:r>
-        <w:t xml:space="preserve">the median age was </w:t>
-      </w:r>
-      <w:r>
-        <w:t>53</w:t>
-      </w:r>
-      <w:r>
-        <w:t xml:space="preserve"> </w:t>
-      </w:r>
-      <w:r>
-        <w:t>years</w:t>
-      </w:r>
-      <w:r>
-        <w:t xml:space="preserve">, </w:t>
-      </w:r>
-      <w:r>
-        <w:t xml:space="preserve">with </w:t>
-      </w:r>
-      <w:r>
-        <w:t>5</w:t>
-      </w:r>
-      <w:r>
-        <w:t>3</w:t>
-      </w:r>
-      <w:r>
-        <w:t>% identifying as female and with a</w:t>
-      </w:r>
-      <w:r>
-        <w:t xml:space="preserve"> mean </w:t>
-      </w:r>
-      <w:r>
-        <w:t xml:space="preserve">BMI of </w:t>
-      </w:r>
-      <w:r>
-        <w:t>30</w:t>
-      </w:r>
-      <w:r>
-        <w:t xml:space="preserve"> kg/m</w:t>
-      </w:r>
-      <w:r>
-        <w:rPr>
-          <w:vertAlign w:val="superscript"/>
-        </w:rPr>
-        <w:t>2</w:t>
-      </w:r>
-      <w:r>
-        <w:t xml:space="preserve">.  The </w:t>
-      </w:r>
-      <w:r>
-        <w:t xml:space="preserve">study </w:t>
-      </w:r>
-      <w:r>
-        <w:t xml:space="preserve">population </w:t>
-      </w:r>
-      <w:commentRangeStart w:id="180"/>
-      <w:r>
-        <w:t>disproportionately</w:t>
-      </w:r>
-      <w:commentRangeEnd w:id="180"/>
-      <w:r>
-        <w:rPr>
-          <w:rStyle w:val="CommentReference"/>
-        </w:rPr>
-        <w:commentReference w:id="180"/>
-      </w:r>
-      <w:r>
-        <w:t xml:space="preserve"> identified as White (</w:t>
-      </w:r>
-      <w:r>
-        <w:t xml:space="preserve">89%; </w:t>
-      </w:r>
-      <w:r>
-        <w:t xml:space="preserve">Table 1).  </w:t>
-      </w:r>
-      <w:r>
-        <w:t xml:space="preserve">15% of </w:t>
-      </w:r>
-      <w:r>
-        <w:t xml:space="preserve">the participants </w:t>
-      </w:r>
-      <w:r>
-        <w:t>w</w:t>
-      </w:r>
-      <w:r>
-        <w:t>ere</w:t>
-      </w:r>
-      <w:r>
-        <w:t xml:space="preserve"> diagnosed with type 2 diabetes</w:t>
-      </w:r>
-      <w:del w:id="181" w:author="Bauer, Kate" w:date="2024-08-28T14:47:00Z">
-        <w:r>
-          <w:delText xml:space="preserve">. </w:delText>
-        </w:r>
-        <w:r>
-          <w:delText>We stratified this population as low or high</w:delText>
-        </w:r>
-        <w:r>
-          <w:delText xml:space="preserve"> perceived</w:delText>
-        </w:r>
-        <w:r>
-          <w:delText xml:space="preserve"> stress based on </w:delText>
-        </w:r>
-        <w:r>
-          <w:delText>their PSS score at enrollment.</w:delText>
-        </w:r>
-      </w:del>
-      <w:ins w:id="182" w:author="Bauer, Kate" w:date="2024-08-28T14:47:00Z">
-        <w:r>
-          <w:t>.</w:t>
-        </w:r>
-      </w:ins>
-    </w:p>
-    <w:p>
-      <w:pPr>
-        <w:rPr>
-          <w:ins w:id="183" w:author="Bauer, Kate" w:date="2024-08-28T14:47:00Z"/>
-        </w:rPr>
-      </w:pPr>
-    </w:p>
-    <w:p>
-      <w:del w:id="184" w:author="Bauer, Kate" w:date="2024-08-28T14:47:00Z">
-        <w:r>
-          <w:lastRenderedPageBreak/>
-          <w:delText xml:space="preserve">  </w:delText>
-        </w:r>
-      </w:del>
-      <w:r>
-        <w:t xml:space="preserve">As shown in Table 1, several demographic factors were significantly different between participants </w:t>
-      </w:r>
-      <w:commentRangeStart w:id="185"/>
-      <w:r>
-        <w:t xml:space="preserve">with high PSS scores </w:t>
-      </w:r>
-      <w:commentRangeEnd w:id="185"/>
-      <w:r>
-        <w:rPr>
-          <w:rStyle w:val="CommentReference"/>
-        </w:rPr>
-        <w:commentReference w:id="185"/>
-      </w:r>
-      <w:r>
-        <w:t xml:space="preserve">including race (higher in Black and Hispanic or Latino participants), </w:t>
-      </w:r>
-      <w:r>
-        <w:t>fe</w:t>
-      </w:r>
-      <w:r>
-        <w:t>male gender (</w:t>
-      </w:r>
-      <w:r>
-        <w:t xml:space="preserve">5% </w:t>
-      </w:r>
-      <w:r>
-        <w:t>higher than male</w:t>
-      </w:r>
-      <w:r>
-        <w:t xml:space="preserve">), younger age (particularly under 60 years old), and the </w:t>
-      </w:r>
-      <w:r>
-        <w:t>higher</w:t>
-      </w:r>
-      <w:r>
-        <w:t xml:space="preserve"> </w:t>
-      </w:r>
-      <w:r>
-        <w:t xml:space="preserve">neighborhood </w:t>
-      </w:r>
-      <w:r>
-        <w:t>disadvantage</w:t>
-      </w:r>
-      <w:r>
-        <w:t xml:space="preserve"> </w:t>
-      </w:r>
-      <w:r>
-        <w:t>scores.</w:t>
-      </w:r>
-      <w:r>
-        <w:t xml:space="preserve">  Body mass indices above 25 and below 18.5 (underweight) were </w:t>
-      </w:r>
-      <w:r>
-        <w:t xml:space="preserve">both </w:t>
-      </w:r>
-      <w:r>
-        <w:t>positively associated with a higher likelihood of perceived stress.</w:t>
-      </w:r>
-      <w:r>
-        <w:t xml:space="preserve">  </w:t>
-      </w:r>
-      <w:r>
-        <w:t>Among</w:t>
-      </w:r>
-      <w:r>
-        <w:t xml:space="preserve"> participants with type 2 diabetes, there </w:t>
-      </w:r>
-      <w:r>
-        <w:t>were more participants reporting</w:t>
-      </w:r>
-      <w:r>
-        <w:t xml:space="preserve"> </w:t>
-      </w:r>
-      <w:r>
-        <w:t xml:space="preserve">above </w:t>
-      </w:r>
-      <w:commentRangeStart w:id="186"/>
-      <w:r>
-        <w:t>average</w:t>
-      </w:r>
-      <w:r>
-        <w:t xml:space="preserve"> rates (47%) </w:t>
-      </w:r>
-      <w:commentRangeEnd w:id="186"/>
-      <w:r>
-        <w:rPr>
-          <w:rStyle w:val="CommentReference"/>
-        </w:rPr>
-        <w:commentReference w:id="186"/>
-      </w:r>
-      <w:r>
-        <w:t>compared to those without</w:t>
-      </w:r>
-      <w:r>
-        <w:t xml:space="preserve"> type 2 diabetes</w:t>
-      </w:r>
-      <w:r>
-        <w:t xml:space="preserve"> (41%</w:t>
-      </w:r>
-      <w:r>
-        <w:t>, p</w:t>
-      </w:r>
-      <w:r>
-        <w:t xml:space="preserve"> = </w:t>
-      </w:r>
-      <w:commentRangeStart w:id="187"/>
-      <w:r>
-        <w:t>6</w:t>
-      </w:r>
-      <w:r>
-        <w:t xml:space="preserve"> x 10</w:t>
-      </w:r>
-      <w:r>
-        <w:rPr>
-          <w:vertAlign w:val="superscript"/>
-        </w:rPr>
-        <w:t>-18</w:t>
-      </w:r>
-      <w:commentRangeEnd w:id="187"/>
-      <w:r>
-        <w:rPr>
-          <w:rStyle w:val="CommentReference"/>
-        </w:rPr>
-        <w:commentReference w:id="187"/>
-      </w:r>
-      <w:r>
-        <w:t>).</w:t>
-      </w:r>
-    </w:p>
-    <w:p/>
-    <w:p>
-      <w:pPr>
-        <w:pStyle w:val="Heading2"/>
-      </w:pPr>
-      <w:r>
-        <w:t xml:space="preserve">Perceived Stress Is </w:t>
-      </w:r>
-      <w:r>
-        <w:t xml:space="preserve">More Strongly </w:t>
-      </w:r>
-      <w:r>
-        <w:t>Associated with Type 2 Diabetes in</w:t>
-      </w:r>
-      <w:r>
-        <w:t xml:space="preserve"> Participants with</w:t>
-      </w:r>
-      <w:r>
-        <w:t xml:space="preserve"> Obes</w:t>
-      </w:r>
-      <w:r>
-        <w:t>ity</w:t>
-      </w:r>
-    </w:p>
-    <w:p/>
-    <w:p>
-      <w:r>
-        <w:t>We next evaluated how obesity modified the stress-diabetes relationship in these participants.</w:t>
-      </w:r>
-      <w:r>
-        <w:t xml:space="preserve">  </w:t>
-      </w:r>
-      <w:commentRangeStart w:id="188"/>
-      <w:r>
-        <w:t>We stratified participants into those with a BMI above or below 30 kg/m</w:t>
-      </w:r>
-      <w:r>
-        <w:rPr>
-          <w:vertAlign w:val="superscript"/>
-        </w:rPr>
-        <w:t>2</w:t>
-      </w:r>
-      <w:r>
-        <w:t xml:space="preserve"> and with above or below median stress.  </w:t>
-      </w:r>
-      <w:commentRangeEnd w:id="188"/>
-      <w:r>
-        <w:rPr>
-          <w:rStyle w:val="CommentReference"/>
-        </w:rPr>
-        <w:commentReference w:id="188"/>
-      </w:r>
-      <w:r>
-        <w:t xml:space="preserve">As expected, participants with obesity had higher type 2 diabetes prevalence than those with a BMI under 30 (unadjusted odds ratio 3.1 +/- 1.0).  </w:t>
-      </w:r>
-      <w:r>
-        <w:t xml:space="preserve">While diabetes rates were higher in male participants </w:t>
-      </w:r>
-      <w:del w:id="189" w:author="Bauer, Kate" w:date="2024-08-28T14:51:00Z">
-        <w:r>
-          <w:delText xml:space="preserve">with </w:delText>
-        </w:r>
-      </w:del>
-      <w:r>
-        <w:t>than female</w:t>
-      </w:r>
-      <w:ins w:id="190" w:author="Bauer, Kate" w:date="2024-08-28T14:51:00Z">
-        <w:r>
-          <w:t xml:space="preserve"> participants</w:t>
-        </w:r>
-      </w:ins>
-      <w:del w:id="191" w:author="Bauer, Kate" w:date="2024-08-28T14:51:00Z">
-        <w:r>
-          <w:delText>s</w:delText>
-        </w:r>
-      </w:del>
-      <w:r>
-        <w:t xml:space="preserve"> (11.6% vs 6.8% among participants without obesity; 26.9% vs 22.1% in participants with obesity), </w:t>
-      </w:r>
-      <w:commentRangeStart w:id="192"/>
-      <w:r>
-        <w:t xml:space="preserve">the </w:t>
-      </w:r>
-      <w:commentRangeStart w:id="193"/>
-      <w:r>
-        <w:t xml:space="preserve">effect of </w:t>
-      </w:r>
-      <w:commentRangeEnd w:id="193"/>
-      <w:r>
-        <w:rPr>
-          <w:rStyle w:val="CommentReference"/>
-        </w:rPr>
-        <w:commentReference w:id="193"/>
-      </w:r>
-      <w:r>
-        <w:t xml:space="preserve">obesity was somewhat attenuated in male participants (Obesity effect was 38% reduced in male participants </w:t>
-      </w:r>
-      <w:proofErr w:type="spellStart"/>
-      <w:r>
-        <w:t>p</w:t>
-      </w:r>
-      <w:r>
-        <w:rPr>
-          <w:vertAlign w:val="subscript"/>
-        </w:rPr>
-        <w:t>gender</w:t>
-      </w:r>
-      <w:proofErr w:type="spellEnd"/>
-      <w:r>
-        <w:rPr>
-          <w:vertAlign w:val="subscript"/>
-        </w:rPr>
-        <w:t xml:space="preserve"> x obesity</w:t>
-      </w:r>
-      <w:r>
-        <w:t>=4.5 x 10</w:t>
-      </w:r>
-      <w:r>
-        <w:rPr>
-          <w:vertAlign w:val="superscript"/>
-        </w:rPr>
-        <w:t>-8</w:t>
-      </w:r>
-      <w:r>
-        <w:t>).</w:t>
-      </w:r>
-      <w:commentRangeEnd w:id="192"/>
-      <w:r>
-        <w:rPr>
-          <w:rStyle w:val="CommentReference"/>
-        </w:rPr>
-        <w:commentReference w:id="192"/>
-      </w:r>
-      <w:r>
-        <w:t xml:space="preserve">  </w:t>
-      </w:r>
-      <w:r>
-        <w:t xml:space="preserve">As Figure </w:t>
-      </w:r>
-      <w:r>
-        <w:t>2</w:t>
-      </w:r>
-      <w:r>
-        <w:t>A</w:t>
-      </w:r>
-      <w:r>
-        <w:t xml:space="preserve"> shows, there </w:t>
-      </w:r>
-      <w:r>
-        <w:t>was</w:t>
-      </w:r>
-      <w:r>
-        <w:t xml:space="preserve"> a significant elevation in diabetes prevalence </w:t>
-      </w:r>
-      <w:r>
-        <w:t xml:space="preserve">for </w:t>
-      </w:r>
-      <w:r>
-        <w:t>participants with obesity</w:t>
-      </w:r>
-      <w:r>
-        <w:t xml:space="preserve"> who reported elevated perceived stress</w:t>
-      </w:r>
-      <w:r>
-        <w:t xml:space="preserve"> (26.8%) relative to </w:t>
-      </w:r>
-      <w:r>
-        <w:t xml:space="preserve">those reporting </w:t>
-      </w:r>
-      <w:r>
-        <w:t>low stress (22.2%)</w:t>
-      </w:r>
-      <w:r>
-        <w:t xml:space="preserve">.  </w:t>
-      </w:r>
-      <w:r>
-        <w:t>Perceived stress was associated with 1</w:t>
-      </w:r>
-      <w:r>
-        <w:t>4</w:t>
-      </w:r>
-      <w:r>
-        <w:t>% increased diabetes prevalence in participants without obesity (p=0.005</w:t>
-      </w:r>
-      <w:del w:id="194" w:author="Bauer, Kate" w:date="2024-08-28T14:54:00Z">
-        <w:r>
-          <w:delText>3</w:delText>
-        </w:r>
-      </w:del>
-      <w:r>
-        <w:t xml:space="preserve">) but was increased </w:t>
-      </w:r>
-      <w:r>
-        <w:t>by</w:t>
-      </w:r>
-      <w:r>
-        <w:t xml:space="preserve"> 27% in participants with obesity (p=</w:t>
-      </w:r>
-      <w:r>
-        <w:t>2.2 x 10</w:t>
-      </w:r>
-      <w:r>
-        <w:rPr>
-          <w:vertAlign w:val="superscript"/>
-        </w:rPr>
-        <w:t>-11</w:t>
-      </w:r>
-      <w:r>
-        <w:t xml:space="preserve">).  This represented a synergistic interaction between obesity and perceived stress on diabetes </w:t>
-      </w:r>
-      <w:r>
-        <w:t>prevalence</w:t>
-      </w:r>
-      <w:r>
-        <w:t xml:space="preserve"> (</w:t>
-      </w:r>
-      <w:commentRangeStart w:id="195"/>
-      <w:r>
-        <w:t xml:space="preserve">12% </w:t>
-      </w:r>
-      <w:commentRangeEnd w:id="195"/>
-      <w:r>
-        <w:rPr>
-          <w:rStyle w:val="CommentReference"/>
-        </w:rPr>
-        <w:commentReference w:id="195"/>
-      </w:r>
-      <w:commentRangeStart w:id="196"/>
-      <w:r>
-        <w:t>increase, p=0.</w:t>
-      </w:r>
-      <w:del w:id="197" w:author="Bauer, Kate" w:date="2024-08-28T14:54:00Z">
-        <w:r>
-          <w:delText>056</w:delText>
-        </w:r>
-      </w:del>
-      <w:ins w:id="198" w:author="Bauer, Kate" w:date="2024-08-28T14:54:00Z">
-        <w:r>
-          <w:t>06</w:t>
-        </w:r>
-      </w:ins>
-      <w:commentRangeEnd w:id="196"/>
-      <w:ins w:id="199" w:author="Bauer, Kate" w:date="2024-08-28T14:55:00Z">
+        <w:r>
+          <w:t xml:space="preserve">associated with </w:t>
+        </w:r>
+      </w:ins>
+      <w:del w:id="217" w:author="Dave Bridges" w:date="2024-08-28T17:40:00Z">
+        <w:r>
+          <w:delText xml:space="preserve">of </w:delText>
+        </w:r>
+        <w:commentRangeEnd w:id="214"/>
         <w:r>
           <w:rPr>
             <w:rStyle w:val="CommentReference"/>
           </w:rPr>
-          <w:commentReference w:id="196"/>
+          <w:commentReference w:id="214"/>
+        </w:r>
+      </w:del>
+      <w:r>
+        <w:t xml:space="preserve">obesity was somewhat attenuated in male participants (Obesity effect was 38% reduced in male participants </w:t>
+      </w:r>
+      <w:proofErr w:type="spellStart"/>
+      <w:r>
+        <w:t>p</w:t>
+      </w:r>
+      <w:r>
+        <w:rPr>
+          <w:vertAlign w:val="subscript"/>
+        </w:rPr>
+        <w:t>gender</w:t>
+      </w:r>
+      <w:proofErr w:type="spellEnd"/>
+      <w:r>
+        <w:rPr>
+          <w:vertAlign w:val="subscript"/>
+        </w:rPr>
+        <w:t xml:space="preserve"> x obesity</w:t>
+      </w:r>
+      <w:r>
+        <w:t>=4.5 x 10</w:t>
+      </w:r>
+      <w:r>
+        <w:rPr>
+          <w:vertAlign w:val="superscript"/>
+        </w:rPr>
+        <w:t>-8</w:t>
+      </w:r>
+      <w:r>
+        <w:t>).</w:t>
+      </w:r>
+      <w:commentRangeEnd w:id="213"/>
+      <w:r>
+        <w:rPr>
+          <w:rStyle w:val="CommentReference"/>
+        </w:rPr>
+        <w:commentReference w:id="213"/>
+      </w:r>
+      <w:r>
+        <w:t xml:space="preserve">  </w:t>
+      </w:r>
+      <w:r>
+        <w:t xml:space="preserve">As Figure </w:t>
+      </w:r>
+      <w:r>
+        <w:t>2</w:t>
+      </w:r>
+      <w:r>
+        <w:t>A</w:t>
+      </w:r>
+      <w:r>
+        <w:t xml:space="preserve"> shows, there </w:t>
+      </w:r>
+      <w:r>
+        <w:t>was</w:t>
+      </w:r>
+      <w:r>
+        <w:t xml:space="preserve"> a significant elevation in diabetes prevalence </w:t>
+      </w:r>
+      <w:r>
+        <w:t xml:space="preserve">for </w:t>
+      </w:r>
+      <w:r>
+        <w:t>participants with obesity</w:t>
+      </w:r>
+      <w:r>
+        <w:t xml:space="preserve"> who reported elevated perceived stress</w:t>
+      </w:r>
+      <w:r>
+        <w:t xml:space="preserve"> (26.8%) relative to </w:t>
+      </w:r>
+      <w:r>
+        <w:t xml:space="preserve">those reporting </w:t>
+      </w:r>
+      <w:r>
+        <w:t>low stress (22.2%)</w:t>
+      </w:r>
+      <w:r>
+        <w:t xml:space="preserve">.  </w:t>
+      </w:r>
+      <w:r>
+        <w:t>Perceived stress was associated with 1</w:t>
+      </w:r>
+      <w:r>
+        <w:t>4</w:t>
+      </w:r>
+      <w:r>
+        <w:t>% increased diabetes prevalence in participants without obesity (p=0.005</w:t>
+      </w:r>
+      <w:del w:id="218" w:author="Bauer, Kate" w:date="2024-08-28T14:54:00Z">
+        <w:r>
+          <w:delText>3</w:delText>
+        </w:r>
+      </w:del>
+      <w:r>
+        <w:t xml:space="preserve">) but was increased </w:t>
+      </w:r>
+      <w:r>
+        <w:t>by</w:t>
+      </w:r>
+      <w:r>
+        <w:t xml:space="preserve"> 27% in participants with obesity (p=</w:t>
+      </w:r>
+      <w:r>
+        <w:t>2.2 x 10</w:t>
+      </w:r>
+      <w:r>
+        <w:rPr>
+          <w:vertAlign w:val="superscript"/>
+        </w:rPr>
+        <w:t>-11</w:t>
+      </w:r>
+      <w:r>
+        <w:t xml:space="preserve">).  This represented a synergistic interaction between obesity and perceived stress on diabetes </w:t>
+      </w:r>
+      <w:r>
+        <w:t>prevalence</w:t>
+      </w:r>
+      <w:r>
+        <w:t xml:space="preserve"> (</w:t>
+      </w:r>
+      <w:commentRangeStart w:id="219"/>
+      <w:r>
+        <w:t xml:space="preserve">12% </w:t>
+      </w:r>
+      <w:commentRangeEnd w:id="219"/>
+      <w:r>
+        <w:rPr>
+          <w:rStyle w:val="CommentReference"/>
+        </w:rPr>
+        <w:commentReference w:id="219"/>
+      </w:r>
+      <w:commentRangeStart w:id="220"/>
+      <w:r>
+        <w:t>increase, p=0.</w:t>
+      </w:r>
+      <w:del w:id="221" w:author="Bauer, Kate" w:date="2024-08-28T14:54:00Z">
+        <w:r>
+          <w:delText>056</w:delText>
+        </w:r>
+      </w:del>
+      <w:ins w:id="222" w:author="Bauer, Kate" w:date="2024-08-28T14:54:00Z">
+        <w:r>
+          <w:t>06</w:t>
+        </w:r>
+      </w:ins>
+      <w:commentRangeEnd w:id="220"/>
+      <w:ins w:id="223" w:author="Bauer, Kate" w:date="2024-08-28T14:55:00Z">
+        <w:r>
+          <w:rPr>
+            <w:rStyle w:val="CommentReference"/>
+          </w:rPr>
+          <w:commentReference w:id="220"/>
         </w:r>
       </w:ins>
       <w:r>
@@ -2853,7 +3007,7 @@
       <w:r>
         <w:t xml:space="preserve">  We stepwise added potential confounders including age, gender (and modification of the gender by gender of the obesity-diabetes relationship), race/ethnicity and neighborhood disadvantage</w:t>
       </w:r>
-      <w:del w:id="200" w:author="Bauer, Kate" w:date="2024-08-28T14:55:00Z">
+      <w:del w:id="224" w:author="Bauer, Kate" w:date="2024-08-28T14:55:00Z">
         <w:r>
           <w:delText xml:space="preserve"> (as a proxy for socioeconomic status)</w:delText>
         </w:r>
@@ -2880,7 +3034,33 @@
         <w:t>on</w:t>
       </w:r>
       <w:r>
-        <w:t xml:space="preserve"> type 2 diabetes </w:t>
+        <w:t xml:space="preserve"> </w:t>
+      </w:r>
+      <w:ins w:id="225" w:author="Dave Bridges" w:date="2024-08-28T17:42:00Z">
+        <w:r>
+          <w:t>T</w:t>
+        </w:r>
+      </w:ins>
+      <w:del w:id="226" w:author="Dave Bridges" w:date="2024-08-28T17:42:00Z">
+        <w:r>
+          <w:delText>t</w:delText>
+        </w:r>
+      </w:del>
+      <w:r>
+        <w:t xml:space="preserve">ype 2 </w:t>
+      </w:r>
+      <w:ins w:id="227" w:author="Dave Bridges" w:date="2024-08-28T17:42:00Z">
+        <w:r>
+          <w:t>D</w:t>
+        </w:r>
+      </w:ins>
+      <w:del w:id="228" w:author="Dave Bridges" w:date="2024-08-28T17:42:00Z">
+        <w:r>
+          <w:delText>d</w:delText>
+        </w:r>
+      </w:del>
+      <w:r>
+        <w:t xml:space="preserve">iabetes </w:t>
       </w:r>
       <w:r>
         <w:t>prevalence</w:t>
@@ -2927,16 +3107,24 @@
       <w:r>
         <w:t xml:space="preserve"> whether the interaction between obesity and perceived stress was consistent across demographic categories.  We found that the interaction was stronger in males (</w:t>
       </w:r>
-      <w:commentRangeStart w:id="201"/>
+      <w:commentRangeStart w:id="229"/>
+      <w:commentRangeStart w:id="230"/>
       <w:r>
         <w:t xml:space="preserve">21%) </w:t>
       </w:r>
-      <w:commentRangeEnd w:id="201"/>
-      <w:r>
-        <w:rPr>
-          <w:rStyle w:val="CommentReference"/>
-        </w:rPr>
-        <w:commentReference w:id="201"/>
+      <w:commentRangeEnd w:id="229"/>
+      <w:r>
+        <w:rPr>
+          <w:rStyle w:val="CommentReference"/>
+        </w:rPr>
+        <w:commentReference w:id="229"/>
+      </w:r>
+      <w:commentRangeEnd w:id="230"/>
+      <w:r>
+        <w:rPr>
+          <w:rStyle w:val="CommentReference"/>
+        </w:rPr>
+        <w:commentReference w:id="230"/>
       </w:r>
       <w:r>
         <w:t xml:space="preserve">than females (0.3%), and stronger in Asian (49%) and Black (19%) participants than White (13%) or Hispanic/Latino (-45%) participants, though neither stress x obesity x gender </w:t>
@@ -2951,6 +3139,7 @@
         <w:t xml:space="preserve">We also found that in the </w:t>
       </w:r>
       <w:r>
+        <w:lastRenderedPageBreak/>
         <w:t>group with the highest neighborhood disadvantage</w:t>
       </w:r>
       <w:r>
@@ -2998,9 +3187,9 @@
       <w:r>
         <w:t xml:space="preserve"> </w:t>
       </w:r>
-      <w:commentRangeStart w:id="202"/>
-      <w:r>
-        <w:lastRenderedPageBreak/>
+      <w:commentRangeStart w:id="231"/>
+      <w:commentRangeStart w:id="232"/>
+      <w:r>
         <w:t>We next tested whether participants with obesity reporting elevated stress were more obese</w:t>
       </w:r>
       <w:r>
@@ -3065,12 +3254,19 @@
       <w:r>
         <w:t>.</w:t>
       </w:r>
-      <w:commentRangeEnd w:id="202"/>
-      <w:r>
-        <w:rPr>
-          <w:rStyle w:val="CommentReference"/>
-        </w:rPr>
-        <w:commentReference w:id="202"/>
+      <w:commentRangeEnd w:id="231"/>
+      <w:r>
+        <w:rPr>
+          <w:rStyle w:val="CommentReference"/>
+        </w:rPr>
+        <w:commentReference w:id="231"/>
+      </w:r>
+      <w:commentRangeEnd w:id="232"/>
+      <w:r>
+        <w:rPr>
+          <w:rStyle w:val="CommentReference"/>
+        </w:rPr>
+        <w:commentReference w:id="232"/>
       </w:r>
     </w:p>
     <w:p>
@@ -3091,49 +3287,155 @@
       <w:r>
         <w:t xml:space="preserve"> Modify the Prevalence of Other </w:t>
       </w:r>
-      <w:commentRangeStart w:id="203"/>
+      <w:commentRangeStart w:id="233"/>
+      <w:commentRangeStart w:id="234"/>
       <w:r>
         <w:t>Obesity-Related Co-Morbidities</w:t>
       </w:r>
-      <w:commentRangeEnd w:id="203"/>
+      <w:commentRangeEnd w:id="233"/>
       <w:r>
         <w:rPr>
           <w:rStyle w:val="CommentReference"/>
           <w:rFonts w:asciiTheme="minorHAnsi" w:eastAsiaTheme="minorHAnsi" w:hAnsiTheme="minorHAnsi" w:cstheme="minorBidi"/>
           <w:color w:val="auto"/>
         </w:rPr>
-        <w:commentReference w:id="203"/>
+        <w:commentReference w:id="233"/>
+      </w:r>
+      <w:commentRangeEnd w:id="234"/>
+      <w:r>
+        <w:rPr>
+          <w:rStyle w:val="CommentReference"/>
+          <w:rFonts w:asciiTheme="minorHAnsi" w:eastAsiaTheme="minorHAnsi" w:hAnsiTheme="minorHAnsi" w:cstheme="minorBidi"/>
+          <w:color w:val="auto"/>
+        </w:rPr>
+        <w:commentReference w:id="234"/>
       </w:r>
     </w:p>
     <w:p/>
     <w:p>
-      <w:commentRangeStart w:id="204"/>
-      <w:r>
-        <w:t xml:space="preserve">Given the enhancement of obesity-associated diabetes prevalence in these participants, we then evaluated several other obesity and stress-linked chronic diseases using the same approach.  </w:t>
-      </w:r>
-      <w:commentRangeEnd w:id="204"/>
-      <w:r>
-        <w:rPr>
-          <w:rStyle w:val="CommentReference"/>
-        </w:rPr>
-        <w:commentReference w:id="204"/>
+      <w:ins w:id="235" w:author="Dave Bridges" w:date="2024-08-28T17:42:00Z">
+        <w:r>
+          <w:t>Sev</w:t>
+        </w:r>
+      </w:ins>
+      <w:ins w:id="236" w:author="Dave Bridges" w:date="2024-08-28T17:43:00Z">
+        <w:r>
+          <w:t xml:space="preserve">eral other chronic diseases including cardiac arrhythmias, chronic pulmonary disease, congestive heart </w:t>
+        </w:r>
+        <w:proofErr w:type="spellStart"/>
+        <w:r>
+          <w:t>ailure</w:t>
+        </w:r>
+        <w:proofErr w:type="spellEnd"/>
+        <w:r>
+          <w:t>, and liver dis</w:t>
+        </w:r>
+      </w:ins>
+      <w:ins w:id="237" w:author="Dave Bridges" w:date="2024-08-28T17:47:00Z">
+        <w:r>
+          <w:t>e</w:t>
+        </w:r>
+      </w:ins>
+      <w:ins w:id="238" w:author="Dave Bridges" w:date="2024-08-28T17:43:00Z">
+        <w:r>
+          <w:t>ase have been previously</w:t>
+        </w:r>
+      </w:ins>
+      <w:ins w:id="239" w:author="Dave Bridges" w:date="2024-08-28T17:47:00Z">
+        <w:r>
+          <w:t xml:space="preserve"> reported.  </w:t>
+        </w:r>
+      </w:ins>
+      <w:commentRangeStart w:id="240"/>
+      <w:r>
+        <w:t xml:space="preserve">Given the enhancement of obesity-associated </w:t>
+      </w:r>
+      <w:ins w:id="241" w:author="Dave Bridges" w:date="2024-08-28T17:43:00Z">
+        <w:r>
+          <w:t>Type 2 D</w:t>
+        </w:r>
+      </w:ins>
+      <w:del w:id="242" w:author="Dave Bridges" w:date="2024-08-28T17:43:00Z">
+        <w:r>
+          <w:delText>d</w:delText>
+        </w:r>
+      </w:del>
+      <w:r>
+        <w:t xml:space="preserve">iabetes prevalence </w:t>
+      </w:r>
+      <w:ins w:id="243" w:author="Dave Bridges" w:date="2024-08-28T17:43:00Z">
+        <w:r>
+          <w:t>that we observed</w:t>
+        </w:r>
+      </w:ins>
+      <w:del w:id="244" w:author="Dave Bridges" w:date="2024-08-28T17:43:00Z">
+        <w:r>
+          <w:delText>in these participants</w:delText>
+        </w:r>
+      </w:del>
+      <w:r>
+        <w:t xml:space="preserve">, we </w:t>
+      </w:r>
+      <w:del w:id="245" w:author="Dave Bridges" w:date="2024-08-28T17:43:00Z">
+        <w:r>
+          <w:delText xml:space="preserve">then </w:delText>
+        </w:r>
+      </w:del>
+      <w:ins w:id="246" w:author="Dave Bridges" w:date="2024-08-28T17:43:00Z">
+        <w:r>
+          <w:t>next</w:t>
+        </w:r>
+        <w:r>
+          <w:t xml:space="preserve"> </w:t>
+        </w:r>
+      </w:ins>
+      <w:r>
+        <w:t>evaluated several other obesity and stress-linked chronic diseases using the same approach.</w:t>
+      </w:r>
+      <w:ins w:id="247" w:author="Dave Bridges" w:date="2024-08-28T17:48:00Z">
+        <w:r>
+          <w:t xml:space="preserve"> To define whether these associations are restricted to Type 2 </w:t>
+        </w:r>
+        <w:proofErr w:type="spellStart"/>
+        <w:r>
+          <w:t>Diabtes</w:t>
+        </w:r>
+        <w:proofErr w:type="spellEnd"/>
+        <w:r>
+          <w:t>, or more generally with other obesity-related chronic diseases</w:t>
+        </w:r>
+      </w:ins>
+      <w:r>
+        <w:t xml:space="preserve">  </w:t>
+      </w:r>
+      <w:commentRangeEnd w:id="240"/>
+      <w:r>
+        <w:rPr>
+          <w:rStyle w:val="CommentReference"/>
+        </w:rPr>
+        <w:commentReference w:id="240"/>
       </w:r>
       <w:r>
         <w:t xml:space="preserve">In </w:t>
       </w:r>
-      <w:commentRangeStart w:id="205"/>
-      <w:r>
-        <w:t xml:space="preserve">Table </w:t>
+      <w:commentRangeStart w:id="248"/>
+      <w:r>
+        <w:t>Tab</w:t>
+      </w:r>
+      <w:bookmarkStart w:id="249" w:name="_GoBack"/>
+      <w:bookmarkEnd w:id="249"/>
+      <w:r>
+        <w:t xml:space="preserve">le </w:t>
       </w:r>
       <w:r>
         <w:t xml:space="preserve">3 </w:t>
       </w:r>
-      <w:commentRangeEnd w:id="205"/>
-      <w:r>
-        <w:rPr>
-          <w:rStyle w:val="CommentReference"/>
-        </w:rPr>
-        <w:commentReference w:id="205"/>
+      <w:commentRangeEnd w:id="248"/>
+      <w:r>
+        <w:rPr>
+          <w:rStyle w:val="CommentReference"/>
+        </w:rPr>
+        <w:commentReference w:id="248"/>
       </w:r>
       <w:r>
         <w:t>we describe the raw and adjusted associations between obesity and stress on arrhythmia</w:t>
@@ -3353,9 +3655,13 @@
         <w:t xml:space="preserve"> </w:t>
       </w:r>
       <w:r>
-        <w:t xml:space="preserve">= 0.0026), consistent with higher rates of weight discrimination in </w:t>
-      </w:r>
-      <w:commentRangeStart w:id="206"/>
+        <w:t xml:space="preserve">= 0.0026), </w:t>
+      </w:r>
+      <w:r>
+        <w:lastRenderedPageBreak/>
+        <w:t xml:space="preserve">consistent with higher rates of weight discrimination in </w:t>
+      </w:r>
+      <w:commentRangeStart w:id="250"/>
       <w:r>
         <w:t xml:space="preserve">women </w:t>
       </w:r>
@@ -3380,12 +3686,12 @@
       <w:r>
         <w:t>.</w:t>
       </w:r>
-      <w:commentRangeEnd w:id="206"/>
-      <w:r>
-        <w:rPr>
-          <w:rStyle w:val="CommentReference"/>
-        </w:rPr>
-        <w:commentReference w:id="206"/>
+      <w:commentRangeEnd w:id="250"/>
+      <w:r>
+        <w:rPr>
+          <w:rStyle w:val="CommentReference"/>
+        </w:rPr>
+        <w:commentReference w:id="250"/>
       </w:r>
       <w:r>
         <w:t xml:space="preserve">  Interestingly though, when treated separately males had a stronger obesity-stress </w:t>
@@ -3421,244 +3727,241 @@
         <w:fldChar w:fldCharType="end"/>
       </w:r>
       <w:r>
-        <w:t xml:space="preserve">.  This could be due to either </w:t>
-      </w:r>
+        <w:t>.  This could be due to either different populations, or the differences between perceived stress and job-related stress and gender-specific effects.</w:t>
+      </w:r>
+    </w:p>
+    <w:p/>
+    <w:p>
+      <w:r>
+        <w:t xml:space="preserve">It is intriguing that the synergistic relationship between obesity and stress is most prominent in participants with type 2 diabetes, but is not evident for liver disease, chronic pulmonary disease or </w:t>
+      </w:r>
+      <w:r>
+        <w:t xml:space="preserve">congestive </w:t>
+      </w:r>
+      <w:r>
+        <w:t xml:space="preserve">heart failure.  Each of these had a substantial obesity-related </w:t>
+      </w:r>
+      <w:r>
+        <w:t>and/</w:t>
+      </w:r>
+      <w:r>
+        <w:t xml:space="preserve">or stress-related elevated </w:t>
+      </w:r>
+      <w:r>
+        <w:t>odds</w:t>
+      </w:r>
+      <w:r>
+        <w:t xml:space="preserve">, but in our population these factors appeared additive rather than synergistic.  </w:t>
+      </w:r>
+      <w:r>
+        <w:t>This work suggests that elevated perceived stress is associated with each of these, but is only enhanced by obesity in the context of type 2 diabetes.</w:t>
+      </w:r>
+    </w:p>
+    <w:p/>
+    <w:p>
+      <w:r>
+        <w:t>There are several limitations to this cross-sectional analysis, most notably whether elevated perceived stress was a cause or consequence of obesity-related diabetes associations</w:t>
+      </w:r>
+      <w:r>
+        <w:t>.  At this stage we think it is plausible that the distress related to chronic disease</w:t>
+      </w:r>
+      <w:r>
+        <w:t xml:space="preserve"> (either obesity or type 2 diabetes)</w:t>
+      </w:r>
+      <w:r>
+        <w:t xml:space="preserve"> could enhance perceived stress as a form of reverse causality.  We hypothesize that this is less likely, as it is only true for type 2 diabetes, but not other comorbidities tested.  It is also possible that the slightly elevated average BMI </w:t>
+      </w:r>
+      <w:r>
+        <w:t xml:space="preserve">in the participants with high PSS scores and obesity could imply that higher stress increases BMI, enhancing diabetes </w:t>
+      </w:r>
+      <w:r>
+        <w:t>prevalence</w:t>
+      </w:r>
+      <w:r>
+        <w:t>, consistent with the COBWEBS model</w:t>
+      </w:r>
+      <w:r>
+        <w:t xml:space="preserve"> wherein obesity-related stress enhances food intake and obesity, exacerbating weight-related metabolic disease </w:t>
+      </w:r>
+      <w:r>
+        <w:fldChar w:fldCharType="begin"/>
+      </w:r>
+      <w:r>
+        <w:instrText xml:space="preserve"> ADDIN ZOTERO_ITEM CSL_CITATION {"citationID":"gUypn5QT","properties":{"formattedCitation":"(17)","plainCitation":"(17)","noteIndex":0},"citationItems":[{"id":1482,"uris":["http://zotero.org/users/7317906/items/5I96XRCC"],"itemData":{"id":1482,"type":"article-journal","abstract":"Weight stigma is highly pervasive, but its consequences are understudied. This review draws from theory in social psychology, health psychology, and neuroendocrinology to construct an original, generative model called the cyclic obesity/weight-based stigma (COBWEBS) model. This model characterizes weight stigma as a \"vicious cycle\" - a positive feedback loop wherein weight stigma begets weight gain. This happens through increased eating behavior and increased cortisol secretion governed by behavioral, emotional, and physiological mechanisms, which are theorized to ultimately result in weight gain and difficulty of weight loss. The purpose of this review is to evaluate the existing literature for evidence supporting such a model, propose ways in which individuals enter, fight against, and exit the cycle, and conclude by outlining fruitful future directions in this nascent yet important area of research. © 2014 Elsevier Ltd.","container-title":"Appetite","DOI":"10.1016/j.appet.2014.06.108","ISSN":"10958304","note":"PMID: 24997407\npublisher: Elsevier Ltd\nCitation Key: Tomiyama2014a\nISBN: 1095-8304 (Electronic)\\r0195-6663 (Linking)","page":"8-15","title":"Weight stigma is stressful. A review of evidence for the cyclic Obesity/weight-based stigma model","volume":"82","author":[{"family":"Tomiyama","given":"A. Janet"}],"issued":{"date-parts":[["2014"]]},"citation-key":"Tomiyama2014a"}}],"schema":"https://github.com/citation-style-language/schema/raw/master/csl-citation.json"} </w:instrText>
+      </w:r>
+      <w:r>
+        <w:fldChar w:fldCharType="separate"/>
+      </w:r>
+      <w:r>
+        <w:rPr>
+          <w:noProof/>
+        </w:rPr>
+        <w:t>(17)</w:t>
+      </w:r>
+      <w:r>
+        <w:fldChar w:fldCharType="end"/>
+      </w:r>
+      <w:r>
+        <w:t xml:space="preserve">.  </w:t>
+      </w:r>
+      <w:r>
+        <w:t xml:space="preserve">In </w:t>
+      </w:r>
+      <w:r>
+        <w:t>terms of generalizability, the population in this study is a majority white, relatively affluent group of participants who have a relatively high age and number of co-morbidities, as is expected for a hospital-based cohort.</w:t>
+      </w:r>
+      <w:r>
+        <w:t xml:space="preserve">  Finally, we are limited by a single self-reported measure of perceived stress and the cross-sectional nature of this study.</w:t>
+      </w:r>
+    </w:p>
+    <w:p/>
+    <w:p>
+      <w:r>
+        <w:t xml:space="preserve">There are several important strengths to this work including a large sample size, consistent and validated measures of perceived stress and well documented disease and sociodemographic factors.  To our knowledge this is the first report </w:t>
+      </w:r>
+      <w:r>
+        <w:t>that</w:t>
+      </w:r>
+      <w:r>
+        <w:t xml:space="preserve"> perceived </w:t>
+      </w:r>
+      <w:r>
+        <w:t xml:space="preserve">psychosocial </w:t>
+      </w:r>
+      <w:r>
+        <w:t xml:space="preserve">stress </w:t>
+      </w:r>
+      <w:r>
+        <w:t>enhances</w:t>
+      </w:r>
+      <w:r>
+        <w:t xml:space="preserve"> obesity-related diabetes </w:t>
+      </w:r>
+      <w:r>
+        <w:t>prevalence</w:t>
+      </w:r>
+      <w:r>
+        <w:t xml:space="preserve">, and </w:t>
+      </w:r>
+      <w:r>
+        <w:t xml:space="preserve">is </w:t>
+      </w:r>
+      <w:r>
+        <w:t xml:space="preserve">consistent with the Whitehall II studies showing similar effects for job-related stress </w:t>
+      </w:r>
+      <w:r>
+        <w:fldChar w:fldCharType="begin"/>
+      </w:r>
+      <w:r>
+        <w:instrText xml:space="preserve"> ADDIN ZOTERO_ITEM CSL_CITATION {"citationID":"tmOtPEdO","properties":{"formattedCitation":"(9)","plainCitation":"(9)","noteIndex":0},"citationItems":[{"id":"fATidvy9/NEBiBgsN","uris":["http://zotero.org/users/2695081/items/3FLNIKRN"],"itemData":{"id":"9zI9GZ7V/BhbSUH95","type":"article-journal","abstract":"Psychosocial work stress has been linked to higher risk of type 2 diabetes (T2DM), with the effect being consistently higher among women than men. Also, work stress has been linked to prospective weight gain among obese men but weight loss among lean men. Here, we aimed to examine the interaction between work stress and obesity in relation to T2DM risk in a gender-specific manner. We studied 5,568 white middle-aged men and women in the Whitehall II study, who were free from diabetes at analysis baseline (1993). After 1993, diabetes was ascertained at six consecutive phases by an oral glucose tolerance test supplemented by self-reports. Cox regression analysis was used to assess the association between job strain (high job demands/low job control) and 18-year incident T2DM stratifying by BMI (BMI &lt;30 kg/m(2) vs. BMI ≥30 kg/m(2)). Overall, work stress was associated with incident T2DM among women (hazard ratio (HR) 1.41: 95% confidence intervals: 1.02; 1.95) but not among men (HR 0.87: 95% confidence interval 0.69; 1.11) (P(INTERACTION) = 0.017). Among men, work stress was associated with a lower risk of T2DM in nonobese (HR 0.70: 0.53; 0.93) but not in obese individuals (P(INTERACTION) = 0.17). Among women, work stress was associated with higher risk of T2DM in the obese (HR 2.01: 1.06; 3.92) but not in the nonobese (P(INTERACTION) = 0.005). Gender and body weight status play a critical role in determining the direction of the association between psychosocial stress and T2DM. The potential effect-modifying role of gender and obesity should not be ignored by future studies looking at stress-disease associations.","container-title":"Obesity (Silver Spring, Md.)","DOI":"10.1038/oby.2011.95","ISSN":"1930-739X","issue":"2","journalAbbreviation":"Obesity (Silver Spring)","language":"eng","note":"PMID: 21593804","page":"428-433","source":"PubMed","title":"Work stress, obesity and the risk of type 2 diabetes: gender-specific bidirectional effect in the Whitehall II study","title-short":"Work stress, obesity and the risk of type 2 diabetes","volume":"20","author":[{"family":"Heraclides","given":"Alexandros M."},{"family":"Chandola","given":"Tarani"},{"family":"Witte","given":"Daniel R."},{"family":"Brunner","given":"Eric J."}],"issued":{"date-parts":[["2012",2]]}}}],"schema":"https://github.com/citation-style-language/schema/raw/master/csl-citation.json"} </w:instrText>
+      </w:r>
+      <w:r>
+        <w:fldChar w:fldCharType="separate"/>
+      </w:r>
+      <w:r>
+        <w:rPr>
+          <w:noProof/>
+        </w:rPr>
+        <w:t>(9)</w:t>
+      </w:r>
+      <w:r>
+        <w:fldChar w:fldCharType="end"/>
+      </w:r>
+      <w:r>
+        <w:t xml:space="preserve">.  </w:t>
+      </w:r>
+      <w:r>
+        <w:t xml:space="preserve">This data is in alignment with our pre-clinical mouse studies that </w:t>
+      </w:r>
+      <w:r>
+        <w:t>demonstrate augmented</w:t>
+      </w:r>
+      <w:r>
+        <w:t xml:space="preserve"> </w:t>
+      </w:r>
+      <w:proofErr w:type="spellStart"/>
+      <w:r>
+        <w:t>dysglycemia</w:t>
+      </w:r>
+      <w:proofErr w:type="spellEnd"/>
+      <w:r>
+        <w:t xml:space="preserve"> in obese mice treated with glucocorticoids </w:t>
+      </w:r>
+      <w:r>
+        <w:fldChar w:fldCharType="begin"/>
+      </w:r>
+      <w:r>
+        <w:instrText xml:space="preserve"> ADDIN ZOTERO_ITEM CSL_CITATION {"citationID":"60pJs55V","properties":{"formattedCitation":"(4, 5)","plainCitation":"(4, 5)","noteIndex":0},"citationItems":[{"id":"fATidvy9/DRHt4VpV","uris":["http://zotero.org/users/2695081/items/ABIIT6F6"],"itemData":{"id":"9zI9GZ7V/tHgRCS7c","type":"article-journal","container-title":"Endocrinology","DOI":"10.1210/en.2018-00147","ISSN":"1945-7170","issue":"6","language":"en","page":"2275-2287","source":"DOI.org (Crossref)","title":"Glucocorticoid-Induced Metabolic Disturbances Are Exacerbated in Obese Male Mice","volume":"159","author":[{"family":"Harvey","given":"Innocence"},{"family":"Stephenson","given":"Erin J"},{"family":"Redd","given":"JeAnna R"},{"family":"Tran","given":"Quynh T"},{"family":"Hochberg","given":"Irit"},{"family":"Qi","given":"Nathan"},{"family":"Bridges","given":"Dave"}],"issued":{"date-parts":[["2018",6,1]]}}},{"id":"fATidvy9/57HHE831","uris":["http://zotero.org/users/2695081/items/455VREYL"],"itemData":{"id":"9zI9GZ7V/3nlM5iac","type":"article-journal","abstract":"Glucocorticoids promote muscle atrophy by inducing a class of proteins called atrogenes, resulting in reductions in muscle size and strength. In this work, we evaluated whether a mouse model with pre-existing diet-induced obesity had altered glucocorticoid responsiveness. We observed that all animals treated with the synthetic glucocorticoid dexamethasone had reduced strength, but that obesity exacerbated this effect. These changes were concordant with more pronounced reductions in muscle size, particularly in Type II muscle fibers, and potentiated induction of atrogene expression in the obese mice relative to lean mice. Furthermore, we show that the reductions in lean mass do not fully account for the dexamethasone-induced insulin resistance observed in these mice. Together, these data suggest that obesity potentiates glucocorticoid-induced muscle atrophy.","container-title":"Biomedicines","DOI":"10.3390/biomedicines8100420","ISSN":"2227-9059","issue":"10","journalAbbreviation":"Biomedicines","language":"en","page":"420","source":"DOI.org (Crossref)","title":"Obesity Augments Glucocorticoid-Dependent Muscle Atrophy in Male C57BL/6J Mice","volume":"8","author":[{"family":"Gunder","given":"Laura C."},{"family":"Harvey","given":"Innocence"},{"family":"Redd","given":"JeAnna R."},{"family":"Davis","given":"Carol S."},{"family":"AL-Tamimi","given":"Ayat"},{"family":"Brooks","given":"Susan V."},{"family":"Bridges","given":"Dave"}],"issued":{"date-parts":[["2020",10,15]]}}}],"schema":"https://github.com/citation-style-language/schema/raw/master/csl-citation.json"} </w:instrText>
+      </w:r>
+      <w:r>
+        <w:fldChar w:fldCharType="separate"/>
+      </w:r>
+      <w:r>
+        <w:rPr>
+          <w:noProof/>
+        </w:rPr>
+        <w:t>(4, 5)</w:t>
+      </w:r>
+      <w:r>
+        <w:fldChar w:fldCharType="end"/>
+      </w:r>
+      <w:r>
+        <w:t xml:space="preserve">, and in human patients with Cushing’s disease </w:t>
+      </w:r>
+      <w:r>
+        <w:fldChar w:fldCharType="begin"/>
+      </w:r>
+      <w:r>
+        <w:instrText xml:space="preserve"> ADDIN ZOTERO_ITEM CSL_CITATION {"citationID":"zW7FcRAf","properties":{"formattedCitation":"(18)","plainCitation":"(18)","noteIndex":0},"citationItems":[{"id":4127,"uris":["http://zotero.org/users/7317906/items/2YQBFJRJ"],"itemData":{"id":4127,"type":"article-journal","abstract":"Glucocorticoids have major effects on adipose tissue metabolism. To study tissue mRNA expression changes induced by chronic elevated endogenous glucocorticoids, we performed RNA sequencing on subcutaneous adipose tissue from patients with Cushing's disease (n=5) compared to patients with non-functioning pituitary adenomas (n=11). We found higher expression of transcripts involved in several metabolic pathways, including lipogenesis, proteolysis and glucose oxidation as well as decreased expression of transcripts involved in inflammation and protein synthesis. To further study this in a model system, we subjected mice to dexamethasone treatment for 12 weeks and analyzed their inguinal (subcutaneous) fat pads, which led to similar findings. Additionally, mice treated with dexamethasone showed drastic decreases in lean body mass as well as increased fat mass, further supporting the human transcriptomic data. These data provide insight to transcriptional changes that may be responsible for the co-morbidities associated with chronic elevations of glucocorticoids.","container-title":"Journal of Molecular Endocrinology","DOI":"10.1530/JME-15-0119","ISSN":"0952-5041","issue":"2","note":"PMID: 26150553\nCitation Key: Hochberg2015a","page":"81-94","title":"Gene expression changes in subcutaneous adipose tissue due to Cushing's disease","volume":"55","author":[{"family":"Hochberg","given":"Irit"},{"family":"Harvey","given":"Innocence"},{"family":"Tran","given":"Quynh T."},{"family":"Stephenson","given":"Erin J."},{"family":"Barkan","given":"Ariel L"},{"family":"Saltiel","given":"Alan R."},{"family":"Chandler","given":"William F."},{"family":"Bridges","given":"Dave"}],"issued":{"date-parts":[["2015",10]]},"citation-key":"Hochberg2015a"}}],"schema":"https://github.com/citation-style-language/schema/raw/master/csl-citation.json"} </w:instrText>
+      </w:r>
+      <w:r>
+        <w:fldChar w:fldCharType="separate"/>
+      </w:r>
+      <w:r>
+        <w:rPr>
+          <w:noProof/>
+        </w:rPr>
+        <w:t>(18)</w:t>
+      </w:r>
+      <w:r>
+        <w:fldChar w:fldCharType="end"/>
+      </w:r>
+      <w:r>
+        <w:t xml:space="preserve">.  </w:t>
+      </w:r>
+      <w:r>
+        <w:t xml:space="preserve">Together these data suggest that stress-related interventions could be </w:t>
+      </w:r>
+      <w:r>
+        <w:t>more effectively</w:t>
+      </w:r>
+      <w:r>
+        <w:t xml:space="preserve"> targeted to those with obesity, and that evaluation of psychosocial stress could be a valuable addition to the treatment and prevention of type 2 diabetes. </w:t>
+      </w:r>
+    </w:p>
+    <w:p>
+      <w:pPr>
+        <w:pStyle w:val="Heading1"/>
+      </w:pPr>
+      <w:r>
+        <w:t>Acknowledgements</w:t>
+      </w:r>
+    </w:p>
+    <w:p/>
+    <w:p>
       <w:r>
         <w:lastRenderedPageBreak/>
-        <w:t>different populations, or the differences between perceived stress and job-related stress and gender-specific effects.</w:t>
-      </w:r>
-    </w:p>
-    <w:p/>
-    <w:p>
-      <w:r>
-        <w:t xml:space="preserve">It is intriguing that the synergistic relationship between obesity and stress is most prominent in participants with type 2 diabetes, but is not evident for liver disease, chronic pulmonary disease or </w:t>
-      </w:r>
-      <w:r>
-        <w:t xml:space="preserve">congestive </w:t>
-      </w:r>
-      <w:r>
-        <w:t xml:space="preserve">heart failure.  Each of these had a substantial obesity-related </w:t>
-      </w:r>
-      <w:r>
-        <w:t>and/</w:t>
-      </w:r>
-      <w:r>
-        <w:t xml:space="preserve">or stress-related elevated </w:t>
-      </w:r>
-      <w:r>
-        <w:t>odds</w:t>
-      </w:r>
-      <w:r>
-        <w:t xml:space="preserve">, but in our population these factors appeared additive rather than synergistic.  </w:t>
-      </w:r>
-      <w:r>
-        <w:t>This work suggests that elevated perceived stress is associated with each of these, but is only enhanced by obesity in the context of type 2 diabetes.</w:t>
-      </w:r>
-    </w:p>
-    <w:p/>
-    <w:p>
-      <w:r>
-        <w:t>There are several limitations to this cross-sectional analysis, most notably whether elevated perceived stress was a cause or consequence of obesity-related diabetes associations</w:t>
-      </w:r>
-      <w:r>
-        <w:t>.  At this stage we think it is plausible that the distress related to chronic disease</w:t>
-      </w:r>
-      <w:r>
-        <w:t xml:space="preserve"> (either obesity or type 2 diabetes)</w:t>
-      </w:r>
-      <w:r>
-        <w:t xml:space="preserve"> could enhance perceived stress as a form of reverse causality.  We hypothesize that this is less likely, as it is only true for type 2 diabetes, but not other comorbidities tested.  It is also possible that the slightly elevated average BMI </w:t>
-      </w:r>
-      <w:r>
-        <w:t xml:space="preserve">in the participants with high PSS scores and obesity could imply that higher stress increases BMI, enhancing diabetes </w:t>
-      </w:r>
-      <w:r>
-        <w:t>prevalence</w:t>
-      </w:r>
-      <w:r>
-        <w:t>, consistent with the COBWEBS model</w:t>
-      </w:r>
-      <w:r>
-        <w:t xml:space="preserve"> wherein obesity-related stress enhances food intake and obesity, exacerbating weight-related metabolic disease </w:t>
-      </w:r>
-      <w:r>
-        <w:fldChar w:fldCharType="begin"/>
-      </w:r>
-      <w:r>
-        <w:instrText xml:space="preserve"> ADDIN ZOTERO_ITEM CSL_CITATION {"citationID":"gUypn5QT","properties":{"formattedCitation":"(17)","plainCitation":"(17)","noteIndex":0},"citationItems":[{"id":1482,"uris":["http://zotero.org/users/7317906/items/5I96XRCC"],"itemData":{"id":1482,"type":"article-journal","abstract":"Weight stigma is highly pervasive, but its consequences are understudied. This review draws from theory in social psychology, health psychology, and neuroendocrinology to construct an original, generative model called the cyclic obesity/weight-based stigma (COBWEBS) model. This model characterizes weight stigma as a \"vicious cycle\" - a positive feedback loop wherein weight stigma begets weight gain. This happens through increased eating behavior and increased cortisol secretion governed by behavioral, emotional, and physiological mechanisms, which are theorized to ultimately result in weight gain and difficulty of weight loss. The purpose of this review is to evaluate the existing literature for evidence supporting such a model, propose ways in which individuals enter, fight against, and exit the cycle, and conclude by outlining fruitful future directions in this nascent yet important area of research. © 2014 Elsevier Ltd.","container-title":"Appetite","DOI":"10.1016/j.appet.2014.06.108","ISSN":"10958304","note":"PMID: 24997407\npublisher: Elsevier Ltd\nCitation Key: Tomiyama2014a\nISBN: 1095-8304 (Electronic)\\r0195-6663 (Linking)","page":"8-15","title":"Weight stigma is stressful. A review of evidence for the cyclic Obesity/weight-based stigma model","volume":"82","author":[{"family":"Tomiyama","given":"A. Janet"}],"issued":{"date-parts":[["2014"]]},"citation-key":"Tomiyama2014a"}}],"schema":"https://github.com/citation-style-language/schema/raw/master/csl-citation.json"} </w:instrText>
-      </w:r>
-      <w:r>
-        <w:fldChar w:fldCharType="separate"/>
-      </w:r>
-      <w:r>
-        <w:rPr>
-          <w:noProof/>
-        </w:rPr>
-        <w:t>(17)</w:t>
-      </w:r>
-      <w:r>
-        <w:fldChar w:fldCharType="end"/>
-      </w:r>
-      <w:r>
-        <w:t xml:space="preserve">.  </w:t>
-      </w:r>
-      <w:r>
-        <w:t xml:space="preserve">In </w:t>
-      </w:r>
-      <w:r>
-        <w:t>terms of generalizability, the population in this study is a majority white, relatively affluent group of participants who have a relatively high age and number of co-morbidities, as is expected for a hospital-based cohort.</w:t>
-      </w:r>
-      <w:r>
-        <w:t xml:space="preserve">  Finally, we are limited by a single self-reported measure of perceived stress and the cross-sectional nature of this study.</w:t>
-      </w:r>
-    </w:p>
-    <w:p/>
-    <w:p>
-      <w:r>
-        <w:t xml:space="preserve">There are several important strengths to this work including a large sample size, consistent and validated measures of perceived stress and well documented disease and sociodemographic factors.  To our knowledge this is the first report </w:t>
-      </w:r>
-      <w:r>
-        <w:t>that</w:t>
-      </w:r>
-      <w:r>
-        <w:t xml:space="preserve"> perceived </w:t>
-      </w:r>
-      <w:r>
-        <w:t xml:space="preserve">psychosocial </w:t>
-      </w:r>
-      <w:r>
-        <w:t xml:space="preserve">stress </w:t>
-      </w:r>
-      <w:r>
-        <w:t>enhances</w:t>
-      </w:r>
-      <w:r>
-        <w:t xml:space="preserve"> obesity-related diabetes </w:t>
-      </w:r>
-      <w:r>
-        <w:t>prevalence</w:t>
-      </w:r>
-      <w:r>
-        <w:t xml:space="preserve">, and </w:t>
-      </w:r>
-      <w:r>
-        <w:t xml:space="preserve">is </w:t>
-      </w:r>
-      <w:r>
-        <w:t xml:space="preserve">consistent with the Whitehall II studies showing similar effects for job-related stress </w:t>
-      </w:r>
-      <w:r>
-        <w:fldChar w:fldCharType="begin"/>
-      </w:r>
-      <w:r>
-        <w:instrText xml:space="preserve"> ADDIN ZOTERO_ITEM CSL_CITATION {"citationID":"tmOtPEdO","properties":{"formattedCitation":"(9)","plainCitation":"(9)","noteIndex":0},"citationItems":[{"id":"fATidvy9/NEBiBgsN","uris":["http://zotero.org/users/2695081/items/3FLNIKRN"],"itemData":{"id":"9zI9GZ7V/BhbSUH95","type":"article-journal","abstract":"Psychosocial work stress has been linked to higher risk of type 2 diabetes (T2DM), with the effect being consistently higher among women than men. Also, work stress has been linked to prospective weight gain among obese men but weight loss among lean men. Here, we aimed to examine the interaction between work stress and obesity in relation to T2DM risk in a gender-specific manner. We studied 5,568 white middle-aged men and women in the Whitehall II study, who were free from diabetes at analysis baseline (1993). After 1993, diabetes was ascertained at six consecutive phases by an oral glucose tolerance test supplemented by self-reports. Cox regression analysis was used to assess the association between job strain (high job demands/low job control) and 18-year incident T2DM stratifying by BMI (BMI &lt;30 kg/m(2) vs. BMI ≥30 kg/m(2)). Overall, work stress was associated with incident T2DM among women (hazard ratio (HR) 1.41: 95% confidence intervals: 1.02; 1.95) but not among men (HR 0.87: 95% confidence interval 0.69; 1.11) (P(INTERACTION) = 0.017). Among men, work stress was associated with a lower risk of T2DM in nonobese (HR 0.70: 0.53; 0.93) but not in obese individuals (P(INTERACTION) = 0.17). Among women, work stress was associated with higher risk of T2DM in the obese (HR 2.01: 1.06; 3.92) but not in the nonobese (P(INTERACTION) = 0.005). Gender and body weight status play a critical role in determining the direction of the association between psychosocial stress and T2DM. The potential effect-modifying role of gender and obesity should not be ignored by future studies looking at stress-disease associations.","container-title":"Obesity (Silver Spring, Md.)","DOI":"10.1038/oby.2011.95","ISSN":"1930-739X","issue":"2","journalAbbreviation":"Obesity (Silver Spring)","language":"eng","note":"PMID: 21593804","page":"428-433","source":"PubMed","title":"Work stress, obesity and the risk of type 2 diabetes: gender-specific bidirectional effect in the Whitehall II study","title-short":"Work stress, obesity and the risk of type 2 diabetes","volume":"20","author":[{"family":"Heraclides","given":"Alexandros M."},{"family":"Chandola","given":"Tarani"},{"family":"Witte","given":"Daniel R."},{"family":"Brunner","given":"Eric J."}],"issued":{"date-parts":[["2012",2]]}}}],"schema":"https://github.com/citation-style-language/schema/raw/master/csl-citation.json"} </w:instrText>
-      </w:r>
-      <w:r>
-        <w:fldChar w:fldCharType="separate"/>
-      </w:r>
-      <w:r>
-        <w:rPr>
-          <w:noProof/>
-        </w:rPr>
-        <w:t>(9)</w:t>
-      </w:r>
-      <w:r>
-        <w:fldChar w:fldCharType="end"/>
-      </w:r>
-      <w:r>
-        <w:t xml:space="preserve">.  </w:t>
-      </w:r>
-      <w:r>
-        <w:t xml:space="preserve">This data is in alignment with our pre-clinical mouse studies that </w:t>
-      </w:r>
-      <w:r>
-        <w:t>demonstrate augmented</w:t>
-      </w:r>
-      <w:r>
-        <w:t xml:space="preserve"> </w:t>
+        <w:t>We would like to thank the members of the Bridges lab for helpful discussions</w:t>
+      </w:r>
+      <w:r>
+        <w:t xml:space="preserve">, and Matthew </w:t>
       </w:r>
       <w:proofErr w:type="spellStart"/>
       <w:r>
-        <w:t>dysglycemia</w:t>
+        <w:t>Zawistowski</w:t>
       </w:r>
       <w:proofErr w:type="spellEnd"/>
       <w:r>
-        <w:t xml:space="preserve"> in obese mice treated with glucocorticoids </w:t>
-      </w:r>
-      <w:r>
-        <w:fldChar w:fldCharType="begin"/>
-      </w:r>
-      <w:r>
-        <w:instrText xml:space="preserve"> ADDIN ZOTERO_ITEM CSL_CITATION {"citationID":"60pJs55V","properties":{"formattedCitation":"(4, 5)","plainCitation":"(4, 5)","noteIndex":0},"citationItems":[{"id":"fATidvy9/DRHt4VpV","uris":["http://zotero.org/users/2695081/items/ABIIT6F6"],"itemData":{"id":"9zI9GZ7V/tHgRCS7c","type":"article-journal","container-title":"Endocrinology","DOI":"10.1210/en.2018-00147","ISSN":"1945-7170","issue":"6","language":"en","page":"2275-2287","source":"DOI.org (Crossref)","title":"Glucocorticoid-Induced Metabolic Disturbances Are Exacerbated in Obese Male Mice","volume":"159","author":[{"family":"Harvey","given":"Innocence"},{"family":"Stephenson","given":"Erin J"},{"family":"Redd","given":"JeAnna R"},{"family":"Tran","given":"Quynh T"},{"family":"Hochberg","given":"Irit"},{"family":"Qi","given":"Nathan"},{"family":"Bridges","given":"Dave"}],"issued":{"date-parts":[["2018",6,1]]}}},{"id":"fATidvy9/57HHE831","uris":["http://zotero.org/users/2695081/items/455VREYL"],"itemData":{"id":"9zI9GZ7V/3nlM5iac","type":"article-journal","abstract":"Glucocorticoids promote muscle atrophy by inducing a class of proteins called atrogenes, resulting in reductions in muscle size and strength. In this work, we evaluated whether a mouse model with pre-existing diet-induced obesity had altered glucocorticoid responsiveness. We observed that all animals treated with the synthetic glucocorticoid dexamethasone had reduced strength, but that obesity exacerbated this effect. These changes were concordant with more pronounced reductions in muscle size, particularly in Type II muscle fibers, and potentiated induction of atrogene expression in the obese mice relative to lean mice. Furthermore, we show that the reductions in lean mass do not fully account for the dexamethasone-induced insulin resistance observed in these mice. Together, these data suggest that obesity potentiates glucocorticoid-induced muscle atrophy.","container-title":"Biomedicines","DOI":"10.3390/biomedicines8100420","ISSN":"2227-9059","issue":"10","journalAbbreviation":"Biomedicines","language":"en","page":"420","source":"DOI.org (Crossref)","title":"Obesity Augments Glucocorticoid-Dependent Muscle Atrophy in Male C57BL/6J Mice","volume":"8","author":[{"family":"Gunder","given":"Laura C."},{"family":"Harvey","given":"Innocence"},{"family":"Redd","given":"JeAnna R."},{"family":"Davis","given":"Carol S."},{"family":"AL-Tamimi","given":"Ayat"},{"family":"Brooks","given":"Susan V."},{"family":"Bridges","given":"Dave"}],"issued":{"date-parts":[["2020",10,15]]}}}],"schema":"https://github.com/citation-style-language/schema/raw/master/csl-citation.json"} </w:instrText>
-      </w:r>
-      <w:r>
-        <w:fldChar w:fldCharType="separate"/>
-      </w:r>
-      <w:r>
-        <w:rPr>
-          <w:noProof/>
-        </w:rPr>
-        <w:t>(4, 5)</w:t>
-      </w:r>
-      <w:r>
-        <w:fldChar w:fldCharType="end"/>
-      </w:r>
-      <w:r>
-        <w:t xml:space="preserve">, and in human patients with Cushing’s disease </w:t>
-      </w:r>
-      <w:r>
-        <w:fldChar w:fldCharType="begin"/>
-      </w:r>
-      <w:r>
-        <w:instrText xml:space="preserve"> ADDIN ZOTERO_ITEM CSL_CITATION {"citationID":"zW7FcRAf","properties":{"formattedCitation":"(18)","plainCitation":"(18)","noteIndex":0},"citationItems":[{"id":4127,"uris":["http://zotero.org/users/7317906/items/2YQBFJRJ"],"itemData":{"id":4127,"type":"article-journal","abstract":"Glucocorticoids have major effects on adipose tissue metabolism. To study tissue mRNA expression changes induced by chronic elevated endogenous glucocorticoids, we performed RNA sequencing on subcutaneous adipose tissue from patients with Cushing's disease (n=5) compared to patients with non-functioning pituitary adenomas (n=11). We found higher expression of transcripts involved in several metabolic pathways, including lipogenesis, proteolysis and glucose oxidation as well as decreased expression of transcripts involved in inflammation and protein synthesis. To further study this in a model system, we subjected mice to dexamethasone treatment for 12 weeks and analyzed their inguinal (subcutaneous) fat pads, which led to similar findings. Additionally, mice treated with dexamethasone showed drastic decreases in lean body mass as well as increased fat mass, further supporting the human transcriptomic data. These data provide insight to transcriptional changes that may be responsible for the co-morbidities associated with chronic elevations of glucocorticoids.","container-title":"Journal of Molecular Endocrinology","DOI":"10.1530/JME-15-0119","ISSN":"0952-5041","issue":"2","note":"PMID: 26150553\nCitation Key: Hochberg2015a","page":"81-94","title":"Gene expression changes in subcutaneous adipose tissue due to Cushing's disease","volume":"55","author":[{"family":"Hochberg","given":"Irit"},{"family":"Harvey","given":"Innocence"},{"family":"Tran","given":"Quynh T."},{"family":"Stephenson","given":"Erin J."},{"family":"Barkan","given":"Ariel L"},{"family":"Saltiel","given":"Alan R."},{"family":"Chandler","given":"William F."},{"family":"Bridges","given":"Dave"}],"issued":{"date-parts":[["2015",10]]},"citation-key":"Hochberg2015a"}}],"schema":"https://github.com/citation-style-language/schema/raw/master/csl-citation.json"} </w:instrText>
-      </w:r>
-      <w:r>
-        <w:fldChar w:fldCharType="separate"/>
-      </w:r>
-      <w:r>
-        <w:rPr>
-          <w:noProof/>
-        </w:rPr>
-        <w:t>(18)</w:t>
-      </w:r>
-      <w:r>
-        <w:fldChar w:fldCharType="end"/>
-      </w:r>
-      <w:r>
-        <w:t xml:space="preserve">.  </w:t>
-      </w:r>
-      <w:r>
-        <w:t xml:space="preserve">Together these data suggest that stress-related interventions could be </w:t>
-      </w:r>
-      <w:r>
-        <w:t>more effectively</w:t>
-      </w:r>
-      <w:r>
-        <w:t xml:space="preserve"> targeted to those with obesity, and that evaluation of psychosocial stress could be a valuable addition to the treatment and prevention of type 2 diabetes. </w:t>
-      </w:r>
-    </w:p>
-    <w:p>
-      <w:pPr>
-        <w:pStyle w:val="Heading1"/>
-      </w:pPr>
-      <w:r>
-        <w:t>Acknowledgements</w:t>
-      </w:r>
-    </w:p>
-    <w:p/>
-    <w:p>
-      <w:r>
-        <w:t>We would like to thank the members of the Bridges lab for helpful discussions</w:t>
-      </w:r>
-      <w:r>
-        <w:t xml:space="preserve">, and Matthew </w:t>
-      </w:r>
-      <w:proofErr w:type="spellStart"/>
-      <w:r>
-        <w:t>Zawistowski</w:t>
-      </w:r>
-      <w:proofErr w:type="spellEnd"/>
-      <w:r>
         <w:t xml:space="preserve"> (University of Michigan) for help with defining ICD based disease status</w:t>
       </w:r>
       <w:r>
@@ -3685,16 +3988,16 @@
       <w:r>
         <w:t xml:space="preserve">DK107535 to </w:t>
       </w:r>
-      <w:commentRangeStart w:id="207"/>
+      <w:commentRangeStart w:id="251"/>
       <w:r>
         <w:t>DB</w:t>
       </w:r>
-      <w:commentRangeEnd w:id="207"/>
-      <w:r>
-        <w:rPr>
-          <w:rStyle w:val="CommentReference"/>
-        </w:rPr>
-        <w:commentReference w:id="207"/>
+      <w:commentRangeEnd w:id="251"/>
+      <w:r>
+        <w:rPr>
+          <w:rStyle w:val="CommentReference"/>
+        </w:rPr>
+        <w:commentReference w:id="251"/>
       </w:r>
       <w:r>
         <w:t>)</w:t>
@@ -3718,11 +4021,7 @@
         <w:t>We would like to acknowledge</w:t>
       </w:r>
       <w:r>
-        <w:t xml:space="preserve"> the Michigan Genomics Initiative participants, Precision Health at the University of Michigan, and the University of </w:t>
-      </w:r>
-      <w:r>
-        <w:lastRenderedPageBreak/>
-        <w:t xml:space="preserve">Michigan Medical School Data Office for Clinical and Translational Research for providing data storage, management, processing, and distribution services. </w:t>
+        <w:t xml:space="preserve"> the Michigan Genomics Initiative participants, Precision Health at the University of Michigan, and the University of Michigan Medical School Data Office for Clinical and Translational Research for providing data storage, management, processing, and distribution services. </w:t>
       </w:r>
     </w:p>
     <w:p/>
@@ -5150,7 +5449,7 @@
       </w:r>
     </w:p>
   </w:comment>
-  <w:comment w:id="124" w:author="Bauer, Kate" w:date="2024-08-28T09:52:00Z" w:initials="KB">
+  <w:comment w:id="123" w:author="Bauer, Kate" w:date="2024-08-28T09:52:00Z" w:initials="KB">
     <w:p>
       <w:pPr>
         <w:pStyle w:val="CommentText"/>
@@ -5166,7 +5465,7 @@
       </w:r>
     </w:p>
   </w:comment>
-  <w:comment w:id="126" w:author="Bauer, Kate" w:date="2024-08-28T09:53:00Z" w:initials="KB">
+  <w:comment w:id="125" w:author="Bauer, Kate" w:date="2024-08-28T09:53:00Z" w:initials="KB">
     <w:p>
       <w:pPr>
         <w:pStyle w:val="CommentText"/>
@@ -5182,7 +5481,7 @@
       </w:r>
     </w:p>
   </w:comment>
-  <w:comment w:id="134" w:author="Bauer, Kate" w:date="2024-08-28T09:54:00Z" w:initials="KB">
+  <w:comment w:id="133" w:author="Bauer, Kate" w:date="2024-08-28T09:54:00Z" w:initials="KB">
     <w:p>
       <w:pPr>
         <w:pStyle w:val="CommentText"/>
@@ -5198,7 +5497,7 @@
       </w:r>
     </w:p>
   </w:comment>
-  <w:comment w:id="137" w:author="Bauer, Kate" w:date="2024-08-28T09:56:00Z" w:initials="KB">
+  <w:comment w:id="136" w:author="Bauer, Kate" w:date="2024-08-28T09:56:00Z" w:initials="KB">
     <w:p>
       <w:pPr>
         <w:pStyle w:val="CommentText"/>
@@ -5222,7 +5521,7 @@
       </w:r>
     </w:p>
   </w:comment>
-  <w:comment w:id="138" w:author="Bauer, Kate" w:date="2024-08-28T09:55:00Z" w:initials="KB">
+  <w:comment w:id="137" w:author="Bauer, Kate" w:date="2024-08-28T09:55:00Z" w:initials="KB">
     <w:p>
       <w:pPr>
         <w:pStyle w:val="CommentText"/>
@@ -5238,7 +5537,7 @@
       </w:r>
     </w:p>
   </w:comment>
-  <w:comment w:id="139" w:author="Bauer, Kate" w:date="2024-08-28T09:57:00Z" w:initials="KB">
+  <w:comment w:id="138" w:author="Bauer, Kate" w:date="2024-08-28T09:57:00Z" w:initials="KB">
     <w:p>
       <w:pPr>
         <w:pStyle w:val="CommentText"/>
@@ -5262,7 +5561,7 @@
       </w:r>
     </w:p>
   </w:comment>
-  <w:comment w:id="141" w:author="Bauer, Kate" w:date="2024-08-28T09:57:00Z" w:initials="KB">
+  <w:comment w:id="140" w:author="Bauer, Kate" w:date="2024-08-28T09:57:00Z" w:initials="KB">
     <w:p>
       <w:pPr>
         <w:pStyle w:val="CommentText"/>
@@ -5288,7 +5587,7 @@
       </w:r>
     </w:p>
   </w:comment>
-  <w:comment w:id="143" w:author="Bauer, Kate" w:date="2024-08-28T12:04:00Z" w:initials="KB">
+  <w:comment w:id="142" w:author="Bauer, Kate" w:date="2024-08-28T12:04:00Z" w:initials="KB">
     <w:p>
       <w:pPr>
         <w:pStyle w:val="CommentText"/>
@@ -5312,7 +5611,7 @@
       </w:r>
     </w:p>
   </w:comment>
-  <w:comment w:id="147" w:author="Bauer, Kate" w:date="2024-08-28T14:43:00Z" w:initials="KB">
+  <w:comment w:id="146" w:author="Bauer, Kate" w:date="2024-08-28T14:43:00Z" w:initials="KB">
     <w:p>
       <w:pPr>
         <w:pStyle w:val="CommentText"/>
@@ -5328,7 +5627,7 @@
       </w:r>
     </w:p>
   </w:comment>
-  <w:comment w:id="148" w:author="Bauer, Kate" w:date="2024-08-28T12:03:00Z" w:initials="KB">
+  <w:comment w:id="147" w:author="Bauer, Kate" w:date="2024-08-28T12:03:00Z" w:initials="KB">
     <w:p>
       <w:pPr>
         <w:pStyle w:val="CommentText"/>
@@ -5344,7 +5643,7 @@
       </w:r>
     </w:p>
   </w:comment>
-  <w:comment w:id="149" w:author="Bauer, Kate" w:date="2024-08-28T10:49:00Z" w:initials="KB">
+  <w:comment w:id="148" w:author="Bauer, Kate" w:date="2024-08-28T10:49:00Z" w:initials="KB">
     <w:p>
       <w:pPr>
         <w:pStyle w:val="CommentText"/>
@@ -5365,6 +5664,22 @@
       <w:proofErr w:type="gramEnd"/>
       <w:r>
         <w:t xml:space="preserve"> what was the timing of these measurements relative to the T2D diagnosis?</w:t>
+      </w:r>
+    </w:p>
+  </w:comment>
+  <w:comment w:id="149" w:author="Bauer, Kate" w:date="2024-08-28T10:50:00Z" w:initials="KB">
+    <w:p>
+      <w:pPr>
+        <w:pStyle w:val="CommentText"/>
+      </w:pPr>
+      <w:r>
+        <w:rPr>
+          <w:rStyle w:val="CommentReference"/>
+        </w:rPr>
+        <w:annotationRef/>
+      </w:r>
+      <w:r>
+        <w:t>Why, especially if you have such a large sample and could look at different levels of obesity?</w:t>
       </w:r>
     </w:p>
   </w:comment>
@@ -5380,11 +5695,11 @@
         <w:annotationRef/>
       </w:r>
       <w:r>
-        <w:t>Why, especially if you have such a large sample and could look at different levels of obesity?</w:t>
+        <w:t>Why not use this as a continuous measure? Is there justification in the literature for dichotomizing at the median?</w:t>
       </w:r>
     </w:p>
   </w:comment>
-  <w:comment w:id="151" w:author="Bauer, Kate" w:date="2024-08-28T10:50:00Z" w:initials="KB">
+  <w:comment w:id="151" w:author="Bauer, Kate" w:date="2024-08-28T10:53:00Z" w:initials="KB">
     <w:p>
       <w:pPr>
         <w:pStyle w:val="CommentText"/>
@@ -5396,11 +5711,11 @@
         <w:annotationRef/>
       </w:r>
       <w:r>
-        <w:t>Why not use this as a continuous measure? Is there justification in the literature for dichotomizing at the median?</w:t>
+        <w:t>I would describe this as neighborhood SES, not participant level.</w:t>
       </w:r>
     </w:p>
   </w:comment>
-  <w:comment w:id="152" w:author="Bauer, Kate" w:date="2024-08-28T10:53:00Z" w:initials="KB">
+  <w:comment w:id="152" w:author="Dave Bridges" w:date="2024-01-04T11:30:00Z" w:initials="DB">
     <w:p>
       <w:pPr>
         <w:pStyle w:val="CommentText"/>
@@ -5412,11 +5727,19 @@
         <w:annotationRef/>
       </w:r>
       <w:r>
-        <w:t>I would describe this as neighborhood SES, not participant level.</w:t>
+        <w:t>@</w:t>
+      </w:r>
+      <w:proofErr w:type="spellStart"/>
+      <w:r>
+        <w:t>kate</w:t>
+      </w:r>
+      <w:proofErr w:type="spellEnd"/>
+      <w:r>
+        <w:t xml:space="preserve"> are there standardized ways to cite these data?</w:t>
       </w:r>
     </w:p>
   </w:comment>
-  <w:comment w:id="153" w:author="Dave Bridges" w:date="2024-01-04T11:30:00Z" w:initials="DB">
+  <w:comment w:id="153" w:author="Bauer, Kate" w:date="2024-08-28T10:51:00Z" w:initials="KB">
     <w:p>
       <w:pPr>
         <w:pStyle w:val="CommentText"/>
@@ -5428,19 +5751,259 @@
         <w:annotationRef/>
       </w:r>
       <w:r>
-        <w:t>@</w:t>
+        <w:t>I think this explanation is fine but how does the timing of the ACS data correspond to the date that data were collected from the participants?</w:t>
+      </w:r>
+    </w:p>
+  </w:comment>
+  <w:comment w:id="160" w:author="Bauer, Kate" w:date="2024-08-28T10:52:00Z" w:initials="KB">
+    <w:p>
+      <w:pPr>
+        <w:pStyle w:val="CommentText"/>
+      </w:pPr>
+      <w:r>
+        <w:rPr>
+          <w:rStyle w:val="CommentReference"/>
+        </w:rPr>
+        <w:annotationRef/>
+      </w:r>
+      <w:r>
+        <w:t>Of heads of household?</w:t>
+      </w:r>
+    </w:p>
+  </w:comment>
+  <w:comment w:id="162" w:author="Bauer, Kate" w:date="2024-08-28T10:52:00Z" w:initials="KB">
+    <w:p>
+      <w:pPr>
+        <w:pStyle w:val="CommentText"/>
+      </w:pPr>
+      <w:r>
+        <w:rPr>
+          <w:rStyle w:val="CommentReference"/>
+        </w:rPr>
+        <w:annotationRef/>
+      </w:r>
+      <w:r>
+        <w:t>Of heads of household? How was “professional” determined? Overall, do you have a citation for using this method to determine SES?</w:t>
+      </w:r>
+    </w:p>
+  </w:comment>
+  <w:comment w:id="163" w:author="Bauer, Kate" w:date="2024-08-28T12:00:00Z" w:initials="KB">
+    <w:p>
+      <w:pPr>
+        <w:pStyle w:val="CommentText"/>
+      </w:pPr>
+      <w:r>
+        <w:rPr>
+          <w:rStyle w:val="CommentReference"/>
+        </w:rPr>
+        <w:annotationRef/>
+      </w:r>
+      <w:r>
+        <w:t>Do you need to add specifically which codes were used? Were any other exclusions made based on other codes?</w:t>
+      </w:r>
+    </w:p>
+  </w:comment>
+  <w:comment w:id="164" w:author="Bauer, Kate" w:date="2024-08-28T12:01:00Z" w:initials="KB">
+    <w:p>
+      <w:pPr>
+        <w:pStyle w:val="CommentText"/>
+      </w:pPr>
+      <w:r>
+        <w:rPr>
+          <w:rStyle w:val="CommentReference"/>
+        </w:rPr>
+        <w:annotationRef/>
+      </w:r>
+      <w:r>
+        <w:t xml:space="preserve">Explain in more detail how this data was collected – participants were asked to self-identify their race/ethnicity, right? </w:t>
+      </w:r>
+    </w:p>
+  </w:comment>
+  <w:comment w:id="167" w:author="Bauer, Kate" w:date="2024-08-28T12:02:00Z" w:initials="KB">
+    <w:p>
+      <w:pPr>
+        <w:pStyle w:val="CommentText"/>
+      </w:pPr>
+      <w:r>
+        <w:rPr>
+          <w:rStyle w:val="CommentReference"/>
+        </w:rPr>
+        <w:annotationRef/>
+      </w:r>
+      <w:r>
+        <w:t xml:space="preserve">It’s not clear what this means – provide more detail. </w:t>
+      </w:r>
+    </w:p>
+  </w:comment>
+  <w:comment w:id="173" w:author="Bauer, Kate" w:date="2024-08-28T14:40:00Z" w:initials="KB">
+    <w:p>
+      <w:pPr>
+        <w:pStyle w:val="CommentText"/>
+      </w:pPr>
+      <w:r>
+        <w:rPr>
+          <w:rStyle w:val="CommentReference"/>
+        </w:rPr>
+        <w:annotationRef/>
+      </w:r>
+      <w:r>
+        <w:t>I think you’re using univariate incorrectly here. Univariates are means, medians, etc. You mean unadjusted or crude models.</w:t>
+      </w:r>
+    </w:p>
+    <w:p>
+      <w:pPr>
+        <w:pStyle w:val="CommentText"/>
+      </w:pPr>
+    </w:p>
+  </w:comment>
+  <w:comment w:id="174" w:author="Dave Bridges" w:date="2024-08-28T17:33:00Z" w:initials="DB">
+    <w:p>
+      <w:pPr>
+        <w:pStyle w:val="CommentText"/>
+      </w:pPr>
+      <w:r>
+        <w:rPr>
+          <w:rStyle w:val="CommentReference"/>
+        </w:rPr>
+        <w:annotationRef/>
+      </w:r>
+      <w:r>
+        <w:t>I meant univariable</w:t>
+      </w:r>
+    </w:p>
+  </w:comment>
+  <w:comment w:id="177" w:author="Bauer, Kate" w:date="2024-08-28T14:41:00Z" w:initials="KB">
+    <w:p>
+      <w:pPr>
+        <w:pStyle w:val="CommentText"/>
+      </w:pPr>
+      <w:r>
+        <w:rPr>
+          <w:rStyle w:val="CommentReference"/>
+        </w:rPr>
+        <w:annotationRef/>
+      </w:r>
+      <w:r>
+        <w:t>Wouldn’t PSS score and obesity status be the predictor and T2D be the outcome?</w:t>
+      </w:r>
+    </w:p>
+  </w:comment>
+  <w:comment w:id="180" w:author="Bauer, Kate" w:date="2024-08-28T14:41:00Z" w:initials="KB">
+    <w:p>
+      <w:pPr>
+        <w:pStyle w:val="CommentText"/>
+      </w:pPr>
+      <w:r>
+        <w:rPr>
+          <w:rStyle w:val="CommentReference"/>
+        </w:rPr>
+        <w:annotationRef/>
+      </w:r>
+      <w:r>
+        <w:t>This is generally frowned upon, you should include covariates where there’s theoretical and/or conceptual justification for their inclusion.</w:t>
+      </w:r>
+    </w:p>
+  </w:comment>
+  <w:comment w:id="184" w:author="Bauer, Kate" w:date="2024-08-28T14:42:00Z" w:initials="KB">
+    <w:p>
+      <w:pPr>
+        <w:pStyle w:val="CommentText"/>
+      </w:pPr>
+      <w:r>
+        <w:rPr>
+          <w:rStyle w:val="CommentReference"/>
+        </w:rPr>
+        <w:annotationRef/>
+      </w:r>
+      <w:r>
+        <w:t>Typo?</w:t>
+      </w:r>
+    </w:p>
+  </w:comment>
+  <w:comment w:id="185" w:author="Bauer, Kate" w:date="2024-08-28T14:43:00Z" w:initials="KB">
+    <w:p>
+      <w:pPr>
+        <w:pStyle w:val="CommentText"/>
+      </w:pPr>
+      <w:r>
+        <w:rPr>
+          <w:rStyle w:val="CommentReference"/>
+        </w:rPr>
+        <w:annotationRef/>
+      </w:r>
+      <w:r>
+        <w:t>Demographics listed above are neighborhood disadvantages and race/ethnicity. Is that all? I believe you at least also include sex.</w:t>
+      </w:r>
+    </w:p>
+  </w:comment>
+  <w:comment w:id="187" w:author="Bauer, Kate" w:date="2024-08-28T14:43:00Z" w:initials="KB">
+    <w:p>
+      <w:pPr>
+        <w:pStyle w:val="CommentText"/>
+      </w:pPr>
+      <w:r>
+        <w:rPr>
+          <w:rStyle w:val="CommentReference"/>
+        </w:rPr>
+        <w:annotationRef/>
+      </w:r>
+      <w:r>
+        <w:t>Your outcome is diabetes prevalence, not incidence</w:t>
+      </w:r>
+    </w:p>
+  </w:comment>
+  <w:comment w:id="199" w:author="Bauer, Kate" w:date="2024-08-28T14:46:00Z" w:initials="KB">
+    <w:p>
+      <w:pPr>
+        <w:pStyle w:val="CommentText"/>
+      </w:pPr>
+      <w:r>
+        <w:rPr>
+          <w:rStyle w:val="CommentReference"/>
+        </w:rPr>
+        <w:annotationRef/>
+      </w:r>
+      <w:r>
+        <w:t>What makes this disproportional? In proportion to what?</w:t>
+      </w:r>
+    </w:p>
+  </w:comment>
+  <w:comment w:id="204" w:author="Bauer, Kate" w:date="2024-08-28T14:48:00Z" w:initials="BK">
+    <w:p>
+      <w:pPr>
+        <w:pStyle w:val="CommentText"/>
+      </w:pPr>
+      <w:r>
+        <w:rPr>
+          <w:rStyle w:val="CommentReference"/>
+        </w:rPr>
+        <w:annotationRef/>
+      </w:r>
+      <w:r>
+        <w:t xml:space="preserve">PSS scores aren’t labeled on Table 1. I assume that’s the No vs. </w:t>
+      </w:r>
+      <w:proofErr w:type="gramStart"/>
+      <w:r>
+        <w:t>Yes</w:t>
+      </w:r>
+      <w:proofErr w:type="gramEnd"/>
+      <w:r>
+        <w:t xml:space="preserve"> columns</w:t>
+      </w:r>
+      <w:r>
+        <w:t xml:space="preserve"> and then the prevalence (so prevalence of high stress?). </w:t>
       </w:r>
       <w:proofErr w:type="spellStart"/>
       <w:r>
-        <w:t>kate</w:t>
+        <w:t>Ddi</w:t>
       </w:r>
       <w:proofErr w:type="spellEnd"/>
       <w:r>
-        <w:t xml:space="preserve"> are there standardized ways to cite these data?</w:t>
+        <w:t xml:space="preserve"> you test the differences in prevalence across the categories of the demographics?</w:t>
       </w:r>
     </w:p>
   </w:comment>
-  <w:comment w:id="154" w:author="Bauer, Kate" w:date="2024-08-28T10:51:00Z" w:initials="KB">
+  <w:comment w:id="205" w:author="Bauer, Kate" w:date="2024-08-28T14:50:00Z" w:initials="BK">
     <w:p>
       <w:pPr>
         <w:pStyle w:val="CommentText"/>
@@ -5452,11 +6015,11 @@
         <w:annotationRef/>
       </w:r>
       <w:r>
-        <w:t>I think this explanation is fine but how does the timing of the ACS data correspond to the date that data were collected from the participants?</w:t>
+        <w:t>Rates of stress?</w:t>
       </w:r>
     </w:p>
   </w:comment>
-  <w:comment w:id="161" w:author="Bauer, Kate" w:date="2024-08-28T10:52:00Z" w:initials="KB">
+  <w:comment w:id="208" w:author="Bauer, Kate" w:date="2024-08-28T14:50:00Z" w:initials="BK">
     <w:p>
       <w:pPr>
         <w:pStyle w:val="CommentText"/>
@@ -5468,11 +6031,11 @@
         <w:annotationRef/>
       </w:r>
       <w:r>
-        <w:t>Of heads of household?</w:t>
+        <w:t>I would just put p&lt;.0001 but I would look at the journal you’re aiming for, they have standards.</w:t>
       </w:r>
     </w:p>
   </w:comment>
-  <w:comment w:id="163" w:author="Bauer, Kate" w:date="2024-08-28T10:52:00Z" w:initials="KB">
+  <w:comment w:id="209" w:author="Bauer, Kate" w:date="2024-08-28T14:52:00Z" w:initials="BK">
     <w:p>
       <w:pPr>
         <w:pStyle w:val="CommentText"/>
@@ -5484,11 +6047,11 @@
         <w:annotationRef/>
       </w:r>
       <w:r>
-        <w:t>Of heads of household? How was “professional” determined? Overall, do you have a citation for using this method to determine SES?</w:t>
+        <w:t>Again, given your large sample size and that you divided all the classes of obesity in Table 1, I think you should look at the interactions for all the classes.</w:t>
       </w:r>
     </w:p>
   </w:comment>
-  <w:comment w:id="164" w:author="Bauer, Kate" w:date="2024-08-28T12:00:00Z" w:initials="KB">
+  <w:comment w:id="214" w:author="Bauer, Kate" w:date="2024-08-28T14:53:00Z" w:initials="BK">
     <w:p>
       <w:pPr>
         <w:pStyle w:val="CommentText"/>
@@ -5500,11 +6063,14 @@
         <w:annotationRef/>
       </w:r>
       <w:r>
-        <w:t>Do you need to add specifically which codes were used? Were any other exclusions made based on other codes?</w:t>
+        <w:t>Not effect, the association between prevalent T2d and obesity status</w:t>
+      </w:r>
+      <w:r>
+        <w:t>…</w:t>
       </w:r>
     </w:p>
   </w:comment>
-  <w:comment w:id="165" w:author="Bauer, Kate" w:date="2024-08-28T12:01:00Z" w:initials="KB">
+  <w:comment w:id="213" w:author="Bauer, Kate" w:date="2024-08-28T14:54:00Z" w:initials="BK">
     <w:p>
       <w:pPr>
         <w:pStyle w:val="CommentText"/>
@@ -5516,11 +6082,11 @@
         <w:annotationRef/>
       </w:r>
       <w:r>
-        <w:t xml:space="preserve">Explain in more detail how this data was collected – participants were asked to self-identify their race/ethnicity, right? </w:t>
+        <w:t xml:space="preserve">Actually, I’m not sure what this analysis is. </w:t>
       </w:r>
     </w:p>
   </w:comment>
-  <w:comment w:id="168" w:author="Bauer, Kate" w:date="2024-08-28T12:02:00Z" w:initials="KB">
+  <w:comment w:id="219" w:author="Bauer, Kate" w:date="2024-08-28T14:56:00Z" w:initials="BK">
     <w:p>
       <w:pPr>
         <w:pStyle w:val="CommentText"/>
@@ -5532,11 +6098,11 @@
         <w:annotationRef/>
       </w:r>
       <w:r>
-        <w:t xml:space="preserve">It’s not clear what this means – provide more detail. </w:t>
+        <w:t>I’m not used to interactions being presented this way but maybe it’s okay.</w:t>
       </w:r>
     </w:p>
   </w:comment>
-  <w:comment w:id="171" w:author="Bauer, Kate" w:date="2024-08-28T14:40:00Z" w:initials="KB">
+  <w:comment w:id="220" w:author="Bauer, Kate" w:date="2024-08-28T14:55:00Z" w:initials="BK">
     <w:p>
       <w:pPr>
         <w:pStyle w:val="CommentText"/>
@@ -5548,16 +6114,27 @@
         <w:annotationRef/>
       </w:r>
       <w:r>
-        <w:t>I think you’re using univariate incorrectly here. Univariates are means, medians, etc. You mean unadjusted or crude models.</w:t>
-      </w:r>
-    </w:p>
+        <w:t>P is &gt;.05</w:t>
+      </w:r>
+    </w:p>
+  </w:comment>
+  <w:comment w:id="229" w:author="Bauer, Kate" w:date="2024-08-28T14:57:00Z" w:initials="BK">
     <w:p>
       <w:pPr>
         <w:pStyle w:val="CommentText"/>
       </w:pPr>
+      <w:r>
+        <w:rPr>
+          <w:rStyle w:val="CommentReference"/>
+        </w:rPr>
+        <w:annotationRef/>
+      </w:r>
+      <w:r>
+        <w:t>Again, I’ve never seen an interaction presented this way so I’m not sure what the 21% is referring to, is this the amount by which the relationship between obesity and T2D is elevated under high stress?</w:t>
+      </w:r>
     </w:p>
   </w:comment>
-  <w:comment w:id="172" w:author="Bauer, Kate" w:date="2024-08-28T14:41:00Z" w:initials="KB">
+  <w:comment w:id="230" w:author="Dave Bridges" w:date="2024-08-28T17:41:00Z" w:initials="DB">
     <w:p>
       <w:pPr>
         <w:pStyle w:val="CommentText"/>
@@ -5568,12 +6145,33 @@
         </w:rPr>
         <w:annotationRef/>
       </w:r>
-      <w:r>
-        <w:t>Wouldn’t PSS score and obesity status be the predictor and T2D be the outcome?</w:t>
+      <w:proofErr w:type="gramStart"/>
+      <w:r>
+        <w:t>Yes</w:t>
+      </w:r>
+      <w:proofErr w:type="gramEnd"/>
+      <w:r>
+        <w:t xml:space="preserve"> that is right.  Maybe it would help to just </w:t>
+      </w:r>
+      <w:proofErr w:type="spellStart"/>
+      <w:r>
+        <w:t>kep</w:t>
+      </w:r>
+      <w:proofErr w:type="spellEnd"/>
+      <w:r>
+        <w:t xml:space="preserve"> going back to the </w:t>
+      </w:r>
+      <w:proofErr w:type="spellStart"/>
+      <w:r>
+        <w:t>prevalences</w:t>
+      </w:r>
+      <w:proofErr w:type="spellEnd"/>
+      <w:r>
+        <w:t xml:space="preserve"> to show this </w:t>
       </w:r>
     </w:p>
   </w:comment>
-  <w:comment w:id="173" w:author="Bauer, Kate" w:date="2024-08-28T14:41:00Z" w:initials="KB">
+  <w:comment w:id="231" w:author="Bauer, Kate" w:date="2024-08-28T15:01:00Z" w:initials="BK">
     <w:p>
       <w:pPr>
         <w:pStyle w:val="CommentText"/>
@@ -5585,11 +6183,11 @@
         <w:annotationRef/>
       </w:r>
       <w:r>
-        <w:t>This is generally frowned upon, you should include covariates where there’s theoretical and/or conceptual justification for their inclusion.</w:t>
+        <w:t>Was this part of the research question?</w:t>
       </w:r>
     </w:p>
   </w:comment>
-  <w:comment w:id="176" w:author="Bauer, Kate" w:date="2024-08-28T14:42:00Z" w:initials="KB">
+  <w:comment w:id="232" w:author="Dave Bridges" w:date="2024-08-28T17:46:00Z" w:initials="DB">
     <w:p>
       <w:pPr>
         <w:pStyle w:val="CommentText"/>
@@ -5601,11 +6199,11 @@
         <w:annotationRef/>
       </w:r>
       <w:r>
-        <w:t>Typo?</w:t>
+        <w:t>No but this is something you brought up on the first look at the data.</w:t>
       </w:r>
     </w:p>
   </w:comment>
-  <w:comment w:id="177" w:author="Bauer, Kate" w:date="2024-08-28T14:43:00Z" w:initials="KB">
+  <w:comment w:id="233" w:author="Bauer, Kate" w:date="2024-08-28T15:01:00Z" w:initials="BK">
     <w:p>
       <w:pPr>
         <w:pStyle w:val="CommentText"/>
@@ -5617,11 +6215,11 @@
         <w:annotationRef/>
       </w:r>
       <w:r>
-        <w:t>Demographics listed above are neighborhood disadvantages and race/ethnicity. Is that all? I believe you at least also include sex.</w:t>
+        <w:t>Still not clear what other co-morbidities you’re talking about.</w:t>
       </w:r>
     </w:p>
   </w:comment>
-  <w:comment w:id="178" w:author="Bauer, Kate" w:date="2024-08-28T14:43:00Z" w:initials="KB">
+  <w:comment w:id="234" w:author="Dave Bridges" w:date="2024-08-28T17:45:00Z" w:initials="DB">
     <w:p>
       <w:pPr>
         <w:pStyle w:val="CommentText"/>
@@ -5633,11 +6231,19 @@
         <w:annotationRef/>
       </w:r>
       <w:r>
-        <w:t>Your outcome is diabetes prevalence, not incidence</w:t>
+        <w:t>I mentioned these in the abstract and @</w:t>
+      </w:r>
+      <w:proofErr w:type="spellStart"/>
+      <w:r>
+        <w:t>irit</w:t>
+      </w:r>
+      <w:proofErr w:type="spellEnd"/>
+      <w:r>
+        <w:t xml:space="preserve"> and I will dig out some refs to put this in the introduction as well.</w:t>
       </w:r>
     </w:p>
   </w:comment>
-  <w:comment w:id="180" w:author="Bauer, Kate" w:date="2024-08-28T14:46:00Z" w:initials="KB">
+  <w:comment w:id="240" w:author="Bauer, Kate" w:date="2024-08-28T15:02:00Z" w:initials="BK">
     <w:p>
       <w:pPr>
         <w:pStyle w:val="CommentText"/>
@@ -5649,225 +6255,11 @@
         <w:annotationRef/>
       </w:r>
       <w:r>
-        <w:t>What makes this disproportional? In proportion to what?</w:t>
+        <w:t>I would either say from the outset what you’re looking at or not include this. It will look like you’re fishing.</w:t>
       </w:r>
     </w:p>
   </w:comment>
-  <w:comment w:id="185" w:author="Bauer, Kate" w:date="2024-08-28T14:48:00Z" w:initials="BK">
-    <w:p>
-      <w:pPr>
-        <w:pStyle w:val="CommentText"/>
-      </w:pPr>
-      <w:r>
-        <w:rPr>
-          <w:rStyle w:val="CommentReference"/>
-        </w:rPr>
-        <w:annotationRef/>
-      </w:r>
-      <w:r>
-        <w:t xml:space="preserve">PSS scores aren’t labeled on Table 1. I assume that’s the No vs. </w:t>
-      </w:r>
-      <w:proofErr w:type="gramStart"/>
-      <w:r>
-        <w:t>Yes</w:t>
-      </w:r>
-      <w:proofErr w:type="gramEnd"/>
-      <w:r>
-        <w:t xml:space="preserve"> columns</w:t>
-      </w:r>
-      <w:r>
-        <w:t xml:space="preserve"> and then the prevalence (so prevalence of high stress?). </w:t>
-      </w:r>
-      <w:proofErr w:type="spellStart"/>
-      <w:r>
-        <w:t>Ddi</w:t>
-      </w:r>
-      <w:proofErr w:type="spellEnd"/>
-      <w:r>
-        <w:t xml:space="preserve"> you test the differences in prevalence across the categories of the demographics?</w:t>
-      </w:r>
-    </w:p>
-  </w:comment>
-  <w:comment w:id="186" w:author="Bauer, Kate" w:date="2024-08-28T14:50:00Z" w:initials="BK">
-    <w:p>
-      <w:pPr>
-        <w:pStyle w:val="CommentText"/>
-      </w:pPr>
-      <w:r>
-        <w:rPr>
-          <w:rStyle w:val="CommentReference"/>
-        </w:rPr>
-        <w:annotationRef/>
-      </w:r>
-      <w:r>
-        <w:t>Rates of stress?</w:t>
-      </w:r>
-    </w:p>
-  </w:comment>
-  <w:comment w:id="187" w:author="Bauer, Kate" w:date="2024-08-28T14:50:00Z" w:initials="BK">
-    <w:p>
-      <w:pPr>
-        <w:pStyle w:val="CommentText"/>
-      </w:pPr>
-      <w:r>
-        <w:rPr>
-          <w:rStyle w:val="CommentReference"/>
-        </w:rPr>
-        <w:annotationRef/>
-      </w:r>
-      <w:r>
-        <w:t>I would just put p&lt;.0001 but I would look at the journal you’re aiming for, they have standards.</w:t>
-      </w:r>
-    </w:p>
-  </w:comment>
-  <w:comment w:id="188" w:author="Bauer, Kate" w:date="2024-08-28T14:52:00Z" w:initials="BK">
-    <w:p>
-      <w:pPr>
-        <w:pStyle w:val="CommentText"/>
-      </w:pPr>
-      <w:r>
-        <w:rPr>
-          <w:rStyle w:val="CommentReference"/>
-        </w:rPr>
-        <w:annotationRef/>
-      </w:r>
-      <w:r>
-        <w:t>Again, given your large sample size and that you divided all the classes of obesity in Table 1, I think you should look at the interactions for all the classes.</w:t>
-      </w:r>
-    </w:p>
-  </w:comment>
-  <w:comment w:id="193" w:author="Bauer, Kate" w:date="2024-08-28T14:53:00Z" w:initials="BK">
-    <w:p>
-      <w:pPr>
-        <w:pStyle w:val="CommentText"/>
-      </w:pPr>
-      <w:r>
-        <w:rPr>
-          <w:rStyle w:val="CommentReference"/>
-        </w:rPr>
-        <w:annotationRef/>
-      </w:r>
-      <w:r>
-        <w:t>Not effect, the association between prevalent T2d and obesity status</w:t>
-      </w:r>
-      <w:r>
-        <w:t>…</w:t>
-      </w:r>
-    </w:p>
-  </w:comment>
-  <w:comment w:id="192" w:author="Bauer, Kate" w:date="2024-08-28T14:54:00Z" w:initials="BK">
-    <w:p>
-      <w:pPr>
-        <w:pStyle w:val="CommentText"/>
-      </w:pPr>
-      <w:r>
-        <w:rPr>
-          <w:rStyle w:val="CommentReference"/>
-        </w:rPr>
-        <w:annotationRef/>
-      </w:r>
-      <w:r>
-        <w:t xml:space="preserve">Actually, I’m not sure what this analysis is. </w:t>
-      </w:r>
-    </w:p>
-  </w:comment>
-  <w:comment w:id="195" w:author="Bauer, Kate" w:date="2024-08-28T14:56:00Z" w:initials="BK">
-    <w:p>
-      <w:pPr>
-        <w:pStyle w:val="CommentText"/>
-      </w:pPr>
-      <w:r>
-        <w:rPr>
-          <w:rStyle w:val="CommentReference"/>
-        </w:rPr>
-        <w:annotationRef/>
-      </w:r>
-      <w:r>
-        <w:t>I’m not used to interactions being presented this way but maybe it’s okay.</w:t>
-      </w:r>
-    </w:p>
-  </w:comment>
-  <w:comment w:id="196" w:author="Bauer, Kate" w:date="2024-08-28T14:55:00Z" w:initials="BK">
-    <w:p>
-      <w:pPr>
-        <w:pStyle w:val="CommentText"/>
-      </w:pPr>
-      <w:r>
-        <w:rPr>
-          <w:rStyle w:val="CommentReference"/>
-        </w:rPr>
-        <w:annotationRef/>
-      </w:r>
-      <w:r>
-        <w:t>P is &gt;.05</w:t>
-      </w:r>
-    </w:p>
-  </w:comment>
-  <w:comment w:id="201" w:author="Bauer, Kate" w:date="2024-08-28T14:57:00Z" w:initials="BK">
-    <w:p>
-      <w:pPr>
-        <w:pStyle w:val="CommentText"/>
-      </w:pPr>
-      <w:r>
-        <w:rPr>
-          <w:rStyle w:val="CommentReference"/>
-        </w:rPr>
-        <w:annotationRef/>
-      </w:r>
-      <w:r>
-        <w:t>Again, I’ve never seen an interaction presented this way so I’m not sure what the 21% is referring to, is this the amount by which the relationship between obesity and T2D is elevated under high stress?</w:t>
-      </w:r>
-    </w:p>
-  </w:comment>
-  <w:comment w:id="202" w:author="Bauer, Kate" w:date="2024-08-28T15:01:00Z" w:initials="BK">
-    <w:p>
-      <w:pPr>
-        <w:pStyle w:val="CommentText"/>
-      </w:pPr>
-      <w:r>
-        <w:rPr>
-          <w:rStyle w:val="CommentReference"/>
-        </w:rPr>
-        <w:annotationRef/>
-      </w:r>
-      <w:r>
-        <w:t>Was this part of the research question?</w:t>
-      </w:r>
-    </w:p>
-  </w:comment>
-  <w:comment w:id="203" w:author="Bauer, Kate" w:date="2024-08-28T15:01:00Z" w:initials="BK">
-    <w:p>
-      <w:pPr>
-        <w:pStyle w:val="CommentText"/>
-      </w:pPr>
-      <w:r>
-        <w:rPr>
-          <w:rStyle w:val="CommentReference"/>
-        </w:rPr>
-        <w:annotationRef/>
-      </w:r>
-      <w:r>
-        <w:t>Still not clear what other co-morbidities you’re talking about.</w:t>
-      </w:r>
-    </w:p>
-  </w:comment>
-  <w:comment w:id="204" w:author="Bauer, Kate" w:date="2024-08-28T15:02:00Z" w:initials="BK">
-    <w:p>
-      <w:pPr>
-        <w:pStyle w:val="CommentText"/>
-      </w:pPr>
-      <w:r>
-        <w:rPr>
-          <w:rStyle w:val="CommentReference"/>
-        </w:rPr>
-        <w:annotationRef/>
-      </w:r>
-      <w:r>
-        <w:t>I would either say from the outset what you’re looking at or not include this. It will look like you’re fishing.</w:t>
-      </w:r>
-    </w:p>
-  </w:comment>
-  <w:comment w:id="205" w:author="Dave Bridges" w:date="2024-04-26T10:23:00Z" w:initials="DB">
+  <w:comment w:id="248" w:author="Dave Bridges" w:date="2024-04-26T10:23:00Z" w:initials="DB">
     <w:p>
       <w:r>
         <w:rPr>
@@ -5885,7 +6277,7 @@
       </w:r>
     </w:p>
   </w:comment>
-  <w:comment w:id="206" w:author="Dave Bridges" w:date="2024-04-12T11:52:00Z" w:initials="DB">
+  <w:comment w:id="250" w:author="Dave Bridges" w:date="2024-04-12T11:52:00Z" w:initials="DB">
     <w:p>
       <w:r>
         <w:rPr>
@@ -6603,7 +6995,7 @@
       </w:r>
     </w:p>
   </w:comment>
-  <w:comment w:id="207" w:author="Dave Bridges" w:date="2024-04-12T11:07:00Z" w:initials="DB">
+  <w:comment w:id="251" w:author="Dave Bridges" w:date="2024-04-12T11:07:00Z" w:initials="DB">
     <w:p>
       <w:pPr>
         <w:pStyle w:val="CommentText"/>
@@ -6693,24 +7085,28 @@
   <w15:commentEx w15:paraId="25141609" w15:done="0"/>
   <w15:commentEx w15:paraId="7C5D2344" w15:done="0"/>
   <w15:commentEx w15:paraId="43615651" w15:done="0"/>
-  <w15:commentEx w15:paraId="7E510FE2" w15:done="0"/>
+  <w15:commentEx w15:paraId="7E510FE2" w15:done="1"/>
+  <w15:commentEx w15:paraId="58512B27" w15:paraIdParent="7E510FE2" w15:done="1"/>
   <w15:commentEx w15:paraId="4B9CECEF" w15:done="0"/>
-  <w15:commentEx w15:paraId="6C32C6E5" w15:done="0"/>
-  <w15:commentEx w15:paraId="307C02FF" w15:done="0"/>
+  <w15:commentEx w15:paraId="6C32C6E5" w15:done="1"/>
+  <w15:commentEx w15:paraId="307C02FF" w15:done="1"/>
   <w15:commentEx w15:paraId="1E58360D" w15:done="0"/>
   <w15:commentEx w15:paraId="6EBE8266" w15:done="0"/>
-  <w15:commentEx w15:paraId="10918CB7" w15:done="0"/>
+  <w15:commentEx w15:paraId="10918CB7" w15:done="1"/>
   <w15:commentEx w15:paraId="3F9861AA" w15:done="0"/>
-  <w15:commentEx w15:paraId="4D22C3B8" w15:done="0"/>
+  <w15:commentEx w15:paraId="4D22C3B8" w15:done="1"/>
   <w15:commentEx w15:paraId="59E010D8" w15:done="0"/>
   <w15:commentEx w15:paraId="59C1994C" w15:done="0"/>
-  <w15:commentEx w15:paraId="350DF077" w15:done="0"/>
+  <w15:commentEx w15:paraId="350DF077" w15:done="1"/>
   <w15:commentEx w15:paraId="1E05F176" w15:done="0"/>
-  <w15:commentEx w15:paraId="75470CCB" w15:done="0"/>
-  <w15:commentEx w15:paraId="068CA543" w15:done="0"/>
+  <w15:commentEx w15:paraId="75470CCB" w15:done="1"/>
+  <w15:commentEx w15:paraId="068CA543" w15:done="1"/>
   <w15:commentEx w15:paraId="7BAD4EFF" w15:done="0"/>
+  <w15:commentEx w15:paraId="0A46ABCD" w15:paraIdParent="7BAD4EFF" w15:done="0"/>
   <w15:commentEx w15:paraId="1C8498E0" w15:done="0"/>
+  <w15:commentEx w15:paraId="5AC9D4BE" w15:paraIdParent="1C8498E0" w15:done="0"/>
   <w15:commentEx w15:paraId="2B8D06E8" w15:done="0"/>
+  <w15:commentEx w15:paraId="010507B3" w15:paraIdParent="2B8D06E8" w15:done="0"/>
   <w15:commentEx w15:paraId="50FED73B" w15:done="0"/>
   <w15:commentEx w15:paraId="0C81528E" w15:done="0"/>
   <w15:commentEx w15:paraId="6B0600C2" w15:done="0"/>
@@ -6835,6 +7231,7 @@
   <w16cid:commentId w16cid:paraId="7C5D2344" w16cid:durableId="40FA825C"/>
   <w16cid:commentId w16cid:paraId="43615651" w16cid:durableId="37C6C69F"/>
   <w16cid:commentId w16cid:paraId="7E510FE2" w16cid:durableId="6FA4254E"/>
+  <w16cid:commentId w16cid:paraId="58512B27" w16cid:durableId="2A79DDFF"/>
   <w16cid:commentId w16cid:paraId="4B9CECEF" w16cid:durableId="581A1923"/>
   <w16cid:commentId w16cid:paraId="6C32C6E5" w16cid:durableId="5DEFE155"/>
   <w16cid:commentId w16cid:paraId="307C02FF" w16cid:durableId="23CDD981"/>
@@ -6850,8 +7247,11 @@
   <w16cid:commentId w16cid:paraId="75470CCB" w16cid:durableId="58A41DFC"/>
   <w16cid:commentId w16cid:paraId="068CA543" w16cid:durableId="273F8B8A"/>
   <w16cid:commentId w16cid:paraId="7BAD4EFF" w16cid:durableId="2AE37BBD"/>
+  <w16cid:commentId w16cid:paraId="0A46ABCD" w16cid:durableId="2A79DFD4"/>
   <w16cid:commentId w16cid:paraId="1C8498E0" w16cid:durableId="50CA65D7"/>
+  <w16cid:commentId w16cid:paraId="5AC9D4BE" w16cid:durableId="2A79E112"/>
   <w16cid:commentId w16cid:paraId="2B8D06E8" w16cid:durableId="147F910E"/>
+  <w16cid:commentId w16cid:paraId="010507B3" w16cid:durableId="2A79E0C1"/>
   <w16cid:commentId w16cid:paraId="50FED73B" w16cid:durableId="1433B20F"/>
   <w16cid:commentId w16cid:paraId="0C81528E" w16cid:durableId="110DF523"/>
   <w16cid:commentId w16cid:paraId="6B0600C2" w16cid:durableId="29C39F1A"/>

</xml_diff>

<commit_message>
Minor changes to the discussion
</commit_message>
<xml_diff>
--- a/manuscript/Obesity-Stress/Manuscript.docx
+++ b/manuscript/Obesity-Stress/Manuscript.docx
@@ -86,10 +86,7 @@
       </w:del>
       <w:ins w:id="4" w:author="Dave Bridges" w:date="2024-08-28T16:58:00Z">
         <w:r>
-          <w:t>examined</w:t>
-        </w:r>
-        <w:r>
-          <w:t xml:space="preserve"> </w:t>
+          <w:t xml:space="preserve">examined </w:t>
         </w:r>
       </w:ins>
       <w:r>
@@ -122,10 +119,7 @@
       </w:ins>
       <w:ins w:id="9" w:author="Dave Bridges" w:date="2024-08-28T16:58:00Z">
         <w:r>
-          <w:t xml:space="preserve"> the</w:t>
-        </w:r>
-        <w:r>
-          <w:t xml:space="preserve"> </w:t>
+          <w:t xml:space="preserve"> the </w:t>
         </w:r>
       </w:ins>
       <w:r>
@@ -213,10 +207,7 @@
       <w:commentRangeEnd w:id="19"/>
       <w:ins w:id="21" w:author="Dave Bridges" w:date="2024-08-28T17:00:00Z">
         <w:r>
-          <w:t>relationship</w:t>
-        </w:r>
-        <w:r>
-          <w:t xml:space="preserve"> </w:t>
+          <w:t xml:space="preserve">relationship </w:t>
         </w:r>
       </w:ins>
       <w:r>
@@ -246,10 +237,7 @@
       </w:del>
       <w:ins w:id="24" w:author="Dave Bridges" w:date="2024-08-28T17:00:00Z">
         <w:r>
-          <w:t>stronger</w:t>
-        </w:r>
-        <w:r>
-          <w:t xml:space="preserve"> </w:t>
+          <w:t xml:space="preserve">stronger </w:t>
         </w:r>
       </w:ins>
       <w:r>
@@ -409,10 +397,7 @@
           <w:t>e</w:t>
         </w:r>
         <w:r>
-          <w:t xml:space="preserve"> to increase</w:t>
-        </w:r>
-        <w:r>
-          <w:t xml:space="preserve"> </w:t>
+          <w:t xml:space="preserve"> to increase </w:t>
         </w:r>
       </w:ins>
       <w:r>
@@ -2031,10 +2016,7 @@
       </w:del>
       <w:ins w:id="166" w:author="Dave Bridges" w:date="2024-08-28T17:30:00Z">
         <w:r>
-          <w:t>from self- reports of Race and Ethnicity as</w:t>
-        </w:r>
-        <w:r>
-          <w:t xml:space="preserve"> </w:t>
+          <w:t xml:space="preserve">from self- reports of Race and Ethnicity as </w:t>
         </w:r>
       </w:ins>
       <w:r>
@@ -2192,10 +2174,7 @@
       </w:del>
       <w:ins w:id="176" w:author="Dave Bridges" w:date="2024-08-28T17:33:00Z">
         <w:r>
-          <w:t>Univariable</w:t>
-        </w:r>
-        <w:r>
-          <w:t xml:space="preserve"> </w:t>
+          <w:t xml:space="preserve">Univariable </w:t>
         </w:r>
       </w:ins>
       <w:r>
@@ -2788,13 +2767,7 @@
       </w:del>
       <w:ins w:id="216" w:author="Dave Bridges" w:date="2024-08-28T17:40:00Z">
         <w:r>
-          <w:t>increased type 2 Diabetes prevalence</w:t>
-        </w:r>
-        <w:r>
-          <w:t xml:space="preserve"> </w:t>
-        </w:r>
-        <w:r>
-          <w:t xml:space="preserve">associated with </w:t>
+          <w:t xml:space="preserve">increased type 2 Diabetes prevalence associated with </w:t>
         </w:r>
       </w:ins>
       <w:del w:id="217" w:author="Dave Bridges" w:date="2024-08-28T17:40:00Z">
@@ -3189,6 +3162,7 @@
       </w:r>
       <w:commentRangeStart w:id="231"/>
       <w:commentRangeStart w:id="232"/>
+      <w:commentRangeStart w:id="233"/>
       <w:r>
         <w:t>We next tested whether participants with obesity reporting elevated stress were more obese</w:t>
       </w:r>
@@ -3268,6 +3242,13 @@
         </w:rPr>
         <w:commentReference w:id="232"/>
       </w:r>
+      <w:commentRangeEnd w:id="233"/>
+      <w:r>
+        <w:rPr>
+          <w:rStyle w:val="CommentReference"/>
+        </w:rPr>
+        <w:commentReference w:id="233"/>
+      </w:r>
     </w:p>
     <w:p>
       <w:pPr>
@@ -3287,38 +3268,38 @@
       <w:r>
         <w:t xml:space="preserve"> Modify the Prevalence of Other </w:t>
       </w:r>
-      <w:commentRangeStart w:id="233"/>
       <w:commentRangeStart w:id="234"/>
+      <w:commentRangeStart w:id="235"/>
       <w:r>
         <w:t>Obesity-Related Co-Morbidities</w:t>
       </w:r>
-      <w:commentRangeEnd w:id="233"/>
+      <w:commentRangeEnd w:id="234"/>
       <w:r>
         <w:rPr>
           <w:rStyle w:val="CommentReference"/>
           <w:rFonts w:asciiTheme="minorHAnsi" w:eastAsiaTheme="minorHAnsi" w:hAnsiTheme="minorHAnsi" w:cstheme="minorBidi"/>
           <w:color w:val="auto"/>
         </w:rPr>
-        <w:commentReference w:id="233"/>
-      </w:r>
-      <w:commentRangeEnd w:id="234"/>
+        <w:commentReference w:id="234"/>
+      </w:r>
+      <w:commentRangeEnd w:id="235"/>
       <w:r>
         <w:rPr>
           <w:rStyle w:val="CommentReference"/>
           <w:rFonts w:asciiTheme="minorHAnsi" w:eastAsiaTheme="minorHAnsi" w:hAnsiTheme="minorHAnsi" w:cstheme="minorBidi"/>
           <w:color w:val="auto"/>
         </w:rPr>
-        <w:commentReference w:id="234"/>
+        <w:commentReference w:id="235"/>
       </w:r>
     </w:p>
     <w:p/>
     <w:p>
-      <w:ins w:id="235" w:author="Dave Bridges" w:date="2024-08-28T17:42:00Z">
+      <w:ins w:id="236" w:author="Dave Bridges" w:date="2024-08-28T17:42:00Z">
         <w:r>
           <w:t>Sev</w:t>
         </w:r>
       </w:ins>
-      <w:ins w:id="236" w:author="Dave Bridges" w:date="2024-08-28T17:43:00Z">
+      <w:ins w:id="237" w:author="Dave Bridges" w:date="2024-08-28T17:43:00Z">
         <w:r>
           <w:t xml:space="preserve">eral other chronic diseases including cardiac arrhythmias, chronic pulmonary disease, congestive heart </w:t>
         </w:r>
@@ -3331,31 +3312,31 @@
           <w:t>, and liver dis</w:t>
         </w:r>
       </w:ins>
-      <w:ins w:id="237" w:author="Dave Bridges" w:date="2024-08-28T17:47:00Z">
+      <w:ins w:id="238" w:author="Dave Bridges" w:date="2024-08-28T17:47:00Z">
         <w:r>
           <w:t>e</w:t>
         </w:r>
       </w:ins>
-      <w:ins w:id="238" w:author="Dave Bridges" w:date="2024-08-28T17:43:00Z">
+      <w:ins w:id="239" w:author="Dave Bridges" w:date="2024-08-28T17:43:00Z">
         <w:r>
           <w:t>ase have been previously</w:t>
         </w:r>
       </w:ins>
-      <w:ins w:id="239" w:author="Dave Bridges" w:date="2024-08-28T17:47:00Z">
+      <w:ins w:id="240" w:author="Dave Bridges" w:date="2024-08-28T17:47:00Z">
         <w:r>
           <w:t xml:space="preserve"> reported.  </w:t>
         </w:r>
       </w:ins>
-      <w:commentRangeStart w:id="240"/>
+      <w:commentRangeStart w:id="241"/>
       <w:r>
         <w:t xml:space="preserve">Given the enhancement of obesity-associated </w:t>
       </w:r>
-      <w:ins w:id="241" w:author="Dave Bridges" w:date="2024-08-28T17:43:00Z">
+      <w:ins w:id="242" w:author="Dave Bridges" w:date="2024-08-28T17:43:00Z">
         <w:r>
           <w:t>Type 2 D</w:t>
         </w:r>
       </w:ins>
-      <w:del w:id="242" w:author="Dave Bridges" w:date="2024-08-28T17:43:00Z">
+      <w:del w:id="243" w:author="Dave Bridges" w:date="2024-08-28T17:43:00Z">
         <w:r>
           <w:delText>d</w:delText>
         </w:r>
@@ -3363,12 +3344,12 @@
       <w:r>
         <w:t xml:space="preserve">iabetes prevalence </w:t>
       </w:r>
-      <w:ins w:id="243" w:author="Dave Bridges" w:date="2024-08-28T17:43:00Z">
+      <w:ins w:id="244" w:author="Dave Bridges" w:date="2024-08-28T17:43:00Z">
         <w:r>
           <w:t>that we observed</w:t>
         </w:r>
       </w:ins>
-      <w:del w:id="244" w:author="Dave Bridges" w:date="2024-08-28T17:43:00Z">
+      <w:del w:id="245" w:author="Dave Bridges" w:date="2024-08-28T17:43:00Z">
         <w:r>
           <w:delText>in these participants</w:delText>
         </w:r>
@@ -3376,23 +3357,20 @@
       <w:r>
         <w:t xml:space="preserve">, we </w:t>
       </w:r>
-      <w:del w:id="245" w:author="Dave Bridges" w:date="2024-08-28T17:43:00Z">
+      <w:del w:id="246" w:author="Dave Bridges" w:date="2024-08-28T17:43:00Z">
         <w:r>
           <w:delText xml:space="preserve">then </w:delText>
         </w:r>
       </w:del>
-      <w:ins w:id="246" w:author="Dave Bridges" w:date="2024-08-28T17:43:00Z">
-        <w:r>
-          <w:t>next</w:t>
-        </w:r>
-        <w:r>
-          <w:t xml:space="preserve"> </w:t>
+      <w:ins w:id="247" w:author="Dave Bridges" w:date="2024-08-28T17:43:00Z">
+        <w:r>
+          <w:t xml:space="preserve">next </w:t>
         </w:r>
       </w:ins>
       <w:r>
         <w:t>evaluated several other obesity and stress-linked chronic diseases using the same approach.</w:t>
       </w:r>
-      <w:ins w:id="247" w:author="Dave Bridges" w:date="2024-08-28T17:48:00Z">
+      <w:ins w:id="248" w:author="Dave Bridges" w:date="2024-08-28T17:48:00Z">
         <w:r>
           <w:t xml:space="preserve"> To define whether these associations are restricted to Type 2 </w:t>
         </w:r>
@@ -3408,34 +3386,29 @@
       <w:r>
         <w:t xml:space="preserve">  </w:t>
       </w:r>
-      <w:commentRangeEnd w:id="240"/>
-      <w:r>
-        <w:rPr>
-          <w:rStyle w:val="CommentReference"/>
-        </w:rPr>
-        <w:commentReference w:id="240"/>
+      <w:commentRangeEnd w:id="241"/>
+      <w:r>
+        <w:rPr>
+          <w:rStyle w:val="CommentReference"/>
+        </w:rPr>
+        <w:commentReference w:id="241"/>
       </w:r>
       <w:r>
         <w:t xml:space="preserve">In </w:t>
       </w:r>
-      <w:commentRangeStart w:id="248"/>
-      <w:r>
-        <w:t>Tab</w:t>
-      </w:r>
-      <w:bookmarkStart w:id="249" w:name="_GoBack"/>
-      <w:bookmarkEnd w:id="249"/>
-      <w:r>
-        <w:t xml:space="preserve">le </w:t>
+      <w:commentRangeStart w:id="249"/>
+      <w:r>
+        <w:t xml:space="preserve">Table </w:t>
       </w:r>
       <w:r>
         <w:t xml:space="preserve">3 </w:t>
       </w:r>
-      <w:commentRangeEnd w:id="248"/>
-      <w:r>
-        <w:rPr>
-          <w:rStyle w:val="CommentReference"/>
-        </w:rPr>
-        <w:commentReference w:id="248"/>
+      <w:commentRangeEnd w:id="249"/>
+      <w:r>
+        <w:rPr>
+          <w:rStyle w:val="CommentReference"/>
+        </w:rPr>
+        <w:commentReference w:id="249"/>
       </w:r>
       <w:r>
         <w:t>we describe the raw and adjusted associations between obesity and stress on arrhythmia</w:t>
@@ -3703,7 +3676,22 @@
         <w:t xml:space="preserve">perceived </w:t>
       </w:r>
       <w:r>
-        <w:t>stress affects the pathophysiology of type 2 diabetes in humans</w:t>
+        <w:t xml:space="preserve">stress affects the pathophysiology of </w:t>
+      </w:r>
+      <w:ins w:id="251" w:author="Dave Bridges" w:date="2024-08-28T17:58:00Z">
+        <w:r>
+          <w:t>T</w:t>
+        </w:r>
+      </w:ins>
+      <w:bookmarkStart w:id="252" w:name="_GoBack"/>
+      <w:bookmarkEnd w:id="252"/>
+      <w:del w:id="253" w:author="Dave Bridges" w:date="2024-08-28T17:58:00Z">
+        <w:r>
+          <w:delText>t</w:delText>
+        </w:r>
+      </w:del>
+      <w:r>
+        <w:t>ype 2 diabetes in humans</w:t>
       </w:r>
       <w:r>
         <w:t xml:space="preserve">.  This is the opposite trend observed for job related stress and diabetes incidence in the Whitehall II study, which showed a stronger obesity-stress-diabetes relationship in females than in males </w:t>
@@ -3988,16 +3976,16 @@
       <w:r>
         <w:t xml:space="preserve">DK107535 to </w:t>
       </w:r>
-      <w:commentRangeStart w:id="251"/>
+      <w:commentRangeStart w:id="254"/>
       <w:r>
         <w:t>DB</w:t>
       </w:r>
-      <w:commentRangeEnd w:id="251"/>
-      <w:r>
-        <w:rPr>
-          <w:rStyle w:val="CommentReference"/>
-        </w:rPr>
-        <w:commentReference w:id="251"/>
+      <w:commentRangeEnd w:id="254"/>
+      <w:r>
+        <w:rPr>
+          <w:rStyle w:val="CommentReference"/>
+        </w:rPr>
+        <w:commentReference w:id="254"/>
       </w:r>
       <w:r>
         <w:t>)</w:t>
@@ -6203,7 +6191,7 @@
       </w:r>
     </w:p>
   </w:comment>
-  <w:comment w:id="233" w:author="Bauer, Kate" w:date="2024-08-28T15:01:00Z" w:initials="BK">
+  <w:comment w:id="233" w:author="Dave Bridges" w:date="2024-08-28T17:57:00Z" w:initials="DB">
     <w:p>
       <w:pPr>
         <w:pStyle w:val="CommentText"/>
@@ -6215,11 +6203,27 @@
         <w:annotationRef/>
       </w:r>
       <w:r>
+        <w:t>We can remove if you think its distracting or secondary.</w:t>
+      </w:r>
+    </w:p>
+  </w:comment>
+  <w:comment w:id="234" w:author="Bauer, Kate" w:date="2024-08-28T15:01:00Z" w:initials="BK">
+    <w:p>
+      <w:pPr>
+        <w:pStyle w:val="CommentText"/>
+      </w:pPr>
+      <w:r>
+        <w:rPr>
+          <w:rStyle w:val="CommentReference"/>
+        </w:rPr>
+        <w:annotationRef/>
+      </w:r>
+      <w:r>
         <w:t>Still not clear what other co-morbidities you’re talking about.</w:t>
       </w:r>
     </w:p>
   </w:comment>
-  <w:comment w:id="234" w:author="Dave Bridges" w:date="2024-08-28T17:45:00Z" w:initials="DB">
+  <w:comment w:id="235" w:author="Dave Bridges" w:date="2024-08-28T17:45:00Z" w:initials="DB">
     <w:p>
       <w:pPr>
         <w:pStyle w:val="CommentText"/>
@@ -6243,7 +6247,7 @@
       </w:r>
     </w:p>
   </w:comment>
-  <w:comment w:id="240" w:author="Bauer, Kate" w:date="2024-08-28T15:02:00Z" w:initials="BK">
+  <w:comment w:id="241" w:author="Bauer, Kate" w:date="2024-08-28T15:02:00Z" w:initials="BK">
     <w:p>
       <w:pPr>
         <w:pStyle w:val="CommentText"/>
@@ -6259,7 +6263,7 @@
       </w:r>
     </w:p>
   </w:comment>
-  <w:comment w:id="248" w:author="Dave Bridges" w:date="2024-04-26T10:23:00Z" w:initials="DB">
+  <w:comment w:id="249" w:author="Dave Bridges" w:date="2024-04-26T10:23:00Z" w:initials="DB">
     <w:p>
       <w:r>
         <w:rPr>
@@ -6386,10 +6390,7 @@
         <w:fldChar w:fldCharType="begin"/>
       </w:r>
       <w:r>
-        <w:instrText xml:space="preserve"> HYPERLINK </w:instrText>
-      </w:r>
-      <w:r>
-        <w:instrText xml:space="preserve">"https://www.ncbi.nlm.nih.gov/pmc/articles/PMC5846936/" \l "bibr34-2055102918759691" </w:instrText>
+        <w:instrText xml:space="preserve"> HYPERLINK "https://www.ncbi.nlm.nih.gov/pmc/articles/PMC5846936/" \l "bibr34-2055102918759691" </w:instrText>
       </w:r>
       <w:r>
         <w:fldChar w:fldCharType="separate"/>
@@ -6497,10 +6498,7 @@
         <w:fldChar w:fldCharType="begin"/>
       </w:r>
       <w:r>
-        <w:instrText xml:space="preserve"> HYPERLINK "https://www.ncbi.nl</w:instrText>
-      </w:r>
-      <w:r>
-        <w:instrText xml:space="preserve">m.nih.gov/pmc/articles/PMC5846936/" \l "bibr50-2055102918759691" </w:instrText>
+        <w:instrText xml:space="preserve"> HYPERLINK "https://www.ncbi.nlm.nih.gov/pmc/articles/PMC5846936/" \l "bibr50-2055102918759691" </w:instrText>
       </w:r>
       <w:r>
         <w:fldChar w:fldCharType="separate"/>
@@ -6549,12 +6547,48 @@
         </w:rPr>
         <w:t>; </w:t>
       </w:r>
+      <w:hyperlink r:id="rId2" w:anchor="bibr48-2055102918759691" w:history="1">
+        <w:proofErr w:type="spellStart"/>
+        <w:r>
+          <w:rPr>
+            <w:rStyle w:val="Hyperlink"/>
+            <w:rFonts w:ascii="Cambria" w:hAnsi="Cambria"/>
+            <w:color w:val="376FAA"/>
+            <w:sz w:val="30"/>
+            <w:szCs w:val="30"/>
+            <w:shd w:val="clear" w:color="auto" w:fill="FFFFFF"/>
+          </w:rPr>
+          <w:t>Vartanian</w:t>
+        </w:r>
+        <w:proofErr w:type="spellEnd"/>
+        <w:r>
+          <w:rPr>
+            <w:rStyle w:val="Hyperlink"/>
+            <w:rFonts w:ascii="Cambria" w:hAnsi="Cambria"/>
+            <w:color w:val="376FAA"/>
+            <w:sz w:val="30"/>
+            <w:szCs w:val="30"/>
+            <w:shd w:val="clear" w:color="auto" w:fill="FFFFFF"/>
+          </w:rPr>
+          <w:t xml:space="preserve"> and Novak, 2011</w:t>
+        </w:r>
+      </w:hyperlink>
+      <w:r>
+        <w:rPr>
+          <w:rFonts w:ascii="Cambria" w:hAnsi="Cambria"/>
+          <w:color w:val="212121"/>
+          <w:sz w:val="30"/>
+          <w:szCs w:val="30"/>
+          <w:shd w:val="clear" w:color="auto" w:fill="FFFFFF"/>
+        </w:rPr>
+        <w:t>;), while others have found females experience higher rates of weight stigma and discrimination than males (</w:t>
+      </w:r>
       <w:proofErr w:type="spellStart"/>
       <w:r>
         <w:fldChar w:fldCharType="begin"/>
       </w:r>
       <w:r>
-        <w:instrText xml:space="preserve"> HYPERLINK "https://www.ncbi.nlm.nih.gov/pmc/articles/PMC5846936/" \l "bibr48-2055102918759691" </w:instrText>
+        <w:instrText xml:space="preserve"> HYPERLINK "https://www.ncbi.nlm.nih.gov/pmc/articles/PMC5846936/" \l "bibr1-2055102918759691" </w:instrText>
       </w:r>
       <w:r>
         <w:fldChar w:fldCharType="separate"/>
@@ -6568,7 +6602,7 @@
           <w:szCs w:val="30"/>
           <w:shd w:val="clear" w:color="auto" w:fill="FFFFFF"/>
         </w:rPr>
-        <w:t>Vartanian</w:t>
+        <w:t>Andreyeva</w:t>
       </w:r>
       <w:proofErr w:type="spellEnd"/>
       <w:r>
@@ -6580,7 +6614,7 @@
           <w:szCs w:val="30"/>
           <w:shd w:val="clear" w:color="auto" w:fill="FFFFFF"/>
         </w:rPr>
-        <w:t xml:space="preserve"> and Novak, 2011</w:t>
+        <w:t xml:space="preserve"> et al., 2008</w:t>
       </w:r>
       <w:r>
         <w:rPr>
@@ -6601,63 +6635,9 @@
           <w:szCs w:val="30"/>
           <w:shd w:val="clear" w:color="auto" w:fill="FFFFFF"/>
         </w:rPr>
-        <w:t>;), while others have found females experience higher rates of weight stigma and discrimination than males (</w:t>
-      </w:r>
-      <w:proofErr w:type="spellStart"/>
-      <w:r>
-        <w:fldChar w:fldCharType="begin"/>
-      </w:r>
-      <w:r>
-        <w:instrText xml:space="preserve"> HYPERLINK "https://www.ncbi.nlm.nih.gov/pmc/articles/PMC5846936/" \l "bibr1-2055102918759691" </w:instrText>
-      </w:r>
-      <w:r>
-        <w:fldChar w:fldCharType="separate"/>
-      </w:r>
-      <w:r>
-        <w:rPr>
-          <w:rStyle w:val="Hyperlink"/>
-          <w:rFonts w:ascii="Cambria" w:hAnsi="Cambria"/>
-          <w:color w:val="376FAA"/>
-          <w:sz w:val="30"/>
-          <w:szCs w:val="30"/>
-          <w:shd w:val="clear" w:color="auto" w:fill="FFFFFF"/>
-        </w:rPr>
-        <w:t>Andreyeva</w:t>
-      </w:r>
-      <w:proofErr w:type="spellEnd"/>
-      <w:r>
-        <w:rPr>
-          <w:rStyle w:val="Hyperlink"/>
-          <w:rFonts w:ascii="Cambria" w:hAnsi="Cambria"/>
-          <w:color w:val="376FAA"/>
-          <w:sz w:val="30"/>
-          <w:szCs w:val="30"/>
-          <w:shd w:val="clear" w:color="auto" w:fill="FFFFFF"/>
-        </w:rPr>
-        <w:t xml:space="preserve"> et al., 2008</w:t>
-      </w:r>
-      <w:r>
-        <w:rPr>
-          <w:rStyle w:val="Hyperlink"/>
-          <w:rFonts w:ascii="Cambria" w:hAnsi="Cambria"/>
-          <w:color w:val="376FAA"/>
-          <w:sz w:val="30"/>
-          <w:szCs w:val="30"/>
-          <w:shd w:val="clear" w:color="auto" w:fill="FFFFFF"/>
-        </w:rPr>
-        <w:fldChar w:fldCharType="end"/>
-      </w:r>
-      <w:r>
-        <w:rPr>
-          <w:rFonts w:ascii="Cambria" w:hAnsi="Cambria"/>
-          <w:color w:val="212121"/>
-          <w:sz w:val="30"/>
-          <w:szCs w:val="30"/>
-          <w:shd w:val="clear" w:color="auto" w:fill="FFFFFF"/>
-        </w:rPr>
         <w:t>; </w:t>
       </w:r>
-      <w:hyperlink r:id="rId2" w:anchor="bibr12-2055102918759691" w:history="1">
+      <w:hyperlink r:id="rId3" w:anchor="bibr12-2055102918759691" w:history="1">
         <w:r>
           <w:rPr>
             <w:rStyle w:val="Hyperlink"/>
@@ -6680,7 +6660,7 @@
         </w:rPr>
         <w:t>; </w:t>
       </w:r>
-      <w:hyperlink r:id="rId3" w:anchor="bibr14-2055102918759691" w:history="1">
+      <w:hyperlink r:id="rId4" w:anchor="bibr14-2055102918759691" w:history="1">
         <w:r>
           <w:rPr>
             <w:rStyle w:val="Hyperlink"/>
@@ -6708,10 +6688,7 @@
         <w:fldChar w:fldCharType="begin"/>
       </w:r>
       <w:r>
-        <w:instrText xml:space="preserve"> HYPERLINK "https://www.ncbi.nlm.nih.gov/pmc/articles/PMC5846936/" \l "bibr15-</w:instrText>
-      </w:r>
-      <w:r>
-        <w:instrText xml:space="preserve">2055102918759691" </w:instrText>
+        <w:instrText xml:space="preserve"> HYPERLINK "https://www.ncbi.nlm.nih.gov/pmc/articles/PMC5846936/" \l "bibr15-2055102918759691" </w:instrText>
       </w:r>
       <w:r>
         <w:fldChar w:fldCharType="separate"/>
@@ -6867,10 +6844,7 @@
         <w:fldChar w:fldCharType="begin"/>
       </w:r>
       <w:r>
-        <w:instrText xml:space="preserve"> HYPERLINK "https://www.ncbi.nlm.nih.gov/pmc/articles/PMC5846936/" \l "bibr32-2055102</w:instrText>
-      </w:r>
-      <w:r>
-        <w:instrText xml:space="preserve">918759691" </w:instrText>
+        <w:instrText xml:space="preserve"> HYPERLINK "https://www.ncbi.nlm.nih.gov/pmc/articles/PMC5846936/" \l "bibr32-2055102918759691" </w:instrText>
       </w:r>
       <w:r>
         <w:fldChar w:fldCharType="separate"/>
@@ -6995,7 +6969,7 @@
       </w:r>
     </w:p>
   </w:comment>
-  <w:comment w:id="251" w:author="Dave Bridges" w:date="2024-04-12T11:07:00Z" w:initials="DB">
+  <w:comment w:id="254" w:author="Dave Bridges" w:date="2024-04-12T11:07:00Z" w:initials="DB">
     <w:p>
       <w:pPr>
         <w:pStyle w:val="CommentText"/>
@@ -7105,6 +7079,7 @@
   <w15:commentEx w15:paraId="0A46ABCD" w15:paraIdParent="7BAD4EFF" w15:done="0"/>
   <w15:commentEx w15:paraId="1C8498E0" w15:done="0"/>
   <w15:commentEx w15:paraId="5AC9D4BE" w15:paraIdParent="1C8498E0" w15:done="0"/>
+  <w15:commentEx w15:paraId="3342DA09" w15:paraIdParent="1C8498E0" w15:done="0"/>
   <w15:commentEx w15:paraId="2B8D06E8" w15:done="0"/>
   <w15:commentEx w15:paraId="010507B3" w15:paraIdParent="2B8D06E8" w15:done="0"/>
   <w15:commentEx w15:paraId="50FED73B" w15:done="0"/>
@@ -7250,6 +7225,7 @@
   <w16cid:commentId w16cid:paraId="0A46ABCD" w16cid:durableId="2A79DFD4"/>
   <w16cid:commentId w16cid:paraId="1C8498E0" w16cid:durableId="50CA65D7"/>
   <w16cid:commentId w16cid:paraId="5AC9D4BE" w16cid:durableId="2A79E112"/>
+  <w16cid:commentId w16cid:paraId="3342DA09" w16cid:durableId="2A79E3D2"/>
   <w16cid:commentId w16cid:paraId="2B8D06E8" w16cid:durableId="147F910E"/>
   <w16cid:commentId w16cid:paraId="010507B3" w16cid:durableId="2A79E0C1"/>
   <w16cid:commentId w16cid:paraId="50FED73B" w16cid:durableId="1433B20F"/>

</xml_diff>

<commit_message>
Updated scripts, revised Table 1 to show chi-squared values
</commit_message>
<xml_diff>
--- a/manuscript/Obesity-Stress/Manuscript.docx
+++ b/manuscript/Obesity-Stress/Manuscript.docx
@@ -14,10 +14,15 @@
       </w:r>
       <w:ins w:id="1" w:author="Irit Hochberg" w:date="2024-08-29T08:41:00Z">
         <w:r>
-          <w:t xml:space="preserve">Association with </w:t>
-        </w:r>
-      </w:ins>
-      <w:del w:id="2" w:author="Irit Hochberg" w:date="2024-08-29T08:41:00Z">
+          <w:t>Association with</w:t>
+        </w:r>
+        <w:del w:id="2" w:author="Dave Bridges" w:date="2025-07-29T16:37:00Z" w16du:dateUtc="2025-07-29T20:37:00Z">
+          <w:r>
+            <w:delText xml:space="preserve"> </w:delText>
+          </w:r>
+        </w:del>
+      </w:ins>
+      <w:del w:id="3" w:author="Irit Hochberg" w:date="2024-08-29T08:41:00Z">
         <w:r>
           <w:delText>Impact on the Development of</w:delText>
         </w:r>
@@ -25,17 +30,17 @@
       <w:r>
         <w:t xml:space="preserve"> Diabetes</w:t>
       </w:r>
-      <w:ins w:id="3" w:author="Irit Hochberg" w:date="2024-08-29T08:43:00Z">
+      <w:ins w:id="4" w:author="Irit Hochberg" w:date="2024-08-29T08:43:00Z">
         <w:r>
           <w:t xml:space="preserve"> and </w:t>
         </w:r>
-        <w:del w:id="4" w:author="Dave Bridges" w:date="2025-07-28T19:43:00Z" w16du:dateUtc="2025-07-28T23:43:00Z">
+        <w:del w:id="5" w:author="Dave Bridges" w:date="2025-07-28T19:43:00Z" w16du:dateUtc="2025-07-28T23:43:00Z">
           <w:r>
             <w:delText>BMI</w:delText>
           </w:r>
         </w:del>
       </w:ins>
-      <w:ins w:id="5" w:author="Dave Bridges" w:date="2025-07-28T19:43:00Z" w16du:dateUtc="2025-07-28T23:43:00Z">
+      <w:ins w:id="6" w:author="Dave Bridges" w:date="2025-07-28T19:43:00Z" w16du:dateUtc="2025-07-28T23:43:00Z">
         <w:r>
           <w:t>Body Mass Index</w:t>
         </w:r>
@@ -43,28 +48,28 @@
       <w:r>
         <w:t xml:space="preserve"> </w:t>
       </w:r>
-      <w:del w:id="6" w:author="Irit Hochberg" w:date="2024-08-29T08:43:00Z">
+      <w:del w:id="7" w:author="Irit Hochberg" w:date="2024-08-29T08:43:00Z">
         <w:r>
           <w:delText>in Obese Individuals</w:delText>
         </w:r>
       </w:del>
-      <w:del w:id="7" w:author="Irit Hochberg" w:date="2024-08-29T08:41:00Z">
+      <w:del w:id="8" w:author="Irit Hochberg" w:date="2024-08-29T08:41:00Z">
         <w:r>
           <w:delText xml:space="preserve">: A Comprehensive </w:delText>
         </w:r>
-        <w:commentRangeStart w:id="8"/>
+        <w:commentRangeStart w:id="9"/>
         <w:r>
           <w:delText>Analysis</w:delText>
         </w:r>
       </w:del>
-      <w:commentRangeEnd w:id="8"/>
+      <w:commentRangeEnd w:id="9"/>
       <w:r>
         <w:rPr>
           <w:rStyle w:val="CommentReference"/>
           <w:sz w:val="56"/>
           <w:szCs w:val="56"/>
         </w:rPr>
-        <w:commentReference w:id="8"/>
+        <w:commentReference w:id="9"/>
       </w:r>
     </w:p>
     <w:p/>
@@ -118,21 +123,21 @@
       <w:r>
         <w:t xml:space="preserve"> </w:t>
       </w:r>
-      <w:commentRangeStart w:id="9"/>
+      <w:commentRangeStart w:id="10"/>
       <w:r>
         <w:t xml:space="preserve">expanding our knowledge regarding the </w:t>
       </w:r>
       <w:r>
         <w:t xml:space="preserve">associations </w:t>
       </w:r>
-      <w:commentRangeEnd w:id="9"/>
+      <w:commentRangeEnd w:id="10"/>
       <w:r>
         <w:rPr>
           <w:rStyle w:val="CommentReference"/>
           <w:sz w:val="24"/>
           <w:szCs w:val="24"/>
         </w:rPr>
-        <w:commentReference w:id="9"/>
+        <w:commentReference w:id="10"/>
       </w:r>
       <w:r>
         <w:t>between perceived stress</w:t>
@@ -152,7 +157,7 @@
       <w:r>
         <w:t xml:space="preserve"> and type 2 diabetes </w:t>
       </w:r>
-      <w:commentRangeStart w:id="10"/>
+      <w:commentRangeStart w:id="11"/>
       <w:r>
         <w:t>prevalence</w:t>
       </w:r>
@@ -162,13 +167,13 @@
       <w:r>
         <w:t xml:space="preserve">, testing the </w:t>
       </w:r>
-      <w:ins w:id="11" w:author="Irit Hochberg" w:date="2024-08-29T08:47:00Z">
+      <w:ins w:id="12" w:author="Irit Hochberg" w:date="2024-08-29T08:47:00Z">
         <w:r>
           <w:t>relationship between</w:t>
         </w:r>
       </w:ins>
-      <w:ins w:id="12" w:author="Dave Bridges" w:date="2024-08-28T17:03:00Z">
-        <w:del w:id="13" w:author="Irit Hochberg" w:date="2024-08-29T08:46:00Z">
+      <w:ins w:id="13" w:author="Dave Bridges" w:date="2024-08-28T17:03:00Z">
+        <w:del w:id="14" w:author="Irit Hochberg" w:date="2024-08-29T08:46:00Z">
           <w:r>
             <w:delText>hypothesis</w:delText>
           </w:r>
@@ -176,7 +181,7 @@
         <w:r>
           <w:t xml:space="preserve"> </w:t>
         </w:r>
-        <w:del w:id="14" w:author="Irit Hochberg" w:date="2024-08-29T08:47:00Z">
+        <w:del w:id="15" w:author="Irit Hochberg" w:date="2024-08-29T08:47:00Z">
           <w:r>
             <w:delText xml:space="preserve">that </w:delText>
           </w:r>
@@ -185,11 +190,11 @@
           <w:t>obesit</w:t>
         </w:r>
       </w:ins>
-      <w:ins w:id="15" w:author="Dave Bridges" w:date="2024-08-28T17:04:00Z">
+      <w:ins w:id="16" w:author="Dave Bridges" w:date="2024-08-28T17:04:00Z">
         <w:r>
           <w:t xml:space="preserve">y and chronic psychosocial stress </w:t>
         </w:r>
-        <w:del w:id="16" w:author="Irit Hochberg" w:date="2024-08-29T08:47:00Z">
+        <w:del w:id="17" w:author="Irit Hochberg" w:date="2024-08-29T08:47:00Z">
           <w:r>
             <w:delText xml:space="preserve">are associated </w:delText>
           </w:r>
@@ -197,7 +202,7 @@
         <w:r>
           <w:t xml:space="preserve">with </w:t>
         </w:r>
-        <w:del w:id="17" w:author="Irit Hochberg" w:date="2024-08-29T08:47:00Z">
+        <w:del w:id="18" w:author="Irit Hochberg" w:date="2024-08-29T08:47:00Z">
           <w:r>
             <w:delText>an increased</w:delText>
           </w:r>
@@ -209,14 +214,14 @@
       <w:r>
         <w:t xml:space="preserve">.  </w:t>
       </w:r>
-      <w:commentRangeEnd w:id="10"/>
+      <w:commentRangeEnd w:id="11"/>
       <w:r>
         <w:rPr>
           <w:rStyle w:val="CommentReference"/>
           <w:sz w:val="24"/>
           <w:szCs w:val="24"/>
         </w:rPr>
-        <w:commentReference w:id="10"/>
+        <w:commentReference w:id="11"/>
       </w:r>
       <w:r>
         <w:t xml:space="preserve">Perceived stress was positively associated with type 2 diabetes, and this </w:t>
@@ -224,15 +229,15 @@
       <w:r>
         <w:t xml:space="preserve">relationship </w:t>
       </w:r>
-      <w:commentRangeStart w:id="18"/>
-      <w:commentRangeEnd w:id="18"/>
+      <w:commentRangeStart w:id="19"/>
+      <w:commentRangeEnd w:id="19"/>
       <w:r>
         <w:rPr>
           <w:rStyle w:val="CommentReference"/>
           <w:sz w:val="24"/>
           <w:szCs w:val="24"/>
         </w:rPr>
-        <w:commentReference w:id="18"/>
+        <w:commentReference w:id="19"/>
       </w:r>
       <w:r>
         <w:t xml:space="preserve">was </w:t>
@@ -264,12 +269,12 @@
       <w:r>
         <w:t xml:space="preserve"> we found that perceived stress </w:t>
       </w:r>
-      <w:commentRangeStart w:id="19"/>
       <w:commentRangeStart w:id="20"/>
+      <w:commentRangeStart w:id="21"/>
       <w:r>
         <w:t xml:space="preserve">enhanced type 2 </w:t>
       </w:r>
-      <w:ins w:id="21" w:author="Irit Hochberg" w:date="2024-08-29T08:48:00Z">
+      <w:ins w:id="22" w:author="Irit Hochberg" w:date="2024-08-29T08:48:00Z">
         <w:r>
           <w:t xml:space="preserve">diabetes </w:t>
         </w:r>
@@ -277,23 +282,23 @@
       <w:r>
         <w:t xml:space="preserve">prevalence by 13% above that </w:t>
       </w:r>
-      <w:commentRangeEnd w:id="19"/>
+      <w:commentRangeEnd w:id="20"/>
       <w:r>
         <w:rPr>
           <w:rStyle w:val="CommentReference"/>
           <w:sz w:val="24"/>
           <w:szCs w:val="24"/>
         </w:rPr>
-        <w:commentReference w:id="19"/>
-      </w:r>
-      <w:commentRangeEnd w:id="20"/>
+        <w:commentReference w:id="20"/>
+      </w:r>
+      <w:commentRangeEnd w:id="21"/>
       <w:r>
         <w:rPr>
           <w:rStyle w:val="CommentReference"/>
           <w:sz w:val="24"/>
           <w:szCs w:val="24"/>
         </w:rPr>
-        <w:commentReference w:id="20"/>
+        <w:commentReference w:id="21"/>
       </w:r>
       <w:r>
         <w:t>expected by obesity or stress alone.</w:t>
@@ -301,7 +306,7 @@
       <w:r>
         <w:t xml:space="preserve">  Similar analyses evaluating the effects of obesity and self-reported psychosocial stress demonstrated additive but not synergistic effects on other obesity relate</w:t>
       </w:r>
-      <w:commentRangeStart w:id="22"/>
+      <w:commentRangeStart w:id="23"/>
       <w:r>
         <w:t>d comorbidities</w:t>
       </w:r>
@@ -311,19 +316,19 @@
       <w:r>
         <w:t xml:space="preserve">. </w:t>
       </w:r>
-      <w:commentRangeEnd w:id="22"/>
+      <w:commentRangeEnd w:id="23"/>
       <w:r>
         <w:rPr>
           <w:rStyle w:val="CommentReference"/>
           <w:sz w:val="24"/>
           <w:szCs w:val="24"/>
         </w:rPr>
-        <w:commentReference w:id="22"/>
+        <w:commentReference w:id="23"/>
       </w:r>
       <w:r>
         <w:t xml:space="preserve">These data support </w:t>
       </w:r>
-      <w:commentRangeStart w:id="23"/>
+      <w:commentRangeStart w:id="24"/>
       <w:r>
         <w:t>other pre-clinical and epidemiological studies</w:t>
       </w:r>
@@ -342,14 +347,14 @@
       <w:r>
         <w:t>the risk of type 2 diabetes.</w:t>
       </w:r>
-      <w:commentRangeEnd w:id="23"/>
+      <w:commentRangeEnd w:id="24"/>
       <w:r>
         <w:rPr>
           <w:rStyle w:val="CommentReference"/>
           <w:sz w:val="24"/>
           <w:szCs w:val="24"/>
         </w:rPr>
-        <w:commentReference w:id="23"/>
+        <w:commentReference w:id="24"/>
       </w:r>
     </w:p>
     <w:p>
@@ -369,19 +374,19 @@
       <w:pPr>
         <w:pStyle w:val="Heading1"/>
       </w:pPr>
-      <w:commentRangeStart w:id="24"/>
+      <w:commentRangeStart w:id="25"/>
       <w:r>
         <w:lastRenderedPageBreak/>
         <w:t>Introduction</w:t>
       </w:r>
-      <w:commentRangeEnd w:id="24"/>
+      <w:commentRangeEnd w:id="25"/>
       <w:r>
         <w:rPr>
           <w:rStyle w:val="CommentReference"/>
           <w:sz w:val="32"/>
           <w:szCs w:val="32"/>
         </w:rPr>
-        <w:commentReference w:id="24"/>
+        <w:commentReference w:id="25"/>
       </w:r>
     </w:p>
     <w:p/>
@@ -503,8 +508,8 @@
       <w:r>
         <w:t xml:space="preserve">Furthermore, </w:t>
       </w:r>
-      <w:commentRangeStart w:id="25"/>
       <w:commentRangeStart w:id="26"/>
+      <w:commentRangeStart w:id="27"/>
       <w:r>
         <w:t xml:space="preserve">stress often correlates with unhealthy lifestyle choices, such as poor diet and physical inactivity, which are </w:t>
       </w:r>
@@ -551,39 +556,39 @@
       <w:r>
         <w:t xml:space="preserve"> </w:t>
       </w:r>
-      <w:commentRangeEnd w:id="25"/>
+      <w:commentRangeEnd w:id="26"/>
       <w:r>
         <w:rPr>
           <w:rStyle w:val="CommentReference"/>
           <w:sz w:val="24"/>
           <w:szCs w:val="24"/>
         </w:rPr>
-        <w:commentReference w:id="25"/>
-      </w:r>
-      <w:commentRangeEnd w:id="26"/>
+        <w:commentReference w:id="26"/>
+      </w:r>
+      <w:commentRangeEnd w:id="27"/>
       <w:r>
         <w:rPr>
           <w:rStyle w:val="CommentReference"/>
           <w:sz w:val="24"/>
           <w:szCs w:val="24"/>
         </w:rPr>
-        <w:commentReference w:id="26"/>
-      </w:r>
-      <w:commentRangeStart w:id="27"/>
+        <w:commentReference w:id="27"/>
+      </w:r>
+      <w:commentRangeStart w:id="28"/>
       <w:r>
         <w:t>Our team has</w:t>
       </w:r>
       <w:r>
         <w:t xml:space="preserve"> </w:t>
       </w:r>
-      <w:commentRangeEnd w:id="27"/>
+      <w:commentRangeEnd w:id="28"/>
       <w:r>
         <w:rPr>
           <w:rStyle w:val="CommentReference"/>
           <w:sz w:val="24"/>
           <w:szCs w:val="24"/>
         </w:rPr>
-        <w:commentReference w:id="27"/>
+        <w:commentReference w:id="28"/>
       </w:r>
       <w:r>
         <w:t>shown in mice that chronically elevated external glucocorticoids act synergistically with diet-induced obesity, leading to exacerbations in metabolic dysfunction</w:t>
@@ -618,7 +623,7 @@
     </w:p>
     <w:p/>
     <w:p>
-      <w:ins w:id="28" w:author="Irit Hochberg" w:date="2024-08-29T09:40:00Z">
+      <w:ins w:id="29" w:author="Irit Hochberg" w:date="2024-08-29T09:40:00Z">
         <w:r>
           <w:t>S</w:t>
         </w:r>
@@ -626,32 +631,32 @@
           <w:t>everal studies have identified a</w:t>
         </w:r>
       </w:ins>
-      <w:ins w:id="29" w:author="Irit Hochberg" w:date="2024-08-29T11:06:00Z">
+      <w:ins w:id="30" w:author="Irit Hochberg" w:date="2024-08-29T11:06:00Z">
         <w:r>
           <w:t>n</w:t>
         </w:r>
       </w:ins>
-      <w:ins w:id="30" w:author="Irit Hochberg" w:date="2024-08-29T09:40:00Z">
+      <w:ins w:id="31" w:author="Irit Hochberg" w:date="2024-08-29T09:40:00Z">
         <w:r>
           <w:t xml:space="preserve"> association between stress and the development of diabetes</w:t>
         </w:r>
       </w:ins>
-      <w:ins w:id="31" w:author="Irit Hochberg" w:date="2024-08-29T09:42:00Z">
+      <w:ins w:id="32" w:author="Irit Hochberg" w:date="2024-08-29T09:42:00Z">
         <w:r>
           <w:t>.</w:t>
         </w:r>
       </w:ins>
-      <w:ins w:id="32" w:author="Irit Hochberg" w:date="2024-08-29T09:40:00Z">
+      <w:ins w:id="33" w:author="Irit Hochberg" w:date="2024-08-29T09:40:00Z">
         <w:r>
           <w:t xml:space="preserve"> </w:t>
         </w:r>
       </w:ins>
-      <w:ins w:id="33" w:author="Irit Hochberg" w:date="2024-08-29T11:06:00Z">
+      <w:ins w:id="34" w:author="Irit Hochberg" w:date="2024-08-29T11:06:00Z">
         <w:r>
           <w:t xml:space="preserve">Many stressor, such as </w:t>
         </w:r>
       </w:ins>
-      <w:ins w:id="34" w:author="Irit Hochberg" w:date="2024-08-29T09:42:00Z">
+      <w:ins w:id="35" w:author="Irit Hochberg" w:date="2024-08-29T09:42:00Z">
         <w:r>
           <w:t xml:space="preserve">adverse childhood experiences  </w:t>
         </w:r>
@@ -662,7 +667,7 @@
       <w:r>
         <w:instrText xml:space="preserve"> ADDIN ZOTERO_ITEM CSL_CITATION {"citationID":"xTFeHYVe","properties":{"formattedCitation":"(6)","plainCitation":"(6)","noteIndex":0},"citationItems":[{"id":11564,"uris":["http://zotero.org/users/7317906/items/M9DE89XP"],"itemData":{"id":11564,"type":"article-journal","abstract":"Background\nThe association between adverse childhood experiences (ACEs) and diabetes is unclear. This systematic review and meta-analysis aims to quantify the association between the number and types of ACEs and diabetes during adulthood based on available observational studies.\n\nMethods\nA comprehensive literature search of studies exploring the association between ACEs and diabetes was conducted in PubMed, Medline, and Embase databases until 15 April 2022. A random-effects model was used to pool odds ratios (ORs) and 95% confidence intervals (CIs) for the number and types of ACEs with diabetes. Regarding the association between the number of ACEs and diabetes, we used funnel plots to examine publication bias, subgroup analysis to explore sources of heterogeneity, and sensitivity analysis to explore the robustness of the pooled results.\n\nResults\nA total of 49 studies were included. Individuals with higher continuous ACEs (per each additional ACE: OR = 1.06, 95% CI = 1.02-1.10), any ACE (OR = 1.22, 95% CI = 1.16-1.28), or ≥4 ACEs (OR = 1.44, 95% CI = 1.27-1.63) were at an increased risk of diabetes in adulthood when compared with individuals without ACEs. Across specific ACE types, childhood economic adversity (OR = 1.11, 95% CI = 1.04-1.19), physical abuse (OR = 1.14, 95% CI = 1.07-1.21), sexual abuse (OR = 1.25, 95% CI = 1.12-1.39), verbal abuse (OR = 1.11, 95% CI = 1.03-1.20), and incarceration (OR = 1.22, 95% CI = 1.03-1.45) were associated with diabetes. However, neglect, emotional abuse, domestic violence, parental divorce or separation, parental death, and living with a family member with substance abuse or mental disorders were not significantly associated with diabetes.\n\nConclusions\nIndividuals with ACEs may have a cumulative risk for diabetes in adulthood. It is critical to prevent ACEs and build resilience in individuals affected by ACEs.","container-title":"Journal of Global Health","DOI":"10.7189/jogh.12.04082","ISSN":"2047-2978","journalAbbreviation":"J Glob Health","note":"PMID: 36318589\nPMCID: PMC9624439","page":"04082","source":"PubMed Central","title":"Adverse childhood experiences and risk of diabetes: A systematic review and meta-analysis","title-short":"Adverse childhood experiences and risk of diabetes","volume":"12","author":[{"family":"Zhu","given":"Siyu"},{"family":"Shan","given":"Shiyi"},{"family":"Liu","given":"Wen"},{"family":"Li","given":"Shuting"},{"family":"Hou","given":"Leying"},{"family":"Huang","given":"Xuanyin"},{"family":"Liu","given":"Yi"},{"family":"Yi","given":"Qian"},{"family":"Sun","given":"Weidi"},{"family":"Tang","given":"Kun"},{"family":"Adeloye","given":"Davies"},{"family":"Rudan","given":"Igor"},{"family":"Song","given":"Peige"}],"citation-key":"zhuAdverseChildhoodExperiences"}}],"schema":"https://github.com/citation-style-language/schema/raw/master/csl-citation.json"} </w:instrText>
       </w:r>
-      <w:ins w:id="35" w:author="Irit Hochberg" w:date="2024-08-29T09:42:00Z">
+      <w:ins w:id="36" w:author="Irit Hochberg" w:date="2024-08-29T09:42:00Z">
         <w:r>
           <w:fldChar w:fldCharType="separate"/>
         </w:r>
@@ -673,12 +678,12 @@
         </w:rPr>
         <w:t>(6)</w:t>
       </w:r>
-      <w:ins w:id="36" w:author="Irit Hochberg" w:date="2024-08-29T09:42:00Z">
+      <w:ins w:id="37" w:author="Irit Hochberg" w:date="2024-08-29T09:42:00Z">
         <w:r>
           <w:fldChar w:fldCharType="end"/>
         </w:r>
       </w:ins>
-      <w:ins w:id="37" w:author="Irit Hochberg" w:date="2024-08-29T11:06:00Z">
+      <w:ins w:id="38" w:author="Irit Hochberg" w:date="2024-08-29T11:06:00Z">
         <w:r>
           <w:t xml:space="preserve">, stressful life experiences </w:t>
         </w:r>
@@ -701,7 +706,7 @@
       <w:r>
         <w:fldChar w:fldCharType="end"/>
       </w:r>
-      <w:ins w:id="38" w:author="Irit Hochberg" w:date="2024-08-29T09:42:00Z">
+      <w:ins w:id="39" w:author="Irit Hochberg" w:date="2024-08-29T09:42:00Z">
         <w:r>
           <w:t xml:space="preserve"> and job-related stress </w:t>
         </w:r>
@@ -712,7 +717,7 @@
       <w:r>
         <w:instrText xml:space="preserve"> ADDIN ZOTERO_ITEM CSL_CITATION {"citationID":"st3OFhFV","properties":{"formattedCitation":"(8)","plainCitation":"(8)","noteIndex":0},"citationItems":[{"id":8716,"uris":["http://zotero.org/users/7317906/items/K39JC8JQ"],"itemData":{"id":8716,"type":"article-journal","abstract":"OBJECTIVE - To investigate the effect of psychosocial stress at work on risk of type 2 diabetes, adjusting for conventional risk factors, among a sample of British, white-collar, middleaged men and women. RESEARCH DESIGN AND METHODS - This was a prospective analysis (1991-2004) from the Whitehall II cohort study. The current sample consists of 5,895 Caucasian middle-aged civil servants free from diabetes at baseline. Type 2 diabetes was ascertained by an oral glucose tolerance test supplemented by self-reports at baseline and four consecutive waves of data collection including two screening phases. The job strain and iso-strain models were used to assess psychosocial work stress. RESULTS- Iso-strain in the workplace was associated with a twofold higher risk of type 2 diabetes in age-adjusted analysis in women but not in men (hazard ratio 1.94 [95% CI 1.17-3.21). This effect remained robust to adjustment for socioeconomic position and outside work stressors and was only attenuated by 20% after adjustment for health behaviors, obesity, and other type 2 diabetes risk factors. CONCLUSIONS - Psychosocial work stress was an independent predictor of type 2 diabetes among women after a 15-year follow-up. This association was not explained by potential confounding and mediating factors. More evidence from prospective studies using the same work stress models is needed to support the current findings and provide further information on sex differences. © 2009 by the American Diabetes Association.","container-title":"Diabetes Care","DOI":"10.2337/dc09-0132","ISSN":"01495992","issue":"12","note":"PMID: 19720842\nCitation Key: Heraclides2009","page":"2230-2235","title":"Psychosocial stress at work doubles the risk of type 2 diabetes in middle-aged women: Evidence from the Whitehall II study","volume":"32","author":[{"family":"Heraclides","given":"Alexandros M."},{"family":"Chandola","given":"Tarani"},{"family":"Witte","given":"Daniel R."},{"family":"Brunner","given":"Eric J."}],"issued":{"date-parts":[["2009"]]},"citation-key":"Heraclides2009"}}],"schema":"https://github.com/citation-style-language/schema/raw/master/csl-citation.json"} </w:instrText>
       </w:r>
-      <w:ins w:id="39" w:author="Irit Hochberg" w:date="2024-08-29T09:42:00Z">
+      <w:ins w:id="40" w:author="Irit Hochberg" w:date="2024-08-29T09:42:00Z">
         <w:r>
           <w:fldChar w:fldCharType="separate"/>
         </w:r>
@@ -728,21 +733,21 @@
         <w:r>
           <w:t xml:space="preserve"> are associated with diabetes risk.  </w:t>
         </w:r>
-        <w:commentRangeStart w:id="40"/>
-        <w:commentRangeEnd w:id="40"/>
+        <w:commentRangeStart w:id="41"/>
+        <w:commentRangeEnd w:id="41"/>
         <w:r>
           <w:rPr>
             <w:rStyle w:val="CommentReference"/>
             <w:sz w:val="24"/>
             <w:szCs w:val="24"/>
           </w:rPr>
-          <w:commentReference w:id="40"/>
+          <w:commentReference w:id="41"/>
         </w:r>
         <w:r>
           <w:t xml:space="preserve"> </w:t>
         </w:r>
       </w:ins>
-      <w:ins w:id="41" w:author="Irit Hochberg" w:date="2024-08-29T09:40:00Z">
+      <w:ins w:id="42" w:author="Irit Hochberg" w:date="2024-08-29T09:40:00Z">
         <w:r>
           <w:t xml:space="preserve">However, </w:t>
         </w:r>
@@ -755,23 +760,23 @@
         <w:r>
           <w:t>on diabetes</w:t>
         </w:r>
-        <w:commentRangeStart w:id="42"/>
-        <w:commentRangeEnd w:id="42"/>
+        <w:commentRangeStart w:id="43"/>
+        <w:commentRangeEnd w:id="43"/>
         <w:r>
           <w:rPr>
             <w:rStyle w:val="CommentReference"/>
             <w:sz w:val="24"/>
             <w:szCs w:val="24"/>
           </w:rPr>
-          <w:commentReference w:id="42"/>
+          <w:commentReference w:id="43"/>
         </w:r>
         <w:r>
           <w:t xml:space="preserve">. </w:t>
         </w:r>
       </w:ins>
-      <w:commentRangeStart w:id="43"/>
       <w:commentRangeStart w:id="44"/>
-      <w:del w:id="45" w:author="Irit Hochberg" w:date="2024-08-29T09:40:00Z">
+      <w:commentRangeStart w:id="45"/>
+      <w:del w:id="46" w:author="Irit Hochberg" w:date="2024-08-29T09:40:00Z">
         <w:r>
           <w:delText>The only major</w:delText>
         </w:r>
@@ -788,7 +793,7 @@
           <w:delText>addressed the combined effect of stress and obesity on diabetes is t</w:delText>
         </w:r>
       </w:del>
-      <w:ins w:id="46" w:author="Irit Hochberg" w:date="2024-08-29T09:40:00Z">
+      <w:ins w:id="47" w:author="Irit Hochberg" w:date="2024-08-29T09:40:00Z">
         <w:r>
           <w:t>T</w:t>
         </w:r>
@@ -796,12 +801,12 @@
       <w:r>
         <w:t>he Whitehall II study</w:t>
       </w:r>
-      <w:ins w:id="47" w:author="Irit Hochberg" w:date="2024-08-29T09:41:00Z">
+      <w:ins w:id="48" w:author="Irit Hochberg" w:date="2024-08-29T09:41:00Z">
         <w:r>
           <w:t xml:space="preserve"> </w:t>
         </w:r>
       </w:ins>
-      <w:del w:id="48" w:author="Irit Hochberg" w:date="2024-08-29T09:41:00Z">
+      <w:del w:id="49" w:author="Irit Hochberg" w:date="2024-08-29T09:41:00Z">
         <w:r>
           <w:delText xml:space="preserve">, </w:delText>
         </w:r>
@@ -818,7 +823,7 @@
       <w:r>
         <w:t xml:space="preserve"> of diabetes in </w:t>
       </w:r>
-      <w:commentRangeStart w:id="49"/>
+      <w:commentRangeStart w:id="50"/>
       <w:r>
         <w:t>women</w:t>
       </w:r>
@@ -828,19 +833,19 @@
       <w:r>
         <w:t xml:space="preserve">, </w:t>
       </w:r>
-      <w:commentRangeEnd w:id="49"/>
+      <w:commentRangeEnd w:id="50"/>
       <w:r>
         <w:rPr>
           <w:rStyle w:val="CommentReference"/>
           <w:sz w:val="24"/>
           <w:szCs w:val="24"/>
         </w:rPr>
-        <w:commentReference w:id="49"/>
+        <w:commentReference w:id="50"/>
       </w:r>
       <w:r>
         <w:t xml:space="preserve">with no apparent effect in </w:t>
       </w:r>
-      <w:del w:id="50" w:author="Irit Hochberg" w:date="2024-08-29T08:57:00Z">
+      <w:del w:id="51" w:author="Irit Hochberg" w:date="2024-08-29T08:57:00Z">
         <w:r>
           <w:delText xml:space="preserve">obese </w:delText>
         </w:r>
@@ -848,7 +853,7 @@
       <w:r>
         <w:t xml:space="preserve">men </w:t>
       </w:r>
-      <w:ins w:id="51" w:author="Irit Hochberg" w:date="2024-08-29T08:57:00Z">
+      <w:ins w:id="52" w:author="Irit Hochberg" w:date="2024-08-29T08:57:00Z">
         <w:r>
           <w:t xml:space="preserve">with obesity </w:t>
         </w:r>
@@ -859,7 +864,7 @@
       <w:r>
         <w:t xml:space="preserve"> </w:t>
       </w:r>
-      <w:del w:id="52" w:author="Irit Hochberg" w:date="2024-08-29T08:58:00Z">
+      <w:del w:id="53" w:author="Irit Hochberg" w:date="2024-08-29T08:58:00Z">
         <w:r>
           <w:delText xml:space="preserve">lean </w:delText>
         </w:r>
@@ -867,17 +872,17 @@
       <w:r>
         <w:t>women</w:t>
       </w:r>
-      <w:ins w:id="53" w:author="Irit Hochberg" w:date="2024-08-29T08:58:00Z">
+      <w:ins w:id="54" w:author="Irit Hochberg" w:date="2024-08-29T08:58:00Z">
         <w:r>
           <w:t xml:space="preserve"> with</w:t>
         </w:r>
       </w:ins>
-      <w:ins w:id="54" w:author="Irit Hochberg" w:date="2024-08-29T11:46:00Z">
+      <w:ins w:id="55" w:author="Irit Hochberg" w:date="2024-08-29T11:46:00Z">
         <w:r>
           <w:t xml:space="preserve"> a healthy weight</w:t>
         </w:r>
       </w:ins>
-      <w:ins w:id="55" w:author="Irit Hochberg" w:date="2024-08-29T08:58:00Z">
+      <w:ins w:id="56" w:author="Irit Hochberg" w:date="2024-08-29T08:58:00Z">
         <w:r>
           <w:t xml:space="preserve"> </w:t>
         </w:r>
@@ -906,28 +911,28 @@
       <w:r>
         <w:t>.</w:t>
       </w:r>
-      <w:commentRangeEnd w:id="43"/>
+      <w:commentRangeEnd w:id="44"/>
       <w:r>
         <w:rPr>
           <w:rStyle w:val="CommentReference"/>
           <w:sz w:val="24"/>
           <w:szCs w:val="24"/>
         </w:rPr>
-        <w:commentReference w:id="43"/>
-      </w:r>
-      <w:commentRangeEnd w:id="44"/>
+        <w:commentReference w:id="44"/>
+      </w:r>
+      <w:commentRangeEnd w:id="45"/>
       <w:r>
         <w:rPr>
           <w:rStyle w:val="CommentReference"/>
           <w:sz w:val="24"/>
           <w:szCs w:val="24"/>
         </w:rPr>
-        <w:commentReference w:id="44"/>
+        <w:commentReference w:id="45"/>
       </w:r>
       <w:r>
         <w:t xml:space="preserve"> </w:t>
       </w:r>
-      <w:del w:id="56" w:author="Irit Hochberg" w:date="2024-08-29T09:40:00Z">
+      <w:del w:id="57" w:author="Irit Hochberg" w:date="2024-08-29T09:40:00Z">
         <w:r>
           <w:delText>S</w:delText>
         </w:r>
@@ -935,8 +940,8 @@
           <w:delText xml:space="preserve">everal studies have identified a robust association between stress and the development of diabetes, </w:delText>
         </w:r>
       </w:del>
-      <w:commentRangeStart w:id="57"/>
-      <w:del w:id="58" w:author="Irit Hochberg" w:date="2024-08-29T08:59:00Z">
+      <w:commentRangeStart w:id="58"/>
+      <w:del w:id="59" w:author="Irit Hochberg" w:date="2024-08-29T08:59:00Z">
         <w:r>
           <w:delText>but</w:delText>
         </w:r>
@@ -953,77 +958,77 @@
           <w:delText>whether the metabolic effect of stress is different between obese and lean individuals</w:delText>
         </w:r>
       </w:del>
-      <w:commentRangeEnd w:id="57"/>
-      <w:del w:id="59" w:author="Irit Hochberg" w:date="2024-08-29T09:40:00Z">
+      <w:commentRangeEnd w:id="58"/>
+      <w:del w:id="60" w:author="Irit Hochberg" w:date="2024-08-29T09:40:00Z">
         <w:r>
           <w:rPr>
             <w:rStyle w:val="CommentReference"/>
             <w:sz w:val="24"/>
             <w:szCs w:val="24"/>
           </w:rPr>
-          <w:commentReference w:id="57"/>
+          <w:commentReference w:id="58"/>
         </w:r>
         <w:r>
           <w:delText xml:space="preserve">. </w:delText>
         </w:r>
-        <w:commentRangeStart w:id="60"/>
+        <w:commentRangeStart w:id="61"/>
         <w:r>
           <w:delText>A</w:delText>
         </w:r>
       </w:del>
-      <w:del w:id="61" w:author="Dave Bridges" w:date="2024-08-28T17:12:00Z">
+      <w:del w:id="62" w:author="Dave Bridges" w:date="2024-08-28T17:12:00Z">
         <w:r>
           <w:delText xml:space="preserve"> </w:delText>
         </w:r>
       </w:del>
-      <w:ins w:id="62" w:author="Dave Bridges" w:date="2024-08-28T17:12:00Z">
-        <w:del w:id="63" w:author="Irit Hochberg" w:date="2024-08-29T09:41:00Z">
+      <w:ins w:id="63" w:author="Dave Bridges" w:date="2024-08-28T17:12:00Z">
+        <w:del w:id="64" w:author="Irit Hochberg" w:date="2024-08-29T09:41:00Z">
           <w:r>
             <w:delText>For example,</w:delText>
           </w:r>
         </w:del>
-        <w:del w:id="64" w:author="Irit Hochberg" w:date="2024-08-29T11:09:00Z">
+        <w:del w:id="65" w:author="Irit Hochberg" w:date="2024-08-29T11:09:00Z">
           <w:r>
             <w:delText xml:space="preserve"> </w:delText>
           </w:r>
         </w:del>
       </w:ins>
-      <w:del w:id="65" w:author="Irit Hochberg" w:date="2024-08-29T11:09:00Z">
+      <w:del w:id="66" w:author="Irit Hochberg" w:date="2024-08-29T11:09:00Z">
         <w:r>
           <w:delText>A</w:delText>
         </w:r>
       </w:del>
-      <w:ins w:id="66" w:author="Irit Hochberg" w:date="2024-08-29T11:08:00Z">
+      <w:ins w:id="67" w:author="Irit Hochberg" w:date="2024-08-29T11:08:00Z">
         <w:r>
           <w:t xml:space="preserve"> </w:t>
         </w:r>
       </w:ins>
-      <w:ins w:id="67" w:author="Irit Hochberg" w:date="2024-08-29T11:09:00Z">
+      <w:ins w:id="68" w:author="Irit Hochberg" w:date="2024-08-29T11:09:00Z">
         <w:r>
           <w:t>A</w:t>
         </w:r>
       </w:ins>
-      <w:ins w:id="68" w:author="Irit Hochberg" w:date="2024-08-29T11:10:00Z">
+      <w:ins w:id="69" w:author="Irit Hochberg" w:date="2024-08-29T11:10:00Z">
         <w:r>
           <w:t>n</w:t>
         </w:r>
       </w:ins>
-      <w:ins w:id="69" w:author="Irit Hochberg" w:date="2024-08-29T11:09:00Z">
+      <w:ins w:id="70" w:author="Irit Hochberg" w:date="2024-08-29T11:09:00Z">
         <w:r>
           <w:t xml:space="preserve"> </w:t>
         </w:r>
       </w:ins>
-      <w:ins w:id="70" w:author="Irit Hochberg" w:date="2024-08-29T11:11:00Z">
+      <w:ins w:id="71" w:author="Irit Hochberg" w:date="2024-08-29T11:11:00Z">
         <w:r>
           <w:t xml:space="preserve">interaction between </w:t>
         </w:r>
       </w:ins>
-      <w:ins w:id="71" w:author="Irit Hochberg" w:date="2024-08-29T11:08:00Z">
+      <w:ins w:id="72" w:author="Irit Hochberg" w:date="2024-08-29T11:08:00Z">
         <w:r>
           <w:t xml:space="preserve">gender </w:t>
         </w:r>
       </w:ins>
-      <w:del w:id="72" w:author="Irit Hochberg" w:date="2024-08-29T11:08:00Z">
+      <w:del w:id="73" w:author="Irit Hochberg" w:date="2024-08-29T11:08:00Z">
         <w:r>
           <w:delText>n</w:delText>
         </w:r>
@@ -1031,19 +1036,19 @@
       <w:r>
         <w:t xml:space="preserve"> </w:t>
       </w:r>
-      <w:ins w:id="73" w:author="Irit Hochberg" w:date="2024-08-29T11:11:00Z">
-        <w:del w:id="74" w:author="Dave Bridges" w:date="2024-09-16T11:10:00Z" w16du:dateUtc="2024-09-16T15:10:00Z">
+      <w:ins w:id="74" w:author="Irit Hochberg" w:date="2024-08-29T11:11:00Z">
+        <w:del w:id="75" w:author="Dave Bridges" w:date="2024-09-16T11:10:00Z" w16du:dateUtc="2024-09-16T15:10:00Z">
           <w:r>
             <w:delText>and</w:delText>
           </w:r>
         </w:del>
       </w:ins>
-      <w:del w:id="75" w:author="Irit Hochberg" w:date="2024-08-29T11:10:00Z">
+      <w:del w:id="76" w:author="Irit Hochberg" w:date="2024-08-29T11:10:00Z">
         <w:r>
           <w:delText xml:space="preserve">effect of chronic stress on </w:delText>
         </w:r>
       </w:del>
-      <w:ins w:id="76" w:author="Irit Hochberg" w:date="2024-08-29T11:11:00Z">
+      <w:ins w:id="77" w:author="Irit Hochberg" w:date="2024-08-29T11:11:00Z">
         <w:r>
           <w:t xml:space="preserve">and </w:t>
         </w:r>
@@ -1051,22 +1056,22 @@
       <w:r>
         <w:t>development of diabetes</w:t>
       </w:r>
-      <w:ins w:id="77" w:author="Irit Hochberg" w:date="2024-08-29T10:12:00Z">
+      <w:ins w:id="78" w:author="Irit Hochberg" w:date="2024-08-29T10:12:00Z">
         <w:r>
           <w:t xml:space="preserve"> </w:t>
         </w:r>
       </w:ins>
-      <w:ins w:id="78" w:author="Irit Hochberg" w:date="2024-08-29T11:10:00Z">
+      <w:ins w:id="79" w:author="Irit Hochberg" w:date="2024-08-29T11:10:00Z">
         <w:r>
           <w:t xml:space="preserve">following chronic stress was </w:t>
         </w:r>
       </w:ins>
-      <w:del w:id="79" w:author="Irit Hochberg" w:date="2024-08-29T11:09:00Z">
+      <w:del w:id="80" w:author="Irit Hochberg" w:date="2024-08-29T11:09:00Z">
         <w:r>
           <w:delText xml:space="preserve"> </w:delText>
         </w:r>
       </w:del>
-      <w:del w:id="80" w:author="Irit Hochberg" w:date="2024-08-29T11:10:00Z">
+      <w:del w:id="81" w:author="Irit Hochberg" w:date="2024-08-29T11:10:00Z">
         <w:r>
           <w:delText>in wom</w:delText>
         </w:r>
@@ -1077,7 +1082,7 @@
           <w:delText>n but not in men wa</w:delText>
         </w:r>
       </w:del>
-      <w:del w:id="81" w:author="Irit Hochberg" w:date="2024-08-29T11:11:00Z">
+      <w:del w:id="82" w:author="Irit Hochberg" w:date="2024-08-29T11:11:00Z">
         <w:r>
           <w:delText xml:space="preserve">s </w:delText>
         </w:r>
@@ -1085,57 +1090,57 @@
       <w:r>
         <w:t>demonstrated in the Australian Diabetes, Obesity and Lifestyle study</w:t>
       </w:r>
-      <w:ins w:id="82" w:author="Irit Hochberg" w:date="2024-08-29T11:11:00Z">
+      <w:ins w:id="83" w:author="Irit Hochberg" w:date="2024-08-29T11:11:00Z">
         <w:r>
           <w:t xml:space="preserve">, </w:t>
         </w:r>
       </w:ins>
-      <w:ins w:id="83" w:author="Irit Hochberg" w:date="2024-08-29T11:14:00Z">
+      <w:ins w:id="84" w:author="Irit Hochberg" w:date="2024-08-29T11:14:00Z">
         <w:r>
           <w:t>where</w:t>
         </w:r>
       </w:ins>
-      <w:ins w:id="84" w:author="Irit Hochberg" w:date="2024-08-29T11:11:00Z">
+      <w:ins w:id="85" w:author="Irit Hochberg" w:date="2024-08-29T11:11:00Z">
         <w:r>
           <w:t xml:space="preserve"> only women</w:t>
         </w:r>
       </w:ins>
-      <w:ins w:id="85" w:author="Irit Hochberg" w:date="2024-08-29T11:13:00Z">
+      <w:ins w:id="86" w:author="Irit Hochberg" w:date="2024-08-29T11:13:00Z">
         <w:r>
           <w:t>, not men,</w:t>
         </w:r>
       </w:ins>
-      <w:ins w:id="86" w:author="Irit Hochberg" w:date="2024-08-29T11:11:00Z">
+      <w:ins w:id="87" w:author="Irit Hochberg" w:date="2024-08-29T11:11:00Z">
         <w:r>
           <w:t xml:space="preserve"> had an increase</w:t>
         </w:r>
       </w:ins>
-      <w:ins w:id="87" w:author="Irit Hochberg" w:date="2024-08-29T11:12:00Z">
+      <w:ins w:id="88" w:author="Irit Hochberg" w:date="2024-08-29T11:12:00Z">
         <w:r>
           <w:t xml:space="preserve">d prevalence of diabetes following stressful life </w:t>
         </w:r>
-        <w:del w:id="88" w:author="Dave Bridges" w:date="2024-09-16T11:10:00Z" w16du:dateUtc="2024-09-16T15:10:00Z">
+        <w:del w:id="89" w:author="Dave Bridges" w:date="2024-09-16T11:10:00Z" w16du:dateUtc="2024-09-16T15:10:00Z">
           <w:r>
             <w:delText>expriences</w:delText>
           </w:r>
         </w:del>
       </w:ins>
-      <w:ins w:id="89" w:author="Dave Bridges" w:date="2024-09-16T11:10:00Z" w16du:dateUtc="2024-09-16T15:10:00Z">
+      <w:ins w:id="90" w:author="Dave Bridges" w:date="2024-09-16T11:10:00Z" w16du:dateUtc="2024-09-16T15:10:00Z">
         <w:r>
           <w:t>experiences</w:t>
         </w:r>
       </w:ins>
-      <w:ins w:id="90" w:author="Irit Hochberg" w:date="2024-08-29T11:15:00Z">
+      <w:ins w:id="91" w:author="Irit Hochberg" w:date="2024-08-29T11:15:00Z">
         <w:r>
           <w:t xml:space="preserve">, a </w:t>
         </w:r>
       </w:ins>
-      <w:del w:id="91" w:author="Irit Hochberg" w:date="2024-08-29T11:13:00Z">
+      <w:del w:id="92" w:author="Irit Hochberg" w:date="2024-08-29T11:13:00Z">
         <w:r>
           <w:delText xml:space="preserve"> </w:delText>
         </w:r>
       </w:del>
-      <w:del w:id="92" w:author="Irit Hochberg" w:date="2024-08-29T11:15:00Z">
+      <w:del w:id="93" w:author="Irit Hochberg" w:date="2024-08-29T11:15:00Z">
         <w:r>
           <w:fldChar w:fldCharType="begin"/>
         </w:r>
@@ -1158,37 +1163,37 @@
           <w:delText>.</w:delText>
         </w:r>
       </w:del>
-      <w:ins w:id="93" w:author="Irit Hochberg" w:date="2024-08-29T11:13:00Z">
+      <w:ins w:id="94" w:author="Irit Hochberg" w:date="2024-08-29T11:13:00Z">
         <w:r>
           <w:t xml:space="preserve"> correlation</w:t>
         </w:r>
       </w:ins>
-      <w:ins w:id="94" w:author="Irit Hochberg" w:date="2024-08-29T11:14:00Z">
+      <w:ins w:id="95" w:author="Irit Hochberg" w:date="2024-08-29T11:14:00Z">
         <w:r>
           <w:t xml:space="preserve"> of </w:t>
         </w:r>
       </w:ins>
-      <w:ins w:id="95" w:author="Irit Hochberg" w:date="2024-08-29T11:15:00Z">
+      <w:ins w:id="96" w:author="Irit Hochberg" w:date="2024-08-29T11:15:00Z">
         <w:r>
           <w:t xml:space="preserve">that </w:t>
         </w:r>
       </w:ins>
-      <w:ins w:id="96" w:author="Irit Hochberg" w:date="2024-08-29T11:14:00Z">
+      <w:ins w:id="97" w:author="Irit Hochberg" w:date="2024-08-29T11:14:00Z">
         <w:r>
           <w:t xml:space="preserve">remained </w:t>
         </w:r>
       </w:ins>
-      <w:ins w:id="97" w:author="Irit Hochberg" w:date="2024-08-29T11:15:00Z">
+      <w:ins w:id="98" w:author="Irit Hochberg" w:date="2024-08-29T11:15:00Z">
         <w:r>
           <w:t xml:space="preserve">significant </w:t>
         </w:r>
       </w:ins>
-      <w:ins w:id="98" w:author="Irit Hochberg" w:date="2024-08-29T11:14:00Z">
+      <w:ins w:id="99" w:author="Irit Hochberg" w:date="2024-08-29T11:14:00Z">
         <w:r>
           <w:t>even after correction to adiposity</w:t>
         </w:r>
       </w:ins>
-      <w:ins w:id="99" w:author="Irit Hochberg" w:date="2024-08-29T11:15:00Z">
+      <w:ins w:id="100" w:author="Irit Hochberg" w:date="2024-08-29T11:15:00Z">
         <w:r>
           <w:t xml:space="preserve"> </w:t>
         </w:r>
@@ -1211,12 +1216,12 @@
       <w:r>
         <w:fldChar w:fldCharType="end"/>
       </w:r>
-      <w:ins w:id="100" w:author="Irit Hochberg" w:date="2024-08-29T11:14:00Z">
+      <w:ins w:id="101" w:author="Irit Hochberg" w:date="2024-08-29T11:14:00Z">
         <w:r>
           <w:t>.</w:t>
         </w:r>
       </w:ins>
-      <w:ins w:id="101" w:author="Irit Hochberg" w:date="2024-08-29T11:13:00Z">
+      <w:ins w:id="102" w:author="Irit Hochberg" w:date="2024-08-29T11:13:00Z">
         <w:r>
           <w:t xml:space="preserve"> </w:t>
         </w:r>
@@ -1224,7 +1229,7 @@
       <w:r>
         <w:t xml:space="preserve"> </w:t>
       </w:r>
-      <w:del w:id="102" w:author="Irit Hochberg" w:date="2024-08-29T09:42:00Z">
+      <w:del w:id="103" w:author="Irit Hochberg" w:date="2024-08-29T09:42:00Z">
         <w:r>
           <w:delText xml:space="preserve">Longitudinally, adverse childhood experiences  </w:delText>
         </w:r>
@@ -1273,92 +1278,92 @@
         <w:r>
           <w:delText xml:space="preserve"> are associated with diabetes risk.  </w:delText>
         </w:r>
-        <w:commentRangeEnd w:id="60"/>
+        <w:commentRangeEnd w:id="61"/>
         <w:r>
           <w:rPr>
             <w:rStyle w:val="CommentReference"/>
             <w:sz w:val="24"/>
             <w:szCs w:val="24"/>
           </w:rPr>
-          <w:commentReference w:id="60"/>
+          <w:commentReference w:id="61"/>
         </w:r>
         <w:r>
           <w:delText xml:space="preserve">  </w:delText>
         </w:r>
       </w:del>
-      <w:ins w:id="103" w:author="Irit Hochberg" w:date="2024-08-29T10:13:00Z">
+      <w:ins w:id="104" w:author="Irit Hochberg" w:date="2024-08-29T10:13:00Z">
         <w:r>
           <w:t xml:space="preserve">Possible mechanisms can be </w:t>
         </w:r>
-        <w:del w:id="104" w:author="Dave Bridges" w:date="2024-09-16T11:10:00Z" w16du:dateUtc="2024-09-16T15:10:00Z">
+        <w:del w:id="105" w:author="Dave Bridges" w:date="2024-09-16T11:10:00Z" w16du:dateUtc="2024-09-16T15:10:00Z">
           <w:r>
             <w:delText>attrubuted</w:delText>
           </w:r>
         </w:del>
       </w:ins>
-      <w:ins w:id="105" w:author="Dave Bridges" w:date="2024-09-16T11:10:00Z" w16du:dateUtc="2024-09-16T15:10:00Z">
+      <w:ins w:id="106" w:author="Dave Bridges" w:date="2024-09-16T11:10:00Z" w16du:dateUtc="2024-09-16T15:10:00Z">
         <w:r>
           <w:t>attributed</w:t>
         </w:r>
       </w:ins>
-      <w:ins w:id="106" w:author="Irit Hochberg" w:date="2024-08-29T10:13:00Z">
+      <w:ins w:id="107" w:author="Irit Hochberg" w:date="2024-08-29T10:13:00Z">
         <w:r>
           <w:t xml:space="preserve"> to </w:t>
         </w:r>
       </w:ins>
-      <w:ins w:id="107" w:author="Irit Hochberg" w:date="2024-08-29T11:16:00Z">
+      <w:ins w:id="108" w:author="Irit Hochberg" w:date="2024-08-29T11:16:00Z">
         <w:r>
           <w:t xml:space="preserve">more pronounced </w:t>
         </w:r>
       </w:ins>
-      <w:ins w:id="108" w:author="Irit Hochberg" w:date="2024-08-29T10:13:00Z">
+      <w:ins w:id="109" w:author="Irit Hochberg" w:date="2024-08-29T10:13:00Z">
         <w:r>
           <w:t>hormonal changes</w:t>
         </w:r>
       </w:ins>
-      <w:ins w:id="109" w:author="Irit Hochberg" w:date="2024-08-29T11:16:00Z">
+      <w:ins w:id="110" w:author="Irit Hochberg" w:date="2024-08-29T11:16:00Z">
         <w:r>
           <w:t xml:space="preserve"> </w:t>
         </w:r>
       </w:ins>
-      <w:ins w:id="110" w:author="Irit Hochberg" w:date="2024-08-29T11:17:00Z">
+      <w:ins w:id="111" w:author="Irit Hochberg" w:date="2024-08-29T11:17:00Z">
         <w:r>
           <w:t xml:space="preserve">related to obesity </w:t>
         </w:r>
       </w:ins>
-      <w:ins w:id="111" w:author="Irit Hochberg" w:date="2024-08-29T11:16:00Z">
+      <w:ins w:id="112" w:author="Irit Hochberg" w:date="2024-08-29T11:16:00Z">
         <w:r>
           <w:t>in individuals with stress.</w:t>
         </w:r>
       </w:ins>
-      <w:ins w:id="112" w:author="Irit Hochberg" w:date="2024-08-29T10:13:00Z">
+      <w:ins w:id="113" w:author="Irit Hochberg" w:date="2024-08-29T10:13:00Z">
         <w:r>
           <w:t xml:space="preserve"> </w:t>
         </w:r>
       </w:ins>
-      <w:commentRangeStart w:id="113"/>
       <w:commentRangeStart w:id="114"/>
-      <w:del w:id="115" w:author="Irit Hochberg" w:date="2024-08-29T10:14:00Z">
+      <w:commentRangeStart w:id="115"/>
+      <w:del w:id="116" w:author="Irit Hochberg" w:date="2024-08-29T10:14:00Z">
         <w:r>
           <w:delText>I</w:delText>
         </w:r>
       </w:del>
-      <w:del w:id="116" w:author="Irit Hochberg" w:date="2024-08-29T11:15:00Z">
+      <w:del w:id="117" w:author="Irit Hochberg" w:date="2024-08-29T11:15:00Z">
         <w:r>
           <w:delText xml:space="preserve">n a smaller study, </w:delText>
         </w:r>
       </w:del>
-      <w:ins w:id="117" w:author="Irit Hochberg" w:date="2024-08-29T10:14:00Z">
+      <w:ins w:id="118" w:author="Irit Hochberg" w:date="2024-08-29T10:14:00Z">
         <w:r>
           <w:t xml:space="preserve"> </w:t>
         </w:r>
       </w:ins>
-      <w:ins w:id="118" w:author="Irit Hochberg" w:date="2024-08-29T11:17:00Z">
+      <w:ins w:id="119" w:author="Irit Hochberg" w:date="2024-08-29T11:17:00Z">
         <w:r>
           <w:t xml:space="preserve">For example, </w:t>
         </w:r>
       </w:ins>
-      <w:ins w:id="119" w:author="Irit Hochberg" w:date="2024-08-29T11:18:00Z">
+      <w:ins w:id="120" w:author="Irit Hochberg" w:date="2024-08-29T11:18:00Z">
         <w:r>
           <w:rPr>
             <w:rFonts w:ascii="Calibri" w:hAnsi="Calibri" w:cs="Calibri"/>
@@ -1389,7 +1394,7 @@
       <w:r>
         <w:t>patients with obesity and diabetes</w:t>
       </w:r>
-      <w:ins w:id="120" w:author="Dave Bridges" w:date="2024-09-16T11:10:00Z" w16du:dateUtc="2024-09-16T15:10:00Z">
+      <w:ins w:id="121" w:author="Dave Bridges" w:date="2024-09-16T11:10:00Z" w16du:dateUtc="2024-09-16T15:10:00Z">
         <w:r>
           <w:t>,</w:t>
         </w:r>
@@ -1397,12 +1402,12 @@
       <w:r>
         <w:t xml:space="preserve"> who also ha</w:t>
       </w:r>
-      <w:ins w:id="121" w:author="Irit Hochberg" w:date="2024-08-29T11:15:00Z">
+      <w:ins w:id="122" w:author="Irit Hochberg" w:date="2024-08-29T11:15:00Z">
         <w:r>
           <w:t>ve</w:t>
         </w:r>
       </w:ins>
-      <w:del w:id="122" w:author="Irit Hochberg" w:date="2024-08-29T11:15:00Z">
+      <w:del w:id="123" w:author="Irit Hochberg" w:date="2024-08-29T11:15:00Z">
         <w:r>
           <w:delText>d</w:delText>
         </w:r>
@@ -1410,7 +1415,7 @@
       <w:r>
         <w:t xml:space="preserve"> depression</w:t>
       </w:r>
-      <w:ins w:id="123" w:author="Dave Bridges" w:date="2024-08-28T17:17:00Z">
+      <w:ins w:id="124" w:author="Dave Bridges" w:date="2024-08-28T17:17:00Z">
         <w:r>
           <w:t>,</w:t>
         </w:r>
@@ -1418,7 +1423,7 @@
       <w:r>
         <w:t xml:space="preserve"> </w:t>
       </w:r>
-      <w:del w:id="124" w:author="Irit Hochberg" w:date="2024-08-29T11:19:00Z">
+      <w:del w:id="125" w:author="Irit Hochberg" w:date="2024-08-29T11:19:00Z">
         <w:r>
           <w:delText xml:space="preserve">stress had </w:delText>
         </w:r>
@@ -1432,7 +1437,7 @@
       <w:r>
         <w:t xml:space="preserve"> </w:t>
       </w:r>
-      <w:del w:id="125" w:author="Dave Bridges" w:date="2024-09-16T11:11:00Z" w16du:dateUtc="2024-09-16T15:11:00Z">
+      <w:del w:id="126" w:author="Dave Bridges" w:date="2024-09-16T11:11:00Z" w16du:dateUtc="2024-09-16T15:11:00Z">
         <w:r>
           <w:delText>enhanced</w:delText>
         </w:r>
@@ -1440,12 +1445,12 @@
           <w:delText xml:space="preserve"> </w:delText>
         </w:r>
       </w:del>
-      <w:del w:id="126" w:author="Dave Bridges" w:date="2024-09-16T11:10:00Z" w16du:dateUtc="2024-09-16T15:10:00Z">
+      <w:del w:id="127" w:author="Dave Bridges" w:date="2024-09-16T11:10:00Z" w16du:dateUtc="2024-09-16T15:10:00Z">
         <w:r>
           <w:delText xml:space="preserve">biochemical </w:delText>
         </w:r>
       </w:del>
-      <w:del w:id="127" w:author="Dave Bridges" w:date="2024-09-16T11:11:00Z" w16du:dateUtc="2024-09-16T15:11:00Z">
+      <w:del w:id="128" w:author="Dave Bridges" w:date="2024-09-16T11:11:00Z" w16du:dateUtc="2024-09-16T15:11:00Z">
         <w:r>
           <w:delText xml:space="preserve">changes associated with obesity, including </w:delText>
         </w:r>
@@ -1483,25 +1488,25 @@
       <w:r>
         <w:t xml:space="preserve">  </w:t>
       </w:r>
-      <w:commentRangeEnd w:id="113"/>
+      <w:commentRangeEnd w:id="114"/>
       <w:r>
         <w:rPr>
           <w:rStyle w:val="CommentReference"/>
           <w:sz w:val="24"/>
           <w:szCs w:val="24"/>
         </w:rPr>
-        <w:commentReference w:id="113"/>
-      </w:r>
-      <w:commentRangeEnd w:id="114"/>
+        <w:commentReference w:id="114"/>
+      </w:r>
+      <w:commentRangeEnd w:id="115"/>
       <w:r>
         <w:rPr>
           <w:rStyle w:val="CommentReference"/>
           <w:sz w:val="24"/>
           <w:szCs w:val="24"/>
         </w:rPr>
-        <w:commentReference w:id="114"/>
-      </w:r>
-      <w:ins w:id="128" w:author="Dave Bridges" w:date="2024-09-16T11:11:00Z" w16du:dateUtc="2024-09-16T15:11:00Z">
+        <w:commentReference w:id="115"/>
+      </w:r>
+      <w:ins w:id="129" w:author="Dave Bridges" w:date="2024-09-16T11:11:00Z" w16du:dateUtc="2024-09-16T15:11:00Z">
         <w:r>
           <w:t>This suggests that endocrine factors associated with obesity are augmented in individuals with depression.</w:t>
         </w:r>
@@ -1512,12 +1517,12 @@
       <w:r>
         <w:t xml:space="preserve">Given the paucity of data on how stress impacts people with and without obesity, in this study we performed a cross-sectional evaluation of participants in a </w:t>
       </w:r>
-      <w:del w:id="129" w:author="Dave Bridges" w:date="2024-09-16T12:51:00Z" w16du:dateUtc="2024-09-16T16:51:00Z">
+      <w:del w:id="130" w:author="Dave Bridges" w:date="2024-09-16T12:51:00Z" w16du:dateUtc="2024-09-16T16:51:00Z">
         <w:r>
           <w:delText>hospital based</w:delText>
         </w:r>
       </w:del>
-      <w:ins w:id="130" w:author="Dave Bridges" w:date="2024-09-16T12:51:00Z" w16du:dateUtc="2024-09-16T16:51:00Z">
+      <w:ins w:id="131" w:author="Dave Bridges" w:date="2024-09-16T12:51:00Z" w16du:dateUtc="2024-09-16T16:51:00Z">
         <w:r>
           <w:t>hospital-based</w:t>
         </w:r>
@@ -1601,17 +1606,17 @@
       <w:r>
         <w:t xml:space="preserve">.  </w:t>
       </w:r>
-      <w:ins w:id="131" w:author="Dave Bridges" w:date="2024-09-16T11:13:00Z" w16du:dateUtc="2024-09-16T15:13:00Z">
+      <w:ins w:id="132" w:author="Dave Bridges" w:date="2024-09-16T11:13:00Z" w16du:dateUtc="2024-09-16T15:13:00Z">
         <w:r>
           <w:t>The Michigan Genomics Initiative study links rich clinical data with broad and diverse phenotypes including survey data, genomic data, and biospecimens to allow for repeated use</w:t>
         </w:r>
       </w:ins>
-      <w:ins w:id="132" w:author="Dave Bridges" w:date="2024-09-16T11:14:00Z" w16du:dateUtc="2024-09-16T15:14:00Z">
+      <w:ins w:id="133" w:author="Dave Bridges" w:date="2024-09-16T11:14:00Z" w16du:dateUtc="2024-09-16T15:14:00Z">
         <w:r>
           <w:t xml:space="preserve"> across a diverse set of study questions.</w:t>
         </w:r>
       </w:ins>
-      <w:ins w:id="133" w:author="Dave Bridges" w:date="2024-09-16T11:13:00Z" w16du:dateUtc="2024-09-16T15:13:00Z">
+      <w:ins w:id="134" w:author="Dave Bridges" w:date="2024-09-16T11:13:00Z" w16du:dateUtc="2024-09-16T15:13:00Z">
         <w:r>
           <w:t xml:space="preserve"> </w:t>
         </w:r>
@@ -1625,7 +1630,7 @@
       <w:r>
         <w:t xml:space="preserve"> are</w:t>
       </w:r>
-      <w:ins w:id="134" w:author="Dave Bridges" w:date="2024-09-16T11:14:00Z" w16du:dateUtc="2024-09-16T15:14:00Z">
+      <w:ins w:id="135" w:author="Dave Bridges" w:date="2024-09-16T11:14:00Z" w16du:dateUtc="2024-09-16T15:14:00Z">
         <w:r>
           <w:t xml:space="preserve"> generally recruited</w:t>
         </w:r>
@@ -1639,18 +1644,18 @@
       <w:r>
         <w:t xml:space="preserve"> and were asked to opt-in to </w:t>
       </w:r>
-      <w:commentRangeStart w:id="135"/>
+      <w:commentRangeStart w:id="136"/>
       <w:r>
         <w:t xml:space="preserve">this cohort </w:t>
       </w:r>
-      <w:commentRangeEnd w:id="135"/>
+      <w:commentRangeEnd w:id="136"/>
       <w:r>
         <w:rPr>
           <w:rStyle w:val="CommentReference"/>
           <w:sz w:val="24"/>
           <w:szCs w:val="24"/>
         </w:rPr>
-        <w:commentReference w:id="135"/>
+        <w:commentReference w:id="136"/>
       </w:r>
       <w:r>
         <w:t xml:space="preserve">between 2012 and 2022.  At enrollment, </w:t>
@@ -1700,11 +1705,11 @@
       <w:r>
         <w:t xml:space="preserve"> </w:t>
       </w:r>
-      <w:commentRangeStart w:id="136"/>
+      <w:commentRangeStart w:id="137"/>
       <w:r>
         <w:t>and</w:t>
       </w:r>
-      <w:ins w:id="137" w:author="Dave Bridges" w:date="2024-09-16T11:15:00Z" w16du:dateUtc="2024-09-16T15:15:00Z">
+      <w:ins w:id="138" w:author="Dave Bridges" w:date="2024-09-16T11:15:00Z" w16du:dateUtc="2024-09-16T15:15:00Z">
         <w:r>
           <w:t xml:space="preserve"> that</w:t>
         </w:r>
@@ -1718,12 +1723,12 @@
       <w:r>
         <w:t xml:space="preserve"> </w:t>
       </w:r>
-      <w:ins w:id="138" w:author="Dave Bridges" w:date="2024-09-16T11:15:00Z" w16du:dateUtc="2024-09-16T15:15:00Z">
+      <w:ins w:id="139" w:author="Dave Bridges" w:date="2024-09-16T11:15:00Z" w16du:dateUtc="2024-09-16T15:15:00Z">
         <w:r>
           <w:t xml:space="preserve">enrollment allowed their </w:t>
         </w:r>
       </w:ins>
-      <w:del w:id="139" w:author="Dave Bridges" w:date="2024-09-16T11:15:00Z" w16du:dateUtc="2024-09-16T15:15:00Z">
+      <w:del w:id="140" w:author="Dave Bridges" w:date="2024-09-16T11:15:00Z" w16du:dateUtc="2024-09-16T15:15:00Z">
         <w:r>
           <w:delText xml:space="preserve">data was linked with their </w:delText>
         </w:r>
@@ -1731,7 +1736,7 @@
       <w:r>
         <w:t>electronic medical record</w:t>
       </w:r>
-      <w:ins w:id="140" w:author="Dave Bridges" w:date="2024-09-16T11:15:00Z" w16du:dateUtc="2024-09-16T15:15:00Z">
+      <w:ins w:id="141" w:author="Dave Bridges" w:date="2024-09-16T11:15:00Z" w16du:dateUtc="2024-09-16T15:15:00Z">
         <w:r>
           <w:t xml:space="preserve"> data to be used for research purposes</w:t>
         </w:r>
@@ -1739,14 +1744,14 @@
       <w:r>
         <w:t xml:space="preserve">. </w:t>
       </w:r>
-      <w:commentRangeEnd w:id="136"/>
+      <w:commentRangeEnd w:id="137"/>
       <w:r>
         <w:rPr>
           <w:rStyle w:val="CommentReference"/>
           <w:sz w:val="24"/>
           <w:szCs w:val="24"/>
         </w:rPr>
-        <w:commentReference w:id="136"/>
+        <w:commentReference w:id="137"/>
       </w:r>
       <w:r>
         <w:t xml:space="preserve"> </w:t>
@@ -1760,22 +1765,22 @@
       <w:r>
         <w:t xml:space="preserve">).  </w:t>
       </w:r>
-      <w:del w:id="141" w:author="Dave Bridges" w:date="2024-09-16T11:16:00Z" w16du:dateUtc="2024-09-16T15:16:00Z">
+      <w:del w:id="142" w:author="Dave Bridges" w:date="2024-09-16T11:16:00Z" w16du:dateUtc="2024-09-16T15:16:00Z">
         <w:r>
           <w:delText xml:space="preserve">We </w:delText>
         </w:r>
       </w:del>
-      <w:ins w:id="142" w:author="Dave Bridges" w:date="2024-09-16T11:16:00Z" w16du:dateUtc="2024-09-16T15:16:00Z">
+      <w:ins w:id="143" w:author="Dave Bridges" w:date="2024-09-16T11:16:00Z" w16du:dateUtc="2024-09-16T15:16:00Z">
         <w:r>
           <w:t xml:space="preserve">As of freeze 5, the MGI cohort included </w:t>
         </w:r>
       </w:ins>
-      <w:ins w:id="143" w:author="Dave Bridges" w:date="2025-07-28T19:21:00Z" w16du:dateUtc="2025-07-28T23:21:00Z">
+      <w:ins w:id="144" w:author="Dave Bridges" w:date="2025-07-28T19:21:00Z" w16du:dateUtc="2025-07-28T23:21:00Z">
         <w:r>
           <w:t>62,012</w:t>
         </w:r>
       </w:ins>
-      <w:ins w:id="144" w:author="Dave Bridges" w:date="2024-09-16T11:16:00Z" w16du:dateUtc="2024-09-16T15:16:00Z">
+      <w:ins w:id="145" w:author="Dave Bridges" w:date="2024-09-16T11:16:00Z" w16du:dateUtc="2024-09-16T15:16:00Z">
         <w:r>
           <w:t xml:space="preserve"> participants.  We </w:t>
         </w:r>
@@ -1783,12 +1788,12 @@
       <w:r>
         <w:t xml:space="preserve">excluded participants </w:t>
       </w:r>
-      <w:commentRangeStart w:id="145"/>
       <w:commentRangeStart w:id="146"/>
+      <w:commentRangeStart w:id="147"/>
       <w:r>
         <w:t xml:space="preserve">without </w:t>
       </w:r>
-      <w:ins w:id="147" w:author="Dave Bridges" w:date="2024-09-16T11:17:00Z" w16du:dateUtc="2024-09-16T15:17:00Z">
+      <w:ins w:id="148" w:author="Dave Bridges" w:date="2024-09-16T11:17:00Z" w16du:dateUtc="2024-09-16T15:17:00Z">
         <w:r>
           <w:t xml:space="preserve">a </w:t>
         </w:r>
@@ -1796,32 +1801,32 @@
       <w:r>
         <w:t xml:space="preserve">BMI </w:t>
       </w:r>
-      <w:commentRangeStart w:id="148"/>
+      <w:commentRangeStart w:id="149"/>
       <w:r>
         <w:t>(</w:t>
       </w:r>
-      <w:commentRangeEnd w:id="145"/>
+      <w:commentRangeEnd w:id="146"/>
       <w:r>
         <w:rPr>
           <w:rStyle w:val="CommentReference"/>
           <w:sz w:val="24"/>
           <w:szCs w:val="24"/>
         </w:rPr>
-        <w:commentReference w:id="145"/>
-      </w:r>
-      <w:commentRangeEnd w:id="146"/>
-      <w:r>
-        <w:rPr>
-          <w:rStyle w:val="CommentReference"/>
-        </w:rPr>
         <w:commentReference w:id="146"/>
       </w:r>
-      <w:del w:id="149" w:author="Dave Bridges" w:date="2025-07-28T18:56:00Z" w16du:dateUtc="2025-07-28T22:56:00Z">
+      <w:commentRangeEnd w:id="147"/>
+      <w:r>
+        <w:rPr>
+          <w:rStyle w:val="CommentReference"/>
+        </w:rPr>
+        <w:commentReference w:id="147"/>
+      </w:r>
+      <w:del w:id="150" w:author="Dave Bridges" w:date="2025-07-28T18:56:00Z" w16du:dateUtc="2025-07-28T22:56:00Z">
         <w:r>
           <w:delText xml:space="preserve">29 586 </w:delText>
         </w:r>
       </w:del>
-      <w:ins w:id="150" w:author="Dave Bridges" w:date="2025-07-28T18:56:00Z" w16du:dateUtc="2025-07-28T22:56:00Z">
+      <w:ins w:id="151" w:author="Dave Bridges" w:date="2025-07-28T18:56:00Z" w16du:dateUtc="2025-07-28T22:56:00Z">
         <w:r>
           <w:t>215</w:t>
         </w:r>
@@ -1829,19 +1834,19 @@
       <w:r>
         <w:t xml:space="preserve">participants) </w:t>
       </w:r>
-      <w:commentRangeEnd w:id="148"/>
+      <w:commentRangeEnd w:id="149"/>
       <w:r>
         <w:rPr>
           <w:rStyle w:val="CommentReference"/>
           <w:sz w:val="24"/>
           <w:szCs w:val="24"/>
         </w:rPr>
-        <w:commentReference w:id="148"/>
+        <w:commentReference w:id="149"/>
       </w:r>
       <w:r>
         <w:t>or PSS data (</w:t>
       </w:r>
-      <w:ins w:id="151" w:author="Dave Bridges" w:date="2025-07-28T19:02:00Z" w16du:dateUtc="2025-07-28T23:02:00Z">
+      <w:ins w:id="152" w:author="Dave Bridges" w:date="2025-07-28T19:02:00Z" w16du:dateUtc="2025-07-28T23:02:00Z">
         <w:r>
           <w:t>22</w:t>
         </w:r>
@@ -1852,7 +1857,7 @@
           <w:t>233</w:t>
         </w:r>
       </w:ins>
-      <w:del w:id="152" w:author="Dave Bridges" w:date="2025-07-28T18:56:00Z" w16du:dateUtc="2025-07-28T22:56:00Z">
+      <w:del w:id="153" w:author="Dave Bridges" w:date="2025-07-28T18:56:00Z" w16du:dateUtc="2025-07-28T22:56:00Z">
         <w:r>
           <w:delText>25 187</w:delText>
         </w:r>
@@ -1860,17 +1865,17 @@
       <w:r>
         <w:t xml:space="preserve">) </w:t>
       </w:r>
-      <w:commentRangeStart w:id="153"/>
       <w:commentRangeStart w:id="154"/>
+      <w:commentRangeStart w:id="155"/>
       <w:r>
         <w:t>or implausible BMI values (&gt;</w:t>
       </w:r>
-      <w:del w:id="155" w:author="Dave Bridges" w:date="2025-07-28T15:37:00Z" w16du:dateUtc="2025-07-28T19:37:00Z">
+      <w:del w:id="156" w:author="Dave Bridges" w:date="2025-07-28T15:37:00Z" w16du:dateUtc="2025-07-28T19:37:00Z">
         <w:r>
           <w:delText>300</w:delText>
         </w:r>
       </w:del>
-      <w:ins w:id="156" w:author="Dave Bridges" w:date="2025-07-28T15:37:00Z" w16du:dateUtc="2025-07-28T19:37:00Z">
+      <w:ins w:id="157" w:author="Dave Bridges" w:date="2025-07-28T15:37:00Z" w16du:dateUtc="2025-07-28T19:37:00Z">
         <w:r>
           <w:t>129</w:t>
         </w:r>
@@ -1878,12 +1883,12 @@
       <w:r>
         <w:t xml:space="preserve">; </w:t>
       </w:r>
-      <w:ins w:id="157" w:author="Dave Bridges" w:date="2025-07-28T18:56:00Z" w16du:dateUtc="2025-07-28T22:56:00Z">
+      <w:ins w:id="158" w:author="Dave Bridges" w:date="2025-07-28T18:56:00Z" w16du:dateUtc="2025-07-28T22:56:00Z">
         <w:r>
           <w:t>2</w:t>
         </w:r>
       </w:ins>
-      <w:del w:id="158" w:author="Dave Bridges" w:date="2025-07-28T18:56:00Z" w16du:dateUtc="2025-07-28T22:56:00Z">
+      <w:del w:id="159" w:author="Dave Bridges" w:date="2025-07-28T18:56:00Z" w16du:dateUtc="2025-07-28T22:56:00Z">
         <w:r>
           <w:delText>1</w:delText>
         </w:r>
@@ -1891,30 +1896,30 @@
       <w:r>
         <w:t xml:space="preserve"> participant</w:t>
       </w:r>
-      <w:commentRangeEnd w:id="153"/>
+      <w:commentRangeEnd w:id="154"/>
       <w:r>
         <w:rPr>
           <w:rStyle w:val="CommentReference"/>
           <w:sz w:val="24"/>
           <w:szCs w:val="24"/>
         </w:rPr>
-        <w:commentReference w:id="153"/>
-      </w:r>
-      <w:commentRangeEnd w:id="154"/>
+        <w:commentReference w:id="154"/>
+      </w:r>
+      <w:commentRangeEnd w:id="155"/>
       <w:r>
         <w:rPr>
           <w:rStyle w:val="CommentReference"/>
           <w:sz w:val="24"/>
           <w:szCs w:val="24"/>
         </w:rPr>
-        <w:commentReference w:id="154"/>
-      </w:r>
-      <w:ins w:id="159" w:author="Dave Bridges" w:date="2025-07-28T18:56:00Z" w16du:dateUtc="2025-07-28T22:56:00Z">
+        <w:commentReference w:id="155"/>
+      </w:r>
+      <w:ins w:id="160" w:author="Dave Bridges" w:date="2025-07-28T18:56:00Z" w16du:dateUtc="2025-07-28T22:56:00Z">
         <w:r>
           <w:t>s</w:t>
         </w:r>
       </w:ins>
-      <w:ins w:id="160" w:author="Dave Bridges" w:date="2025-07-28T15:37:00Z" w16du:dateUtc="2025-07-28T19:37:00Z">
+      <w:ins w:id="161" w:author="Dave Bridges" w:date="2025-07-28T15:37:00Z" w16du:dateUtc="2025-07-28T19:37:00Z">
         <w:r>
           <w:t xml:space="preserve">; </w:t>
         </w:r>
@@ -1943,32 +1948,32 @@
       <w:r>
         <w:t xml:space="preserve">.  </w:t>
       </w:r>
-      <w:ins w:id="161" w:author="Dave Bridges" w:date="2025-07-28T19:00:00Z" w16du:dateUtc="2025-07-28T23:00:00Z">
+      <w:ins w:id="162" w:author="Dave Bridges" w:date="2025-07-28T19:00:00Z" w16du:dateUtc="2025-07-28T23:00:00Z">
         <w:r>
           <w:t>PSS Surveys were only included in the MGI enrollees after 2014</w:t>
         </w:r>
       </w:ins>
-      <w:ins w:id="162" w:author="Dave Bridges" w:date="2025-07-28T19:03:00Z" w16du:dateUtc="2025-07-28T23:03:00Z">
+      <w:ins w:id="163" w:author="Dave Bridges" w:date="2025-07-28T19:03:00Z" w16du:dateUtc="2025-07-28T23:03:00Z">
         <w:r>
           <w:t xml:space="preserve">.  After this point </w:t>
         </w:r>
       </w:ins>
-      <w:ins w:id="163" w:author="Dave Bridges" w:date="2025-07-28T19:43:00Z" w16du:dateUtc="2025-07-28T23:43:00Z">
+      <w:ins w:id="164" w:author="Dave Bridges" w:date="2025-07-28T19:43:00Z" w16du:dateUtc="2025-07-28T23:43:00Z">
         <w:r>
           <w:t>83</w:t>
         </w:r>
       </w:ins>
-      <w:ins w:id="164" w:author="Dave Bridges" w:date="2025-07-28T19:04:00Z" w16du:dateUtc="2025-07-28T23:04:00Z">
+      <w:ins w:id="165" w:author="Dave Bridges" w:date="2025-07-28T19:04:00Z" w16du:dateUtc="2025-07-28T23:04:00Z">
         <w:r>
           <w:t>%</w:t>
         </w:r>
       </w:ins>
-      <w:ins w:id="165" w:author="Dave Bridges" w:date="2025-07-28T19:21:00Z" w16du:dateUtc="2025-07-28T23:21:00Z">
+      <w:ins w:id="166" w:author="Dave Bridges" w:date="2025-07-28T19:21:00Z" w16du:dateUtc="2025-07-28T23:21:00Z">
         <w:r>
           <w:t xml:space="preserve"> completed PSS surveys</w:t>
         </w:r>
       </w:ins>
-      <w:ins w:id="166" w:author="Dave Bridges" w:date="2025-07-28T19:00:00Z" w16du:dateUtc="2025-07-28T23:00:00Z">
+      <w:ins w:id="167" w:author="Dave Bridges" w:date="2025-07-28T19:00:00Z" w16du:dateUtc="2025-07-28T23:00:00Z">
         <w:r>
           <w:t xml:space="preserve">.  </w:t>
         </w:r>
@@ -1976,12 +1981,12 @@
       <w:r>
         <w:t xml:space="preserve">This resulted in a population </w:t>
       </w:r>
-      <w:commentRangeStart w:id="167"/>
       <w:commentRangeStart w:id="168"/>
+      <w:commentRangeStart w:id="169"/>
       <w:r>
         <w:t xml:space="preserve">of </w:t>
       </w:r>
-      <w:ins w:id="169" w:author="Dave Bridges" w:date="2025-07-28T19:02:00Z" w16du:dateUtc="2025-07-28T23:02:00Z">
+      <w:ins w:id="170" w:author="Dave Bridges" w:date="2025-07-28T19:02:00Z" w16du:dateUtc="2025-07-28T23:02:00Z">
         <w:r>
           <w:t>39,560</w:t>
         </w:r>
@@ -1989,14 +1994,14 @@
           <w:t xml:space="preserve"> </w:t>
         </w:r>
       </w:ins>
-      <w:del w:id="170" w:author="Dave Bridges" w:date="2025-07-28T18:57:00Z" w16du:dateUtc="2025-07-28T22:57:00Z">
+      <w:del w:id="171" w:author="Dave Bridges" w:date="2025-07-28T18:57:00Z" w16du:dateUtc="2025-07-28T22:57:00Z">
         <w:r>
           <w:delText>39</w:delText>
         </w:r>
         <w:r>
           <w:delText>,</w:delText>
         </w:r>
-        <w:commentRangeStart w:id="171"/>
+        <w:commentRangeStart w:id="172"/>
         <w:r>
           <w:delText>560</w:delText>
         </w:r>
@@ -2007,33 +2012,33 @@
       <w:r>
         <w:t xml:space="preserve">participants </w:t>
       </w:r>
-      <w:commentRangeEnd w:id="167"/>
+      <w:commentRangeEnd w:id="168"/>
       <w:r>
         <w:rPr>
           <w:rStyle w:val="CommentReference"/>
           <w:sz w:val="24"/>
           <w:szCs w:val="24"/>
         </w:rPr>
-        <w:commentReference w:id="167"/>
-      </w:r>
-      <w:commentRangeEnd w:id="168"/>
-      <w:r>
-        <w:rPr>
-          <w:rStyle w:val="CommentReference"/>
-        </w:rPr>
         <w:commentReference w:id="168"/>
       </w:r>
+      <w:commentRangeEnd w:id="169"/>
+      <w:r>
+        <w:rPr>
+          <w:rStyle w:val="CommentReference"/>
+        </w:rPr>
+        <w:commentReference w:id="169"/>
+      </w:r>
       <w:r>
         <w:t xml:space="preserve">see Figure 1).  </w:t>
       </w:r>
-      <w:commentRangeEnd w:id="171"/>
+      <w:commentRangeEnd w:id="172"/>
       <w:r>
         <w:rPr>
           <w:rStyle w:val="CommentReference"/>
           <w:sz w:val="24"/>
           <w:szCs w:val="24"/>
         </w:rPr>
-        <w:commentReference w:id="171"/>
+        <w:commentReference w:id="172"/>
       </w:r>
     </w:p>
     <w:p/>
@@ -2049,23 +2054,23 @@
     <w:p>
       <w:pPr>
         <w:rPr>
-          <w:ins w:id="172" w:author="Dave Bridges" w:date="2025-07-28T19:24:00Z" w16du:dateUtc="2025-07-28T23:24:00Z"/>
-        </w:rPr>
-      </w:pPr>
-      <w:commentRangeStart w:id="173"/>
+          <w:ins w:id="173" w:author="Dave Bridges" w:date="2025-07-28T19:24:00Z" w16du:dateUtc="2025-07-28T23:24:00Z"/>
+        </w:rPr>
+      </w:pPr>
       <w:commentRangeStart w:id="174"/>
       <w:commentRangeStart w:id="175"/>
+      <w:commentRangeStart w:id="176"/>
       <w:r>
         <w:t xml:space="preserve">BMI was </w:t>
       </w:r>
-      <w:commentRangeEnd w:id="173"/>
+      <w:commentRangeEnd w:id="174"/>
       <w:r>
         <w:rPr>
           <w:rStyle w:val="CommentReference"/>
           <w:sz w:val="24"/>
           <w:szCs w:val="24"/>
         </w:rPr>
-        <w:commentReference w:id="173"/>
+        <w:commentReference w:id="174"/>
       </w:r>
       <w:r>
         <w:t>defined for each participant</w:t>
@@ -2073,28 +2078,28 @@
       <w:r>
         <w:t xml:space="preserve"> by taking the median value if multiple measurements were available</w:t>
       </w:r>
-      <w:commentRangeEnd w:id="174"/>
+      <w:commentRangeEnd w:id="175"/>
       <w:r>
         <w:rPr>
           <w:rStyle w:val="CommentReference"/>
           <w:sz w:val="24"/>
           <w:szCs w:val="24"/>
         </w:rPr>
-        <w:commentReference w:id="174"/>
+        <w:commentReference w:id="175"/>
       </w:r>
       <w:r>
         <w:t xml:space="preserve">. </w:t>
       </w:r>
-      <w:commentRangeEnd w:id="175"/>
+      <w:commentRangeEnd w:id="176"/>
       <w:r>
         <w:rPr>
           <w:rStyle w:val="CommentReference"/>
           <w:sz w:val="24"/>
           <w:szCs w:val="24"/>
         </w:rPr>
-        <w:commentReference w:id="175"/>
-      </w:r>
-      <w:commentRangeStart w:id="176"/>
+        <w:commentReference w:id="176"/>
+      </w:r>
+      <w:commentRangeStart w:id="177"/>
       <w:r>
         <w:t>Prior to sensitivity analyses we dichotomized participants as BMI greater or less than 30 kg/m</w:t>
       </w:r>
@@ -2107,14 +2112,14 @@
       <w:r>
         <w:t>.</w:t>
       </w:r>
-      <w:commentRangeEnd w:id="176"/>
+      <w:commentRangeEnd w:id="177"/>
       <w:r>
         <w:rPr>
           <w:rStyle w:val="CommentReference"/>
           <w:sz w:val="24"/>
           <w:szCs w:val="24"/>
         </w:rPr>
-        <w:commentReference w:id="176"/>
+        <w:commentReference w:id="177"/>
       </w:r>
       <w:r>
         <w:t xml:space="preserve">  </w:t>
@@ -2123,16 +2128,16 @@
     <w:p>
       <w:pPr>
         <w:rPr>
-          <w:ins w:id="177" w:author="Dave Bridges" w:date="2025-07-28T19:24:00Z" w16du:dateUtc="2025-07-28T23:24:00Z"/>
-        </w:rPr>
-      </w:pPr>
-    </w:p>
-    <w:p>
-      <w:pPr>
-        <w:rPr>
           <w:ins w:id="178" w:author="Dave Bridges" w:date="2025-07-28T19:24:00Z" w16du:dateUtc="2025-07-28T23:24:00Z"/>
         </w:rPr>
       </w:pPr>
+    </w:p>
+    <w:p>
+      <w:pPr>
+        <w:rPr>
+          <w:ins w:id="179" w:author="Dave Bridges" w:date="2025-07-28T19:24:00Z" w16du:dateUtc="2025-07-28T23:24:00Z"/>
+        </w:rPr>
+      </w:pPr>
       <w:r>
         <w:t xml:space="preserve">To </w:t>
       </w:r>
@@ -2151,8 +2156,8 @@
       <w:r>
         <w:t xml:space="preserve">of the participants, </w:t>
       </w:r>
-      <w:commentRangeStart w:id="179"/>
       <w:commentRangeStart w:id="180"/>
+      <w:commentRangeStart w:id="181"/>
       <w:r>
         <w:t xml:space="preserve">we used the </w:t>
       </w:r>
@@ -2171,52 +2176,52 @@
       <w:r>
         <w:t xml:space="preserve">  </w:t>
       </w:r>
-      <w:commentRangeEnd w:id="179"/>
+      <w:commentRangeEnd w:id="180"/>
       <w:r>
         <w:rPr>
           <w:rStyle w:val="CommentReference"/>
           <w:sz w:val="24"/>
           <w:szCs w:val="24"/>
         </w:rPr>
-        <w:commentReference w:id="179"/>
-      </w:r>
-      <w:commentRangeEnd w:id="180"/>
+        <w:commentReference w:id="180"/>
+      </w:r>
+      <w:commentRangeEnd w:id="181"/>
       <w:r>
         <w:rPr>
           <w:rStyle w:val="CommentReference"/>
           <w:sz w:val="24"/>
           <w:szCs w:val="24"/>
         </w:rPr>
-        <w:commentReference w:id="180"/>
-      </w:r>
-    </w:p>
-    <w:p>
-      <w:pPr>
-        <w:rPr>
-          <w:ins w:id="181" w:author="Dave Bridges" w:date="2025-07-28T19:24:00Z" w16du:dateUtc="2025-07-28T23:24:00Z"/>
-        </w:rPr>
-      </w:pPr>
-    </w:p>
-    <w:p>
-      <w:pPr>
-        <w:rPr>
-          <w:ins w:id="182" w:author="Dave Bridges" w:date="2025-07-28T19:25:00Z" w16du:dateUtc="2025-07-28T23:25:00Z"/>
+        <w:commentReference w:id="181"/>
+      </w:r>
+    </w:p>
+    <w:p>
+      <w:pPr>
+        <w:rPr>
+          <w:ins w:id="182" w:author="Dave Bridges" w:date="2025-07-28T19:24:00Z" w16du:dateUtc="2025-07-28T23:24:00Z"/>
+        </w:rPr>
+      </w:pPr>
+    </w:p>
+    <w:p>
+      <w:pPr>
+        <w:rPr>
+          <w:ins w:id="183" w:author="Dave Bridges" w:date="2025-07-28T19:25:00Z" w16du:dateUtc="2025-07-28T23:25:00Z"/>
           <w:rFonts w:ascii="Times New Roman" w:eastAsia="Times New Roman" w:hAnsi="Times New Roman" w:cs="Times New Roman"/>
         </w:rPr>
       </w:pPr>
-      <w:ins w:id="183" w:author="Dave Bridges" w:date="2025-07-28T19:25:00Z" w16du:dateUtc="2025-07-28T23:25:00Z">
+      <w:ins w:id="184" w:author="Dave Bridges" w:date="2025-07-28T19:25:00Z" w16du:dateUtc="2025-07-28T23:25:00Z">
         <w:r>
           <w:t>Neighborho</w:t>
         </w:r>
       </w:ins>
-      <w:ins w:id="184" w:author="Dave Bridges" w:date="2025-07-28T19:26:00Z" w16du:dateUtc="2025-07-28T23:26:00Z">
+      <w:ins w:id="185" w:author="Dave Bridges" w:date="2025-07-28T19:26:00Z" w16du:dateUtc="2025-07-28T23:26:00Z">
         <w:r>
           <w:t>od-level s</w:t>
         </w:r>
       </w:ins>
-      <w:commentRangeStart w:id="185"/>
       <w:commentRangeStart w:id="186"/>
-      <w:del w:id="187" w:author="Dave Bridges" w:date="2025-07-28T19:26:00Z" w16du:dateUtc="2025-07-28T23:26:00Z">
+      <w:commentRangeStart w:id="187"/>
+      <w:del w:id="188" w:author="Dave Bridges" w:date="2025-07-28T19:26:00Z" w16du:dateUtc="2025-07-28T23:26:00Z">
         <w:r>
           <w:delText>S</w:delText>
         </w:r>
@@ -2224,31 +2229,31 @@
       <w:r>
         <w:t>ocioeconomic status</w:t>
       </w:r>
-      <w:ins w:id="188" w:author="Dave Bridges" w:date="2025-07-28T19:26:00Z" w16du:dateUtc="2025-07-28T23:26:00Z">
+      <w:ins w:id="189" w:author="Dave Bridges" w:date="2025-07-28T19:26:00Z" w16du:dateUtc="2025-07-28T23:26:00Z">
         <w:r>
           <w:t xml:space="preserve"> </w:t>
         </w:r>
       </w:ins>
-      <w:del w:id="189" w:author="Dave Bridges" w:date="2025-07-28T19:26:00Z" w16du:dateUtc="2025-07-28T23:26:00Z">
+      <w:del w:id="190" w:author="Dave Bridges" w:date="2025-07-28T19:26:00Z" w16du:dateUtc="2025-07-28T23:26:00Z">
         <w:r>
           <w:delText xml:space="preserve"> of participants </w:delText>
         </w:r>
-        <w:commentRangeEnd w:id="185"/>
+        <w:commentRangeEnd w:id="186"/>
         <w:r>
           <w:rPr>
             <w:rStyle w:val="CommentReference"/>
             <w:sz w:val="24"/>
             <w:szCs w:val="24"/>
           </w:rPr>
-          <w:commentReference w:id="185"/>
+          <w:commentReference w:id="186"/>
         </w:r>
       </w:del>
-      <w:commentRangeEnd w:id="186"/>
-      <w:r>
-        <w:rPr>
-          <w:rStyle w:val="CommentReference"/>
-        </w:rPr>
-        <w:commentReference w:id="186"/>
+      <w:commentRangeEnd w:id="187"/>
+      <w:r>
+        <w:rPr>
+          <w:rStyle w:val="CommentReference"/>
+        </w:rPr>
+        <w:commentReference w:id="187"/>
       </w:r>
       <w:r>
         <w:t xml:space="preserve">was approximated by constructing a neighborhood </w:t>
@@ -2259,12 +2264,12 @@
       <w:r>
         <w:t xml:space="preserve"> score based on </w:t>
       </w:r>
-      <w:del w:id="190" w:author="Dave Bridges" w:date="2025-07-28T19:26:00Z" w16du:dateUtc="2025-07-28T23:26:00Z">
+      <w:del w:id="191" w:author="Dave Bridges" w:date="2025-07-28T19:26:00Z" w16du:dateUtc="2025-07-28T23:26:00Z">
         <w:r>
           <w:delText xml:space="preserve">their </w:delText>
         </w:r>
       </w:del>
-      <w:ins w:id="191" w:author="Dave Bridges" w:date="2025-07-28T19:26:00Z" w16du:dateUtc="2025-07-28T23:26:00Z">
+      <w:ins w:id="192" w:author="Dave Bridges" w:date="2025-07-28T19:26:00Z" w16du:dateUtc="2025-07-28T23:26:00Z">
         <w:r>
           <w:t xml:space="preserve">the participants’ </w:t>
         </w:r>
@@ -2272,8 +2277,8 @@
       <w:r>
         <w:t xml:space="preserve">census block connected to the </w:t>
       </w:r>
-      <w:commentRangeStart w:id="192"/>
       <w:commentRangeStart w:id="193"/>
+      <w:commentRangeStart w:id="194"/>
       <w:r>
         <w:t>National Neighborhood Data Archive (</w:t>
       </w:r>
@@ -2315,23 +2320,23 @@
       <w:r>
         <w:t xml:space="preserve"> to data from the American Community Survey (2013-2017).  </w:t>
       </w:r>
-      <w:commentRangeEnd w:id="192"/>
+      <w:commentRangeEnd w:id="193"/>
       <w:r>
         <w:rPr>
           <w:rStyle w:val="CommentReference"/>
           <w:sz w:val="24"/>
           <w:szCs w:val="24"/>
         </w:rPr>
-        <w:commentReference w:id="192"/>
-      </w:r>
-      <w:commentRangeEnd w:id="193"/>
+        <w:commentReference w:id="193"/>
+      </w:r>
+      <w:commentRangeEnd w:id="194"/>
       <w:r>
         <w:rPr>
           <w:rStyle w:val="CommentReference"/>
           <w:sz w:val="24"/>
           <w:szCs w:val="24"/>
         </w:rPr>
-        <w:commentReference w:id="193"/>
+        <w:commentReference w:id="194"/>
       </w:r>
       <w:r>
         <w:t>Participant</w:t>
@@ -2372,31 +2377,31 @@
       <w:r>
         <w:t>p</w:t>
       </w:r>
-      <w:commentRangeStart w:id="194"/>
       <w:commentRangeStart w:id="195"/>
+      <w:commentRangeStart w:id="196"/>
       <w:r>
         <w:t>roportion</w:t>
       </w:r>
-      <w:commentRangeEnd w:id="194"/>
+      <w:commentRangeEnd w:id="195"/>
       <w:r>
         <w:rPr>
           <w:rStyle w:val="CommentReference"/>
           <w:sz w:val="24"/>
           <w:szCs w:val="24"/>
         </w:rPr>
-        <w:commentReference w:id="194"/>
-      </w:r>
-      <w:commentRangeEnd w:id="195"/>
-      <w:r>
-        <w:rPr>
-          <w:rStyle w:val="CommentReference"/>
-        </w:rPr>
         <w:commentReference w:id="195"/>
       </w:r>
+      <w:commentRangeEnd w:id="196"/>
+      <w:r>
+        <w:rPr>
+          <w:rStyle w:val="CommentReference"/>
+        </w:rPr>
+        <w:commentReference w:id="196"/>
+      </w:r>
       <w:r>
         <w:t xml:space="preserve"> </w:t>
       </w:r>
-      <w:ins w:id="196" w:author="Dave Bridges" w:date="2024-09-16T12:45:00Z" w16du:dateUtc="2024-09-16T16:45:00Z">
+      <w:ins w:id="197" w:author="Dave Bridges" w:date="2024-09-16T12:45:00Z" w16du:dateUtc="2024-09-16T16:45:00Z">
         <w:r>
           <w:t xml:space="preserve">of adults </w:t>
         </w:r>
@@ -2410,11 +2415,11 @@
       <w:r>
         <w:t xml:space="preserve">3) </w:t>
       </w:r>
-      <w:commentRangeStart w:id="197"/>
+      <w:commentRangeStart w:id="198"/>
       <w:r>
         <w:t xml:space="preserve">proportion </w:t>
       </w:r>
-      <w:ins w:id="198" w:author="Dave Bridges" w:date="2024-09-16T12:45:00Z" w16du:dateUtc="2024-09-16T16:45:00Z">
+      <w:ins w:id="199" w:author="Dave Bridges" w:date="2024-09-16T12:45:00Z" w16du:dateUtc="2024-09-16T16:45:00Z">
         <w:r>
           <w:t xml:space="preserve">of adults </w:t>
         </w:r>
@@ -2425,14 +2430,14 @@
       <w:r>
         <w:t xml:space="preserve"> </w:t>
       </w:r>
-      <w:commentRangeEnd w:id="197"/>
+      <w:commentRangeEnd w:id="198"/>
       <w:r>
         <w:rPr>
           <w:rStyle w:val="CommentReference"/>
           <w:sz w:val="24"/>
           <w:szCs w:val="24"/>
         </w:rPr>
-        <w:commentReference w:id="197"/>
+        <w:commentReference w:id="198"/>
       </w:r>
       <w:r>
         <w:t xml:space="preserve">with </w:t>
@@ -2465,7 +2470,7 @@
     <w:p>
       <w:pPr>
         <w:rPr>
-          <w:ins w:id="199" w:author="Dave Bridges" w:date="2025-07-28T19:25:00Z" w16du:dateUtc="2025-07-28T23:25:00Z"/>
+          <w:ins w:id="200" w:author="Dave Bridges" w:date="2025-07-28T19:25:00Z" w16du:dateUtc="2025-07-28T23:25:00Z"/>
           <w:rFonts w:ascii="Times New Roman" w:eastAsia="Times New Roman" w:hAnsi="Times New Roman" w:cs="Times New Roman"/>
         </w:rPr>
       </w:pPr>
@@ -2473,20 +2478,20 @@
     <w:p>
       <w:pPr>
         <w:rPr>
-          <w:ins w:id="200" w:author="Dave Bridges" w:date="2025-07-28T19:25:00Z" w16du:dateUtc="2025-07-28T23:25:00Z"/>
-        </w:rPr>
-      </w:pPr>
-      <w:commentRangeStart w:id="201"/>
+          <w:ins w:id="201" w:author="Dave Bridges" w:date="2025-07-28T19:25:00Z" w16du:dateUtc="2025-07-28T23:25:00Z"/>
+        </w:rPr>
+      </w:pPr>
       <w:commentRangeStart w:id="202"/>
+      <w:commentRangeStart w:id="203"/>
       <w:r>
         <w:t xml:space="preserve">Type 2 </w:t>
       </w:r>
-      <w:del w:id="203" w:author="Dave Bridges" w:date="2024-09-16T12:56:00Z" w16du:dateUtc="2024-09-16T16:56:00Z">
+      <w:del w:id="204" w:author="Dave Bridges" w:date="2024-09-16T12:56:00Z" w16du:dateUtc="2024-09-16T16:56:00Z">
         <w:r>
           <w:delText>d</w:delText>
         </w:r>
       </w:del>
-      <w:ins w:id="204" w:author="Dave Bridges" w:date="2024-09-16T12:56:00Z" w16du:dateUtc="2024-09-16T16:56:00Z">
+      <w:ins w:id="205" w:author="Dave Bridges" w:date="2024-09-16T12:56:00Z" w16du:dateUtc="2024-09-16T16:56:00Z">
         <w:r>
           <w:t>D</w:t>
         </w:r>
@@ -2497,7 +2502,7 @@
       <w:r>
         <w:t xml:space="preserve"> </w:t>
       </w:r>
-      <w:ins w:id="205" w:author="Dave Bridges" w:date="2024-09-16T12:56:00Z" w16du:dateUtc="2024-09-16T16:56:00Z">
+      <w:ins w:id="206" w:author="Dave Bridges" w:date="2024-09-16T12:56:00Z" w16du:dateUtc="2024-09-16T16:56:00Z">
         <w:r>
           <w:t xml:space="preserve">Mellitus </w:t>
         </w:r>
@@ -2505,35 +2510,35 @@
       <w:r>
         <w:t>was indicated by an ICD9 or ICD10 coded diagnosis in the participant’s electronic medical record</w:t>
       </w:r>
-      <w:commentRangeEnd w:id="201"/>
+      <w:commentRangeEnd w:id="202"/>
       <w:r>
         <w:rPr>
           <w:rStyle w:val="CommentReference"/>
           <w:sz w:val="24"/>
           <w:szCs w:val="24"/>
         </w:rPr>
-        <w:commentReference w:id="201"/>
-      </w:r>
-      <w:commentRangeEnd w:id="202"/>
+        <w:commentReference w:id="202"/>
+      </w:r>
+      <w:commentRangeEnd w:id="203"/>
       <w:r>
         <w:rPr>
           <w:rStyle w:val="CommentReference"/>
           <w:sz w:val="24"/>
           <w:szCs w:val="24"/>
         </w:rPr>
-        <w:commentReference w:id="202"/>
-      </w:r>
-      <w:ins w:id="206" w:author="Dave Bridges" w:date="2024-09-16T11:21:00Z" w16du:dateUtc="2024-09-16T15:21:00Z">
+        <w:commentReference w:id="203"/>
+      </w:r>
+      <w:ins w:id="207" w:author="Dave Bridges" w:date="2024-09-16T11:21:00Z" w16du:dateUtc="2024-09-16T15:21:00Z">
         <w:r>
           <w:t xml:space="preserve"> (see </w:t>
         </w:r>
       </w:ins>
-      <w:ins w:id="207" w:author="Dave Bridges" w:date="2024-09-16T12:51:00Z" w16du:dateUtc="2024-09-16T16:51:00Z">
+      <w:ins w:id="208" w:author="Dave Bridges" w:date="2024-09-16T12:51:00Z" w16du:dateUtc="2024-09-16T16:51:00Z">
         <w:r>
           <w:t xml:space="preserve">Supplementary </w:t>
         </w:r>
       </w:ins>
-      <w:ins w:id="208" w:author="Dave Bridges" w:date="2024-09-16T11:21:00Z" w16du:dateUtc="2024-09-16T15:21:00Z">
+      <w:ins w:id="209" w:author="Dave Bridges" w:date="2024-09-16T11:21:00Z" w16du:dateUtc="2024-09-16T15:21:00Z">
         <w:r>
           <w:t>Table 1)</w:t>
         </w:r>
@@ -2544,9 +2549,9 @@
       <w:r>
         <w:t xml:space="preserve">  </w:t>
       </w:r>
-      <w:moveToRangeStart w:id="209" w:author="Dave Bridges" w:date="2024-09-16T11:22:00Z" w:name="move177378140"/>
-      <w:commentRangeStart w:id="210"/>
-      <w:moveTo w:id="211" w:author="Dave Bridges" w:date="2024-09-16T11:22:00Z" w16du:dateUtc="2024-09-16T15:22:00Z">
+      <w:moveToRangeStart w:id="210" w:author="Dave Bridges" w:date="2024-09-16T11:22:00Z" w:name="move177378140"/>
+      <w:commentRangeStart w:id="211"/>
+      <w:moveTo w:id="212" w:author="Dave Bridges" w:date="2024-09-16T11:22:00Z" w16du:dateUtc="2024-09-16T15:22:00Z">
         <w:r>
           <w:t xml:space="preserve">Comorbidities were assessed using </w:t>
         </w:r>
@@ -2565,7 +2570,7 @@
       <w:r>
         <w:instrText xml:space="preserve"> ADDIN ZOTERO_ITEM CSL_CITATION {"citationID":"NpzuWU2y","properties":{"formattedCitation":"(15)","plainCitation":"(15)","noteIndex":0},"citationItems":[{"id":11488,"uris":["http://zotero.org/users/7317906/items/JMLH32L3"],"itemData":{"id":11488,"type":"article-journal","abstract":"OBJECTIVES: This study attempts to develop a comprehensive set of comorbidity measures for use with large administrative inpatient datasets.\nMETHODS: The study involved clinical and empirical review of comorbidity measures, development of a framework that attempts to segregate comorbidities from other aspects of the patient's condition, development of a comorbidity algorithm, and testing on heterogeneous and homogeneous patient groups. Data were drawn from all adult, nonmaternal inpatients from 438 acute care hospitals in California in 1992 (n = 1,779,167). Outcome measures were those commonly available in administrative data: length of stay, hospital charges, and in-hospital death.\nRESULTS: A comprehensive set of 30 comorbidity measures was developed. The comorbidities were associated with substantial increases in length of stay, hospital charges, and mortality both for heterogeneous and homogeneous disease groups. Several comorbidities are described that are important predictors of outcomes, yet commonly are not measured. These include mental disorders, drug and alcohol abuse, obesity, coagulopathy, weight loss, and fluid and electrolyte disorders.\nCONCLUSIONS: The comorbidities had independent effects on outcomes and probably should not be simplified as an index because they affect outcomes differently among different patient groups. The present method addresses some of the limitations of previous measures. It is based on a comprehensive approach to identifying comorbidities and separates them from the primary reason for hospitalization, resulting in an expanded set of comorbidities that easily is applied without further refinement to administrative data for a wide range of diseases.","container-title":"Medical Care","DOI":"10.1097/00005650-199801000-00004","ISSN":"0025-7079","issue":"1","journalAbbreviation":"Med Care","language":"eng","note":"PMID: 9431328","page":"8-27","source":"PubMed","title":"Comorbidity measures for use with administrative data","volume":"36","author":[{"family":"Elixhauser","given":"A."},{"family":"Steiner","given":"C."},{"family":"Harris","given":"D. R."},{"family":"Coffey","given":"R. M."}],"issued":{"date-parts":[["1998",1]]},"citation-key":"elixhauserComorbidityMeasuresUse1998"}}],"schema":"https://github.com/citation-style-language/schema/raw/master/csl-citation.json"} </w:instrText>
       </w:r>
-      <w:moveTo w:id="212" w:author="Dave Bridges" w:date="2024-09-16T11:22:00Z" w16du:dateUtc="2024-09-16T15:22:00Z">
+      <w:moveTo w:id="213" w:author="Dave Bridges" w:date="2024-09-16T11:22:00Z" w16du:dateUtc="2024-09-16T15:22:00Z">
         <w:r>
           <w:fldChar w:fldCharType="separate"/>
         </w:r>
@@ -2576,7 +2581,7 @@
         </w:rPr>
         <w:t>(15)</w:t>
       </w:r>
-      <w:moveTo w:id="213" w:author="Dave Bridges" w:date="2024-09-16T11:22:00Z" w16du:dateUtc="2024-09-16T15:22:00Z">
+      <w:moveTo w:id="214" w:author="Dave Bridges" w:date="2024-09-16T11:22:00Z" w16du:dateUtc="2024-09-16T15:22:00Z">
         <w:r>
           <w:fldChar w:fldCharType="end"/>
         </w:r>
@@ -2584,26 +2589,26 @@
           <w:t xml:space="preserve">.  </w:t>
         </w:r>
       </w:moveTo>
-      <w:moveToRangeEnd w:id="209"/>
-      <w:commentRangeEnd w:id="210"/>
+      <w:moveToRangeEnd w:id="210"/>
+      <w:commentRangeEnd w:id="211"/>
       <w:r>
         <w:rPr>
           <w:rStyle w:val="CommentReference"/>
           <w:sz w:val="24"/>
           <w:szCs w:val="24"/>
         </w:rPr>
-        <w:commentReference w:id="210"/>
-      </w:r>
-    </w:p>
-    <w:p>
-      <w:pPr>
-        <w:rPr>
-          <w:ins w:id="214" w:author="Dave Bridges" w:date="2025-07-28T19:25:00Z" w16du:dateUtc="2025-07-28T23:25:00Z"/>
-        </w:rPr>
-      </w:pPr>
-    </w:p>
-    <w:p>
-      <w:commentRangeStart w:id="215"/>
+        <w:commentReference w:id="211"/>
+      </w:r>
+    </w:p>
+    <w:p>
+      <w:pPr>
+        <w:rPr>
+          <w:ins w:id="215" w:author="Dave Bridges" w:date="2025-07-28T19:25:00Z" w16du:dateUtc="2025-07-28T23:25:00Z"/>
+        </w:rPr>
+      </w:pPr>
+    </w:p>
+    <w:p>
+      <w:commentRangeStart w:id="216"/>
       <w:r>
         <w:t xml:space="preserve">Race and ethnicity </w:t>
       </w:r>
@@ -2620,7 +2625,7 @@
       <w:r>
         <w:t>self</w:t>
       </w:r>
-      <w:del w:id="216" w:author="Dave Bridges" w:date="2025-07-28T19:27:00Z" w16du:dateUtc="2025-07-28T23:27:00Z">
+      <w:del w:id="217" w:author="Dave Bridges" w:date="2025-07-28T19:27:00Z" w16du:dateUtc="2025-07-28T23:27:00Z">
         <w:r>
           <w:delText>-</w:delText>
         </w:r>
@@ -2635,7 +2640,7 @@
       <w:r>
         <w:t>Asian, Black, White, Hispanic/Latino, or Other</w:t>
       </w:r>
-      <w:ins w:id="217" w:author="Dave Bridges" w:date="2025-07-28T19:28:00Z" w16du:dateUtc="2025-07-28T23:28:00Z">
+      <w:ins w:id="218" w:author="Dave Bridges" w:date="2025-07-28T19:28:00Z" w16du:dateUtc="2025-07-28T23:28:00Z">
         <w:r>
           <w:t>/Declined</w:t>
         </w:r>
@@ -2646,7 +2651,7 @@
       <w:r>
         <w:t xml:space="preserve">  </w:t>
       </w:r>
-      <w:del w:id="218" w:author="Dave Bridges" w:date="2025-07-28T19:28:00Z" w16du:dateUtc="2025-07-28T23:28:00Z">
+      <w:del w:id="219" w:author="Dave Bridges" w:date="2025-07-28T19:28:00Z" w16du:dateUtc="2025-07-28T23:28:00Z">
         <w:r>
           <w:delText xml:space="preserve">The latter group includes those who self-reported </w:delText>
         </w:r>
@@ -2654,7 +2659,7 @@
           <w:delText>their race as Other/Unknown/Declined, and groups with</w:delText>
         </w:r>
       </w:del>
-      <w:ins w:id="219" w:author="Dave Bridges" w:date="2025-07-28T19:28:00Z" w16du:dateUtc="2025-07-28T23:28:00Z">
+      <w:ins w:id="220" w:author="Dave Bridges" w:date="2025-07-28T19:28:00Z" w16du:dateUtc="2025-07-28T23:28:00Z">
         <w:r>
           <w:t>Other also includes groups with</w:t>
         </w:r>
@@ -2665,22 +2670,22 @@
       <w:r>
         <w:t xml:space="preserve"> </w:t>
       </w:r>
-      <w:commentRangeEnd w:id="215"/>
+      <w:commentRangeEnd w:id="216"/>
       <w:r>
         <w:rPr>
           <w:rStyle w:val="CommentReference"/>
           <w:sz w:val="24"/>
           <w:szCs w:val="24"/>
         </w:rPr>
-        <w:commentReference w:id="215"/>
+        <w:commentReference w:id="216"/>
       </w:r>
       <w:r>
         <w:t xml:space="preserve"> </w:t>
       </w:r>
-      <w:moveFromRangeStart w:id="220" w:author="Dave Bridges" w:date="2024-09-16T11:22:00Z" w:name="move177378140"/>
-      <w:commentRangeStart w:id="221"/>
+      <w:moveFromRangeStart w:id="221" w:author="Dave Bridges" w:date="2024-09-16T11:22:00Z" w:name="move177378140"/>
       <w:commentRangeStart w:id="222"/>
-      <w:moveFrom w:id="223" w:author="Dave Bridges" w:date="2024-09-16T11:22:00Z" w16du:dateUtc="2024-09-16T15:22:00Z">
+      <w:commentRangeStart w:id="223"/>
+      <w:moveFrom w:id="224" w:author="Dave Bridges" w:date="2024-09-16T11:22:00Z" w16du:dateUtc="2024-09-16T15:22:00Z">
         <w:r>
           <w:t>Comorbidities were assessed using Elixhauser comorbidity indices</w:t>
         </w:r>
@@ -2718,24 +2723,24 @@
           <w:t xml:space="preserve">.  </w:t>
         </w:r>
       </w:moveFrom>
-      <w:moveFromRangeEnd w:id="220"/>
-      <w:commentRangeEnd w:id="221"/>
-      <w:del w:id="224" w:author="Dave Bridges" w:date="2024-09-16T11:22:00Z" w16du:dateUtc="2024-09-16T15:22:00Z">
+      <w:moveFromRangeEnd w:id="221"/>
+      <w:commentRangeEnd w:id="222"/>
+      <w:del w:id="225" w:author="Dave Bridges" w:date="2024-09-16T11:22:00Z" w16du:dateUtc="2024-09-16T15:22:00Z">
         <w:r>
           <w:rPr>
             <w:rStyle w:val="CommentReference"/>
             <w:sz w:val="24"/>
             <w:szCs w:val="24"/>
           </w:rPr>
-          <w:commentReference w:id="221"/>
+          <w:commentReference w:id="222"/>
         </w:r>
       </w:del>
-      <w:commentRangeEnd w:id="222"/>
-      <w:r>
-        <w:rPr>
-          <w:rStyle w:val="CommentReference"/>
-        </w:rPr>
-        <w:commentReference w:id="222"/>
+      <w:commentRangeEnd w:id="223"/>
+      <w:r>
+        <w:rPr>
+          <w:rStyle w:val="CommentReference"/>
+        </w:rPr>
+        <w:commentReference w:id="223"/>
       </w:r>
     </w:p>
     <w:p/>
@@ -2793,31 +2798,31 @@
       <w:r>
         <w:t xml:space="preserve">  </w:t>
       </w:r>
-      <w:commentRangeStart w:id="225"/>
       <w:commentRangeStart w:id="226"/>
+      <w:commentRangeStart w:id="227"/>
       <w:r>
         <w:t xml:space="preserve">Univariable </w:t>
       </w:r>
       <w:r>
         <w:t xml:space="preserve">analyses </w:t>
       </w:r>
-      <w:commentRangeEnd w:id="225"/>
+      <w:commentRangeEnd w:id="226"/>
       <w:r>
         <w:rPr>
           <w:rStyle w:val="CommentReference"/>
           <w:sz w:val="24"/>
           <w:szCs w:val="24"/>
         </w:rPr>
-        <w:commentReference w:id="225"/>
-      </w:r>
-      <w:commentRangeEnd w:id="226"/>
+        <w:commentReference w:id="226"/>
+      </w:r>
+      <w:commentRangeEnd w:id="227"/>
       <w:r>
         <w:rPr>
           <w:rStyle w:val="CommentReference"/>
           <w:sz w:val="24"/>
           <w:szCs w:val="24"/>
         </w:rPr>
-        <w:commentReference w:id="226"/>
+        <w:commentReference w:id="227"/>
       </w:r>
       <w:r>
         <w:t>were performed using logistic regressions</w:t>
@@ -2825,12 +2830,12 @@
       <w:r>
         <w:t xml:space="preserve"> </w:t>
       </w:r>
-      <w:commentRangeStart w:id="227"/>
       <w:commentRangeStart w:id="228"/>
+      <w:commentRangeStart w:id="229"/>
       <w:r>
         <w:t xml:space="preserve">with </w:t>
       </w:r>
-      <w:del w:id="229" w:author="Dave Bridges" w:date="2025-07-28T19:30:00Z" w16du:dateUtc="2025-07-28T23:30:00Z">
+      <w:del w:id="230" w:author="Dave Bridges" w:date="2025-07-28T19:30:00Z" w16du:dateUtc="2025-07-28T23:30:00Z">
         <w:r>
           <w:delText xml:space="preserve">either </w:delText>
         </w:r>
@@ -2838,7 +2843,7 @@
       <w:r>
         <w:t xml:space="preserve">type 2 diabetes diagnosis </w:t>
       </w:r>
-      <w:del w:id="230" w:author="Dave Bridges" w:date="2025-07-28T19:29:00Z" w16du:dateUtc="2025-07-28T23:29:00Z">
+      <w:del w:id="231" w:author="Dave Bridges" w:date="2025-07-28T19:29:00Z" w16du:dateUtc="2025-07-28T23:29:00Z">
         <w:r>
           <w:delText xml:space="preserve">or above median PSS score </w:delText>
         </w:r>
@@ -2849,22 +2854,22 @@
       <w:r>
         <w:t>.</w:t>
       </w:r>
-      <w:commentRangeEnd w:id="227"/>
+      <w:commentRangeEnd w:id="228"/>
       <w:r>
         <w:rPr>
           <w:rStyle w:val="CommentReference"/>
           <w:sz w:val="24"/>
           <w:szCs w:val="24"/>
         </w:rPr>
-        <w:commentReference w:id="227"/>
-      </w:r>
-      <w:commentRangeEnd w:id="228"/>
-      <w:r>
-        <w:rPr>
-          <w:rStyle w:val="CommentReference"/>
-        </w:rPr>
         <w:commentReference w:id="228"/>
       </w:r>
+      <w:commentRangeEnd w:id="229"/>
+      <w:r>
+        <w:rPr>
+          <w:rStyle w:val="CommentReference"/>
+        </w:rPr>
+        <w:commentReference w:id="229"/>
+      </w:r>
       <w:r>
         <w:t xml:space="preserve">  </w:t>
       </w:r>
@@ -2882,12 +2887,12 @@
       <w:r>
         <w:t xml:space="preserve">analyses were performed by </w:t>
       </w:r>
-      <w:commentRangeStart w:id="231"/>
       <w:commentRangeStart w:id="232"/>
+      <w:commentRangeStart w:id="233"/>
       <w:r>
         <w:t>stepwise addition</w:t>
       </w:r>
-      <w:del w:id="233" w:author="Dave Bridges" w:date="2025-07-28T19:29:00Z" w16du:dateUtc="2025-07-28T23:29:00Z">
+      <w:del w:id="234" w:author="Dave Bridges" w:date="2025-07-28T19:29:00Z" w16du:dateUtc="2025-07-28T23:29:00Z">
         <w:r>
           <w:delText xml:space="preserve"> of </w:delText>
         </w:r>
@@ -2897,22 +2902,22 @@
         <w:r>
           <w:delText>covariates</w:delText>
         </w:r>
-        <w:commentRangeEnd w:id="231"/>
+        <w:commentRangeEnd w:id="232"/>
         <w:r>
           <w:rPr>
             <w:rStyle w:val="CommentReference"/>
             <w:sz w:val="24"/>
             <w:szCs w:val="24"/>
           </w:rPr>
-          <w:commentReference w:id="231"/>
+          <w:commentReference w:id="232"/>
         </w:r>
       </w:del>
-      <w:commentRangeEnd w:id="232"/>
-      <w:r>
-        <w:rPr>
-          <w:rStyle w:val="CommentReference"/>
-        </w:rPr>
-        <w:commentReference w:id="232"/>
+      <w:commentRangeEnd w:id="233"/>
+      <w:r>
+        <w:rPr>
+          <w:rStyle w:val="CommentReference"/>
+        </w:rPr>
+        <w:commentReference w:id="233"/>
       </w:r>
       <w:r>
         <w:t xml:space="preserve">.  Sensitivity analyses were </w:t>
@@ -2924,12 +2929,12 @@
       <w:r>
         <w:t>s</w:t>
       </w:r>
-      <w:del w:id="234" w:author="Dave Bridges" w:date="2025-07-28T19:32:00Z" w16du:dateUtc="2025-07-28T23:32:00Z">
+      <w:del w:id="235" w:author="Dave Bridges" w:date="2025-07-28T19:32:00Z" w16du:dateUtc="2025-07-28T23:32:00Z">
         <w:r>
           <w:delText xml:space="preserve">, </w:delText>
         </w:r>
-        <w:commentRangeStart w:id="235"/>
         <w:commentRangeStart w:id="236"/>
+        <w:commentRangeStart w:id="237"/>
         <w:r>
           <w:delText>and with PSS scores as a continuous variable</w:delText>
         </w:r>
@@ -2937,28 +2942,28 @@
       <w:r>
         <w:t xml:space="preserve">.  </w:t>
       </w:r>
-      <w:commentRangeEnd w:id="235"/>
+      <w:commentRangeEnd w:id="236"/>
       <w:r>
         <w:rPr>
           <w:rStyle w:val="CommentReference"/>
           <w:sz w:val="24"/>
           <w:szCs w:val="24"/>
         </w:rPr>
-        <w:commentReference w:id="235"/>
-      </w:r>
-      <w:commentRangeEnd w:id="236"/>
-      <w:r>
-        <w:rPr>
-          <w:rStyle w:val="CommentReference"/>
-        </w:rPr>
         <w:commentReference w:id="236"/>
       </w:r>
+      <w:commentRangeEnd w:id="237"/>
+      <w:r>
+        <w:rPr>
+          <w:rStyle w:val="CommentReference"/>
+        </w:rPr>
+        <w:commentReference w:id="237"/>
+      </w:r>
       <w:r>
         <w:t xml:space="preserve">We also did subgroup analyses within </w:t>
       </w:r>
-      <w:commentRangeStart w:id="237"/>
       <w:commentRangeStart w:id="238"/>
-      <w:del w:id="239" w:author="Dave Bridges" w:date="2025-07-28T19:33:00Z" w16du:dateUtc="2025-07-28T23:33:00Z">
+      <w:commentRangeStart w:id="239"/>
+      <w:del w:id="240" w:author="Dave Bridges" w:date="2025-07-28T19:33:00Z" w16du:dateUtc="2025-07-28T23:33:00Z">
         <w:r>
           <w:delText xml:space="preserve">each </w:delText>
         </w:r>
@@ -2966,12 +2971,12 @@
       <w:r>
         <w:t>gender</w:t>
       </w:r>
-      <w:ins w:id="240" w:author="Dave Bridges" w:date="2025-07-28T19:33:00Z" w16du:dateUtc="2025-07-28T23:33:00Z">
+      <w:ins w:id="241" w:author="Dave Bridges" w:date="2025-07-28T19:33:00Z" w16du:dateUtc="2025-07-28T23:33:00Z">
         <w:r>
           <w:t>, neighborhood, and race/ethnicity</w:t>
         </w:r>
       </w:ins>
-      <w:del w:id="241" w:author="Dave Bridges" w:date="2025-07-28T19:33:00Z" w16du:dateUtc="2025-07-28T23:33:00Z">
+      <w:del w:id="242" w:author="Dave Bridges" w:date="2025-07-28T19:33:00Z" w16du:dateUtc="2025-07-28T23:33:00Z">
         <w:r>
           <w:delText xml:space="preserve"> and </w:delText>
         </w:r>
@@ -2982,26 +2987,26 @@
       <w:r>
         <w:t xml:space="preserve"> group </w:t>
       </w:r>
-      <w:commentRangeEnd w:id="237"/>
+      <w:commentRangeEnd w:id="238"/>
       <w:r>
         <w:rPr>
           <w:rStyle w:val="CommentReference"/>
           <w:sz w:val="24"/>
           <w:szCs w:val="24"/>
         </w:rPr>
-        <w:commentReference w:id="237"/>
-      </w:r>
-      <w:commentRangeEnd w:id="238"/>
-      <w:r>
-        <w:rPr>
-          <w:rStyle w:val="CommentReference"/>
-        </w:rPr>
         <w:commentReference w:id="238"/>
       </w:r>
+      <w:commentRangeEnd w:id="239"/>
+      <w:r>
+        <w:rPr>
+          <w:rStyle w:val="CommentReference"/>
+        </w:rPr>
+        <w:commentReference w:id="239"/>
+      </w:r>
       <w:r>
         <w:t xml:space="preserve">testing for effect modification of the obesity-stress relationship on </w:t>
       </w:r>
-      <w:commentRangeStart w:id="242"/>
+      <w:commentRangeStart w:id="243"/>
       <w:r>
         <w:t xml:space="preserve">diabetes </w:t>
       </w:r>
@@ -3011,14 +3016,14 @@
       <w:r>
         <w:t xml:space="preserve">.  </w:t>
       </w:r>
-      <w:commentRangeEnd w:id="242"/>
+      <w:commentRangeEnd w:id="243"/>
       <w:r>
         <w:rPr>
           <w:rStyle w:val="CommentReference"/>
           <w:sz w:val="24"/>
           <w:szCs w:val="24"/>
         </w:rPr>
-        <w:commentReference w:id="242"/>
+        <w:commentReference w:id="243"/>
       </w:r>
     </w:p>
     <w:p/>
@@ -3109,51 +3114,51 @@
       <w:r>
         <w:t xml:space="preserve">population </w:t>
       </w:r>
-      <w:commentRangeStart w:id="243"/>
       <w:commentRangeStart w:id="244"/>
+      <w:commentRangeStart w:id="245"/>
       <w:r>
         <w:t>disproportionately</w:t>
       </w:r>
-      <w:commentRangeEnd w:id="243"/>
+      <w:commentRangeEnd w:id="244"/>
       <w:r>
         <w:rPr>
           <w:rStyle w:val="CommentReference"/>
           <w:sz w:val="24"/>
           <w:szCs w:val="24"/>
         </w:rPr>
-        <w:commentReference w:id="243"/>
-      </w:r>
-      <w:commentRangeEnd w:id="244"/>
-      <w:r>
-        <w:rPr>
-          <w:rStyle w:val="CommentReference"/>
-        </w:rPr>
         <w:commentReference w:id="244"/>
       </w:r>
+      <w:commentRangeEnd w:id="245"/>
+      <w:r>
+        <w:rPr>
+          <w:rStyle w:val="CommentReference"/>
+        </w:rPr>
+        <w:commentReference w:id="245"/>
+      </w:r>
       <w:r>
         <w:t xml:space="preserve"> identified as White </w:t>
       </w:r>
-      <w:ins w:id="245" w:author="Dave Bridges" w:date="2025-07-28T19:34:00Z" w16du:dateUtc="2025-07-28T23:34:00Z">
+      <w:ins w:id="246" w:author="Dave Bridges" w:date="2025-07-28T19:34:00Z" w16du:dateUtc="2025-07-28T23:34:00Z">
         <w:r>
           <w:t>relative to</w:t>
         </w:r>
       </w:ins>
-      <w:ins w:id="246" w:author="Dave Bridges" w:date="2025-07-28T19:35:00Z" w16du:dateUtc="2025-07-28T23:35:00Z">
+      <w:ins w:id="247" w:author="Dave Bridges" w:date="2025-07-28T19:35:00Z" w16du:dateUtc="2025-07-28T23:35:00Z">
         <w:r>
           <w:t xml:space="preserve"> both</w:t>
         </w:r>
       </w:ins>
-      <w:ins w:id="247" w:author="Dave Bridges" w:date="2025-07-28T19:34:00Z" w16du:dateUtc="2025-07-28T23:34:00Z">
+      <w:ins w:id="248" w:author="Dave Bridges" w:date="2025-07-28T19:34:00Z" w16du:dateUtc="2025-07-28T23:34:00Z">
         <w:r>
           <w:t xml:space="preserve"> Michigan and</w:t>
         </w:r>
       </w:ins>
-      <w:ins w:id="248" w:author="Dave Bridges" w:date="2025-07-28T19:35:00Z" w16du:dateUtc="2025-07-28T23:35:00Z">
+      <w:ins w:id="249" w:author="Dave Bridges" w:date="2025-07-28T19:35:00Z" w16du:dateUtc="2025-07-28T23:35:00Z">
         <w:r>
           <w:t xml:space="preserve"> the</w:t>
         </w:r>
       </w:ins>
-      <w:ins w:id="249" w:author="Dave Bridges" w:date="2025-07-28T19:34:00Z" w16du:dateUtc="2025-07-28T23:34:00Z">
+      <w:ins w:id="250" w:author="Dave Bridges" w:date="2025-07-28T19:34:00Z" w16du:dateUtc="2025-07-28T23:34:00Z">
         <w:r>
           <w:t xml:space="preserve"> United States </w:t>
         </w:r>
@@ -3168,7 +3173,20 @@
         <w:t xml:space="preserve">Table 1).  </w:t>
       </w:r>
       <w:r>
-        <w:t xml:space="preserve">15% of </w:t>
+        <w:t>1</w:t>
+      </w:r>
+      <w:ins w:id="251" w:author="Dave Bridges" w:date="2025-07-29T16:41:00Z" w16du:dateUtc="2025-07-29T20:41:00Z">
+        <w:r>
+          <w:t>6</w:t>
+        </w:r>
+      </w:ins>
+      <w:del w:id="252" w:author="Dave Bridges" w:date="2025-07-29T16:41:00Z" w16du:dateUtc="2025-07-29T20:41:00Z">
+        <w:r>
+          <w:delText>5</w:delText>
+        </w:r>
+      </w:del>
+      <w:r>
+        <w:t xml:space="preserve">% of </w:t>
       </w:r>
       <w:r>
         <w:t xml:space="preserve">the participants </w:t>
@@ -3191,26 +3209,26 @@
       <w:r>
         <w:t xml:space="preserve">As shown in Table 1, several demographic factors were significantly different between participants </w:t>
       </w:r>
-      <w:commentRangeStart w:id="250"/>
-      <w:commentRangeStart w:id="251"/>
+      <w:commentRangeStart w:id="253"/>
+      <w:commentRangeStart w:id="254"/>
       <w:r>
         <w:t xml:space="preserve">with high PSS scores </w:t>
       </w:r>
-      <w:commentRangeEnd w:id="250"/>
+      <w:commentRangeEnd w:id="253"/>
       <w:r>
         <w:rPr>
           <w:rStyle w:val="CommentReference"/>
           <w:sz w:val="24"/>
           <w:szCs w:val="24"/>
         </w:rPr>
-        <w:commentReference w:id="250"/>
-      </w:r>
-      <w:commentRangeEnd w:id="251"/>
-      <w:r>
-        <w:rPr>
-          <w:rStyle w:val="CommentReference"/>
-        </w:rPr>
-        <w:commentReference w:id="251"/>
+        <w:commentReference w:id="253"/>
+      </w:r>
+      <w:commentRangeEnd w:id="254"/>
+      <w:r>
+        <w:rPr>
+          <w:rStyle w:val="CommentReference"/>
+        </w:rPr>
+        <w:commentReference w:id="254"/>
       </w:r>
       <w:r>
         <w:t xml:space="preserve">including race (higher in Black and Hispanic or Latino participants), </w:t>
@@ -3227,6 +3245,20 @@
       <w:r>
         <w:t>higher than male</w:t>
       </w:r>
+      <w:ins w:id="255" w:author="Dave Bridges" w:date="2025-07-29T16:39:00Z" w16du:dateUtc="2025-07-29T20:39:00Z">
+        <w:r>
+          <w:t>, p= 8 x 10</w:t>
+        </w:r>
+        <w:r>
+          <w:rPr>
+            <w:vertAlign w:val="superscript"/>
+            <w:rPrChange w:id="256" w:author="Dave Bridges" w:date="2025-07-29T16:39:00Z" w16du:dateUtc="2025-07-29T20:39:00Z">
+              <w:rPr/>
+            </w:rPrChange>
+          </w:rPr>
+          <w:t>-20</w:t>
+        </w:r>
+      </w:ins>
       <w:r>
         <w:t xml:space="preserve">), younger age (particularly under 60 years old), and the </w:t>
       </w:r>
@@ -3249,13 +3281,91 @@
         <w:t>scores.</w:t>
       </w:r>
       <w:r>
-        <w:t xml:space="preserve">  Body mass indices above 25 and below 18.5 (underweight) were </w:t>
-      </w:r>
-      <w:r>
-        <w:t xml:space="preserve">both </w:t>
-      </w:r>
-      <w:r>
-        <w:t>positively associated with a higher likelihood of perceived stress.</w:t>
+        <w:t xml:space="preserve">  Body mass indices above </w:t>
+      </w:r>
+      <w:del w:id="257" w:author="Dave Bridges" w:date="2025-07-29T16:38:00Z" w16du:dateUtc="2025-07-29T20:38:00Z">
+        <w:r>
+          <w:delText xml:space="preserve">25 </w:delText>
+        </w:r>
+      </w:del>
+      <w:ins w:id="258" w:author="Dave Bridges" w:date="2025-07-29T16:38:00Z" w16du:dateUtc="2025-07-29T20:38:00Z">
+        <w:r>
+          <w:t>30</w:t>
+        </w:r>
+        <w:r>
+          <w:t xml:space="preserve"> </w:t>
+        </w:r>
+      </w:ins>
+      <w:del w:id="259" w:author="Dave Bridges" w:date="2025-07-29T16:40:00Z" w16du:dateUtc="2025-07-29T20:40:00Z">
+        <w:r>
+          <w:delText xml:space="preserve">and below </w:delText>
+        </w:r>
+      </w:del>
+      <w:del w:id="260" w:author="Dave Bridges" w:date="2025-07-29T16:38:00Z" w16du:dateUtc="2025-07-29T20:38:00Z">
+        <w:r>
+          <w:delText xml:space="preserve">18.5 (underweight) </w:delText>
+        </w:r>
+      </w:del>
+      <w:del w:id="261" w:author="Dave Bridges" w:date="2025-07-29T16:40:00Z" w16du:dateUtc="2025-07-29T20:40:00Z">
+        <w:r>
+          <w:delText xml:space="preserve">were </w:delText>
+        </w:r>
+      </w:del>
+      <w:del w:id="262" w:author="Dave Bridges" w:date="2025-07-29T16:38:00Z" w16du:dateUtc="2025-07-29T20:38:00Z">
+        <w:r>
+          <w:delText xml:space="preserve">both </w:delText>
+        </w:r>
+      </w:del>
+      <w:del w:id="263" w:author="Dave Bridges" w:date="2025-07-29T16:40:00Z" w16du:dateUtc="2025-07-29T20:40:00Z">
+        <w:r>
+          <w:delText>positively associated with a</w:delText>
+        </w:r>
+      </w:del>
+      <w:ins w:id="264" w:author="Dave Bridges" w:date="2025-07-29T16:40:00Z" w16du:dateUtc="2025-07-29T20:40:00Z">
+        <w:r>
+          <w:t>had</w:t>
+        </w:r>
+      </w:ins>
+      <w:r>
+        <w:t xml:space="preserve"> higher </w:t>
+      </w:r>
+      <w:ins w:id="265" w:author="Dave Bridges" w:date="2025-07-29T16:38:00Z" w16du:dateUtc="2025-07-29T20:38:00Z">
+        <w:r>
+          <w:t xml:space="preserve">rates </w:t>
+        </w:r>
+      </w:ins>
+      <w:del w:id="266" w:author="Dave Bridges" w:date="2025-07-29T16:38:00Z" w16du:dateUtc="2025-07-29T20:38:00Z">
+        <w:r>
+          <w:delText xml:space="preserve">likelihood </w:delText>
+        </w:r>
+      </w:del>
+      <w:r>
+        <w:t>of perceived stress</w:t>
+      </w:r>
+      <w:ins w:id="267" w:author="Dave Bridges" w:date="2025-07-29T16:40:00Z" w16du:dateUtc="2025-07-29T20:40:00Z">
+        <w:r>
+          <w:t xml:space="preserve"> (45% vs 41%, p=4.7</w:t>
+        </w:r>
+      </w:ins>
+      <w:ins w:id="268" w:author="Dave Bridges" w:date="2025-07-29T16:41:00Z" w16du:dateUtc="2025-07-29T20:41:00Z">
+        <w:r>
+          <w:t xml:space="preserve"> x 10</w:t>
+        </w:r>
+        <w:r>
+          <w:rPr>
+            <w:vertAlign w:val="superscript"/>
+            <w:rPrChange w:id="269" w:author="Dave Bridges" w:date="2025-07-29T16:41:00Z" w16du:dateUtc="2025-07-29T20:41:00Z">
+              <w:rPr/>
+            </w:rPrChange>
+          </w:rPr>
+          <w:t>-18</w:t>
+        </w:r>
+        <w:r>
+          <w:t>)</w:t>
+        </w:r>
+      </w:ins>
+      <w:r>
+        <w:t>.</w:t>
       </w:r>
       <w:r>
         <w:t xml:space="preserve">  </w:t>
@@ -3275,8 +3385,8 @@
       <w:r>
         <w:t xml:space="preserve">above </w:t>
       </w:r>
-      <w:commentRangeStart w:id="252"/>
-      <w:commentRangeStart w:id="253"/>
+      <w:commentRangeStart w:id="270"/>
+      <w:commentRangeStart w:id="271"/>
       <w:r>
         <w:t>average</w:t>
       </w:r>
@@ -3289,21 +3399,21 @@
       <w:r>
         <w:t xml:space="preserve"> (47%) </w:t>
       </w:r>
-      <w:commentRangeEnd w:id="252"/>
+      <w:commentRangeEnd w:id="270"/>
       <w:r>
         <w:rPr>
           <w:rStyle w:val="CommentReference"/>
           <w:sz w:val="24"/>
           <w:szCs w:val="24"/>
         </w:rPr>
-        <w:commentReference w:id="252"/>
-      </w:r>
-      <w:commentRangeEnd w:id="253"/>
-      <w:r>
-        <w:rPr>
-          <w:rStyle w:val="CommentReference"/>
-        </w:rPr>
-        <w:commentReference w:id="253"/>
+        <w:commentReference w:id="270"/>
+      </w:r>
+      <w:commentRangeEnd w:id="271"/>
+      <w:r>
+        <w:rPr>
+          <w:rStyle w:val="CommentReference"/>
+        </w:rPr>
+        <w:commentReference w:id="271"/>
       </w:r>
       <w:r>
         <w:t>compared to those without</w:t>
@@ -3320,11 +3430,18 @@
       <w:r>
         <w:t xml:space="preserve"> = </w:t>
       </w:r>
-      <w:commentRangeStart w:id="254"/>
-      <w:commentRangeStart w:id="255"/>
-      <w:r>
-        <w:t>6</w:t>
-      </w:r>
+      <w:ins w:id="272" w:author="Dave Bridges" w:date="2025-07-29T16:39:00Z" w16du:dateUtc="2025-07-29T20:39:00Z">
+        <w:r>
+          <w:t>5.2</w:t>
+        </w:r>
+      </w:ins>
+      <w:commentRangeStart w:id="273"/>
+      <w:commentRangeStart w:id="274"/>
+      <w:del w:id="275" w:author="Dave Bridges" w:date="2025-07-29T16:39:00Z" w16du:dateUtc="2025-07-29T20:39:00Z">
+        <w:r>
+          <w:delText>6</w:delText>
+        </w:r>
+      </w:del>
       <w:r>
         <w:t xml:space="preserve"> x 10</w:t>
       </w:r>
@@ -3334,23 +3451,23 @@
         </w:rPr>
         <w:t>-18</w:t>
       </w:r>
-      <w:commentRangeEnd w:id="254"/>
+      <w:commentRangeEnd w:id="273"/>
       <w:r>
         <w:rPr>
           <w:rStyle w:val="CommentReference"/>
           <w:sz w:val="24"/>
           <w:szCs w:val="24"/>
         </w:rPr>
-        <w:commentReference w:id="254"/>
-      </w:r>
-      <w:commentRangeEnd w:id="255"/>
+        <w:commentReference w:id="273"/>
+      </w:r>
+      <w:commentRangeEnd w:id="274"/>
       <w:r>
         <w:rPr>
           <w:rStyle w:val="CommentReference"/>
           <w:sz w:val="24"/>
           <w:szCs w:val="24"/>
         </w:rPr>
-        <w:commentReference w:id="255"/>
+        <w:commentReference w:id="274"/>
       </w:r>
       <w:r>
         <w:t>).</w:t>
@@ -3360,27 +3477,87 @@
     <w:p>
       <w:pPr>
         <w:pStyle w:val="Heading2"/>
-      </w:pPr>
-      <w:r>
-        <w:t xml:space="preserve">Perceived Stress Is </w:t>
-      </w:r>
-      <w:r>
-        <w:t xml:space="preserve">More Strongly </w:t>
-      </w:r>
-      <w:r>
-        <w:t>Associated with Type 2 Diabetes in</w:t>
-      </w:r>
-      <w:r>
-        <w:t xml:space="preserve"> Participants with</w:t>
-      </w:r>
-      <w:r>
-        <w:t xml:space="preserve"> Obes</w:t>
-      </w:r>
-      <w:r>
-        <w:t>ity</w:t>
-      </w:r>
-    </w:p>
-    <w:p/>
+        <w:rPr>
+          <w:ins w:id="276" w:author="Dave Bridges" w:date="2025-07-29T16:44:00Z" w16du:dateUtc="2025-07-29T20:44:00Z"/>
+        </w:rPr>
+      </w:pPr>
+      <w:commentRangeStart w:id="277"/>
+      <w:r>
+        <w:t xml:space="preserve">Perceived Stress </w:t>
+      </w:r>
+      <w:ins w:id="278" w:author="Dave Bridges" w:date="2025-07-29T16:44:00Z" w16du:dateUtc="2025-07-29T20:44:00Z">
+        <w:r>
+          <w:t xml:space="preserve">Is </w:t>
+        </w:r>
+      </w:ins>
+      <w:del w:id="279" w:author="Dave Bridges" w:date="2025-07-29T16:42:00Z" w16du:dateUtc="2025-07-29T20:42:00Z">
+        <w:r>
+          <w:delText xml:space="preserve">Is </w:delText>
+        </w:r>
+        <w:r>
+          <w:delText xml:space="preserve">More Strongly </w:delText>
+        </w:r>
+      </w:del>
+      <w:r>
+        <w:t xml:space="preserve">Associated with Type 2 Diabetes </w:t>
+      </w:r>
+    </w:p>
+    <w:p>
+      <w:pPr>
+        <w:pStyle w:val="Heading2"/>
+        <w:rPr>
+          <w:ins w:id="280" w:author="Dave Bridges" w:date="2025-07-29T16:44:00Z" w16du:dateUtc="2025-07-29T20:44:00Z"/>
+        </w:rPr>
+      </w:pPr>
+    </w:p>
+    <w:p>
+      <w:pPr>
+        <w:pStyle w:val="Heading2"/>
+      </w:pPr>
+      <w:del w:id="281" w:author="Dave Bridges" w:date="2025-07-29T16:42:00Z" w16du:dateUtc="2025-07-29T20:42:00Z">
+        <w:r>
+          <w:delText>in</w:delText>
+        </w:r>
+        <w:r>
+          <w:delText xml:space="preserve"> Participants with</w:delText>
+        </w:r>
+        <w:r>
+          <w:delText xml:space="preserve"> Obes</w:delText>
+        </w:r>
+        <w:r>
+          <w:delText>ity</w:delText>
+        </w:r>
+      </w:del>
+      <w:commentRangeEnd w:id="277"/>
+      <w:r>
+        <w:rPr>
+          <w:rStyle w:val="CommentReference"/>
+          <w:rFonts w:asciiTheme="minorHAnsi" w:eastAsiaTheme="minorHAnsi" w:hAnsiTheme="minorHAnsi" w:cstheme="minorBidi"/>
+          <w:color w:val="auto"/>
+        </w:rPr>
+        <w:commentReference w:id="277"/>
+      </w:r>
+    </w:p>
+    <w:p>
+      <w:pPr>
+        <w:rPr>
+          <w:ins w:id="282" w:author="Dave Bridges" w:date="2025-07-29T16:44:00Z" w16du:dateUtc="2025-07-29T20:44:00Z"/>
+        </w:rPr>
+      </w:pPr>
+    </w:p>
+    <w:p>
+      <w:pPr>
+        <w:pStyle w:val="Heading2"/>
+        <w:pPrChange w:id="283" w:author="Dave Bridges" w:date="2025-07-29T16:44:00Z" w16du:dateUtc="2025-07-29T20:44:00Z">
+          <w:pPr/>
+        </w:pPrChange>
+      </w:pPr>
+      <w:ins w:id="284" w:author="Dave Bridges" w:date="2025-07-29T16:44:00Z" w16du:dateUtc="2025-07-29T20:44:00Z">
+        <w:r>
+          <w:t>Stress is More Strongly Associated with Type 2 Diabetes Risk in People with Obesity</w:t>
+        </w:r>
+      </w:ins>
+    </w:p>
     <w:p>
       <w:r>
         <w:t>We next evaluated how obesity modified the stress-diabetes relationship in these participants.</w:t>
@@ -3388,7 +3565,7 @@
       <w:r>
         <w:t xml:space="preserve">  </w:t>
       </w:r>
-      <w:commentRangeStart w:id="256"/>
+      <w:commentRangeStart w:id="285"/>
       <w:r>
         <w:t>We stratified participants into those with a BMI above or below 30 kg/m</w:t>
       </w:r>
@@ -3401,14 +3578,14 @@
       <w:r>
         <w:t xml:space="preserve"> and with above or below median stress.  </w:t>
       </w:r>
-      <w:commentRangeEnd w:id="256"/>
+      <w:commentRangeEnd w:id="285"/>
       <w:r>
         <w:rPr>
           <w:rStyle w:val="CommentReference"/>
           <w:sz w:val="24"/>
           <w:szCs w:val="24"/>
         </w:rPr>
-        <w:commentReference w:id="256"/>
+        <w:commentReference w:id="285"/>
       </w:r>
       <w:r>
         <w:t xml:space="preserve">As expected, participants with obesity had higher type 2 diabetes prevalence than those with a BMI under 30 (unadjusted odds ratio 3.1 +/- 1.0).  </w:t>
@@ -3422,7 +3599,7 @@
       <w:r>
         <w:t xml:space="preserve"> (11.6% vs 6.8% among participants without obesity; 26.9% vs 22.1% in participants with obesity), </w:t>
       </w:r>
-      <w:commentRangeStart w:id="257"/>
+      <w:commentRangeStart w:id="286"/>
       <w:r>
         <w:t xml:space="preserve">the </w:t>
       </w:r>
@@ -3461,14 +3638,14 @@
       <w:r>
         <w:t>).</w:t>
       </w:r>
-      <w:commentRangeEnd w:id="257"/>
+      <w:commentRangeEnd w:id="286"/>
       <w:r>
         <w:rPr>
           <w:rStyle w:val="CommentReference"/>
           <w:sz w:val="24"/>
           <w:szCs w:val="24"/>
         </w:rPr>
-        <w:commentReference w:id="257"/>
+        <w:commentReference w:id="286"/>
       </w:r>
       <w:r>
         <w:t xml:space="preserve">  </w:t>
@@ -3545,34 +3722,34 @@
       <w:r>
         <w:t xml:space="preserve"> (</w:t>
       </w:r>
-      <w:commentRangeStart w:id="258"/>
+      <w:commentRangeStart w:id="287"/>
       <w:r>
         <w:t xml:space="preserve">12% </w:t>
       </w:r>
-      <w:commentRangeEnd w:id="258"/>
+      <w:commentRangeEnd w:id="287"/>
       <w:r>
         <w:rPr>
           <w:rStyle w:val="CommentReference"/>
           <w:sz w:val="24"/>
           <w:szCs w:val="24"/>
         </w:rPr>
-        <w:commentReference w:id="258"/>
-      </w:r>
-      <w:commentRangeStart w:id="259"/>
+        <w:commentReference w:id="287"/>
+      </w:r>
+      <w:commentRangeStart w:id="288"/>
       <w:r>
         <w:t>increase, p=0.</w:t>
       </w:r>
       <w:r>
         <w:t>06</w:t>
       </w:r>
-      <w:commentRangeEnd w:id="259"/>
+      <w:commentRangeEnd w:id="288"/>
       <w:r>
         <w:rPr>
           <w:rStyle w:val="CommentReference"/>
           <w:sz w:val="24"/>
           <w:szCs w:val="24"/>
         </w:rPr>
-        <w:commentReference w:id="259"/>
+        <w:commentReference w:id="288"/>
       </w:r>
       <w:r>
         <w:t xml:space="preserve">).  </w:t>
@@ -3581,6 +3758,7 @@
         <w:t xml:space="preserve">This effect was similar across gender, and neighborhood </w:t>
       </w:r>
       <w:r>
+        <w:lastRenderedPageBreak/>
         <w:t>disadvantage</w:t>
       </w:r>
       <w:r>
@@ -3694,28 +3872,28 @@
       <w:r>
         <w:t xml:space="preserve"> whether the interaction between obesity and perceived stress was consistent across demographic categories.  We found that the interaction was stronger in males (</w:t>
       </w:r>
-      <w:commentRangeStart w:id="260"/>
-      <w:commentRangeStart w:id="261"/>
+      <w:commentRangeStart w:id="289"/>
+      <w:commentRangeStart w:id="290"/>
       <w:r>
         <w:t xml:space="preserve">21%) </w:t>
       </w:r>
-      <w:commentRangeEnd w:id="260"/>
+      <w:commentRangeEnd w:id="289"/>
       <w:r>
         <w:rPr>
           <w:rStyle w:val="CommentReference"/>
           <w:sz w:val="24"/>
           <w:szCs w:val="24"/>
         </w:rPr>
-        <w:commentReference w:id="260"/>
-      </w:r>
-      <w:commentRangeEnd w:id="261"/>
+        <w:commentReference w:id="289"/>
+      </w:r>
+      <w:commentRangeEnd w:id="290"/>
       <w:r>
         <w:rPr>
           <w:rStyle w:val="CommentReference"/>
           <w:sz w:val="24"/>
           <w:szCs w:val="24"/>
         </w:rPr>
-        <w:commentReference w:id="261"/>
+        <w:commentReference w:id="290"/>
       </w:r>
       <w:r>
         <w:t xml:space="preserve">than females (0.3%), and stronger in Asian (49%) and Black (19%) participants than White (13%) or Hispanic/Latino (-45%) participants, though neither stress x obesity x gender </w:t>
@@ -3777,9 +3955,9 @@
       <w:r>
         <w:t xml:space="preserve"> </w:t>
       </w:r>
-      <w:commentRangeStart w:id="262"/>
-      <w:commentRangeStart w:id="263"/>
-      <w:commentRangeStart w:id="264"/>
+      <w:commentRangeStart w:id="291"/>
+      <w:commentRangeStart w:id="292"/>
+      <w:commentRangeStart w:id="293"/>
       <w:r>
         <w:t>We next tested whether participants with obesity reporting elevated stress were more obese</w:t>
       </w:r>
@@ -3845,32 +4023,32 @@
       <w:r>
         <w:t>.</w:t>
       </w:r>
-      <w:commentRangeEnd w:id="262"/>
+      <w:commentRangeEnd w:id="291"/>
       <w:r>
         <w:rPr>
           <w:rStyle w:val="CommentReference"/>
           <w:sz w:val="24"/>
           <w:szCs w:val="24"/>
         </w:rPr>
-        <w:commentReference w:id="262"/>
-      </w:r>
-      <w:commentRangeEnd w:id="263"/>
+        <w:commentReference w:id="291"/>
+      </w:r>
+      <w:commentRangeEnd w:id="292"/>
       <w:r>
         <w:rPr>
           <w:rStyle w:val="CommentReference"/>
           <w:sz w:val="24"/>
           <w:szCs w:val="24"/>
         </w:rPr>
-        <w:commentReference w:id="263"/>
-      </w:r>
-      <w:commentRangeEnd w:id="264"/>
+        <w:commentReference w:id="292"/>
+      </w:r>
+      <w:commentRangeEnd w:id="293"/>
       <w:r>
         <w:rPr>
           <w:rStyle w:val="CommentReference"/>
           <w:sz w:val="24"/>
           <w:szCs w:val="24"/>
         </w:rPr>
-        <w:commentReference w:id="264"/>
+        <w:commentReference w:id="293"/>
       </w:r>
     </w:p>
     <w:p>
@@ -3891,73 +4069,73 @@
       <w:r>
         <w:t xml:space="preserve"> Modify the Prevalence of Other </w:t>
       </w:r>
-      <w:commentRangeStart w:id="265"/>
-      <w:commentRangeStart w:id="266"/>
+      <w:commentRangeStart w:id="294"/>
+      <w:commentRangeStart w:id="295"/>
       <w:r>
         <w:t>Obesity-Related Co-Morbidities</w:t>
       </w:r>
-      <w:commentRangeEnd w:id="265"/>
+      <w:commentRangeEnd w:id="294"/>
       <w:r>
         <w:rPr>
           <w:rStyle w:val="CommentReference"/>
           <w:sz w:val="26"/>
           <w:szCs w:val="26"/>
         </w:rPr>
-        <w:commentReference w:id="265"/>
-      </w:r>
-      <w:commentRangeEnd w:id="266"/>
+        <w:commentReference w:id="294"/>
+      </w:r>
+      <w:commentRangeEnd w:id="295"/>
       <w:r>
         <w:rPr>
           <w:rStyle w:val="CommentReference"/>
           <w:sz w:val="26"/>
           <w:szCs w:val="26"/>
         </w:rPr>
-        <w:commentReference w:id="266"/>
+        <w:commentReference w:id="295"/>
       </w:r>
     </w:p>
     <w:p/>
     <w:p>
-      <w:ins w:id="267" w:author="Dave Bridges" w:date="2024-08-28T17:42:00Z">
+      <w:ins w:id="296" w:author="Dave Bridges" w:date="2024-08-28T17:42:00Z">
         <w:r>
           <w:t>Sev</w:t>
         </w:r>
       </w:ins>
-      <w:ins w:id="268" w:author="Dave Bridges" w:date="2024-08-28T17:43:00Z">
+      <w:ins w:id="297" w:author="Dave Bridges" w:date="2024-08-28T17:43:00Z">
         <w:r>
           <w:t xml:space="preserve">eral other chronic diseases </w:t>
         </w:r>
       </w:ins>
-      <w:ins w:id="269" w:author="Irit Hochberg" w:date="2024-08-29T11:34:00Z">
+      <w:ins w:id="298" w:author="Irit Hochberg" w:date="2024-08-29T11:34:00Z">
         <w:r>
           <w:t>are associated with obesity</w:t>
         </w:r>
       </w:ins>
-      <w:ins w:id="270" w:author="Irit Hochberg" w:date="2024-08-29T11:35:00Z">
+      <w:ins w:id="299" w:author="Irit Hochberg" w:date="2024-08-29T11:35:00Z">
         <w:r>
           <w:t xml:space="preserve">, </w:t>
         </w:r>
       </w:ins>
-      <w:ins w:id="271" w:author="Dave Bridges" w:date="2024-08-28T17:43:00Z">
+      <w:ins w:id="300" w:author="Dave Bridges" w:date="2024-08-28T17:43:00Z">
         <w:r>
           <w:t>includ</w:t>
         </w:r>
-        <w:del w:id="272" w:author="Irit Hochberg" w:date="2024-08-29T11:35:00Z">
+        <w:del w:id="301" w:author="Irit Hochberg" w:date="2024-08-29T11:35:00Z">
           <w:r>
             <w:delText>ing</w:delText>
           </w:r>
         </w:del>
       </w:ins>
-      <w:ins w:id="273" w:author="Irit Hochberg" w:date="2024-08-29T11:35:00Z">
+      <w:ins w:id="302" w:author="Irit Hochberg" w:date="2024-08-29T11:35:00Z">
         <w:r>
           <w:t>e</w:t>
         </w:r>
       </w:ins>
-      <w:ins w:id="274" w:author="Dave Bridges" w:date="2024-08-28T17:43:00Z">
+      <w:ins w:id="303" w:author="Dave Bridges" w:date="2024-08-28T17:43:00Z">
         <w:r>
           <w:t xml:space="preserve"> cardiac arrhythmias</w:t>
         </w:r>
       </w:ins>
-      <w:ins w:id="275" w:author="Dave Bridges" w:date="2024-09-16T12:48:00Z" w16du:dateUtc="2024-09-16T16:48:00Z">
+      <w:ins w:id="304" w:author="Dave Bridges" w:date="2024-09-16T12:48:00Z" w16du:dateUtc="2024-09-16T16:48:00Z">
         <w:r>
           <w:t xml:space="preserve"> </w:t>
         </w:r>
@@ -3980,18 +4158,18 @@
       <w:r>
         <w:fldChar w:fldCharType="end"/>
       </w:r>
-      <w:ins w:id="276" w:author="Dave Bridges" w:date="2024-08-28T17:43:00Z">
+      <w:ins w:id="305" w:author="Dave Bridges" w:date="2024-08-28T17:43:00Z">
         <w:r>
           <w:t>, chronic pulmonary disease</w:t>
         </w:r>
       </w:ins>
-      <w:ins w:id="277" w:author="Dave Bridges" w:date="2024-09-16T12:48:00Z" w16du:dateUtc="2024-09-16T16:48:00Z">
+      <w:ins w:id="306" w:author="Dave Bridges" w:date="2024-09-16T12:48:00Z" w16du:dateUtc="2024-09-16T16:48:00Z">
         <w:r>
           <w:t xml:space="preserve"> </w:t>
         </w:r>
       </w:ins>
-      <w:commentRangeStart w:id="278"/>
-      <w:commentRangeStart w:id="279"/>
+      <w:commentRangeStart w:id="307"/>
+      <w:commentRangeStart w:id="308"/>
       <w:r>
         <w:fldChar w:fldCharType="begin"/>
       </w:r>
@@ -4010,40 +4188,40 @@
       <w:r>
         <w:fldChar w:fldCharType="end"/>
       </w:r>
-      <w:commentRangeEnd w:id="278"/>
+      <w:commentRangeEnd w:id="307"/>
       <w:r>
         <w:rPr>
           <w:rStyle w:val="CommentReference"/>
           <w:sz w:val="24"/>
           <w:szCs w:val="24"/>
         </w:rPr>
-        <w:commentReference w:id="278"/>
-      </w:r>
-      <w:commentRangeEnd w:id="279"/>
+        <w:commentReference w:id="307"/>
+      </w:r>
+      <w:commentRangeEnd w:id="308"/>
       <w:r>
         <w:rPr>
           <w:rStyle w:val="CommentReference"/>
           <w:sz w:val="24"/>
           <w:szCs w:val="24"/>
         </w:rPr>
-        <w:commentReference w:id="279"/>
-      </w:r>
-      <w:ins w:id="280" w:author="Dave Bridges" w:date="2024-08-28T17:43:00Z">
+        <w:commentReference w:id="308"/>
+      </w:r>
+      <w:ins w:id="309" w:author="Dave Bridges" w:date="2024-08-28T17:43:00Z">
         <w:r>
           <w:t xml:space="preserve">, congestive heart </w:t>
         </w:r>
       </w:ins>
-      <w:ins w:id="281" w:author="Irit Hochberg" w:date="2024-08-29T12:04:00Z">
+      <w:ins w:id="310" w:author="Irit Hochberg" w:date="2024-08-29T12:04:00Z">
         <w:r>
           <w:t>f</w:t>
         </w:r>
       </w:ins>
-      <w:ins w:id="282" w:author="Dave Bridges" w:date="2024-08-28T17:43:00Z">
+      <w:ins w:id="311" w:author="Dave Bridges" w:date="2024-08-28T17:43:00Z">
         <w:r>
           <w:t>ailure</w:t>
         </w:r>
       </w:ins>
-      <w:ins w:id="283" w:author="Dave Bridges" w:date="2024-09-16T12:48:00Z" w16du:dateUtc="2024-09-16T16:48:00Z">
+      <w:ins w:id="312" w:author="Dave Bridges" w:date="2024-09-16T12:48:00Z" w16du:dateUtc="2024-09-16T16:48:00Z">
         <w:r>
           <w:t xml:space="preserve"> </w:t>
         </w:r>
@@ -4066,22 +4244,22 @@
       <w:r>
         <w:fldChar w:fldCharType="end"/>
       </w:r>
-      <w:ins w:id="284" w:author="Dave Bridges" w:date="2024-08-28T17:43:00Z">
+      <w:ins w:id="313" w:author="Dave Bridges" w:date="2024-08-28T17:43:00Z">
         <w:r>
           <w:t>, and liver dis</w:t>
         </w:r>
       </w:ins>
-      <w:ins w:id="285" w:author="Dave Bridges" w:date="2024-08-28T17:47:00Z">
+      <w:ins w:id="314" w:author="Dave Bridges" w:date="2024-08-28T17:47:00Z">
         <w:r>
           <w:t>e</w:t>
         </w:r>
       </w:ins>
-      <w:ins w:id="286" w:author="Dave Bridges" w:date="2024-08-28T17:43:00Z">
+      <w:ins w:id="315" w:author="Dave Bridges" w:date="2024-08-28T17:43:00Z">
         <w:r>
           <w:t>ase</w:t>
         </w:r>
       </w:ins>
-      <w:ins w:id="287" w:author="Dave Bridges" w:date="2024-09-16T12:48:00Z" w16du:dateUtc="2024-09-16T16:48:00Z">
+      <w:ins w:id="316" w:author="Dave Bridges" w:date="2024-09-16T12:48:00Z" w16du:dateUtc="2024-09-16T16:48:00Z">
         <w:r>
           <w:t xml:space="preserve"> </w:t>
         </w:r>
@@ -4104,18 +4282,18 @@
       <w:r>
         <w:fldChar w:fldCharType="end"/>
       </w:r>
-      <w:ins w:id="288" w:author="Dave Bridges" w:date="2024-08-28T17:43:00Z">
+      <w:ins w:id="317" w:author="Dave Bridges" w:date="2024-08-28T17:43:00Z">
         <w:r>
           <w:t xml:space="preserve"> </w:t>
         </w:r>
-        <w:del w:id="289" w:author="Irit Hochberg" w:date="2024-08-29T11:35:00Z">
+        <w:del w:id="318" w:author="Irit Hochberg" w:date="2024-08-29T11:35:00Z">
           <w:r>
             <w:delText>have been previously</w:delText>
           </w:r>
         </w:del>
       </w:ins>
-      <w:ins w:id="290" w:author="Dave Bridges" w:date="2024-08-28T17:47:00Z">
-        <w:del w:id="291" w:author="Irit Hochberg" w:date="2024-08-29T11:35:00Z">
+      <w:ins w:id="319" w:author="Dave Bridges" w:date="2024-08-28T17:47:00Z">
+        <w:del w:id="320" w:author="Irit Hochberg" w:date="2024-08-29T11:35:00Z">
           <w:r>
             <w:delText xml:space="preserve"> reported</w:delText>
           </w:r>
@@ -4124,16 +4302,16 @@
           <w:t xml:space="preserve">.  </w:t>
         </w:r>
       </w:ins>
-      <w:commentRangeStart w:id="292"/>
+      <w:commentRangeStart w:id="321"/>
       <w:r>
         <w:t xml:space="preserve">Given the enhancement of obesity-associated </w:t>
       </w:r>
-      <w:ins w:id="293" w:author="Dave Bridges" w:date="2024-08-28T17:43:00Z">
+      <w:ins w:id="322" w:author="Dave Bridges" w:date="2024-08-28T17:43:00Z">
         <w:r>
           <w:t>Type 2 D</w:t>
         </w:r>
       </w:ins>
-      <w:del w:id="294" w:author="Dave Bridges" w:date="2024-08-28T17:43:00Z">
+      <w:del w:id="323" w:author="Dave Bridges" w:date="2024-08-28T17:43:00Z">
         <w:r>
           <w:delText>d</w:delText>
         </w:r>
@@ -4141,12 +4319,12 @@
       <w:r>
         <w:t xml:space="preserve">iabetes prevalence </w:t>
       </w:r>
-      <w:ins w:id="295" w:author="Dave Bridges" w:date="2024-08-28T17:43:00Z">
+      <w:ins w:id="324" w:author="Dave Bridges" w:date="2024-08-28T17:43:00Z">
         <w:r>
           <w:t>that we observed</w:t>
         </w:r>
       </w:ins>
-      <w:del w:id="296" w:author="Dave Bridges" w:date="2024-08-28T17:43:00Z">
+      <w:del w:id="325" w:author="Dave Bridges" w:date="2024-08-28T17:43:00Z">
         <w:r>
           <w:delText>in these participants</w:delText>
         </w:r>
@@ -4154,12 +4332,12 @@
       <w:r>
         <w:t xml:space="preserve">, we </w:t>
       </w:r>
-      <w:del w:id="297" w:author="Dave Bridges" w:date="2024-08-28T17:43:00Z">
+      <w:del w:id="326" w:author="Dave Bridges" w:date="2024-08-28T17:43:00Z">
         <w:r>
           <w:delText xml:space="preserve">then </w:delText>
         </w:r>
       </w:del>
-      <w:ins w:id="298" w:author="Dave Bridges" w:date="2024-08-28T17:43:00Z">
+      <w:ins w:id="327" w:author="Dave Bridges" w:date="2024-08-28T17:43:00Z">
         <w:r>
           <w:t xml:space="preserve">next </w:t>
         </w:r>
@@ -4167,7 +4345,7 @@
       <w:r>
         <w:t xml:space="preserve">evaluated </w:t>
       </w:r>
-      <w:del w:id="299" w:author="Irit Hochberg" w:date="2024-08-29T12:03:00Z">
+      <w:del w:id="328" w:author="Irit Hochberg" w:date="2024-08-29T12:03:00Z">
         <w:r>
           <w:delText>several other</w:delText>
         </w:r>
@@ -4175,17 +4353,17 @@
       <w:r>
         <w:t xml:space="preserve"> </w:t>
       </w:r>
-      <w:ins w:id="300" w:author="Irit Hochberg" w:date="2024-08-29T12:19:00Z">
+      <w:ins w:id="329" w:author="Irit Hochberg" w:date="2024-08-29T12:19:00Z">
         <w:r>
           <w:t xml:space="preserve">whether </w:t>
         </w:r>
       </w:ins>
-      <w:ins w:id="301" w:author="Irit Hochberg" w:date="2024-08-29T12:04:00Z">
+      <w:ins w:id="330" w:author="Irit Hochberg" w:date="2024-08-29T12:04:00Z">
         <w:r>
           <w:t>the</w:t>
         </w:r>
       </w:ins>
-      <w:ins w:id="302" w:author="Irit Hochberg" w:date="2024-08-29T12:19:00Z">
+      <w:ins w:id="331" w:author="Irit Hochberg" w:date="2024-08-29T12:19:00Z">
         <w:r>
           <w:t xml:space="preserve">re is </w:t>
         </w:r>
@@ -4198,12 +4376,12 @@
           <w:t xml:space="preserve"> </w:t>
         </w:r>
       </w:ins>
-      <w:ins w:id="303" w:author="Irit Hochberg" w:date="2024-08-29T12:04:00Z">
+      <w:ins w:id="332" w:author="Irit Hochberg" w:date="2024-08-29T12:04:00Z">
         <w:r>
           <w:t xml:space="preserve">effect of </w:t>
         </w:r>
       </w:ins>
-      <w:ins w:id="304" w:author="Irit Hochberg" w:date="2024-08-29T12:20:00Z">
+      <w:ins w:id="333" w:author="Irit Hochberg" w:date="2024-08-29T12:20:00Z">
         <w:r>
           <w:t xml:space="preserve">stress on the link between </w:t>
         </w:r>
@@ -4211,32 +4389,32 @@
       <w:r>
         <w:t xml:space="preserve">obesity </w:t>
       </w:r>
-      <w:del w:id="305" w:author="Irit Hochberg" w:date="2024-08-29T12:20:00Z">
+      <w:del w:id="334" w:author="Irit Hochberg" w:date="2024-08-29T12:20:00Z">
         <w:r>
           <w:delText>and stress</w:delText>
         </w:r>
       </w:del>
-      <w:del w:id="306" w:author="Irit Hochberg" w:date="2024-08-29T12:04:00Z">
+      <w:del w:id="335" w:author="Irit Hochberg" w:date="2024-08-29T12:04:00Z">
         <w:r>
           <w:delText>-linked</w:delText>
         </w:r>
       </w:del>
-      <w:del w:id="307" w:author="Irit Hochberg" w:date="2024-08-29T12:20:00Z">
+      <w:del w:id="336" w:author="Irit Hochberg" w:date="2024-08-29T12:20:00Z">
         <w:r>
           <w:delText xml:space="preserve"> </w:delText>
         </w:r>
       </w:del>
-      <w:ins w:id="308" w:author="Irit Hochberg" w:date="2024-08-29T12:20:00Z">
+      <w:ins w:id="337" w:author="Irit Hochberg" w:date="2024-08-29T12:20:00Z">
         <w:r>
           <w:t>and</w:t>
         </w:r>
       </w:ins>
-      <w:ins w:id="309" w:author="Irit Hochberg" w:date="2024-08-29T12:04:00Z">
+      <w:ins w:id="338" w:author="Irit Hochberg" w:date="2024-08-29T12:04:00Z">
         <w:r>
           <w:t xml:space="preserve"> prevalence of</w:t>
         </w:r>
       </w:ins>
-      <w:ins w:id="310" w:author="Irit Hochberg" w:date="2024-08-29T12:03:00Z">
+      <w:ins w:id="339" w:author="Irit Hochberg" w:date="2024-08-29T12:03:00Z">
         <w:r>
           <w:t xml:space="preserve"> these </w:t>
         </w:r>
@@ -4244,17 +4422,17 @@
       <w:r>
         <w:t xml:space="preserve">chronic diseases </w:t>
       </w:r>
-      <w:ins w:id="311" w:author="Irit Hochberg" w:date="2024-08-29T12:04:00Z">
+      <w:ins w:id="340" w:author="Irit Hochberg" w:date="2024-08-29T12:04:00Z">
         <w:r>
           <w:t xml:space="preserve">in </w:t>
         </w:r>
       </w:ins>
-      <w:ins w:id="312" w:author="Irit Hochberg" w:date="2024-08-29T12:20:00Z">
+      <w:ins w:id="341" w:author="Irit Hochberg" w:date="2024-08-29T12:20:00Z">
         <w:r>
           <w:t xml:space="preserve">individuals in </w:t>
         </w:r>
       </w:ins>
-      <w:ins w:id="313" w:author="Irit Hochberg" w:date="2024-08-29T12:04:00Z">
+      <w:ins w:id="342" w:author="Irit Hochberg" w:date="2024-08-29T12:04:00Z">
         <w:r>
           <w:t xml:space="preserve">our cohort </w:t>
         </w:r>
@@ -4262,17 +4440,17 @@
       <w:r>
         <w:t>using the same approach.</w:t>
       </w:r>
-      <w:ins w:id="314" w:author="Dave Bridges" w:date="2024-08-28T17:48:00Z">
+      <w:ins w:id="343" w:author="Dave Bridges" w:date="2024-08-28T17:48:00Z">
         <w:r>
           <w:t xml:space="preserve"> To define whether these associations are restricted to Type 2 Diab</w:t>
         </w:r>
       </w:ins>
-      <w:ins w:id="315" w:author="Dave Bridges" w:date="2024-09-16T12:49:00Z" w16du:dateUtc="2024-09-16T16:49:00Z">
+      <w:ins w:id="344" w:author="Dave Bridges" w:date="2024-09-16T12:49:00Z" w16du:dateUtc="2024-09-16T16:49:00Z">
         <w:r>
           <w:t>e</w:t>
         </w:r>
       </w:ins>
-      <w:ins w:id="316" w:author="Dave Bridges" w:date="2024-08-28T17:48:00Z">
+      <w:ins w:id="345" w:author="Dave Bridges" w:date="2024-08-28T17:48:00Z">
         <w:r>
           <w:t>tes, or more generally with other obesity-related chronic diseases</w:t>
         </w:r>
@@ -4280,33 +4458,33 @@
       <w:r>
         <w:t xml:space="preserve">  </w:t>
       </w:r>
-      <w:commentRangeEnd w:id="292"/>
+      <w:commentRangeEnd w:id="321"/>
       <w:r>
         <w:rPr>
           <w:rStyle w:val="CommentReference"/>
           <w:sz w:val="24"/>
           <w:szCs w:val="24"/>
         </w:rPr>
-        <w:commentReference w:id="292"/>
+        <w:commentReference w:id="321"/>
       </w:r>
       <w:r>
         <w:t xml:space="preserve">In </w:t>
       </w:r>
-      <w:commentRangeStart w:id="317"/>
+      <w:commentRangeStart w:id="346"/>
       <w:r>
         <w:t xml:space="preserve">Table </w:t>
       </w:r>
       <w:r>
         <w:t xml:space="preserve">3 </w:t>
       </w:r>
-      <w:commentRangeEnd w:id="317"/>
+      <w:commentRangeEnd w:id="346"/>
       <w:r>
         <w:rPr>
           <w:rStyle w:val="CommentReference"/>
           <w:sz w:val="24"/>
           <w:szCs w:val="24"/>
         </w:rPr>
-        <w:commentReference w:id="317"/>
+        <w:commentReference w:id="346"/>
       </w:r>
       <w:r>
         <w:t>we describe the raw and adjusted associations between obesity and stress on arrhythmia</w:t>
@@ -4422,7 +4600,11 @@
         <w:t xml:space="preserve"> </w:t>
       </w:r>
       <w:r>
-        <w:t>of obesity when coupled with psychosocial stress</w:t>
+        <w:t xml:space="preserve">of </w:t>
+      </w:r>
+      <w:r>
+        <w:lastRenderedPageBreak/>
+        <w:t>obesity when coupled with psychosocial stress</w:t>
       </w:r>
       <w:r>
         <w:t xml:space="preserve"> is not </w:t>
@@ -4449,7 +4631,6 @@
         <w:pStyle w:val="Heading1"/>
       </w:pPr>
       <w:r>
-        <w:lastRenderedPageBreak/>
         <w:t>Discussion</w:t>
       </w:r>
     </w:p>
@@ -4537,7 +4718,7 @@
       <w:r>
         <w:t xml:space="preserve">= 0.0026), consistent with higher rates of weight discrimination in </w:t>
       </w:r>
-      <w:commentRangeStart w:id="318"/>
+      <w:commentRangeStart w:id="347"/>
       <w:r>
         <w:t xml:space="preserve">women </w:t>
       </w:r>
@@ -4562,14 +4743,14 @@
       <w:r>
         <w:t>.</w:t>
       </w:r>
-      <w:commentRangeEnd w:id="318"/>
+      <w:commentRangeEnd w:id="347"/>
       <w:r>
         <w:rPr>
           <w:rStyle w:val="CommentReference"/>
           <w:sz w:val="24"/>
           <w:szCs w:val="24"/>
         </w:rPr>
-        <w:commentReference w:id="318"/>
+        <w:commentReference w:id="347"/>
       </w:r>
       <w:r>
         <w:t xml:space="preserve">  Interestingly though, when treated separately males had a stronger obesity-stress </w:t>
@@ -4703,13 +4884,16 @@
         <w:t>terms of generalizability, the population in this study is a majority white, relatively affluent group of participants who have a relatively high age and number of co-morbidities, as is expected for a hospital-based cohort.</w:t>
       </w:r>
       <w:r>
-        <w:t xml:space="preserve">  Finally, we are limited by a single self-reported measure of perceived stress and the cross-sectional nature of this study.</w:t>
+        <w:t xml:space="preserve">  Finally, we </w:t>
+      </w:r>
+      <w:r>
+        <w:lastRenderedPageBreak/>
+        <w:t>are limited by a single self-reported measure of perceived stress and the cross-sectional nature of this study.</w:t>
       </w:r>
     </w:p>
     <w:p/>
     <w:p>
       <w:r>
-        <w:lastRenderedPageBreak/>
         <w:t xml:space="preserve">There are several important strengths to this work including a large sample size, consistent and validated measures of perceived stress and well documented disease and sociodemographic factors.  To our knowledge this is the first report </w:t>
       </w:r>
       <w:r>
@@ -4848,7 +5032,7 @@
       <w:r>
         <w:t xml:space="preserve">, and </w:t>
       </w:r>
-      <w:ins w:id="319" w:author="Dave Bridges" w:date="2025-07-28T19:45:00Z" w16du:dateUtc="2025-07-28T23:45:00Z">
+      <w:ins w:id="348" w:author="Dave Bridges" w:date="2025-07-28T19:45:00Z" w16du:dateUtc="2025-07-28T23:45:00Z">
         <w:r>
           <w:t xml:space="preserve">Dr. </w:t>
         </w:r>
@@ -4856,17 +5040,17 @@
       <w:r>
         <w:t xml:space="preserve">Matthew Zawistowski (University of Michigan) for help </w:t>
       </w:r>
-      <w:del w:id="320" w:author="Dave Bridges" w:date="2024-09-16T12:57:00Z" w16du:dateUtc="2024-09-16T16:57:00Z">
+      <w:del w:id="349" w:author="Dave Bridges" w:date="2024-09-16T12:57:00Z" w16du:dateUtc="2024-09-16T16:57:00Z">
         <w:r>
           <w:delText>with defining ICD based disease status</w:delText>
         </w:r>
       </w:del>
-      <w:ins w:id="321" w:author="Dave Bridges" w:date="2024-09-16T12:57:00Z" w16du:dateUtc="2024-09-16T16:57:00Z">
+      <w:ins w:id="350" w:author="Dave Bridges" w:date="2024-09-16T12:57:00Z" w16du:dateUtc="2024-09-16T16:57:00Z">
         <w:r>
           <w:t>with ICD</w:t>
         </w:r>
       </w:ins>
-      <w:ins w:id="322" w:author="Dave Bridges" w:date="2024-09-16T12:58:00Z" w16du:dateUtc="2024-09-16T16:58:00Z">
+      <w:ins w:id="351" w:author="Dave Bridges" w:date="2024-09-16T12:58:00Z" w16du:dateUtc="2024-09-16T16:58:00Z">
         <w:r>
           <w:t xml:space="preserve"> codes and data access</w:t>
         </w:r>
@@ -4895,38 +5079,38 @@
       <w:r>
         <w:t xml:space="preserve">DK107535 to </w:t>
       </w:r>
-      <w:commentRangeStart w:id="323"/>
-      <w:commentRangeStart w:id="324"/>
-      <w:commentRangeStart w:id="325"/>
+      <w:commentRangeStart w:id="352"/>
+      <w:commentRangeStart w:id="353"/>
+      <w:commentRangeStart w:id="354"/>
       <w:r>
         <w:t>DB</w:t>
       </w:r>
-      <w:commentRangeEnd w:id="323"/>
+      <w:commentRangeEnd w:id="352"/>
       <w:r>
         <w:rPr>
           <w:rStyle w:val="CommentReference"/>
           <w:sz w:val="24"/>
           <w:szCs w:val="24"/>
         </w:rPr>
-        <w:commentReference w:id="323"/>
-      </w:r>
-      <w:commentRangeEnd w:id="324"/>
+        <w:commentReference w:id="352"/>
+      </w:r>
+      <w:commentRangeEnd w:id="353"/>
       <w:r>
         <w:rPr>
           <w:rStyle w:val="CommentReference"/>
           <w:sz w:val="24"/>
           <w:szCs w:val="24"/>
         </w:rPr>
-        <w:commentReference w:id="324"/>
-      </w:r>
-      <w:commentRangeEnd w:id="325"/>
+        <w:commentReference w:id="353"/>
+      </w:r>
+      <w:commentRangeEnd w:id="354"/>
       <w:r>
         <w:rPr>
           <w:rStyle w:val="CommentReference"/>
           <w:sz w:val="24"/>
           <w:szCs w:val="24"/>
         </w:rPr>
-        <w:commentReference w:id="325"/>
+        <w:commentReference w:id="354"/>
       </w:r>
       <w:r>
         <w:t>)</w:t>
@@ -6039,7 +6223,7 @@
 
 <file path=word/comments.xml><?xml version="1.0" encoding="utf-8"?>
 <w:comments xmlns:wpc="http://schemas.microsoft.com/office/word/2010/wordprocessingCanvas" xmlns:cx="http://schemas.microsoft.com/office/drawing/2014/chartex" xmlns:cx1="http://schemas.microsoft.com/office/drawing/2015/9/8/chartex" xmlns:cx2="http://schemas.microsoft.com/office/drawing/2015/10/21/chartex" xmlns:cx3="http://schemas.microsoft.com/office/drawing/2016/5/9/chartex" xmlns:cx4="http://schemas.microsoft.com/office/drawing/2016/5/10/chartex" xmlns:cx5="http://schemas.microsoft.com/office/drawing/2016/5/11/chartex" xmlns:cx6="http://schemas.microsoft.com/office/drawing/2016/5/12/chartex" xmlns:cx7="http://schemas.microsoft.com/office/drawing/2016/5/13/chartex" xmlns:cx8="http://schemas.microsoft.com/office/drawing/2016/5/14/chartex" xmlns:mc="http://schemas.openxmlformats.org/markup-compatibility/2006" xmlns:aink="http://schemas.microsoft.com/office/drawing/2016/ink" xmlns:am3d="http://schemas.microsoft.com/office/drawing/2017/model3d" xmlns:o="urn:schemas-microsoft-com:office:office" xmlns:oel="http://schemas.microsoft.com/office/2019/extlst" xmlns:r="http://schemas.openxmlformats.org/officeDocument/2006/relationships" xmlns:m="http://schemas.openxmlformats.org/officeDocument/2006/math" xmlns:v="urn:schemas-microsoft-com:vml" xmlns:wp14="http://schemas.microsoft.com/office/word/2010/wordprocessingDrawing" xmlns:wp="http://schemas.openxmlformats.org/drawingml/2006/wordprocessingDrawing" xmlns:w10="urn:schemas-microsoft-com:office:word" xmlns:w="http://schemas.openxmlformats.org/wordprocessingml/2006/main" xmlns:w14="http://schemas.microsoft.com/office/word/2010/wordml" xmlns:w15="http://schemas.microsoft.com/office/word/2012/wordml" xmlns:w16cex="http://schemas.microsoft.com/office/word/2018/wordml/cex" xmlns:w16cid="http://schemas.microsoft.com/office/word/2016/wordml/cid" xmlns:w16="http://schemas.microsoft.com/office/word/2018/wordml" xmlns:w16du="http://schemas.microsoft.com/office/word/2023/wordml/word16du" xmlns:w16sdtdh="http://schemas.microsoft.com/office/word/2020/wordml/sdtdatahash" xmlns:w16sdtfl="http://schemas.microsoft.com/office/word/2024/wordml/sdtformatlock" xmlns:w16se="http://schemas.microsoft.com/office/word/2015/wordml/symex" xmlns:wpg="http://schemas.microsoft.com/office/word/2010/wordprocessingGroup" xmlns:wpi="http://schemas.microsoft.com/office/word/2010/wordprocessingInk" xmlns:wne="http://schemas.microsoft.com/office/word/2006/wordml" xmlns:wps="http://schemas.microsoft.com/office/word/2010/wordprocessingShape" mc:Ignorable="w14 w15 w16se w16cid w16 w16cex w16sdtdh w16sdtfl w16du wp14">
-  <w:comment w:id="8" w:author="Irit Hochberg" w:date="2024-08-29T08:45:00Z" w:initials="IH">
+  <w:comment w:id="9" w:author="Irit Hochberg" w:date="2024-08-29T08:45:00Z" w:initials="IH">
     <w:p>
       <w:pPr>
         <w:pStyle w:val="CommentText"/>
@@ -6058,7 +6242,7 @@
       </w:r>
     </w:p>
   </w:comment>
-  <w:comment w:id="9" w:author="Bauer, Kate" w:date="2024-08-28T09:33:00Z" w:initials="KB">
+  <w:comment w:id="10" w:author="Bauer, Kate" w:date="2024-08-28T09:33:00Z" w:initials="KB">
     <w:p>
       <w:pPr>
         <w:pStyle w:val="CommentText"/>
@@ -6074,7 +6258,7 @@
       </w:r>
     </w:p>
   </w:comment>
-  <w:comment w:id="10" w:author="Bauer, Kate" w:date="2024-08-28T15:39:00Z" w:initials="BK">
+  <w:comment w:id="11" w:author="Bauer, Kate" w:date="2024-08-28T15:39:00Z" w:initials="BK">
     <w:p>
       <w:pPr>
         <w:pStyle w:val="CommentText"/>
@@ -6090,7 +6274,7 @@
       </w:r>
     </w:p>
   </w:comment>
-  <w:comment w:id="18" w:author="Bauer, Kate" w:date="2024-08-28T09:34:00Z" w:initials="KB">
+  <w:comment w:id="19" w:author="Bauer, Kate" w:date="2024-08-28T09:34:00Z" w:initials="KB">
     <w:p>
       <w:pPr>
         <w:pStyle w:val="CommentText"/>
@@ -6106,7 +6290,7 @@
       </w:r>
     </w:p>
   </w:comment>
-  <w:comment w:id="19" w:author="Bauer, Kate" w:date="2024-08-28T09:35:00Z" w:initials="KB">
+  <w:comment w:id="20" w:author="Bauer, Kate" w:date="2024-08-28T09:35:00Z" w:initials="KB">
     <w:p>
       <w:pPr>
         <w:pStyle w:val="CommentText"/>
@@ -6122,7 +6306,7 @@
       </w:r>
     </w:p>
   </w:comment>
-  <w:comment w:id="20" w:author="Dave Bridges" w:date="2024-08-28T17:05:00Z" w:initials="DB">
+  <w:comment w:id="21" w:author="Dave Bridges" w:date="2024-08-28T17:05:00Z" w:initials="DB">
     <w:p>
       <w:pPr>
         <w:pStyle w:val="CommentText"/>
@@ -6135,22 +6319,6 @@
       </w:r>
       <w:r>
         <w:t>Will add, need to calculate.</w:t>
-      </w:r>
-    </w:p>
-  </w:comment>
-  <w:comment w:id="22" w:author="Bauer, Kate" w:date="2024-08-28T09:36:00Z" w:initials="KB">
-    <w:p>
-      <w:pPr>
-        <w:pStyle w:val="CommentText"/>
-      </w:pPr>
-      <w:r>
-        <w:rPr>
-          <w:rStyle w:val="CommentReference"/>
-        </w:rPr>
-        <w:annotationRef/>
-      </w:r>
-      <w:r>
-        <w:t xml:space="preserve">Such as what? All diabetes related? </w:t>
       </w:r>
     </w:p>
   </w:comment>
@@ -6166,11 +6334,27 @@
         <w:annotationRef/>
       </w:r>
       <w:r>
+        <w:t xml:space="preserve">Such as what? All diabetes related? </w:t>
+      </w:r>
+    </w:p>
+  </w:comment>
+  <w:comment w:id="24" w:author="Bauer, Kate" w:date="2024-08-28T09:36:00Z" w:initials="KB">
+    <w:p>
+      <w:pPr>
+        <w:pStyle w:val="CommentText"/>
+      </w:pPr>
+      <w:r>
+        <w:rPr>
+          <w:rStyle w:val="CommentReference"/>
+        </w:rPr>
+        <w:annotationRef/>
+      </w:r>
+      <w:r>
         <w:t xml:space="preserve">You didn’t state a hypothesis earlier. </w:t>
       </w:r>
     </w:p>
   </w:comment>
-  <w:comment w:id="24" w:author="Bauer, Kate" w:date="2024-08-28T09:50:00Z" w:initials="KB">
+  <w:comment w:id="25" w:author="Bauer, Kate" w:date="2024-08-28T09:50:00Z" w:initials="KB">
     <w:p>
       <w:pPr>
         <w:pStyle w:val="CommentText"/>
@@ -6186,7 +6370,7 @@
       </w:r>
     </w:p>
   </w:comment>
-  <w:comment w:id="25" w:author="Bauer, Kate" w:date="2024-08-28T09:39:00Z" w:initials="KB">
+  <w:comment w:id="26" w:author="Bauer, Kate" w:date="2024-08-28T09:39:00Z" w:initials="KB">
     <w:p>
       <w:pPr>
         <w:pStyle w:val="CommentText"/>
@@ -6202,7 +6386,7 @@
       </w:r>
     </w:p>
   </w:comment>
-  <w:comment w:id="26" w:author="Dave Bridges" w:date="2024-08-28T17:10:00Z" w:initials="DB">
+  <w:comment w:id="27" w:author="Dave Bridges" w:date="2024-08-28T17:10:00Z" w:initials="DB">
     <w:p>
       <w:pPr>
         <w:pStyle w:val="CommentText"/>
@@ -6218,7 +6402,7 @@
       </w:r>
     </w:p>
   </w:comment>
-  <w:comment w:id="27" w:author="Bauer, Kate" w:date="2024-08-28T09:37:00Z" w:initials="KB">
+  <w:comment w:id="28" w:author="Bauer, Kate" w:date="2024-08-28T09:37:00Z" w:initials="KB">
     <w:p>
       <w:pPr>
         <w:pStyle w:val="CommentText"/>
@@ -6237,7 +6421,7 @@
       </w:r>
     </w:p>
   </w:comment>
-  <w:comment w:id="40" w:author="Bauer, Kate" w:date="2024-08-28T09:43:00Z" w:initials="KB">
+  <w:comment w:id="41" w:author="Bauer, Kate" w:date="2024-08-28T09:43:00Z" w:initials="KB">
     <w:p>
       <w:pPr>
         <w:pStyle w:val="CommentText"/>
@@ -6253,7 +6437,7 @@
       </w:r>
     </w:p>
   </w:comment>
-  <w:comment w:id="42" w:author="Bauer, Kate" w:date="2024-08-28T09:40:00Z" w:initials="KB">
+  <w:comment w:id="43" w:author="Bauer, Kate" w:date="2024-08-28T09:40:00Z" w:initials="KB">
     <w:p>
       <w:pPr>
         <w:pStyle w:val="CommentText"/>
@@ -6269,7 +6453,7 @@
       </w:r>
     </w:p>
   </w:comment>
-  <w:comment w:id="49" w:author="Bauer, Kate" w:date="2024-08-28T09:45:00Z" w:initials="KB">
+  <w:comment w:id="50" w:author="Bauer, Kate" w:date="2024-08-28T09:45:00Z" w:initials="KB">
     <w:p>
       <w:pPr>
         <w:pStyle w:val="CommentText"/>
@@ -6285,7 +6469,7 @@
       </w:r>
     </w:p>
   </w:comment>
-  <w:comment w:id="43" w:author="Bauer, Kate" w:date="2024-08-28T09:44:00Z" w:initials="KB">
+  <w:comment w:id="44" w:author="Bauer, Kate" w:date="2024-08-28T09:44:00Z" w:initials="KB">
     <w:p>
       <w:pPr>
         <w:pStyle w:val="CommentText"/>
@@ -6301,7 +6485,7 @@
       </w:r>
     </w:p>
   </w:comment>
-  <w:comment w:id="44" w:author="Dave Bridges" w:date="2024-08-28T17:16:00Z" w:initials="DB">
+  <w:comment w:id="45" w:author="Dave Bridges" w:date="2024-08-28T17:16:00Z" w:initials="DB">
     <w:p>
       <w:pPr>
         <w:pStyle w:val="CommentText"/>
@@ -6317,7 +6501,7 @@
       </w:r>
     </w:p>
   </w:comment>
-  <w:comment w:id="57" w:author="Bauer, Kate" w:date="2024-08-28T09:40:00Z" w:initials="KB">
+  <w:comment w:id="58" w:author="Bauer, Kate" w:date="2024-08-28T09:40:00Z" w:initials="KB">
     <w:p>
       <w:pPr>
         <w:pStyle w:val="CommentText"/>
@@ -6333,7 +6517,7 @@
       </w:r>
     </w:p>
   </w:comment>
-  <w:comment w:id="60" w:author="Bauer, Kate" w:date="2024-08-28T09:43:00Z" w:initials="KB">
+  <w:comment w:id="61" w:author="Bauer, Kate" w:date="2024-08-28T09:43:00Z" w:initials="KB">
     <w:p>
       <w:pPr>
         <w:pStyle w:val="CommentText"/>
@@ -6349,7 +6533,7 @@
       </w:r>
     </w:p>
   </w:comment>
-  <w:comment w:id="113" w:author="Bauer, Kate" w:date="2024-08-28T09:46:00Z" w:initials="KB">
+  <w:comment w:id="114" w:author="Bauer, Kate" w:date="2024-08-28T09:46:00Z" w:initials="KB">
     <w:p>
       <w:pPr>
         <w:pStyle w:val="CommentText"/>
@@ -6365,7 +6549,7 @@
       </w:r>
     </w:p>
   </w:comment>
-  <w:comment w:id="114" w:author="Dave Bridges" w:date="2024-08-28T17:18:00Z" w:initials="DB">
+  <w:comment w:id="115" w:author="Dave Bridges" w:date="2024-08-28T17:18:00Z" w:initials="DB">
     <w:p>
       <w:pPr>
         <w:pStyle w:val="CommentText"/>
@@ -6381,7 +6565,7 @@
       </w:r>
     </w:p>
   </w:comment>
-  <w:comment w:id="135" w:author="Bauer, Kate" w:date="2024-08-28T09:53:00Z" w:initials="KB">
+  <w:comment w:id="136" w:author="Bauer, Kate" w:date="2024-08-28T09:53:00Z" w:initials="KB">
     <w:p>
       <w:pPr>
         <w:pStyle w:val="CommentText"/>
@@ -6397,7 +6581,7 @@
       </w:r>
     </w:p>
   </w:comment>
-  <w:comment w:id="136" w:author="Bauer, Kate" w:date="2024-08-28T09:54:00Z" w:initials="KB">
+  <w:comment w:id="137" w:author="Bauer, Kate" w:date="2024-08-28T09:54:00Z" w:initials="KB">
     <w:p>
       <w:pPr>
         <w:pStyle w:val="CommentText"/>
@@ -6413,7 +6597,7 @@
       </w:r>
     </w:p>
   </w:comment>
-  <w:comment w:id="145" w:author="Bauer, Kate" w:date="2024-08-28T09:56:00Z" w:initials="KB">
+  <w:comment w:id="146" w:author="Bauer, Kate" w:date="2024-08-28T09:56:00Z" w:initials="KB">
     <w:p>
       <w:pPr>
         <w:pStyle w:val="CommentText"/>
@@ -6429,7 +6613,7 @@
       </w:r>
     </w:p>
   </w:comment>
-  <w:comment w:id="146" w:author="Dave Bridges" w:date="2025-07-28T19:03:00Z" w:initials="DB">
+  <w:comment w:id="147" w:author="Dave Bridges" w:date="2025-07-28T19:03:00Z" w:initials="DB">
     <w:p>
       <w:r>
         <w:rPr>
@@ -6456,7 +6640,7 @@
       </w:r>
     </w:p>
   </w:comment>
-  <w:comment w:id="148" w:author="Bauer, Kate" w:date="2024-08-28T09:55:00Z" w:initials="KB">
+  <w:comment w:id="149" w:author="Bauer, Kate" w:date="2024-08-28T09:55:00Z" w:initials="KB">
     <w:p>
       <w:pPr>
         <w:pStyle w:val="CommentText"/>
@@ -6472,7 +6656,7 @@
       </w:r>
     </w:p>
   </w:comment>
-  <w:comment w:id="153" w:author="Bauer, Kate" w:date="2024-08-28T09:57:00Z" w:initials="KB">
+  <w:comment w:id="154" w:author="Bauer, Kate" w:date="2024-08-28T09:57:00Z" w:initials="KB">
     <w:p>
       <w:pPr>
         <w:pStyle w:val="CommentText"/>
@@ -6488,7 +6672,7 @@
       </w:r>
     </w:p>
   </w:comment>
-  <w:comment w:id="154" w:author="Dave Bridges" w:date="2025-07-28T15:38:00Z" w:initials="DB">
+  <w:comment w:id="155" w:author="Dave Bridges" w:date="2025-07-28T15:38:00Z" w:initials="DB">
     <w:p>
       <w:r>
         <w:rPr>
@@ -6520,7 +6704,7 @@
     <w:p/>
     <w:p/>
   </w:comment>
-  <w:comment w:id="167" w:author="Bauer, Kate" w:date="2024-08-28T09:57:00Z" w:initials="KB">
+  <w:comment w:id="168" w:author="Bauer, Kate" w:date="2024-08-28T09:57:00Z" w:initials="KB">
     <w:p>
       <w:pPr>
         <w:pStyle w:val="CommentText"/>
@@ -6536,7 +6720,7 @@
       </w:r>
     </w:p>
   </w:comment>
-  <w:comment w:id="168" w:author="Dave Bridges" w:date="2025-07-28T19:24:00Z" w:initials="DB">
+  <w:comment w:id="169" w:author="Dave Bridges" w:date="2025-07-28T19:24:00Z" w:initials="DB">
     <w:p>
       <w:r>
         <w:rPr>
@@ -6553,7 +6737,7 @@
       </w:r>
     </w:p>
   </w:comment>
-  <w:comment w:id="171" w:author="Bauer, Kate" w:date="2024-08-28T12:04:00Z" w:initials="KB">
+  <w:comment w:id="172" w:author="Bauer, Kate" w:date="2024-08-28T12:04:00Z" w:initials="KB">
     <w:p>
       <w:pPr>
         <w:pStyle w:val="CommentText"/>
@@ -6572,7 +6756,7 @@
       </w:r>
     </w:p>
   </w:comment>
-  <w:comment w:id="173" w:author="Bauer, Kate" w:date="2024-08-28T14:43:00Z" w:initials="KB">
+  <w:comment w:id="174" w:author="Bauer, Kate" w:date="2024-08-28T14:43:00Z" w:initials="KB">
     <w:p>
       <w:pPr>
         <w:pStyle w:val="CommentText"/>
@@ -6588,7 +6772,7 @@
       </w:r>
     </w:p>
   </w:comment>
-  <w:comment w:id="174" w:author="Bauer, Kate" w:date="2024-08-28T12:03:00Z" w:initials="KB">
+  <w:comment w:id="175" w:author="Bauer, Kate" w:date="2024-08-28T12:03:00Z" w:initials="KB">
     <w:p>
       <w:pPr>
         <w:pStyle w:val="CommentText"/>
@@ -6604,7 +6788,7 @@
       </w:r>
     </w:p>
   </w:comment>
-  <w:comment w:id="175" w:author="Bauer, Kate" w:date="2024-08-28T10:49:00Z" w:initials="KB">
+  <w:comment w:id="176" w:author="Bauer, Kate" w:date="2024-08-28T10:49:00Z" w:initials="KB">
     <w:p>
       <w:pPr>
         <w:pStyle w:val="CommentText"/>
@@ -6620,7 +6804,7 @@
       </w:r>
     </w:p>
   </w:comment>
-  <w:comment w:id="176" w:author="Bauer, Kate" w:date="2024-08-28T10:50:00Z" w:initials="KB">
+  <w:comment w:id="177" w:author="Bauer, Kate" w:date="2024-08-28T10:50:00Z" w:initials="KB">
     <w:p>
       <w:pPr>
         <w:pStyle w:val="CommentText"/>
@@ -6636,7 +6820,7 @@
       </w:r>
     </w:p>
   </w:comment>
-  <w:comment w:id="179" w:author="Bauer, Kate" w:date="2024-08-28T10:50:00Z" w:initials="KB">
+  <w:comment w:id="180" w:author="Bauer, Kate" w:date="2024-08-28T10:50:00Z" w:initials="KB">
     <w:p>
       <w:pPr>
         <w:pStyle w:val="CommentText"/>
@@ -6652,7 +6836,7 @@
       </w:r>
     </w:p>
   </w:comment>
-  <w:comment w:id="180" w:author="Dave Bridges" w:date="2024-09-16T11:22:00Z" w:initials="DB">
+  <w:comment w:id="181" w:author="Dave Bridges" w:date="2024-09-16T11:22:00Z" w:initials="DB">
     <w:p>
       <w:r>
         <w:rPr>
@@ -6670,7 +6854,7 @@
       </w:r>
     </w:p>
   </w:comment>
-  <w:comment w:id="185" w:author="Bauer, Kate" w:date="2024-08-28T10:53:00Z" w:initials="KB">
+  <w:comment w:id="186" w:author="Bauer, Kate" w:date="2024-08-28T10:53:00Z" w:initials="KB">
     <w:p>
       <w:pPr>
         <w:pStyle w:val="CommentText"/>
@@ -6686,7 +6870,7 @@
       </w:r>
     </w:p>
   </w:comment>
-  <w:comment w:id="186" w:author="Dave Bridges" w:date="2025-07-28T19:26:00Z" w:initials="DB">
+  <w:comment w:id="187" w:author="Dave Bridges" w:date="2025-07-28T19:26:00Z" w:initials="DB">
     <w:p>
       <w:r>
         <w:rPr>
@@ -6703,7 +6887,7 @@
       </w:r>
     </w:p>
   </w:comment>
-  <w:comment w:id="192" w:author="Dave Bridges" w:date="2024-01-04T11:30:00Z" w:initials="DB">
+  <w:comment w:id="193" w:author="Dave Bridges" w:date="2024-01-04T11:30:00Z" w:initials="DB">
     <w:p>
       <w:pPr>
         <w:pStyle w:val="CommentText"/>
@@ -6719,7 +6903,7 @@
       </w:r>
     </w:p>
   </w:comment>
-  <w:comment w:id="193" w:author="Bauer, Kate" w:date="2024-08-28T10:51:00Z" w:initials="KB">
+  <w:comment w:id="194" w:author="Bauer, Kate" w:date="2024-08-28T10:51:00Z" w:initials="KB">
     <w:p>
       <w:pPr>
         <w:pStyle w:val="CommentText"/>
@@ -6735,7 +6919,7 @@
       </w:r>
     </w:p>
   </w:comment>
-  <w:comment w:id="194" w:author="Bauer, Kate" w:date="2024-08-28T10:52:00Z" w:initials="KB">
+  <w:comment w:id="195" w:author="Bauer, Kate" w:date="2024-08-28T10:52:00Z" w:initials="KB">
     <w:p>
       <w:pPr>
         <w:pStyle w:val="CommentText"/>
@@ -6751,7 +6935,7 @@
       </w:r>
     </w:p>
   </w:comment>
-  <w:comment w:id="195" w:author="Dave Bridges" w:date="2025-07-28T19:27:00Z" w:initials="DB">
+  <w:comment w:id="196" w:author="Dave Bridges" w:date="2025-07-28T19:27:00Z" w:initials="DB">
     <w:p>
       <w:r>
         <w:rPr>
@@ -6768,7 +6952,7 @@
       </w:r>
     </w:p>
   </w:comment>
-  <w:comment w:id="197" w:author="Bauer, Kate" w:date="2024-08-28T10:52:00Z" w:initials="KB">
+  <w:comment w:id="198" w:author="Bauer, Kate" w:date="2024-08-28T10:52:00Z" w:initials="KB">
     <w:p>
       <w:pPr>
         <w:pStyle w:val="CommentText"/>
@@ -6784,7 +6968,7 @@
       </w:r>
     </w:p>
   </w:comment>
-  <w:comment w:id="201" w:author="Bauer, Kate" w:date="2024-08-28T12:00:00Z" w:initials="KB">
+  <w:comment w:id="202" w:author="Bauer, Kate" w:date="2024-08-28T12:00:00Z" w:initials="KB">
     <w:p>
       <w:pPr>
         <w:pStyle w:val="CommentText"/>
@@ -6800,7 +6984,7 @@
       </w:r>
     </w:p>
   </w:comment>
-  <w:comment w:id="202" w:author="Dave Bridges" w:date="2024-09-16T12:57:00Z" w:initials="DB">
+  <w:comment w:id="203" w:author="Dave Bridges" w:date="2024-09-16T12:57:00Z" w:initials="DB">
     <w:p>
       <w:r>
         <w:rPr>
@@ -6818,7 +7002,7 @@
       </w:r>
     </w:p>
   </w:comment>
-  <w:comment w:id="210" w:author="Bauer, Kate" w:date="2024-08-28T12:02:00Z" w:initials="KB">
+  <w:comment w:id="211" w:author="Bauer, Kate" w:date="2024-08-28T12:02:00Z" w:initials="KB">
     <w:p>
       <w:pPr>
         <w:pStyle w:val="CommentText"/>
@@ -6834,7 +7018,7 @@
       </w:r>
     </w:p>
   </w:comment>
-  <w:comment w:id="215" w:author="Bauer, Kate" w:date="2024-08-28T12:01:00Z" w:initials="KB">
+  <w:comment w:id="216" w:author="Bauer, Kate" w:date="2024-08-28T12:01:00Z" w:initials="KB">
     <w:p>
       <w:pPr>
         <w:pStyle w:val="CommentText"/>
@@ -6850,7 +7034,7 @@
       </w:r>
     </w:p>
   </w:comment>
-  <w:comment w:id="221" w:author="Bauer, Kate" w:date="2024-08-28T12:02:00Z" w:initials="KB">
+  <w:comment w:id="222" w:author="Bauer, Kate" w:date="2024-08-28T12:02:00Z" w:initials="KB">
     <w:p>
       <w:pPr>
         <w:pStyle w:val="CommentText"/>
@@ -6866,7 +7050,7 @@
       </w:r>
     </w:p>
   </w:comment>
-  <w:comment w:id="222" w:author="Dave Bridges" w:date="2025-07-28T19:28:00Z" w:initials="DB">
+  <w:comment w:id="223" w:author="Dave Bridges" w:date="2025-07-28T19:28:00Z" w:initials="DB">
     <w:p>
       <w:r>
         <w:rPr>
@@ -6883,7 +7067,7 @@
       </w:r>
     </w:p>
   </w:comment>
-  <w:comment w:id="225" w:author="Bauer, Kate" w:date="2024-08-28T14:40:00Z" w:initials="KB">
+  <w:comment w:id="226" w:author="Bauer, Kate" w:date="2024-08-28T14:40:00Z" w:initials="KB">
     <w:p>
       <w:pPr>
         <w:pStyle w:val="CommentText"/>
@@ -6904,7 +7088,7 @@
       </w:pPr>
     </w:p>
   </w:comment>
-  <w:comment w:id="226" w:author="Dave Bridges" w:date="2024-08-28T17:33:00Z" w:initials="DB">
+  <w:comment w:id="227" w:author="Dave Bridges" w:date="2024-08-28T17:33:00Z" w:initials="DB">
     <w:p>
       <w:pPr>
         <w:pStyle w:val="CommentText"/>
@@ -6920,7 +7104,7 @@
       </w:r>
     </w:p>
   </w:comment>
-  <w:comment w:id="227" w:author="Bauer, Kate" w:date="2024-08-28T14:41:00Z" w:initials="KB">
+  <w:comment w:id="228" w:author="Bauer, Kate" w:date="2024-08-28T14:41:00Z" w:initials="KB">
     <w:p>
       <w:pPr>
         <w:pStyle w:val="CommentText"/>
@@ -6936,7 +7120,7 @@
       </w:r>
     </w:p>
   </w:comment>
-  <w:comment w:id="228" w:author="Dave Bridges" w:date="2025-07-28T19:30:00Z" w:initials="DB">
+  <w:comment w:id="229" w:author="Dave Bridges" w:date="2025-07-28T19:30:00Z" w:initials="DB">
     <w:p>
       <w:r>
         <w:rPr>
@@ -6953,7 +7137,7 @@
       </w:r>
     </w:p>
   </w:comment>
-  <w:comment w:id="231" w:author="Bauer, Kate" w:date="2024-08-28T14:41:00Z" w:initials="KB">
+  <w:comment w:id="232" w:author="Bauer, Kate" w:date="2024-08-28T14:41:00Z" w:initials="KB">
     <w:p>
       <w:pPr>
         <w:pStyle w:val="CommentText"/>
@@ -6969,7 +7153,7 @@
       </w:r>
     </w:p>
   </w:comment>
-  <w:comment w:id="232" w:author="Dave Bridges" w:date="2025-07-28T19:31:00Z" w:initials="DB">
+  <w:comment w:id="233" w:author="Dave Bridges" w:date="2025-07-28T19:31:00Z" w:initials="DB">
     <w:p>
       <w:r>
         <w:rPr>
@@ -6986,7 +7170,7 @@
       </w:r>
     </w:p>
   </w:comment>
-  <w:comment w:id="235" w:author="Bauer, Kate" w:date="2024-08-28T14:42:00Z" w:initials="KB">
+  <w:comment w:id="236" w:author="Bauer, Kate" w:date="2024-08-28T14:42:00Z" w:initials="KB">
     <w:p>
       <w:pPr>
         <w:pStyle w:val="CommentText"/>
@@ -7002,7 +7186,7 @@
       </w:r>
     </w:p>
   </w:comment>
-  <w:comment w:id="236" w:author="Dave Bridges" w:date="2025-07-28T19:34:00Z" w:initials="DB">
+  <w:comment w:id="237" w:author="Dave Bridges" w:date="2025-07-28T19:34:00Z" w:initials="DB">
     <w:p>
       <w:r>
         <w:rPr>
@@ -7019,7 +7203,7 @@
       </w:r>
     </w:p>
   </w:comment>
-  <w:comment w:id="237" w:author="Bauer, Kate" w:date="2024-08-28T14:43:00Z" w:initials="KB">
+  <w:comment w:id="238" w:author="Bauer, Kate" w:date="2024-08-28T14:43:00Z" w:initials="KB">
     <w:p>
       <w:pPr>
         <w:pStyle w:val="CommentText"/>
@@ -7035,7 +7219,7 @@
       </w:r>
     </w:p>
   </w:comment>
-  <w:comment w:id="238" w:author="Dave Bridges" w:date="2025-07-28T19:34:00Z" w:initials="DB">
+  <w:comment w:id="239" w:author="Dave Bridges" w:date="2025-07-28T19:34:00Z" w:initials="DB">
     <w:p>
       <w:r>
         <w:rPr>
@@ -7052,7 +7236,7 @@
       </w:r>
     </w:p>
   </w:comment>
-  <w:comment w:id="242" w:author="Bauer, Kate" w:date="2024-08-28T14:43:00Z" w:initials="KB">
+  <w:comment w:id="243" w:author="Bauer, Kate" w:date="2024-08-28T14:43:00Z" w:initials="KB">
     <w:p>
       <w:pPr>
         <w:pStyle w:val="CommentText"/>
@@ -7068,7 +7252,7 @@
       </w:r>
     </w:p>
   </w:comment>
-  <w:comment w:id="243" w:author="Bauer, Kate" w:date="2024-08-28T14:46:00Z" w:initials="KB">
+  <w:comment w:id="244" w:author="Bauer, Kate" w:date="2024-08-28T14:46:00Z" w:initials="KB">
     <w:p>
       <w:pPr>
         <w:pStyle w:val="CommentText"/>
@@ -7084,7 +7268,7 @@
       </w:r>
     </w:p>
   </w:comment>
-  <w:comment w:id="244" w:author="Dave Bridges" w:date="2025-07-28T19:35:00Z" w:initials="DB">
+  <w:comment w:id="245" w:author="Dave Bridges" w:date="2025-07-28T19:35:00Z" w:initials="DB">
     <w:p>
       <w:r>
         <w:rPr>
@@ -7101,7 +7285,7 @@
       </w:r>
     </w:p>
   </w:comment>
-  <w:comment w:id="250" w:author="Bauer, Kate" w:date="2024-08-28T14:48:00Z" w:initials="BK">
+  <w:comment w:id="253" w:author="Bauer, Kate" w:date="2024-08-28T14:48:00Z" w:initials="BK">
     <w:p>
       <w:pPr>
         <w:pStyle w:val="CommentText"/>
@@ -7120,7 +7304,7 @@
       </w:r>
     </w:p>
   </w:comment>
-  <w:comment w:id="251" w:author="Dave Bridges" w:date="2025-07-28T19:39:00Z" w:initials="DB">
+  <w:comment w:id="254" w:author="Dave Bridges" w:date="2025-07-28T19:39:00Z" w:initials="DB">
     <w:p>
       <w:r>
         <w:rPr>
@@ -7137,7 +7321,7 @@
       </w:r>
     </w:p>
   </w:comment>
-  <w:comment w:id="252" w:author="Bauer, Kate" w:date="2024-08-28T14:50:00Z" w:initials="BK">
+  <w:comment w:id="270" w:author="Bauer, Kate" w:date="2024-08-28T14:50:00Z" w:initials="BK">
     <w:p>
       <w:pPr>
         <w:pStyle w:val="CommentText"/>
@@ -7153,7 +7337,7 @@
       </w:r>
     </w:p>
   </w:comment>
-  <w:comment w:id="253" w:author="Dave Bridges" w:date="2025-07-28T19:39:00Z" w:initials="DB">
+  <w:comment w:id="271" w:author="Dave Bridges" w:date="2025-07-28T19:39:00Z" w:initials="DB">
     <w:p>
       <w:r>
         <w:rPr>
@@ -7170,7 +7354,7 @@
       </w:r>
     </w:p>
   </w:comment>
-  <w:comment w:id="254" w:author="Bauer, Kate" w:date="2024-08-28T14:50:00Z" w:initials="BK">
+  <w:comment w:id="273" w:author="Bauer, Kate" w:date="2024-08-28T14:50:00Z" w:initials="BK">
     <w:p>
       <w:pPr>
         <w:pStyle w:val="CommentText"/>
@@ -7186,7 +7370,7 @@
       </w:r>
     </w:p>
   </w:comment>
-  <w:comment w:id="255" w:author="Dave Bridges" w:date="2024-09-16T12:47:00Z" w:initials="DB">
+  <w:comment w:id="274" w:author="Dave Bridges" w:date="2024-09-16T12:47:00Z" w:initials="DB">
     <w:p>
       <w:r>
         <w:rPr>
@@ -7204,87 +7388,7 @@
       </w:r>
     </w:p>
   </w:comment>
-  <w:comment w:id="256" w:author="Bauer, Kate" w:date="2024-08-28T14:52:00Z" w:initials="BK">
-    <w:p>
-      <w:pPr>
-        <w:pStyle w:val="CommentText"/>
-      </w:pPr>
-      <w:r>
-        <w:rPr>
-          <w:rStyle w:val="CommentReference"/>
-        </w:rPr>
-        <w:annotationRef/>
-      </w:r>
-      <w:r>
-        <w:t>Again, given your large sample size and that you divided all the classes of obesity in Table 1, I think you should look at the interactions for all the classes.</w:t>
-      </w:r>
-    </w:p>
-  </w:comment>
-  <w:comment w:id="257" w:author="Bauer, Kate" w:date="2024-08-28T14:54:00Z" w:initials="BK">
-    <w:p>
-      <w:pPr>
-        <w:pStyle w:val="CommentText"/>
-      </w:pPr>
-      <w:r>
-        <w:rPr>
-          <w:rStyle w:val="CommentReference"/>
-        </w:rPr>
-        <w:annotationRef/>
-      </w:r>
-      <w:r>
-        <w:t xml:space="preserve">Actually, I’m not sure what this analysis is. </w:t>
-      </w:r>
-    </w:p>
-  </w:comment>
-  <w:comment w:id="258" w:author="Bauer, Kate" w:date="2024-08-28T14:56:00Z" w:initials="BK">
-    <w:p>
-      <w:pPr>
-        <w:pStyle w:val="CommentText"/>
-      </w:pPr>
-      <w:r>
-        <w:rPr>
-          <w:rStyle w:val="CommentReference"/>
-        </w:rPr>
-        <w:annotationRef/>
-      </w:r>
-      <w:r>
-        <w:t>I’m not used to interactions being presented this way but maybe it’s okay.</w:t>
-      </w:r>
-    </w:p>
-  </w:comment>
-  <w:comment w:id="259" w:author="Bauer, Kate" w:date="2024-08-28T14:55:00Z" w:initials="BK">
-    <w:p>
-      <w:pPr>
-        <w:pStyle w:val="CommentText"/>
-      </w:pPr>
-      <w:r>
-        <w:rPr>
-          <w:rStyle w:val="CommentReference"/>
-        </w:rPr>
-        <w:annotationRef/>
-      </w:r>
-      <w:r>
-        <w:t>P is &gt;.05</w:t>
-      </w:r>
-    </w:p>
-  </w:comment>
-  <w:comment w:id="260" w:author="Bauer, Kate" w:date="2024-08-28T14:57:00Z" w:initials="BK">
-    <w:p>
-      <w:pPr>
-        <w:pStyle w:val="CommentText"/>
-      </w:pPr>
-      <w:r>
-        <w:rPr>
-          <w:rStyle w:val="CommentReference"/>
-        </w:rPr>
-        <w:annotationRef/>
-      </w:r>
-      <w:r>
-        <w:t>Again, I’ve never seen an interaction presented this way so I’m not sure what the 21% is referring to, is this the amount by which the relationship between obesity and T2D is elevated under high stress?</w:t>
-      </w:r>
-    </w:p>
-  </w:comment>
-  <w:comment w:id="261" w:author="Dave Bridges" w:date="2024-08-28T17:41:00Z" w:initials="DB">
+  <w:comment w:id="277" w:author="Dave Bridges" w:date="2025-07-29T16:43:00Z" w:initials="DB">
     <w:p>
       <w:r>
         <w:rPr>
@@ -7297,11 +7401,108 @@
           <w:sz w:val="20"/>
           <w:szCs w:val="20"/>
         </w:rPr>
+        <w:t>I reorganized this to first look at the stress -&gt; diabetes relationship including the multivariable analyses, and then in the next section to look at effect modification.  I think it flows better this way.</w:t>
+      </w:r>
+    </w:p>
+  </w:comment>
+  <w:comment w:id="285" w:author="Bauer, Kate" w:date="2024-08-28T14:52:00Z" w:initials="BK">
+    <w:p>
+      <w:pPr>
+        <w:pStyle w:val="CommentText"/>
+      </w:pPr>
+      <w:r>
+        <w:rPr>
+          <w:rStyle w:val="CommentReference"/>
+        </w:rPr>
+        <w:annotationRef/>
+      </w:r>
+      <w:r>
+        <w:t>Again, given your large sample size and that you divided all the classes of obesity in Table 1, I think you should look at the interactions for all the classes.</w:t>
+      </w:r>
+    </w:p>
+  </w:comment>
+  <w:comment w:id="286" w:author="Bauer, Kate" w:date="2024-08-28T14:54:00Z" w:initials="BK">
+    <w:p>
+      <w:pPr>
+        <w:pStyle w:val="CommentText"/>
+      </w:pPr>
+      <w:r>
+        <w:rPr>
+          <w:rStyle w:val="CommentReference"/>
+        </w:rPr>
+        <w:annotationRef/>
+      </w:r>
+      <w:r>
+        <w:t xml:space="preserve">Actually, I’m not sure what this analysis is. </w:t>
+      </w:r>
+    </w:p>
+  </w:comment>
+  <w:comment w:id="287" w:author="Bauer, Kate" w:date="2024-08-28T14:56:00Z" w:initials="BK">
+    <w:p>
+      <w:pPr>
+        <w:pStyle w:val="CommentText"/>
+      </w:pPr>
+      <w:r>
+        <w:rPr>
+          <w:rStyle w:val="CommentReference"/>
+        </w:rPr>
+        <w:annotationRef/>
+      </w:r>
+      <w:r>
+        <w:t>I’m not used to interactions being presented this way but maybe it’s okay.</w:t>
+      </w:r>
+    </w:p>
+  </w:comment>
+  <w:comment w:id="288" w:author="Bauer, Kate" w:date="2024-08-28T14:55:00Z" w:initials="BK">
+    <w:p>
+      <w:pPr>
+        <w:pStyle w:val="CommentText"/>
+      </w:pPr>
+      <w:r>
+        <w:rPr>
+          <w:rStyle w:val="CommentReference"/>
+        </w:rPr>
+        <w:annotationRef/>
+      </w:r>
+      <w:r>
+        <w:t>P is &gt;.05</w:t>
+      </w:r>
+    </w:p>
+  </w:comment>
+  <w:comment w:id="289" w:author="Bauer, Kate" w:date="2024-08-28T14:57:00Z" w:initials="BK">
+    <w:p>
+      <w:pPr>
+        <w:pStyle w:val="CommentText"/>
+      </w:pPr>
+      <w:r>
+        <w:rPr>
+          <w:rStyle w:val="CommentReference"/>
+        </w:rPr>
+        <w:annotationRef/>
+      </w:r>
+      <w:r>
+        <w:t>Again, I’ve never seen an interaction presented this way so I’m not sure what the 21% is referring to, is this the amount by which the relationship between obesity and T2D is elevated under high stress?</w:t>
+      </w:r>
+    </w:p>
+  </w:comment>
+  <w:comment w:id="290" w:author="Dave Bridges" w:date="2024-08-28T17:41:00Z" w:initials="DB">
+    <w:p>
+      <w:r>
+        <w:rPr>
+          <w:rStyle w:val="CommentReference"/>
+        </w:rPr>
+        <w:annotationRef/>
+      </w:r>
+      <w:r>
+        <w:rPr>
+          <w:sz w:val="20"/>
+          <w:szCs w:val="20"/>
+        </w:rPr>
         <w:t xml:space="preserve">Yes that is right.  Maybe it would help to just keep going back to the prevalences to show this </w:t>
       </w:r>
     </w:p>
   </w:comment>
-  <w:comment w:id="262" w:author="Bauer, Kate" w:date="2024-08-28T15:01:00Z" w:initials="BK">
+  <w:comment w:id="291" w:author="Bauer, Kate" w:date="2024-08-28T15:01:00Z" w:initials="BK">
     <w:p>
       <w:pPr>
         <w:pStyle w:val="CommentText"/>
@@ -7317,7 +7518,7 @@
       </w:r>
     </w:p>
   </w:comment>
-  <w:comment w:id="263" w:author="Dave Bridges" w:date="2024-08-28T17:46:00Z" w:initials="DB">
+  <w:comment w:id="292" w:author="Dave Bridges" w:date="2024-08-28T17:46:00Z" w:initials="DB">
     <w:p>
       <w:pPr>
         <w:pStyle w:val="CommentText"/>
@@ -7333,7 +7534,7 @@
       </w:r>
     </w:p>
   </w:comment>
-  <w:comment w:id="264" w:author="Dave Bridges" w:date="2024-08-28T17:57:00Z" w:initials="DB">
+  <w:comment w:id="293" w:author="Dave Bridges" w:date="2024-08-28T17:57:00Z" w:initials="DB">
     <w:p>
       <w:pPr>
         <w:pStyle w:val="CommentText"/>
@@ -7349,7 +7550,7 @@
       </w:r>
     </w:p>
   </w:comment>
-  <w:comment w:id="265" w:author="Bauer, Kate" w:date="2024-08-28T15:01:00Z" w:initials="BK">
+  <w:comment w:id="294" w:author="Bauer, Kate" w:date="2024-08-28T15:01:00Z" w:initials="BK">
     <w:p>
       <w:pPr>
         <w:pStyle w:val="CommentText"/>
@@ -7365,7 +7566,7 @@
       </w:r>
     </w:p>
   </w:comment>
-  <w:comment w:id="266" w:author="Dave Bridges" w:date="2024-08-28T17:45:00Z" w:initials="DB">
+  <w:comment w:id="295" w:author="Dave Bridges" w:date="2024-08-28T17:45:00Z" w:initials="DB">
     <w:p>
       <w:pPr>
         <w:pStyle w:val="CommentText"/>
@@ -7381,7 +7582,7 @@
       </w:r>
     </w:p>
   </w:comment>
-  <w:comment w:id="278" w:author="Irit Hochberg" w:date="2024-08-29T12:09:00Z" w:initials="IH">
+  <w:comment w:id="307" w:author="Irit Hochberg" w:date="2024-08-29T12:09:00Z" w:initials="IH">
     <w:p>
       <w:pPr>
         <w:pStyle w:val="CommentText"/>
@@ -7404,7 +7605,7 @@
       </w:r>
     </w:p>
   </w:comment>
-  <w:comment w:id="279" w:author="Dave Bridges" w:date="2024-09-16T12:51:00Z" w:initials="DB">
+  <w:comment w:id="308" w:author="Dave Bridges" w:date="2024-09-16T12:51:00Z" w:initials="DB">
     <w:p>
       <w:r>
         <w:rPr>
@@ -7422,7 +7623,7 @@
       </w:r>
     </w:p>
   </w:comment>
-  <w:comment w:id="292" w:author="Bauer, Kate" w:date="2024-08-28T15:02:00Z" w:initials="BK">
+  <w:comment w:id="321" w:author="Bauer, Kate" w:date="2024-08-28T15:02:00Z" w:initials="BK">
     <w:p>
       <w:pPr>
         <w:pStyle w:val="CommentText"/>
@@ -7438,7 +7639,7 @@
       </w:r>
     </w:p>
   </w:comment>
-  <w:comment w:id="317" w:author="Dave Bridges" w:date="2024-04-26T10:23:00Z" w:initials="DB">
+  <w:comment w:id="346" w:author="Dave Bridges" w:date="2024-04-26T10:23:00Z" w:initials="DB">
     <w:p>
       <w:r>
         <w:rPr>
@@ -7456,7 +7657,7 @@
       </w:r>
     </w:p>
   </w:comment>
-  <w:comment w:id="318" w:author="Dave Bridges" w:date="2024-04-12T11:52:00Z" w:initials="DB">
+  <w:comment w:id="347" w:author="Dave Bridges" w:date="2024-04-12T11:52:00Z" w:initials="DB">
     <w:p>
       <w:r>
         <w:rPr>
@@ -7796,7 +7997,7 @@
       </w:r>
     </w:p>
   </w:comment>
-  <w:comment w:id="323" w:author="Irit Hochberg" w:date="2024-08-29T08:52:00Z" w:initials="IH">
+  <w:comment w:id="352" w:author="Irit Hochberg" w:date="2024-08-29T08:52:00Z" w:initials="IH">
     <w:p>
       <w:pPr>
         <w:pStyle w:val="CommentText"/>
@@ -7815,7 +8016,7 @@
       </w:r>
     </w:p>
   </w:comment>
-  <w:comment w:id="324" w:author="Dave Bridges" w:date="2024-04-12T11:07:00Z" w:initials="DB">
+  <w:comment w:id="353" w:author="Dave Bridges" w:date="2024-04-12T11:07:00Z" w:initials="DB">
     <w:p>
       <w:pPr>
         <w:pStyle w:val="CommentText"/>
@@ -7838,7 +8039,7 @@
       </w:r>
     </w:p>
   </w:comment>
-  <w:comment w:id="325" w:author="Dave Bridges" w:date="2024-09-16T12:57:00Z" w:initials="DB">
+  <w:comment w:id="354" w:author="Dave Bridges" w:date="2024-09-16T12:57:00Z" w:initials="DB">
     <w:p>
       <w:r>
         <w:rPr>
@@ -7930,6 +8131,7 @@
   <w15:commentEx w15:paraId="45771AB6" w15:paraIdParent="4D22C3B8" w15:done="0"/>
   <w15:commentEx w15:paraId="59E010D8" w15:done="0"/>
   <w15:commentEx w15:paraId="6ABAF8FA" w15:paraIdParent="59E010D8" w15:done="0"/>
+  <w15:commentEx w15:paraId="2A230F17" w15:done="0"/>
   <w15:commentEx w15:paraId="59C1994C" w15:done="0"/>
   <w15:commentEx w15:paraId="1E05F176" w15:done="0"/>
   <w15:commentEx w15:paraId="75470CCB" w15:done="0"/>
@@ -8011,6 +8213,7 @@
   <w16cex:commentExtensible w16cex:durableId="09EB8659" w16cex:dateUtc="2025-07-28T23:39:00Z"/>
   <w16cex:commentExtensible w16cex:durableId="08C42FA6" w16cex:dateUtc="2024-08-28T18:50:00Z"/>
   <w16cex:commentExtensible w16cex:durableId="2A4F61C8" w16cex:dateUtc="2024-09-16T16:47:00Z"/>
+  <w16cex:commentExtensible w16cex:durableId="7E9F4FDA" w16cex:dateUtc="2025-07-29T20:43:00Z"/>
   <w16cex:commentExtensible w16cex:durableId="5D49B79E" w16cex:dateUtc="2024-08-28T18:52:00Z"/>
   <w16cex:commentExtensible w16cex:durableId="78D3D7A1" w16cex:dateUtc="2024-08-28T18:54:00Z"/>
   <w16cex:commentExtensible w16cex:durableId="58A41DFC" w16cex:dateUtc="2024-08-28T18:56:00Z"/>
@@ -8096,6 +8299,7 @@
   <w16cid:commentId w16cid:paraId="45771AB6" w16cid:durableId="09EB8659"/>
   <w16cid:commentId w16cid:paraId="59E010D8" w16cid:durableId="08C42FA6"/>
   <w16cid:commentId w16cid:paraId="6ABAF8FA" w16cid:durableId="2A4F61C8"/>
+  <w16cid:commentId w16cid:paraId="2A230F17" w16cid:durableId="7E9F4FDA"/>
   <w16cid:commentId w16cid:paraId="59C1994C" w16cid:durableId="5D49B79E"/>
   <w16cid:commentId w16cid:paraId="1E05F176" w16cid:durableId="78D3D7A1"/>
   <w16cid:commentId w16cid:paraId="75470CCB" w16cid:durableId="58A41DFC"/>

</xml_diff>